<commit_message>
crew 1.0: per-flavour PATH fixtures for Windows; autoClear onlyRepos/onlySessions narrowing scope
</commit_message>
<xml_diff>
--- a/docs/guides/crew/crew-1.0-troubleshooting.docx
+++ b/docs/guides/crew/crew-1.0-troubleshooting.docx
@@ -9167,14 +9167,746 @@
     </w:p>
     <w:p>
       <w:pPr>
+        <w:pStyle w:val="Heading4"/>
+        <w:bidi w:val="0"/>
+        <w:ind w:hanging="0" w:left="0" w:right="0"/>
+        <w:jc w:val="left"/>
+        <w:rPr/>
+      </w:pPr>
+      <w:bookmarkStart w:id="14" w:name="arming-one-scratch-repo-while-other-sess"/>
+      <w:bookmarkEnd w:id="14"/>
+      <w:r>
+        <w:rPr/>
+        <w:t>Arming one scratch repo while other sessions are live</w:t>
+      </w:r>
+    </w:p>
+    <w:p>
+      <w:pPr>
+        <w:pStyle w:val="BodyText"/>
+        <w:bidi w:val="0"/>
+        <w:jc w:val="left"/>
+        <w:rPr/>
+      </w:pPr>
+      <w:r>
+        <w:rPr>
+          <w:rStyle w:val="SourceText"/>
+        </w:rPr>
+        <w:t>enabled: true</w:t>
+      </w:r>
+      <w:r>
+        <w:rPr/>
+        <w:t xml:space="preserve"> arms auto-clear in </w:t>
+      </w:r>
+      <w:r>
+        <w:rPr>
+          <w:rStyle w:val="Strong"/>
+        </w:rPr>
+        <w:t>every</w:t>
+      </w:r>
+      <w:r>
+        <w:rPr/>
+        <w:t xml:space="preserve"> Claude session on the machine, not just the one you are testing. If other sessions are running, one of them can get </w:t>
+      </w:r>
+      <w:r>
+        <w:rPr>
+          <w:rStyle w:val="SourceText"/>
+        </w:rPr>
+        <w:t>/clear</w:t>
+      </w:r>
+      <w:r>
+        <w:rPr/>
+        <w:t xml:space="preserve"> typed into its terminal when its own handoff lands. To limit auto-clear to one repo or one session, add these keys to the same machine file. They can only narrow what </w:t>
+      </w:r>
+      <w:r>
+        <w:rPr>
+          <w:rStyle w:val="SourceText"/>
+        </w:rPr>
+        <w:t>enabled</w:t>
+      </w:r>
+      <w:r>
+        <w:rPr/>
+        <w:t xml:space="preserve"> turns on:</w:t>
+      </w:r>
+    </w:p>
+    <w:tbl>
+      <w:tblPr>
+        <w:tblW w:w="10959" w:type="dxa"/>
+        <w:jc w:val="left"/>
+        <w:tblInd w:w="28" w:type="dxa"/>
+        <w:tblLayout w:type="fixed"/>
+        <w:tblCellMar>
+          <w:top w:w="28" w:type="dxa"/>
+          <w:left w:w="28" w:type="dxa"/>
+          <w:bottom w:w="28" w:type="dxa"/>
+          <w:right w:w="28" w:type="dxa"/>
+        </w:tblCellMar>
+      </w:tblPr>
+      <w:tblGrid>
+        <w:gridCol w:w="3762"/>
+        <w:gridCol w:w="2975"/>
+        <w:gridCol w:w="4222"/>
+      </w:tblGrid>
+      <w:tr>
+        <w:trPr>
+          <w:tblHeader w:val="true"/>
+        </w:trPr>
+        <w:tc>
+          <w:tcPr>
+            <w:tcW w:w="3762" w:type="dxa"/>
+            <w:tcBorders/>
+            <w:vAlign w:val="center"/>
+          </w:tcPr>
+          <w:p>
+            <w:pPr>
+              <w:pStyle w:val="TableHeading"/>
+              <w:suppressLineNumbers/>
+              <w:shd w:fill="434C5E" w:val="clear"/>
+              <w:bidi w:val="0"/>
+              <w:spacing w:before="120" w:after="120"/>
+              <w:jc w:val="left"/>
+              <w:rPr/>
+            </w:pPr>
+            <w:r>
+              <w:rPr/>
+              <w:t>Key</w:t>
+            </w:r>
+          </w:p>
+        </w:tc>
+        <w:tc>
+          <w:tcPr>
+            <w:tcW w:w="2975" w:type="dxa"/>
+            <w:tcBorders/>
+            <w:vAlign w:val="center"/>
+          </w:tcPr>
+          <w:p>
+            <w:pPr>
+              <w:pStyle w:val="TableHeading"/>
+              <w:suppressLineNumbers/>
+              <w:shd w:fill="434C5E" w:val="clear"/>
+              <w:bidi w:val="0"/>
+              <w:spacing w:before="120" w:after="120"/>
+              <w:jc w:val="left"/>
+              <w:rPr/>
+            </w:pPr>
+            <w:r>
+              <w:rPr/>
+              <w:t>Value</w:t>
+            </w:r>
+          </w:p>
+        </w:tc>
+        <w:tc>
+          <w:tcPr>
+            <w:tcW w:w="4222" w:type="dxa"/>
+            <w:tcBorders/>
+            <w:vAlign w:val="center"/>
+          </w:tcPr>
+          <w:p>
+            <w:pPr>
+              <w:pStyle w:val="TableHeading"/>
+              <w:suppressLineNumbers/>
+              <w:shd w:fill="434C5E" w:val="clear"/>
+              <w:bidi w:val="0"/>
+              <w:spacing w:before="120" w:after="120"/>
+              <w:jc w:val="left"/>
+              <w:rPr/>
+            </w:pPr>
+            <w:r>
+              <w:rPr/>
+              <w:t>Effect</w:t>
+            </w:r>
+          </w:p>
+        </w:tc>
+      </w:tr>
+      <w:tr>
+        <w:trPr/>
+        <w:tc>
+          <w:tcPr>
+            <w:tcW w:w="3762" w:type="dxa"/>
+            <w:tcBorders/>
+            <w:vAlign w:val="center"/>
+          </w:tcPr>
+          <w:p>
+            <w:pPr>
+              <w:pStyle w:val="TableContents"/>
+              <w:shd w:fill="2E3440" w:val="clear"/>
+              <w:bidi w:val="0"/>
+              <w:spacing w:before="120" w:after="120"/>
+              <w:jc w:val="left"/>
+              <w:rPr/>
+            </w:pPr>
+            <w:r>
+              <w:rPr>
+                <w:rStyle w:val="SourceText"/>
+              </w:rPr>
+              <w:t>context.autoClear.onlyRepos</w:t>
+            </w:r>
+          </w:p>
+        </w:tc>
+        <w:tc>
+          <w:tcPr>
+            <w:tcW w:w="2975" w:type="dxa"/>
+            <w:tcBorders/>
+            <w:vAlign w:val="center"/>
+          </w:tcPr>
+          <w:p>
+            <w:pPr>
+              <w:pStyle w:val="TableContents"/>
+              <w:shd w:fill="2E3440" w:val="clear"/>
+              <w:bidi w:val="0"/>
+              <w:spacing w:before="120" w:after="120"/>
+              <w:jc w:val="left"/>
+              <w:rPr/>
+            </w:pPr>
+            <w:r>
+              <w:rPr/>
+              <w:t>list of absolute repo paths</w:t>
+            </w:r>
+          </w:p>
+        </w:tc>
+        <w:tc>
+          <w:tcPr>
+            <w:tcW w:w="4222" w:type="dxa"/>
+            <w:tcBorders/>
+            <w:vAlign w:val="center"/>
+          </w:tcPr>
+          <w:p>
+            <w:pPr>
+              <w:pStyle w:val="TableContents"/>
+              <w:shd w:fill="2E3440" w:val="clear"/>
+              <w:bidi w:val="0"/>
+              <w:spacing w:before="120" w:after="120"/>
+              <w:jc w:val="left"/>
+              <w:rPr/>
+            </w:pPr>
+            <w:r>
+              <w:rPr/>
+              <w:t>auto-clear runs only in these repos</w:t>
+            </w:r>
+          </w:p>
+        </w:tc>
+      </w:tr>
+      <w:tr>
+        <w:trPr/>
+        <w:tc>
+          <w:tcPr>
+            <w:tcW w:w="3762" w:type="dxa"/>
+            <w:tcBorders/>
+            <w:vAlign w:val="center"/>
+          </w:tcPr>
+          <w:p>
+            <w:pPr>
+              <w:pStyle w:val="TableContents"/>
+              <w:shd w:fill="2E3440" w:val="clear"/>
+              <w:bidi w:val="0"/>
+              <w:spacing w:before="120" w:after="120"/>
+              <w:jc w:val="left"/>
+              <w:rPr/>
+            </w:pPr>
+            <w:r>
+              <w:rPr>
+                <w:rStyle w:val="SourceText"/>
+              </w:rPr>
+              <w:t>context.autoClear.onlySessions</w:t>
+            </w:r>
+          </w:p>
+        </w:tc>
+        <w:tc>
+          <w:tcPr>
+            <w:tcW w:w="2975" w:type="dxa"/>
+            <w:tcBorders/>
+            <w:vAlign w:val="center"/>
+          </w:tcPr>
+          <w:p>
+            <w:pPr>
+              <w:pStyle w:val="TableContents"/>
+              <w:shd w:fill="2E3440" w:val="clear"/>
+              <w:bidi w:val="0"/>
+              <w:spacing w:before="120" w:after="120"/>
+              <w:jc w:val="left"/>
+              <w:rPr/>
+            </w:pPr>
+            <w:r>
+              <w:rPr/>
+              <w:t>list of session ids</w:t>
+            </w:r>
+          </w:p>
+        </w:tc>
+        <w:tc>
+          <w:tcPr>
+            <w:tcW w:w="4222" w:type="dxa"/>
+            <w:tcBorders/>
+            <w:vAlign w:val="center"/>
+          </w:tcPr>
+          <w:p>
+            <w:pPr>
+              <w:pStyle w:val="TableContents"/>
+              <w:shd w:fill="2E3440" w:val="clear"/>
+              <w:bidi w:val="0"/>
+              <w:spacing w:before="120" w:after="120"/>
+              <w:jc w:val="left"/>
+              <w:rPr/>
+            </w:pPr>
+            <w:r>
+              <w:rPr/>
+              <w:t>auto-clear runs only in these sessions</w:t>
+            </w:r>
+          </w:p>
+        </w:tc>
+      </w:tr>
+    </w:tbl>
+    <w:p>
+      <w:pPr>
+        <w:pStyle w:val="BodyText"/>
+        <w:numPr>
+          <w:ilvl w:val="0"/>
+          <w:numId w:val="17"/>
+        </w:numPr>
+        <w:tabs>
+          <w:tab w:val="clear" w:pos="1134"/>
+          <w:tab w:val="left" w:pos="829" w:leader="none"/>
+        </w:tabs>
+        <w:bidi w:val="0"/>
+        <w:spacing w:before="120" w:after="0"/>
+        <w:ind w:hanging="283" w:left="829"/>
+        <w:jc w:val="left"/>
+        <w:rPr/>
+      </w:pPr>
+      <w:r>
+        <w:rPr/>
+        <w:t xml:space="preserve">A missing key or </w:t>
+      </w:r>
+      <w:r>
+        <w:rPr>
+          <w:rStyle w:val="SourceText"/>
+        </w:rPr>
+        <w:t>null</w:t>
+      </w:r>
+      <w:r>
+        <w:rPr/>
+        <w:t xml:space="preserve"> does not narrow anything. An empty list </w:t>
+      </w:r>
+      <w:r>
+        <w:rPr>
+          <w:rStyle w:val="SourceText"/>
+        </w:rPr>
+        <w:t>[]</w:t>
+      </w:r>
+      <w:r>
+        <w:rPr/>
+        <w:t xml:space="preserve"> turns auto-clear off everywhere. If a key holds anything other than a list, auto-clear is off everywhere too. </w:t>
+      </w:r>
+    </w:p>
+    <w:p>
+      <w:pPr>
+        <w:pStyle w:val="BodyText"/>
+        <w:numPr>
+          <w:ilvl w:val="0"/>
+          <w:numId w:val="17"/>
+        </w:numPr>
+        <w:tabs>
+          <w:tab w:val="clear" w:pos="1134"/>
+          <w:tab w:val="left" w:pos="829" w:leader="none"/>
+        </w:tabs>
+        <w:bidi w:val="0"/>
+        <w:spacing w:before="120" w:after="0"/>
+        <w:ind w:hanging="283" w:left="829"/>
+        <w:jc w:val="left"/>
+        <w:rPr/>
+      </w:pPr>
+      <w:r>
+        <w:rPr/>
+        <w:t xml:space="preserve">When both keys are set, a session must match both. </w:t>
+      </w:r>
+    </w:p>
+    <w:p>
+      <w:pPr>
+        <w:pStyle w:val="BodyText"/>
+        <w:numPr>
+          <w:ilvl w:val="0"/>
+          <w:numId w:val="17"/>
+        </w:numPr>
+        <w:tabs>
+          <w:tab w:val="clear" w:pos="1134"/>
+          <w:tab w:val="left" w:pos="829" w:leader="none"/>
+        </w:tabs>
+        <w:bidi w:val="0"/>
+        <w:spacing w:before="120" w:after="0"/>
+        <w:ind w:hanging="283" w:left="829"/>
+        <w:jc w:val="left"/>
+        <w:rPr/>
+      </w:pPr>
+      <w:r>
+        <w:rPr/>
+        <w:t xml:space="preserve">Paths are compared after symlinks are resolved. Backslashes and trailing separators do not matter. On Windows, case does not matter and </w:t>
+      </w:r>
+      <w:r>
+        <w:rPr>
+          <w:rStyle w:val="SourceText"/>
+        </w:rPr>
+        <w:t>/c/repos/x</w:t>
+      </w:r>
+      <w:r>
+        <w:rPr/>
+        <w:t xml:space="preserve"> means </w:t>
+      </w:r>
+      <w:r>
+        <w:rPr>
+          <w:rStyle w:val="SourceText"/>
+        </w:rPr>
+        <w:t>C:\repos\x</w:t>
+      </w:r>
+      <w:r>
+        <w:rPr/>
+        <w:t xml:space="preserve">. A relative path such as </w:t>
+      </w:r>
+      <w:r>
+        <w:rPr>
+          <w:rStyle w:val="SourceText"/>
+        </w:rPr>
+        <w:t>.</w:t>
+      </w:r>
+      <w:r>
+        <w:rPr/>
+        <w:t xml:space="preserve"> never matches. </w:t>
+      </w:r>
+    </w:p>
+    <w:p>
+      <w:pPr>
+        <w:pStyle w:val="BodyText"/>
+        <w:numPr>
+          <w:ilvl w:val="0"/>
+          <w:numId w:val="17"/>
+        </w:numPr>
+        <w:tabs>
+          <w:tab w:val="clear" w:pos="1134"/>
+          <w:tab w:val="left" w:pos="829" w:leader="none"/>
+        </w:tabs>
+        <w:bidi w:val="0"/>
+        <w:spacing w:before="120" w:after="0"/>
+        <w:ind w:hanging="283" w:left="829"/>
+        <w:jc w:val="left"/>
+        <w:rPr/>
+      </w:pPr>
+      <w:r>
+        <w:rPr/>
+        <w:t xml:space="preserve">Session ids must match exactly, including case. </w:t>
+      </w:r>
+    </w:p>
+    <w:p>
+      <w:pPr>
+        <w:pStyle w:val="BodyText"/>
+        <w:numPr>
+          <w:ilvl w:val="0"/>
+          <w:numId w:val="17"/>
+        </w:numPr>
+        <w:tabs>
+          <w:tab w:val="clear" w:pos="1134"/>
+          <w:tab w:val="left" w:pos="829" w:leader="none"/>
+        </w:tabs>
+        <w:bidi w:val="0"/>
+        <w:spacing w:before="120" w:after="0"/>
+        <w:ind w:hanging="283" w:left="829"/>
+        <w:jc w:val="left"/>
+        <w:rPr/>
+      </w:pPr>
+      <w:r>
+        <w:rPr/>
+        <w:t xml:space="preserve">These keys are read </w:t>
+      </w:r>
+      <w:r>
+        <w:rPr>
+          <w:rStyle w:val="Strong"/>
+        </w:rPr>
+        <w:t>only</w:t>
+      </w:r>
+      <w:r>
+        <w:rPr/>
+        <w:t xml:space="preserve"> from the machine file. If a repo's </w:t>
+      </w:r>
+      <w:r>
+        <w:rPr>
+          <w:rStyle w:val="SourceText"/>
+        </w:rPr>
+        <w:t>.crew/config.json</w:t>
+      </w:r>
+      <w:r>
+        <w:rPr/>
+        <w:t xml:space="preserve"> sets them, they are ignored, so a repo cannot add itself. A repo's </w:t>
+      </w:r>
+      <w:r>
+        <w:rPr>
+          <w:rStyle w:val="SourceText"/>
+        </w:rPr>
+        <w:t>enabled: false</w:t>
+      </w:r>
+      <w:r>
+        <w:rPr/>
+        <w:t xml:space="preserve"> still turns auto-clear off. </w:t>
+      </w:r>
+    </w:p>
+    <w:p>
+      <w:pPr>
+        <w:pStyle w:val="BodyText"/>
+        <w:numPr>
+          <w:ilvl w:val="0"/>
+          <w:numId w:val="17"/>
+        </w:numPr>
+        <w:tabs>
+          <w:tab w:val="clear" w:pos="1134"/>
+          <w:tab w:val="left" w:pos="829" w:leader="none"/>
+        </w:tabs>
+        <w:bidi w:val="0"/>
+        <w:ind w:hanging="283" w:left="829"/>
+        <w:jc w:val="left"/>
+        <w:rPr/>
+      </w:pPr>
+      <w:r>
+        <w:rPr/>
+        <w:t xml:space="preserve">In any other repo or session, auto-clear stays silent. It does not write a log line, just as it does when </w:t>
+      </w:r>
+      <w:r>
+        <w:rPr>
+          <w:rStyle w:val="SourceText"/>
+        </w:rPr>
+        <w:t>enabled</w:t>
+      </w:r>
+      <w:r>
+        <w:rPr/>
+        <w:t xml:space="preserve"> is off. </w:t>
+      </w:r>
+    </w:p>
+    <w:p>
+      <w:pPr>
+        <w:pStyle w:val="BodyText"/>
+        <w:bidi w:val="0"/>
+        <w:jc w:val="left"/>
+        <w:rPr/>
+      </w:pPr>
+      <w:r>
+        <w:rPr/>
+        <w:t>To arm one scratch repo safely:</w:t>
+      </w:r>
+    </w:p>
+    <w:p>
+      <w:pPr>
+        <w:pStyle w:val="PreformattedText"/>
+        <w:bidi w:val="0"/>
+        <w:jc w:val="left"/>
+        <w:rPr/>
+      </w:pPr>
+      <w:r>
+        <w:rPr>
+          <w:rStyle w:val="SourceText"/>
+        </w:rPr>
+        <w:t>{</w:t>
+      </w:r>
+    </w:p>
+    <w:p>
+      <w:pPr>
+        <w:pStyle w:val="PreformattedText"/>
+        <w:bidi w:val="0"/>
+        <w:jc w:val="left"/>
+        <w:rPr/>
+      </w:pPr>
+      <w:r>
+        <w:rPr>
+          <w:rStyle w:val="SourceText"/>
+        </w:rPr>
+        <w:t xml:space="preserve">  </w:t>
+      </w:r>
+      <w:r>
+        <w:rPr>
+          <w:rStyle w:val="SourceText"/>
+        </w:rPr>
+        <w:t>"context": {</w:t>
+      </w:r>
+    </w:p>
+    <w:p>
+      <w:pPr>
+        <w:pStyle w:val="PreformattedText"/>
+        <w:bidi w:val="0"/>
+        <w:jc w:val="left"/>
+        <w:rPr/>
+      </w:pPr>
+      <w:r>
+        <w:rPr>
+          <w:rStyle w:val="SourceText"/>
+        </w:rPr>
+        <w:t xml:space="preserve">    </w:t>
+      </w:r>
+      <w:r>
+        <w:rPr>
+          <w:rStyle w:val="SourceText"/>
+        </w:rPr>
+        <w:t>"autoClear": {</w:t>
+      </w:r>
+    </w:p>
+    <w:p>
+      <w:pPr>
+        <w:pStyle w:val="PreformattedText"/>
+        <w:bidi w:val="0"/>
+        <w:jc w:val="left"/>
+        <w:rPr/>
+      </w:pPr>
+      <w:r>
+        <w:rPr>
+          <w:rStyle w:val="SourceText"/>
+        </w:rPr>
+        <w:t xml:space="preserve">      </w:t>
+      </w:r>
+      <w:r>
+        <w:rPr>
+          <w:rStyle w:val="SourceText"/>
+        </w:rPr>
+        <w:t>"enabled": true,</w:t>
+      </w:r>
+    </w:p>
+    <w:p>
+      <w:pPr>
+        <w:pStyle w:val="PreformattedText"/>
+        <w:bidi w:val="0"/>
+        <w:jc w:val="left"/>
+        <w:rPr/>
+      </w:pPr>
+      <w:r>
+        <w:rPr>
+          <w:rStyle w:val="SourceText"/>
+        </w:rPr>
+        <w:t xml:space="preserve">      </w:t>
+      </w:r>
+      <w:r>
+        <w:rPr>
+          <w:rStyle w:val="SourceText"/>
+        </w:rPr>
+        <w:t>"onlyRepos": ["C:\\repos\\autoclear-scratch"]</w:t>
+      </w:r>
+    </w:p>
+    <w:p>
+      <w:pPr>
+        <w:pStyle w:val="PreformattedText"/>
+        <w:bidi w:val="0"/>
+        <w:jc w:val="left"/>
+        <w:rPr/>
+      </w:pPr>
+      <w:r>
+        <w:rPr>
+          <w:rStyle w:val="SourceText"/>
+        </w:rPr>
+        <w:t xml:space="preserve">    </w:t>
+      </w:r>
+      <w:r>
+        <w:rPr>
+          <w:rStyle w:val="SourceText"/>
+        </w:rPr>
+        <w:t>}</w:t>
+      </w:r>
+    </w:p>
+    <w:p>
+      <w:pPr>
+        <w:pStyle w:val="PreformattedText"/>
+        <w:bidi w:val="0"/>
+        <w:jc w:val="left"/>
+        <w:rPr/>
+      </w:pPr>
+      <w:r>
+        <w:rPr>
+          <w:rStyle w:val="SourceText"/>
+        </w:rPr>
+        <w:t xml:space="preserve">  </w:t>
+      </w:r>
+      <w:r>
+        <w:rPr>
+          <w:rStyle w:val="SourceText"/>
+        </w:rPr>
+        <w:t>}</w:t>
+      </w:r>
+    </w:p>
+    <w:p>
+      <w:pPr>
+        <w:pStyle w:val="PreformattedText"/>
+        <w:bidi w:val="0"/>
+        <w:jc w:val="left"/>
+        <w:rPr/>
+      </w:pPr>
+      <w:r>
+        <w:rPr>
+          <w:rStyle w:val="SourceText"/>
+        </w:rPr>
+        <w:t>}</w:t>
+      </w:r>
+    </w:p>
+    <w:p>
+      <w:pPr>
+        <w:pStyle w:val="BodyText"/>
+        <w:bidi w:val="0"/>
+        <w:jc w:val="left"/>
+        <w:rPr/>
+      </w:pPr>
+      <w:r>
+        <w:rPr/>
+        <w:t xml:space="preserve">On Linux, use a path such as </w:t>
+      </w:r>
+      <w:r>
+        <w:rPr>
+          <w:rStyle w:val="SourceText"/>
+        </w:rPr>
+        <w:t>"/home/you/autoclear-scratch"</w:t>
+      </w:r>
+      <w:r>
+        <w:rPr/>
+        <w:t xml:space="preserve">. When you are done testing, remove </w:t>
+      </w:r>
+      <w:r>
+        <w:rPr>
+          <w:rStyle w:val="SourceText"/>
+        </w:rPr>
+        <w:t>enabled</w:t>
+      </w:r>
+      <w:r>
+        <w:rPr/>
+        <w:t xml:space="preserve"> or set it to </w:t>
+      </w:r>
+      <w:r>
+        <w:rPr>
+          <w:rStyle w:val="SourceText"/>
+        </w:rPr>
+        <w:t>false</w:t>
+      </w:r>
+      <w:r>
+        <w:rPr/>
+        <w:t xml:space="preserve">. Also delete </w:t>
+      </w:r>
+      <w:r>
+        <w:rPr>
+          <w:rStyle w:val="SourceText"/>
+        </w:rPr>
+        <w:t>onlyRepos</w:t>
+      </w:r>
+      <w:r>
+        <w:rPr/>
+        <w:t xml:space="preserve">, so that a later </w:t>
+      </w:r>
+      <w:r>
+        <w:rPr>
+          <w:rStyle w:val="SourceText"/>
+        </w:rPr>
+        <w:t>enabled: true</w:t>
+      </w:r>
+      <w:r>
+        <w:rPr/>
+        <w:t xml:space="preserve"> does not arm only that repo without anyone noticing.</w:t>
+      </w:r>
+    </w:p>
+    <w:p>
+      <w:pPr>
         <w:pStyle w:val="Heading3"/>
         <w:bidi w:val="0"/>
         <w:ind w:hanging="0" w:left="0" w:right="0"/>
         <w:jc w:val="left"/>
         <w:rPr/>
       </w:pPr>
-      <w:bookmarkStart w:id="14" w:name="when-it-will-not-clear"/>
-      <w:bookmarkEnd w:id="14"/>
+      <w:bookmarkStart w:id="15" w:name="when-it-will-not-clear"/>
+      <w:bookmarkEnd w:id="15"/>
       <w:r>
         <w:rPr/>
         <w:t>When It Will Not Clear</w:t>
@@ -9815,8 +10547,8 @@
         <w:jc w:val="left"/>
         <w:rPr/>
       </w:pPr>
-      <w:bookmarkStart w:id="15" w:name="which-window-gets-the-keystroke"/>
-      <w:bookmarkEnd w:id="15"/>
+      <w:bookmarkStart w:id="16" w:name="which-window-gets-the-keystroke"/>
+      <w:bookmarkEnd w:id="16"/>
       <w:r>
         <w:rPr/>
         <w:t>Which Window Gets the Keystroke</w:t>
@@ -9827,7 +10559,7 @@
         <w:pStyle w:val="BodyText"/>
         <w:numPr>
           <w:ilvl w:val="0"/>
-          <w:numId w:val="17"/>
+          <w:numId w:val="18"/>
         </w:numPr>
         <w:tabs>
           <w:tab w:val="clear" w:pos="1134"/>
@@ -9865,7 +10597,7 @@
         <w:pStyle w:val="BodyText"/>
         <w:numPr>
           <w:ilvl w:val="0"/>
-          <w:numId w:val="17"/>
+          <w:numId w:val="18"/>
         </w:numPr>
         <w:tabs>
           <w:tab w:val="clear" w:pos="1134"/>
@@ -9925,7 +10657,7 @@
         <w:pStyle w:val="BodyText"/>
         <w:numPr>
           <w:ilvl w:val="0"/>
-          <w:numId w:val="17"/>
+          <w:numId w:val="18"/>
         </w:numPr>
         <w:tabs>
           <w:tab w:val="clear" w:pos="1134"/>
@@ -12309,6 +13041,143 @@
   <w:abstractNum w:abstractNumId="18">
     <w:lvl w:ilvl="0">
       <w:start w:val="1"/>
+      <w:numFmt w:val="bullet"/>
+      <w:lvlText w:val=""/>
+      <w:lvlJc w:val="left"/>
+      <w:pPr>
+        <w:tabs>
+          <w:tab w:val="num" w:pos="709"/>
+        </w:tabs>
+        <w:ind w:left="709" w:hanging="283"/>
+      </w:pPr>
+      <w:rPr>
+        <w:rFonts w:ascii="Symbol" w:hAnsi="Symbol" w:cs="Symbol" w:hint="default"/>
+      </w:rPr>
+    </w:lvl>
+    <w:lvl w:ilvl="1">
+      <w:start w:val="1"/>
+      <w:numFmt w:val="bullet"/>
+      <w:lvlText w:val=""/>
+      <w:lvlJc w:val="left"/>
+      <w:pPr>
+        <w:tabs>
+          <w:tab w:val="num" w:pos="1418"/>
+        </w:tabs>
+        <w:ind w:left="1418" w:hanging="283"/>
+      </w:pPr>
+      <w:rPr>
+        <w:rFonts w:ascii="Symbol" w:hAnsi="Symbol" w:cs="Symbol" w:hint="default"/>
+      </w:rPr>
+    </w:lvl>
+    <w:lvl w:ilvl="2">
+      <w:start w:val="1"/>
+      <w:numFmt w:val="bullet"/>
+      <w:lvlText w:val=""/>
+      <w:lvlJc w:val="left"/>
+      <w:pPr>
+        <w:tabs>
+          <w:tab w:val="num" w:pos="2127"/>
+        </w:tabs>
+        <w:ind w:left="2127" w:hanging="283"/>
+      </w:pPr>
+      <w:rPr>
+        <w:rFonts w:ascii="Symbol" w:hAnsi="Symbol" w:cs="Symbol" w:hint="default"/>
+      </w:rPr>
+    </w:lvl>
+    <w:lvl w:ilvl="3">
+      <w:start w:val="1"/>
+      <w:numFmt w:val="bullet"/>
+      <w:lvlText w:val=""/>
+      <w:lvlJc w:val="left"/>
+      <w:pPr>
+        <w:tabs>
+          <w:tab w:val="num" w:pos="2836"/>
+        </w:tabs>
+        <w:ind w:left="2836" w:hanging="283"/>
+      </w:pPr>
+      <w:rPr>
+        <w:rFonts w:ascii="Symbol" w:hAnsi="Symbol" w:cs="Symbol" w:hint="default"/>
+      </w:rPr>
+    </w:lvl>
+    <w:lvl w:ilvl="4">
+      <w:start w:val="1"/>
+      <w:numFmt w:val="bullet"/>
+      <w:lvlText w:val=""/>
+      <w:lvlJc w:val="left"/>
+      <w:pPr>
+        <w:tabs>
+          <w:tab w:val="num" w:pos="3545"/>
+        </w:tabs>
+        <w:ind w:left="3545" w:hanging="283"/>
+      </w:pPr>
+      <w:rPr>
+        <w:rFonts w:ascii="Symbol" w:hAnsi="Symbol" w:cs="Symbol" w:hint="default"/>
+      </w:rPr>
+    </w:lvl>
+    <w:lvl w:ilvl="5">
+      <w:start w:val="1"/>
+      <w:numFmt w:val="bullet"/>
+      <w:lvlText w:val=""/>
+      <w:lvlJc w:val="left"/>
+      <w:pPr>
+        <w:tabs>
+          <w:tab w:val="num" w:pos="4254"/>
+        </w:tabs>
+        <w:ind w:left="4254" w:hanging="283"/>
+      </w:pPr>
+      <w:rPr>
+        <w:rFonts w:ascii="Symbol" w:hAnsi="Symbol" w:cs="Symbol" w:hint="default"/>
+      </w:rPr>
+    </w:lvl>
+    <w:lvl w:ilvl="6">
+      <w:start w:val="1"/>
+      <w:numFmt w:val="bullet"/>
+      <w:lvlText w:val=""/>
+      <w:lvlJc w:val="left"/>
+      <w:pPr>
+        <w:tabs>
+          <w:tab w:val="num" w:pos="4963"/>
+        </w:tabs>
+        <w:ind w:left="4963" w:hanging="283"/>
+      </w:pPr>
+      <w:rPr>
+        <w:rFonts w:ascii="Symbol" w:hAnsi="Symbol" w:cs="Symbol" w:hint="default"/>
+      </w:rPr>
+    </w:lvl>
+    <w:lvl w:ilvl="7">
+      <w:start w:val="1"/>
+      <w:numFmt w:val="bullet"/>
+      <w:lvlText w:val=""/>
+      <w:lvlJc w:val="left"/>
+      <w:pPr>
+        <w:tabs>
+          <w:tab w:val="num" w:pos="5672"/>
+        </w:tabs>
+        <w:ind w:left="5672" w:hanging="283"/>
+      </w:pPr>
+      <w:rPr>
+        <w:rFonts w:ascii="Symbol" w:hAnsi="Symbol" w:cs="Symbol" w:hint="default"/>
+      </w:rPr>
+    </w:lvl>
+    <w:lvl w:ilvl="8">
+      <w:start w:val="1"/>
+      <w:numFmt w:val="bullet"/>
+      <w:lvlText w:val=""/>
+      <w:lvlJc w:val="left"/>
+      <w:pPr>
+        <w:tabs>
+          <w:tab w:val="num" w:pos="6381"/>
+        </w:tabs>
+        <w:ind w:left="6381" w:hanging="283"/>
+      </w:pPr>
+      <w:rPr>
+        <w:rFonts w:ascii="Symbol" w:hAnsi="Symbol" w:cs="Symbol" w:hint="default"/>
+      </w:rPr>
+    </w:lvl>
+  </w:abstractNum>
+  <w:abstractNum w:abstractNumId="19">
+    <w:lvl w:ilvl="0">
+      <w:start w:val="1"/>
       <w:numFmt w:val="none"/>
       <w:suff w:val="nothing"/>
       <w:lvlText w:val=""/>
@@ -12351,6 +13220,7 @@
     <w:lvl w:ilvl="3">
       <w:start w:val="1"/>
       <w:numFmt w:val="none"/>
+      <w:pStyle w:val="Heading4"/>
       <w:suff w:val="nothing"/>
       <w:lvlText w:val=""/>
       <w:lvlJc w:val="left"/>
@@ -12480,6 +13350,9 @@
   </w:num>
   <w:num w:numId="18">
     <w:abstractNumId w:val="18"/>
+  </w:num>
+  <w:num w:numId="19">
+    <w:abstractNumId w:val="19"/>
   </w:num>
 </w:numbering>
 </file>
@@ -12573,6 +13446,23 @@
       <w:color w:val="88C0D0"/>
       <w:sz w:val="26"/>
       <w:szCs w:val="26"/>
+    </w:rPr>
+  </w:style>
+  <w:style w:type="paragraph" w:styleId="Heading4">
+    <w:name w:val="heading 4"/>
+    <w:basedOn w:val="Heading"/>
+    <w:next w:val="BodyText"/>
+    <w:qFormat/>
+    <w:pPr>
+      <w:spacing w:before="120" w:after="120"/>
+      <w:outlineLvl w:val="3"/>
+    </w:pPr>
+    <w:rPr>
+      <w:rFonts w:ascii="Liberation Serif" w:hAnsi="Liberation Serif" w:eastAsia="Noto Serif CJK SC" w:cs="Noto Sans Devanagari"/>
+      <w:b/>
+      <w:bCs/>
+      <w:sz w:val="24"/>
+      <w:szCs w:val="24"/>
     </w:rPr>
   </w:style>
   <w:style w:type="character" w:styleId="EndnoteReference">

</xml_diff>

<commit_message>
T-0021 landing: rebuild the troubleshooting guide from the merged sources
docs/guides/crew/src/build.py --guide troubleshooting (LibreOffice
26.2.5.2 on Linux). T-0021's build predates T-0042's auto-cycle.md wait
reasons, which build into this guide; the HTML gains exactly those
(16 lines added, 6 removed). DOCX and PDF re-rendered from it.
</commit_message>
<xml_diff>
--- a/docs/guides/crew/crew-1.0-troubleshooting.docx
+++ b/docs/guides/crew/crew-1.0-troubleshooting.docx
@@ -9056,7 +9056,7 @@
       </w:r>
       <w:r>
         <w:rPr/>
-        <w:t xml:space="preserve"> when a check refuses it. It still does not start on its own: you press Enter or type it, until T-0013 types it where the terminal can be identified. The refusal reasons are: compact was not a manual /compact; no handoff note, or it was archived as stale, or is stale and could not be archived; no resume line, </w:t>
+        <w:t xml:space="preserve"> when a check refuses it. It still does not start on its own: you press Enter or type it, until T-0013 types it where the terminal can be identified. The refusal reasons are: compact was not a manual /compact; no handoff note, or it was archived as stale, or is stale and could not be archived; the handoff is the automatic PreCompact skeleton; no resume line, </w:t>
       </w:r>
       <w:r>
         <w:rPr>
@@ -9096,7 +9096,27 @@
       </w:r>
       <w:r>
         <w:rPr/>
-        <w:t xml:space="preserve"> does not match the checkout; the ticket directory or goal file is missing; the command is not installed; the record of past auto-resumes (</w:t>
+        <w:t xml:space="preserve"> does not match the checkout; the ticket directory or goal file is missing; the command is not installed; </w:t>
+      </w:r>
+      <w:r>
+        <w:rPr>
+          <w:rStyle w:val="SourceText"/>
+        </w:rPr>
+        <w:t>handoff-author.json</w:t>
+      </w:r>
+      <w:r>
+        <w:rPr/>
+        <w:t xml:space="preserve"> could not be read; no record of which session wrote this handoff; the handoff changed since its author session wrote it; the handoff was written by another session; this session's process could not be identified (always on a host without </w:t>
+      </w:r>
+      <w:r>
+        <w:rPr>
+          <w:rStyle w:val="SourceText"/>
+        </w:rPr>
+        <w:t>/proc</w:t>
+      </w:r>
+      <w:r>
+        <w:rPr/>
+        <w:t>, such as native Windows or macOS); the record of past auto-resumes (</w:t>
       </w:r>
       <w:r>
         <w:rPr>
@@ -9106,7 +9126,17 @@
       </w:r>
       <w:r>
         <w:rPr/>
-        <w:t xml:space="preserve">) exists and could not be read; this handoff was already resumed; the progress fingerprint could not be computed; the same command with no progress since the last auto-resume. Never on a plain </w:t>
+        <w:t xml:space="preserve">) could not be read, or its directory cannot be searched; this handoff was already resumed; the progress fingerprint could not be computed; the same command with no progress since the last auto-resume; </w:t>
+      </w:r>
+      <w:r>
+        <w:rPr>
+          <w:rStyle w:val="SourceText"/>
+        </w:rPr>
+        <w:t>internal error</w:t>
+      </w:r>
+      <w:r>
+        <w:rPr/>
+        <w:t xml:space="preserve"> (the decision itself failed, and the handoff is still injected). Never on a plain </w:t>
       </w:r>
       <w:r>
         <w:rPr>
@@ -9117,6 +9147,58 @@
       <w:r>
         <w:rPr/>
         <w:t>.</w:t>
+      </w:r>
+    </w:p>
+    <w:p>
+      <w:pPr>
+        <w:pStyle w:val="BodyText"/>
+        <w:bidi w:val="0"/>
+        <w:jc w:val="left"/>
+        <w:rPr/>
+      </w:pPr>
+      <w:r>
+        <w:rPr/>
+        <w:t xml:space="preserve">A note resumes only in the session that wrote it. Write it with the Write tool (as </w:t>
+      </w:r>
+      <w:r>
+        <w:rPr>
+          <w:rStyle w:val="SourceText"/>
+        </w:rPr>
+        <w:t>/crew:handoff</w:t>
+      </w:r>
+      <w:r>
+        <w:rPr/>
+        <w:t xml:space="preserve"> does): the context hook then records which session and which Claude Code process wrote it. After </w:t>
+      </w:r>
+      <w:r>
+        <w:rPr>
+          <w:rStyle w:val="SourceText"/>
+        </w:rPr>
+        <w:t>/compact</w:t>
+      </w:r>
+      <w:r>
+        <w:rPr/>
+        <w:t xml:space="preserve"> the session must match; after </w:t>
+      </w:r>
+      <w:r>
+        <w:rPr>
+          <w:rStyle w:val="SourceText"/>
+        </w:rPr>
+        <w:t>/clear</w:t>
+      </w:r>
+      <w:r>
+        <w:rPr/>
+        <w:t xml:space="preserve"> the process must, so a </w:t>
+      </w:r>
+      <w:r>
+        <w:rPr>
+          <w:rStyle w:val="SourceText"/>
+        </w:rPr>
+        <w:t>/clear</w:t>
+      </w:r>
+      <w:r>
+        <w:rPr/>
+        <w:t xml:space="preserve"> in another terminal on the same worktree waits. A note written by Bash or by hand waits.</w:t>
       </w:r>
     </w:p>
     <w:p>

</xml_diff>

<commit_message>
crew: T-0064 docs - crew-graph Build checks the denylist first, Secrets denylist and Tainted graph sections, crew-setup 3e, onboard/upgrade/status, README, PLUGINS.md, troubleshooting guide rebuilt
</commit_message>
<xml_diff>
--- a/docs/guides/crew/crew-1.0-troubleshooting.docx
+++ b/docs/guides/crew/crew-1.0-troubleshooting.docx
@@ -6431,8 +6431,578 @@
         <w:jc w:val="left"/>
         <w:rPr/>
       </w:pPr>
-      <w:bookmarkStart w:id="10" w:name="turning-things-off"/>
+      <w:bookmarkStart w:id="10" w:name="graph-refresh-refused-secrets-denylisted"/>
       <w:bookmarkEnd w:id="10"/>
+      <w:r>
+        <w:rPr/>
+        <w:t>Graph Refresh Refused: Secrets-Denylisted Path</w:t>
+      </w:r>
+    </w:p>
+    <w:p>
+      <w:pPr>
+        <w:pStyle w:val="BodyText"/>
+        <w:bidi w:val="0"/>
+        <w:jc w:val="left"/>
+        <w:rPr/>
+      </w:pPr>
+      <w:r>
+        <w:rPr/>
+        <w:t xml:space="preserve">graphify reads every file its ignore rules do not exclude and records the symbols it finds in </w:t>
+      </w:r>
+      <w:r>
+        <w:rPr>
+          <w:rStyle w:val="SourceText"/>
+        </w:rPr>
+        <w:t>graph.json</w:t>
+      </w:r>
+      <w:r>
+        <w:rPr/>
+        <w:t xml:space="preserve">. For a file git tracks, </w:t>
+      </w:r>
+      <w:r>
+        <w:rPr>
+          <w:rStyle w:val="SourceText"/>
+        </w:rPr>
+        <w:t>.gitignore</w:t>
+      </w:r>
+      <w:r>
+        <w:rPr/>
+        <w:t xml:space="preserve"> does not stop it: only </w:t>
+      </w:r>
+      <w:r>
+        <w:rPr>
+          <w:rStyle w:val="SourceText"/>
+        </w:rPr>
+        <w:t>.graphifyignore</w:t>
+      </w:r>
+      <w:r>
+        <w:rPr/>
+        <w:t xml:space="preserve"> does. So crew checks, before it names or runs a graph build, that the root </w:t>
+      </w:r>
+      <w:r>
+        <w:rPr>
+          <w:rStyle w:val="SourceText"/>
+        </w:rPr>
+        <w:t>.graphifyignore</w:t>
+      </w:r>
+      <w:r>
+        <w:rPr/>
+        <w:t xml:space="preserve"> excludes every file the secrets denylist matches.</w:t>
+      </w:r>
+    </w:p>
+    <w:p>
+      <w:pPr>
+        <w:pStyle w:val="BodyText"/>
+        <w:numPr>
+          <w:ilvl w:val="0"/>
+          <w:numId w:val="15"/>
+        </w:numPr>
+        <w:tabs>
+          <w:tab w:val="clear" w:pos="1134"/>
+          <w:tab w:val="left" w:pos="829" w:leader="none"/>
+        </w:tabs>
+        <w:bidi w:val="0"/>
+        <w:ind w:hanging="283" w:left="829"/>
+        <w:jc w:val="left"/>
+        <w:rPr/>
+      </w:pPr>
+      <w:r>
+        <w:rPr>
+          <w:rStyle w:val="Strong"/>
+        </w:rPr>
+        <w:t xml:space="preserve">Symptom: </w:t>
+      </w:r>
+      <w:r>
+        <w:rPr>
+          <w:rStyle w:val="SourceText"/>
+        </w:rPr>
+        <w:t>refresh-check</w:t>
+      </w:r>
+      <w:r>
+        <w:rPr>
+          <w:rStyle w:val="Strong"/>
+        </w:rPr>
+        <w:t xml:space="preserve"> prints </w:t>
+      </w:r>
+      <w:r>
+        <w:rPr>
+          <w:rStyle w:val="SourceText"/>
+        </w:rPr>
+        <w:t>graph graphify-out: unknown - graphify would read N secrets-denylisted path(s) .graphifyignore does not exclude: ...; stop - a refresh cannot settle this</w:t>
+      </w:r>
+      <w:r>
+        <w:rPr>
+          <w:rStyle w:val="Strong"/>
+        </w:rPr>
+        <w:t>,</w:t>
+      </w:r>
+      <w:r>
+        <w:rPr/>
+        <w:t xml:space="preserve"> or </w:t>
+      </w:r>
+      <w:r>
+        <w:rPr>
+          <w:rStyle w:val="SourceText"/>
+        </w:rPr>
+        <w:t>/crew:status</w:t>
+      </w:r>
+      <w:r>
+        <w:rPr/>
+        <w:t xml:space="preserve"> prints </w:t>
+      </w:r>
+      <w:r>
+        <w:rPr>
+          <w:rStyle w:val="SourceText"/>
+        </w:rPr>
+        <w:t>graph-ignore UNCOVERED</w:t>
+      </w:r>
+      <w:r>
+        <w:rPr/>
+        <w:t xml:space="preserve">. </w:t>
+      </w:r>
+      <w:r>
+        <w:rPr>
+          <w:rStyle w:val="Strong"/>
+        </w:rPr>
+        <w:t>Check:</w:t>
+      </w:r>
+      <w:r>
+        <w:rPr/>
+        <w:t xml:space="preserve"> which files, and from which source. </w:t>
+      </w:r>
+    </w:p>
+    <w:p>
+      <w:pPr>
+        <w:pStyle w:val="PreformattedText"/>
+        <w:bidi w:val="0"/>
+        <w:jc w:val="left"/>
+        <w:rPr/>
+      </w:pPr>
+      <w:r>
+        <w:rPr>
+          <w:rStyle w:val="SourceText"/>
+        </w:rPr>
+        <w:t>python3 "&lt;crew&gt;/hooks/scripts/crew_graph_ignore.py" --root . --check --json</w:t>
+      </w:r>
+    </w:p>
+    <w:p>
+      <w:pPr>
+        <w:pStyle w:val="BodyText"/>
+        <w:bidi w:val="0"/>
+        <w:jc w:val="left"/>
+        <w:rPr/>
+      </w:pPr>
+      <w:r>
+        <w:rPr/>
+        <w:t>The denylist is the built-in patterns (</w:t>
+      </w:r>
+      <w:r>
+        <w:rPr>
+          <w:rStyle w:val="SourceText"/>
+        </w:rPr>
+        <w:t>.env</w:t>
+      </w:r>
+      <w:r>
+        <w:rPr/>
+        <w:t xml:space="preserve">, </w:t>
+      </w:r>
+      <w:r>
+        <w:rPr>
+          <w:rStyle w:val="SourceText"/>
+        </w:rPr>
+        <w:t>.env.*</w:t>
+      </w:r>
+      <w:r>
+        <w:rPr/>
+        <w:t xml:space="preserve"> but not </w:t>
+      </w:r>
+      <w:r>
+        <w:rPr>
+          <w:rStyle w:val="SourceText"/>
+        </w:rPr>
+        <w:t>.env.example</w:t>
+      </w:r>
+      <w:r>
+        <w:rPr/>
+        <w:t xml:space="preserve">, </w:t>
+      </w:r>
+      <w:r>
+        <w:rPr>
+          <w:rStyle w:val="SourceText"/>
+        </w:rPr>
+        <w:t>*.pem</w:t>
+      </w:r>
+      <w:r>
+        <w:rPr/>
+        <w:t xml:space="preserve">, </w:t>
+      </w:r>
+      <w:r>
+        <w:rPr>
+          <w:rStyle w:val="SourceText"/>
+        </w:rPr>
+        <w:t>*.key</w:t>
+      </w:r>
+      <w:r>
+        <w:rPr/>
+        <w:t xml:space="preserve">, </w:t>
+      </w:r>
+      <w:r>
+        <w:rPr>
+          <w:rStyle w:val="SourceText"/>
+        </w:rPr>
+        <w:t>*.p12</w:t>
+      </w:r>
+      <w:r>
+        <w:rPr/>
+        <w:t xml:space="preserve">, </w:t>
+      </w:r>
+      <w:r>
+        <w:rPr>
+          <w:rStyle w:val="SourceText"/>
+        </w:rPr>
+        <w:t>*.pfx</w:t>
+      </w:r>
+      <w:r>
+        <w:rPr/>
+        <w:t xml:space="preserve">, </w:t>
+      </w:r>
+      <w:r>
+        <w:rPr>
+          <w:rStyle w:val="SourceText"/>
+        </w:rPr>
+        <w:t>id_rsa*</w:t>
+      </w:r>
+      <w:r>
+        <w:rPr/>
+        <w:t xml:space="preserve">, </w:t>
+      </w:r>
+      <w:r>
+        <w:rPr>
+          <w:rStyle w:val="SourceText"/>
+        </w:rPr>
+        <w:t>id_ed25519*</w:t>
+      </w:r>
+      <w:r>
+        <w:rPr/>
+        <w:t xml:space="preserve">), </w:t>
+      </w:r>
+      <w:r>
+        <w:rPr>
+          <w:rStyle w:val="SourceText"/>
+        </w:rPr>
+        <w:t>.claude/secrets-denylist</w:t>
+      </w:r>
+      <w:r>
+        <w:rPr/>
+        <w:t xml:space="preserve"> if it exists, and every in-repo </w:t>
+      </w:r>
+      <w:r>
+        <w:rPr>
+          <w:rStyle w:val="SourceText"/>
+        </w:rPr>
+        <w:t>Read(...)</w:t>
+      </w:r>
+      <w:r>
+        <w:rPr/>
+        <w:t xml:space="preserve"> rule in </w:t>
+      </w:r>
+      <w:r>
+        <w:rPr>
+          <w:rStyle w:val="SourceText"/>
+        </w:rPr>
+        <w:t>permissions.deny</w:t>
+      </w:r>
+      <w:r>
+        <w:rPr/>
+        <w:t xml:space="preserve"> of </w:t>
+      </w:r>
+      <w:r>
+        <w:rPr>
+          <w:rStyle w:val="SourceText"/>
+        </w:rPr>
+        <w:t>.claude/settings.json</w:t>
+      </w:r>
+      <w:r>
+        <w:rPr/>
+        <w:t xml:space="preserve"> and </w:t>
+      </w:r>
+      <w:r>
+        <w:rPr>
+          <w:rStyle w:val="SourceText"/>
+        </w:rPr>
+        <w:t>.claude/settings.local.json</w:t>
+      </w:r>
+      <w:r>
+        <w:rPr/>
+        <w:t xml:space="preserve">. </w:t>
+      </w:r>
+      <w:r>
+        <w:rPr>
+          <w:rStyle w:val="SourceText"/>
+        </w:rPr>
+        <w:t>sources</w:t>
+      </w:r>
+      <w:r>
+        <w:rPr/>
+        <w:t xml:space="preserve"> in the JSON names which ones were read. </w:t>
+      </w:r>
+      <w:r>
+        <w:rPr>
+          <w:rStyle w:val="Strong"/>
+        </w:rPr>
+        <w:t>Fix:</w:t>
+      </w:r>
+      <w:r>
+        <w:rPr/>
+        <w:t xml:space="preserve"> add the missing patterns, then check again.</w:t>
+      </w:r>
+    </w:p>
+    <w:p>
+      <w:pPr>
+        <w:pStyle w:val="PreformattedText"/>
+        <w:bidi w:val="0"/>
+        <w:jc w:val="left"/>
+        <w:rPr/>
+      </w:pPr>
+      <w:r>
+        <w:rPr>
+          <w:rStyle w:val="SourceText"/>
+        </w:rPr>
+        <w:t>python3 "&lt;crew&gt;/hooks/scripts/crew_graph_ignore.py" --root . --write</w:t>
+      </w:r>
+    </w:p>
+    <w:p>
+      <w:pPr>
+        <w:pStyle w:val="BodyText"/>
+        <w:bidi w:val="0"/>
+        <w:jc w:val="left"/>
+        <w:rPr/>
+      </w:pPr>
+      <w:r>
+        <w:rPr/>
+        <w:t xml:space="preserve">It appends only the missing patterns, under one marked block, and leaves every existing line as it was. Commit </w:t>
+      </w:r>
+      <w:r>
+        <w:rPr>
+          <w:rStyle w:val="SourceText"/>
+        </w:rPr>
+        <w:t>.graphifyignore</w:t>
+      </w:r>
+      <w:r>
+        <w:rPr/>
+        <w:t>, then re-run the refresh check.</w:t>
+      </w:r>
+    </w:p>
+    <w:p>
+      <w:pPr>
+        <w:pStyle w:val="BodyText"/>
+        <w:numPr>
+          <w:ilvl w:val="0"/>
+          <w:numId w:val="16"/>
+        </w:numPr>
+        <w:tabs>
+          <w:tab w:val="clear" w:pos="1134"/>
+          <w:tab w:val="left" w:pos="829" w:leader="none"/>
+        </w:tabs>
+        <w:bidi w:val="0"/>
+        <w:ind w:hanging="283" w:left="829"/>
+        <w:jc w:val="left"/>
+        <w:rPr/>
+      </w:pPr>
+      <w:r>
+        <w:rPr>
+          <w:rStyle w:val="Strong"/>
+        </w:rPr>
+        <w:t xml:space="preserve">Symptom: </w:t>
+      </w:r>
+      <w:r>
+        <w:rPr>
+          <w:rStyle w:val="SourceText"/>
+        </w:rPr>
+        <w:t>denylist coverage unknown: &lt;reason&gt;</w:t>
+      </w:r>
+      <w:r>
+        <w:rPr/>
+        <w:t xml:space="preserve"> (the refresh check) or </w:t>
+      </w:r>
+      <w:r>
+        <w:rPr>
+          <w:rStyle w:val="SourceText"/>
+        </w:rPr>
+        <w:t>graph-ignore unknown</w:t>
+      </w:r>
+      <w:r>
+        <w:rPr/>
+        <w:t xml:space="preserve"> (</w:t>
+      </w:r>
+      <w:r>
+        <w:rPr>
+          <w:rStyle w:val="SourceText"/>
+        </w:rPr>
+        <w:t>/crew:status</w:t>
+      </w:r>
+      <w:r>
+        <w:rPr/>
+        <w:t xml:space="preserve">). </w:t>
+      </w:r>
+      <w:r>
+        <w:rPr>
+          <w:rStyle w:val="Strong"/>
+        </w:rPr>
+        <w:t>Check:</w:t>
+      </w:r>
+      <w:r>
+        <w:rPr/>
+        <w:t xml:space="preserve"> the reason names it: git missing, a settings file that does not parse, an unreadable </w:t>
+      </w:r>
+      <w:r>
+        <w:rPr>
+          <w:rStyle w:val="SourceText"/>
+        </w:rPr>
+        <w:t>.claude/secrets-denylist</w:t>
+      </w:r>
+      <w:r>
+        <w:rPr/>
+        <w:t xml:space="preserve"> or </w:t>
+      </w:r>
+      <w:r>
+        <w:rPr>
+          <w:rStyle w:val="SourceText"/>
+        </w:rPr>
+        <w:t>.graphifyignore</w:t>
+      </w:r>
+      <w:r>
+        <w:rPr/>
+        <w:t xml:space="preserve">, a nested </w:t>
+      </w:r>
+      <w:r>
+        <w:rPr>
+          <w:rStyle w:val="SourceText"/>
+        </w:rPr>
+        <w:t>.graphifyignore</w:t>
+      </w:r>
+      <w:r>
+        <w:rPr/>
+        <w:t xml:space="preserve"> (only the root one is evaluated, and a nested one could re-include a file with </w:t>
+      </w:r>
+      <w:r>
+        <w:rPr>
+          <w:rStyle w:val="SourceText"/>
+        </w:rPr>
+        <w:t>!</w:t>
+      </w:r>
+      <w:r>
+        <w:rPr/>
+        <w:t xml:space="preserve">), or a deny-all </w:t>
+      </w:r>
+      <w:r>
+        <w:rPr>
+          <w:rStyle w:val="SourceText"/>
+        </w:rPr>
+        <w:t>Read</w:t>
+      </w:r>
+      <w:r>
+        <w:rPr/>
+        <w:t xml:space="preserve"> rule. </w:t>
+      </w:r>
+      <w:r>
+        <w:rPr>
+          <w:rStyle w:val="Strong"/>
+        </w:rPr>
+        <w:t>Fix:</w:t>
+      </w:r>
+      <w:r>
+        <w:rPr/>
+        <w:t xml:space="preserve"> repair what it names. An unknown is never read as covered, so no refresh is named until it is fixed.</w:t>
+      </w:r>
+    </w:p>
+    <w:p>
+      <w:pPr>
+        <w:pStyle w:val="BodyText"/>
+        <w:numPr>
+          <w:ilvl w:val="0"/>
+          <w:numId w:val="16"/>
+        </w:numPr>
+        <w:tabs>
+          <w:tab w:val="clear" w:pos="1134"/>
+          <w:tab w:val="left" w:pos="829" w:leader="none"/>
+        </w:tabs>
+        <w:bidi w:val="0"/>
+        <w:ind w:hanging="283" w:left="829"/>
+        <w:jc w:val="left"/>
+        <w:rPr/>
+      </w:pPr>
+      <w:r>
+        <w:rPr>
+          <w:rStyle w:val="Strong"/>
+        </w:rPr>
+        <w:t>Symptom: a graph was built before the fix</w:t>
+      </w:r>
+      <w:r>
+        <w:rPr/>
+        <w:t xml:space="preserve"> (by hand, or by graphify's post-commit hook, which bypasses crew). </w:t>
+      </w:r>
+      <w:r>
+        <w:rPr>
+          <w:rStyle w:val="Strong"/>
+        </w:rPr>
+        <w:t>Fix:</w:t>
+      </w:r>
+      <w:r>
+        <w:rPr/>
+        <w:t xml:space="preserve"> treat that graph as holding text from the secret files. Delete the graph output directory (</w:t>
+      </w:r>
+      <w:r>
+        <w:rPr>
+          <w:rStyle w:val="SourceText"/>
+        </w:rPr>
+        <w:t>graphify-out/</w:t>
+      </w:r>
+      <w:r>
+        <w:rPr/>
+        <w:t xml:space="preserve"> by default), run </w:t>
+      </w:r>
+      <w:r>
+        <w:rPr>
+          <w:rStyle w:val="SourceText"/>
+        </w:rPr>
+        <w:t>--write</w:t>
+      </w:r>
+      <w:r>
+        <w:rPr/>
+        <w:t xml:space="preserve">, check that </w:t>
+      </w:r>
+      <w:r>
+        <w:rPr>
+          <w:rStyle w:val="SourceText"/>
+        </w:rPr>
+        <w:t>--check</w:t>
+      </w:r>
+      <w:r>
+        <w:rPr/>
+        <w:t xml:space="preserve"> exits 0, then rebuild. Commit the rebuild if the output is tracked. The crew-graph skill's </w:t>
+      </w:r>
+      <w:r>
+        <w:rPr>
+          <w:rStyle w:val="Strong"/>
+        </w:rPr>
+        <w:t>Tainted graph</w:t>
+      </w:r>
+      <w:r>
+        <w:rPr/>
+        <w:t xml:space="preserve"> section has the same steps.</w:t>
+      </w:r>
+    </w:p>
+    <w:p>
+      <w:pPr>
+        <w:pStyle w:val="Heading2"/>
+        <w:bidi w:val="0"/>
+        <w:ind w:hanging="0" w:left="0" w:right="0"/>
+        <w:jc w:val="left"/>
+        <w:rPr/>
+      </w:pPr>
+      <w:bookmarkStart w:id="11" w:name="turning-things-off"/>
+      <w:bookmarkEnd w:id="11"/>
       <w:r>
         <w:rPr/>
         <w:t>Turning Things Off</w:t>
@@ -8142,8 +8712,8 @@
         <w:jc w:val="left"/>
         <w:rPr/>
       </w:pPr>
-      <w:bookmarkStart w:id="11" w:name="web-testing"/>
-      <w:bookmarkEnd w:id="11"/>
+      <w:bookmarkStart w:id="12" w:name="web-testing"/>
+      <w:bookmarkEnd w:id="12"/>
       <w:r>
         <w:rPr/>
         <w:t>Web Testing</w:t>
@@ -8182,7 +8752,7 @@
         <w:pStyle w:val="BodyText"/>
         <w:numPr>
           <w:ilvl w:val="0"/>
-          <w:numId w:val="15"/>
+          <w:numId w:val="17"/>
         </w:numPr>
         <w:tabs>
           <w:tab w:val="clear" w:pos="1134"/>
@@ -8256,7 +8826,7 @@
         <w:pStyle w:val="BodyText"/>
         <w:numPr>
           <w:ilvl w:val="0"/>
-          <w:numId w:val="15"/>
+          <w:numId w:val="17"/>
         </w:numPr>
         <w:tabs>
           <w:tab w:val="clear" w:pos="1134"/>
@@ -8307,441 +8877,6 @@
       <w:r>
         <w:rPr/>
         <w:t xml:space="preserve">) skips the OS packages Chromium needs and produces a browser that launches, then crashes on first navigation. </w:t>
-      </w:r>
-    </w:p>
-    <w:p>
-      <w:pPr>
-        <w:pStyle w:val="BodyText"/>
-        <w:numPr>
-          <w:ilvl w:val="0"/>
-          <w:numId w:val="15"/>
-        </w:numPr>
-        <w:tabs>
-          <w:tab w:val="clear" w:pos="1134"/>
-          <w:tab w:val="left" w:pos="829" w:leader="none"/>
-        </w:tabs>
-        <w:bidi w:val="0"/>
-        <w:spacing w:before="120" w:after="0"/>
-        <w:ind w:hanging="283" w:left="829"/>
-        <w:jc w:val="left"/>
-        <w:rPr/>
-      </w:pPr>
-      <w:r>
-        <w:rPr>
-          <w:rStyle w:val="Strong"/>
-        </w:rPr>
-        <w:t>Docker absent -&gt; visual UNVERIFIED, not a fail.</w:t>
-      </w:r>
-      <w:r>
-        <w:rPr/>
-        <w:t xml:space="preserve"> </w:t>
-      </w:r>
-      <w:r>
-        <w:rPr>
-          <w:rStyle w:val="SourceText"/>
-        </w:rPr>
-        <w:t>toHaveScreenshot</w:t>
-      </w:r>
-      <w:r>
-        <w:rPr/>
-        <w:t xml:space="preserve"> baselines are only meaningful when generated inside </w:t>
-      </w:r>
-      <w:r>
-        <w:rPr>
-          <w:rStyle w:val="SourceText"/>
-        </w:rPr>
-        <w:t>mcr.microsoft.com/playwright:v1.63.0-noble</w:t>
-      </w:r>
-      <w:r>
-        <w:rPr/>
-        <w:t xml:space="preserve"> — the installer warns rather than blocking when Docker is missing, and the visual </w:t>
-      </w:r>
-      <w:r>
-        <w:rPr>
-          <w:rStyle w:val="SourceText"/>
-        </w:rPr>
-        <w:t>verify.json</w:t>
-      </w:r>
-      <w:r>
-        <w:rPr/>
-        <w:t xml:space="preserve"> rule is written to skip (report UNVERIFIED) outside that image rather than compare against a baseline that can never match. </w:t>
-      </w:r>
-    </w:p>
-    <w:p>
-      <w:pPr>
-        <w:pStyle w:val="BodyText"/>
-        <w:numPr>
-          <w:ilvl w:val="0"/>
-          <w:numId w:val="15"/>
-        </w:numPr>
-        <w:tabs>
-          <w:tab w:val="clear" w:pos="1134"/>
-          <w:tab w:val="left" w:pos="829" w:leader="none"/>
-        </w:tabs>
-        <w:bidi w:val="0"/>
-        <w:ind w:hanging="283" w:left="829"/>
-        <w:jc w:val="left"/>
-        <w:rPr/>
-      </w:pPr>
-      <w:r>
-        <w:rPr>
-          <w:rStyle w:val="Strong"/>
-        </w:rPr>
-        <w:t>MCP server won't connect on Windows.</w:t>
-      </w:r>
-      <w:r>
-        <w:rPr/>
-        <w:t xml:space="preserve"> Both </w:t>
-      </w:r>
-      <w:r>
-        <w:rPr>
-          <w:rStyle w:val="SourceText"/>
-        </w:rPr>
-        <w:t>@playwright/mcp</w:t>
-      </w:r>
-      <w:r>
-        <w:rPr/>
-        <w:t xml:space="preserve"> and </w:t>
-      </w:r>
-      <w:r>
-        <w:rPr>
-          <w:rStyle w:val="SourceText"/>
-        </w:rPr>
-        <w:t>chrome-devtools-mcp</w:t>
-      </w:r>
-      <w:r>
-        <w:rPr/>
-        <w:t xml:space="preserve"> are launched with </w:t>
-      </w:r>
-      <w:r>
-        <w:rPr>
-          <w:rStyle w:val="SourceText"/>
-        </w:rPr>
-        <w:t>npx</w:t>
-      </w:r>
-      <w:r>
-        <w:rPr/>
-        <w:t xml:space="preserve">, which the MCP host cannot invoke directly on Windows — wrap the entry as </w:t>
-      </w:r>
-      <w:r>
-        <w:rPr>
-          <w:rStyle w:val="SourceText"/>
-        </w:rPr>
-        <w:t>"command": "cmd", "args": ["/c", "npx", ...]</w:t>
-      </w:r>
-      <w:r>
-        <w:rPr/>
-        <w:t xml:space="preserve"> in </w:t>
-      </w:r>
-      <w:r>
-        <w:rPr>
-          <w:rStyle w:val="SourceText"/>
-        </w:rPr>
-        <w:t>.mcp.json</w:t>
-      </w:r>
-      <w:r>
-        <w:rPr/>
-        <w:t xml:space="preserve"> (documented in chrome-devtools-mcp's own troubleshooting for the "Connection closed" failure); the </w:t>
-      </w:r>
-      <w:r>
-        <w:rPr>
-          <w:rStyle w:val="SourceText"/>
-        </w:rPr>
-        <w:t>stack-web</w:t>
-      </w:r>
-      <w:r>
-        <w:rPr/>
-        <w:t xml:space="preserve"> skill's </w:t>
-      </w:r>
-      <w:r>
-        <w:rPr>
-          <w:rStyle w:val="SourceText"/>
-        </w:rPr>
-        <w:t>.mcp.json</w:t>
-      </w:r>
-      <w:r>
-        <w:rPr/>
-        <w:t xml:space="preserve"> example already shows this. </w:t>
-      </w:r>
-    </w:p>
-    <w:p>
-      <w:pPr>
-        <w:pStyle w:val="Heading2"/>
-        <w:bidi w:val="0"/>
-        <w:ind w:hanging="0" w:left="0" w:right="0"/>
-        <w:jc w:val="left"/>
-        <w:rPr/>
-      </w:pPr>
-      <w:bookmarkStart w:id="12" w:name="windows-notes"/>
-      <w:bookmarkEnd w:id="12"/>
-      <w:r>
-        <w:rPr/>
-        <w:t>Windows Notes</w:t>
-      </w:r>
-    </w:p>
-    <w:p>
-      <w:pPr>
-        <w:pStyle w:val="BodyText"/>
-        <w:numPr>
-          <w:ilvl w:val="0"/>
-          <w:numId w:val="16"/>
-        </w:numPr>
-        <w:tabs>
-          <w:tab w:val="clear" w:pos="1134"/>
-          <w:tab w:val="left" w:pos="829" w:leader="none"/>
-        </w:tabs>
-        <w:bidi w:val="0"/>
-        <w:spacing w:before="120" w:after="0"/>
-        <w:ind w:hanging="283" w:left="829"/>
-        <w:jc w:val="left"/>
-        <w:rPr/>
-      </w:pPr>
-      <w:r>
-        <w:rPr>
-          <w:rStyle w:val="SourceText"/>
-        </w:rPr>
-        <w:t>pwsh</w:t>
-      </w:r>
-      <w:r>
-        <w:rPr>
-          <w:rStyle w:val="Strong"/>
-        </w:rPr>
-        <w:t xml:space="preserve"> is not on Git Bash's </w:t>
-      </w:r>
-      <w:r>
-        <w:rPr>
-          <w:rStyle w:val="SourceText"/>
-        </w:rPr>
-        <w:t>PATH</w:t>
-      </w:r>
-      <w:r>
-        <w:rPr>
-          <w:rStyle w:val="Strong"/>
-        </w:rPr>
-        <w:t>.</w:t>
-      </w:r>
-      <w:r>
-        <w:rPr/>
-        <w:t xml:space="preserve"> Every script that shells out to PowerShell names it by an absolute path or resolves it explicitly; a bare </w:t>
-      </w:r>
-      <w:r>
-        <w:rPr>
-          <w:rStyle w:val="SourceText"/>
-        </w:rPr>
-        <w:t>pwsh</w:t>
-      </w:r>
-      <w:r>
-        <w:rPr/>
-        <w:t xml:space="preserve"> in a hand-typed command fails as "command not found", which is easy to misread as PowerShell itself being broken. </w:t>
-      </w:r>
-    </w:p>
-    <w:p>
-      <w:pPr>
-        <w:pStyle w:val="BodyText"/>
-        <w:numPr>
-          <w:ilvl w:val="0"/>
-          <w:numId w:val="16"/>
-        </w:numPr>
-        <w:tabs>
-          <w:tab w:val="clear" w:pos="1134"/>
-          <w:tab w:val="left" w:pos="829" w:leader="none"/>
-        </w:tabs>
-        <w:bidi w:val="0"/>
-        <w:spacing w:before="120" w:after="0"/>
-        <w:ind w:hanging="283" w:left="829"/>
-        <w:jc w:val="left"/>
-        <w:rPr/>
-      </w:pPr>
-      <w:r>
-        <w:rPr>
-          <w:rStyle w:val="Strong"/>
-        </w:rPr>
-        <w:t xml:space="preserve">Git Bash ships without </w:t>
-      </w:r>
-      <w:r>
-        <w:rPr>
-          <w:rStyle w:val="SourceText"/>
-        </w:rPr>
-        <w:t>python3</w:t>
-      </w:r>
-      <w:r>
-        <w:rPr>
-          <w:rStyle w:val="Strong"/>
-        </w:rPr>
-        <w:t>.</w:t>
-      </w:r>
-      <w:r>
-        <w:rPr/>
-        <w:t xml:space="preserve"> Every hook wrapper here resolves </w:t>
-      </w:r>
-      <w:r>
-        <w:rPr>
-          <w:rStyle w:val="SourceText"/>
-        </w:rPr>
-        <w:t>python3</w:t>
-      </w:r>
-      <w:r>
-        <w:rPr/>
-        <w:t xml:space="preserve">, then </w:t>
-      </w:r>
-      <w:r>
-        <w:rPr>
-          <w:rStyle w:val="SourceText"/>
-        </w:rPr>
-        <w:t>python</w:t>
-      </w:r>
-      <w:r>
-        <w:rPr/>
-        <w:t xml:space="preserve">, then </w:t>
-      </w:r>
-      <w:r>
-        <w:rPr>
-          <w:rStyle w:val="SourceText"/>
-        </w:rPr>
-        <w:t>py</w:t>
-      </w:r>
-      <w:r>
-        <w:rPr/>
-        <w:t xml:space="preserve">, and fails loudly on stderr rather than silently standing down when none resolves (see "no-python fail-closed", above). If a hook you expect to run says nothing at all, check for a usable Python on </w:t>
-      </w:r>
-      <w:r>
-        <w:rPr>
-          <w:rStyle w:val="SourceText"/>
-        </w:rPr>
-        <w:t>PATH</w:t>
-      </w:r>
-      <w:r>
-        <w:rPr/>
-        <w:t xml:space="preserve"> first. </w:t>
-      </w:r>
-    </w:p>
-    <w:p>
-      <w:pPr>
-        <w:pStyle w:val="BodyText"/>
-        <w:numPr>
-          <w:ilvl w:val="0"/>
-          <w:numId w:val="16"/>
-        </w:numPr>
-        <w:tabs>
-          <w:tab w:val="clear" w:pos="1134"/>
-          <w:tab w:val="left" w:pos="829" w:leader="none"/>
-        </w:tabs>
-        <w:bidi w:val="0"/>
-        <w:ind w:hanging="283" w:left="829"/>
-        <w:jc w:val="left"/>
-        <w:rPr/>
-      </w:pPr>
-      <w:r>
-        <w:rPr>
-          <w:rStyle w:val="Strong"/>
-        </w:rPr>
-        <w:t>Both flavours are always registered.</w:t>
-      </w:r>
-      <w:r>
-        <w:rPr/>
-        <w:t xml:space="preserve"> </w:t>
-      </w:r>
-      <w:r>
-        <w:rPr>
-          <w:rStyle w:val="SourceText"/>
-        </w:rPr>
-        <w:t>hooks.json</w:t>
-      </w:r>
-      <w:r>
-        <w:rPr/>
-        <w:t xml:space="preserve"> pairs every bash command with a </w:t>
-      </w:r>
-      <w:r>
-        <w:rPr>
-          <w:rStyle w:val="SourceText"/>
-        </w:rPr>
-        <w:t>shell: "powershell"</w:t>
-      </w:r>
-      <w:r>
-        <w:rPr/>
-        <w:t xml:space="preserve"> sibling on the same event, so a machine with both </w:t>
-      </w:r>
-      <w:r>
-        <w:rPr>
-          <w:rStyle w:val="SourceText"/>
-        </w:rPr>
-        <w:t>bash</w:t>
-      </w:r>
-      <w:r>
-        <w:rPr/>
-        <w:t xml:space="preserve"> and </w:t>
-      </w:r>
-      <w:r>
-        <w:rPr>
-          <w:rStyle w:val="SourceText"/>
-        </w:rPr>
-        <w:t>pwsh</w:t>
-      </w:r>
-      <w:r>
-        <w:rPr/>
-        <w:t xml:space="preserve"> present runs both. This is not double-firing to fix — it is how the same hook reaches both shells; each PowerShell twin stands itself down on the wrong platform (</w:t>
-      </w:r>
-      <w:r>
-        <w:rPr>
-          <w:rStyle w:val="SourceText"/>
-        </w:rPr>
-        <w:t>$env:OS -ne 'Windows_NT'</w:t>
-      </w:r>
-      <w:r>
-        <w:rPr/>
-        <w:t xml:space="preserve">) rather than the bash twin doing that job. </w:t>
-      </w:r>
-    </w:p>
-    <w:p>
-      <w:pPr>
-        <w:pStyle w:val="Heading2"/>
-        <w:bidi w:val="0"/>
-        <w:ind w:hanging="0" w:left="0" w:right="0"/>
-        <w:jc w:val="left"/>
-        <w:rPr/>
-      </w:pPr>
-      <w:bookmarkStart w:id="13" w:name="auto-wrap-up-auto-clear-and-auto-resume"/>
-      <w:bookmarkEnd w:id="13"/>
-      <w:r>
-        <w:rPr/>
-        <w:t>Auto Wrap-Up, Auto-Clear and Auto-Resume</w:t>
-      </w:r>
-    </w:p>
-    <w:p>
-      <w:pPr>
-        <w:pStyle w:val="BodyText"/>
-        <w:bidi w:val="0"/>
-        <w:jc w:val="left"/>
-        <w:rPr/>
-      </w:pPr>
-      <w:r>
-        <w:rPr/>
-        <w:t>This section is folded into the troubleshooting guide (</w:t>
-      </w:r>
-      <w:r>
-        <w:rPr>
-          <w:rStyle w:val="SourceText"/>
-        </w:rPr>
-        <w:t>troubleshooting.md</w:t>
-      </w:r>
-      <w:r>
-        <w:rPr/>
-        <w:t>), linked from it as "Auto wrap-up, clear and resume". It covers the cycle that lets a long session finish itself cleanly, clear, and pick up where it stopped.</w:t>
-      </w:r>
-    </w:p>
-    <w:p>
-      <w:pPr>
-        <w:pStyle w:val="Heading3"/>
-        <w:bidi w:val="0"/>
-        <w:ind w:hanging="0" w:left="0" w:right="0"/>
-        <w:jc w:val="left"/>
-        <w:rPr/>
-      </w:pPr>
-      <w:bookmarkStart w:id="14" w:name="what-the-cycle-does"/>
-      <w:bookmarkEnd w:id="14"/>
-      <w:r>
-        <w:rPr/>
-        <w:t>What the Cycle Does</w:t>
       </w:r>
     </w:p>
     <w:p>
@@ -8765,31 +8900,41 @@
         <w:rPr>
           <w:rStyle w:val="Strong"/>
         </w:rPr>
-        <w:t>Wrap-up.</w:t>
-      </w:r>
-      <w:r>
-        <w:rPr/>
-        <w:t xml:space="preserve"> When the context window crosses its threshold, the </w:t>
-      </w:r>
-      <w:r>
-        <w:rPr>
-          <w:rStyle w:val="SourceText"/>
-        </w:rPr>
-        <w:t>Stop</w:t>
-      </w:r>
-      <w:r>
-        <w:rPr/>
-        <w:t xml:space="preserve"> hook blocks once. It asks the session to finish or park the change in flight, write </w:t>
-      </w:r>
-      <w:r>
-        <w:rPr>
-          <w:rStyle w:val="SourceText"/>
-        </w:rPr>
-        <w:t>.work/HANDOFF.md</w:t>
-      </w:r>
-      <w:r>
-        <w:rPr/>
-        <w:t xml:space="preserve">, and update the ticket. This happens once for each threshold crossing in each session. It never happens on the forced continuation that follows a block. </w:t>
+        <w:t>Docker absent -&gt; visual UNVERIFIED, not a fail.</w:t>
+      </w:r>
+      <w:r>
+        <w:rPr/>
+        <w:t xml:space="preserve"> </w:t>
+      </w:r>
+      <w:r>
+        <w:rPr>
+          <w:rStyle w:val="SourceText"/>
+        </w:rPr>
+        <w:t>toHaveScreenshot</w:t>
+      </w:r>
+      <w:r>
+        <w:rPr/>
+        <w:t xml:space="preserve"> baselines are only meaningful when generated inside </w:t>
+      </w:r>
+      <w:r>
+        <w:rPr>
+          <w:rStyle w:val="SourceText"/>
+        </w:rPr>
+        <w:t>mcr.microsoft.com/playwright:v1.63.0-noble</w:t>
+      </w:r>
+      <w:r>
+        <w:rPr/>
+        <w:t xml:space="preserve"> — the installer warns rather than blocking when Docker is missing, and the visual </w:t>
+      </w:r>
+      <w:r>
+        <w:rPr>
+          <w:rStyle w:val="SourceText"/>
+        </w:rPr>
+        <w:t>verify.json</w:t>
+      </w:r>
+      <w:r>
+        <w:rPr/>
+        <w:t xml:space="preserve"> rule is written to skip (report UNVERIFIED) outside that image rather than compare against a baseline that can never match. </w:t>
       </w:r>
     </w:p>
     <w:p>
@@ -8812,67 +8957,17 @@
         <w:rPr>
           <w:rStyle w:val="Strong"/>
         </w:rPr>
-        <w:t>Clear, or notify.</w:t>
-      </w:r>
-      <w:r>
-        <w:rPr/>
-        <w:t xml:space="preserve"> After the handoff is written, auto-clear acts on it. What it does depends on </w:t>
-      </w:r>
-      <w:r>
-        <w:rPr>
-          <w:rStyle w:val="SourceText"/>
-        </w:rPr>
-        <w:t>method</w:t>
-      </w:r>
-      <w:r>
-        <w:rPr/>
-        <w:t xml:space="preserve"> (below): </w:t>
-      </w:r>
-      <w:r>
-        <w:rPr>
-          <w:rStyle w:val="SourceText"/>
-        </w:rPr>
-        <w:t>notify</w:t>
-      </w:r>
-      <w:r>
-        <w:rPr/>
-        <w:t xml:space="preserve"> (the default on native Windows) prints a message telling you the handoff is written and it is safe to run </w:t>
-      </w:r>
-      <w:r>
-        <w:rPr>
-          <w:rStyle w:val="SourceText"/>
-        </w:rPr>
-        <w:t>/clear</w:t>
-      </w:r>
-      <w:r>
-        <w:rPr/>
-        <w:t xml:space="preserve"> (or </w:t>
-      </w:r>
-      <w:r>
-        <w:rPr>
-          <w:rStyle w:val="SourceText"/>
-        </w:rPr>
-        <w:t>/compact</w:t>
-      </w:r>
-      <w:r>
-        <w:rPr/>
-        <w:t xml:space="preserve">) yourself — it types nothing. </w:t>
-      </w:r>
-      <w:r>
-        <w:rPr>
-          <w:rStyle w:val="SourceText"/>
-        </w:rPr>
-        <w:t>tmux</w:t>
-      </w:r>
-      <w:r>
-        <w:rPr/>
-        <w:t xml:space="preserve">, </w:t>
-      </w:r>
-      <w:r>
-        <w:rPr>
-          <w:rStyle w:val="SourceText"/>
-        </w:rPr>
-        <w:t>xdotool</w:t>
+        <w:t>MCP server won't connect on Windows.</w:t>
+      </w:r>
+      <w:r>
+        <w:rPr/>
+        <w:t xml:space="preserve"> Both </w:t>
+      </w:r>
+      <w:r>
+        <w:rPr>
+          <w:rStyle w:val="SourceText"/>
+        </w:rPr>
+        <w:t>@playwright/mcp</w:t>
       </w:r>
       <w:r>
         <w:rPr/>
@@ -8882,51 +8977,304 @@
         <w:rPr>
           <w:rStyle w:val="SourceText"/>
         </w:rPr>
-        <w:t>sendkeys</w:t>
-      </w:r>
-      <w:r>
-        <w:rPr/>
-        <w:t xml:space="preserve"> actually type the configured command into the terminal that runs this session. Whichever method is in force, it acts only when all four of these hold: - this machine opted in; - the handoff was written by this session after the wrap-up request, is longer than a stub, and is not the automatic PreCompact skeleton; - the context reading that caused the wrap-up was a real measurement (see "When it will not clear"); - for a method that types (</w:t>
-      </w:r>
-      <w:r>
-        <w:rPr>
-          <w:rStyle w:val="SourceText"/>
-        </w:rPr>
-        <w:t>tmux</w:t>
-      </w:r>
-      <w:r>
-        <w:rPr/>
-        <w:t>/</w:t>
-      </w:r>
-      <w:r>
-        <w:rPr>
-          <w:rStyle w:val="SourceText"/>
-        </w:rPr>
-        <w:t>xdotool</w:t>
-      </w:r>
-      <w:r>
-        <w:rPr/>
-        <w:t>/</w:t>
-      </w:r>
-      <w:r>
-        <w:rPr>
-          <w:rStyle w:val="SourceText"/>
-        </w:rPr>
-        <w:t>sendkeys</w:t>
-      </w:r>
-      <w:r>
-        <w:rPr/>
-        <w:t xml:space="preserve">), the target window can be identified exactly — </w:t>
-      </w:r>
-      <w:r>
-        <w:rPr>
-          <w:rStyle w:val="SourceText"/>
-        </w:rPr>
-        <w:t>notify</w:t>
-      </w:r>
-      <w:r>
-        <w:rPr/>
-        <w:t xml:space="preserve"> needs none of this, since it identifies no window. </w:t>
+        <w:t>chrome-devtools-mcp</w:t>
+      </w:r>
+      <w:r>
+        <w:rPr/>
+        <w:t xml:space="preserve"> are launched with </w:t>
+      </w:r>
+      <w:r>
+        <w:rPr>
+          <w:rStyle w:val="SourceText"/>
+        </w:rPr>
+        <w:t>npx</w:t>
+      </w:r>
+      <w:r>
+        <w:rPr/>
+        <w:t xml:space="preserve">, which the MCP host cannot invoke directly on Windows — wrap the entry as </w:t>
+      </w:r>
+      <w:r>
+        <w:rPr>
+          <w:rStyle w:val="SourceText"/>
+        </w:rPr>
+        <w:t>"command": "cmd", "args": ["/c", "npx", ...]</w:t>
+      </w:r>
+      <w:r>
+        <w:rPr/>
+        <w:t xml:space="preserve"> in </w:t>
+      </w:r>
+      <w:r>
+        <w:rPr>
+          <w:rStyle w:val="SourceText"/>
+        </w:rPr>
+        <w:t>.mcp.json</w:t>
+      </w:r>
+      <w:r>
+        <w:rPr/>
+        <w:t xml:space="preserve"> (documented in chrome-devtools-mcp's own troubleshooting for the "Connection closed" failure); the </w:t>
+      </w:r>
+      <w:r>
+        <w:rPr>
+          <w:rStyle w:val="SourceText"/>
+        </w:rPr>
+        <w:t>stack-web</w:t>
+      </w:r>
+      <w:r>
+        <w:rPr/>
+        <w:t xml:space="preserve"> skill's </w:t>
+      </w:r>
+      <w:r>
+        <w:rPr>
+          <w:rStyle w:val="SourceText"/>
+        </w:rPr>
+        <w:t>.mcp.json</w:t>
+      </w:r>
+      <w:r>
+        <w:rPr/>
+        <w:t xml:space="preserve"> example already shows this. </w:t>
+      </w:r>
+    </w:p>
+    <w:p>
+      <w:pPr>
+        <w:pStyle w:val="Heading2"/>
+        <w:bidi w:val="0"/>
+        <w:ind w:hanging="0" w:left="0" w:right="0"/>
+        <w:jc w:val="left"/>
+        <w:rPr/>
+      </w:pPr>
+      <w:bookmarkStart w:id="13" w:name="windows-notes"/>
+      <w:bookmarkEnd w:id="13"/>
+      <w:r>
+        <w:rPr/>
+        <w:t>Windows Notes</w:t>
+      </w:r>
+    </w:p>
+    <w:p>
+      <w:pPr>
+        <w:pStyle w:val="BodyText"/>
+        <w:numPr>
+          <w:ilvl w:val="0"/>
+          <w:numId w:val="18"/>
+        </w:numPr>
+        <w:tabs>
+          <w:tab w:val="clear" w:pos="1134"/>
+          <w:tab w:val="left" w:pos="829" w:leader="none"/>
+        </w:tabs>
+        <w:bidi w:val="0"/>
+        <w:spacing w:before="120" w:after="0"/>
+        <w:ind w:hanging="283" w:left="829"/>
+        <w:jc w:val="left"/>
+        <w:rPr/>
+      </w:pPr>
+      <w:r>
+        <w:rPr>
+          <w:rStyle w:val="SourceText"/>
+        </w:rPr>
+        <w:t>pwsh</w:t>
+      </w:r>
+      <w:r>
+        <w:rPr>
+          <w:rStyle w:val="Strong"/>
+        </w:rPr>
+        <w:t xml:space="preserve"> is not on Git Bash's </w:t>
+      </w:r>
+      <w:r>
+        <w:rPr>
+          <w:rStyle w:val="SourceText"/>
+        </w:rPr>
+        <w:t>PATH</w:t>
+      </w:r>
+      <w:r>
+        <w:rPr>
+          <w:rStyle w:val="Strong"/>
+        </w:rPr>
+        <w:t>.</w:t>
+      </w:r>
+      <w:r>
+        <w:rPr/>
+        <w:t xml:space="preserve"> Every script that shells out to PowerShell names it by an absolute path or resolves it explicitly; a bare </w:t>
+      </w:r>
+      <w:r>
+        <w:rPr>
+          <w:rStyle w:val="SourceText"/>
+        </w:rPr>
+        <w:t>pwsh</w:t>
+      </w:r>
+      <w:r>
+        <w:rPr/>
+        <w:t xml:space="preserve"> in a hand-typed command fails as "command not found", which is easy to misread as PowerShell itself being broken. </w:t>
+      </w:r>
+    </w:p>
+    <w:p>
+      <w:pPr>
+        <w:pStyle w:val="BodyText"/>
+        <w:numPr>
+          <w:ilvl w:val="0"/>
+          <w:numId w:val="18"/>
+        </w:numPr>
+        <w:tabs>
+          <w:tab w:val="clear" w:pos="1134"/>
+          <w:tab w:val="left" w:pos="829" w:leader="none"/>
+        </w:tabs>
+        <w:bidi w:val="0"/>
+        <w:spacing w:before="120" w:after="0"/>
+        <w:ind w:hanging="283" w:left="829"/>
+        <w:jc w:val="left"/>
+        <w:rPr/>
+      </w:pPr>
+      <w:r>
+        <w:rPr>
+          <w:rStyle w:val="Strong"/>
+        </w:rPr>
+        <w:t xml:space="preserve">Git Bash ships without </w:t>
+      </w:r>
+      <w:r>
+        <w:rPr>
+          <w:rStyle w:val="SourceText"/>
+        </w:rPr>
+        <w:t>python3</w:t>
+      </w:r>
+      <w:r>
+        <w:rPr>
+          <w:rStyle w:val="Strong"/>
+        </w:rPr>
+        <w:t>.</w:t>
+      </w:r>
+      <w:r>
+        <w:rPr/>
+        <w:t xml:space="preserve"> Every hook wrapper here resolves </w:t>
+      </w:r>
+      <w:r>
+        <w:rPr>
+          <w:rStyle w:val="SourceText"/>
+        </w:rPr>
+        <w:t>python3</w:t>
+      </w:r>
+      <w:r>
+        <w:rPr/>
+        <w:t xml:space="preserve">, then </w:t>
+      </w:r>
+      <w:r>
+        <w:rPr>
+          <w:rStyle w:val="SourceText"/>
+        </w:rPr>
+        <w:t>python</w:t>
+      </w:r>
+      <w:r>
+        <w:rPr/>
+        <w:t xml:space="preserve">, then </w:t>
+      </w:r>
+      <w:r>
+        <w:rPr>
+          <w:rStyle w:val="SourceText"/>
+        </w:rPr>
+        <w:t>py</w:t>
+      </w:r>
+      <w:r>
+        <w:rPr/>
+        <w:t xml:space="preserve">, and fails loudly on stderr rather than silently standing down when none resolves (see "no-python fail-closed", above). If a hook you expect to run says nothing at all, check for a usable Python on </w:t>
+      </w:r>
+      <w:r>
+        <w:rPr>
+          <w:rStyle w:val="SourceText"/>
+        </w:rPr>
+        <w:t>PATH</w:t>
+      </w:r>
+      <w:r>
+        <w:rPr/>
+        <w:t xml:space="preserve"> first. </w:t>
+      </w:r>
+    </w:p>
+    <w:p>
+      <w:pPr>
+        <w:pStyle w:val="BodyText"/>
+        <w:numPr>
+          <w:ilvl w:val="0"/>
+          <w:numId w:val="18"/>
+        </w:numPr>
+        <w:tabs>
+          <w:tab w:val="clear" w:pos="1134"/>
+          <w:tab w:val="left" w:pos="829" w:leader="none"/>
+        </w:tabs>
+        <w:bidi w:val="0"/>
+        <w:ind w:hanging="283" w:left="829"/>
+        <w:jc w:val="left"/>
+        <w:rPr/>
+      </w:pPr>
+      <w:r>
+        <w:rPr>
+          <w:rStyle w:val="Strong"/>
+        </w:rPr>
+        <w:t>Both flavours are always registered.</w:t>
+      </w:r>
+      <w:r>
+        <w:rPr/>
+        <w:t xml:space="preserve"> </w:t>
+      </w:r>
+      <w:r>
+        <w:rPr>
+          <w:rStyle w:val="SourceText"/>
+        </w:rPr>
+        <w:t>hooks.json</w:t>
+      </w:r>
+      <w:r>
+        <w:rPr/>
+        <w:t xml:space="preserve"> pairs every bash command with a </w:t>
+      </w:r>
+      <w:r>
+        <w:rPr>
+          <w:rStyle w:val="SourceText"/>
+        </w:rPr>
+        <w:t>shell: "powershell"</w:t>
+      </w:r>
+      <w:r>
+        <w:rPr/>
+        <w:t xml:space="preserve"> sibling on the same event, so a machine with both </w:t>
+      </w:r>
+      <w:r>
+        <w:rPr>
+          <w:rStyle w:val="SourceText"/>
+        </w:rPr>
+        <w:t>bash</w:t>
+      </w:r>
+      <w:r>
+        <w:rPr/>
+        <w:t xml:space="preserve"> and </w:t>
+      </w:r>
+      <w:r>
+        <w:rPr>
+          <w:rStyle w:val="SourceText"/>
+        </w:rPr>
+        <w:t>pwsh</w:t>
+      </w:r>
+      <w:r>
+        <w:rPr/>
+        <w:t xml:space="preserve"> present runs both. This is not double-firing to fix — it is how the same hook reaches both shells; each PowerShell twin stands itself down on the wrong platform (</w:t>
+      </w:r>
+      <w:r>
+        <w:rPr>
+          <w:rStyle w:val="SourceText"/>
+        </w:rPr>
+        <w:t>$env:OS -ne 'Windows_NT'</w:t>
+      </w:r>
+      <w:r>
+        <w:rPr/>
+        <w:t xml:space="preserve">) rather than the bash twin doing that job. </w:t>
+      </w:r>
+    </w:p>
+    <w:p>
+      <w:pPr>
+        <w:pStyle w:val="Heading2"/>
+        <w:bidi w:val="0"/>
+        <w:ind w:hanging="0" w:left="0" w:right="0"/>
+        <w:jc w:val="left"/>
+        <w:rPr/>
+      </w:pPr>
+      <w:bookmarkStart w:id="14" w:name="auto-wrap-up-auto-clear-and-auto-resume"/>
+      <w:bookmarkEnd w:id="14"/>
+      <w:r>
+        <w:rPr/>
+        <w:t>Auto Wrap-Up, Auto-Clear and Auto-Resume</w:t>
       </w:r>
     </w:p>
     <w:p>
@@ -8937,268 +9285,18 @@
         <w:rPr/>
       </w:pPr>
       <w:r>
-        <w:rPr>
-          <w:rStyle w:val="Strong"/>
-        </w:rPr>
-        <w:t>Crew neither causes nor tunes Claude Code's own auto-compact.</w:t>
-      </w:r>
-      <w:r>
-        <w:rPr/>
-        <w:t xml:space="preserve"> That is a separate, built-in behaviour that fires whenever Claude Code itself decides to; this cycle only reacts to a handoff once one exists, and nothing here makes auto-compact happen sooner, later, or at all. 3. </w:t>
-      </w:r>
-      <w:r>
-        <w:rPr>
-          <w:rStyle w:val="Strong"/>
-        </w:rPr>
-        <w:t>Resume.</w:t>
-      </w:r>
-      <w:r>
-        <w:rPr/>
-        <w:t xml:space="preserve"> The new session starts with the handoff and its next action already in context, within the 3,000-character resume budget. Nothing starts working unprompted: crew does not use </w:t>
-      </w:r>
-      <w:r>
-        <w:rPr>
-          <w:rStyle w:val="SourceText"/>
-        </w:rPr>
-        <w:t>initialUserMessage</w:t>
-      </w:r>
-      <w:r>
-        <w:rPr/>
-        <w:t xml:space="preserve">, so you press Enter to continue. Claude Code 2.1.282 drops it in an interactive session anyway (spike, 2026-09-25): it is honoured by </w:t>
-      </w:r>
-      <w:r>
-        <w:rPr>
-          <w:rStyle w:val="SourceText"/>
-        </w:rPr>
-        <w:t>claude -p</w:t>
-      </w:r>
-      <w:r>
-        <w:rPr/>
-        <w:t xml:space="preserve"> only.</w:t>
-      </w:r>
-    </w:p>
-    <w:p>
-      <w:pPr>
-        <w:pStyle w:val="BodyText"/>
-        <w:bidi w:val="0"/>
-        <w:jc w:val="left"/>
-        <w:rPr/>
-      </w:pPr>
-      <w:r>
-        <w:rPr/>
-        <w:t xml:space="preserve">With </w:t>
-      </w:r>
-      <w:r>
-        <w:rPr>
-          <w:rStyle w:val="SourceText"/>
-        </w:rPr>
-        <w:t>resume.auto: true</w:t>
-      </w:r>
-      <w:r>
-        <w:rPr/>
-        <w:t xml:space="preserve"> in the machine-global config, the handoff after </w:t>
-      </w:r>
-      <w:r>
-        <w:rPr>
-          <w:rStyle w:val="SourceText"/>
-        </w:rPr>
-        <w:t>/clear</w:t>
-      </w:r>
-      <w:r>
-        <w:rPr/>
-        <w:t xml:space="preserve"> or a manual </w:t>
-      </w:r>
-      <w:r>
-        <w:rPr>
-          <w:rStyle w:val="SourceText"/>
-        </w:rPr>
-        <w:t>/compact</w:t>
-      </w:r>
-      <w:r>
-        <w:rPr/>
-        <w:t xml:space="preserve"> also names the exact next command, read from the note's </w:t>
-      </w:r>
-      <w:r>
-        <w:rPr>
-          <w:rStyle w:val="SourceText"/>
-        </w:rPr>
-        <w:t>resume:</w:t>
-      </w:r>
-      <w:r>
-        <w:rPr/>
-        <w:t xml:space="preserve"> line (</w:t>
-      </w:r>
-      <w:r>
-        <w:rPr>
-          <w:rStyle w:val="SourceText"/>
-        </w:rPr>
-        <w:t>resume: /crew:done T-0001</w:t>
-      </w:r>
-      <w:r>
-        <w:rPr/>
-        <w:t xml:space="preserve">): </w:t>
-      </w:r>
-      <w:r>
-        <w:rPr>
-          <w:rStyle w:val="SourceText"/>
-        </w:rPr>
-        <w:t>Auto-resume: ready to run /crew:done T-0001.</w:t>
-      </w:r>
-      <w:r>
-        <w:rPr/>
-        <w:t xml:space="preserve"> — or </w:t>
-      </w:r>
-      <w:r>
-        <w:rPr>
-          <w:rStyle w:val="SourceText"/>
-        </w:rPr>
-        <w:t>Auto-resume did not start: &lt;reason&gt;.</w:t>
-      </w:r>
-      <w:r>
-        <w:rPr/>
-        <w:t xml:space="preserve"> when a check refuses it. It still does not start on its own: you press Enter or type it, until T-0013 types it where the terminal can be identified. The refusal reasons are: compact was not a manual /compact; no handoff note, or it was archived as stale, or is stale and could not be archived; the handoff is the automatic PreCompact skeleton; no resume line, </w:t>
-      </w:r>
-      <w:r>
-        <w:rPr>
-          <w:rStyle w:val="SourceText"/>
-        </w:rPr>
-        <w:t>resume: none</w:t>
-      </w:r>
-      <w:r>
-        <w:rPr/>
-        <w:t xml:space="preserve">, or a line the grammar refuses (a second line, trailing text, an unknown command, or an excluded one such as </w:t>
-      </w:r>
-      <w:r>
-        <w:rPr>
-          <w:rStyle w:val="SourceText"/>
-        </w:rPr>
-        <w:t>/crew:approve</w:t>
-      </w:r>
-      <w:r>
-        <w:rPr/>
-        <w:t xml:space="preserve">); the note's </w:t>
-      </w:r>
-      <w:r>
-        <w:rPr>
-          <w:rStyle w:val="SourceText"/>
-        </w:rPr>
-        <w:t>branch:</w:t>
-      </w:r>
-      <w:r>
-        <w:rPr/>
-        <w:t xml:space="preserve"> or </w:t>
-      </w:r>
-      <w:r>
-        <w:rPr>
-          <w:rStyle w:val="SourceText"/>
-        </w:rPr>
-        <w:t>head:</w:t>
-      </w:r>
-      <w:r>
-        <w:rPr/>
-        <w:t xml:space="preserve"> does not match the checkout; the ticket directory or goal file is missing; the command is not installed; </w:t>
-      </w:r>
-      <w:r>
-        <w:rPr>
-          <w:rStyle w:val="SourceText"/>
-        </w:rPr>
-        <w:t>handoff-author.json</w:t>
-      </w:r>
-      <w:r>
-        <w:rPr/>
-        <w:t xml:space="preserve"> could not be read; no record of which session wrote this handoff; the handoff changed since its author session wrote it; the handoff was written by another session; this session's process could not be identified (always on a host without </w:t>
-      </w:r>
-      <w:r>
-        <w:rPr>
-          <w:rStyle w:val="SourceText"/>
-        </w:rPr>
-        <w:t>/proc</w:t>
-      </w:r>
-      <w:r>
-        <w:rPr/>
-        <w:t>, such as native Windows or macOS); the record of past auto-resumes (</w:t>
-      </w:r>
-      <w:r>
-        <w:rPr>
-          <w:rStyle w:val="SourceText"/>
-        </w:rPr>
-        <w:t>resume-state.json</w:t>
-      </w:r>
-      <w:r>
-        <w:rPr/>
-        <w:t xml:space="preserve">) could not be read, or its directory cannot be searched; this handoff was already resumed; the progress fingerprint could not be computed; the same command with no progress since the last auto-resume; </w:t>
-      </w:r>
-      <w:r>
-        <w:rPr>
-          <w:rStyle w:val="SourceText"/>
-        </w:rPr>
-        <w:t>internal error</w:t>
-      </w:r>
-      <w:r>
-        <w:rPr/>
-        <w:t xml:space="preserve"> (the decision itself failed, and the handoff is still injected). Never on a plain </w:t>
-      </w:r>
-      <w:r>
-        <w:rPr>
-          <w:rStyle w:val="SourceText"/>
-        </w:rPr>
-        <w:t>startup</w:t>
-      </w:r>
-      <w:r>
-        <w:rPr/>
-        <w:t>.</w:t>
-      </w:r>
-    </w:p>
-    <w:p>
-      <w:pPr>
-        <w:pStyle w:val="BodyText"/>
-        <w:bidi w:val="0"/>
-        <w:jc w:val="left"/>
-        <w:rPr/>
-      </w:pPr>
-      <w:r>
-        <w:rPr/>
-        <w:t xml:space="preserve">A note resumes only in the session that wrote it. Write it with the Write tool (as </w:t>
-      </w:r>
-      <w:r>
-        <w:rPr>
-          <w:rStyle w:val="SourceText"/>
-        </w:rPr>
-        <w:t>/crew:handoff</w:t>
-      </w:r>
-      <w:r>
-        <w:rPr/>
-        <w:t xml:space="preserve"> does): the context hook then records which session and which Claude Code process wrote it. After </w:t>
-      </w:r>
-      <w:r>
-        <w:rPr>
-          <w:rStyle w:val="SourceText"/>
-        </w:rPr>
-        <w:t>/compact</w:t>
-      </w:r>
-      <w:r>
-        <w:rPr/>
-        <w:t xml:space="preserve"> the session must match; after </w:t>
-      </w:r>
-      <w:r>
-        <w:rPr>
-          <w:rStyle w:val="SourceText"/>
-        </w:rPr>
-        <w:t>/clear</w:t>
-      </w:r>
-      <w:r>
-        <w:rPr/>
-        <w:t xml:space="preserve"> the process must, so a </w:t>
-      </w:r>
-      <w:r>
-        <w:rPr>
-          <w:rStyle w:val="SourceText"/>
-        </w:rPr>
-        <w:t>/clear</w:t>
-      </w:r>
-      <w:r>
-        <w:rPr/>
-        <w:t xml:space="preserve"> in another terminal on the same worktree waits. A note written by Bash or by hand waits.</w:t>
+        <w:rPr/>
+        <w:t>This section is folded into the troubleshooting guide (</w:t>
+      </w:r>
+      <w:r>
+        <w:rPr>
+          <w:rStyle w:val="SourceText"/>
+        </w:rPr>
+        <w:t>troubleshooting.md</w:t>
+      </w:r>
+      <w:r>
+        <w:rPr/>
+        <w:t>), linked from it as "Auto wrap-up, clear and resume". It covers the cycle that lets a long session finish itself cleanly, clear, and pick up where it stopped.</w:t>
       </w:r>
     </w:p>
     <w:p>
@@ -9209,8 +9307,480 @@
         <w:jc w:val="left"/>
         <w:rPr/>
       </w:pPr>
-      <w:bookmarkStart w:id="15" w:name="turning-it-on-and-off"/>
+      <w:bookmarkStart w:id="15" w:name="what-the-cycle-does"/>
       <w:bookmarkEnd w:id="15"/>
+      <w:r>
+        <w:rPr/>
+        <w:t>What the Cycle Does</w:t>
+      </w:r>
+    </w:p>
+    <w:p>
+      <w:pPr>
+        <w:pStyle w:val="BodyText"/>
+        <w:numPr>
+          <w:ilvl w:val="0"/>
+          <w:numId w:val="19"/>
+        </w:numPr>
+        <w:tabs>
+          <w:tab w:val="clear" w:pos="1134"/>
+          <w:tab w:val="left" w:pos="829" w:leader="none"/>
+        </w:tabs>
+        <w:bidi w:val="0"/>
+        <w:spacing w:before="120" w:after="0"/>
+        <w:ind w:hanging="283" w:left="829"/>
+        <w:jc w:val="left"/>
+        <w:rPr/>
+      </w:pPr>
+      <w:r>
+        <w:rPr>
+          <w:rStyle w:val="Strong"/>
+        </w:rPr>
+        <w:t>Wrap-up.</w:t>
+      </w:r>
+      <w:r>
+        <w:rPr/>
+        <w:t xml:space="preserve"> When the context window crosses its threshold, the </w:t>
+      </w:r>
+      <w:r>
+        <w:rPr>
+          <w:rStyle w:val="SourceText"/>
+        </w:rPr>
+        <w:t>Stop</w:t>
+      </w:r>
+      <w:r>
+        <w:rPr/>
+        <w:t xml:space="preserve"> hook blocks once. It asks the session to finish or park the change in flight, write </w:t>
+      </w:r>
+      <w:r>
+        <w:rPr>
+          <w:rStyle w:val="SourceText"/>
+        </w:rPr>
+        <w:t>.work/HANDOFF.md</w:t>
+      </w:r>
+      <w:r>
+        <w:rPr/>
+        <w:t xml:space="preserve">, and update the ticket. This happens once for each threshold crossing in each session. It never happens on the forced continuation that follows a block. </w:t>
+      </w:r>
+    </w:p>
+    <w:p>
+      <w:pPr>
+        <w:pStyle w:val="BodyText"/>
+        <w:numPr>
+          <w:ilvl w:val="0"/>
+          <w:numId w:val="19"/>
+        </w:numPr>
+        <w:tabs>
+          <w:tab w:val="clear" w:pos="1134"/>
+          <w:tab w:val="left" w:pos="829" w:leader="none"/>
+        </w:tabs>
+        <w:bidi w:val="0"/>
+        <w:ind w:hanging="283" w:left="829"/>
+        <w:jc w:val="left"/>
+        <w:rPr/>
+      </w:pPr>
+      <w:r>
+        <w:rPr>
+          <w:rStyle w:val="Strong"/>
+        </w:rPr>
+        <w:t>Clear, or notify.</w:t>
+      </w:r>
+      <w:r>
+        <w:rPr/>
+        <w:t xml:space="preserve"> After the handoff is written, auto-clear acts on it. What it does depends on </w:t>
+      </w:r>
+      <w:r>
+        <w:rPr>
+          <w:rStyle w:val="SourceText"/>
+        </w:rPr>
+        <w:t>method</w:t>
+      </w:r>
+      <w:r>
+        <w:rPr/>
+        <w:t xml:space="preserve"> (below): </w:t>
+      </w:r>
+      <w:r>
+        <w:rPr>
+          <w:rStyle w:val="SourceText"/>
+        </w:rPr>
+        <w:t>notify</w:t>
+      </w:r>
+      <w:r>
+        <w:rPr/>
+        <w:t xml:space="preserve"> (the default on native Windows) prints a message telling you the handoff is written and it is safe to run </w:t>
+      </w:r>
+      <w:r>
+        <w:rPr>
+          <w:rStyle w:val="SourceText"/>
+        </w:rPr>
+        <w:t>/clear</w:t>
+      </w:r>
+      <w:r>
+        <w:rPr/>
+        <w:t xml:space="preserve"> (or </w:t>
+      </w:r>
+      <w:r>
+        <w:rPr>
+          <w:rStyle w:val="SourceText"/>
+        </w:rPr>
+        <w:t>/compact</w:t>
+      </w:r>
+      <w:r>
+        <w:rPr/>
+        <w:t xml:space="preserve">) yourself — it types nothing. </w:t>
+      </w:r>
+      <w:r>
+        <w:rPr>
+          <w:rStyle w:val="SourceText"/>
+        </w:rPr>
+        <w:t>tmux</w:t>
+      </w:r>
+      <w:r>
+        <w:rPr/>
+        <w:t xml:space="preserve">, </w:t>
+      </w:r>
+      <w:r>
+        <w:rPr>
+          <w:rStyle w:val="SourceText"/>
+        </w:rPr>
+        <w:t>xdotool</w:t>
+      </w:r>
+      <w:r>
+        <w:rPr/>
+        <w:t xml:space="preserve"> and </w:t>
+      </w:r>
+      <w:r>
+        <w:rPr>
+          <w:rStyle w:val="SourceText"/>
+        </w:rPr>
+        <w:t>sendkeys</w:t>
+      </w:r>
+      <w:r>
+        <w:rPr/>
+        <w:t xml:space="preserve"> actually type the configured command into the terminal that runs this session. Whichever method is in force, it acts only when all four of these hold: - this machine opted in; - the handoff was written by this session after the wrap-up request, is longer than a stub, and is not the automatic PreCompact skeleton; - the context reading that caused the wrap-up was a real measurement (see "When it will not clear"); - for a method that types (</w:t>
+      </w:r>
+      <w:r>
+        <w:rPr>
+          <w:rStyle w:val="SourceText"/>
+        </w:rPr>
+        <w:t>tmux</w:t>
+      </w:r>
+      <w:r>
+        <w:rPr/>
+        <w:t>/</w:t>
+      </w:r>
+      <w:r>
+        <w:rPr>
+          <w:rStyle w:val="SourceText"/>
+        </w:rPr>
+        <w:t>xdotool</w:t>
+      </w:r>
+      <w:r>
+        <w:rPr/>
+        <w:t>/</w:t>
+      </w:r>
+      <w:r>
+        <w:rPr>
+          <w:rStyle w:val="SourceText"/>
+        </w:rPr>
+        <w:t>sendkeys</w:t>
+      </w:r>
+      <w:r>
+        <w:rPr/>
+        <w:t xml:space="preserve">), the target window can be identified exactly — </w:t>
+      </w:r>
+      <w:r>
+        <w:rPr>
+          <w:rStyle w:val="SourceText"/>
+        </w:rPr>
+        <w:t>notify</w:t>
+      </w:r>
+      <w:r>
+        <w:rPr/>
+        <w:t xml:space="preserve"> needs none of this, since it identifies no window. </w:t>
+      </w:r>
+    </w:p>
+    <w:p>
+      <w:pPr>
+        <w:pStyle w:val="BodyText"/>
+        <w:bidi w:val="0"/>
+        <w:jc w:val="left"/>
+        <w:rPr/>
+      </w:pPr>
+      <w:r>
+        <w:rPr>
+          <w:rStyle w:val="Strong"/>
+        </w:rPr>
+        <w:t>Crew neither causes nor tunes Claude Code's own auto-compact.</w:t>
+      </w:r>
+      <w:r>
+        <w:rPr/>
+        <w:t xml:space="preserve"> That is a separate, built-in behaviour that fires whenever Claude Code itself decides to; this cycle only reacts to a handoff once one exists, and nothing here makes auto-compact happen sooner, later, or at all. 3. </w:t>
+      </w:r>
+      <w:r>
+        <w:rPr>
+          <w:rStyle w:val="Strong"/>
+        </w:rPr>
+        <w:t>Resume.</w:t>
+      </w:r>
+      <w:r>
+        <w:rPr/>
+        <w:t xml:space="preserve"> The new session starts with the handoff and its next action already in context, within the 3,000-character resume budget. Nothing starts working unprompted: crew does not use </w:t>
+      </w:r>
+      <w:r>
+        <w:rPr>
+          <w:rStyle w:val="SourceText"/>
+        </w:rPr>
+        <w:t>initialUserMessage</w:t>
+      </w:r>
+      <w:r>
+        <w:rPr/>
+        <w:t xml:space="preserve">, so you press Enter to continue. Claude Code 2.1.282 drops it in an interactive session anyway (spike, 2026-09-25): it is honoured by </w:t>
+      </w:r>
+      <w:r>
+        <w:rPr>
+          <w:rStyle w:val="SourceText"/>
+        </w:rPr>
+        <w:t>claude -p</w:t>
+      </w:r>
+      <w:r>
+        <w:rPr/>
+        <w:t xml:space="preserve"> only.</w:t>
+      </w:r>
+    </w:p>
+    <w:p>
+      <w:pPr>
+        <w:pStyle w:val="BodyText"/>
+        <w:bidi w:val="0"/>
+        <w:jc w:val="left"/>
+        <w:rPr/>
+      </w:pPr>
+      <w:r>
+        <w:rPr/>
+        <w:t xml:space="preserve">With </w:t>
+      </w:r>
+      <w:r>
+        <w:rPr>
+          <w:rStyle w:val="SourceText"/>
+        </w:rPr>
+        <w:t>resume.auto: true</w:t>
+      </w:r>
+      <w:r>
+        <w:rPr/>
+        <w:t xml:space="preserve"> in the machine-global config, the handoff after </w:t>
+      </w:r>
+      <w:r>
+        <w:rPr>
+          <w:rStyle w:val="SourceText"/>
+        </w:rPr>
+        <w:t>/clear</w:t>
+      </w:r>
+      <w:r>
+        <w:rPr/>
+        <w:t xml:space="preserve"> or a manual </w:t>
+      </w:r>
+      <w:r>
+        <w:rPr>
+          <w:rStyle w:val="SourceText"/>
+        </w:rPr>
+        <w:t>/compact</w:t>
+      </w:r>
+      <w:r>
+        <w:rPr/>
+        <w:t xml:space="preserve"> also names the exact next command, read from the note's </w:t>
+      </w:r>
+      <w:r>
+        <w:rPr>
+          <w:rStyle w:val="SourceText"/>
+        </w:rPr>
+        <w:t>resume:</w:t>
+      </w:r>
+      <w:r>
+        <w:rPr/>
+        <w:t xml:space="preserve"> line (</w:t>
+      </w:r>
+      <w:r>
+        <w:rPr>
+          <w:rStyle w:val="SourceText"/>
+        </w:rPr>
+        <w:t>resume: /crew:done T-0001</w:t>
+      </w:r>
+      <w:r>
+        <w:rPr/>
+        <w:t xml:space="preserve">): </w:t>
+      </w:r>
+      <w:r>
+        <w:rPr>
+          <w:rStyle w:val="SourceText"/>
+        </w:rPr>
+        <w:t>Auto-resume: ready to run /crew:done T-0001.</w:t>
+      </w:r>
+      <w:r>
+        <w:rPr/>
+        <w:t xml:space="preserve"> — or </w:t>
+      </w:r>
+      <w:r>
+        <w:rPr>
+          <w:rStyle w:val="SourceText"/>
+        </w:rPr>
+        <w:t>Auto-resume did not start: &lt;reason&gt;.</w:t>
+      </w:r>
+      <w:r>
+        <w:rPr/>
+        <w:t xml:space="preserve"> when a check refuses it. It still does not start on its own: you press Enter or type it, until T-0013 types it where the terminal can be identified. The refusal reasons are: compact was not a manual /compact; no handoff note, or it was archived as stale, or is stale and could not be archived; the handoff is the automatic PreCompact skeleton; no resume line, </w:t>
+      </w:r>
+      <w:r>
+        <w:rPr>
+          <w:rStyle w:val="SourceText"/>
+        </w:rPr>
+        <w:t>resume: none</w:t>
+      </w:r>
+      <w:r>
+        <w:rPr/>
+        <w:t xml:space="preserve">, or a line the grammar refuses (a second line, trailing text, an unknown command, or an excluded one such as </w:t>
+      </w:r>
+      <w:r>
+        <w:rPr>
+          <w:rStyle w:val="SourceText"/>
+        </w:rPr>
+        <w:t>/crew:approve</w:t>
+      </w:r>
+      <w:r>
+        <w:rPr/>
+        <w:t xml:space="preserve">); the note's </w:t>
+      </w:r>
+      <w:r>
+        <w:rPr>
+          <w:rStyle w:val="SourceText"/>
+        </w:rPr>
+        <w:t>branch:</w:t>
+      </w:r>
+      <w:r>
+        <w:rPr/>
+        <w:t xml:space="preserve"> or </w:t>
+      </w:r>
+      <w:r>
+        <w:rPr>
+          <w:rStyle w:val="SourceText"/>
+        </w:rPr>
+        <w:t>head:</w:t>
+      </w:r>
+      <w:r>
+        <w:rPr/>
+        <w:t xml:space="preserve"> does not match the checkout; the ticket directory or goal file is missing; the command is not installed; </w:t>
+      </w:r>
+      <w:r>
+        <w:rPr>
+          <w:rStyle w:val="SourceText"/>
+        </w:rPr>
+        <w:t>handoff-author.json</w:t>
+      </w:r>
+      <w:r>
+        <w:rPr/>
+        <w:t xml:space="preserve"> could not be read; no record of which session wrote this handoff; the handoff changed since its author session wrote it; the handoff was written by another session; this session's process could not be identified (always on a host without </w:t>
+      </w:r>
+      <w:r>
+        <w:rPr>
+          <w:rStyle w:val="SourceText"/>
+        </w:rPr>
+        <w:t>/proc</w:t>
+      </w:r>
+      <w:r>
+        <w:rPr/>
+        <w:t>, such as native Windows or macOS); the record of past auto-resumes (</w:t>
+      </w:r>
+      <w:r>
+        <w:rPr>
+          <w:rStyle w:val="SourceText"/>
+        </w:rPr>
+        <w:t>resume-state.json</w:t>
+      </w:r>
+      <w:r>
+        <w:rPr/>
+        <w:t xml:space="preserve">) could not be read, or its directory cannot be searched; this handoff was already resumed; the progress fingerprint could not be computed; the same command with no progress since the last auto-resume; </w:t>
+      </w:r>
+      <w:r>
+        <w:rPr>
+          <w:rStyle w:val="SourceText"/>
+        </w:rPr>
+        <w:t>internal error</w:t>
+      </w:r>
+      <w:r>
+        <w:rPr/>
+        <w:t xml:space="preserve"> (the decision itself failed, and the handoff is still injected). Never on a plain </w:t>
+      </w:r>
+      <w:r>
+        <w:rPr>
+          <w:rStyle w:val="SourceText"/>
+        </w:rPr>
+        <w:t>startup</w:t>
+      </w:r>
+      <w:r>
+        <w:rPr/>
+        <w:t>.</w:t>
+      </w:r>
+    </w:p>
+    <w:p>
+      <w:pPr>
+        <w:pStyle w:val="BodyText"/>
+        <w:bidi w:val="0"/>
+        <w:jc w:val="left"/>
+        <w:rPr/>
+      </w:pPr>
+      <w:r>
+        <w:rPr/>
+        <w:t xml:space="preserve">A note resumes only in the session that wrote it. Write it with the Write tool (as </w:t>
+      </w:r>
+      <w:r>
+        <w:rPr>
+          <w:rStyle w:val="SourceText"/>
+        </w:rPr>
+        <w:t>/crew:handoff</w:t>
+      </w:r>
+      <w:r>
+        <w:rPr/>
+        <w:t xml:space="preserve"> does): the context hook then records which session and which Claude Code process wrote it. After </w:t>
+      </w:r>
+      <w:r>
+        <w:rPr>
+          <w:rStyle w:val="SourceText"/>
+        </w:rPr>
+        <w:t>/compact</w:t>
+      </w:r>
+      <w:r>
+        <w:rPr/>
+        <w:t xml:space="preserve"> the session must match; after </w:t>
+      </w:r>
+      <w:r>
+        <w:rPr>
+          <w:rStyle w:val="SourceText"/>
+        </w:rPr>
+        <w:t>/clear</w:t>
+      </w:r>
+      <w:r>
+        <w:rPr/>
+        <w:t xml:space="preserve"> the process must, so a </w:t>
+      </w:r>
+      <w:r>
+        <w:rPr>
+          <w:rStyle w:val="SourceText"/>
+        </w:rPr>
+        <w:t>/clear</w:t>
+      </w:r>
+      <w:r>
+        <w:rPr/>
+        <w:t xml:space="preserve"> in another terminal on the same worktree waits. A note written by Bash or by hand waits.</w:t>
+      </w:r>
+    </w:p>
+    <w:p>
+      <w:pPr>
+        <w:pStyle w:val="Heading3"/>
+        <w:bidi w:val="0"/>
+        <w:ind w:hanging="0" w:left="0" w:right="0"/>
+        <w:jc w:val="left"/>
+        <w:rPr/>
+      </w:pPr>
+      <w:bookmarkStart w:id="16" w:name="turning-it-on-and-off"/>
+      <w:bookmarkEnd w:id="16"/>
       <w:r>
         <w:rPr/>
         <w:t>Turning It on and Off</w:t>
@@ -10558,8 +11128,8 @@
         <w:jc w:val="left"/>
         <w:rPr/>
       </w:pPr>
-      <w:bookmarkStart w:id="16" w:name="arming-one-scratch-repo-while-other-sess"/>
-      <w:bookmarkEnd w:id="16"/>
+      <w:bookmarkStart w:id="17" w:name="arming-one-scratch-repo-while-other-sess"/>
+      <w:bookmarkEnd w:id="17"/>
       <w:r>
         <w:rPr/>
         <w:t>Arming one scratch repo while other sessions are live</w:t>
@@ -10844,7 +11414,7 @@
         <w:pStyle w:val="BodyText"/>
         <w:numPr>
           <w:ilvl w:val="0"/>
-          <w:numId w:val="18"/>
+          <w:numId w:val="20"/>
         </w:numPr>
         <w:tabs>
           <w:tab w:val="clear" w:pos="1134"/>
@@ -10886,7 +11456,7 @@
         <w:pStyle w:val="BodyText"/>
         <w:numPr>
           <w:ilvl w:val="0"/>
-          <w:numId w:val="18"/>
+          <w:numId w:val="20"/>
         </w:numPr>
         <w:tabs>
           <w:tab w:val="clear" w:pos="1134"/>
@@ -10908,7 +11478,7 @@
         <w:pStyle w:val="BodyText"/>
         <w:numPr>
           <w:ilvl w:val="0"/>
-          <w:numId w:val="18"/>
+          <w:numId w:val="20"/>
         </w:numPr>
         <w:tabs>
           <w:tab w:val="clear" w:pos="1134"/>
@@ -10960,7 +11530,7 @@
         <w:pStyle w:val="BodyText"/>
         <w:numPr>
           <w:ilvl w:val="0"/>
-          <w:numId w:val="18"/>
+          <w:numId w:val="20"/>
         </w:numPr>
         <w:tabs>
           <w:tab w:val="clear" w:pos="1134"/>
@@ -10982,7 +11552,7 @@
         <w:pStyle w:val="BodyText"/>
         <w:numPr>
           <w:ilvl w:val="0"/>
-          <w:numId w:val="18"/>
+          <w:numId w:val="20"/>
         </w:numPr>
         <w:tabs>
           <w:tab w:val="clear" w:pos="1134"/>
@@ -11034,7 +11604,7 @@
         <w:pStyle w:val="BodyText"/>
         <w:numPr>
           <w:ilvl w:val="0"/>
-          <w:numId w:val="18"/>
+          <w:numId w:val="20"/>
         </w:numPr>
         <w:tabs>
           <w:tab w:val="clear" w:pos="1134"/>
@@ -11290,8 +11860,8 @@
         <w:jc w:val="left"/>
         <w:rPr/>
       </w:pPr>
-      <w:bookmarkStart w:id="17" w:name="which-method-and-what-it-does"/>
-      <w:bookmarkEnd w:id="17"/>
+      <w:bookmarkStart w:id="18" w:name="which-method-and-what-it-does"/>
+      <w:bookmarkEnd w:id="18"/>
       <w:r>
         <w:rPr/>
         <w:t>Which Method, and What It Does</w:t>
@@ -11873,8 +12443,8 @@
         <w:jc w:val="left"/>
         <w:rPr/>
       </w:pPr>
-      <w:bookmarkStart w:id="18" w:name="when-it-will-not-clear-or-notify"/>
-      <w:bookmarkEnd w:id="18"/>
+      <w:bookmarkStart w:id="19" w:name="when-it-will-not-clear-or-notify"/>
+      <w:bookmarkEnd w:id="19"/>
       <w:r>
         <w:rPr/>
         <w:t>When It Will Not Clear (or Notify)</w:t>
@@ -12742,8 +13312,8 @@
         <w:jc w:val="left"/>
         <w:rPr/>
       </w:pPr>
-      <w:bookmarkStart w:id="19" w:name="which-window-gets-the-keystroke"/>
-      <w:bookmarkEnd w:id="19"/>
+      <w:bookmarkStart w:id="20" w:name="which-window-gets-the-keystroke"/>
+      <w:bookmarkEnd w:id="20"/>
       <w:r>
         <w:rPr/>
         <w:t>Which Window Gets the Keystroke</w:t>
@@ -12806,7 +13376,7 @@
         <w:pStyle w:val="BodyText"/>
         <w:numPr>
           <w:ilvl w:val="0"/>
-          <w:numId w:val="19"/>
+          <w:numId w:val="21"/>
         </w:numPr>
         <w:tabs>
           <w:tab w:val="clear" w:pos="1134"/>
@@ -12844,7 +13414,7 @@
         <w:pStyle w:val="BodyText"/>
         <w:numPr>
           <w:ilvl w:val="0"/>
-          <w:numId w:val="19"/>
+          <w:numId w:val="21"/>
         </w:numPr>
         <w:tabs>
           <w:tab w:val="clear" w:pos="1134"/>
@@ -12904,7 +13474,7 @@
         <w:pStyle w:val="BodyText"/>
         <w:numPr>
           <w:ilvl w:val="0"/>
-          <w:numId w:val="19"/>
+          <w:numId w:val="21"/>
         </w:numPr>
         <w:tabs>
           <w:tab w:val="clear" w:pos="1134"/>
@@ -15171,8 +15741,8 @@
   <w:abstractNum w:abstractNumId="17">
     <w:lvl w:ilvl="0">
       <w:start w:val="1"/>
-      <w:numFmt w:val="decimal"/>
-      <w:lvlText w:val="%1."/>
+      <w:numFmt w:val="bullet"/>
+      <w:lvlText w:val=""/>
       <w:lvlJc w:val="left"/>
       <w:pPr>
         <w:tabs>
@@ -15180,12 +15750,14 @@
         </w:tabs>
         <w:ind w:left="709" w:hanging="283"/>
       </w:pPr>
-      <w:rPr/>
+      <w:rPr>
+        <w:rFonts w:ascii="Symbol" w:hAnsi="Symbol" w:cs="Symbol" w:hint="default"/>
+      </w:rPr>
     </w:lvl>
     <w:lvl w:ilvl="1">
       <w:start w:val="1"/>
-      <w:numFmt w:val="decimal"/>
-      <w:lvlText w:val="%2."/>
+      <w:numFmt w:val="bullet"/>
+      <w:lvlText w:val=""/>
       <w:lvlJc w:val="left"/>
       <w:pPr>
         <w:tabs>
@@ -15193,12 +15765,14 @@
         </w:tabs>
         <w:ind w:left="1418" w:hanging="283"/>
       </w:pPr>
-      <w:rPr/>
+      <w:rPr>
+        <w:rFonts w:ascii="Symbol" w:hAnsi="Symbol" w:cs="Symbol" w:hint="default"/>
+      </w:rPr>
     </w:lvl>
     <w:lvl w:ilvl="2">
       <w:start w:val="1"/>
-      <w:numFmt w:val="decimal"/>
-      <w:lvlText w:val="%3."/>
+      <w:numFmt w:val="bullet"/>
+      <w:lvlText w:val=""/>
       <w:lvlJc w:val="left"/>
       <w:pPr>
         <w:tabs>
@@ -15206,12 +15780,14 @@
         </w:tabs>
         <w:ind w:left="2127" w:hanging="283"/>
       </w:pPr>
-      <w:rPr/>
+      <w:rPr>
+        <w:rFonts w:ascii="Symbol" w:hAnsi="Symbol" w:cs="Symbol" w:hint="default"/>
+      </w:rPr>
     </w:lvl>
     <w:lvl w:ilvl="3">
       <w:start w:val="1"/>
-      <w:numFmt w:val="decimal"/>
-      <w:lvlText w:val="%4."/>
+      <w:numFmt w:val="bullet"/>
+      <w:lvlText w:val=""/>
       <w:lvlJc w:val="left"/>
       <w:pPr>
         <w:tabs>
@@ -15219,12 +15795,14 @@
         </w:tabs>
         <w:ind w:left="2836" w:hanging="283"/>
       </w:pPr>
-      <w:rPr/>
+      <w:rPr>
+        <w:rFonts w:ascii="Symbol" w:hAnsi="Symbol" w:cs="Symbol" w:hint="default"/>
+      </w:rPr>
     </w:lvl>
     <w:lvl w:ilvl="4">
       <w:start w:val="1"/>
-      <w:numFmt w:val="decimal"/>
-      <w:lvlText w:val="%5."/>
+      <w:numFmt w:val="bullet"/>
+      <w:lvlText w:val=""/>
       <w:lvlJc w:val="left"/>
       <w:pPr>
         <w:tabs>
@@ -15232,12 +15810,14 @@
         </w:tabs>
         <w:ind w:left="3545" w:hanging="283"/>
       </w:pPr>
-      <w:rPr/>
+      <w:rPr>
+        <w:rFonts w:ascii="Symbol" w:hAnsi="Symbol" w:cs="Symbol" w:hint="default"/>
+      </w:rPr>
     </w:lvl>
     <w:lvl w:ilvl="5">
       <w:start w:val="1"/>
-      <w:numFmt w:val="decimal"/>
-      <w:lvlText w:val="%6."/>
+      <w:numFmt w:val="bullet"/>
+      <w:lvlText w:val=""/>
       <w:lvlJc w:val="left"/>
       <w:pPr>
         <w:tabs>
@@ -15245,12 +15825,14 @@
         </w:tabs>
         <w:ind w:left="4254" w:hanging="283"/>
       </w:pPr>
-      <w:rPr/>
+      <w:rPr>
+        <w:rFonts w:ascii="Symbol" w:hAnsi="Symbol" w:cs="Symbol" w:hint="default"/>
+      </w:rPr>
     </w:lvl>
     <w:lvl w:ilvl="6">
       <w:start w:val="1"/>
-      <w:numFmt w:val="decimal"/>
-      <w:lvlText w:val="%7."/>
+      <w:numFmt w:val="bullet"/>
+      <w:lvlText w:val=""/>
       <w:lvlJc w:val="left"/>
       <w:pPr>
         <w:tabs>
@@ -15258,12 +15840,14 @@
         </w:tabs>
         <w:ind w:left="4963" w:hanging="283"/>
       </w:pPr>
-      <w:rPr/>
+      <w:rPr>
+        <w:rFonts w:ascii="Symbol" w:hAnsi="Symbol" w:cs="Symbol" w:hint="default"/>
+      </w:rPr>
     </w:lvl>
     <w:lvl w:ilvl="7">
       <w:start w:val="1"/>
-      <w:numFmt w:val="decimal"/>
-      <w:lvlText w:val="%8."/>
+      <w:numFmt w:val="bullet"/>
+      <w:lvlText w:val=""/>
       <w:lvlJc w:val="left"/>
       <w:pPr>
         <w:tabs>
@@ -15271,12 +15855,14 @@
         </w:tabs>
         <w:ind w:left="5672" w:hanging="283"/>
       </w:pPr>
-      <w:rPr/>
+      <w:rPr>
+        <w:rFonts w:ascii="Symbol" w:hAnsi="Symbol" w:cs="Symbol" w:hint="default"/>
+      </w:rPr>
     </w:lvl>
     <w:lvl w:ilvl="8">
       <w:start w:val="1"/>
-      <w:numFmt w:val="decimal"/>
-      <w:lvlText w:val="%9."/>
+      <w:numFmt w:val="bullet"/>
+      <w:lvlText w:val=""/>
       <w:lvlJc w:val="left"/>
       <w:pPr>
         <w:tabs>
@@ -15284,7 +15870,9 @@
         </w:tabs>
         <w:ind w:left="6381" w:hanging="283"/>
       </w:pPr>
-      <w:rPr/>
+      <w:rPr>
+        <w:rFonts w:ascii="Symbol" w:hAnsi="Symbol" w:cs="Symbol" w:hint="default"/>
+      </w:rPr>
     </w:lvl>
   </w:abstractNum>
   <w:abstractNum w:abstractNumId="18">
@@ -15427,8 +16015,8 @@
   <w:abstractNum w:abstractNumId="19">
     <w:lvl w:ilvl="0">
       <w:start w:val="1"/>
-      <w:numFmt w:val="bullet"/>
-      <w:lvlText w:val=""/>
+      <w:numFmt w:val="decimal"/>
+      <w:lvlText w:val="%1."/>
       <w:lvlJc w:val="left"/>
       <w:pPr>
         <w:tabs>
@@ -15436,14 +16024,12 @@
         </w:tabs>
         <w:ind w:left="709" w:hanging="283"/>
       </w:pPr>
-      <w:rPr>
-        <w:rFonts w:ascii="Symbol" w:hAnsi="Symbol" w:cs="Symbol" w:hint="default"/>
-      </w:rPr>
+      <w:rPr/>
     </w:lvl>
     <w:lvl w:ilvl="1">
       <w:start w:val="1"/>
-      <w:numFmt w:val="bullet"/>
-      <w:lvlText w:val=""/>
+      <w:numFmt w:val="decimal"/>
+      <w:lvlText w:val="%2."/>
       <w:lvlJc w:val="left"/>
       <w:pPr>
         <w:tabs>
@@ -15451,14 +16037,12 @@
         </w:tabs>
         <w:ind w:left="1418" w:hanging="283"/>
       </w:pPr>
-      <w:rPr>
-        <w:rFonts w:ascii="Symbol" w:hAnsi="Symbol" w:cs="Symbol" w:hint="default"/>
-      </w:rPr>
+      <w:rPr/>
     </w:lvl>
     <w:lvl w:ilvl="2">
       <w:start w:val="1"/>
-      <w:numFmt w:val="bullet"/>
-      <w:lvlText w:val=""/>
+      <w:numFmt w:val="decimal"/>
+      <w:lvlText w:val="%3."/>
       <w:lvlJc w:val="left"/>
       <w:pPr>
         <w:tabs>
@@ -15466,14 +16050,12 @@
         </w:tabs>
         <w:ind w:left="2127" w:hanging="283"/>
       </w:pPr>
-      <w:rPr>
-        <w:rFonts w:ascii="Symbol" w:hAnsi="Symbol" w:cs="Symbol" w:hint="default"/>
-      </w:rPr>
+      <w:rPr/>
     </w:lvl>
     <w:lvl w:ilvl="3">
       <w:start w:val="1"/>
-      <w:numFmt w:val="bullet"/>
-      <w:lvlText w:val=""/>
+      <w:numFmt w:val="decimal"/>
+      <w:lvlText w:val="%4."/>
       <w:lvlJc w:val="left"/>
       <w:pPr>
         <w:tabs>
@@ -15481,14 +16063,12 @@
         </w:tabs>
         <w:ind w:left="2836" w:hanging="283"/>
       </w:pPr>
-      <w:rPr>
-        <w:rFonts w:ascii="Symbol" w:hAnsi="Symbol" w:cs="Symbol" w:hint="default"/>
-      </w:rPr>
+      <w:rPr/>
     </w:lvl>
     <w:lvl w:ilvl="4">
       <w:start w:val="1"/>
-      <w:numFmt w:val="bullet"/>
-      <w:lvlText w:val=""/>
+      <w:numFmt w:val="decimal"/>
+      <w:lvlText w:val="%5."/>
       <w:lvlJc w:val="left"/>
       <w:pPr>
         <w:tabs>
@@ -15496,14 +16076,12 @@
         </w:tabs>
         <w:ind w:left="3545" w:hanging="283"/>
       </w:pPr>
-      <w:rPr>
-        <w:rFonts w:ascii="Symbol" w:hAnsi="Symbol" w:cs="Symbol" w:hint="default"/>
-      </w:rPr>
+      <w:rPr/>
     </w:lvl>
     <w:lvl w:ilvl="5">
       <w:start w:val="1"/>
-      <w:numFmt w:val="bullet"/>
-      <w:lvlText w:val=""/>
+      <w:numFmt w:val="decimal"/>
+      <w:lvlText w:val="%6."/>
       <w:lvlJc w:val="left"/>
       <w:pPr>
         <w:tabs>
@@ -15511,14 +16089,12 @@
         </w:tabs>
         <w:ind w:left="4254" w:hanging="283"/>
       </w:pPr>
-      <w:rPr>
-        <w:rFonts w:ascii="Symbol" w:hAnsi="Symbol" w:cs="Symbol" w:hint="default"/>
-      </w:rPr>
+      <w:rPr/>
     </w:lvl>
     <w:lvl w:ilvl="6">
       <w:start w:val="1"/>
-      <w:numFmt w:val="bullet"/>
-      <w:lvlText w:val=""/>
+      <w:numFmt w:val="decimal"/>
+      <w:lvlText w:val="%7."/>
       <w:lvlJc w:val="left"/>
       <w:pPr>
         <w:tabs>
@@ -15526,14 +16102,12 @@
         </w:tabs>
         <w:ind w:left="4963" w:hanging="283"/>
       </w:pPr>
-      <w:rPr>
-        <w:rFonts w:ascii="Symbol" w:hAnsi="Symbol" w:cs="Symbol" w:hint="default"/>
-      </w:rPr>
+      <w:rPr/>
     </w:lvl>
     <w:lvl w:ilvl="7">
       <w:start w:val="1"/>
-      <w:numFmt w:val="bullet"/>
-      <w:lvlText w:val=""/>
+      <w:numFmt w:val="decimal"/>
+      <w:lvlText w:val="%8."/>
       <w:lvlJc w:val="left"/>
       <w:pPr>
         <w:tabs>
@@ -15541,14 +16115,12 @@
         </w:tabs>
         <w:ind w:left="5672" w:hanging="283"/>
       </w:pPr>
-      <w:rPr>
-        <w:rFonts w:ascii="Symbol" w:hAnsi="Symbol" w:cs="Symbol" w:hint="default"/>
-      </w:rPr>
+      <w:rPr/>
     </w:lvl>
     <w:lvl w:ilvl="8">
       <w:start w:val="1"/>
-      <w:numFmt w:val="bullet"/>
-      <w:lvlText w:val=""/>
+      <w:numFmt w:val="decimal"/>
+      <w:lvlText w:val="%9."/>
       <w:lvlJc w:val="left"/>
       <w:pPr>
         <w:tabs>
@@ -15556,12 +16128,284 @@
         </w:tabs>
         <w:ind w:left="6381" w:hanging="283"/>
       </w:pPr>
-      <w:rPr>
-        <w:rFonts w:ascii="Symbol" w:hAnsi="Symbol" w:cs="Symbol" w:hint="default"/>
-      </w:rPr>
+      <w:rPr/>
     </w:lvl>
   </w:abstractNum>
   <w:abstractNum w:abstractNumId="20">
+    <w:lvl w:ilvl="0">
+      <w:start w:val="1"/>
+      <w:numFmt w:val="bullet"/>
+      <w:lvlText w:val=""/>
+      <w:lvlJc w:val="left"/>
+      <w:pPr>
+        <w:tabs>
+          <w:tab w:val="num" w:pos="709"/>
+        </w:tabs>
+        <w:ind w:left="709" w:hanging="283"/>
+      </w:pPr>
+      <w:rPr>
+        <w:rFonts w:ascii="Symbol" w:hAnsi="Symbol" w:cs="Symbol" w:hint="default"/>
+      </w:rPr>
+    </w:lvl>
+    <w:lvl w:ilvl="1">
+      <w:start w:val="1"/>
+      <w:numFmt w:val="bullet"/>
+      <w:lvlText w:val=""/>
+      <w:lvlJc w:val="left"/>
+      <w:pPr>
+        <w:tabs>
+          <w:tab w:val="num" w:pos="1418"/>
+        </w:tabs>
+        <w:ind w:left="1418" w:hanging="283"/>
+      </w:pPr>
+      <w:rPr>
+        <w:rFonts w:ascii="Symbol" w:hAnsi="Symbol" w:cs="Symbol" w:hint="default"/>
+      </w:rPr>
+    </w:lvl>
+    <w:lvl w:ilvl="2">
+      <w:start w:val="1"/>
+      <w:numFmt w:val="bullet"/>
+      <w:lvlText w:val=""/>
+      <w:lvlJc w:val="left"/>
+      <w:pPr>
+        <w:tabs>
+          <w:tab w:val="num" w:pos="2127"/>
+        </w:tabs>
+        <w:ind w:left="2127" w:hanging="283"/>
+      </w:pPr>
+      <w:rPr>
+        <w:rFonts w:ascii="Symbol" w:hAnsi="Symbol" w:cs="Symbol" w:hint="default"/>
+      </w:rPr>
+    </w:lvl>
+    <w:lvl w:ilvl="3">
+      <w:start w:val="1"/>
+      <w:numFmt w:val="bullet"/>
+      <w:lvlText w:val=""/>
+      <w:lvlJc w:val="left"/>
+      <w:pPr>
+        <w:tabs>
+          <w:tab w:val="num" w:pos="2836"/>
+        </w:tabs>
+        <w:ind w:left="2836" w:hanging="283"/>
+      </w:pPr>
+      <w:rPr>
+        <w:rFonts w:ascii="Symbol" w:hAnsi="Symbol" w:cs="Symbol" w:hint="default"/>
+      </w:rPr>
+    </w:lvl>
+    <w:lvl w:ilvl="4">
+      <w:start w:val="1"/>
+      <w:numFmt w:val="bullet"/>
+      <w:lvlText w:val=""/>
+      <w:lvlJc w:val="left"/>
+      <w:pPr>
+        <w:tabs>
+          <w:tab w:val="num" w:pos="3545"/>
+        </w:tabs>
+        <w:ind w:left="3545" w:hanging="283"/>
+      </w:pPr>
+      <w:rPr>
+        <w:rFonts w:ascii="Symbol" w:hAnsi="Symbol" w:cs="Symbol" w:hint="default"/>
+      </w:rPr>
+    </w:lvl>
+    <w:lvl w:ilvl="5">
+      <w:start w:val="1"/>
+      <w:numFmt w:val="bullet"/>
+      <w:lvlText w:val=""/>
+      <w:lvlJc w:val="left"/>
+      <w:pPr>
+        <w:tabs>
+          <w:tab w:val="num" w:pos="4254"/>
+        </w:tabs>
+        <w:ind w:left="4254" w:hanging="283"/>
+      </w:pPr>
+      <w:rPr>
+        <w:rFonts w:ascii="Symbol" w:hAnsi="Symbol" w:cs="Symbol" w:hint="default"/>
+      </w:rPr>
+    </w:lvl>
+    <w:lvl w:ilvl="6">
+      <w:start w:val="1"/>
+      <w:numFmt w:val="bullet"/>
+      <w:lvlText w:val=""/>
+      <w:lvlJc w:val="left"/>
+      <w:pPr>
+        <w:tabs>
+          <w:tab w:val="num" w:pos="4963"/>
+        </w:tabs>
+        <w:ind w:left="4963" w:hanging="283"/>
+      </w:pPr>
+      <w:rPr>
+        <w:rFonts w:ascii="Symbol" w:hAnsi="Symbol" w:cs="Symbol" w:hint="default"/>
+      </w:rPr>
+    </w:lvl>
+    <w:lvl w:ilvl="7">
+      <w:start w:val="1"/>
+      <w:numFmt w:val="bullet"/>
+      <w:lvlText w:val=""/>
+      <w:lvlJc w:val="left"/>
+      <w:pPr>
+        <w:tabs>
+          <w:tab w:val="num" w:pos="5672"/>
+        </w:tabs>
+        <w:ind w:left="5672" w:hanging="283"/>
+      </w:pPr>
+      <w:rPr>
+        <w:rFonts w:ascii="Symbol" w:hAnsi="Symbol" w:cs="Symbol" w:hint="default"/>
+      </w:rPr>
+    </w:lvl>
+    <w:lvl w:ilvl="8">
+      <w:start w:val="1"/>
+      <w:numFmt w:val="bullet"/>
+      <w:lvlText w:val=""/>
+      <w:lvlJc w:val="left"/>
+      <w:pPr>
+        <w:tabs>
+          <w:tab w:val="num" w:pos="6381"/>
+        </w:tabs>
+        <w:ind w:left="6381" w:hanging="283"/>
+      </w:pPr>
+      <w:rPr>
+        <w:rFonts w:ascii="Symbol" w:hAnsi="Symbol" w:cs="Symbol" w:hint="default"/>
+      </w:rPr>
+    </w:lvl>
+  </w:abstractNum>
+  <w:abstractNum w:abstractNumId="21">
+    <w:lvl w:ilvl="0">
+      <w:start w:val="1"/>
+      <w:numFmt w:val="bullet"/>
+      <w:lvlText w:val=""/>
+      <w:lvlJc w:val="left"/>
+      <w:pPr>
+        <w:tabs>
+          <w:tab w:val="num" w:pos="709"/>
+        </w:tabs>
+        <w:ind w:left="709" w:hanging="283"/>
+      </w:pPr>
+      <w:rPr>
+        <w:rFonts w:ascii="Symbol" w:hAnsi="Symbol" w:cs="Symbol" w:hint="default"/>
+      </w:rPr>
+    </w:lvl>
+    <w:lvl w:ilvl="1">
+      <w:start w:val="1"/>
+      <w:numFmt w:val="bullet"/>
+      <w:lvlText w:val=""/>
+      <w:lvlJc w:val="left"/>
+      <w:pPr>
+        <w:tabs>
+          <w:tab w:val="num" w:pos="1418"/>
+        </w:tabs>
+        <w:ind w:left="1418" w:hanging="283"/>
+      </w:pPr>
+      <w:rPr>
+        <w:rFonts w:ascii="Symbol" w:hAnsi="Symbol" w:cs="Symbol" w:hint="default"/>
+      </w:rPr>
+    </w:lvl>
+    <w:lvl w:ilvl="2">
+      <w:start w:val="1"/>
+      <w:numFmt w:val="bullet"/>
+      <w:lvlText w:val=""/>
+      <w:lvlJc w:val="left"/>
+      <w:pPr>
+        <w:tabs>
+          <w:tab w:val="num" w:pos="2127"/>
+        </w:tabs>
+        <w:ind w:left="2127" w:hanging="283"/>
+      </w:pPr>
+      <w:rPr>
+        <w:rFonts w:ascii="Symbol" w:hAnsi="Symbol" w:cs="Symbol" w:hint="default"/>
+      </w:rPr>
+    </w:lvl>
+    <w:lvl w:ilvl="3">
+      <w:start w:val="1"/>
+      <w:numFmt w:val="bullet"/>
+      <w:lvlText w:val=""/>
+      <w:lvlJc w:val="left"/>
+      <w:pPr>
+        <w:tabs>
+          <w:tab w:val="num" w:pos="2836"/>
+        </w:tabs>
+        <w:ind w:left="2836" w:hanging="283"/>
+      </w:pPr>
+      <w:rPr>
+        <w:rFonts w:ascii="Symbol" w:hAnsi="Symbol" w:cs="Symbol" w:hint="default"/>
+      </w:rPr>
+    </w:lvl>
+    <w:lvl w:ilvl="4">
+      <w:start w:val="1"/>
+      <w:numFmt w:val="bullet"/>
+      <w:lvlText w:val=""/>
+      <w:lvlJc w:val="left"/>
+      <w:pPr>
+        <w:tabs>
+          <w:tab w:val="num" w:pos="3545"/>
+        </w:tabs>
+        <w:ind w:left="3545" w:hanging="283"/>
+      </w:pPr>
+      <w:rPr>
+        <w:rFonts w:ascii="Symbol" w:hAnsi="Symbol" w:cs="Symbol" w:hint="default"/>
+      </w:rPr>
+    </w:lvl>
+    <w:lvl w:ilvl="5">
+      <w:start w:val="1"/>
+      <w:numFmt w:val="bullet"/>
+      <w:lvlText w:val=""/>
+      <w:lvlJc w:val="left"/>
+      <w:pPr>
+        <w:tabs>
+          <w:tab w:val="num" w:pos="4254"/>
+        </w:tabs>
+        <w:ind w:left="4254" w:hanging="283"/>
+      </w:pPr>
+      <w:rPr>
+        <w:rFonts w:ascii="Symbol" w:hAnsi="Symbol" w:cs="Symbol" w:hint="default"/>
+      </w:rPr>
+    </w:lvl>
+    <w:lvl w:ilvl="6">
+      <w:start w:val="1"/>
+      <w:numFmt w:val="bullet"/>
+      <w:lvlText w:val=""/>
+      <w:lvlJc w:val="left"/>
+      <w:pPr>
+        <w:tabs>
+          <w:tab w:val="num" w:pos="4963"/>
+        </w:tabs>
+        <w:ind w:left="4963" w:hanging="283"/>
+      </w:pPr>
+      <w:rPr>
+        <w:rFonts w:ascii="Symbol" w:hAnsi="Symbol" w:cs="Symbol" w:hint="default"/>
+      </w:rPr>
+    </w:lvl>
+    <w:lvl w:ilvl="7">
+      <w:start w:val="1"/>
+      <w:numFmt w:val="bullet"/>
+      <w:lvlText w:val=""/>
+      <w:lvlJc w:val="left"/>
+      <w:pPr>
+        <w:tabs>
+          <w:tab w:val="num" w:pos="5672"/>
+        </w:tabs>
+        <w:ind w:left="5672" w:hanging="283"/>
+      </w:pPr>
+      <w:rPr>
+        <w:rFonts w:ascii="Symbol" w:hAnsi="Symbol" w:cs="Symbol" w:hint="default"/>
+      </w:rPr>
+    </w:lvl>
+    <w:lvl w:ilvl="8">
+      <w:start w:val="1"/>
+      <w:numFmt w:val="bullet"/>
+      <w:lvlText w:val=""/>
+      <w:lvlJc w:val="left"/>
+      <w:pPr>
+        <w:tabs>
+          <w:tab w:val="num" w:pos="6381"/>
+        </w:tabs>
+        <w:ind w:left="6381" w:hanging="283"/>
+      </w:pPr>
+      <w:rPr>
+        <w:rFonts w:ascii="Symbol" w:hAnsi="Symbol" w:cs="Symbol" w:hint="default"/>
+      </w:rPr>
+    </w:lvl>
+  </w:abstractNum>
+  <w:abstractNum w:abstractNumId="22">
     <w:lvl w:ilvl="0">
       <w:start w:val="1"/>
       <w:numFmt w:val="none"/>
@@ -15742,6 +16586,12 @@
   </w:num>
   <w:num w:numId="20">
     <w:abstractNumId w:val="20"/>
+  </w:num>
+  <w:num w:numId="21">
+    <w:abstractNumId w:val="21"/>
+  </w:num>
+  <w:num w:numId="22">
+    <w:abstractNumId w:val="22"/>
   </w:num>
 </w:numbering>
 </file>

</xml_diff>

<commit_message>
T-0087: docs for refunds and harness checks - README, review/status/autopilot commands, three guides (rebuilt with LibreOffice), lifecycle diagram
</commit_message>
<xml_diff>
--- a/docs/guides/crew/crew-1.0-troubleshooting.docx
+++ b/docs/guides/crew/crew-1.0-troubleshooting.docx
@@ -3308,6 +3308,185 @@
         <w:rPr>
           <w:rStyle w:val="Strong"/>
         </w:rPr>
+        <w:t xml:space="preserve">Symptom: a round came back </w:t>
+      </w:r>
+      <w:r>
+        <w:rPr>
+          <w:rStyle w:val="SourceText"/>
+        </w:rPr>
+        <w:t>INCOMPLETE</w:t>
+      </w:r>
+      <w:r>
+        <w:rPr>
+          <w:rStyle w:val="Strong"/>
+        </w:rPr>
+        <w:t>.</w:t>
+      </w:r>
+      <w:r>
+        <w:rPr/>
+        <w:t xml:space="preserve"> </w:t>
+      </w:r>
+      <w:r>
+        <w:rPr>
+          <w:rStyle w:val="Strong"/>
+        </w:rPr>
+        <w:t>Check:</w:t>
+      </w:r>
+      <w:r>
+        <w:rPr/>
+        <w:t xml:space="preserve"> the </w:t>
+      </w:r>
+      <w:r>
+        <w:rPr>
+          <w:rStyle w:val="SourceText"/>
+        </w:rPr>
+        <w:t>review:</w:t>
+      </w:r>
+      <w:r>
+        <w:rPr/>
+        <w:t xml:space="preserve"> lines, or </w:t>
+      </w:r>
+      <w:r>
+        <w:rPr>
+          <w:rStyle w:val="SourceText"/>
+        </w:rPr>
+        <w:t>failure_class</w:t>
+      </w:r>
+      <w:r>
+        <w:rPr/>
+        <w:t xml:space="preserve"> in </w:t>
+      </w:r>
+      <w:r>
+        <w:rPr>
+          <w:rStyle w:val="SourceText"/>
+        </w:rPr>
+        <w:t>.work/tickets/&lt;id&gt;/review.json</w:t>
+      </w:r>
+      <w:r>
+        <w:rPr/>
+        <w:t xml:space="preserve">. An INCOMPLETE round has one of three classes. </w:t>
+      </w:r>
+      <w:r>
+        <w:rPr>
+          <w:rStyle w:val="SourceText"/>
+        </w:rPr>
+        <w:t>tool</w:t>
+      </w:r>
+      <w:r>
+        <w:rPr/>
+        <w:t xml:space="preserve"> means the answer never arrived intact: a timeout, a bad or unknown exit, empty output, or a failed Codex stream. </w:t>
+      </w:r>
+      <w:r>
+        <w:rPr>
+          <w:rStyle w:val="SourceText"/>
+        </w:rPr>
+        <w:t>tree</w:t>
+      </w:r>
+      <w:r>
+        <w:rPr/>
+        <w:t xml:space="preserve"> means a bundle part or web-test report changed under the reviewer. </w:t>
+      </w:r>
+      <w:r>
+        <w:rPr>
+          <w:rStyle w:val="SourceText"/>
+        </w:rPr>
+        <w:t>reviewer</w:t>
+      </w:r>
+      <w:r>
+        <w:rPr/>
+        <w:t xml:space="preserve"> means the output arrived and broke the contract. </w:t>
+      </w:r>
+      <w:r>
+        <w:rPr>
+          <w:rStyle w:val="Strong"/>
+        </w:rPr>
+        <w:t>Fix:</w:t>
+      </w:r>
+      <w:r>
+        <w:rPr/>
+        <w:t xml:space="preserve"> a </w:t>
+      </w:r>
+      <w:r>
+        <w:rPr>
+          <w:rStyle w:val="SourceText"/>
+        </w:rPr>
+        <w:t>tool</w:t>
+      </w:r>
+      <w:r>
+        <w:rPr/>
+        <w:t xml:space="preserve"> round is refunded automatically, up to two per plan. The line reads </w:t>
+      </w:r>
+      <w:r>
+        <w:rPr>
+          <w:rStyle w:val="SourceText"/>
+        </w:rPr>
+        <w:t>review: round N was a tool failure (...); refunded</w:t>
+      </w:r>
+      <w:r>
+        <w:rPr/>
+        <w:t xml:space="preserve">. Rerun </w:t>
+      </w:r>
+      <w:r>
+        <w:rPr>
+          <w:rStyle w:val="SourceText"/>
+        </w:rPr>
+        <w:t>/crew:review</w:t>
+      </w:r>
+      <w:r>
+        <w:rPr/>
+        <w:t xml:space="preserve">, which does not spend the budget; if Codex is out of quota, use the next eligible provider. A third tool failure under one plan reads </w:t>
+      </w:r>
+      <w:r>
+        <w:rPr>
+          <w:rStyle w:val="SourceText"/>
+        </w:rPr>
+        <w:t>NOT refunded - refund limit 2 per plan reached</w:t>
+      </w:r>
+      <w:r>
+        <w:rPr/>
+        <w:t xml:space="preserve"> and counts. A </w:t>
+      </w:r>
+      <w:r>
+        <w:rPr>
+          <w:rStyle w:val="SourceText"/>
+        </w:rPr>
+        <w:t>reviewer</w:t>
+      </w:r>
+      <w:r>
+        <w:rPr/>
+        <w:t xml:space="preserve"> or </w:t>
+      </w:r>
+      <w:r>
+        <w:rPr>
+          <w:rStyle w:val="SourceText"/>
+        </w:rPr>
+        <w:t>tree</w:t>
+      </w:r>
+      <w:r>
+        <w:rPr/>
+        <w:t xml:space="preserve"> round always counts. Rebuild the bundle (tree), or rerun and read what the reviewer wrote (reviewer).</w:t>
+      </w:r>
+    </w:p>
+    <w:p>
+      <w:pPr>
+        <w:pStyle w:val="BodyText"/>
+        <w:numPr>
+          <w:ilvl w:val="0"/>
+          <w:numId w:val="6"/>
+        </w:numPr>
+        <w:tabs>
+          <w:tab w:val="clear" w:pos="1134"/>
+          <w:tab w:val="left" w:pos="829" w:leader="none"/>
+        </w:tabs>
+        <w:bidi w:val="0"/>
+        <w:ind w:hanging="283" w:left="829"/>
+        <w:jc w:val="left"/>
+        <w:rPr/>
+      </w:pPr>
+      <w:r>
+        <w:rPr>
+          <w:rStyle w:val="Strong"/>
+        </w:rPr>
         <w:t xml:space="preserve">Symptom: </w:t>
       </w:r>
       <w:r>
@@ -3331,10 +3510,6 @@
           <w:rStyle w:val="Strong"/>
         </w:rPr>
         <w:t>Check:</w:t>
-      </w:r>
-      <w:r>
-        <w:rPr/>
-        <w:t xml:space="preserve"> </w:t>
       </w:r>
     </w:p>
     <w:p>

</xml_diff>

<commit_message>
T-0088: rebuild the working-with-codex and troubleshooting guides (build.py --guide; LibreOffice 26.2.5.2, not Microsoft Word)
</commit_message>
<xml_diff>
--- a/docs/guides/crew/crew-1.0-troubleshooting.docx
+++ b/docs/guides/crew/crew-1.0-troubleshooting.docx
@@ -3453,6 +3453,137 @@
         <w:rPr>
           <w:rStyle w:val="Strong"/>
         </w:rPr>
+        <w:t>Symptom: Codex hit a usage limit.</w:t>
+      </w:r>
+      <w:r>
+        <w:rPr/>
+        <w:t xml:space="preserve"> </w:t>
+      </w:r>
+      <w:r>
+        <w:rPr>
+          <w:rStyle w:val="SourceText"/>
+        </w:rPr>
+        <w:t>/crew:review</w:t>
+      </w:r>
+      <w:r>
+        <w:rPr/>
+        <w:t xml:space="preserve"> said </w:t>
+      </w:r>
+      <w:r>
+        <w:rPr>
+          <w:rStyle w:val="SourceText"/>
+        </w:rPr>
+        <w:t>codex probe: limited</w:t>
+      </w:r>
+      <w:r>
+        <w:rPr/>
+        <w:t xml:space="preserve"> or printed </w:t>
+      </w:r>
+      <w:r>
+        <w:rPr>
+          <w:rStyle w:val="SourceText"/>
+        </w:rPr>
+        <w:t>review: codex usage limit in round N: ...</w:t>
+      </w:r>
+      <w:r>
+        <w:rPr/>
+        <w:t xml:space="preserve">. </w:t>
+      </w:r>
+      <w:r>
+        <w:rPr>
+          <w:rStyle w:val="Strong"/>
+        </w:rPr>
+        <w:t>Cause:</w:t>
+      </w:r>
+      <w:r>
+        <w:rPr/>
+        <w:t xml:space="preserve"> Codex's usage limit, rate limit, quota or spend cap - its own message is quoted. </w:t>
+      </w:r>
+      <w:r>
+        <w:rPr>
+          <w:rStyle w:val="Strong"/>
+        </w:rPr>
+        <w:t>What happens:</w:t>
+      </w:r>
+      <w:r>
+        <w:rPr/>
+        <w:t xml:space="preserve"> that round runs on the Claude reviewer, announced as </w:t>
+      </w:r>
+      <w:r>
+        <w:rPr>
+          <w:rStyle w:val="SourceText"/>
+        </w:rPr>
+        <w:t>same-family (codex limit)</w:t>
+      </w:r>
+      <w:r>
+        <w:rPr/>
+        <w:t xml:space="preserve"> and not independent; the limit is recorded in </w:t>
+      </w:r>
+      <w:r>
+        <w:rPr>
+          <w:rStyle w:val="SourceText"/>
+        </w:rPr>
+        <w:t>&lt;git-common-dir&gt;/crew/review/&lt;ticket&gt;.limit.json</w:t>
+      </w:r>
+      <w:r>
+        <w:rPr/>
+        <w:t xml:space="preserve"> and applies to the next round only. The round is spent like any other. To check Codex yourself without spending one: </w:t>
+      </w:r>
+    </w:p>
+    <w:p>
+      <w:pPr>
+        <w:pStyle w:val="PreformattedText"/>
+        <w:bidi w:val="0"/>
+        <w:jc w:val="left"/>
+        <w:rPr/>
+      </w:pPr>
+      <w:r>
+        <w:rPr>
+          <w:rStyle w:val="SourceText"/>
+        </w:rPr>
+        <w:t>python3 "&lt;crew&gt;/hooks/scripts/review_run.py" --root . --ticket &lt;id&gt; --scratch &lt;dir&gt; \</w:t>
+      </w:r>
+    </w:p>
+    <w:p>
+      <w:pPr>
+        <w:pStyle w:val="PreformattedText"/>
+        <w:bidi w:val="0"/>
+        <w:jc w:val="left"/>
+        <w:rPr/>
+      </w:pPr>
+      <w:r>
+        <w:rPr>
+          <w:rStyle w:val="SourceText"/>
+        </w:rPr>
+        <w:t xml:space="preserve">  </w:t>
+      </w:r>
+      <w:r>
+        <w:rPr>
+          <w:rStyle w:val="SourceText"/>
+        </w:rPr>
+        <w:t>--provider codex --probe</w:t>
+      </w:r>
+    </w:p>
+    <w:p>
+      <w:pPr>
+        <w:pStyle w:val="BodyText"/>
+        <w:numPr>
+          <w:ilvl w:val="0"/>
+          <w:numId w:val="8"/>
+        </w:numPr>
+        <w:tabs>
+          <w:tab w:val="clear" w:pos="1134"/>
+          <w:tab w:val="left" w:pos="829" w:leader="none"/>
+        </w:tabs>
+        <w:bidi w:val="0"/>
+        <w:ind w:hanging="283" w:left="829"/>
+        <w:jc w:val="left"/>
+        <w:rPr/>
+      </w:pPr>
+      <w:r>
+        <w:rPr>
+          <w:rStyle w:val="Strong"/>
+        </w:rPr>
         <w:t>Symptom: you want to send a ticket back without spending the third round.</w:t>
       </w:r>
       <w:r>
@@ -3600,13 +3731,14 @@
         <w:pStyle w:val="BodyText"/>
         <w:numPr>
           <w:ilvl w:val="0"/>
-          <w:numId w:val="8"/>
+          <w:numId w:val="9"/>
         </w:numPr>
         <w:tabs>
           <w:tab w:val="clear" w:pos="1134"/>
           <w:tab w:val="left" w:pos="829" w:leader="none"/>
         </w:tabs>
         <w:bidi w:val="0"/>
+        <w:spacing w:before="120" w:after="0"/>
         <w:ind w:hanging="283" w:left="829"/>
         <w:jc w:val="left"/>
         <w:rPr/>
@@ -3615,7 +3747,57 @@
         <w:rPr>
           <w:rStyle w:val="Strong"/>
         </w:rPr>
-        <w:t>Symptom: an edit inside Touch is still refused.</w:t>
+        <w:t>Symptom: a lane worktree does not see my settings</w:t>
+      </w:r>
+      <w:r>
+        <w:rPr/>
+        <w:t xml:space="preserve"> (a CLI approval refused, </w:t>
+      </w:r>
+      <w:r>
+        <w:rPr>
+          <w:rStyle w:val="SourceText"/>
+        </w:rPr>
+        <w:t>scope.mode</w:t>
+      </w:r>
+      <w:r>
+        <w:rPr/>
+        <w:t xml:space="preserve"> read as </w:t>
+      </w:r>
+      <w:r>
+        <w:rPr>
+          <w:rStyle w:val="SourceText"/>
+        </w:rPr>
+        <w:t>off</w:t>
+      </w:r>
+      <w:r>
+        <w:rPr/>
+        <w:t xml:space="preserve">, guards at their defaults). </w:t>
+      </w:r>
+      <w:r>
+        <w:rPr>
+          <w:rStyle w:val="SourceText"/>
+        </w:rPr>
+        <w:t>.crew/*</w:t>
+      </w:r>
+      <w:r>
+        <w:rPr/>
+        <w:t xml:space="preserve"> is gitignored, so </w:t>
+      </w:r>
+      <w:r>
+        <w:rPr>
+          <w:rStyle w:val="SourceText"/>
+        </w:rPr>
+        <w:t>git worktree add</w:t>
+      </w:r>
+      <w:r>
+        <w:rPr/>
+        <w:t xml:space="preserve"> makes a checkout with no crew config. </w:t>
+      </w:r>
+      <w:r>
+        <w:rPr>
+          <w:rStyle w:val="Strong"/>
+        </w:rPr>
+        <w:t>Check:</w:t>
       </w:r>
       <w:r>
         <w:rPr/>
@@ -3623,119 +3805,63 @@
       </w:r>
       <w:r>
         <w:rPr>
+          <w:rStyle w:val="SourceText"/>
+        </w:rPr>
+        <w:t>/crew:status</w:t>
+      </w:r>
+      <w:r>
+        <w:rPr/>
+        <w:t xml:space="preserve"> prints </w:t>
+      </w:r>
+      <w:r>
+        <w:rPr>
+          <w:rStyle w:val="SourceText"/>
+        </w:rPr>
+        <w:t>config inherited from the main checkout (&lt;path&gt;) ...</w:t>
+      </w:r>
+      <w:r>
+        <w:rPr/>
+        <w:t xml:space="preserve"> when the worktree reads the main checkout's </w:t>
+      </w:r>
+      <w:r>
+        <w:rPr>
+          <w:rStyle w:val="SourceText"/>
+        </w:rPr>
+        <w:t>.crew/config.json</w:t>
+      </w:r>
+      <w:r>
+        <w:rPr/>
+        <w:t xml:space="preserve"> (crew 1.0.52+, T-0088), and </w:t>
+      </w:r>
+      <w:r>
+        <w:rPr>
+          <w:rStyle w:val="SourceText"/>
+        </w:rPr>
+        <w:t>crew_config.py --root . --explain</w:t>
+      </w:r>
+      <w:r>
+        <w:rPr/>
+        <w:t xml:space="preserve"> starts with </w:t>
+      </w:r>
+      <w:r>
+        <w:rPr>
+          <w:rStyle w:val="SourceText"/>
+        </w:rPr>
+        <w:t>repo layer: &lt;path&gt; (&lt;source&gt;)</w:t>
+      </w:r>
+      <w:r>
+        <w:rPr/>
+        <w:t xml:space="preserve">. </w:t>
+      </w:r>
+      <w:r>
+        <w:rPr>
           <w:rStyle w:val="Strong"/>
         </w:rPr>
-        <w:t>Check:</w:t>
-      </w:r>
-      <w:r>
-        <w:rPr/>
-        <w:t xml:space="preserve"> approval status. </w:t>
-      </w:r>
-    </w:p>
-    <w:p>
-      <w:pPr>
-        <w:pStyle w:val="PreformattedText"/>
-        <w:bidi w:val="0"/>
-        <w:jc w:val="left"/>
-        <w:rPr/>
-      </w:pPr>
-      <w:r>
-        <w:rPr>
-          <w:rStyle w:val="SourceText"/>
-        </w:rPr>
-        <w:t>python3 "&lt;crew&gt;/hooks/scripts/crew_ticket.py" status --ticket &lt;id&gt;</w:t>
-      </w:r>
-    </w:p>
-    <w:p>
-      <w:pPr>
-        <w:pStyle w:val="BodyText"/>
-        <w:bidi w:val="0"/>
-        <w:jc w:val="left"/>
-        <w:rPr/>
-      </w:pPr>
-      <w:r>
-        <w:rPr/>
-        <w:t xml:space="preserve">Returns </w:t>
-      </w:r>
-      <w:r>
-        <w:rPr>
-          <w:rStyle w:val="SourceText"/>
-        </w:rPr>
-        <w:t>approved</w:t>
-      </w:r>
-      <w:r>
-        <w:rPr/>
-        <w:t xml:space="preserve"> (both </w:t>
-      </w:r>
-      <w:r>
-        <w:rPr>
-          <w:rStyle w:val="SourceText"/>
-        </w:rPr>
-        <w:t>spec.md</w:t>
-      </w:r>
-      <w:r>
-        <w:rPr/>
-        <w:t xml:space="preserve"> and </w:t>
-      </w:r>
-      <w:r>
-        <w:rPr>
-          <w:rStyle w:val="SourceText"/>
-        </w:rPr>
-        <w:t>plan.md</w:t>
-      </w:r>
-      <w:r>
-        <w:rPr/>
-        <w:t xml:space="preserve"> hash to what was approved), </w:t>
-      </w:r>
-      <w:r>
-        <w:rPr>
-          <w:rStyle w:val="SourceText"/>
-        </w:rPr>
-        <w:t>stale</w:t>
-      </w:r>
-      <w:r>
-        <w:rPr/>
-        <w:t xml:space="preserve"> (either file changed since), or </w:t>
-      </w:r>
-      <w:r>
-        <w:rPr>
-          <w:rStyle w:val="SourceText"/>
-        </w:rPr>
-        <w:t>none</w:t>
-      </w:r>
-      <w:r>
-        <w:rPr/>
-        <w:t xml:space="preserve">. </w:t>
-      </w:r>
-      <w:r>
-        <w:rPr>
-          <w:rStyle w:val="Strong"/>
-        </w:rPr>
-        <w:t>Editing spec.md or plan.md after approval makes the approval stale immediately</w:t>
-      </w:r>
-      <w:r>
-        <w:rPr/>
-        <w:t xml:space="preserve"> — that is deliberate: an edited spec cannot silently widen what the guard accepts. Only a receipt from the user's own prompt counts by default; a </w:t>
-      </w:r>
-      <w:r>
-        <w:rPr>
-          <w:rStyle w:val="SourceText"/>
-        </w:rPr>
-        <w:t>cli</w:t>
-      </w:r>
-      <w:r>
-        <w:rPr/>
-        <w:t xml:space="preserve">-sourced receipt (written by </w:t>
-      </w:r>
-      <w:r>
-        <w:rPr>
-          <w:rStyle w:val="SourceText"/>
-        </w:rPr>
-        <w:t>crew_ticket.py approve</w:t>
-      </w:r>
-      <w:r>
-        <w:rPr/>
-        <w:t xml:space="preserve"> directly, for tests/CI) is accepted only when </w:t>
+        <w:t>Cause and fix:</w:t>
+      </w:r>
+      <w:r>
+        <w:rPr/>
+        <w:t xml:space="preserve"> a worktree with its own </w:t>
       </w:r>
       <w:r>
         <w:rPr>
@@ -3745,67 +3871,97 @@
       </w:r>
       <w:r>
         <w:rPr/>
-        <w:t xml:space="preserve"> sets </w:t>
-      </w:r>
-      <w:r>
-        <w:rPr>
-          <w:rStyle w:val="SourceText"/>
-        </w:rPr>
-        <w:t>scope.allowCliApproval: true</w:t>
-      </w:r>
-      <w:r>
-        <w:rPr/>
-        <w:t xml:space="preserve">. </w:t>
-      </w:r>
-      <w:r>
-        <w:rPr>
-          <w:rStyle w:val="Strong"/>
-        </w:rPr>
-        <w:t>Fix:</w:t>
-      </w:r>
-      <w:r>
-        <w:rPr/>
-        <w:t xml:space="preserve"> re-approve. The user types </w:t>
-      </w:r>
-      <w:r>
-        <w:rPr>
-          <w:rStyle w:val="SourceText"/>
-        </w:rPr>
-        <w:t>/crew:approve &lt;id&gt;</w:t>
-      </w:r>
-      <w:r>
-        <w:rPr/>
-        <w:t xml:space="preserve"> again — nothing else can write the receipt; </w:t>
-      </w:r>
-      <w:r>
-        <w:rPr>
-          <w:rStyle w:val="SourceText"/>
-        </w:rPr>
-        <w:t>scope_guard.py</w:t>
-      </w:r>
-      <w:r>
-        <w:rPr/>
-        <w:t xml:space="preserve"> refuses a Write/Edit under </w:t>
-      </w:r>
-      <w:r>
-        <w:rPr>
-          <w:rStyle w:val="SourceText"/>
-        </w:rPr>
-        <w:t>&lt;git-common-dir&gt;/crew/</w:t>
-      </w:r>
-      <w:r>
-        <w:rPr/>
-        <w:t xml:space="preserve"> in every mode but </w:t>
-      </w:r>
-      <w:r>
-        <w:rPr>
-          <w:rStyle w:val="SourceText"/>
-        </w:rPr>
-        <w:t>off</w:t>
-      </w:r>
-      <w:r>
-        <w:rPr/>
-        <w:t>, so a session cannot forge or refresh its own approval.</w:t>
+        <w:t xml:space="preserve"> or </w:t>
+      </w:r>
+      <w:r>
+        <w:rPr>
+          <w:rStyle w:val="SourceText"/>
+        </w:rPr>
+        <w:t>.crew/crew.json</w:t>
+      </w:r>
+      <w:r>
+        <w:rPr/>
+        <w:t xml:space="preserve"> reads only those, never merged with the main checkout's - delete them to inherit. </w:t>
+      </w:r>
+      <w:r>
+        <w:rPr>
+          <w:rStyle w:val="SourceText"/>
+        </w:rPr>
+        <w:t>(unknown)</w:t>
+      </w:r>
+      <w:r>
+        <w:rPr/>
+        <w:t xml:space="preserve"> means git could not name the main checkout. The shell and PowerShell readers (</w:t>
+      </w:r>
+      <w:r>
+        <w:rPr>
+          <w:rStyle w:val="SourceText"/>
+        </w:rPr>
+        <w:t>verify-gate.sh</w:t>
+      </w:r>
+      <w:r>
+        <w:rPr/>
+        <w:t xml:space="preserve">, </w:t>
+      </w:r>
+      <w:r>
+        <w:rPr>
+          <w:rStyle w:val="SourceText"/>
+        </w:rPr>
+        <w:t>_common.sh</w:t>
+      </w:r>
+      <w:r>
+        <w:rPr/>
+        <w:t xml:space="preserve">, </w:t>
+      </w:r>
+      <w:r>
+        <w:rPr>
+          <w:rStyle w:val="SourceText"/>
+        </w:rPr>
+        <w:t>notify.sh</w:t>
+      </w:r>
+      <w:r>
+        <w:rPr/>
+        <w:t xml:space="preserve">, the handoff scripts, </w:t>
+      </w:r>
+      <w:r>
+        <w:rPr>
+          <w:rStyle w:val="SourceText"/>
+        </w:rPr>
+        <w:t>promote-gate.ps1</w:t>
+      </w:r>
+      <w:r>
+        <w:rPr/>
+        <w:t xml:space="preserve">, </w:t>
+      </w:r>
+      <w:r>
+        <w:rPr>
+          <w:rStyle w:val="SourceText"/>
+        </w:rPr>
+        <w:t>scope-guard.ps1</w:t>
+      </w:r>
+      <w:r>
+        <w:rPr/>
+        <w:t xml:space="preserve">, </w:t>
+      </w:r>
+      <w:r>
+        <w:rPr>
+          <w:rStyle w:val="SourceText"/>
+        </w:rPr>
+        <w:t>cloud-guard.ps1</w:t>
+      </w:r>
+      <w:r>
+        <w:rPr/>
+        <w:t xml:space="preserve">, </w:t>
+      </w:r>
+      <w:r>
+        <w:rPr>
+          <w:rStyle w:val="SourceText"/>
+        </w:rPr>
+        <w:t>auto-clear.ps1</w:t>
+      </w:r>
+      <w:r>
+        <w:rPr/>
+        <w:t xml:space="preserve">) do not inherit yet. </w:t>
       </w:r>
     </w:p>
     <w:p>
@@ -3828,7 +3984,7 @@
         <w:rPr>
           <w:rStyle w:val="Strong"/>
         </w:rPr>
-        <w:t>Symptom: you need to touch one more path mid-ticket.</w:t>
+        <w:t>Symptom: an edit inside Touch is still refused.</w:t>
       </w:r>
       <w:r>
         <w:rPr/>
@@ -3838,166 +3994,11 @@
         <w:rPr>
           <w:rStyle w:val="Strong"/>
         </w:rPr>
-        <w:t>Fix:</w:t>
-      </w:r>
-      <w:r>
-        <w:rPr/>
-        <w:t xml:space="preserve"> amend </w:t>
-      </w:r>
-      <w:r>
-        <w:rPr>
-          <w:rStyle w:val="SourceText"/>
-        </w:rPr>
-        <w:t>spec.md</w:t>
-      </w:r>
-      <w:r>
-        <w:rPr/>
-        <w:t xml:space="preserve">'s </w:t>
-      </w:r>
-      <w:r>
-        <w:rPr>
-          <w:rStyle w:val="SourceText"/>
-        </w:rPr>
-        <w:t>## Touch</w:t>
-      </w:r>
-      <w:r>
-        <w:rPr/>
-        <w:t xml:space="preserve"> (widen it), then approve again. There is no partial-approve; amending scope is edit-then-approve, same as any other spec change.</w:t>
-      </w:r>
-    </w:p>
-    <w:p>
-      <w:pPr>
-        <w:pStyle w:val="BodyText"/>
-        <w:numPr>
-          <w:ilvl w:val="0"/>
-          <w:numId w:val="9"/>
-        </w:numPr>
-        <w:tabs>
-          <w:tab w:val="clear" w:pos="1134"/>
-          <w:tab w:val="left" w:pos="829" w:leader="none"/>
-        </w:tabs>
-        <w:bidi w:val="0"/>
-        <w:ind w:hanging="283" w:left="829"/>
-        <w:jc w:val="left"/>
-        <w:rPr/>
-      </w:pPr>
-      <w:r>
-        <w:rPr>
-          <w:rStyle w:val="Strong"/>
-        </w:rPr>
-        <w:t xml:space="preserve">Symptom: </w:t>
-      </w:r>
-      <w:r>
-        <w:rPr>
-          <w:rStyle w:val="SourceText"/>
-        </w:rPr>
-        <w:t>/crew:done</w:t>
-      </w:r>
-      <w:r>
-        <w:rPr>
-          <w:rStyle w:val="Strong"/>
-        </w:rPr>
-        <w:t xml:space="preserve"> refuses on "out of scope" for a file the edit guard never saw.</w:t>
-      </w:r>
-      <w:r>
-        <w:rPr/>
-        <w:t xml:space="preserve"> This is the Stop-time completion audit (</w:t>
-      </w:r>
-      <w:r>
-        <w:rPr>
-          <w:rStyle w:val="SourceText"/>
-        </w:rPr>
-        <w:t>completion_audit.py</w:t>
-      </w:r>
-      <w:r>
-        <w:rPr/>
-        <w:t xml:space="preserve">), not the edit guard. The edit guard only sees </w:t>
-      </w:r>
-      <w:r>
-        <w:rPr>
-          <w:rStyle w:val="SourceText"/>
-        </w:rPr>
-        <w:t>Write</w:t>
-      </w:r>
-      <w:r>
-        <w:rPr/>
-        <w:t>/</w:t>
-      </w:r>
-      <w:r>
-        <w:rPr>
-          <w:rStyle w:val="SourceText"/>
-        </w:rPr>
-        <w:t>Edit</w:t>
-      </w:r>
-      <w:r>
-        <w:rPr/>
-        <w:t>/</w:t>
-      </w:r>
-      <w:r>
-        <w:rPr>
-          <w:rStyle w:val="SourceText"/>
-        </w:rPr>
-        <w:t>MultiEdit</w:t>
-      </w:r>
-      <w:r>
-        <w:rPr/>
-        <w:t>/</w:t>
-      </w:r>
-      <w:r>
-        <w:rPr>
-          <w:rStyle w:val="SourceText"/>
-        </w:rPr>
-        <w:t>NotebookEdit</w:t>
-      </w:r>
-      <w:r>
-        <w:rPr/>
-        <w:t xml:space="preserve"> tool calls; a </w:t>
-      </w:r>
-      <w:r>
-        <w:rPr>
-          <w:rStyle w:val="SourceText"/>
-        </w:rPr>
-        <w:t>sed -i</w:t>
-      </w:r>
-      <w:r>
-        <w:rPr/>
-        <w:t xml:space="preserve">, a redirect, a formatter or a </w:t>
-      </w:r>
-      <w:r>
-        <w:rPr>
-          <w:rStyle w:val="SourceText"/>
-        </w:rPr>
-        <w:t>git mv</w:t>
-      </w:r>
-      <w:r>
-        <w:rPr/>
-        <w:t xml:space="preserve"> never reaches it. The audit instead diffs the </w:t>
-      </w:r>
-      <w:r>
-        <w:rPr>
-          <w:rStyle w:val="Strong"/>
-        </w:rPr>
-        <w:t>whole working tree</w:t>
-      </w:r>
-      <w:r>
-        <w:rPr/>
-        <w:t xml:space="preserve"> against the ticket's scope base (</w:t>
-      </w:r>
-      <w:r>
-        <w:rPr>
-          <w:rStyle w:val="SourceText"/>
-        </w:rPr>
-        <w:t>scope_base.resolve</w:t>
-      </w:r>
-      <w:r>
-        <w:rPr/>
-        <w:t xml:space="preserve"> — the commit the ticket started from) across committed, staged, unstaged and untracked changes, so a shell-made write is caught here even though nothing blocked it at the time. </w:t>
-      </w:r>
-      <w:r>
-        <w:rPr>
-          <w:rStyle w:val="Strong"/>
-        </w:rPr>
-        <w:t>Check it directly, without waiting for a Stop:</w:t>
+        <w:t>Check:</w:t>
+      </w:r>
+      <w:r>
+        <w:rPr/>
+        <w:t xml:space="preserve"> approval status. </w:t>
       </w:r>
     </w:p>
     <w:p>
@@ -4011,7 +4012,7 @@
         <w:rPr>
           <w:rStyle w:val="SourceText"/>
         </w:rPr>
-        <w:t>python3 "&lt;crew&gt;/hooks/scripts/completion_audit.py" --check --ticket &lt;id&gt;</w:t>
+        <w:t>python3 "&lt;crew&gt;/hooks/scripts/crew_ticket.py" status --ticket &lt;id&gt;</w:t>
       </w:r>
     </w:p>
     <w:p>
@@ -4022,34 +4023,158 @@
         <w:rPr/>
       </w:pPr>
       <w:r>
+        <w:rPr/>
+        <w:t xml:space="preserve">Returns </w:t>
+      </w:r>
+      <w:r>
+        <w:rPr>
+          <w:rStyle w:val="SourceText"/>
+        </w:rPr>
+        <w:t>approved</w:t>
+      </w:r>
+      <w:r>
+        <w:rPr/>
+        <w:t xml:space="preserve"> (both </w:t>
+      </w:r>
+      <w:r>
+        <w:rPr>
+          <w:rStyle w:val="SourceText"/>
+        </w:rPr>
+        <w:t>spec.md</w:t>
+      </w:r>
+      <w:r>
+        <w:rPr/>
+        <w:t xml:space="preserve"> and </w:t>
+      </w:r>
+      <w:r>
+        <w:rPr>
+          <w:rStyle w:val="SourceText"/>
+        </w:rPr>
+        <w:t>plan.md</w:t>
+      </w:r>
+      <w:r>
+        <w:rPr/>
+        <w:t xml:space="preserve"> hash to what was approved), </w:t>
+      </w:r>
+      <w:r>
+        <w:rPr>
+          <w:rStyle w:val="SourceText"/>
+        </w:rPr>
+        <w:t>stale</w:t>
+      </w:r>
+      <w:r>
+        <w:rPr/>
+        <w:t xml:space="preserve"> (either file changed since), or </w:t>
+      </w:r>
+      <w:r>
+        <w:rPr>
+          <w:rStyle w:val="SourceText"/>
+        </w:rPr>
+        <w:t>none</w:t>
+      </w:r>
+      <w:r>
+        <w:rPr/>
+        <w:t xml:space="preserve">. </w:t>
+      </w:r>
+      <w:r>
         <w:rPr>
           <w:rStyle w:val="Strong"/>
         </w:rPr>
+        <w:t>Editing spec.md or plan.md after approval makes the approval stale immediately</w:t>
+      </w:r>
+      <w:r>
+        <w:rPr/>
+        <w:t xml:space="preserve"> — that is deliberate: an edited spec cannot silently widen what the guard accepts. Only a receipt from the user's own prompt counts by default; a </w:t>
+      </w:r>
+      <w:r>
+        <w:rPr>
+          <w:rStyle w:val="SourceText"/>
+        </w:rPr>
+        <w:t>cli</w:t>
+      </w:r>
+      <w:r>
+        <w:rPr/>
+        <w:t xml:space="preserve">-sourced receipt (written by </w:t>
+      </w:r>
+      <w:r>
+        <w:rPr>
+          <w:rStyle w:val="SourceText"/>
+        </w:rPr>
+        <w:t>crew_ticket.py approve</w:t>
+      </w:r>
+      <w:r>
+        <w:rPr/>
+        <w:t xml:space="preserve"> directly, for tests/CI) is accepted only when </w:t>
+      </w:r>
+      <w:r>
+        <w:rPr>
+          <w:rStyle w:val="SourceText"/>
+        </w:rPr>
+        <w:t>.crew/config.json</w:t>
+      </w:r>
+      <w:r>
+        <w:rPr/>
+        <w:t xml:space="preserve"> sets </w:t>
+      </w:r>
+      <w:r>
+        <w:rPr>
+          <w:rStyle w:val="SourceText"/>
+        </w:rPr>
+        <w:t>scope.allowCliApproval: true</w:t>
+      </w:r>
+      <w:r>
+        <w:rPr/>
+        <w:t xml:space="preserve">. </w:t>
+      </w:r>
+      <w:r>
+        <w:rPr>
+          <w:rStyle w:val="Strong"/>
+        </w:rPr>
         <w:t>Fix:</w:t>
       </w:r>
       <w:r>
         <w:rPr/>
-        <w:t xml:space="preserve"> either the path genuinely needs to be in scope (widen Touch and re-approve), or revert the out-of-scope change. Files git ignores (including everything under </w:t>
-      </w:r>
-      <w:r>
-        <w:rPr>
-          <w:rStyle w:val="SourceText"/>
-        </w:rPr>
-        <w:t>.crew/</w:t>
-      </w:r>
-      <w:r>
-        <w:rPr/>
-        <w:t xml:space="preserve">) and </w:t>
-      </w:r>
-      <w:r>
-        <w:rPr>
-          <w:rStyle w:val="SourceText"/>
-        </w:rPr>
-        <w:t>.work/</w:t>
-      </w:r>
-      <w:r>
-        <w:rPr/>
-        <w:t xml:space="preserve"> itself are outside what the audit can see at all — that is by design, not a gap to work around.</w:t>
+        <w:t xml:space="preserve"> re-approve. The user types </w:t>
+      </w:r>
+      <w:r>
+        <w:rPr>
+          <w:rStyle w:val="SourceText"/>
+        </w:rPr>
+        <w:t>/crew:approve &lt;id&gt;</w:t>
+      </w:r>
+      <w:r>
+        <w:rPr/>
+        <w:t xml:space="preserve"> again — nothing else can write the receipt; </w:t>
+      </w:r>
+      <w:r>
+        <w:rPr>
+          <w:rStyle w:val="SourceText"/>
+        </w:rPr>
+        <w:t>scope_guard.py</w:t>
+      </w:r>
+      <w:r>
+        <w:rPr/>
+        <w:t xml:space="preserve"> refuses a Write/Edit under </w:t>
+      </w:r>
+      <w:r>
+        <w:rPr>
+          <w:rStyle w:val="SourceText"/>
+        </w:rPr>
+        <w:t>&lt;git-common-dir&gt;/crew/</w:t>
+      </w:r>
+      <w:r>
+        <w:rPr/>
+        <w:t xml:space="preserve"> in every mode but </w:t>
+      </w:r>
+      <w:r>
+        <w:rPr>
+          <w:rStyle w:val="SourceText"/>
+        </w:rPr>
+        <w:t>off</w:t>
+      </w:r>
+      <w:r>
+        <w:rPr/>
+        <w:t>, so a session cannot forge or refresh its own approval.</w:t>
       </w:r>
     </w:p>
     <w:p>
@@ -4070,15 +4195,9 @@
       </w:pPr>
       <w:r>
         <w:rPr>
-          <w:rStyle w:val="SourceText"/>
-        </w:rPr>
-        <w:t>scope.mode</w:t>
-      </w:r>
-      <w:r>
-        <w:rPr>
           <w:rStyle w:val="Strong"/>
         </w:rPr>
-        <w:t xml:space="preserve"> values, and what "auto" means:</w:t>
+        <w:t>Symptom: you need to touch one more path mid-ticket.</w:t>
       </w:r>
       <w:r>
         <w:rPr/>
@@ -4086,83 +4205,33 @@
       </w:r>
       <w:r>
         <w:rPr>
-          <w:rStyle w:val="SourceText"/>
-        </w:rPr>
-        <w:t>off</w:t>
-      </w:r>
-      <w:r>
-        <w:rPr/>
-        <w:t xml:space="preserve"> (hooks do nothing, the default), </w:t>
-      </w:r>
-      <w:r>
-        <w:rPr>
-          <w:rStyle w:val="SourceText"/>
-        </w:rPr>
-        <w:t>report</w:t>
-      </w:r>
-      <w:r>
-        <w:rPr/>
-        <w:t xml:space="preserve"> (allows everything, logs the row to </w:t>
-      </w:r>
-      <w:r>
-        <w:rPr>
-          <w:rStyle w:val="SourceText"/>
-        </w:rPr>
-        <w:t>.crew/guard.log</w:t>
-      </w:r>
-      <w:r>
-        <w:rPr/>
-        <w:t xml:space="preserve">), </w:t>
-      </w:r>
-      <w:r>
-        <w:rPr>
-          <w:rStyle w:val="SourceText"/>
-        </w:rPr>
-        <w:t>block</w:t>
-      </w:r>
-      <w:r>
-        <w:rPr/>
-        <w:t xml:space="preserve"> (refuses out-of-scope writes and fails the completion audit), </w:t>
-      </w:r>
-      <w:r>
-        <w:rPr>
-          <w:rStyle w:val="SourceText"/>
-        </w:rPr>
-        <w:t>auto</w:t>
-      </w:r>
-      <w:r>
-        <w:rPr/>
-        <w:t xml:space="preserve"> (</w:t>
-      </w:r>
-      <w:r>
-        <w:rPr>
-          <w:rStyle w:val="SourceText"/>
-        </w:rPr>
-        <w:t>report</w:t>
-      </w:r>
-      <w:r>
-        <w:rPr/>
-        <w:t xml:space="preserve"> for the first ten tickets approved in this repo, then </w:t>
-      </w:r>
-      <w:r>
-        <w:rPr>
-          <w:rStyle w:val="SourceText"/>
-        </w:rPr>
-        <w:t>block</w:t>
-      </w:r>
-      <w:r>
-        <w:rPr/>
-        <w:t xml:space="preserve">). A config file that exists but fails to parse, or names an unknown mode, resolves to </w:t>
-      </w:r>
-      <w:r>
-        <w:rPr>
-          <w:rStyle w:val="SourceText"/>
-        </w:rPr>
-        <w:t>block</w:t>
-      </w:r>
-      <w:r>
-        <w:rPr/>
-        <w:t xml:space="preserve"> and says so — the unknown never collapses into the permissive value.</w:t>
+          <w:rStyle w:val="Strong"/>
+        </w:rPr>
+        <w:t>Fix:</w:t>
+      </w:r>
+      <w:r>
+        <w:rPr/>
+        <w:t xml:space="preserve"> amend </w:t>
+      </w:r>
+      <w:r>
+        <w:rPr>
+          <w:rStyle w:val="SourceText"/>
+        </w:rPr>
+        <w:t>spec.md</w:t>
+      </w:r>
+      <w:r>
+        <w:rPr/>
+        <w:t xml:space="preserve">'s </w:t>
+      </w:r>
+      <w:r>
+        <w:rPr>
+          <w:rStyle w:val="SourceText"/>
+        </w:rPr>
+        <w:t>## Touch</w:t>
+      </w:r>
+      <w:r>
+        <w:rPr/>
+        <w:t xml:space="preserve"> (widen it), then approve again. There is no partial-approve; amending scope is edit-then-approve, same as any other spec change.</w:t>
       </w:r>
     </w:p>
     <w:p>
@@ -4185,17 +4254,39 @@
         <w:rPr>
           <w:rStyle w:val="Strong"/>
         </w:rPr>
-        <w:t>No-python fail-closed, and why it is not a bug:</w:t>
-      </w:r>
-      <w:r>
-        <w:rPr/>
-        <w:t xml:space="preserve"> if none of </w:t>
-      </w:r>
-      <w:r>
-        <w:rPr>
-          <w:rStyle w:val="SourceText"/>
-        </w:rPr>
-        <w:t>python3</w:t>
+        <w:t xml:space="preserve">Symptom: </w:t>
+      </w:r>
+      <w:r>
+        <w:rPr>
+          <w:rStyle w:val="SourceText"/>
+        </w:rPr>
+        <w:t>/crew:done</w:t>
+      </w:r>
+      <w:r>
+        <w:rPr>
+          <w:rStyle w:val="Strong"/>
+        </w:rPr>
+        <w:t xml:space="preserve"> refuses on "out of scope" for a file the edit guard never saw.</w:t>
+      </w:r>
+      <w:r>
+        <w:rPr/>
+        <w:t xml:space="preserve"> This is the Stop-time completion audit (</w:t>
+      </w:r>
+      <w:r>
+        <w:rPr>
+          <w:rStyle w:val="SourceText"/>
+        </w:rPr>
+        <w:t>completion_audit.py</w:t>
+      </w:r>
+      <w:r>
+        <w:rPr/>
+        <w:t xml:space="preserve">), not the edit guard. The edit guard only sees </w:t>
+      </w:r>
+      <w:r>
+        <w:rPr>
+          <w:rStyle w:val="SourceText"/>
+        </w:rPr>
+        <w:t>Write</w:t>
       </w:r>
       <w:r>
         <w:rPr/>
@@ -4205,7 +4296,7 @@
         <w:rPr>
           <w:rStyle w:val="SourceText"/>
         </w:rPr>
-        <w:t>python</w:t>
+        <w:t>Edit</w:t>
       </w:r>
       <w:r>
         <w:rPr/>
@@ -4215,166 +4306,81 @@
         <w:rPr>
           <w:rStyle w:val="SourceText"/>
         </w:rPr>
-        <w:t>py</w:t>
-      </w:r>
-      <w:r>
-        <w:rPr/>
-        <w:t xml:space="preserve"> resolves to a </w:t>
-      </w:r>
-      <w:r>
-        <w:rPr>
-          <w:rStyle w:val="Emphasis"/>
-        </w:rPr>
-        <w:t>proved</w:t>
-      </w:r>
-      <w:r>
-        <w:rPr/>
-        <w:t xml:space="preserve"> working interpreter, </w:t>
-      </w:r>
-      <w:r>
-        <w:rPr>
-          <w:rStyle w:val="SourceText"/>
-        </w:rPr>
-        <w:t>scope-guard.sh</w:t>
-      </w:r>
-      <w:r>
-        <w:rPr/>
-        <w:t xml:space="preserve"> (and </w:t>
-      </w:r>
-      <w:r>
-        <w:rPr>
-          <w:rStyle w:val="SourceText"/>
-        </w:rPr>
-        <w:t>completion-audit.sh</w:t>
-      </w:r>
-      <w:r>
-        <w:rPr/>
-        <w:t xml:space="preserve">, byte-for-byte the same logic) does </w:t>
+        <w:t>MultiEdit</w:t>
+      </w:r>
+      <w:r>
+        <w:rPr/>
+        <w:t>/</w:t>
+      </w:r>
+      <w:r>
+        <w:rPr>
+          <w:rStyle w:val="SourceText"/>
+        </w:rPr>
+        <w:t>NotebookEdit</w:t>
+      </w:r>
+      <w:r>
+        <w:rPr/>
+        <w:t xml:space="preserve"> tool calls; a </w:t>
+      </w:r>
+      <w:r>
+        <w:rPr>
+          <w:rStyle w:val="SourceText"/>
+        </w:rPr>
+        <w:t>sed -i</w:t>
+      </w:r>
+      <w:r>
+        <w:rPr/>
+        <w:t xml:space="preserve">, a redirect, a formatter or a </w:t>
+      </w:r>
+      <w:r>
+        <w:rPr>
+          <w:rStyle w:val="SourceText"/>
+        </w:rPr>
+        <w:t>git mv</w:t>
+      </w:r>
+      <w:r>
+        <w:rPr/>
+        <w:t xml:space="preserve"> never reaches it. The audit instead diffs the </w:t>
       </w:r>
       <w:r>
         <w:rPr>
           <w:rStyle w:val="Strong"/>
         </w:rPr>
-        <w:t>not</w:t>
-      </w:r>
-      <w:r>
-        <w:rPr/>
-        <w:t xml:space="preserve"> silently allow the write. It checks whether </w:t>
-      </w:r>
-      <w:r>
-        <w:rPr>
-          <w:rStyle w:val="SourceText"/>
-        </w:rPr>
-        <w:t>.crew/config.json</w:t>
-      </w:r>
-      <w:r>
-        <w:rPr/>
-        <w:t xml:space="preserve"> </w:t>
+        <w:t>whole working tree</w:t>
+      </w:r>
+      <w:r>
+        <w:rPr/>
+        <w:t xml:space="preserve"> against the ticket's scope base (</w:t>
+      </w:r>
+      <w:r>
+        <w:rPr>
+          <w:rStyle w:val="SourceText"/>
+        </w:rPr>
+        <w:t>scope_base.resolve</w:t>
+      </w:r>
+      <w:r>
+        <w:rPr/>
+        <w:t xml:space="preserve"> — the commit the ticket started from) across committed, staged, unstaged and untracked changes, so a shell-made write is caught here even though nothing blocked it at the time. </w:t>
       </w:r>
       <w:r>
         <w:rPr>
           <w:rStyle w:val="Strong"/>
         </w:rPr>
-        <w:t>provably</w:t>
-      </w:r>
-      <w:r>
-        <w:rPr/>
-        <w:t xml:space="preserve"> sets </w:t>
-      </w:r>
-      <w:r>
-        <w:rPr>
-          <w:rStyle w:val="SourceText"/>
-        </w:rPr>
-        <w:t>scope.mode</w:t>
-      </w:r>
-      <w:r>
-        <w:rPr/>
-        <w:t xml:space="preserve"> to </w:t>
-      </w:r>
-      <w:r>
-        <w:rPr>
-          <w:rStyle w:val="SourceText"/>
-        </w:rPr>
-        <w:t>off</w:t>
-      </w:r>
-      <w:r>
-        <w:rPr/>
-        <w:t xml:space="preserve"> — a crude, non-JSON textual check, because it runs in exactly the situation where python cannot parse the file for it — and only then exits 0. Anything it cannot prove </w:t>
-      </w:r>
-      <w:r>
-        <w:rPr>
-          <w:rStyle w:val="SourceText"/>
-        </w:rPr>
-        <w:t>off</w:t>
-      </w:r>
-      <w:r>
-        <w:rPr/>
-        <w:t xml:space="preserve"> (a corrupt file, </w:t>
-      </w:r>
-      <w:r>
-        <w:rPr>
-          <w:rStyle w:val="SourceText"/>
-        </w:rPr>
-        <w:t>report</w:t>
-      </w:r>
-      <w:r>
-        <w:rPr/>
-        <w:t xml:space="preserve">, </w:t>
-      </w:r>
-      <w:r>
-        <w:rPr>
-          <w:rStyle w:val="SourceText"/>
-        </w:rPr>
-        <w:t>auto</w:t>
-      </w:r>
-      <w:r>
-        <w:rPr/>
-        <w:t xml:space="preserve">, </w:t>
-      </w:r>
-      <w:r>
-        <w:rPr>
-          <w:rStyle w:val="SourceText"/>
-        </w:rPr>
-        <w:t>block</w:t>
-      </w:r>
-      <w:r>
-        <w:rPr/>
-        <w:t xml:space="preserve">, or no </w:t>
-      </w:r>
-      <w:r>
-        <w:rPr>
-          <w:rStyle w:val="SourceText"/>
-        </w:rPr>
-        <w:t>scope</w:t>
-      </w:r>
-      <w:r>
-        <w:rPr/>
-        <w:t xml:space="preserve"> key at all) fails </w:t>
-      </w:r>
-      <w:r>
-        <w:rPr>
-          <w:rStyle w:val="Strong"/>
-        </w:rPr>
-        <w:t>closed</w:t>
-      </w:r>
-      <w:r>
-        <w:rPr/>
-        <w:t xml:space="preserve"> with exit 2: "no usable python ... failing closed". Fix by installing a real Python 3, not by reading the closed refusal as a false positive.</w:t>
+        <w:t>Check it directly, without waiting for a Stop:</w:t>
       </w:r>
     </w:p>
     <w:p>
       <w:pPr>
-        <w:pStyle w:val="Heading2"/>
+        <w:pStyle w:val="PreformattedText"/>
         <w:bidi w:val="0"/>
-        <w:ind w:hanging="0" w:left="0" w:right="0"/>
         <w:jc w:val="left"/>
         <w:rPr/>
       </w:pPr>
-      <w:bookmarkStart w:id="5" w:name="cloud-guard-false-positives"/>
-      <w:bookmarkEnd w:id="5"/>
-      <w:r>
-        <w:rPr/>
-        <w:t>Cloud Guard False Positives</w:t>
+      <w:r>
+        <w:rPr>
+          <w:rStyle w:val="SourceText"/>
+        </w:rPr>
+        <w:t>python3 "&lt;crew&gt;/hooks/scripts/completion_audit.py" --check --ticket &lt;id&gt;</w:t>
       </w:r>
     </w:p>
     <w:p>
@@ -4386,103 +4392,33 @@
       </w:pPr>
       <w:r>
         <w:rPr>
-          <w:rStyle w:val="SourceText"/>
-        </w:rPr>
-        <w:t>cloud-guard.sh</w:t>
-      </w:r>
-      <w:r>
-        <w:rPr/>
-        <w:t xml:space="preserve"> / </w:t>
-      </w:r>
-      <w:r>
-        <w:rPr>
-          <w:rStyle w:val="SourceText"/>
-        </w:rPr>
-        <w:t>cloud_guard.py</w:t>
-      </w:r>
-      <w:r>
-        <w:rPr/>
-        <w:t xml:space="preserve">, a </w:t>
-      </w:r>
-      <w:r>
-        <w:rPr>
-          <w:rStyle w:val="SourceText"/>
-        </w:rPr>
-        <w:t>PreToolUse</w:t>
-      </w:r>
-      <w:r>
-        <w:rPr/>
-        <w:t xml:space="preserve"> hook on </w:t>
-      </w:r>
-      <w:r>
-        <w:rPr>
-          <w:rStyle w:val="SourceText"/>
-        </w:rPr>
-        <w:t>Bash</w:t>
-      </w:r>
-      <w:r>
-        <w:rPr/>
-        <w:t xml:space="preserve"> and </w:t>
-      </w:r>
-      <w:r>
-        <w:rPr>
-          <w:rStyle w:val="SourceText"/>
-        </w:rPr>
-        <w:t>PowerShell</w:t>
-      </w:r>
-      <w:r>
-        <w:rPr/>
-        <w:t xml:space="preserve">. </w:t>
-      </w:r>
-      <w:r>
-        <w:rPr>
           <w:rStyle w:val="Strong"/>
         </w:rPr>
-        <w:t>Ships off</w:t>
-      </w:r>
-      <w:r>
-        <w:rPr/>
-        <w:t xml:space="preserve"> (</w:t>
-      </w:r>
-      <w:r>
-        <w:rPr>
-          <w:rStyle w:val="SourceText"/>
-        </w:rPr>
-        <w:t>guards.cloudGuard: off</w:t>
-      </w:r>
-      <w:r>
-        <w:rPr/>
-        <w:t xml:space="preserve">); turn it on with </w:t>
-      </w:r>
-      <w:r>
-        <w:rPr>
-          <w:rStyle w:val="SourceText"/>
-        </w:rPr>
-        <w:t>{"guards": {"cloudGuard": "report"}}</w:t>
-      </w:r>
-      <w:r>
-        <w:rPr/>
-        <w:t xml:space="preserve"> first to see what it </w:t>
-      </w:r>
-      <w:r>
-        <w:rPr>
-          <w:rStyle w:val="Emphasis"/>
-        </w:rPr>
-        <w:t>would</w:t>
-      </w:r>
-      <w:r>
-        <w:rPr/>
-        <w:t xml:space="preserve"> refuse before enforcing with </w:t>
-      </w:r>
-      <w:r>
-        <w:rPr>
-          <w:rStyle w:val="SourceText"/>
-        </w:rPr>
-        <w:t>"block"</w:t>
-      </w:r>
-      <w:r>
-        <w:rPr/>
-        <w:t>.</w:t>
+        <w:t>Fix:</w:t>
+      </w:r>
+      <w:r>
+        <w:rPr/>
+        <w:t xml:space="preserve"> either the path genuinely needs to be in scope (widen Touch and re-approve), or revert the out-of-scope change. Files git ignores (including everything under </w:t>
+      </w:r>
+      <w:r>
+        <w:rPr>
+          <w:rStyle w:val="SourceText"/>
+        </w:rPr>
+        <w:t>.crew/</w:t>
+      </w:r>
+      <w:r>
+        <w:rPr/>
+        <w:t xml:space="preserve">) and </w:t>
+      </w:r>
+      <w:r>
+        <w:rPr>
+          <w:rStyle w:val="SourceText"/>
+        </w:rPr>
+        <w:t>.work/</w:t>
+      </w:r>
+      <w:r>
+        <w:rPr/>
+        <w:t xml:space="preserve"> itself are outside what the audit can see at all — that is by design, not a gap to work around.</w:t>
       </w:r>
     </w:p>
     <w:p>
@@ -4503,9 +4439,15 @@
       </w:pPr>
       <w:r>
         <w:rPr>
+          <w:rStyle w:val="SourceText"/>
+        </w:rPr>
+        <w:t>scope.mode</w:t>
+      </w:r>
+      <w:r>
+        <w:rPr>
           <w:rStyle w:val="Strong"/>
         </w:rPr>
-        <w:t>SQL text that merely looks destructive is not blocked.</w:t>
+        <w:t xml:space="preserve"> values, and what "auto" means:</w:t>
       </w:r>
       <w:r>
         <w:rPr/>
@@ -4515,121 +4457,81 @@
         <w:rPr>
           <w:rStyle w:val="SourceText"/>
         </w:rPr>
-        <w:t>DROP</w:t>
-      </w:r>
-      <w:r>
-        <w:rPr/>
-        <w:t>/</w:t>
-      </w:r>
-      <w:r>
-        <w:rPr>
-          <w:rStyle w:val="SourceText"/>
-        </w:rPr>
-        <w:t>TRUNCATE</w:t>
-      </w:r>
-      <w:r>
-        <w:rPr/>
-        <w:t xml:space="preserve"> inside a string literal or a comment does not count: the guard strips literals and comments before matching, read both as standard SQL and as MySQL, because the two dialects disagree about what </w:t>
-      </w:r>
-      <w:r>
-        <w:rPr>
-          <w:rStyle w:val="SourceText"/>
-        </w:rPr>
-        <w:t>\'</w:t>
-      </w:r>
-      <w:r>
-        <w:rPr/>
-        <w:t xml:space="preserve"> and </w:t>
-      </w:r>
-      <w:r>
-        <w:rPr>
-          <w:rStyle w:val="SourceText"/>
-        </w:rPr>
-        <w:t>--</w:t>
-      </w:r>
-      <w:r>
-        <w:rPr/>
-        <w:t xml:space="preserve"> mean — a payload is flagged only if </w:t>
-      </w:r>
-      <w:r>
-        <w:rPr>
-          <w:rStyle w:val="Strong"/>
-        </w:rPr>
-        <w:t>either</w:t>
-      </w:r>
-      <w:r>
-        <w:rPr/>
-        <w:t xml:space="preserve"> reading still shows the keyword outside a literal. So </w:t>
-      </w:r>
-      <w:r>
-        <w:rPr>
-          <w:rStyle w:val="SourceText"/>
-        </w:rPr>
-        <w:t>psql -c "SELECT 'DROP TABLE x' AS s"</w:t>
-      </w:r>
-      <w:r>
-        <w:rPr/>
-        <w:t xml:space="preserve"> and </w:t>
-      </w:r>
-      <w:r>
-        <w:rPr>
-          <w:rStyle w:val="SourceText"/>
-        </w:rPr>
-        <w:t>psql -c 'SELECT 1 -- DROP TABLE x'</w:t>
-      </w:r>
-      <w:r>
-        <w:rPr/>
-        <w:t xml:space="preserve"> are both allowed (</w:t>
-      </w:r>
-      <w:r>
-        <w:rPr>
-          <w:rStyle w:val="SourceText"/>
-        </w:rPr>
-        <w:t>plugin/crew/tests/test_cloud_guard.py</w:t>
-      </w:r>
-      <w:r>
-        <w:rPr/>
-        <w:t xml:space="preserve">, cases </w:t>
-      </w:r>
-      <w:r>
-        <w:rPr>
-          <w:rStyle w:val="SourceText"/>
-        </w:rPr>
-        <w:t>sql-literal</w:t>
-      </w:r>
-      <w:r>
-        <w:rPr/>
-        <w:t>/</w:t>
-      </w:r>
-      <w:r>
-        <w:rPr>
-          <w:rStyle w:val="SourceText"/>
-        </w:rPr>
-        <w:t>sql-comment</w:t>
-      </w:r>
-      <w:r>
-        <w:rPr/>
-        <w:t>/</w:t>
-      </w:r>
-      <w:r>
-        <w:rPr>
-          <w:rStyle w:val="SourceText"/>
-        </w:rPr>
-        <w:t>sql-block-comment</w:t>
-      </w:r>
-      <w:r>
-        <w:rPr/>
-        <w:t>). If a query like this is still blocked, the reason (</w:t>
-      </w:r>
-      <w:r>
-        <w:rPr>
-          <w:rStyle w:val="SourceText"/>
-        </w:rPr>
-        <w:t>[sqlDestructive]</w:t>
-      </w:r>
-      <w:r>
-        <w:rPr/>
-        <w:t xml:space="preserve"> in the deny message) is worth reading closely — the keyword may genuinely sit outside every literal reading.</w:t>
+        <w:t>off</w:t>
+      </w:r>
+      <w:r>
+        <w:rPr/>
+        <w:t xml:space="preserve"> (hooks do nothing, the default), </w:t>
+      </w:r>
+      <w:r>
+        <w:rPr>
+          <w:rStyle w:val="SourceText"/>
+        </w:rPr>
+        <w:t>report</w:t>
+      </w:r>
+      <w:r>
+        <w:rPr/>
+        <w:t xml:space="preserve"> (allows everything, logs the row to </w:t>
+      </w:r>
+      <w:r>
+        <w:rPr>
+          <w:rStyle w:val="SourceText"/>
+        </w:rPr>
+        <w:t>.crew/guard.log</w:t>
+      </w:r>
+      <w:r>
+        <w:rPr/>
+        <w:t xml:space="preserve">), </w:t>
+      </w:r>
+      <w:r>
+        <w:rPr>
+          <w:rStyle w:val="SourceText"/>
+        </w:rPr>
+        <w:t>block</w:t>
+      </w:r>
+      <w:r>
+        <w:rPr/>
+        <w:t xml:space="preserve"> (refuses out-of-scope writes and fails the completion audit), </w:t>
+      </w:r>
+      <w:r>
+        <w:rPr>
+          <w:rStyle w:val="SourceText"/>
+        </w:rPr>
+        <w:t>auto</w:t>
+      </w:r>
+      <w:r>
+        <w:rPr/>
+        <w:t xml:space="preserve"> (</w:t>
+      </w:r>
+      <w:r>
+        <w:rPr>
+          <w:rStyle w:val="SourceText"/>
+        </w:rPr>
+        <w:t>report</w:t>
+      </w:r>
+      <w:r>
+        <w:rPr/>
+        <w:t xml:space="preserve"> for the first ten tickets approved in this repo, then </w:t>
+      </w:r>
+      <w:r>
+        <w:rPr>
+          <w:rStyle w:val="SourceText"/>
+        </w:rPr>
+        <w:t>block</w:t>
+      </w:r>
+      <w:r>
+        <w:rPr/>
+        <w:t xml:space="preserve">). A config file that exists but fails to parse, or names an unknown mode, resolves to </w:t>
+      </w:r>
+      <w:r>
+        <w:rPr>
+          <w:rStyle w:val="SourceText"/>
+        </w:rPr>
+        <w:t>block</w:t>
+      </w:r>
+      <w:r>
+        <w:rPr/>
+        <w:t xml:space="preserve"> and says so — the unknown never collapses into the permissive value.</w:t>
       </w:r>
     </w:p>
     <w:p>
@@ -4652,103 +4554,304 @@
         <w:rPr>
           <w:rStyle w:val="Strong"/>
         </w:rPr>
-        <w:t xml:space="preserve">A dry-run, help, or </w:t>
-      </w:r>
-      <w:r>
-        <w:rPr>
-          <w:rStyle w:val="SourceText"/>
-        </w:rPr>
-        <w:t>-WhatIf</w:t>
+        <w:t>No-python fail-closed, and why it is not a bug:</w:t>
+      </w:r>
+      <w:r>
+        <w:rPr/>
+        <w:t xml:space="preserve"> if none of </w:t>
+      </w:r>
+      <w:r>
+        <w:rPr>
+          <w:rStyle w:val="SourceText"/>
+        </w:rPr>
+        <w:t>python3</w:t>
+      </w:r>
+      <w:r>
+        <w:rPr/>
+        <w:t>/</w:t>
+      </w:r>
+      <w:r>
+        <w:rPr>
+          <w:rStyle w:val="SourceText"/>
+        </w:rPr>
+        <w:t>python</w:t>
+      </w:r>
+      <w:r>
+        <w:rPr/>
+        <w:t>/</w:t>
+      </w:r>
+      <w:r>
+        <w:rPr>
+          <w:rStyle w:val="SourceText"/>
+        </w:rPr>
+        <w:t>py</w:t>
+      </w:r>
+      <w:r>
+        <w:rPr/>
+        <w:t xml:space="preserve"> resolves to a </w:t>
+      </w:r>
+      <w:r>
+        <w:rPr>
+          <w:rStyle w:val="Emphasis"/>
+        </w:rPr>
+        <w:t>proved</w:t>
+      </w:r>
+      <w:r>
+        <w:rPr/>
+        <w:t xml:space="preserve"> working interpreter, </w:t>
+      </w:r>
+      <w:r>
+        <w:rPr>
+          <w:rStyle w:val="SourceText"/>
+        </w:rPr>
+        <w:t>scope-guard.sh</w:t>
+      </w:r>
+      <w:r>
+        <w:rPr/>
+        <w:t xml:space="preserve"> (and </w:t>
+      </w:r>
+      <w:r>
+        <w:rPr>
+          <w:rStyle w:val="SourceText"/>
+        </w:rPr>
+        <w:t>completion-audit.sh</w:t>
+      </w:r>
+      <w:r>
+        <w:rPr/>
+        <w:t xml:space="preserve">, byte-for-byte the same logic) does </w:t>
       </w:r>
       <w:r>
         <w:rPr>
           <w:rStyle w:val="Strong"/>
         </w:rPr>
-        <w:t xml:space="preserve"> invocation is still classified as destructive.</w:t>
-      </w:r>
-      <w:r>
-        <w:rPr/>
-        <w:t xml:space="preserve"> The guard matches on the </w:t>
+        <w:t>not</w:t>
+      </w:r>
+      <w:r>
+        <w:rPr/>
+        <w:t xml:space="preserve"> silently allow the write. It checks whether </w:t>
+      </w:r>
+      <w:r>
+        <w:rPr>
+          <w:rStyle w:val="SourceText"/>
+        </w:rPr>
+        <w:t>.crew/config.json</w:t>
+      </w:r>
+      <w:r>
+        <w:rPr/>
+        <w:t xml:space="preserve"> </w:t>
+      </w:r>
+      <w:r>
+        <w:rPr>
+          <w:rStyle w:val="Strong"/>
+        </w:rPr>
+        <w:t>provably</w:t>
+      </w:r>
+      <w:r>
+        <w:rPr/>
+        <w:t xml:space="preserve"> sets </w:t>
+      </w:r>
+      <w:r>
+        <w:rPr>
+          <w:rStyle w:val="SourceText"/>
+        </w:rPr>
+        <w:t>scope.mode</w:t>
+      </w:r>
+      <w:r>
+        <w:rPr/>
+        <w:t xml:space="preserve"> to </w:t>
+      </w:r>
+      <w:r>
+        <w:rPr>
+          <w:rStyle w:val="SourceText"/>
+        </w:rPr>
+        <w:t>off</w:t>
+      </w:r>
+      <w:r>
+        <w:rPr/>
+        <w:t xml:space="preserve"> — a crude, non-JSON textual check, because it runs in exactly the situation where python cannot parse the file for it — and only then exits 0. Anything it cannot prove </w:t>
+      </w:r>
+      <w:r>
+        <w:rPr>
+          <w:rStyle w:val="SourceText"/>
+        </w:rPr>
+        <w:t>off</w:t>
+      </w:r>
+      <w:r>
+        <w:rPr/>
+        <w:t xml:space="preserve"> (a corrupt file, </w:t>
+      </w:r>
+      <w:r>
+        <w:rPr>
+          <w:rStyle w:val="SourceText"/>
+        </w:rPr>
+        <w:t>report</w:t>
+      </w:r>
+      <w:r>
+        <w:rPr/>
+        <w:t xml:space="preserve">, </w:t>
+      </w:r>
+      <w:r>
+        <w:rPr>
+          <w:rStyle w:val="SourceText"/>
+        </w:rPr>
+        <w:t>auto</w:t>
+      </w:r>
+      <w:r>
+        <w:rPr/>
+        <w:t xml:space="preserve">, </w:t>
+      </w:r>
+      <w:r>
+        <w:rPr>
+          <w:rStyle w:val="SourceText"/>
+        </w:rPr>
+        <w:t>block</w:t>
+      </w:r>
+      <w:r>
+        <w:rPr/>
+        <w:t xml:space="preserve">, or no </w:t>
+      </w:r>
+      <w:r>
+        <w:rPr>
+          <w:rStyle w:val="SourceText"/>
+        </w:rPr>
+        <w:t>scope</w:t>
+      </w:r>
+      <w:r>
+        <w:rPr/>
+        <w:t xml:space="preserve"> key at all) fails </w:t>
+      </w:r>
+      <w:r>
+        <w:rPr>
+          <w:rStyle w:val="Strong"/>
+        </w:rPr>
+        <w:t>closed</w:t>
+      </w:r>
+      <w:r>
+        <w:rPr/>
+        <w:t xml:space="preserve"> with exit 2: "no usable python ... failing closed". Fix by installing a real Python 3, not by reading the closed refusal as a false positive.</w:t>
+      </w:r>
+    </w:p>
+    <w:p>
+      <w:pPr>
+        <w:pStyle w:val="Heading2"/>
+        <w:bidi w:val="0"/>
+        <w:ind w:hanging="0" w:left="0" w:right="0"/>
+        <w:jc w:val="left"/>
+        <w:rPr/>
+      </w:pPr>
+      <w:bookmarkStart w:id="5" w:name="cloud-guard-false-positives"/>
+      <w:bookmarkEnd w:id="5"/>
+      <w:r>
+        <w:rPr/>
+        <w:t>Cloud Guard False Positives</w:t>
+      </w:r>
+    </w:p>
+    <w:p>
+      <w:pPr>
+        <w:pStyle w:val="BodyText"/>
+        <w:bidi w:val="0"/>
+        <w:jc w:val="left"/>
+        <w:rPr/>
+      </w:pPr>
+      <w:r>
+        <w:rPr>
+          <w:rStyle w:val="SourceText"/>
+        </w:rPr>
+        <w:t>cloud-guard.sh</w:t>
+      </w:r>
+      <w:r>
+        <w:rPr/>
+        <w:t xml:space="preserve"> / </w:t>
+      </w:r>
+      <w:r>
+        <w:rPr>
+          <w:rStyle w:val="SourceText"/>
+        </w:rPr>
+        <w:t>cloud_guard.py</w:t>
+      </w:r>
+      <w:r>
+        <w:rPr/>
+        <w:t xml:space="preserve">, a </w:t>
+      </w:r>
+      <w:r>
+        <w:rPr>
+          <w:rStyle w:val="SourceText"/>
+        </w:rPr>
+        <w:t>PreToolUse</w:t>
+      </w:r>
+      <w:r>
+        <w:rPr/>
+        <w:t xml:space="preserve"> hook on </w:t>
+      </w:r>
+      <w:r>
+        <w:rPr>
+          <w:rStyle w:val="SourceText"/>
+        </w:rPr>
+        <w:t>Bash</w:t>
+      </w:r>
+      <w:r>
+        <w:rPr/>
+        <w:t xml:space="preserve"> and </w:t>
+      </w:r>
+      <w:r>
+        <w:rPr>
+          <w:rStyle w:val="SourceText"/>
+        </w:rPr>
+        <w:t>PowerShell</w:t>
+      </w:r>
+      <w:r>
+        <w:rPr/>
+        <w:t xml:space="preserve">. </w:t>
+      </w:r>
+      <w:r>
+        <w:rPr>
+          <w:rStyle w:val="Strong"/>
+        </w:rPr>
+        <w:t>Ships off</w:t>
+      </w:r>
+      <w:r>
+        <w:rPr/>
+        <w:t xml:space="preserve"> (</w:t>
+      </w:r>
+      <w:r>
+        <w:rPr>
+          <w:rStyle w:val="SourceText"/>
+        </w:rPr>
+        <w:t>guards.cloudGuard: off</w:t>
+      </w:r>
+      <w:r>
+        <w:rPr/>
+        <w:t xml:space="preserve">); turn it on with </w:t>
+      </w:r>
+      <w:r>
+        <w:rPr>
+          <w:rStyle w:val="SourceText"/>
+        </w:rPr>
+        <w:t>{"guards": {"cloudGuard": "report"}}</w:t>
+      </w:r>
+      <w:r>
+        <w:rPr/>
+        <w:t xml:space="preserve"> first to see what it </w:t>
       </w:r>
       <w:r>
         <w:rPr>
           <w:rStyle w:val="Emphasis"/>
         </w:rPr>
-        <w:t>subcommand</w:t>
-      </w:r>
-      <w:r>
-        <w:rPr/>
-        <w:t xml:space="preserve">, not on flags that make it a no-op: </w:t>
-      </w:r>
-      <w:r>
-        <w:rPr>
-          <w:rStyle w:val="SourceText"/>
-        </w:rPr>
-        <w:t>terraform destroy --help</w:t>
-      </w:r>
-      <w:r>
-        <w:rPr/>
-        <w:t xml:space="preserve">, </w:t>
-      </w:r>
-      <w:r>
-        <w:rPr>
-          <w:rStyle w:val="SourceText"/>
-        </w:rPr>
-        <w:t>aws ec2 terminate-instances --dry-run</w:t>
-      </w:r>
-      <w:r>
-        <w:rPr/>
-        <w:t xml:space="preserve"> and </w:t>
-      </w:r>
-      <w:r>
-        <w:rPr>
-          <w:rStyle w:val="SourceText"/>
-        </w:rPr>
-        <w:t>Remove-AzResourceGroup -WhatIf</w:t>
-      </w:r>
-      <w:r>
-        <w:rPr/>
-        <w:t xml:space="preserve"> are all judged exactly like the command they simulate, because nothing in </w:t>
-      </w:r>
-      <w:r>
-        <w:rPr>
-          <w:rStyle w:val="SourceText"/>
-        </w:rPr>
-        <w:t>_terraform_destructive</w:t>
-      </w:r>
-      <w:r>
-        <w:rPr/>
-        <w:t>/</w:t>
-      </w:r>
-      <w:r>
-        <w:rPr>
-          <w:rStyle w:val="SourceText"/>
-        </w:rPr>
-        <w:t>_aws_destructive</w:t>
-      </w:r>
-      <w:r>
-        <w:rPr/>
-        <w:t xml:space="preserve">/the </w:t>
-      </w:r>
-      <w:r>
-        <w:rPr>
-          <w:rStyle w:val="SourceText"/>
-        </w:rPr>
-        <w:t>Remove-Az*</w:t>
-      </w:r>
-      <w:r>
-        <w:rPr/>
-        <w:t xml:space="preserve"> matcher inspects those flags. This is a known gap, not a config bug — there is no key that special-cases them. If you need to run one of these unattended, use </w:t>
-      </w:r>
-      <w:r>
-        <w:rPr>
-          <w:rStyle w:val="SourceText"/>
-        </w:rPr>
-        <w:t>report</w:t>
-      </w:r>
-      <w:r>
-        <w:rPr/>
-        <w:t xml:space="preserve"> mode while testing, or approve the one-shot marker the deny message names.</w:t>
+        <w:t>would</w:t>
+      </w:r>
+      <w:r>
+        <w:rPr/>
+        <w:t xml:space="preserve"> refuse before enforcing with </w:t>
+      </w:r>
+      <w:r>
+        <w:rPr>
+          <w:rStyle w:val="SourceText"/>
+        </w:rPr>
+        <w:t>"block"</w:t>
+      </w:r>
+      <w:r>
+        <w:rPr/>
+        <w:t>.</w:t>
       </w:r>
     </w:p>
     <w:p>
@@ -4756,7 +4859,273 @@
         <w:pStyle w:val="BodyText"/>
         <w:numPr>
           <w:ilvl w:val="0"/>
-          <w:numId w:val="11"/>
+          <w:numId w:val="12"/>
+        </w:numPr>
+        <w:tabs>
+          <w:tab w:val="clear" w:pos="1134"/>
+          <w:tab w:val="left" w:pos="829" w:leader="none"/>
+        </w:tabs>
+        <w:bidi w:val="0"/>
+        <w:ind w:hanging="283" w:left="829"/>
+        <w:jc w:val="left"/>
+        <w:rPr/>
+      </w:pPr>
+      <w:r>
+        <w:rPr>
+          <w:rStyle w:val="Strong"/>
+        </w:rPr>
+        <w:t>SQL text that merely looks destructive is not blocked.</w:t>
+      </w:r>
+      <w:r>
+        <w:rPr/>
+        <w:t xml:space="preserve"> </w:t>
+      </w:r>
+      <w:r>
+        <w:rPr>
+          <w:rStyle w:val="SourceText"/>
+        </w:rPr>
+        <w:t>DROP</w:t>
+      </w:r>
+      <w:r>
+        <w:rPr/>
+        <w:t>/</w:t>
+      </w:r>
+      <w:r>
+        <w:rPr>
+          <w:rStyle w:val="SourceText"/>
+        </w:rPr>
+        <w:t>TRUNCATE</w:t>
+      </w:r>
+      <w:r>
+        <w:rPr/>
+        <w:t xml:space="preserve"> inside a string literal or a comment does not count: the guard strips literals and comments before matching, read both as standard SQL and as MySQL, because the two dialects disagree about what </w:t>
+      </w:r>
+      <w:r>
+        <w:rPr>
+          <w:rStyle w:val="SourceText"/>
+        </w:rPr>
+        <w:t>\'</w:t>
+      </w:r>
+      <w:r>
+        <w:rPr/>
+        <w:t xml:space="preserve"> and </w:t>
+      </w:r>
+      <w:r>
+        <w:rPr>
+          <w:rStyle w:val="SourceText"/>
+        </w:rPr>
+        <w:t>--</w:t>
+      </w:r>
+      <w:r>
+        <w:rPr/>
+        <w:t xml:space="preserve"> mean — a payload is flagged only if </w:t>
+      </w:r>
+      <w:r>
+        <w:rPr>
+          <w:rStyle w:val="Strong"/>
+        </w:rPr>
+        <w:t>either</w:t>
+      </w:r>
+      <w:r>
+        <w:rPr/>
+        <w:t xml:space="preserve"> reading still shows the keyword outside a literal. So </w:t>
+      </w:r>
+      <w:r>
+        <w:rPr>
+          <w:rStyle w:val="SourceText"/>
+        </w:rPr>
+        <w:t>psql -c "SELECT 'DROP TABLE x' AS s"</w:t>
+      </w:r>
+      <w:r>
+        <w:rPr/>
+        <w:t xml:space="preserve"> and </w:t>
+      </w:r>
+      <w:r>
+        <w:rPr>
+          <w:rStyle w:val="SourceText"/>
+        </w:rPr>
+        <w:t>psql -c 'SELECT 1 -- DROP TABLE x'</w:t>
+      </w:r>
+      <w:r>
+        <w:rPr/>
+        <w:t xml:space="preserve"> are both allowed (</w:t>
+      </w:r>
+      <w:r>
+        <w:rPr>
+          <w:rStyle w:val="SourceText"/>
+        </w:rPr>
+        <w:t>plugin/crew/tests/test_cloud_guard.py</w:t>
+      </w:r>
+      <w:r>
+        <w:rPr/>
+        <w:t xml:space="preserve">, cases </w:t>
+      </w:r>
+      <w:r>
+        <w:rPr>
+          <w:rStyle w:val="SourceText"/>
+        </w:rPr>
+        <w:t>sql-literal</w:t>
+      </w:r>
+      <w:r>
+        <w:rPr/>
+        <w:t>/</w:t>
+      </w:r>
+      <w:r>
+        <w:rPr>
+          <w:rStyle w:val="SourceText"/>
+        </w:rPr>
+        <w:t>sql-comment</w:t>
+      </w:r>
+      <w:r>
+        <w:rPr/>
+        <w:t>/</w:t>
+      </w:r>
+      <w:r>
+        <w:rPr>
+          <w:rStyle w:val="SourceText"/>
+        </w:rPr>
+        <w:t>sql-block-comment</w:t>
+      </w:r>
+      <w:r>
+        <w:rPr/>
+        <w:t>). If a query like this is still blocked, the reason (</w:t>
+      </w:r>
+      <w:r>
+        <w:rPr>
+          <w:rStyle w:val="SourceText"/>
+        </w:rPr>
+        <w:t>[sqlDestructive]</w:t>
+      </w:r>
+      <w:r>
+        <w:rPr/>
+        <w:t xml:space="preserve"> in the deny message) is worth reading closely — the keyword may genuinely sit outside every literal reading.</w:t>
+      </w:r>
+    </w:p>
+    <w:p>
+      <w:pPr>
+        <w:pStyle w:val="BodyText"/>
+        <w:numPr>
+          <w:ilvl w:val="0"/>
+          <w:numId w:val="12"/>
+        </w:numPr>
+        <w:tabs>
+          <w:tab w:val="clear" w:pos="1134"/>
+          <w:tab w:val="left" w:pos="829" w:leader="none"/>
+        </w:tabs>
+        <w:bidi w:val="0"/>
+        <w:ind w:hanging="283" w:left="829"/>
+        <w:jc w:val="left"/>
+        <w:rPr/>
+      </w:pPr>
+      <w:r>
+        <w:rPr>
+          <w:rStyle w:val="Strong"/>
+        </w:rPr>
+        <w:t xml:space="preserve">A dry-run, help, or </w:t>
+      </w:r>
+      <w:r>
+        <w:rPr>
+          <w:rStyle w:val="SourceText"/>
+        </w:rPr>
+        <w:t>-WhatIf</w:t>
+      </w:r>
+      <w:r>
+        <w:rPr>
+          <w:rStyle w:val="Strong"/>
+        </w:rPr>
+        <w:t xml:space="preserve"> invocation is still classified as destructive.</w:t>
+      </w:r>
+      <w:r>
+        <w:rPr/>
+        <w:t xml:space="preserve"> The guard matches on the </w:t>
+      </w:r>
+      <w:r>
+        <w:rPr>
+          <w:rStyle w:val="Emphasis"/>
+        </w:rPr>
+        <w:t>subcommand</w:t>
+      </w:r>
+      <w:r>
+        <w:rPr/>
+        <w:t xml:space="preserve">, not on flags that make it a no-op: </w:t>
+      </w:r>
+      <w:r>
+        <w:rPr>
+          <w:rStyle w:val="SourceText"/>
+        </w:rPr>
+        <w:t>terraform destroy --help</w:t>
+      </w:r>
+      <w:r>
+        <w:rPr/>
+        <w:t xml:space="preserve">, </w:t>
+      </w:r>
+      <w:r>
+        <w:rPr>
+          <w:rStyle w:val="SourceText"/>
+        </w:rPr>
+        <w:t>aws ec2 terminate-instances --dry-run</w:t>
+      </w:r>
+      <w:r>
+        <w:rPr/>
+        <w:t xml:space="preserve"> and </w:t>
+      </w:r>
+      <w:r>
+        <w:rPr>
+          <w:rStyle w:val="SourceText"/>
+        </w:rPr>
+        <w:t>Remove-AzResourceGroup -WhatIf</w:t>
+      </w:r>
+      <w:r>
+        <w:rPr/>
+        <w:t xml:space="preserve"> are all judged exactly like the command they simulate, because nothing in </w:t>
+      </w:r>
+      <w:r>
+        <w:rPr>
+          <w:rStyle w:val="SourceText"/>
+        </w:rPr>
+        <w:t>_terraform_destructive</w:t>
+      </w:r>
+      <w:r>
+        <w:rPr/>
+        <w:t>/</w:t>
+      </w:r>
+      <w:r>
+        <w:rPr>
+          <w:rStyle w:val="SourceText"/>
+        </w:rPr>
+        <w:t>_aws_destructive</w:t>
+      </w:r>
+      <w:r>
+        <w:rPr/>
+        <w:t xml:space="preserve">/the </w:t>
+      </w:r>
+      <w:r>
+        <w:rPr>
+          <w:rStyle w:val="SourceText"/>
+        </w:rPr>
+        <w:t>Remove-Az*</w:t>
+      </w:r>
+      <w:r>
+        <w:rPr/>
+        <w:t xml:space="preserve"> matcher inspects those flags. This is a known gap, not a config bug — there is no key that special-cases them. If you need to run one of these unattended, use </w:t>
+      </w:r>
+      <w:r>
+        <w:rPr>
+          <w:rStyle w:val="SourceText"/>
+        </w:rPr>
+        <w:t>report</w:t>
+      </w:r>
+      <w:r>
+        <w:rPr/>
+        <w:t xml:space="preserve"> mode while testing, or approve the one-shot marker the deny message names.</w:t>
+      </w:r>
+    </w:p>
+    <w:p>
+      <w:pPr>
+        <w:pStyle w:val="BodyText"/>
+        <w:numPr>
+          <w:ilvl w:val="0"/>
+          <w:numId w:val="12"/>
         </w:numPr>
         <w:tabs>
           <w:tab w:val="clear" w:pos="1134"/>
@@ -5088,7 +5457,7 @@
         <w:pStyle w:val="BodyText"/>
         <w:numPr>
           <w:ilvl w:val="0"/>
-          <w:numId w:val="12"/>
+          <w:numId w:val="13"/>
         </w:numPr>
         <w:tabs>
           <w:tab w:val="clear" w:pos="1134"/>
@@ -5158,235 +5527,6 @@
       <w:r>
         <w:rPr/>
         <w:t>.</w:t>
-      </w:r>
-    </w:p>
-    <w:p>
-      <w:pPr>
-        <w:pStyle w:val="BodyText"/>
-        <w:numPr>
-          <w:ilvl w:val="0"/>
-          <w:numId w:val="12"/>
-        </w:numPr>
-        <w:tabs>
-          <w:tab w:val="clear" w:pos="1134"/>
-          <w:tab w:val="left" w:pos="829" w:leader="none"/>
-        </w:tabs>
-        <w:bidi w:val="0"/>
-        <w:ind w:hanging="283" w:left="829"/>
-        <w:jc w:val="left"/>
-        <w:rPr/>
-      </w:pPr>
-      <w:r>
-        <w:rPr>
-          <w:rStyle w:val="Strong"/>
-        </w:rPr>
-        <w:t>Symptom: recall never surfaces anything you know is in the vault.</w:t>
-      </w:r>
-      <w:r>
-        <w:rPr/>
-        <w:t xml:space="preserve"> </w:t>
-      </w:r>
-      <w:r>
-        <w:rPr>
-          <w:rStyle w:val="Strong"/>
-        </w:rPr>
-        <w:t>Check:</w:t>
-      </w:r>
-    </w:p>
-    <w:p>
-      <w:pPr>
-        <w:pStyle w:val="PreformattedText"/>
-        <w:bidi w:val="0"/>
-        <w:jc w:val="left"/>
-        <w:rPr/>
-      </w:pPr>
-      <w:r>
-        <w:rPr>
-          <w:rStyle w:val="SourceText"/>
-        </w:rPr>
-        <w:t>python3 "&lt;crew plugin root&gt;/hooks/scripts/crew_context.py" --stats</w:t>
-      </w:r>
-    </w:p>
-    <w:p>
-      <w:pPr>
-        <w:pStyle w:val="BodyText"/>
-        <w:bidi w:val="0"/>
-        <w:jc w:val="left"/>
-        <w:rPr/>
-      </w:pPr>
-      <w:r>
-        <w:rPr/>
-        <w:t xml:space="preserve">Read the </w:t>
-      </w:r>
-      <w:r>
-        <w:rPr>
-          <w:rStyle w:val="SourceText"/>
-        </w:rPr>
-        <w:t>miss reasons</w:t>
-      </w:r>
-      <w:r>
-        <w:rPr/>
-        <w:t xml:space="preserve"> line. </w:t>
-      </w:r>
-      <w:r>
-        <w:rPr>
-          <w:rStyle w:val="SourceText"/>
-        </w:rPr>
-        <w:t>cli-missing</w:t>
-      </w:r>
-      <w:r>
-        <w:rPr/>
-        <w:t xml:space="preserve"> means </w:t>
-      </w:r>
-      <w:r>
-        <w:rPr>
-          <w:rStyle w:val="SourceText"/>
-        </w:rPr>
-        <w:t>obsidian-vault</w:t>
-      </w:r>
-      <w:r>
-        <w:rPr/>
-        <w:t xml:space="preserve"> is not installed where crew can find it; </w:t>
-      </w:r>
-      <w:r>
-        <w:rPr>
-          <w:rStyle w:val="SourceText"/>
-        </w:rPr>
-        <w:t>cli-exit-N</w:t>
-      </w:r>
-      <w:r>
-        <w:rPr/>
-        <w:t xml:space="preserve">, </w:t>
-      </w:r>
-      <w:r>
-        <w:rPr>
-          <w:rStyle w:val="SourceText"/>
-        </w:rPr>
-        <w:t>cli-timeout</w:t>
-      </w:r>
-      <w:r>
-        <w:rPr/>
-        <w:t xml:space="preserve">, </w:t>
-      </w:r>
-      <w:r>
-        <w:rPr>
-          <w:rStyle w:val="SourceText"/>
-        </w:rPr>
-        <w:t>cli-bad-json</w:t>
-      </w:r>
-      <w:r>
-        <w:rPr/>
-        <w:t xml:space="preserve"> mean the CLI ran and failed; </w:t>
-      </w:r>
-      <w:r>
-        <w:rPr>
-          <w:rStyle w:val="SourceText"/>
-        </w:rPr>
-        <w:t>no-vaults</w:t>
-      </w:r>
-      <w:r>
-        <w:rPr/>
-        <w:t xml:space="preserve"> means no vault is currently </w:t>
-      </w:r>
-      <w:r>
-        <w:rPr>
-          <w:rStyle w:val="SourceText"/>
-        </w:rPr>
-        <w:t>primary</w:t>
-      </w:r>
-      <w:r>
-        <w:rPr/>
-        <w:t xml:space="preserve"> or </w:t>
-      </w:r>
-      <w:r>
-        <w:rPr>
-          <w:rStyle w:val="SourceText"/>
-        </w:rPr>
-        <w:t>recall</w:t>
-      </w:r>
-      <w:r>
-        <w:rPr/>
-        <w:t xml:space="preserve">; </w:t>
-      </w:r>
-      <w:r>
-        <w:rPr>
-          <w:rStyle w:val="SourceText"/>
-        </w:rPr>
-        <w:t>no-hits</w:t>
-      </w:r>
-      <w:r>
-        <w:rPr/>
-        <w:t xml:space="preserve"> means the search itself found nothing. Only </w:t>
-      </w:r>
-      <w:r>
-        <w:rPr>
-          <w:rStyle w:val="SourceText"/>
-        </w:rPr>
-        <w:t>no-hits</w:t>
-      </w:r>
-      <w:r>
-        <w:rPr/>
-        <w:t xml:space="preserve"> means "the vault genuinely has nothing relevant" — every other reason is a setup problem. Also confirm </w:t>
-      </w:r>
-      <w:r>
-        <w:rPr>
-          <w:rStyle w:val="SourceText"/>
-        </w:rPr>
-        <w:t>memory.inject</w:t>
-      </w:r>
-      <w:r>
-        <w:rPr/>
-        <w:t xml:space="preserve"> is not </w:t>
-      </w:r>
-      <w:r>
-        <w:rPr>
-          <w:rStyle w:val="SourceText"/>
-        </w:rPr>
-        <w:t>false</w:t>
-      </w:r>
-      <w:r>
-        <w:rPr/>
-        <w:t xml:space="preserve"> in </w:t>
-      </w:r>
-      <w:r>
-        <w:rPr>
-          <w:rStyle w:val="SourceText"/>
-        </w:rPr>
-        <w:t>.crew/config.json</w:t>
-      </w:r>
-      <w:r>
-        <w:rPr/>
-        <w:t xml:space="preserve"> — recall and code-map injection are on by default since 1.0.0, so "no recall ever appears" with the key set to </w:t>
-      </w:r>
-      <w:r>
-        <w:rPr>
-          <w:rStyle w:val="SourceText"/>
-        </w:rPr>
-        <w:t>false</w:t>
-      </w:r>
-      <w:r>
-        <w:rPr/>
-        <w:t xml:space="preserve"> is expected. </w:t>
-      </w:r>
-      <w:r>
-        <w:rPr>
-          <w:rStyle w:val="Strong"/>
-        </w:rPr>
-        <w:t>Fix:</w:t>
-      </w:r>
-      <w:r>
-        <w:rPr/>
-        <w:t xml:space="preserve"> </w:t>
-      </w:r>
-      <w:r>
-        <w:rPr>
-          <w:rStyle w:val="SourceText"/>
-        </w:rPr>
-        <w:t>$VO recall --query "&lt;words you expect&gt;"</w:t>
-      </w:r>
-      <w:r>
-        <w:rPr/>
-        <w:t xml:space="preserve"> directly, to separate "the CLI can't find it" from "the hook isn't calling the CLI".</w:t>
       </w:r>
     </w:p>
     <w:p>
@@ -5409,37 +5549,199 @@
         <w:rPr>
           <w:rStyle w:val="Strong"/>
         </w:rPr>
-        <w:t>Symptom: the gardener seems to be falling behind.</w:t>
-      </w:r>
-      <w:r>
-        <w:rPr/>
-        <w:t xml:space="preserve"> It runs in bounded passes on purpose, not continuously: </w:t>
+        <w:t>Symptom: recall never surfaces anything you know is in the vault.</w:t>
+      </w:r>
+      <w:r>
+        <w:rPr/>
+        <w:t xml:space="preserve"> </w:t>
       </w:r>
       <w:r>
         <w:rPr>
           <w:rStyle w:val="Strong"/>
         </w:rPr>
-        <w:t>at most 5 items or 10 minutes per run</w:t>
-      </w:r>
-      <w:r>
-        <w:rPr/>
-        <w:t xml:space="preserve">, whichever comes first, on </w:t>
+        <w:t>Check:</w:t>
+      </w:r>
+    </w:p>
+    <w:p>
+      <w:pPr>
+        <w:pStyle w:val="PreformattedText"/>
+        <w:bidi w:val="0"/>
+        <w:jc w:val="left"/>
+        <w:rPr/>
+      </w:pPr>
+      <w:r>
+        <w:rPr>
+          <w:rStyle w:val="SourceText"/>
+        </w:rPr>
+        <w:t>python3 "&lt;crew plugin root&gt;/hooks/scripts/crew_context.py" --stats</w:t>
+      </w:r>
+    </w:p>
+    <w:p>
+      <w:pPr>
+        <w:pStyle w:val="BodyText"/>
+        <w:bidi w:val="0"/>
+        <w:jc w:val="left"/>
+        <w:rPr/>
+      </w:pPr>
+      <w:r>
+        <w:rPr/>
+        <w:t xml:space="preserve">Read the </w:t>
+      </w:r>
+      <w:r>
+        <w:rPr>
+          <w:rStyle w:val="SourceText"/>
+        </w:rPr>
+        <w:t>miss reasons</w:t>
+      </w:r>
+      <w:r>
+        <w:rPr/>
+        <w:t xml:space="preserve"> line. </w:t>
+      </w:r>
+      <w:r>
+        <w:rPr>
+          <w:rStyle w:val="SourceText"/>
+        </w:rPr>
+        <w:t>cli-missing</w:t>
+      </w:r>
+      <w:r>
+        <w:rPr/>
+        <w:t xml:space="preserve"> means </w:t>
+      </w:r>
+      <w:r>
+        <w:rPr>
+          <w:rStyle w:val="SourceText"/>
+        </w:rPr>
+        <w:t>obsidian-vault</w:t>
+      </w:r>
+      <w:r>
+        <w:rPr/>
+        <w:t xml:space="preserve"> is not installed where crew can find it; </w:t>
+      </w:r>
+      <w:r>
+        <w:rPr>
+          <w:rStyle w:val="SourceText"/>
+        </w:rPr>
+        <w:t>cli-exit-N</w:t>
+      </w:r>
+      <w:r>
+        <w:rPr/>
+        <w:t xml:space="preserve">, </w:t>
+      </w:r>
+      <w:r>
+        <w:rPr>
+          <w:rStyle w:val="SourceText"/>
+        </w:rPr>
+        <w:t>cli-timeout</w:t>
+      </w:r>
+      <w:r>
+        <w:rPr/>
+        <w:t xml:space="preserve">, </w:t>
+      </w:r>
+      <w:r>
+        <w:rPr>
+          <w:rStyle w:val="SourceText"/>
+        </w:rPr>
+        <w:t>cli-bad-json</w:t>
+      </w:r>
+      <w:r>
+        <w:rPr/>
+        <w:t xml:space="preserve"> mean the CLI ran and failed; </w:t>
+      </w:r>
+      <w:r>
+        <w:rPr>
+          <w:rStyle w:val="SourceText"/>
+        </w:rPr>
+        <w:t>no-vaults</w:t>
+      </w:r>
+      <w:r>
+        <w:rPr/>
+        <w:t xml:space="preserve"> means no vault is currently </w:t>
+      </w:r>
+      <w:r>
+        <w:rPr>
+          <w:rStyle w:val="SourceText"/>
+        </w:rPr>
+        <w:t>primary</w:t>
+      </w:r>
+      <w:r>
+        <w:rPr/>
+        <w:t xml:space="preserve"> or </w:t>
+      </w:r>
+      <w:r>
+        <w:rPr>
+          <w:rStyle w:val="SourceText"/>
+        </w:rPr>
+        <w:t>recall</w:t>
+      </w:r>
+      <w:r>
+        <w:rPr/>
+        <w:t xml:space="preserve">; </w:t>
+      </w:r>
+      <w:r>
+        <w:rPr>
+          <w:rStyle w:val="SourceText"/>
+        </w:rPr>
+        <w:t>no-hits</w:t>
+      </w:r>
+      <w:r>
+        <w:rPr/>
+        <w:t xml:space="preserve"> means the search itself found nothing. Only </w:t>
+      </w:r>
+      <w:r>
+        <w:rPr>
+          <w:rStyle w:val="SourceText"/>
+        </w:rPr>
+        <w:t>no-hits</w:t>
+      </w:r>
+      <w:r>
+        <w:rPr/>
+        <w:t xml:space="preserve"> means "the vault genuinely has nothing relevant" — every other reason is a setup problem. Also confirm </w:t>
+      </w:r>
+      <w:r>
+        <w:rPr>
+          <w:rStyle w:val="SourceText"/>
+        </w:rPr>
+        <w:t>memory.inject</w:t>
+      </w:r>
+      <w:r>
+        <w:rPr/>
+        <w:t xml:space="preserve"> is not </w:t>
+      </w:r>
+      <w:r>
+        <w:rPr>
+          <w:rStyle w:val="SourceText"/>
+        </w:rPr>
+        <w:t>false</w:t>
+      </w:r>
+      <w:r>
+        <w:rPr/>
+        <w:t xml:space="preserve"> in </w:t>
+      </w:r>
+      <w:r>
+        <w:rPr>
+          <w:rStyle w:val="SourceText"/>
+        </w:rPr>
+        <w:t>.crew/config.json</w:t>
+      </w:r>
+      <w:r>
+        <w:rPr/>
+        <w:t xml:space="preserve"> — recall and code-map injection are on by default since 1.0.0, so "no recall ever appears" with the key set to </w:t>
+      </w:r>
+      <w:r>
+        <w:rPr>
+          <w:rStyle w:val="SourceText"/>
+        </w:rPr>
+        <w:t>false</w:t>
+      </w:r>
+      <w:r>
+        <w:rPr/>
+        <w:t xml:space="preserve"> is expected. </w:t>
       </w:r>
       <w:r>
         <w:rPr>
           <w:rStyle w:val="Strong"/>
         </w:rPr>
-        <w:t>one designated host</w:t>
-      </w:r>
-      <w:r>
-        <w:rPr/>
-        <w:t xml:space="preserve">, one run at a time. A session whose transcript lives on another machine is left queued for that machine and does not spend one of the five slots. </w:t>
-      </w:r>
-      <w:r>
-        <w:rPr>
-          <w:rStyle w:val="Strong"/>
-        </w:rPr>
-        <w:t>Check:</w:t>
+        <w:t>Fix:</w:t>
       </w:r>
       <w:r>
         <w:rPr/>
@@ -5449,71 +5751,11 @@
         <w:rPr>
           <w:rStyle w:val="SourceText"/>
         </w:rPr>
-        <w:t>$VO queue</w:t>
-      </w:r>
-      <w:r>
-        <w:rPr/>
-        <w:t xml:space="preserve"> (what is waiting) and </w:t>
-      </w:r>
-      <w:r>
-        <w:rPr>
-          <w:rStyle w:val="SourceText"/>
-        </w:rPr>
-        <w:t>~/.claude/obsidian/gardener.log</w:t>
-      </w:r>
-      <w:r>
-        <w:rPr/>
-        <w:t xml:space="preserve"> for lines starting </w:t>
-      </w:r>
-      <w:r>
-        <w:rPr>
-          <w:rStyle w:val="SourceText"/>
-        </w:rPr>
-        <w:t>left queued</w:t>
-      </w:r>
-      <w:r>
-        <w:rPr/>
-        <w:t xml:space="preserve">. </w:t>
-      </w:r>
-      <w:r>
-        <w:rPr>
-          <w:rStyle w:val="Strong"/>
-        </w:rPr>
-        <w:t>Fix:</w:t>
-      </w:r>
-      <w:r>
-        <w:rPr/>
-        <w:t xml:space="preserve"> run a bounded pass by hand (</w:t>
-      </w:r>
-      <w:r>
-        <w:rPr>
-          <w:rStyle w:val="SourceText"/>
-        </w:rPr>
-        <w:t>/obsidian-vault:garden</w:t>
-      </w:r>
-      <w:r>
-        <w:rPr/>
-        <w:t xml:space="preserve"> or </w:t>
-      </w:r>
-      <w:r>
-        <w:rPr>
-          <w:rStyle w:val="SourceText"/>
-        </w:rPr>
-        <w:t>$VO garden-run</w:t>
-      </w:r>
-      <w:r>
-        <w:rPr/>
-        <w:t xml:space="preserve">), or drain a large backlog in batches: </w:t>
-      </w:r>
-      <w:r>
-        <w:rPr>
-          <w:rStyle w:val="SourceText"/>
-        </w:rPr>
-        <w:t>$VO drain --apply --batches 4</w:t>
-      </w:r>
-      <w:r>
-        <w:rPr/>
-        <w:t>.</w:t>
+        <w:t>$VO recall --query "&lt;words you expect&gt;"</w:t>
+      </w:r>
+      <w:r>
+        <w:rPr/>
+        <w:t xml:space="preserve"> directly, to separate "the CLI can't find it" from "the hook isn't calling the CLI".</w:t>
       </w:r>
     </w:p>
     <w:p>
@@ -5521,7 +5763,7 @@
         <w:pStyle w:val="BodyText"/>
         <w:numPr>
           <w:ilvl w:val="0"/>
-          <w:numId w:val="13"/>
+          <w:numId w:val="14"/>
         </w:numPr>
         <w:tabs>
           <w:tab w:val="clear" w:pos="1134"/>
@@ -5536,41 +5778,111 @@
         <w:rPr>
           <w:rStyle w:val="Strong"/>
         </w:rPr>
-        <w:t>Symptom: two machines sharing one vault seem to be racing each other.</w:t>
-      </w:r>
-      <w:r>
-        <w:rPr/>
-        <w:t xml:space="preserve"> They are not writing the same file: each host appends to its own </w:t>
-      </w:r>
-      <w:r>
-        <w:rPr>
-          <w:rStyle w:val="SourceText"/>
-        </w:rPr>
-        <w:t>inbox/pending-reflect.&lt;host&gt;.md</w:t>
-      </w:r>
-      <w:r>
-        <w:rPr/>
-        <w:t xml:space="preserve"> and acknowledges to its own </w:t>
-      </w:r>
-      <w:r>
-        <w:rPr>
-          <w:rStyle w:val="SourceText"/>
-        </w:rPr>
-        <w:t>inbox/reflected.&lt;host&gt;.md</w:t>
-      </w:r>
-      <w:r>
-        <w:rPr/>
-        <w:t xml:space="preserve">, so two machines syncing one vault never contend for the same queue file. An older </w:t>
-      </w:r>
-      <w:r>
-        <w:rPr>
-          <w:rStyle w:val="SourceText"/>
-        </w:rPr>
-        <w:t>inbox/pending-reflect.md</w:t>
-      </w:r>
-      <w:r>
-        <w:rPr/>
-        <w:t xml:space="preserve"> (no host suffix) is still read if present, so an old backlog drains rather than being stranded — it is just never written again.</w:t>
+        <w:t>Symptom: the gardener seems to be falling behind.</w:t>
+      </w:r>
+      <w:r>
+        <w:rPr/>
+        <w:t xml:space="preserve"> It runs in bounded passes on purpose, not continuously: </w:t>
+      </w:r>
+      <w:r>
+        <w:rPr>
+          <w:rStyle w:val="Strong"/>
+        </w:rPr>
+        <w:t>at most 5 items or 10 minutes per run</w:t>
+      </w:r>
+      <w:r>
+        <w:rPr/>
+        <w:t xml:space="preserve">, whichever comes first, on </w:t>
+      </w:r>
+      <w:r>
+        <w:rPr>
+          <w:rStyle w:val="Strong"/>
+        </w:rPr>
+        <w:t>one designated host</w:t>
+      </w:r>
+      <w:r>
+        <w:rPr/>
+        <w:t xml:space="preserve">, one run at a time. A session whose transcript lives on another machine is left queued for that machine and does not spend one of the five slots. </w:t>
+      </w:r>
+      <w:r>
+        <w:rPr>
+          <w:rStyle w:val="Strong"/>
+        </w:rPr>
+        <w:t>Check:</w:t>
+      </w:r>
+      <w:r>
+        <w:rPr/>
+        <w:t xml:space="preserve"> </w:t>
+      </w:r>
+      <w:r>
+        <w:rPr>
+          <w:rStyle w:val="SourceText"/>
+        </w:rPr>
+        <w:t>$VO queue</w:t>
+      </w:r>
+      <w:r>
+        <w:rPr/>
+        <w:t xml:space="preserve"> (what is waiting) and </w:t>
+      </w:r>
+      <w:r>
+        <w:rPr>
+          <w:rStyle w:val="SourceText"/>
+        </w:rPr>
+        <w:t>~/.claude/obsidian/gardener.log</w:t>
+      </w:r>
+      <w:r>
+        <w:rPr/>
+        <w:t xml:space="preserve"> for lines starting </w:t>
+      </w:r>
+      <w:r>
+        <w:rPr>
+          <w:rStyle w:val="SourceText"/>
+        </w:rPr>
+        <w:t>left queued</w:t>
+      </w:r>
+      <w:r>
+        <w:rPr/>
+        <w:t xml:space="preserve">. </w:t>
+      </w:r>
+      <w:r>
+        <w:rPr>
+          <w:rStyle w:val="Strong"/>
+        </w:rPr>
+        <w:t>Fix:</w:t>
+      </w:r>
+      <w:r>
+        <w:rPr/>
+        <w:t xml:space="preserve"> run a bounded pass by hand (</w:t>
+      </w:r>
+      <w:r>
+        <w:rPr>
+          <w:rStyle w:val="SourceText"/>
+        </w:rPr>
+        <w:t>/obsidian-vault:garden</w:t>
+      </w:r>
+      <w:r>
+        <w:rPr/>
+        <w:t xml:space="preserve"> or </w:t>
+      </w:r>
+      <w:r>
+        <w:rPr>
+          <w:rStyle w:val="SourceText"/>
+        </w:rPr>
+        <w:t>$VO garden-run</w:t>
+      </w:r>
+      <w:r>
+        <w:rPr/>
+        <w:t xml:space="preserve">), or drain a large backlog in batches: </w:t>
+      </w:r>
+      <w:r>
+        <w:rPr>
+          <w:rStyle w:val="SourceText"/>
+        </w:rPr>
+        <w:t>$VO drain --apply --batches 4</w:t>
+      </w:r>
+      <w:r>
+        <w:rPr/>
+        <w:t>.</w:t>
       </w:r>
     </w:p>
     <w:p>
@@ -5578,7 +5890,7 @@
         <w:pStyle w:val="BodyText"/>
         <w:numPr>
           <w:ilvl w:val="0"/>
-          <w:numId w:val="13"/>
+          <w:numId w:val="14"/>
         </w:numPr>
         <w:tabs>
           <w:tab w:val="clear" w:pos="1134"/>
@@ -5593,6 +5905,63 @@
         <w:rPr>
           <w:rStyle w:val="Strong"/>
         </w:rPr>
+        <w:t>Symptom: two machines sharing one vault seem to be racing each other.</w:t>
+      </w:r>
+      <w:r>
+        <w:rPr/>
+        <w:t xml:space="preserve"> They are not writing the same file: each host appends to its own </w:t>
+      </w:r>
+      <w:r>
+        <w:rPr>
+          <w:rStyle w:val="SourceText"/>
+        </w:rPr>
+        <w:t>inbox/pending-reflect.&lt;host&gt;.md</w:t>
+      </w:r>
+      <w:r>
+        <w:rPr/>
+        <w:t xml:space="preserve"> and acknowledges to its own </w:t>
+      </w:r>
+      <w:r>
+        <w:rPr>
+          <w:rStyle w:val="SourceText"/>
+        </w:rPr>
+        <w:t>inbox/reflected.&lt;host&gt;.md</w:t>
+      </w:r>
+      <w:r>
+        <w:rPr/>
+        <w:t xml:space="preserve">, so two machines syncing one vault never contend for the same queue file. An older </w:t>
+      </w:r>
+      <w:r>
+        <w:rPr>
+          <w:rStyle w:val="SourceText"/>
+        </w:rPr>
+        <w:t>inbox/pending-reflect.md</w:t>
+      </w:r>
+      <w:r>
+        <w:rPr/>
+        <w:t xml:space="preserve"> (no host suffix) is still read if present, so an old backlog drains rather than being stranded — it is just never written again.</w:t>
+      </w:r>
+    </w:p>
+    <w:p>
+      <w:pPr>
+        <w:pStyle w:val="BodyText"/>
+        <w:numPr>
+          <w:ilvl w:val="0"/>
+          <w:numId w:val="14"/>
+        </w:numPr>
+        <w:tabs>
+          <w:tab w:val="clear" w:pos="1134"/>
+          <w:tab w:val="left" w:pos="829" w:leader="none"/>
+        </w:tabs>
+        <w:bidi w:val="0"/>
+        <w:ind w:hanging="283" w:left="829"/>
+        <w:jc w:val="left"/>
+        <w:rPr/>
+      </w:pPr>
+      <w:r>
+        <w:rPr>
+          <w:rStyle w:val="Strong"/>
+        </w:rPr>
         <w:t xml:space="preserve">Symptom: </w:t>
       </w:r>
       <w:r>
@@ -5661,7 +6030,7 @@
         <w:pStyle w:val="BodyText"/>
         <w:numPr>
           <w:ilvl w:val="1"/>
-          <w:numId w:val="13"/>
+          <w:numId w:val="14"/>
         </w:numPr>
         <w:tabs>
           <w:tab w:val="clear" w:pos="1134"/>
@@ -5719,7 +6088,7 @@
         <w:pStyle w:val="BodyText"/>
         <w:numPr>
           <w:ilvl w:val="1"/>
-          <w:numId w:val="13"/>
+          <w:numId w:val="14"/>
         </w:numPr>
         <w:tabs>
           <w:tab w:val="clear" w:pos="1134"/>
@@ -5779,7 +6148,7 @@
         <w:pStyle w:val="BodyText"/>
         <w:numPr>
           <w:ilvl w:val="1"/>
-          <w:numId w:val="13"/>
+          <w:numId w:val="14"/>
         </w:numPr>
         <w:tabs>
           <w:tab w:val="clear" w:pos="1134"/>
@@ -5837,7 +6206,7 @@
         <w:pStyle w:val="BodyText"/>
         <w:numPr>
           <w:ilvl w:val="1"/>
-          <w:numId w:val="13"/>
+          <w:numId w:val="14"/>
         </w:numPr>
         <w:tabs>
           <w:tab w:val="clear" w:pos="1134"/>
@@ -5976,7 +6345,7 @@
         <w:pStyle w:val="BodyText"/>
         <w:numPr>
           <w:ilvl w:val="0"/>
-          <w:numId w:val="14"/>
+          <w:numId w:val="15"/>
         </w:numPr>
         <w:tabs>
           <w:tab w:val="clear" w:pos="1134"/>
@@ -6100,7 +6469,7 @@
         <w:pStyle w:val="BodyText"/>
         <w:numPr>
           <w:ilvl w:val="0"/>
-          <w:numId w:val="14"/>
+          <w:numId w:val="15"/>
         </w:numPr>
         <w:tabs>
           <w:tab w:val="clear" w:pos="1134"/>
@@ -6188,7 +6557,7 @@
         <w:pStyle w:val="BodyText"/>
         <w:numPr>
           <w:ilvl w:val="0"/>
-          <w:numId w:val="14"/>
+          <w:numId w:val="15"/>
         </w:numPr>
         <w:tabs>
           <w:tab w:val="clear" w:pos="1134"/>
@@ -8182,7 +8551,7 @@
         <w:pStyle w:val="BodyText"/>
         <w:numPr>
           <w:ilvl w:val="0"/>
-          <w:numId w:val="15"/>
+          <w:numId w:val="16"/>
         </w:numPr>
         <w:tabs>
           <w:tab w:val="clear" w:pos="1134"/>
@@ -8256,7 +8625,7 @@
         <w:pStyle w:val="BodyText"/>
         <w:numPr>
           <w:ilvl w:val="0"/>
-          <w:numId w:val="15"/>
+          <w:numId w:val="16"/>
         </w:numPr>
         <w:tabs>
           <w:tab w:val="clear" w:pos="1134"/>
@@ -8307,176 +8676,6 @@
       <w:r>
         <w:rPr/>
         <w:t xml:space="preserve">) skips the OS packages Chromium needs and produces a browser that launches, then crashes on first navigation. </w:t>
-      </w:r>
-    </w:p>
-    <w:p>
-      <w:pPr>
-        <w:pStyle w:val="BodyText"/>
-        <w:numPr>
-          <w:ilvl w:val="0"/>
-          <w:numId w:val="15"/>
-        </w:numPr>
-        <w:tabs>
-          <w:tab w:val="clear" w:pos="1134"/>
-          <w:tab w:val="left" w:pos="829" w:leader="none"/>
-        </w:tabs>
-        <w:bidi w:val="0"/>
-        <w:spacing w:before="120" w:after="0"/>
-        <w:ind w:hanging="283" w:left="829"/>
-        <w:jc w:val="left"/>
-        <w:rPr/>
-      </w:pPr>
-      <w:r>
-        <w:rPr>
-          <w:rStyle w:val="Strong"/>
-        </w:rPr>
-        <w:t>Docker absent -&gt; visual UNVERIFIED, not a fail.</w:t>
-      </w:r>
-      <w:r>
-        <w:rPr/>
-        <w:t xml:space="preserve"> </w:t>
-      </w:r>
-      <w:r>
-        <w:rPr>
-          <w:rStyle w:val="SourceText"/>
-        </w:rPr>
-        <w:t>toHaveScreenshot</w:t>
-      </w:r>
-      <w:r>
-        <w:rPr/>
-        <w:t xml:space="preserve"> baselines are only meaningful when generated inside </w:t>
-      </w:r>
-      <w:r>
-        <w:rPr>
-          <w:rStyle w:val="SourceText"/>
-        </w:rPr>
-        <w:t>mcr.microsoft.com/playwright:v1.63.0-noble</w:t>
-      </w:r>
-      <w:r>
-        <w:rPr/>
-        <w:t xml:space="preserve"> — the installer warns rather than blocking when Docker is missing, and the visual </w:t>
-      </w:r>
-      <w:r>
-        <w:rPr>
-          <w:rStyle w:val="SourceText"/>
-        </w:rPr>
-        <w:t>verify.json</w:t>
-      </w:r>
-      <w:r>
-        <w:rPr/>
-        <w:t xml:space="preserve"> rule is written to skip (report UNVERIFIED) outside that image rather than compare against a baseline that can never match. </w:t>
-      </w:r>
-    </w:p>
-    <w:p>
-      <w:pPr>
-        <w:pStyle w:val="BodyText"/>
-        <w:numPr>
-          <w:ilvl w:val="0"/>
-          <w:numId w:val="15"/>
-        </w:numPr>
-        <w:tabs>
-          <w:tab w:val="clear" w:pos="1134"/>
-          <w:tab w:val="left" w:pos="829" w:leader="none"/>
-        </w:tabs>
-        <w:bidi w:val="0"/>
-        <w:ind w:hanging="283" w:left="829"/>
-        <w:jc w:val="left"/>
-        <w:rPr/>
-      </w:pPr>
-      <w:r>
-        <w:rPr>
-          <w:rStyle w:val="Strong"/>
-        </w:rPr>
-        <w:t>MCP server won't connect on Windows.</w:t>
-      </w:r>
-      <w:r>
-        <w:rPr/>
-        <w:t xml:space="preserve"> Both </w:t>
-      </w:r>
-      <w:r>
-        <w:rPr>
-          <w:rStyle w:val="SourceText"/>
-        </w:rPr>
-        <w:t>@playwright/mcp</w:t>
-      </w:r>
-      <w:r>
-        <w:rPr/>
-        <w:t xml:space="preserve"> and </w:t>
-      </w:r>
-      <w:r>
-        <w:rPr>
-          <w:rStyle w:val="SourceText"/>
-        </w:rPr>
-        <w:t>chrome-devtools-mcp</w:t>
-      </w:r>
-      <w:r>
-        <w:rPr/>
-        <w:t xml:space="preserve"> are launched with </w:t>
-      </w:r>
-      <w:r>
-        <w:rPr>
-          <w:rStyle w:val="SourceText"/>
-        </w:rPr>
-        <w:t>npx</w:t>
-      </w:r>
-      <w:r>
-        <w:rPr/>
-        <w:t xml:space="preserve">, which the MCP host cannot invoke directly on Windows — wrap the entry as </w:t>
-      </w:r>
-      <w:r>
-        <w:rPr>
-          <w:rStyle w:val="SourceText"/>
-        </w:rPr>
-        <w:t>"command": "cmd", "args": ["/c", "npx", ...]</w:t>
-      </w:r>
-      <w:r>
-        <w:rPr/>
-        <w:t xml:space="preserve"> in </w:t>
-      </w:r>
-      <w:r>
-        <w:rPr>
-          <w:rStyle w:val="SourceText"/>
-        </w:rPr>
-        <w:t>.mcp.json</w:t>
-      </w:r>
-      <w:r>
-        <w:rPr/>
-        <w:t xml:space="preserve"> (documented in chrome-devtools-mcp's own troubleshooting for the "Connection closed" failure); the </w:t>
-      </w:r>
-      <w:r>
-        <w:rPr>
-          <w:rStyle w:val="SourceText"/>
-        </w:rPr>
-        <w:t>stack-web</w:t>
-      </w:r>
-      <w:r>
-        <w:rPr/>
-        <w:t xml:space="preserve"> skill's </w:t>
-      </w:r>
-      <w:r>
-        <w:rPr>
-          <w:rStyle w:val="SourceText"/>
-        </w:rPr>
-        <w:t>.mcp.json</w:t>
-      </w:r>
-      <w:r>
-        <w:rPr/>
-        <w:t xml:space="preserve"> example already shows this. </w:t>
-      </w:r>
-    </w:p>
-    <w:p>
-      <w:pPr>
-        <w:pStyle w:val="Heading2"/>
-        <w:bidi w:val="0"/>
-        <w:ind w:hanging="0" w:left="0" w:right="0"/>
-        <w:jc w:val="left"/>
-        <w:rPr/>
-      </w:pPr>
-      <w:bookmarkStart w:id="12" w:name="windows-notes"/>
-      <w:bookmarkEnd w:id="12"/>
-      <w:r>
-        <w:rPr/>
-        <w:t>Windows Notes</w:t>
       </w:r>
     </w:p>
     <w:p>
@@ -8498,41 +8697,43 @@
       </w:pPr>
       <w:r>
         <w:rPr>
-          <w:rStyle w:val="SourceText"/>
-        </w:rPr>
-        <w:t>pwsh</w:t>
-      </w:r>
-      <w:r>
-        <w:rPr>
           <w:rStyle w:val="Strong"/>
         </w:rPr>
-        <w:t xml:space="preserve"> is not on Git Bash's </w:t>
-      </w:r>
-      <w:r>
-        <w:rPr>
-          <w:rStyle w:val="SourceText"/>
-        </w:rPr>
-        <w:t>PATH</w:t>
-      </w:r>
-      <w:r>
-        <w:rPr>
-          <w:rStyle w:val="Strong"/>
-        </w:rPr>
-        <w:t>.</w:t>
-      </w:r>
-      <w:r>
-        <w:rPr/>
-        <w:t xml:space="preserve"> Every script that shells out to PowerShell names it by an absolute path or resolves it explicitly; a bare </w:t>
-      </w:r>
-      <w:r>
-        <w:rPr>
-          <w:rStyle w:val="SourceText"/>
-        </w:rPr>
-        <w:t>pwsh</w:t>
-      </w:r>
-      <w:r>
-        <w:rPr/>
-        <w:t xml:space="preserve"> in a hand-typed command fails as "command not found", which is easy to misread as PowerShell itself being broken. </w:t>
+        <w:t>Docker absent -&gt; visual UNVERIFIED, not a fail.</w:t>
+      </w:r>
+      <w:r>
+        <w:rPr/>
+        <w:t xml:space="preserve"> </w:t>
+      </w:r>
+      <w:r>
+        <w:rPr>
+          <w:rStyle w:val="SourceText"/>
+        </w:rPr>
+        <w:t>toHaveScreenshot</w:t>
+      </w:r>
+      <w:r>
+        <w:rPr/>
+        <w:t xml:space="preserve"> baselines are only meaningful when generated inside </w:t>
+      </w:r>
+      <w:r>
+        <w:rPr>
+          <w:rStyle w:val="SourceText"/>
+        </w:rPr>
+        <w:t>mcr.microsoft.com/playwright:v1.63.0-noble</w:t>
+      </w:r>
+      <w:r>
+        <w:rPr/>
+        <w:t xml:space="preserve"> — the installer warns rather than blocking when Docker is missing, and the visual </w:t>
+      </w:r>
+      <w:r>
+        <w:rPr>
+          <w:rStyle w:val="SourceText"/>
+        </w:rPr>
+        <w:t>verify.json</w:t>
+      </w:r>
+      <w:r>
+        <w:rPr/>
+        <w:t xml:space="preserve"> rule is written to skip (report UNVERIFIED) outside that image rather than compare against a baseline that can never match. </w:t>
       </w:r>
     </w:p>
     <w:p>
@@ -8547,7 +8748,6 @@
           <w:tab w:val="left" w:pos="829" w:leader="none"/>
         </w:tabs>
         <w:bidi w:val="0"/>
-        <w:spacing w:before="120" w:after="0"/>
         <w:ind w:hanging="283" w:left="829"/>
         <w:jc w:val="left"/>
         <w:rPr/>
@@ -8556,116 +8756,17 @@
         <w:rPr>
           <w:rStyle w:val="Strong"/>
         </w:rPr>
-        <w:t xml:space="preserve">Git Bash ships without </w:t>
-      </w:r>
-      <w:r>
-        <w:rPr>
-          <w:rStyle w:val="SourceText"/>
-        </w:rPr>
-        <w:t>python3</w:t>
-      </w:r>
-      <w:r>
-        <w:rPr>
-          <w:rStyle w:val="Strong"/>
-        </w:rPr>
-        <w:t>.</w:t>
-      </w:r>
-      <w:r>
-        <w:rPr/>
-        <w:t xml:space="preserve"> Every hook wrapper here resolves </w:t>
-      </w:r>
-      <w:r>
-        <w:rPr>
-          <w:rStyle w:val="SourceText"/>
-        </w:rPr>
-        <w:t>python3</w:t>
-      </w:r>
-      <w:r>
-        <w:rPr/>
-        <w:t xml:space="preserve">, then </w:t>
-      </w:r>
-      <w:r>
-        <w:rPr>
-          <w:rStyle w:val="SourceText"/>
-        </w:rPr>
-        <w:t>python</w:t>
-      </w:r>
-      <w:r>
-        <w:rPr/>
-        <w:t xml:space="preserve">, then </w:t>
-      </w:r>
-      <w:r>
-        <w:rPr>
-          <w:rStyle w:val="SourceText"/>
-        </w:rPr>
-        <w:t>py</w:t>
-      </w:r>
-      <w:r>
-        <w:rPr/>
-        <w:t xml:space="preserve">, and fails loudly on stderr rather than silently standing down when none resolves (see "no-python fail-closed", above). If a hook you expect to run says nothing at all, check for a usable Python on </w:t>
-      </w:r>
-      <w:r>
-        <w:rPr>
-          <w:rStyle w:val="SourceText"/>
-        </w:rPr>
-        <w:t>PATH</w:t>
-      </w:r>
-      <w:r>
-        <w:rPr/>
-        <w:t xml:space="preserve"> first. </w:t>
-      </w:r>
-    </w:p>
-    <w:p>
-      <w:pPr>
-        <w:pStyle w:val="BodyText"/>
-        <w:numPr>
-          <w:ilvl w:val="0"/>
-          <w:numId w:val="16"/>
-        </w:numPr>
-        <w:tabs>
-          <w:tab w:val="clear" w:pos="1134"/>
-          <w:tab w:val="left" w:pos="829" w:leader="none"/>
-        </w:tabs>
-        <w:bidi w:val="0"/>
-        <w:ind w:hanging="283" w:left="829"/>
-        <w:jc w:val="left"/>
-        <w:rPr/>
-      </w:pPr>
-      <w:r>
-        <w:rPr>
-          <w:rStyle w:val="Strong"/>
-        </w:rPr>
-        <w:t>Both flavours are always registered.</w:t>
-      </w:r>
-      <w:r>
-        <w:rPr/>
-        <w:t xml:space="preserve"> </w:t>
-      </w:r>
-      <w:r>
-        <w:rPr>
-          <w:rStyle w:val="SourceText"/>
-        </w:rPr>
-        <w:t>hooks.json</w:t>
-      </w:r>
-      <w:r>
-        <w:rPr/>
-        <w:t xml:space="preserve"> pairs every bash command with a </w:t>
-      </w:r>
-      <w:r>
-        <w:rPr>
-          <w:rStyle w:val="SourceText"/>
-        </w:rPr>
-        <w:t>shell: "powershell"</w:t>
-      </w:r>
-      <w:r>
-        <w:rPr/>
-        <w:t xml:space="preserve"> sibling on the same event, so a machine with both </w:t>
-      </w:r>
-      <w:r>
-        <w:rPr>
-          <w:rStyle w:val="SourceText"/>
-        </w:rPr>
-        <w:t>bash</w:t>
+        <w:t>MCP server won't connect on Windows.</w:t>
+      </w:r>
+      <w:r>
+        <w:rPr/>
+        <w:t xml:space="preserve"> Both </w:t>
+      </w:r>
+      <w:r>
+        <w:rPr>
+          <w:rStyle w:val="SourceText"/>
+        </w:rPr>
+        <w:t>@playwright/mcp</w:t>
       </w:r>
       <w:r>
         <w:rPr/>
@@ -8675,21 +8776,61 @@
         <w:rPr>
           <w:rStyle w:val="SourceText"/>
         </w:rPr>
-        <w:t>pwsh</w:t>
-      </w:r>
-      <w:r>
-        <w:rPr/>
-        <w:t xml:space="preserve"> present runs both. This is not double-firing to fix — it is how the same hook reaches both shells; each PowerShell twin stands itself down on the wrong platform (</w:t>
-      </w:r>
-      <w:r>
-        <w:rPr>
-          <w:rStyle w:val="SourceText"/>
-        </w:rPr>
-        <w:t>$env:OS -ne 'Windows_NT'</w:t>
-      </w:r>
-      <w:r>
-        <w:rPr/>
-        <w:t xml:space="preserve">) rather than the bash twin doing that job. </w:t>
+        <w:t>chrome-devtools-mcp</w:t>
+      </w:r>
+      <w:r>
+        <w:rPr/>
+        <w:t xml:space="preserve"> are launched with </w:t>
+      </w:r>
+      <w:r>
+        <w:rPr>
+          <w:rStyle w:val="SourceText"/>
+        </w:rPr>
+        <w:t>npx</w:t>
+      </w:r>
+      <w:r>
+        <w:rPr/>
+        <w:t xml:space="preserve">, which the MCP host cannot invoke directly on Windows — wrap the entry as </w:t>
+      </w:r>
+      <w:r>
+        <w:rPr>
+          <w:rStyle w:val="SourceText"/>
+        </w:rPr>
+        <w:t>"command": "cmd", "args": ["/c", "npx", ...]</w:t>
+      </w:r>
+      <w:r>
+        <w:rPr/>
+        <w:t xml:space="preserve"> in </w:t>
+      </w:r>
+      <w:r>
+        <w:rPr>
+          <w:rStyle w:val="SourceText"/>
+        </w:rPr>
+        <w:t>.mcp.json</w:t>
+      </w:r>
+      <w:r>
+        <w:rPr/>
+        <w:t xml:space="preserve"> (documented in chrome-devtools-mcp's own troubleshooting for the "Connection closed" failure); the </w:t>
+      </w:r>
+      <w:r>
+        <w:rPr>
+          <w:rStyle w:val="SourceText"/>
+        </w:rPr>
+        <w:t>stack-web</w:t>
+      </w:r>
+      <w:r>
+        <w:rPr/>
+        <w:t xml:space="preserve"> skill's </w:t>
+      </w:r>
+      <w:r>
+        <w:rPr>
+          <w:rStyle w:val="SourceText"/>
+        </w:rPr>
+        <w:t>.mcp.json</w:t>
+      </w:r>
+      <w:r>
+        <w:rPr/>
+        <w:t xml:space="preserve"> example already shows this. </w:t>
       </w:r>
     </w:p>
     <w:p>
@@ -8700,48 +8841,11 @@
         <w:jc w:val="left"/>
         <w:rPr/>
       </w:pPr>
-      <w:bookmarkStart w:id="13" w:name="auto-wrap-up-auto-clear-and-auto-resume"/>
-      <w:bookmarkEnd w:id="13"/>
-      <w:r>
-        <w:rPr/>
-        <w:t>Auto Wrap-Up, Auto-Clear and Auto-Resume</w:t>
-      </w:r>
-    </w:p>
-    <w:p>
-      <w:pPr>
-        <w:pStyle w:val="BodyText"/>
-        <w:bidi w:val="0"/>
-        <w:jc w:val="left"/>
-        <w:rPr/>
-      </w:pPr>
-      <w:r>
-        <w:rPr/>
-        <w:t>This section is folded into the troubleshooting guide (</w:t>
-      </w:r>
-      <w:r>
-        <w:rPr>
-          <w:rStyle w:val="SourceText"/>
-        </w:rPr>
-        <w:t>troubleshooting.md</w:t>
-      </w:r>
-      <w:r>
-        <w:rPr/>
-        <w:t>), linked from it as "Auto wrap-up, clear and resume". It covers the cycle that lets a long session finish itself cleanly, clear, and pick up where it stopped.</w:t>
-      </w:r>
-    </w:p>
-    <w:p>
-      <w:pPr>
-        <w:pStyle w:val="Heading3"/>
-        <w:bidi w:val="0"/>
-        <w:ind w:hanging="0" w:left="0" w:right="0"/>
-        <w:jc w:val="left"/>
-        <w:rPr/>
-      </w:pPr>
-      <w:bookmarkStart w:id="14" w:name="what-the-cycle-does"/>
-      <w:bookmarkEnd w:id="14"/>
-      <w:r>
-        <w:rPr/>
-        <w:t>What the Cycle Does</w:t>
+      <w:bookmarkStart w:id="12" w:name="windows-notes"/>
+      <w:bookmarkEnd w:id="12"/>
+      <w:r>
+        <w:rPr/>
+        <w:t>Windows Notes</w:t>
       </w:r>
     </w:p>
     <w:p>
@@ -8763,33 +8867,41 @@
       </w:pPr>
       <w:r>
         <w:rPr>
+          <w:rStyle w:val="SourceText"/>
+        </w:rPr>
+        <w:t>pwsh</w:t>
+      </w:r>
+      <w:r>
+        <w:rPr>
           <w:rStyle w:val="Strong"/>
         </w:rPr>
-        <w:t>Wrap-up.</w:t>
-      </w:r>
-      <w:r>
-        <w:rPr/>
-        <w:t xml:space="preserve"> When the context window crosses its threshold, the </w:t>
-      </w:r>
-      <w:r>
-        <w:rPr>
-          <w:rStyle w:val="SourceText"/>
-        </w:rPr>
-        <w:t>Stop</w:t>
-      </w:r>
-      <w:r>
-        <w:rPr/>
-        <w:t xml:space="preserve"> hook blocks once. It asks the session to finish or park the change in flight, write </w:t>
-      </w:r>
-      <w:r>
-        <w:rPr>
-          <w:rStyle w:val="SourceText"/>
-        </w:rPr>
-        <w:t>.work/HANDOFF.md</w:t>
-      </w:r>
-      <w:r>
-        <w:rPr/>
-        <w:t xml:space="preserve">, and update the ticket. This happens once for each threshold crossing in each session. It never happens on the forced continuation that follows a block. </w:t>
+        <w:t xml:space="preserve"> is not on Git Bash's </w:t>
+      </w:r>
+      <w:r>
+        <w:rPr>
+          <w:rStyle w:val="SourceText"/>
+        </w:rPr>
+        <w:t>PATH</w:t>
+      </w:r>
+      <w:r>
+        <w:rPr>
+          <w:rStyle w:val="Strong"/>
+        </w:rPr>
+        <w:t>.</w:t>
+      </w:r>
+      <w:r>
+        <w:rPr/>
+        <w:t xml:space="preserve"> Every script that shells out to PowerShell names it by an absolute path or resolves it explicitly; a bare </w:t>
+      </w:r>
+      <w:r>
+        <w:rPr>
+          <w:rStyle w:val="SourceText"/>
+        </w:rPr>
+        <w:t>pwsh</w:t>
+      </w:r>
+      <w:r>
+        <w:rPr/>
+        <w:t xml:space="preserve"> in a hand-typed command fails as "command not found", which is easy to misread as PowerShell itself being broken. </w:t>
       </w:r>
     </w:p>
     <w:p>
@@ -8798,6 +8910,263 @@
         <w:numPr>
           <w:ilvl w:val="0"/>
           <w:numId w:val="17"/>
+        </w:numPr>
+        <w:tabs>
+          <w:tab w:val="clear" w:pos="1134"/>
+          <w:tab w:val="left" w:pos="829" w:leader="none"/>
+        </w:tabs>
+        <w:bidi w:val="0"/>
+        <w:spacing w:before="120" w:after="0"/>
+        <w:ind w:hanging="283" w:left="829"/>
+        <w:jc w:val="left"/>
+        <w:rPr/>
+      </w:pPr>
+      <w:r>
+        <w:rPr>
+          <w:rStyle w:val="Strong"/>
+        </w:rPr>
+        <w:t xml:space="preserve">Git Bash ships without </w:t>
+      </w:r>
+      <w:r>
+        <w:rPr>
+          <w:rStyle w:val="SourceText"/>
+        </w:rPr>
+        <w:t>python3</w:t>
+      </w:r>
+      <w:r>
+        <w:rPr>
+          <w:rStyle w:val="Strong"/>
+        </w:rPr>
+        <w:t>.</w:t>
+      </w:r>
+      <w:r>
+        <w:rPr/>
+        <w:t xml:space="preserve"> Every hook wrapper here resolves </w:t>
+      </w:r>
+      <w:r>
+        <w:rPr>
+          <w:rStyle w:val="SourceText"/>
+        </w:rPr>
+        <w:t>python3</w:t>
+      </w:r>
+      <w:r>
+        <w:rPr/>
+        <w:t xml:space="preserve">, then </w:t>
+      </w:r>
+      <w:r>
+        <w:rPr>
+          <w:rStyle w:val="SourceText"/>
+        </w:rPr>
+        <w:t>python</w:t>
+      </w:r>
+      <w:r>
+        <w:rPr/>
+        <w:t xml:space="preserve">, then </w:t>
+      </w:r>
+      <w:r>
+        <w:rPr>
+          <w:rStyle w:val="SourceText"/>
+        </w:rPr>
+        <w:t>py</w:t>
+      </w:r>
+      <w:r>
+        <w:rPr/>
+        <w:t xml:space="preserve">, and fails loudly on stderr rather than silently standing down when none resolves (see "no-python fail-closed", above). If a hook you expect to run says nothing at all, check for a usable Python on </w:t>
+      </w:r>
+      <w:r>
+        <w:rPr>
+          <w:rStyle w:val="SourceText"/>
+        </w:rPr>
+        <w:t>PATH</w:t>
+      </w:r>
+      <w:r>
+        <w:rPr/>
+        <w:t xml:space="preserve"> first. </w:t>
+      </w:r>
+    </w:p>
+    <w:p>
+      <w:pPr>
+        <w:pStyle w:val="BodyText"/>
+        <w:numPr>
+          <w:ilvl w:val="0"/>
+          <w:numId w:val="17"/>
+        </w:numPr>
+        <w:tabs>
+          <w:tab w:val="clear" w:pos="1134"/>
+          <w:tab w:val="left" w:pos="829" w:leader="none"/>
+        </w:tabs>
+        <w:bidi w:val="0"/>
+        <w:ind w:hanging="283" w:left="829"/>
+        <w:jc w:val="left"/>
+        <w:rPr/>
+      </w:pPr>
+      <w:r>
+        <w:rPr>
+          <w:rStyle w:val="Strong"/>
+        </w:rPr>
+        <w:t>Both flavours are always registered.</w:t>
+      </w:r>
+      <w:r>
+        <w:rPr/>
+        <w:t xml:space="preserve"> </w:t>
+      </w:r>
+      <w:r>
+        <w:rPr>
+          <w:rStyle w:val="SourceText"/>
+        </w:rPr>
+        <w:t>hooks.json</w:t>
+      </w:r>
+      <w:r>
+        <w:rPr/>
+        <w:t xml:space="preserve"> pairs every bash command with a </w:t>
+      </w:r>
+      <w:r>
+        <w:rPr>
+          <w:rStyle w:val="SourceText"/>
+        </w:rPr>
+        <w:t>shell: "powershell"</w:t>
+      </w:r>
+      <w:r>
+        <w:rPr/>
+        <w:t xml:space="preserve"> sibling on the same event, so a machine with both </w:t>
+      </w:r>
+      <w:r>
+        <w:rPr>
+          <w:rStyle w:val="SourceText"/>
+        </w:rPr>
+        <w:t>bash</w:t>
+      </w:r>
+      <w:r>
+        <w:rPr/>
+        <w:t xml:space="preserve"> and </w:t>
+      </w:r>
+      <w:r>
+        <w:rPr>
+          <w:rStyle w:val="SourceText"/>
+        </w:rPr>
+        <w:t>pwsh</w:t>
+      </w:r>
+      <w:r>
+        <w:rPr/>
+        <w:t xml:space="preserve"> present runs both. This is not double-firing to fix — it is how the same hook reaches both shells; each PowerShell twin stands itself down on the wrong platform (</w:t>
+      </w:r>
+      <w:r>
+        <w:rPr>
+          <w:rStyle w:val="SourceText"/>
+        </w:rPr>
+        <w:t>$env:OS -ne 'Windows_NT'</w:t>
+      </w:r>
+      <w:r>
+        <w:rPr/>
+        <w:t xml:space="preserve">) rather than the bash twin doing that job. </w:t>
+      </w:r>
+    </w:p>
+    <w:p>
+      <w:pPr>
+        <w:pStyle w:val="Heading2"/>
+        <w:bidi w:val="0"/>
+        <w:ind w:hanging="0" w:left="0" w:right="0"/>
+        <w:jc w:val="left"/>
+        <w:rPr/>
+      </w:pPr>
+      <w:bookmarkStart w:id="13" w:name="auto-wrap-up-auto-clear-and-auto-resume"/>
+      <w:bookmarkEnd w:id="13"/>
+      <w:r>
+        <w:rPr/>
+        <w:t>Auto Wrap-Up, Auto-Clear and Auto-Resume</w:t>
+      </w:r>
+    </w:p>
+    <w:p>
+      <w:pPr>
+        <w:pStyle w:val="BodyText"/>
+        <w:bidi w:val="0"/>
+        <w:jc w:val="left"/>
+        <w:rPr/>
+      </w:pPr>
+      <w:r>
+        <w:rPr/>
+        <w:t>This section is folded into the troubleshooting guide (</w:t>
+      </w:r>
+      <w:r>
+        <w:rPr>
+          <w:rStyle w:val="SourceText"/>
+        </w:rPr>
+        <w:t>troubleshooting.md</w:t>
+      </w:r>
+      <w:r>
+        <w:rPr/>
+        <w:t>), linked from it as "Auto wrap-up, clear and resume". It covers the cycle that lets a long session finish itself cleanly, clear, and pick up where it stopped.</w:t>
+      </w:r>
+    </w:p>
+    <w:p>
+      <w:pPr>
+        <w:pStyle w:val="Heading3"/>
+        <w:bidi w:val="0"/>
+        <w:ind w:hanging="0" w:left="0" w:right="0"/>
+        <w:jc w:val="left"/>
+        <w:rPr/>
+      </w:pPr>
+      <w:bookmarkStart w:id="14" w:name="what-the-cycle-does"/>
+      <w:bookmarkEnd w:id="14"/>
+      <w:r>
+        <w:rPr/>
+        <w:t>What the Cycle Does</w:t>
+      </w:r>
+    </w:p>
+    <w:p>
+      <w:pPr>
+        <w:pStyle w:val="BodyText"/>
+        <w:numPr>
+          <w:ilvl w:val="0"/>
+          <w:numId w:val="18"/>
+        </w:numPr>
+        <w:tabs>
+          <w:tab w:val="clear" w:pos="1134"/>
+          <w:tab w:val="left" w:pos="829" w:leader="none"/>
+        </w:tabs>
+        <w:bidi w:val="0"/>
+        <w:spacing w:before="120" w:after="0"/>
+        <w:ind w:hanging="283" w:left="829"/>
+        <w:jc w:val="left"/>
+        <w:rPr/>
+      </w:pPr>
+      <w:r>
+        <w:rPr>
+          <w:rStyle w:val="Strong"/>
+        </w:rPr>
+        <w:t>Wrap-up.</w:t>
+      </w:r>
+      <w:r>
+        <w:rPr/>
+        <w:t xml:space="preserve"> When the context window crosses its threshold, the </w:t>
+      </w:r>
+      <w:r>
+        <w:rPr>
+          <w:rStyle w:val="SourceText"/>
+        </w:rPr>
+        <w:t>Stop</w:t>
+      </w:r>
+      <w:r>
+        <w:rPr/>
+        <w:t xml:space="preserve"> hook blocks once. It asks the session to finish or park the change in flight, write </w:t>
+      </w:r>
+      <w:r>
+        <w:rPr>
+          <w:rStyle w:val="SourceText"/>
+        </w:rPr>
+        <w:t>.work/HANDOFF.md</w:t>
+      </w:r>
+      <w:r>
+        <w:rPr/>
+        <w:t xml:space="preserve">, and update the ticket. This happens once for each threshold crossing in each session. It never happens on the forced continuation that follows a block. </w:t>
+      </w:r>
+    </w:p>
+    <w:p>
+      <w:pPr>
+        <w:pStyle w:val="BodyText"/>
+        <w:numPr>
+          <w:ilvl w:val="0"/>
+          <w:numId w:val="18"/>
         </w:numPr>
         <w:tabs>
           <w:tab w:val="clear" w:pos="1134"/>
@@ -10844,7 +11213,7 @@
         <w:pStyle w:val="BodyText"/>
         <w:numPr>
           <w:ilvl w:val="0"/>
-          <w:numId w:val="18"/>
+          <w:numId w:val="19"/>
         </w:numPr>
         <w:tabs>
           <w:tab w:val="clear" w:pos="1134"/>
@@ -10886,7 +11255,7 @@
         <w:pStyle w:val="BodyText"/>
         <w:numPr>
           <w:ilvl w:val="0"/>
-          <w:numId w:val="18"/>
+          <w:numId w:val="19"/>
         </w:numPr>
         <w:tabs>
           <w:tab w:val="clear" w:pos="1134"/>
@@ -10908,7 +11277,7 @@
         <w:pStyle w:val="BodyText"/>
         <w:numPr>
           <w:ilvl w:val="0"/>
-          <w:numId w:val="18"/>
+          <w:numId w:val="19"/>
         </w:numPr>
         <w:tabs>
           <w:tab w:val="clear" w:pos="1134"/>
@@ -10960,7 +11329,7 @@
         <w:pStyle w:val="BodyText"/>
         <w:numPr>
           <w:ilvl w:val="0"/>
-          <w:numId w:val="18"/>
+          <w:numId w:val="19"/>
         </w:numPr>
         <w:tabs>
           <w:tab w:val="clear" w:pos="1134"/>
@@ -10982,7 +11351,7 @@
         <w:pStyle w:val="BodyText"/>
         <w:numPr>
           <w:ilvl w:val="0"/>
-          <w:numId w:val="18"/>
+          <w:numId w:val="19"/>
         </w:numPr>
         <w:tabs>
           <w:tab w:val="clear" w:pos="1134"/>
@@ -11034,7 +11403,7 @@
         <w:pStyle w:val="BodyText"/>
         <w:numPr>
           <w:ilvl w:val="0"/>
-          <w:numId w:val="18"/>
+          <w:numId w:val="19"/>
         </w:numPr>
         <w:tabs>
           <w:tab w:val="clear" w:pos="1134"/>
@@ -12806,7 +13175,7 @@
         <w:pStyle w:val="BodyText"/>
         <w:numPr>
           <w:ilvl w:val="0"/>
-          <w:numId w:val="19"/>
+          <w:numId w:val="20"/>
         </w:numPr>
         <w:tabs>
           <w:tab w:val="clear" w:pos="1134"/>
@@ -12844,7 +13213,7 @@
         <w:pStyle w:val="BodyText"/>
         <w:numPr>
           <w:ilvl w:val="0"/>
-          <w:numId w:val="19"/>
+          <w:numId w:val="20"/>
         </w:numPr>
         <w:tabs>
           <w:tab w:val="clear" w:pos="1134"/>
@@ -12904,7 +13273,7 @@
         <w:pStyle w:val="BodyText"/>
         <w:numPr>
           <w:ilvl w:val="0"/>
-          <w:numId w:val="19"/>
+          <w:numId w:val="20"/>
         </w:numPr>
         <w:tabs>
           <w:tab w:val="clear" w:pos="1134"/>
@@ -15171,8 +15540,8 @@
   <w:abstractNum w:abstractNumId="17">
     <w:lvl w:ilvl="0">
       <w:start w:val="1"/>
-      <w:numFmt w:val="decimal"/>
-      <w:lvlText w:val="%1."/>
+      <w:numFmt w:val="bullet"/>
+      <w:lvlText w:val=""/>
       <w:lvlJc w:val="left"/>
       <w:pPr>
         <w:tabs>
@@ -15180,12 +15549,14 @@
         </w:tabs>
         <w:ind w:left="709" w:hanging="283"/>
       </w:pPr>
-      <w:rPr/>
+      <w:rPr>
+        <w:rFonts w:ascii="Symbol" w:hAnsi="Symbol" w:cs="Symbol" w:hint="default"/>
+      </w:rPr>
     </w:lvl>
     <w:lvl w:ilvl="1">
       <w:start w:val="1"/>
-      <w:numFmt w:val="decimal"/>
-      <w:lvlText w:val="%2."/>
+      <w:numFmt w:val="bullet"/>
+      <w:lvlText w:val=""/>
       <w:lvlJc w:val="left"/>
       <w:pPr>
         <w:tabs>
@@ -15193,12 +15564,14 @@
         </w:tabs>
         <w:ind w:left="1418" w:hanging="283"/>
       </w:pPr>
-      <w:rPr/>
+      <w:rPr>
+        <w:rFonts w:ascii="Symbol" w:hAnsi="Symbol" w:cs="Symbol" w:hint="default"/>
+      </w:rPr>
     </w:lvl>
     <w:lvl w:ilvl="2">
       <w:start w:val="1"/>
-      <w:numFmt w:val="decimal"/>
-      <w:lvlText w:val="%3."/>
+      <w:numFmt w:val="bullet"/>
+      <w:lvlText w:val=""/>
       <w:lvlJc w:val="left"/>
       <w:pPr>
         <w:tabs>
@@ -15206,12 +15579,14 @@
         </w:tabs>
         <w:ind w:left="2127" w:hanging="283"/>
       </w:pPr>
-      <w:rPr/>
+      <w:rPr>
+        <w:rFonts w:ascii="Symbol" w:hAnsi="Symbol" w:cs="Symbol" w:hint="default"/>
+      </w:rPr>
     </w:lvl>
     <w:lvl w:ilvl="3">
       <w:start w:val="1"/>
-      <w:numFmt w:val="decimal"/>
-      <w:lvlText w:val="%4."/>
+      <w:numFmt w:val="bullet"/>
+      <w:lvlText w:val=""/>
       <w:lvlJc w:val="left"/>
       <w:pPr>
         <w:tabs>
@@ -15219,12 +15594,14 @@
         </w:tabs>
         <w:ind w:left="2836" w:hanging="283"/>
       </w:pPr>
-      <w:rPr/>
+      <w:rPr>
+        <w:rFonts w:ascii="Symbol" w:hAnsi="Symbol" w:cs="Symbol" w:hint="default"/>
+      </w:rPr>
     </w:lvl>
     <w:lvl w:ilvl="4">
       <w:start w:val="1"/>
-      <w:numFmt w:val="decimal"/>
-      <w:lvlText w:val="%5."/>
+      <w:numFmt w:val="bullet"/>
+      <w:lvlText w:val=""/>
       <w:lvlJc w:val="left"/>
       <w:pPr>
         <w:tabs>
@@ -15232,12 +15609,14 @@
         </w:tabs>
         <w:ind w:left="3545" w:hanging="283"/>
       </w:pPr>
-      <w:rPr/>
+      <w:rPr>
+        <w:rFonts w:ascii="Symbol" w:hAnsi="Symbol" w:cs="Symbol" w:hint="default"/>
+      </w:rPr>
     </w:lvl>
     <w:lvl w:ilvl="5">
       <w:start w:val="1"/>
-      <w:numFmt w:val="decimal"/>
-      <w:lvlText w:val="%6."/>
+      <w:numFmt w:val="bullet"/>
+      <w:lvlText w:val=""/>
       <w:lvlJc w:val="left"/>
       <w:pPr>
         <w:tabs>
@@ -15245,12 +15624,14 @@
         </w:tabs>
         <w:ind w:left="4254" w:hanging="283"/>
       </w:pPr>
-      <w:rPr/>
+      <w:rPr>
+        <w:rFonts w:ascii="Symbol" w:hAnsi="Symbol" w:cs="Symbol" w:hint="default"/>
+      </w:rPr>
     </w:lvl>
     <w:lvl w:ilvl="6">
       <w:start w:val="1"/>
-      <w:numFmt w:val="decimal"/>
-      <w:lvlText w:val="%7."/>
+      <w:numFmt w:val="bullet"/>
+      <w:lvlText w:val=""/>
       <w:lvlJc w:val="left"/>
       <w:pPr>
         <w:tabs>
@@ -15258,12 +15639,14 @@
         </w:tabs>
         <w:ind w:left="4963" w:hanging="283"/>
       </w:pPr>
-      <w:rPr/>
+      <w:rPr>
+        <w:rFonts w:ascii="Symbol" w:hAnsi="Symbol" w:cs="Symbol" w:hint="default"/>
+      </w:rPr>
     </w:lvl>
     <w:lvl w:ilvl="7">
       <w:start w:val="1"/>
-      <w:numFmt w:val="decimal"/>
-      <w:lvlText w:val="%8."/>
+      <w:numFmt w:val="bullet"/>
+      <w:lvlText w:val=""/>
       <w:lvlJc w:val="left"/>
       <w:pPr>
         <w:tabs>
@@ -15271,12 +15654,14 @@
         </w:tabs>
         <w:ind w:left="5672" w:hanging="283"/>
       </w:pPr>
-      <w:rPr/>
+      <w:rPr>
+        <w:rFonts w:ascii="Symbol" w:hAnsi="Symbol" w:cs="Symbol" w:hint="default"/>
+      </w:rPr>
     </w:lvl>
     <w:lvl w:ilvl="8">
       <w:start w:val="1"/>
-      <w:numFmt w:val="decimal"/>
-      <w:lvlText w:val="%9."/>
+      <w:numFmt w:val="bullet"/>
+      <w:lvlText w:val=""/>
       <w:lvlJc w:val="left"/>
       <w:pPr>
         <w:tabs>
@@ -15284,14 +15669,16 @@
         </w:tabs>
         <w:ind w:left="6381" w:hanging="283"/>
       </w:pPr>
-      <w:rPr/>
+      <w:rPr>
+        <w:rFonts w:ascii="Symbol" w:hAnsi="Symbol" w:cs="Symbol" w:hint="default"/>
+      </w:rPr>
     </w:lvl>
   </w:abstractNum>
   <w:abstractNum w:abstractNumId="18">
     <w:lvl w:ilvl="0">
       <w:start w:val="1"/>
-      <w:numFmt w:val="bullet"/>
-      <w:lvlText w:val=""/>
+      <w:numFmt w:val="decimal"/>
+      <w:lvlText w:val="%1."/>
       <w:lvlJc w:val="left"/>
       <w:pPr>
         <w:tabs>
@@ -15299,14 +15686,12 @@
         </w:tabs>
         <w:ind w:left="709" w:hanging="283"/>
       </w:pPr>
-      <w:rPr>
-        <w:rFonts w:ascii="Symbol" w:hAnsi="Symbol" w:cs="Symbol" w:hint="default"/>
-      </w:rPr>
+      <w:rPr/>
     </w:lvl>
     <w:lvl w:ilvl="1">
       <w:start w:val="1"/>
-      <w:numFmt w:val="bullet"/>
-      <w:lvlText w:val=""/>
+      <w:numFmt w:val="decimal"/>
+      <w:lvlText w:val="%2."/>
       <w:lvlJc w:val="left"/>
       <w:pPr>
         <w:tabs>
@@ -15314,14 +15699,12 @@
         </w:tabs>
         <w:ind w:left="1418" w:hanging="283"/>
       </w:pPr>
-      <w:rPr>
-        <w:rFonts w:ascii="Symbol" w:hAnsi="Symbol" w:cs="Symbol" w:hint="default"/>
-      </w:rPr>
+      <w:rPr/>
     </w:lvl>
     <w:lvl w:ilvl="2">
       <w:start w:val="1"/>
-      <w:numFmt w:val="bullet"/>
-      <w:lvlText w:val=""/>
+      <w:numFmt w:val="decimal"/>
+      <w:lvlText w:val="%3."/>
       <w:lvlJc w:val="left"/>
       <w:pPr>
         <w:tabs>
@@ -15329,14 +15712,12 @@
         </w:tabs>
         <w:ind w:left="2127" w:hanging="283"/>
       </w:pPr>
-      <w:rPr>
-        <w:rFonts w:ascii="Symbol" w:hAnsi="Symbol" w:cs="Symbol" w:hint="default"/>
-      </w:rPr>
+      <w:rPr/>
     </w:lvl>
     <w:lvl w:ilvl="3">
       <w:start w:val="1"/>
-      <w:numFmt w:val="bullet"/>
-      <w:lvlText w:val=""/>
+      <w:numFmt w:val="decimal"/>
+      <w:lvlText w:val="%4."/>
       <w:lvlJc w:val="left"/>
       <w:pPr>
         <w:tabs>
@@ -15344,14 +15725,12 @@
         </w:tabs>
         <w:ind w:left="2836" w:hanging="283"/>
       </w:pPr>
-      <w:rPr>
-        <w:rFonts w:ascii="Symbol" w:hAnsi="Symbol" w:cs="Symbol" w:hint="default"/>
-      </w:rPr>
+      <w:rPr/>
     </w:lvl>
     <w:lvl w:ilvl="4">
       <w:start w:val="1"/>
-      <w:numFmt w:val="bullet"/>
-      <w:lvlText w:val=""/>
+      <w:numFmt w:val="decimal"/>
+      <w:lvlText w:val="%5."/>
       <w:lvlJc w:val="left"/>
       <w:pPr>
         <w:tabs>
@@ -15359,14 +15738,12 @@
         </w:tabs>
         <w:ind w:left="3545" w:hanging="283"/>
       </w:pPr>
-      <w:rPr>
-        <w:rFonts w:ascii="Symbol" w:hAnsi="Symbol" w:cs="Symbol" w:hint="default"/>
-      </w:rPr>
+      <w:rPr/>
     </w:lvl>
     <w:lvl w:ilvl="5">
       <w:start w:val="1"/>
-      <w:numFmt w:val="bullet"/>
-      <w:lvlText w:val=""/>
+      <w:numFmt w:val="decimal"/>
+      <w:lvlText w:val="%6."/>
       <w:lvlJc w:val="left"/>
       <w:pPr>
         <w:tabs>
@@ -15374,14 +15751,12 @@
         </w:tabs>
         <w:ind w:left="4254" w:hanging="283"/>
       </w:pPr>
-      <w:rPr>
-        <w:rFonts w:ascii="Symbol" w:hAnsi="Symbol" w:cs="Symbol" w:hint="default"/>
-      </w:rPr>
+      <w:rPr/>
     </w:lvl>
     <w:lvl w:ilvl="6">
       <w:start w:val="1"/>
-      <w:numFmt w:val="bullet"/>
-      <w:lvlText w:val=""/>
+      <w:numFmt w:val="decimal"/>
+      <w:lvlText w:val="%7."/>
       <w:lvlJc w:val="left"/>
       <w:pPr>
         <w:tabs>
@@ -15389,14 +15764,12 @@
         </w:tabs>
         <w:ind w:left="4963" w:hanging="283"/>
       </w:pPr>
-      <w:rPr>
-        <w:rFonts w:ascii="Symbol" w:hAnsi="Symbol" w:cs="Symbol" w:hint="default"/>
-      </w:rPr>
+      <w:rPr/>
     </w:lvl>
     <w:lvl w:ilvl="7">
       <w:start w:val="1"/>
-      <w:numFmt w:val="bullet"/>
-      <w:lvlText w:val=""/>
+      <w:numFmt w:val="decimal"/>
+      <w:lvlText w:val="%8."/>
       <w:lvlJc w:val="left"/>
       <w:pPr>
         <w:tabs>
@@ -15404,14 +15777,12 @@
         </w:tabs>
         <w:ind w:left="5672" w:hanging="283"/>
       </w:pPr>
-      <w:rPr>
-        <w:rFonts w:ascii="Symbol" w:hAnsi="Symbol" w:cs="Symbol" w:hint="default"/>
-      </w:rPr>
+      <w:rPr/>
     </w:lvl>
     <w:lvl w:ilvl="8">
       <w:start w:val="1"/>
-      <w:numFmt w:val="bullet"/>
-      <w:lvlText w:val=""/>
+      <w:numFmt w:val="decimal"/>
+      <w:lvlText w:val="%9."/>
       <w:lvlJc w:val="left"/>
       <w:pPr>
         <w:tabs>
@@ -15419,9 +15790,7 @@
         </w:tabs>
         <w:ind w:left="6381" w:hanging="283"/>
       </w:pPr>
-      <w:rPr>
-        <w:rFonts w:ascii="Symbol" w:hAnsi="Symbol" w:cs="Symbol" w:hint="default"/>
-      </w:rPr>
+      <w:rPr/>
     </w:lvl>
   </w:abstractNum>
   <w:abstractNum w:abstractNumId="19">
@@ -15562,6 +15931,143 @@
     </w:lvl>
   </w:abstractNum>
   <w:abstractNum w:abstractNumId="20">
+    <w:lvl w:ilvl="0">
+      <w:start w:val="1"/>
+      <w:numFmt w:val="bullet"/>
+      <w:lvlText w:val=""/>
+      <w:lvlJc w:val="left"/>
+      <w:pPr>
+        <w:tabs>
+          <w:tab w:val="num" w:pos="709"/>
+        </w:tabs>
+        <w:ind w:left="709" w:hanging="283"/>
+      </w:pPr>
+      <w:rPr>
+        <w:rFonts w:ascii="Symbol" w:hAnsi="Symbol" w:cs="Symbol" w:hint="default"/>
+      </w:rPr>
+    </w:lvl>
+    <w:lvl w:ilvl="1">
+      <w:start w:val="1"/>
+      <w:numFmt w:val="bullet"/>
+      <w:lvlText w:val=""/>
+      <w:lvlJc w:val="left"/>
+      <w:pPr>
+        <w:tabs>
+          <w:tab w:val="num" w:pos="1418"/>
+        </w:tabs>
+        <w:ind w:left="1418" w:hanging="283"/>
+      </w:pPr>
+      <w:rPr>
+        <w:rFonts w:ascii="Symbol" w:hAnsi="Symbol" w:cs="Symbol" w:hint="default"/>
+      </w:rPr>
+    </w:lvl>
+    <w:lvl w:ilvl="2">
+      <w:start w:val="1"/>
+      <w:numFmt w:val="bullet"/>
+      <w:lvlText w:val=""/>
+      <w:lvlJc w:val="left"/>
+      <w:pPr>
+        <w:tabs>
+          <w:tab w:val="num" w:pos="2127"/>
+        </w:tabs>
+        <w:ind w:left="2127" w:hanging="283"/>
+      </w:pPr>
+      <w:rPr>
+        <w:rFonts w:ascii="Symbol" w:hAnsi="Symbol" w:cs="Symbol" w:hint="default"/>
+      </w:rPr>
+    </w:lvl>
+    <w:lvl w:ilvl="3">
+      <w:start w:val="1"/>
+      <w:numFmt w:val="bullet"/>
+      <w:lvlText w:val=""/>
+      <w:lvlJc w:val="left"/>
+      <w:pPr>
+        <w:tabs>
+          <w:tab w:val="num" w:pos="2836"/>
+        </w:tabs>
+        <w:ind w:left="2836" w:hanging="283"/>
+      </w:pPr>
+      <w:rPr>
+        <w:rFonts w:ascii="Symbol" w:hAnsi="Symbol" w:cs="Symbol" w:hint="default"/>
+      </w:rPr>
+    </w:lvl>
+    <w:lvl w:ilvl="4">
+      <w:start w:val="1"/>
+      <w:numFmt w:val="bullet"/>
+      <w:lvlText w:val=""/>
+      <w:lvlJc w:val="left"/>
+      <w:pPr>
+        <w:tabs>
+          <w:tab w:val="num" w:pos="3545"/>
+        </w:tabs>
+        <w:ind w:left="3545" w:hanging="283"/>
+      </w:pPr>
+      <w:rPr>
+        <w:rFonts w:ascii="Symbol" w:hAnsi="Symbol" w:cs="Symbol" w:hint="default"/>
+      </w:rPr>
+    </w:lvl>
+    <w:lvl w:ilvl="5">
+      <w:start w:val="1"/>
+      <w:numFmt w:val="bullet"/>
+      <w:lvlText w:val=""/>
+      <w:lvlJc w:val="left"/>
+      <w:pPr>
+        <w:tabs>
+          <w:tab w:val="num" w:pos="4254"/>
+        </w:tabs>
+        <w:ind w:left="4254" w:hanging="283"/>
+      </w:pPr>
+      <w:rPr>
+        <w:rFonts w:ascii="Symbol" w:hAnsi="Symbol" w:cs="Symbol" w:hint="default"/>
+      </w:rPr>
+    </w:lvl>
+    <w:lvl w:ilvl="6">
+      <w:start w:val="1"/>
+      <w:numFmt w:val="bullet"/>
+      <w:lvlText w:val=""/>
+      <w:lvlJc w:val="left"/>
+      <w:pPr>
+        <w:tabs>
+          <w:tab w:val="num" w:pos="4963"/>
+        </w:tabs>
+        <w:ind w:left="4963" w:hanging="283"/>
+      </w:pPr>
+      <w:rPr>
+        <w:rFonts w:ascii="Symbol" w:hAnsi="Symbol" w:cs="Symbol" w:hint="default"/>
+      </w:rPr>
+    </w:lvl>
+    <w:lvl w:ilvl="7">
+      <w:start w:val="1"/>
+      <w:numFmt w:val="bullet"/>
+      <w:lvlText w:val=""/>
+      <w:lvlJc w:val="left"/>
+      <w:pPr>
+        <w:tabs>
+          <w:tab w:val="num" w:pos="5672"/>
+        </w:tabs>
+        <w:ind w:left="5672" w:hanging="283"/>
+      </w:pPr>
+      <w:rPr>
+        <w:rFonts w:ascii="Symbol" w:hAnsi="Symbol" w:cs="Symbol" w:hint="default"/>
+      </w:rPr>
+    </w:lvl>
+    <w:lvl w:ilvl="8">
+      <w:start w:val="1"/>
+      <w:numFmt w:val="bullet"/>
+      <w:lvlText w:val=""/>
+      <w:lvlJc w:val="left"/>
+      <w:pPr>
+        <w:tabs>
+          <w:tab w:val="num" w:pos="6381"/>
+        </w:tabs>
+        <w:ind w:left="6381" w:hanging="283"/>
+      </w:pPr>
+      <w:rPr>
+        <w:rFonts w:ascii="Symbol" w:hAnsi="Symbol" w:cs="Symbol" w:hint="default"/>
+      </w:rPr>
+    </w:lvl>
+  </w:abstractNum>
+  <w:abstractNum w:abstractNumId="21">
     <w:lvl w:ilvl="0">
       <w:start w:val="1"/>
       <w:numFmt w:val="none"/>
@@ -15742,6 +16248,9 @@
   </w:num>
   <w:num w:numId="20">
     <w:abstractNumId w:val="20"/>
+  </w:num>
+  <w:num w:numId="21">
+    <w:abstractNumId w:val="21"/>
   </w:num>
 </w:numbering>
 </file>

</xml_diff>

<commit_message>
T-0088: rebuild the troubleshooting and working-with-codex guides (HTML, DOCX, PDF) after the review round 1 doc fixes
</commit_message>
<xml_diff>
--- a/docs/guides/crew/crew-1.0-troubleshooting.docx
+++ b/docs/guides/crew/crew-1.0-troubleshooting.docx
@@ -3457,27 +3457,27 @@
       </w:r>
       <w:r>
         <w:rPr/>
-        <w:t xml:space="preserve"> </w:t>
-      </w:r>
-      <w:r>
-        <w:rPr>
-          <w:rStyle w:val="SourceText"/>
-        </w:rPr>
-        <w:t>/crew:review</w:t>
-      </w:r>
-      <w:r>
-        <w:rPr/>
-        <w:t xml:space="preserve"> said </w:t>
-      </w:r>
-      <w:r>
-        <w:rPr>
-          <w:rStyle w:val="SourceText"/>
-        </w:rPr>
-        <w:t>codex probe: limited</w:t>
-      </w:r>
-      <w:r>
-        <w:rPr/>
-        <w:t xml:space="preserve"> or printed </w:t>
+        <w:t xml:space="preserve"> The probe printed </w:t>
+      </w:r>
+      <w:r>
+        <w:rPr>
+          <w:rStyle w:val="SourceText"/>
+        </w:rPr>
+        <w:t>PROBE=limited</w:t>
+      </w:r>
+      <w:r>
+        <w:rPr/>
+        <w:t xml:space="preserve"> (exit 5) with the error on </w:t>
+      </w:r>
+      <w:r>
+        <w:rPr>
+          <w:rStyle w:val="SourceText"/>
+        </w:rPr>
+        <w:t>PROBE_DETAIL=...</w:t>
+      </w:r>
+      <w:r>
+        <w:rPr/>
+        <w:t xml:space="preserve">, or a round printed </w:t>
       </w:r>
       <w:r>
         <w:rPr>
@@ -3523,7 +3523,7 @@
         <w:rPr>
           <w:rStyle w:val="SourceText"/>
         </w:rPr>
-        <w:t>&lt;git-common-dir&gt;/crew/review/&lt;ticket&gt;.limit.json</w:t>
+        <w:t>&lt;git-common-dir&gt;/crew/review-limit/&lt;ticket&gt;.json</w:t>
       </w:r>
       <w:r>
         <w:rPr/>
@@ -3887,11 +3887,31 @@
         <w:rPr>
           <w:rStyle w:val="SourceText"/>
         </w:rPr>
+        <w:t>/crew:status</w:t>
+      </w:r>
+      <w:r>
+        <w:rPr/>
+        <w:t xml:space="preserve"> names that case: </w:t>
+      </w:r>
+      <w:r>
+        <w:rPr>
+          <w:rStyle w:val="SourceText"/>
+        </w:rPr>
+        <w:t>... the main checkout's (&lt;path&gt;) is not read ...</w:t>
+      </w:r>
+      <w:r>
+        <w:rPr/>
+        <w:t xml:space="preserve">. A lane made before 1.0.55 almost always has one, a default that crew's SessionStart heal wrote there. </w:t>
+      </w:r>
+      <w:r>
+        <w:rPr>
+          <w:rStyle w:val="SourceText"/>
+        </w:rPr>
         <w:t>(unknown)</w:t>
       </w:r>
       <w:r>
         <w:rPr/>
-        <w:t xml:space="preserve"> means git could not name the main checkout. The shell and PowerShell readers (</w:t>
+        <w:t xml:space="preserve"> means git could not name the main checkout; then no default is written either. The shell and PowerShell readers (</w:t>
       </w:r>
       <w:r>
         <w:rPr>

</xml_diff>

<commit_message>
crew 1.0.56: T-0088 re-bumped for its review round 1 fixes (1.0.55 was never on main); current-version mentions and the troubleshooting guide follow
</commit_message>
<xml_diff>
--- a/docs/guides/crew/crew-1.0-troubleshooting.docx
+++ b/docs/guides/crew/crew-1.0-troubleshooting.docx
@@ -3831,7 +3831,7 @@
       </w:r>
       <w:r>
         <w:rPr/>
-        <w:t xml:space="preserve"> (crew 1.0.55+, T-0088), and </w:t>
+        <w:t xml:space="preserve"> (crew 1.0.56+, T-0088), and </w:t>
       </w:r>
       <w:r>
         <w:rPr>
@@ -3901,7 +3901,7 @@
       </w:r>
       <w:r>
         <w:rPr/>
-        <w:t xml:space="preserve">. A lane made before 1.0.55 almost always has one, a default that crew's SessionStart heal wrote there. </w:t>
+        <w:t xml:space="preserve">. A lane made before 1.0.56 almost always has one, a default that crew's SessionStart heal wrote there. </w:t>
       </w:r>
       <w:r>
         <w:rPr>

</xml_diff>

<commit_message>
T-0100 docs: troubleshooting guide rebuilt after the merge of main (DOCX, PDF; HTML unchanged; LibreOffice 26.2.5.2, not Word)
</commit_message>
<xml_diff>
--- a/docs/guides/crew/crew-1.0-troubleshooting.docx
+++ b/docs/guides/crew/crew-1.0-troubleshooting.docx
@@ -3991,7 +3991,27 @@
       </w:r>
       <w:r>
         <w:rPr/>
-        <w:t xml:space="preserve"> — the commit the ticket started from) across committed, staged, unstaged and untracked changes, so a shell-made write is caught here even though nothing blocked it at the time. </w:t>
+        <w:t xml:space="preserve"> — the commit the ticket started from) across committed, staged, unstaged and untracked changes, so a shell-made write is caught here even though nothing blocked it at the time. A file byte-identical to main as last merged is not counted; a </w:t>
+      </w:r>
+      <w:r>
+        <w:rPr>
+          <w:rStyle w:val="SourceText"/>
+        </w:rPr>
+        <w:t>merged main: could not tell</w:t>
+      </w:r>
+      <w:r>
+        <w:rPr/>
+        <w:t xml:space="preserve"> line (detached HEAD, no </w:t>
+      </w:r>
+      <w:r>
+        <w:rPr>
+          <w:rStyle w:val="SourceText"/>
+        </w:rPr>
+        <w:t>origin/main</w:t>
+      </w:r>
+      <w:r>
+        <w:rPr/>
+        <w:t xml:space="preserve">) means every merged-in file was counted, so check out the ticket branch and rerun. </w:t>
       </w:r>
       <w:r>
         <w:rPr>

</xml_diff>

<commit_message>
T-0010: re-measure BUDGETS.md (19,494 lines / 128 files) and rebuild the troubleshooting guide after merging e878cc31
troubleshooting.md and auto-cycle.md merged both sides; build.py --guide troubleshooting
reproduces the merged HTML byte-identically and rewrites the DOCX and PDF (LibreOffice).
</commit_message>
<xml_diff>
--- a/docs/guides/crew/crew-1.0-troubleshooting.docx
+++ b/docs/guides/crew/crew-1.0-troubleshooting.docx
@@ -3755,7 +3755,37 @@
       </w:r>
       <w:r>
         <w:rPr/>
-        <w:t xml:space="preserve">. </w:t>
+        <w:t xml:space="preserve">, and an </w:t>
+      </w:r>
+      <w:r>
+        <w:rPr>
+          <w:rStyle w:val="SourceText"/>
+        </w:rPr>
+        <w:t>autopilot</w:t>
+      </w:r>
+      <w:r>
+        <w:rPr/>
+        <w:t xml:space="preserve"> receipt (from </w:t>
+      </w:r>
+      <w:r>
+        <w:rPr>
+          <w:rStyle w:val="SourceText"/>
+        </w:rPr>
+        <w:t>crew_autopilot.py approve</w:t>
+      </w:r>
+      <w:r>
+        <w:rPr/>
+        <w:t xml:space="preserve">) only while that is true and </w:t>
+      </w:r>
+      <w:r>
+        <w:rPr>
+          <w:rStyle w:val="SourceText"/>
+        </w:rPr>
+        <w:t>autopilot.approval</w:t>
+      </w:r>
+      <w:r>
+        <w:rPr/>
+        <w:t xml:space="preserve"> still allows it. </w:t>
       </w:r>
       <w:r>
         <w:rPr>
@@ -3775,7 +3805,27 @@
       </w:r>
       <w:r>
         <w:rPr/>
-        <w:t xml:space="preserve"> again — nothing else can write the receipt; </w:t>
+        <w:t xml:space="preserve"> again — the only other route is </w:t>
+      </w:r>
+      <w:r>
+        <w:rPr>
+          <w:rStyle w:val="SourceText"/>
+        </w:rPr>
+        <w:t>/crew:autopilot</w:t>
+      </w:r>
+      <w:r>
+        <w:rPr/>
+        <w:t xml:space="preserve"> under an opted-in </w:t>
+      </w:r>
+      <w:r>
+        <w:rPr>
+          <w:rStyle w:val="SourceText"/>
+        </w:rPr>
+        <w:t>autopilot.approval</w:t>
+      </w:r>
+      <w:r>
+        <w:rPr/>
+        <w:t xml:space="preserve">; </w:t>
       </w:r>
       <w:r>
         <w:rPr>
@@ -6494,10 +6544,10 @@
         </w:tblCellMar>
       </w:tblPr>
       <w:tblGrid>
-        <w:gridCol w:w="4654"/>
-        <w:gridCol w:w="1569"/>
-        <w:gridCol w:w="1804"/>
-        <w:gridCol w:w="3312"/>
+        <w:gridCol w:w="4621"/>
+        <w:gridCol w:w="1551"/>
+        <w:gridCol w:w="1790"/>
+        <w:gridCol w:w="3377"/>
       </w:tblGrid>
       <w:tr>
         <w:trPr>
@@ -6505,7 +6555,7 @@
         </w:trPr>
         <w:tc>
           <w:tcPr>
-            <w:tcW w:w="4654" w:type="dxa"/>
+            <w:tcW w:w="4621" w:type="dxa"/>
             <w:tcBorders/>
             <w:vAlign w:val="center"/>
           </w:tcPr>
@@ -6527,7 +6577,7 @@
         </w:tc>
         <w:tc>
           <w:tcPr>
-            <w:tcW w:w="1569" w:type="dxa"/>
+            <w:tcW w:w="1551" w:type="dxa"/>
             <w:tcBorders/>
             <w:vAlign w:val="center"/>
           </w:tcPr>
@@ -6549,7 +6599,7 @@
         </w:tc>
         <w:tc>
           <w:tcPr>
-            <w:tcW w:w="1804" w:type="dxa"/>
+            <w:tcW w:w="1790" w:type="dxa"/>
             <w:tcBorders/>
             <w:vAlign w:val="center"/>
           </w:tcPr>
@@ -6571,7 +6621,7 @@
         </w:tc>
         <w:tc>
           <w:tcPr>
-            <w:tcW w:w="3312" w:type="dxa"/>
+            <w:tcW w:w="3377" w:type="dxa"/>
             <w:tcBorders/>
             <w:vAlign w:val="center"/>
           </w:tcPr>
@@ -6596,7 +6646,7 @@
         <w:trPr/>
         <w:tc>
           <w:tcPr>
-            <w:tcW w:w="4654" w:type="dxa"/>
+            <w:tcW w:w="4621" w:type="dxa"/>
             <w:tcBorders/>
             <w:vAlign w:val="center"/>
           </w:tcPr>
@@ -6619,7 +6669,7 @@
         </w:tc>
         <w:tc>
           <w:tcPr>
-            <w:tcW w:w="1569" w:type="dxa"/>
+            <w:tcW w:w="1551" w:type="dxa"/>
             <w:tcBorders/>
             <w:vAlign w:val="center"/>
           </w:tcPr>
@@ -6640,7 +6690,7 @@
         </w:tc>
         <w:tc>
           <w:tcPr>
-            <w:tcW w:w="1804" w:type="dxa"/>
+            <w:tcW w:w="1790" w:type="dxa"/>
             <w:tcBorders/>
             <w:vAlign w:val="center"/>
           </w:tcPr>
@@ -6661,7 +6711,7 @@
         </w:tc>
         <w:tc>
           <w:tcPr>
-            <w:tcW w:w="3312" w:type="dxa"/>
+            <w:tcW w:w="3377" w:type="dxa"/>
             <w:tcBorders/>
             <w:vAlign w:val="center"/>
           </w:tcPr>
@@ -6701,7 +6751,7 @@
         <w:trPr/>
         <w:tc>
           <w:tcPr>
-            <w:tcW w:w="4654" w:type="dxa"/>
+            <w:tcW w:w="4621" w:type="dxa"/>
             <w:tcBorders/>
             <w:vAlign w:val="center"/>
           </w:tcPr>
@@ -6724,7 +6774,7 @@
         </w:tc>
         <w:tc>
           <w:tcPr>
-            <w:tcW w:w="1569" w:type="dxa"/>
+            <w:tcW w:w="1551" w:type="dxa"/>
             <w:tcBorders/>
             <w:vAlign w:val="center"/>
           </w:tcPr>
@@ -6745,7 +6795,7 @@
         </w:tc>
         <w:tc>
           <w:tcPr>
-            <w:tcW w:w="1804" w:type="dxa"/>
+            <w:tcW w:w="1790" w:type="dxa"/>
             <w:tcBorders/>
             <w:vAlign w:val="center"/>
           </w:tcPr>
@@ -6788,7 +6838,7 @@
         </w:tc>
         <w:tc>
           <w:tcPr>
-            <w:tcW w:w="3312" w:type="dxa"/>
+            <w:tcW w:w="3377" w:type="dxa"/>
             <w:tcBorders/>
             <w:vAlign w:val="center"/>
           </w:tcPr>
@@ -6818,7 +6868,7 @@
         <w:trPr/>
         <w:tc>
           <w:tcPr>
-            <w:tcW w:w="4654" w:type="dxa"/>
+            <w:tcW w:w="4621" w:type="dxa"/>
             <w:tcBorders/>
             <w:vAlign w:val="center"/>
           </w:tcPr>
@@ -6841,7 +6891,7 @@
         </w:tc>
         <w:tc>
           <w:tcPr>
-            <w:tcW w:w="1569" w:type="dxa"/>
+            <w:tcW w:w="1551" w:type="dxa"/>
             <w:tcBorders/>
             <w:vAlign w:val="center"/>
           </w:tcPr>
@@ -6862,7 +6912,7 @@
         </w:tc>
         <w:tc>
           <w:tcPr>
-            <w:tcW w:w="1804" w:type="dxa"/>
+            <w:tcW w:w="1790" w:type="dxa"/>
             <w:tcBorders/>
             <w:vAlign w:val="center"/>
           </w:tcPr>
@@ -6905,7 +6955,7 @@
         </w:tc>
         <w:tc>
           <w:tcPr>
-            <w:tcW w:w="3312" w:type="dxa"/>
+            <w:tcW w:w="3377" w:type="dxa"/>
             <w:tcBorders/>
             <w:vAlign w:val="center"/>
           </w:tcPr>
@@ -6935,7 +6985,7 @@
         <w:trPr/>
         <w:tc>
           <w:tcPr>
-            <w:tcW w:w="4654" w:type="dxa"/>
+            <w:tcW w:w="4621" w:type="dxa"/>
             <w:tcBorders/>
             <w:vAlign w:val="center"/>
           </w:tcPr>
@@ -7008,7 +7058,7 @@
         </w:tc>
         <w:tc>
           <w:tcPr>
-            <w:tcW w:w="1569" w:type="dxa"/>
+            <w:tcW w:w="1551" w:type="dxa"/>
             <w:tcBorders/>
             <w:vAlign w:val="center"/>
           </w:tcPr>
@@ -7029,7 +7079,7 @@
         </w:tc>
         <w:tc>
           <w:tcPr>
-            <w:tcW w:w="1804" w:type="dxa"/>
+            <w:tcW w:w="1790" w:type="dxa"/>
             <w:tcBorders/>
             <w:vAlign w:val="center"/>
           </w:tcPr>
@@ -7072,7 +7122,7 @@
         </w:tc>
         <w:tc>
           <w:tcPr>
-            <w:tcW w:w="3312" w:type="dxa"/>
+            <w:tcW w:w="3377" w:type="dxa"/>
             <w:tcBorders/>
             <w:vAlign w:val="center"/>
           </w:tcPr>
@@ -7106,7 +7156,7 @@
         <w:trPr/>
         <w:tc>
           <w:tcPr>
-            <w:tcW w:w="4654" w:type="dxa"/>
+            <w:tcW w:w="4621" w:type="dxa"/>
             <w:tcBorders/>
             <w:vAlign w:val="center"/>
           </w:tcPr>
@@ -7139,7 +7189,7 @@
         </w:tc>
         <w:tc>
           <w:tcPr>
-            <w:tcW w:w="1569" w:type="dxa"/>
+            <w:tcW w:w="1551" w:type="dxa"/>
             <w:tcBorders/>
             <w:vAlign w:val="center"/>
           </w:tcPr>
@@ -7160,7 +7210,7 @@
         </w:tc>
         <w:tc>
           <w:tcPr>
-            <w:tcW w:w="1804" w:type="dxa"/>
+            <w:tcW w:w="1790" w:type="dxa"/>
             <w:tcBorders/>
             <w:vAlign w:val="center"/>
           </w:tcPr>
@@ -7203,7 +7253,7 @@
         </w:tc>
         <w:tc>
           <w:tcPr>
-            <w:tcW w:w="3312" w:type="dxa"/>
+            <w:tcW w:w="3377" w:type="dxa"/>
             <w:tcBorders/>
             <w:vAlign w:val="center"/>
           </w:tcPr>
@@ -7233,7 +7283,7 @@
         <w:trPr/>
         <w:tc>
           <w:tcPr>
-            <w:tcW w:w="4654" w:type="dxa"/>
+            <w:tcW w:w="4621" w:type="dxa"/>
             <w:tcBorders/>
             <w:vAlign w:val="center"/>
           </w:tcPr>
@@ -7256,7 +7306,7 @@
         </w:tc>
         <w:tc>
           <w:tcPr>
-            <w:tcW w:w="1569" w:type="dxa"/>
+            <w:tcW w:w="1551" w:type="dxa"/>
             <w:tcBorders/>
             <w:vAlign w:val="center"/>
           </w:tcPr>
@@ -7277,7 +7327,7 @@
         </w:tc>
         <w:tc>
           <w:tcPr>
-            <w:tcW w:w="1804" w:type="dxa"/>
+            <w:tcW w:w="1790" w:type="dxa"/>
             <w:tcBorders/>
             <w:vAlign w:val="center"/>
           </w:tcPr>
@@ -7330,7 +7380,7 @@
         </w:tc>
         <w:tc>
           <w:tcPr>
-            <w:tcW w:w="3312" w:type="dxa"/>
+            <w:tcW w:w="3377" w:type="dxa"/>
             <w:tcBorders/>
             <w:vAlign w:val="center"/>
           </w:tcPr>
@@ -7360,7 +7410,7 @@
         <w:trPr/>
         <w:tc>
           <w:tcPr>
-            <w:tcW w:w="4654" w:type="dxa"/>
+            <w:tcW w:w="4621" w:type="dxa"/>
             <w:tcBorders/>
             <w:vAlign w:val="center"/>
           </w:tcPr>
@@ -7383,7 +7433,7 @@
         </w:tc>
         <w:tc>
           <w:tcPr>
-            <w:tcW w:w="1569" w:type="dxa"/>
+            <w:tcW w:w="1551" w:type="dxa"/>
             <w:tcBorders/>
             <w:vAlign w:val="center"/>
           </w:tcPr>
@@ -7404,7 +7454,7 @@
         </w:tc>
         <w:tc>
           <w:tcPr>
-            <w:tcW w:w="1804" w:type="dxa"/>
+            <w:tcW w:w="1790" w:type="dxa"/>
             <w:tcBorders/>
             <w:vAlign w:val="center"/>
           </w:tcPr>
@@ -7425,7 +7475,7 @@
         </w:tc>
         <w:tc>
           <w:tcPr>
-            <w:tcW w:w="3312" w:type="dxa"/>
+            <w:tcW w:w="3377" w:type="dxa"/>
             <w:tcBorders/>
             <w:vAlign w:val="center"/>
           </w:tcPr>
@@ -7456,7 +7506,27 @@
             </w:r>
             <w:r>
               <w:rPr/>
-              <w:t xml:space="preserve"> typed by the user counts</w:t>
+              <w:t xml:space="preserve"> typed by the user counts (no </w:t>
+            </w:r>
+            <w:r>
+              <w:rPr>
+                <w:rStyle w:val="SourceText"/>
+              </w:rPr>
+              <w:t>cli</w:t>
+            </w:r>
+            <w:r>
+              <w:rPr/>
+              <w:t xml:space="preserve"> or </w:t>
+            </w:r>
+            <w:r>
+              <w:rPr>
+                <w:rStyle w:val="SourceText"/>
+              </w:rPr>
+              <w:t>autopilot</w:t>
+            </w:r>
+            <w:r>
+              <w:rPr/>
+              <w:t xml:space="preserve"> receipt)</w:t>
             </w:r>
           </w:p>
         </w:tc>
@@ -7465,7 +7535,7 @@
         <w:trPr/>
         <w:tc>
           <w:tcPr>
-            <w:tcW w:w="4654" w:type="dxa"/>
+            <w:tcW w:w="4621" w:type="dxa"/>
             <w:tcBorders/>
             <w:vAlign w:val="center"/>
           </w:tcPr>
@@ -7488,7 +7558,7 @@
         </w:tc>
         <w:tc>
           <w:tcPr>
-            <w:tcW w:w="1569" w:type="dxa"/>
+            <w:tcW w:w="1551" w:type="dxa"/>
             <w:tcBorders/>
             <w:vAlign w:val="center"/>
           </w:tcPr>
@@ -7509,7 +7579,7 @@
         </w:tc>
         <w:tc>
           <w:tcPr>
-            <w:tcW w:w="1804" w:type="dxa"/>
+            <w:tcW w:w="1790" w:type="dxa"/>
             <w:tcBorders/>
             <w:vAlign w:val="center"/>
           </w:tcPr>
@@ -7530,7 +7600,7 @@
         </w:tc>
         <w:tc>
           <w:tcPr>
-            <w:tcW w:w="3312" w:type="dxa"/>
+            <w:tcW w:w="3377" w:type="dxa"/>
             <w:tcBorders/>
             <w:vAlign w:val="center"/>
           </w:tcPr>
@@ -7560,7 +7630,7 @@
         <w:trPr/>
         <w:tc>
           <w:tcPr>
-            <w:tcW w:w="4654" w:type="dxa"/>
+            <w:tcW w:w="4621" w:type="dxa"/>
             <w:tcBorders/>
             <w:vAlign w:val="center"/>
           </w:tcPr>
@@ -7583,7 +7653,7 @@
         </w:tc>
         <w:tc>
           <w:tcPr>
-            <w:tcW w:w="1569" w:type="dxa"/>
+            <w:tcW w:w="1551" w:type="dxa"/>
             <w:tcBorders/>
             <w:vAlign w:val="center"/>
           </w:tcPr>
@@ -7604,7 +7674,7 @@
         </w:tc>
         <w:tc>
           <w:tcPr>
-            <w:tcW w:w="1804" w:type="dxa"/>
+            <w:tcW w:w="1790" w:type="dxa"/>
             <w:tcBorders/>
             <w:vAlign w:val="center"/>
           </w:tcPr>
@@ -7625,7 +7695,7 @@
         </w:tc>
         <w:tc>
           <w:tcPr>
-            <w:tcW w:w="3312" w:type="dxa"/>
+            <w:tcW w:w="3377" w:type="dxa"/>
             <w:tcBorders/>
             <w:vAlign w:val="center"/>
           </w:tcPr>
@@ -7665,7 +7735,7 @@
         <w:trPr/>
         <w:tc>
           <w:tcPr>
-            <w:tcW w:w="4654" w:type="dxa"/>
+            <w:tcW w:w="4621" w:type="dxa"/>
             <w:tcBorders/>
             <w:vAlign w:val="center"/>
           </w:tcPr>
@@ -7698,7 +7768,7 @@
         </w:tc>
         <w:tc>
           <w:tcPr>
-            <w:tcW w:w="1569" w:type="dxa"/>
+            <w:tcW w:w="1551" w:type="dxa"/>
             <w:tcBorders/>
             <w:vAlign w:val="center"/>
           </w:tcPr>
@@ -7719,7 +7789,7 @@
         </w:tc>
         <w:tc>
           <w:tcPr>
-            <w:tcW w:w="1804" w:type="dxa"/>
+            <w:tcW w:w="1790" w:type="dxa"/>
             <w:tcBorders/>
             <w:vAlign w:val="center"/>
           </w:tcPr>
@@ -7740,7 +7810,7 @@
         </w:tc>
         <w:tc>
           <w:tcPr>
-            <w:tcW w:w="3312" w:type="dxa"/>
+            <w:tcW w:w="3377" w:type="dxa"/>
             <w:tcBorders/>
             <w:vAlign w:val="center"/>
           </w:tcPr>
@@ -7764,7 +7834,7 @@
         <w:trPr/>
         <w:tc>
           <w:tcPr>
-            <w:tcW w:w="4654" w:type="dxa"/>
+            <w:tcW w:w="4621" w:type="dxa"/>
             <w:tcBorders/>
             <w:vAlign w:val="center"/>
           </w:tcPr>
@@ -7787,7 +7857,7 @@
         </w:tc>
         <w:tc>
           <w:tcPr>
-            <w:tcW w:w="1569" w:type="dxa"/>
+            <w:tcW w:w="1551" w:type="dxa"/>
             <w:tcBorders/>
             <w:vAlign w:val="center"/>
           </w:tcPr>
@@ -7808,7 +7878,7 @@
         </w:tc>
         <w:tc>
           <w:tcPr>
-            <w:tcW w:w="1804" w:type="dxa"/>
+            <w:tcW w:w="1790" w:type="dxa"/>
             <w:tcBorders/>
             <w:vAlign w:val="center"/>
           </w:tcPr>
@@ -7835,7 +7905,7 @@
         </w:tc>
         <w:tc>
           <w:tcPr>
-            <w:tcW w:w="3312" w:type="dxa"/>
+            <w:tcW w:w="3377" w:type="dxa"/>
             <w:tcBorders/>
             <w:vAlign w:val="center"/>
           </w:tcPr>
@@ -7875,7 +7945,7 @@
         <w:trPr/>
         <w:tc>
           <w:tcPr>
-            <w:tcW w:w="4654" w:type="dxa"/>
+            <w:tcW w:w="4621" w:type="dxa"/>
             <w:tcBorders/>
             <w:vAlign w:val="center"/>
           </w:tcPr>
@@ -7898,7 +7968,7 @@
         </w:tc>
         <w:tc>
           <w:tcPr>
-            <w:tcW w:w="1569" w:type="dxa"/>
+            <w:tcW w:w="1551" w:type="dxa"/>
             <w:tcBorders/>
             <w:vAlign w:val="center"/>
           </w:tcPr>
@@ -7919,7 +7989,7 @@
         </w:tc>
         <w:tc>
           <w:tcPr>
-            <w:tcW w:w="1804" w:type="dxa"/>
+            <w:tcW w:w="1790" w:type="dxa"/>
             <w:tcBorders/>
             <w:vAlign w:val="center"/>
           </w:tcPr>
@@ -7940,7 +8010,7 @@
         </w:tc>
         <w:tc>
           <w:tcPr>
-            <w:tcW w:w="3312" w:type="dxa"/>
+            <w:tcW w:w="3377" w:type="dxa"/>
             <w:tcBorders/>
             <w:vAlign w:val="center"/>
           </w:tcPr>
@@ -7970,7 +8040,7 @@
         <w:trPr/>
         <w:tc>
           <w:tcPr>
-            <w:tcW w:w="4654" w:type="dxa"/>
+            <w:tcW w:w="4621" w:type="dxa"/>
             <w:tcBorders/>
             <w:vAlign w:val="center"/>
           </w:tcPr>
@@ -7993,7 +8063,7 @@
         </w:tc>
         <w:tc>
           <w:tcPr>
-            <w:tcW w:w="1569" w:type="dxa"/>
+            <w:tcW w:w="1551" w:type="dxa"/>
             <w:tcBorders/>
             <w:vAlign w:val="center"/>
           </w:tcPr>
@@ -8014,7 +8084,7 @@
         </w:tc>
         <w:tc>
           <w:tcPr>
-            <w:tcW w:w="1804" w:type="dxa"/>
+            <w:tcW w:w="1790" w:type="dxa"/>
             <w:tcBorders/>
             <w:vAlign w:val="center"/>
           </w:tcPr>
@@ -8045,7 +8115,7 @@
         </w:tc>
         <w:tc>
           <w:tcPr>
-            <w:tcW w:w="3312" w:type="dxa"/>
+            <w:tcW w:w="3377" w:type="dxa"/>
             <w:tcBorders/>
             <w:vAlign w:val="center"/>
           </w:tcPr>

</xml_diff>

<commit_message>
T-0100 round 1 docs: troubleshooting guide rebuilt (HTML, DOCX, PDF; LibreOffice 26.2.5.2, not Word)
</commit_message>
<xml_diff>
--- a/docs/guides/crew/crew-1.0-troubleshooting.docx
+++ b/docs/guides/crew/crew-1.0-troubleshooting.docx
@@ -4001,7 +4001,17 @@
       </w:r>
       <w:r>
         <w:rPr/>
-        <w:t xml:space="preserve"> line (detached HEAD, no </w:t>
+        <w:t xml:space="preserve"> line (a detached HEAD, none of </w:t>
+      </w:r>
+      <w:r>
+        <w:rPr>
+          <w:rStyle w:val="SourceText"/>
+        </w:rPr>
+        <w:t>origin/HEAD</w:t>
+      </w:r>
+      <w:r>
+        <w:rPr/>
+        <w:t xml:space="preserve">, </w:t>
       </w:r>
       <w:r>
         <w:rPr>
@@ -4011,7 +4021,37 @@
       </w:r>
       <w:r>
         <w:rPr/>
-        <w:t xml:space="preserve">) means every merged-in file was counted, so check out the ticket branch and rerun. </w:t>
+        <w:t xml:space="preserve"> and </w:t>
+      </w:r>
+      <w:r>
+        <w:rPr>
+          <w:rStyle w:val="SourceText"/>
+        </w:rPr>
+        <w:t>main</w:t>
+      </w:r>
+      <w:r>
+        <w:rPr/>
+        <w:t xml:space="preserve"> naming a commit, or a git error) means every merged-in file was counted, so check out the ticket branch and rerun. A missing </w:t>
+      </w:r>
+      <w:r>
+        <w:rPr>
+          <w:rStyle w:val="SourceText"/>
+        </w:rPr>
+        <w:t>origin/main</w:t>
+      </w:r>
+      <w:r>
+        <w:rPr/>
+        <w:t xml:space="preserve"> alone is not that: a local </w:t>
+      </w:r>
+      <w:r>
+        <w:rPr>
+          <w:rStyle w:val="SourceText"/>
+        </w:rPr>
+        <w:t>main</w:t>
+      </w:r>
+      <w:r>
+        <w:rPr/>
+        <w:t xml:space="preserve"> is used instead. </w:t>
       </w:r>
       <w:r>
         <w:rPr>

</xml_diff>

<commit_message>
crew 1.0.61: T-0088 re-bumped for its landing-branch changes; current-version mentions and the troubleshooting guide follow
check-marketplace.py failed the landing branch: plugin/crew/ changed after
1.0.60 was set in the merge (cf64e513) - the test allowlist (4c870759), the
ruff fixes (4934681d) and the pylint disable (24ca5046). 1.0.60 was never on
main. T-0088's own "since/before crew 1.0.60" mentions in CONFIG.md, the crew
README and the troubleshooting guide now say 1.0.61, in place; the "crew <=
1.0.59 heal" mentions stay, since 1.0.59 is the last release before T-0088.
CHANGELOG heading and bump line record the landing bumps; the two code-map
version sentences follow. Troubleshooting guide rebuilt (HTML, DOCX, PDF).
</commit_message>
<xml_diff>
--- a/docs/guides/crew/crew-1.0-troubleshooting.docx
+++ b/docs/guides/crew/crew-1.0-troubleshooting.docx
@@ -3831,7 +3831,7 @@
       </w:r>
       <w:r>
         <w:rPr/>
-        <w:t xml:space="preserve"> (crew 1.0.60+, T-0088), and </w:t>
+        <w:t xml:space="preserve"> (crew 1.0.61+, T-0088), and </w:t>
       </w:r>
       <w:r>
         <w:rPr>
@@ -3901,7 +3901,7 @@
       </w:r>
       <w:r>
         <w:rPr/>
-        <w:t xml:space="preserve">. A lane made before 1.0.60 almost always has one, a default that crew's SessionStart heal wrote there. </w:t>
+        <w:t xml:space="preserve">. A lane made before 1.0.61 almost always has one, a default that crew's SessionStart heal wrote there. </w:t>
       </w:r>
       <w:r>
         <w:rPr>

</xml_diff>

<commit_message>
T-0100 successor docs: README (untracked merged-in path follows core.fileMode; merged_main.fork/fork_reason and diffed-from-merged=could-not-tell; receipt fork note), troubleshooting could-not-tell causes (guide rebuilt: HTML, DOCX, PDF; LibreOffice 26.2.5.2, not Word), CHANGELOG successor paragraph
</commit_message>
<xml_diff>
--- a/docs/guides/crew/crew-1.0-troubleshooting.docx
+++ b/docs/guides/crew/crew-1.0-troubleshooting.docx
@@ -4051,7 +4051,77 @@
       </w:r>
       <w:r>
         <w:rPr/>
-        <w:t xml:space="preserve"> is used instead. </w:t>
+        <w:t xml:space="preserve"> is used instead. An untracked merged-in file (after </w:t>
+      </w:r>
+      <w:r>
+        <w:rPr>
+          <w:rStyle w:val="SourceText"/>
+        </w:rPr>
+        <w:t>git rm --cached</w:t>
+      </w:r>
+      <w:r>
+        <w:rPr/>
+        <w:t xml:space="preserve">) is main's only when </w:t>
+      </w:r>
+      <w:r>
+        <w:rPr>
+          <w:rStyle w:val="SourceText"/>
+        </w:rPr>
+        <w:t>git add</w:t>
+      </w:r>
+      <w:r>
+        <w:rPr/>
+        <w:t xml:space="preserve"> would record it identically: with </w:t>
+      </w:r>
+      <w:r>
+        <w:rPr>
+          <w:rStyle w:val="SourceText"/>
+        </w:rPr>
+        <w:t>core.fileMode=false</w:t>
+      </w:r>
+      <w:r>
+        <w:rPr/>
+        <w:t xml:space="preserve"> its execute bit is ignored, as git ignores it. On the review side, </w:t>
+      </w:r>
+      <w:r>
+        <w:rPr>
+          <w:rStyle w:val="SourceText"/>
+        </w:rPr>
+        <w:t>diffed-from-merged=could-not-tell</w:t>
+      </w:r>
+      <w:r>
+        <w:rPr/>
+        <w:t xml:space="preserve"> (or </w:t>
+      </w:r>
+      <w:r>
+        <w:rPr>
+          <w:rStyle w:val="SourceText"/>
+        </w:rPr>
+        <w:t>fork: could not tell</w:t>
+      </w:r>
+      <w:r>
+        <w:rPr/>
+        <w:t xml:space="preserve"> from </w:t>
+      </w:r>
+      <w:r>
+        <w:rPr>
+          <w:rStyle w:val="SourceText"/>
+        </w:rPr>
+        <w:t>--check-receipt</w:t>
+      </w:r>
+      <w:r>
+        <w:rPr/>
+        <w:t xml:space="preserve">) means </w:t>
+      </w:r>
+      <w:r>
+        <w:rPr>
+          <w:rStyle w:val="SourceText"/>
+        </w:rPr>
+        <w:t>git merge-base &lt;start&gt; &lt;merged&gt;</w:t>
+      </w:r>
+      <w:r>
+        <w:rPr/>
+        <w:t xml:space="preserve"> gave no answer, so a file main also changed shows main's lines as the ticket's: fetch, check the start commit still exists, and rebuild. </w:t>
       </w:r>
       <w:r>
         <w:rPr>

</xml_diff>

<commit_message>
T-0087: rebuild the daily-workflow and troubleshooting guides' DOCX and PDF from their merged sources (build.py; HTML unchanged)
</commit_message>
<xml_diff>
--- a/docs/guides/crew/crew-1.0-troubleshooting.docx
+++ b/docs/guides/crew/crew-1.0-troubleshooting.docx
@@ -3308,6 +3308,185 @@
         <w:rPr>
           <w:rStyle w:val="Strong"/>
         </w:rPr>
+        <w:t xml:space="preserve">Symptom: a round came back </w:t>
+      </w:r>
+      <w:r>
+        <w:rPr>
+          <w:rStyle w:val="SourceText"/>
+        </w:rPr>
+        <w:t>INCOMPLETE</w:t>
+      </w:r>
+      <w:r>
+        <w:rPr>
+          <w:rStyle w:val="Strong"/>
+        </w:rPr>
+        <w:t>.</w:t>
+      </w:r>
+      <w:r>
+        <w:rPr/>
+        <w:t xml:space="preserve"> </w:t>
+      </w:r>
+      <w:r>
+        <w:rPr>
+          <w:rStyle w:val="Strong"/>
+        </w:rPr>
+        <w:t>Check:</w:t>
+      </w:r>
+      <w:r>
+        <w:rPr/>
+        <w:t xml:space="preserve"> the </w:t>
+      </w:r>
+      <w:r>
+        <w:rPr>
+          <w:rStyle w:val="SourceText"/>
+        </w:rPr>
+        <w:t>review:</w:t>
+      </w:r>
+      <w:r>
+        <w:rPr/>
+        <w:t xml:space="preserve"> lines, or </w:t>
+      </w:r>
+      <w:r>
+        <w:rPr>
+          <w:rStyle w:val="SourceText"/>
+        </w:rPr>
+        <w:t>failure_class</w:t>
+      </w:r>
+      <w:r>
+        <w:rPr/>
+        <w:t xml:space="preserve"> in </w:t>
+      </w:r>
+      <w:r>
+        <w:rPr>
+          <w:rStyle w:val="SourceText"/>
+        </w:rPr>
+        <w:t>.work/tickets/&lt;id&gt;/review.json</w:t>
+      </w:r>
+      <w:r>
+        <w:rPr/>
+        <w:t xml:space="preserve">. An INCOMPLETE round has one of three classes. </w:t>
+      </w:r>
+      <w:r>
+        <w:rPr>
+          <w:rStyle w:val="SourceText"/>
+        </w:rPr>
+        <w:t>tool</w:t>
+      </w:r>
+      <w:r>
+        <w:rPr/>
+        <w:t xml:space="preserve"> means the answer never arrived intact: a timeout, a bad or unknown exit, empty output, or a failed Codex stream. </w:t>
+      </w:r>
+      <w:r>
+        <w:rPr>
+          <w:rStyle w:val="SourceText"/>
+        </w:rPr>
+        <w:t>tree</w:t>
+      </w:r>
+      <w:r>
+        <w:rPr/>
+        <w:t xml:space="preserve"> means a bundle part or web-test report changed under the reviewer. </w:t>
+      </w:r>
+      <w:r>
+        <w:rPr>
+          <w:rStyle w:val="SourceText"/>
+        </w:rPr>
+        <w:t>reviewer</w:t>
+      </w:r>
+      <w:r>
+        <w:rPr/>
+        <w:t xml:space="preserve"> means the output arrived and broke the contract. </w:t>
+      </w:r>
+      <w:r>
+        <w:rPr>
+          <w:rStyle w:val="Strong"/>
+        </w:rPr>
+        <w:t>Fix:</w:t>
+      </w:r>
+      <w:r>
+        <w:rPr/>
+        <w:t xml:space="preserve"> a </w:t>
+      </w:r>
+      <w:r>
+        <w:rPr>
+          <w:rStyle w:val="SourceText"/>
+        </w:rPr>
+        <w:t>tool</w:t>
+      </w:r>
+      <w:r>
+        <w:rPr/>
+        <w:t xml:space="preserve"> round is refunded automatically, up to two per plan. The line reads </w:t>
+      </w:r>
+      <w:r>
+        <w:rPr>
+          <w:rStyle w:val="SourceText"/>
+        </w:rPr>
+        <w:t>review: round N was a tool failure (...); refunded</w:t>
+      </w:r>
+      <w:r>
+        <w:rPr/>
+        <w:t xml:space="preserve">. Only the failed round is given back: the rerun </w:t>
+      </w:r>
+      <w:r>
+        <w:rPr>
+          <w:rStyle w:val="SourceText"/>
+        </w:rPr>
+        <w:t>/crew:review</w:t>
+      </w:r>
+      <w:r>
+        <w:rPr/>
+        <w:t xml:space="preserve"> reserves a new round, charged like any other unless it is a tool failure too, so a ticket with one charged round that reruns and gets FINDINGS has spent the budget. If Codex is out of quota, use the next eligible provider. A third tool failure under one plan reads </w:t>
+      </w:r>
+      <w:r>
+        <w:rPr>
+          <w:rStyle w:val="SourceText"/>
+        </w:rPr>
+        <w:t>NOT refunded - refund limit 2 per plan reached</w:t>
+      </w:r>
+      <w:r>
+        <w:rPr/>
+        <w:t xml:space="preserve"> and counts. A </w:t>
+      </w:r>
+      <w:r>
+        <w:rPr>
+          <w:rStyle w:val="SourceText"/>
+        </w:rPr>
+        <w:t>reviewer</w:t>
+      </w:r>
+      <w:r>
+        <w:rPr/>
+        <w:t xml:space="preserve"> or </w:t>
+      </w:r>
+      <w:r>
+        <w:rPr>
+          <w:rStyle w:val="SourceText"/>
+        </w:rPr>
+        <w:t>tree</w:t>
+      </w:r>
+      <w:r>
+        <w:rPr/>
+        <w:t xml:space="preserve"> round always counts. Rebuild the bundle (tree), or rerun and read what the reviewer wrote (reviewer).</w:t>
+      </w:r>
+    </w:p>
+    <w:p>
+      <w:pPr>
+        <w:pStyle w:val="BodyText"/>
+        <w:numPr>
+          <w:ilvl w:val="0"/>
+          <w:numId w:val="6"/>
+        </w:numPr>
+        <w:tabs>
+          <w:tab w:val="clear" w:pos="1134"/>
+          <w:tab w:val="left" w:pos="829" w:leader="none"/>
+        </w:tabs>
+        <w:bidi w:val="0"/>
+        <w:ind w:hanging="283" w:left="829"/>
+        <w:jc w:val="left"/>
+        <w:rPr/>
+      </w:pPr>
+      <w:r>
+        <w:rPr>
+          <w:rStyle w:val="Strong"/>
+        </w:rPr>
         <w:t xml:space="preserve">Symptom: </w:t>
       </w:r>
       <w:r>
@@ -3331,10 +3510,6 @@
           <w:rStyle w:val="Strong"/>
         </w:rPr>
         <w:t>Check:</w:t>
-      </w:r>
-      <w:r>
-        <w:rPr/>
-        <w:t xml:space="preserve"> </w:t>
       </w:r>
     </w:p>
     <w:p>

</xml_diff>

<commit_message>
crew 1.0.68: the review_gate allowlist commit changed plugin/crew/ after 1.0.67 was set
T-0088's version wording follows: since 1.0.68, heal-written defaults on
1.0.67 or earlier. Troubleshooting guide rebuilt.

Co-Authored-By: Claude Opus 5.5 <noreply@anthropic.com>
Claude-Session: https://claude.ai/code/session_01EjQoUd5kvVMR2LfjAsrdFC
</commit_message>
<xml_diff>
--- a/docs/guides/crew/crew-1.0-troubleshooting.docx
+++ b/docs/guides/crew/crew-1.0-troubleshooting.docx
@@ -3831,7 +3831,7 @@
       </w:r>
       <w:r>
         <w:rPr/>
-        <w:t xml:space="preserve"> (crew 1.0.67+, T-0088), and </w:t>
+        <w:t xml:space="preserve"> (crew 1.0.68+, T-0088), and </w:t>
       </w:r>
       <w:r>
         <w:rPr>
@@ -3901,7 +3901,7 @@
       </w:r>
       <w:r>
         <w:rPr/>
-        <w:t xml:space="preserve">. A lane made before 1.0.67 almost always has one, a default that crew's SessionStart heal wrote there. </w:t>
+        <w:t xml:space="preserve">. A lane made before 1.0.68 almost always has one, a default that crew's SessionStart heal wrote there. </w:t>
       </w:r>
       <w:r>
         <w:rPr>

</xml_diff>

<commit_message>
crew 1.0.69: the #267 merge changed plugin/crew/ after 1.0.68 was set
T-0088's version wording follows: since 1.0.69, heal-written defaults on
1.0.68 or earlier. BUDGETS.md takes check-marketplace's own count
(19,915 lines, 132 files; splitlines per tracked file, not wc -l).
Troubleshooting guide rebuilt.

Co-Authored-By: Claude Opus 5.5 <noreply@anthropic.com>
Claude-Session: https://claude.ai/code/session_01EjQoUd5kvVMR2LfjAsrdFC
</commit_message>
<xml_diff>
--- a/docs/guides/crew/crew-1.0-troubleshooting.docx
+++ b/docs/guides/crew/crew-1.0-troubleshooting.docx
@@ -3831,7 +3831,7 @@
       </w:r>
       <w:r>
         <w:rPr/>
-        <w:t xml:space="preserve"> (crew 1.0.68+, T-0088), and </w:t>
+        <w:t xml:space="preserve"> (crew 1.0.69+, T-0088), and </w:t>
       </w:r>
       <w:r>
         <w:rPr>
@@ -3901,7 +3901,7 @@
       </w:r>
       <w:r>
         <w:rPr/>
-        <w:t xml:space="preserve">. A lane made before 1.0.68 almost always has one, a default that crew's SessionStart heal wrote there. </w:t>
+        <w:t xml:space="preserve">. A lane made before 1.0.69 almost always has one, a default that crew's SessionStart heal wrote there. </w:t>
       </w:r>
       <w:r>
         <w:rPr>

</xml_diff>

<commit_message>
T-0087: rebuild the troubleshooting and working-with-codex guides' HTML, DOCX and PDF from their merged sources after merging a61a6f38 (build.py; LibreOffice 26.2.5.2, not Microsoft Word; troubleshooting HTML unchanged)
</commit_message>
<xml_diff>
--- a/docs/guides/crew/crew-1.0-troubleshooting.docx
+++ b/docs/guides/crew/crew-1.0-troubleshooting.docx
@@ -1,6 +1,6 @@
 
 <file path=word/document.xml><?xml version="1.0" encoding="utf-8"?>
-<w:document xmlns:o="urn:schemas-microsoft-com:office:office" xmlns:r="http://schemas.openxmlformats.org/officeDocument/2006/relationships" xmlns:v="urn:schemas-microsoft-com:vml" xmlns:w="http://schemas.openxmlformats.org/wordprocessingml/2006/main" xmlns:w10="urn:schemas-microsoft-com:office:word" xmlns:wp="http://schemas.openxmlformats.org/drawingml/2006/wordprocessingDrawing" xmlns:wps="http://schemas.microsoft.com/office/word/2010/wordprocessingShape" xmlns:wpg="http://schemas.microsoft.com/office/word/2010/wordprocessingGroup" xmlns:mc="http://schemas.openxmlformats.org/markup-compatibility/2006" xmlns:wp14="http://schemas.microsoft.com/office/word/2010/wordprocessingDrawing" xmlns:w14="http://schemas.microsoft.com/office/word/2010/wordml" xmlns:w15="http://schemas.microsoft.com/office/word/2012/wordml" mc:Ignorable="w14 wp14 w15">
+<w:document xmlns:o="urn:schemas-microsoft-com:office:office" xmlns:r="http://schemas.openxmlformats.org/officeDocument/2006/relationships" xmlns:v="urn:schemas-microsoft-com:vml" xmlns:w="http://schemas.openxmlformats.org/wordprocessingml/2006/main" xmlns:w10="urn:schemas-microsoft-com:office:word" xmlns:wp="http://schemas.openxmlformats.org/drawingml/2006/wordprocessingDrawing" xmlns:pic="http://schemas.openxmlformats.org/drawingml/2006/picture" xmlns:wps="http://schemas.microsoft.com/office/word/2010/wordprocessingShape" xmlns:wpg="http://schemas.microsoft.com/office/word/2010/wordprocessingGroup" xmlns:mc="http://schemas.openxmlformats.org/markup-compatibility/2006" xmlns:wp14="http://schemas.microsoft.com/office/word/2010/wordprocessingDrawing" xmlns:w14="http://schemas.microsoft.com/office/word/2010/wordml" xmlns:w15="http://schemas.microsoft.com/office/word/2012/wordml" mc:Ignorable="w14 wp14 w15">
   <w:body>
     <w:p>
       <w:pPr>
@@ -545,9 +545,9 @@
     </w:p>
     <w:tbl>
       <w:tblPr>
-        <w:tblW w:w="11810" w:type="dxa"/>
+        <w:tblW w:w="11731" w:type="dxa"/>
         <w:jc w:val="left"/>
-        <w:tblInd w:w="0" w:type="dxa"/>
+        <w:tblInd w:w="28" w:type="dxa"/>
         <w:tblLayout w:type="fixed"/>
         <w:tblCellMar>
           <w:top w:w="28" w:type="dxa"/>
@@ -557,11 +557,11 @@
         </w:tblCellMar>
       </w:tblPr>
       <w:tblGrid>
-        <w:gridCol w:w="2116"/>
-        <w:gridCol w:w="2446"/>
-        <w:gridCol w:w="2131"/>
+        <w:gridCol w:w="2119"/>
+        <w:gridCol w:w="2456"/>
+        <w:gridCol w:w="2022"/>
         <w:gridCol w:w="2986"/>
-        <w:gridCol w:w="2131"/>
+        <w:gridCol w:w="2148"/>
       </w:tblGrid>
       <w:tr>
         <w:trPr>
@@ -569,7 +569,7 @@
         </w:trPr>
         <w:tc>
           <w:tcPr>
-            <w:tcW w:w="2116" w:type="dxa"/>
+            <w:tcW w:w="2119" w:type="dxa"/>
             <w:tcBorders/>
             <w:vAlign w:val="center"/>
           </w:tcPr>
@@ -591,7 +591,7 @@
         </w:tc>
         <w:tc>
           <w:tcPr>
-            <w:tcW w:w="2446" w:type="dxa"/>
+            <w:tcW w:w="2456" w:type="dxa"/>
             <w:tcBorders/>
             <w:vAlign w:val="center"/>
           </w:tcPr>
@@ -613,7 +613,7 @@
         </w:tc>
         <w:tc>
           <w:tcPr>
-            <w:tcW w:w="2131" w:type="dxa"/>
+            <w:tcW w:w="2022" w:type="dxa"/>
             <w:tcBorders/>
             <w:vAlign w:val="center"/>
           </w:tcPr>
@@ -657,7 +657,7 @@
         </w:tc>
         <w:tc>
           <w:tcPr>
-            <w:tcW w:w="2131" w:type="dxa"/>
+            <w:tcW w:w="2148" w:type="dxa"/>
             <w:tcBorders/>
             <w:vAlign w:val="center"/>
           </w:tcPr>
@@ -682,7 +682,7 @@
         <w:trPr/>
         <w:tc>
           <w:tcPr>
-            <w:tcW w:w="2116" w:type="dxa"/>
+            <w:tcW w:w="2119" w:type="dxa"/>
             <w:tcBorders/>
             <w:vAlign w:val="center"/>
           </w:tcPr>
@@ -705,7 +705,7 @@
         </w:tc>
         <w:tc>
           <w:tcPr>
-            <w:tcW w:w="2446" w:type="dxa"/>
+            <w:tcW w:w="2456" w:type="dxa"/>
             <w:tcBorders/>
             <w:vAlign w:val="center"/>
           </w:tcPr>
@@ -728,7 +728,7 @@
         </w:tc>
         <w:tc>
           <w:tcPr>
-            <w:tcW w:w="2131" w:type="dxa"/>
+            <w:tcW w:w="2022" w:type="dxa"/>
             <w:tcBorders/>
             <w:vAlign w:val="center"/>
           </w:tcPr>
@@ -794,7 +794,7 @@
         </w:tc>
         <w:tc>
           <w:tcPr>
-            <w:tcW w:w="2131" w:type="dxa"/>
+            <w:tcW w:w="2148" w:type="dxa"/>
             <w:tcBorders/>
             <w:vAlign w:val="center"/>
           </w:tcPr>
@@ -818,7 +818,7 @@
         <w:trPr/>
         <w:tc>
           <w:tcPr>
-            <w:tcW w:w="2116" w:type="dxa"/>
+            <w:tcW w:w="2119" w:type="dxa"/>
             <w:tcBorders/>
             <w:vAlign w:val="center"/>
           </w:tcPr>
@@ -841,7 +841,7 @@
         </w:tc>
         <w:tc>
           <w:tcPr>
-            <w:tcW w:w="2446" w:type="dxa"/>
+            <w:tcW w:w="2456" w:type="dxa"/>
             <w:tcBorders/>
             <w:vAlign w:val="center"/>
           </w:tcPr>
@@ -864,7 +864,7 @@
         </w:tc>
         <w:tc>
           <w:tcPr>
-            <w:tcW w:w="2131" w:type="dxa"/>
+            <w:tcW w:w="2022" w:type="dxa"/>
             <w:tcBorders/>
             <w:vAlign w:val="center"/>
           </w:tcPr>
@@ -916,7 +916,7 @@
         </w:tc>
         <w:tc>
           <w:tcPr>
-            <w:tcW w:w="2131" w:type="dxa"/>
+            <w:tcW w:w="2148" w:type="dxa"/>
             <w:tcBorders/>
             <w:vAlign w:val="center"/>
           </w:tcPr>
@@ -940,7 +940,7 @@
         <w:trPr/>
         <w:tc>
           <w:tcPr>
-            <w:tcW w:w="2116" w:type="dxa"/>
+            <w:tcW w:w="2119" w:type="dxa"/>
             <w:tcBorders/>
             <w:vAlign w:val="center"/>
           </w:tcPr>
@@ -993,7 +993,7 @@
         </w:tc>
         <w:tc>
           <w:tcPr>
-            <w:tcW w:w="2446" w:type="dxa"/>
+            <w:tcW w:w="2456" w:type="dxa"/>
             <w:tcBorders/>
             <w:vAlign w:val="center"/>
           </w:tcPr>
@@ -1016,7 +1016,7 @@
         </w:tc>
         <w:tc>
           <w:tcPr>
-            <w:tcW w:w="2131" w:type="dxa"/>
+            <w:tcW w:w="2022" w:type="dxa"/>
             <w:tcBorders/>
             <w:vAlign w:val="center"/>
           </w:tcPr>
@@ -1074,7 +1074,7 @@
         </w:tc>
         <w:tc>
           <w:tcPr>
-            <w:tcW w:w="2131" w:type="dxa"/>
+            <w:tcW w:w="2148" w:type="dxa"/>
             <w:tcBorders/>
             <w:vAlign w:val="center"/>
           </w:tcPr>
@@ -1110,7 +1110,7 @@
         <w:trPr/>
         <w:tc>
           <w:tcPr>
-            <w:tcW w:w="2116" w:type="dxa"/>
+            <w:tcW w:w="2119" w:type="dxa"/>
             <w:tcBorders/>
             <w:vAlign w:val="center"/>
           </w:tcPr>
@@ -1133,7 +1133,7 @@
         </w:tc>
         <w:tc>
           <w:tcPr>
-            <w:tcW w:w="2446" w:type="dxa"/>
+            <w:tcW w:w="2456" w:type="dxa"/>
             <w:tcBorders/>
             <w:vAlign w:val="center"/>
           </w:tcPr>
@@ -1156,7 +1156,7 @@
         </w:tc>
         <w:tc>
           <w:tcPr>
-            <w:tcW w:w="2131" w:type="dxa"/>
+            <w:tcW w:w="2022" w:type="dxa"/>
             <w:tcBorders/>
             <w:vAlign w:val="center"/>
           </w:tcPr>
@@ -1214,7 +1214,7 @@
         </w:tc>
         <w:tc>
           <w:tcPr>
-            <w:tcW w:w="2131" w:type="dxa"/>
+            <w:tcW w:w="2148" w:type="dxa"/>
             <w:tcBorders/>
             <w:vAlign w:val="center"/>
           </w:tcPr>
@@ -1238,7 +1238,7 @@
         <w:trPr/>
         <w:tc>
           <w:tcPr>
-            <w:tcW w:w="2116" w:type="dxa"/>
+            <w:tcW w:w="2119" w:type="dxa"/>
             <w:tcBorders/>
             <w:vAlign w:val="center"/>
           </w:tcPr>
@@ -1285,7 +1285,7 @@
         </w:tc>
         <w:tc>
           <w:tcPr>
-            <w:tcW w:w="2446" w:type="dxa"/>
+            <w:tcW w:w="2456" w:type="dxa"/>
             <w:tcBorders/>
             <w:vAlign w:val="center"/>
           </w:tcPr>
@@ -1308,7 +1308,7 @@
         </w:tc>
         <w:tc>
           <w:tcPr>
-            <w:tcW w:w="2131" w:type="dxa"/>
+            <w:tcW w:w="2022" w:type="dxa"/>
             <w:tcBorders/>
             <w:vAlign w:val="center"/>
           </w:tcPr>
@@ -1428,7 +1428,7 @@
         </w:tc>
         <w:tc>
           <w:tcPr>
-            <w:tcW w:w="2131" w:type="dxa"/>
+            <w:tcW w:w="2148" w:type="dxa"/>
             <w:tcBorders/>
             <w:vAlign w:val="center"/>
           </w:tcPr>
@@ -1468,7 +1468,7 @@
         <w:trPr/>
         <w:tc>
           <w:tcPr>
-            <w:tcW w:w="2116" w:type="dxa"/>
+            <w:tcW w:w="2119" w:type="dxa"/>
             <w:tcBorders/>
             <w:vAlign w:val="center"/>
           </w:tcPr>
@@ -1515,7 +1515,7 @@
         </w:tc>
         <w:tc>
           <w:tcPr>
-            <w:tcW w:w="2446" w:type="dxa"/>
+            <w:tcW w:w="2456" w:type="dxa"/>
             <w:tcBorders/>
             <w:vAlign w:val="center"/>
           </w:tcPr>
@@ -1538,7 +1538,7 @@
         </w:tc>
         <w:tc>
           <w:tcPr>
-            <w:tcW w:w="2131" w:type="dxa"/>
+            <w:tcW w:w="2022" w:type="dxa"/>
             <w:tcBorders/>
             <w:vAlign w:val="center"/>
           </w:tcPr>
@@ -1616,7 +1616,7 @@
         </w:tc>
         <w:tc>
           <w:tcPr>
-            <w:tcW w:w="2131" w:type="dxa"/>
+            <w:tcW w:w="2148" w:type="dxa"/>
             <w:tcBorders/>
             <w:vAlign w:val="center"/>
           </w:tcPr>
@@ -1642,7 +1642,7 @@
         <w:trPr/>
         <w:tc>
           <w:tcPr>
-            <w:tcW w:w="2116" w:type="dxa"/>
+            <w:tcW w:w="2119" w:type="dxa"/>
             <w:tcBorders/>
             <w:vAlign w:val="center"/>
           </w:tcPr>
@@ -1689,7 +1689,7 @@
         </w:tc>
         <w:tc>
           <w:tcPr>
-            <w:tcW w:w="2446" w:type="dxa"/>
+            <w:tcW w:w="2456" w:type="dxa"/>
             <w:tcBorders/>
             <w:vAlign w:val="center"/>
           </w:tcPr>
@@ -1712,7 +1712,7 @@
         </w:tc>
         <w:tc>
           <w:tcPr>
-            <w:tcW w:w="2131" w:type="dxa"/>
+            <w:tcW w:w="2022" w:type="dxa"/>
             <w:tcBorders/>
             <w:vAlign w:val="center"/>
           </w:tcPr>
@@ -1810,7 +1810,7 @@
         </w:tc>
         <w:tc>
           <w:tcPr>
-            <w:tcW w:w="2131" w:type="dxa"/>
+            <w:tcW w:w="2148" w:type="dxa"/>
             <w:tcBorders/>
             <w:vAlign w:val="center"/>
           </w:tcPr>
@@ -1836,7 +1836,7 @@
         <w:trPr/>
         <w:tc>
           <w:tcPr>
-            <w:tcW w:w="2116" w:type="dxa"/>
+            <w:tcW w:w="2119" w:type="dxa"/>
             <w:tcBorders/>
             <w:vAlign w:val="center"/>
           </w:tcPr>
@@ -1923,7 +1923,7 @@
         </w:tc>
         <w:tc>
           <w:tcPr>
-            <w:tcW w:w="2446" w:type="dxa"/>
+            <w:tcW w:w="2456" w:type="dxa"/>
             <w:tcBorders/>
             <w:vAlign w:val="center"/>
           </w:tcPr>
@@ -1946,7 +1946,7 @@
         </w:tc>
         <w:tc>
           <w:tcPr>
-            <w:tcW w:w="2131" w:type="dxa"/>
+            <w:tcW w:w="2022" w:type="dxa"/>
             <w:tcBorders/>
             <w:vAlign w:val="center"/>
           </w:tcPr>
@@ -2040,7 +2040,7 @@
         </w:tc>
         <w:tc>
           <w:tcPr>
-            <w:tcW w:w="2131" w:type="dxa"/>
+            <w:tcW w:w="2148" w:type="dxa"/>
             <w:tcBorders/>
             <w:vAlign w:val="center"/>
           </w:tcPr>
@@ -2076,7 +2076,7 @@
         <w:trPr/>
         <w:tc>
           <w:tcPr>
-            <w:tcW w:w="2116" w:type="dxa"/>
+            <w:tcW w:w="2119" w:type="dxa"/>
             <w:tcBorders/>
             <w:vAlign w:val="center"/>
           </w:tcPr>
@@ -2099,7 +2099,7 @@
         </w:tc>
         <w:tc>
           <w:tcPr>
-            <w:tcW w:w="2446" w:type="dxa"/>
+            <w:tcW w:w="2456" w:type="dxa"/>
             <w:tcBorders/>
             <w:vAlign w:val="center"/>
           </w:tcPr>
@@ -2122,7 +2122,7 @@
         </w:tc>
         <w:tc>
           <w:tcPr>
-            <w:tcW w:w="2131" w:type="dxa"/>
+            <w:tcW w:w="2022" w:type="dxa"/>
             <w:tcBorders/>
             <w:vAlign w:val="center"/>
           </w:tcPr>
@@ -2176,7 +2176,7 @@
         </w:tc>
         <w:tc>
           <w:tcPr>
-            <w:tcW w:w="2131" w:type="dxa"/>
+            <w:tcW w:w="2148" w:type="dxa"/>
             <w:tcBorders/>
             <w:vAlign w:val="center"/>
           </w:tcPr>
@@ -2200,7 +2200,7 @@
         <w:trPr/>
         <w:tc>
           <w:tcPr>
-            <w:tcW w:w="2116" w:type="dxa"/>
+            <w:tcW w:w="2119" w:type="dxa"/>
             <w:tcBorders/>
             <w:vAlign w:val="center"/>
           </w:tcPr>
@@ -2223,7 +2223,7 @@
         </w:tc>
         <w:tc>
           <w:tcPr>
-            <w:tcW w:w="2446" w:type="dxa"/>
+            <w:tcW w:w="2456" w:type="dxa"/>
             <w:tcBorders/>
             <w:vAlign w:val="center"/>
           </w:tcPr>
@@ -2246,7 +2246,7 @@
         </w:tc>
         <w:tc>
           <w:tcPr>
-            <w:tcW w:w="2131" w:type="dxa"/>
+            <w:tcW w:w="2022" w:type="dxa"/>
             <w:tcBorders/>
             <w:vAlign w:val="center"/>
           </w:tcPr>
@@ -2310,7 +2310,7 @@
         </w:tc>
         <w:tc>
           <w:tcPr>
-            <w:tcW w:w="2131" w:type="dxa"/>
+            <w:tcW w:w="2148" w:type="dxa"/>
             <w:tcBorders/>
             <w:vAlign w:val="center"/>
           </w:tcPr>
@@ -2336,7 +2336,7 @@
         <w:trPr/>
         <w:tc>
           <w:tcPr>
-            <w:tcW w:w="2116" w:type="dxa"/>
+            <w:tcW w:w="2119" w:type="dxa"/>
             <w:tcBorders/>
             <w:vAlign w:val="center"/>
           </w:tcPr>
@@ -2359,7 +2359,7 @@
         </w:tc>
         <w:tc>
           <w:tcPr>
-            <w:tcW w:w="2446" w:type="dxa"/>
+            <w:tcW w:w="2456" w:type="dxa"/>
             <w:tcBorders/>
             <w:vAlign w:val="center"/>
           </w:tcPr>
@@ -2382,7 +2382,7 @@
         </w:tc>
         <w:tc>
           <w:tcPr>
-            <w:tcW w:w="2131" w:type="dxa"/>
+            <w:tcW w:w="2022" w:type="dxa"/>
             <w:tcBorders/>
             <w:vAlign w:val="center"/>
           </w:tcPr>
@@ -2440,7 +2440,7 @@
         </w:tc>
         <w:tc>
           <w:tcPr>
-            <w:tcW w:w="2131" w:type="dxa"/>
+            <w:tcW w:w="2148" w:type="dxa"/>
             <w:tcBorders/>
             <w:vAlign w:val="center"/>
           </w:tcPr>
@@ -2466,7 +2466,7 @@
         <w:trPr/>
         <w:tc>
           <w:tcPr>
-            <w:tcW w:w="2116" w:type="dxa"/>
+            <w:tcW w:w="2119" w:type="dxa"/>
             <w:tcBorders/>
             <w:vAlign w:val="center"/>
           </w:tcPr>
@@ -2489,7 +2489,7 @@
         </w:tc>
         <w:tc>
           <w:tcPr>
-            <w:tcW w:w="2446" w:type="dxa"/>
+            <w:tcW w:w="2456" w:type="dxa"/>
             <w:tcBorders/>
             <w:vAlign w:val="center"/>
           </w:tcPr>
@@ -2512,7 +2512,7 @@
         </w:tc>
         <w:tc>
           <w:tcPr>
-            <w:tcW w:w="2131" w:type="dxa"/>
+            <w:tcW w:w="2022" w:type="dxa"/>
             <w:tcBorders/>
             <w:vAlign w:val="center"/>
           </w:tcPr>
@@ -2596,7 +2596,7 @@
         </w:tc>
         <w:tc>
           <w:tcPr>
-            <w:tcW w:w="2131" w:type="dxa"/>
+            <w:tcW w:w="2148" w:type="dxa"/>
             <w:tcBorders/>
             <w:vAlign w:val="center"/>
           </w:tcPr>
@@ -2626,7 +2626,7 @@
         <w:trPr/>
         <w:tc>
           <w:tcPr>
-            <w:tcW w:w="2116" w:type="dxa"/>
+            <w:tcW w:w="2119" w:type="dxa"/>
             <w:tcBorders/>
             <w:vAlign w:val="center"/>
           </w:tcPr>
@@ -2649,7 +2649,7 @@
         </w:tc>
         <w:tc>
           <w:tcPr>
-            <w:tcW w:w="2446" w:type="dxa"/>
+            <w:tcW w:w="2456" w:type="dxa"/>
             <w:tcBorders/>
             <w:vAlign w:val="center"/>
           </w:tcPr>
@@ -2672,7 +2672,7 @@
         </w:tc>
         <w:tc>
           <w:tcPr>
-            <w:tcW w:w="2131" w:type="dxa"/>
+            <w:tcW w:w="2022" w:type="dxa"/>
             <w:tcBorders/>
             <w:vAlign w:val="center"/>
           </w:tcPr>
@@ -2716,7 +2716,7 @@
         </w:tc>
         <w:tc>
           <w:tcPr>
-            <w:tcW w:w="2131" w:type="dxa"/>
+            <w:tcW w:w="2148" w:type="dxa"/>
             <w:tcBorders/>
             <w:vAlign w:val="center"/>
           </w:tcPr>
@@ -3308,6 +3308,185 @@
         <w:rPr>
           <w:rStyle w:val="Strong"/>
         </w:rPr>
+        <w:t xml:space="preserve">Symptom: a round came back </w:t>
+      </w:r>
+      <w:r>
+        <w:rPr>
+          <w:rStyle w:val="SourceText"/>
+        </w:rPr>
+        <w:t>INCOMPLETE</w:t>
+      </w:r>
+      <w:r>
+        <w:rPr>
+          <w:rStyle w:val="Strong"/>
+        </w:rPr>
+        <w:t>.</w:t>
+      </w:r>
+      <w:r>
+        <w:rPr/>
+        <w:t xml:space="preserve"> </w:t>
+      </w:r>
+      <w:r>
+        <w:rPr>
+          <w:rStyle w:val="Strong"/>
+        </w:rPr>
+        <w:t>Check:</w:t>
+      </w:r>
+      <w:r>
+        <w:rPr/>
+        <w:t xml:space="preserve"> the </w:t>
+      </w:r>
+      <w:r>
+        <w:rPr>
+          <w:rStyle w:val="SourceText"/>
+        </w:rPr>
+        <w:t>review:</w:t>
+      </w:r>
+      <w:r>
+        <w:rPr/>
+        <w:t xml:space="preserve"> lines, or </w:t>
+      </w:r>
+      <w:r>
+        <w:rPr>
+          <w:rStyle w:val="SourceText"/>
+        </w:rPr>
+        <w:t>failure_class</w:t>
+      </w:r>
+      <w:r>
+        <w:rPr/>
+        <w:t xml:space="preserve"> in </w:t>
+      </w:r>
+      <w:r>
+        <w:rPr>
+          <w:rStyle w:val="SourceText"/>
+        </w:rPr>
+        <w:t>.work/tickets/&lt;id&gt;/review.json</w:t>
+      </w:r>
+      <w:r>
+        <w:rPr/>
+        <w:t xml:space="preserve">. An INCOMPLETE round has one of three classes. </w:t>
+      </w:r>
+      <w:r>
+        <w:rPr>
+          <w:rStyle w:val="SourceText"/>
+        </w:rPr>
+        <w:t>tool</w:t>
+      </w:r>
+      <w:r>
+        <w:rPr/>
+        <w:t xml:space="preserve"> means the answer never arrived intact: a timeout, a bad or unknown exit, empty output, or a failed Codex stream. </w:t>
+      </w:r>
+      <w:r>
+        <w:rPr>
+          <w:rStyle w:val="SourceText"/>
+        </w:rPr>
+        <w:t>tree</w:t>
+      </w:r>
+      <w:r>
+        <w:rPr/>
+        <w:t xml:space="preserve"> means a bundle part or web-test report changed under the reviewer. </w:t>
+      </w:r>
+      <w:r>
+        <w:rPr>
+          <w:rStyle w:val="SourceText"/>
+        </w:rPr>
+        <w:t>reviewer</w:t>
+      </w:r>
+      <w:r>
+        <w:rPr/>
+        <w:t xml:space="preserve"> means the output arrived and broke the contract. </w:t>
+      </w:r>
+      <w:r>
+        <w:rPr>
+          <w:rStyle w:val="Strong"/>
+        </w:rPr>
+        <w:t>Fix:</w:t>
+      </w:r>
+      <w:r>
+        <w:rPr/>
+        <w:t xml:space="preserve"> a </w:t>
+      </w:r>
+      <w:r>
+        <w:rPr>
+          <w:rStyle w:val="SourceText"/>
+        </w:rPr>
+        <w:t>tool</w:t>
+      </w:r>
+      <w:r>
+        <w:rPr/>
+        <w:t xml:space="preserve"> round is refunded automatically, up to two per plan. The line reads </w:t>
+      </w:r>
+      <w:r>
+        <w:rPr>
+          <w:rStyle w:val="SourceText"/>
+        </w:rPr>
+        <w:t>review: round N was a tool failure (...); refunded</w:t>
+      </w:r>
+      <w:r>
+        <w:rPr/>
+        <w:t xml:space="preserve">. Only the failed round is given back: the rerun </w:t>
+      </w:r>
+      <w:r>
+        <w:rPr>
+          <w:rStyle w:val="SourceText"/>
+        </w:rPr>
+        <w:t>/crew:review</w:t>
+      </w:r>
+      <w:r>
+        <w:rPr/>
+        <w:t xml:space="preserve"> reserves a new round, charged like any other unless it is a tool failure too, so a ticket with one charged round that reruns and gets FINDINGS has spent the budget. If Codex is out of quota, use the next eligible provider. A third tool failure under one plan reads </w:t>
+      </w:r>
+      <w:r>
+        <w:rPr>
+          <w:rStyle w:val="SourceText"/>
+        </w:rPr>
+        <w:t>NOT refunded - refund limit 2 per plan reached</w:t>
+      </w:r>
+      <w:r>
+        <w:rPr/>
+        <w:t xml:space="preserve"> and counts. A </w:t>
+      </w:r>
+      <w:r>
+        <w:rPr>
+          <w:rStyle w:val="SourceText"/>
+        </w:rPr>
+        <w:t>reviewer</w:t>
+      </w:r>
+      <w:r>
+        <w:rPr/>
+        <w:t xml:space="preserve"> or </w:t>
+      </w:r>
+      <w:r>
+        <w:rPr>
+          <w:rStyle w:val="SourceText"/>
+        </w:rPr>
+        <w:t>tree</w:t>
+      </w:r>
+      <w:r>
+        <w:rPr/>
+        <w:t xml:space="preserve"> round always counts. Rebuild the bundle (tree), or rerun and read what the reviewer wrote (reviewer).</w:t>
+      </w:r>
+    </w:p>
+    <w:p>
+      <w:pPr>
+        <w:pStyle w:val="BodyText"/>
+        <w:numPr>
+          <w:ilvl w:val="0"/>
+          <w:numId w:val="6"/>
+        </w:numPr>
+        <w:tabs>
+          <w:tab w:val="clear" w:pos="1134"/>
+          <w:tab w:val="left" w:pos="829" w:leader="none"/>
+        </w:tabs>
+        <w:bidi w:val="0"/>
+        <w:ind w:hanging="283" w:left="829"/>
+        <w:jc w:val="left"/>
+        <w:rPr/>
+      </w:pPr>
+      <w:r>
+        <w:rPr>
+          <w:rStyle w:val="Strong"/>
+        </w:rPr>
         <w:t xml:space="preserve">Symptom: </w:t>
       </w:r>
       <w:r>
@@ -3331,10 +3510,6 @@
           <w:rStyle w:val="Strong"/>
         </w:rPr>
         <w:t>Check:</w:t>
-      </w:r>
-      <w:r>
-        <w:rPr/>
-        <w:t xml:space="preserve"> </w:t>
       </w:r>
     </w:p>
     <w:p>
@@ -6921,9 +7096,9 @@
     </w:p>
     <w:tbl>
       <w:tblPr>
-        <w:tblW w:w="11810" w:type="dxa"/>
+        <w:tblW w:w="11339" w:type="dxa"/>
         <w:jc w:val="left"/>
-        <w:tblInd w:w="0" w:type="dxa"/>
+        <w:tblInd w:w="28" w:type="dxa"/>
         <w:tblLayout w:type="fixed"/>
         <w:tblCellMar>
           <w:top w:w="28" w:type="dxa"/>
@@ -6933,10 +7108,10 @@
         </w:tblCellMar>
       </w:tblPr>
       <w:tblGrid>
-        <w:gridCol w:w="4730"/>
-        <w:gridCol w:w="1699"/>
-        <w:gridCol w:w="1841"/>
-        <w:gridCol w:w="3540"/>
+        <w:gridCol w:w="4621"/>
+        <w:gridCol w:w="1551"/>
+        <w:gridCol w:w="1790"/>
+        <w:gridCol w:w="3377"/>
       </w:tblGrid>
       <w:tr>
         <w:trPr>
@@ -6944,7 +7119,7 @@
         </w:trPr>
         <w:tc>
           <w:tcPr>
-            <w:tcW w:w="4730" w:type="dxa"/>
+            <w:tcW w:w="4621" w:type="dxa"/>
             <w:tcBorders/>
             <w:vAlign w:val="center"/>
           </w:tcPr>
@@ -6966,7 +7141,7 @@
         </w:tc>
         <w:tc>
           <w:tcPr>
-            <w:tcW w:w="1699" w:type="dxa"/>
+            <w:tcW w:w="1551" w:type="dxa"/>
             <w:tcBorders/>
             <w:vAlign w:val="center"/>
           </w:tcPr>
@@ -6988,7 +7163,7 @@
         </w:tc>
         <w:tc>
           <w:tcPr>
-            <w:tcW w:w="1841" w:type="dxa"/>
+            <w:tcW w:w="1790" w:type="dxa"/>
             <w:tcBorders/>
             <w:vAlign w:val="center"/>
           </w:tcPr>
@@ -7010,7 +7185,7 @@
         </w:tc>
         <w:tc>
           <w:tcPr>
-            <w:tcW w:w="3540" w:type="dxa"/>
+            <w:tcW w:w="3377" w:type="dxa"/>
             <w:tcBorders/>
             <w:vAlign w:val="center"/>
           </w:tcPr>
@@ -7035,7 +7210,7 @@
         <w:trPr/>
         <w:tc>
           <w:tcPr>
-            <w:tcW w:w="4730" w:type="dxa"/>
+            <w:tcW w:w="4621" w:type="dxa"/>
             <w:tcBorders/>
             <w:vAlign w:val="center"/>
           </w:tcPr>
@@ -7058,7 +7233,7 @@
         </w:tc>
         <w:tc>
           <w:tcPr>
-            <w:tcW w:w="1699" w:type="dxa"/>
+            <w:tcW w:w="1551" w:type="dxa"/>
             <w:tcBorders/>
             <w:vAlign w:val="center"/>
           </w:tcPr>
@@ -7079,7 +7254,7 @@
         </w:tc>
         <w:tc>
           <w:tcPr>
-            <w:tcW w:w="1841" w:type="dxa"/>
+            <w:tcW w:w="1790" w:type="dxa"/>
             <w:tcBorders/>
             <w:vAlign w:val="center"/>
           </w:tcPr>
@@ -7100,7 +7275,7 @@
         </w:tc>
         <w:tc>
           <w:tcPr>
-            <w:tcW w:w="3540" w:type="dxa"/>
+            <w:tcW w:w="3377" w:type="dxa"/>
             <w:tcBorders/>
             <w:vAlign w:val="center"/>
           </w:tcPr>
@@ -7140,7 +7315,7 @@
         <w:trPr/>
         <w:tc>
           <w:tcPr>
-            <w:tcW w:w="4730" w:type="dxa"/>
+            <w:tcW w:w="4621" w:type="dxa"/>
             <w:tcBorders/>
             <w:vAlign w:val="center"/>
           </w:tcPr>
@@ -7163,7 +7338,7 @@
         </w:tc>
         <w:tc>
           <w:tcPr>
-            <w:tcW w:w="1699" w:type="dxa"/>
+            <w:tcW w:w="1551" w:type="dxa"/>
             <w:tcBorders/>
             <w:vAlign w:val="center"/>
           </w:tcPr>
@@ -7184,7 +7359,7 @@
         </w:tc>
         <w:tc>
           <w:tcPr>
-            <w:tcW w:w="1841" w:type="dxa"/>
+            <w:tcW w:w="1790" w:type="dxa"/>
             <w:tcBorders/>
             <w:vAlign w:val="center"/>
           </w:tcPr>
@@ -7227,7 +7402,7 @@
         </w:tc>
         <w:tc>
           <w:tcPr>
-            <w:tcW w:w="3540" w:type="dxa"/>
+            <w:tcW w:w="3377" w:type="dxa"/>
             <w:tcBorders/>
             <w:vAlign w:val="center"/>
           </w:tcPr>
@@ -7257,7 +7432,7 @@
         <w:trPr/>
         <w:tc>
           <w:tcPr>
-            <w:tcW w:w="4730" w:type="dxa"/>
+            <w:tcW w:w="4621" w:type="dxa"/>
             <w:tcBorders/>
             <w:vAlign w:val="center"/>
           </w:tcPr>
@@ -7280,7 +7455,7 @@
         </w:tc>
         <w:tc>
           <w:tcPr>
-            <w:tcW w:w="1699" w:type="dxa"/>
+            <w:tcW w:w="1551" w:type="dxa"/>
             <w:tcBorders/>
             <w:vAlign w:val="center"/>
           </w:tcPr>
@@ -7301,7 +7476,7 @@
         </w:tc>
         <w:tc>
           <w:tcPr>
-            <w:tcW w:w="1841" w:type="dxa"/>
+            <w:tcW w:w="1790" w:type="dxa"/>
             <w:tcBorders/>
             <w:vAlign w:val="center"/>
           </w:tcPr>
@@ -7344,7 +7519,7 @@
         </w:tc>
         <w:tc>
           <w:tcPr>
-            <w:tcW w:w="3540" w:type="dxa"/>
+            <w:tcW w:w="3377" w:type="dxa"/>
             <w:tcBorders/>
             <w:vAlign w:val="center"/>
           </w:tcPr>
@@ -7374,7 +7549,7 @@
         <w:trPr/>
         <w:tc>
           <w:tcPr>
-            <w:tcW w:w="4730" w:type="dxa"/>
+            <w:tcW w:w="4621" w:type="dxa"/>
             <w:tcBorders/>
             <w:vAlign w:val="center"/>
           </w:tcPr>
@@ -7447,7 +7622,7 @@
         </w:tc>
         <w:tc>
           <w:tcPr>
-            <w:tcW w:w="1699" w:type="dxa"/>
+            <w:tcW w:w="1551" w:type="dxa"/>
             <w:tcBorders/>
             <w:vAlign w:val="center"/>
           </w:tcPr>
@@ -7468,7 +7643,7 @@
         </w:tc>
         <w:tc>
           <w:tcPr>
-            <w:tcW w:w="1841" w:type="dxa"/>
+            <w:tcW w:w="1790" w:type="dxa"/>
             <w:tcBorders/>
             <w:vAlign w:val="center"/>
           </w:tcPr>
@@ -7511,7 +7686,7 @@
         </w:tc>
         <w:tc>
           <w:tcPr>
-            <w:tcW w:w="3540" w:type="dxa"/>
+            <w:tcW w:w="3377" w:type="dxa"/>
             <w:tcBorders/>
             <w:vAlign w:val="center"/>
           </w:tcPr>
@@ -7545,7 +7720,7 @@
         <w:trPr/>
         <w:tc>
           <w:tcPr>
-            <w:tcW w:w="4730" w:type="dxa"/>
+            <w:tcW w:w="4621" w:type="dxa"/>
             <w:tcBorders/>
             <w:vAlign w:val="center"/>
           </w:tcPr>
@@ -7578,7 +7753,7 @@
         </w:tc>
         <w:tc>
           <w:tcPr>
-            <w:tcW w:w="1699" w:type="dxa"/>
+            <w:tcW w:w="1551" w:type="dxa"/>
             <w:tcBorders/>
             <w:vAlign w:val="center"/>
           </w:tcPr>
@@ -7599,7 +7774,7 @@
         </w:tc>
         <w:tc>
           <w:tcPr>
-            <w:tcW w:w="1841" w:type="dxa"/>
+            <w:tcW w:w="1790" w:type="dxa"/>
             <w:tcBorders/>
             <w:vAlign w:val="center"/>
           </w:tcPr>
@@ -7642,7 +7817,7 @@
         </w:tc>
         <w:tc>
           <w:tcPr>
-            <w:tcW w:w="3540" w:type="dxa"/>
+            <w:tcW w:w="3377" w:type="dxa"/>
             <w:tcBorders/>
             <w:vAlign w:val="center"/>
           </w:tcPr>
@@ -7672,7 +7847,7 @@
         <w:trPr/>
         <w:tc>
           <w:tcPr>
-            <w:tcW w:w="4730" w:type="dxa"/>
+            <w:tcW w:w="4621" w:type="dxa"/>
             <w:tcBorders/>
             <w:vAlign w:val="center"/>
           </w:tcPr>
@@ -7695,7 +7870,7 @@
         </w:tc>
         <w:tc>
           <w:tcPr>
-            <w:tcW w:w="1699" w:type="dxa"/>
+            <w:tcW w:w="1551" w:type="dxa"/>
             <w:tcBorders/>
             <w:vAlign w:val="center"/>
           </w:tcPr>
@@ -7716,7 +7891,7 @@
         </w:tc>
         <w:tc>
           <w:tcPr>
-            <w:tcW w:w="1841" w:type="dxa"/>
+            <w:tcW w:w="1790" w:type="dxa"/>
             <w:tcBorders/>
             <w:vAlign w:val="center"/>
           </w:tcPr>
@@ -7769,7 +7944,7 @@
         </w:tc>
         <w:tc>
           <w:tcPr>
-            <w:tcW w:w="3540" w:type="dxa"/>
+            <w:tcW w:w="3377" w:type="dxa"/>
             <w:tcBorders/>
             <w:vAlign w:val="center"/>
           </w:tcPr>
@@ -7799,7 +7974,7 @@
         <w:trPr/>
         <w:tc>
           <w:tcPr>
-            <w:tcW w:w="4730" w:type="dxa"/>
+            <w:tcW w:w="4621" w:type="dxa"/>
             <w:tcBorders/>
             <w:vAlign w:val="center"/>
           </w:tcPr>
@@ -7822,7 +7997,7 @@
         </w:tc>
         <w:tc>
           <w:tcPr>
-            <w:tcW w:w="1699" w:type="dxa"/>
+            <w:tcW w:w="1551" w:type="dxa"/>
             <w:tcBorders/>
             <w:vAlign w:val="center"/>
           </w:tcPr>
@@ -7843,7 +8018,7 @@
         </w:tc>
         <w:tc>
           <w:tcPr>
-            <w:tcW w:w="1841" w:type="dxa"/>
+            <w:tcW w:w="1790" w:type="dxa"/>
             <w:tcBorders/>
             <w:vAlign w:val="center"/>
           </w:tcPr>
@@ -7864,7 +8039,7 @@
         </w:tc>
         <w:tc>
           <w:tcPr>
-            <w:tcW w:w="3540" w:type="dxa"/>
+            <w:tcW w:w="3377" w:type="dxa"/>
             <w:tcBorders/>
             <w:vAlign w:val="center"/>
           </w:tcPr>
@@ -7924,7 +8099,7 @@
         <w:trPr/>
         <w:tc>
           <w:tcPr>
-            <w:tcW w:w="4730" w:type="dxa"/>
+            <w:tcW w:w="4621" w:type="dxa"/>
             <w:tcBorders/>
             <w:vAlign w:val="center"/>
           </w:tcPr>
@@ -7947,7 +8122,7 @@
         </w:tc>
         <w:tc>
           <w:tcPr>
-            <w:tcW w:w="1699" w:type="dxa"/>
+            <w:tcW w:w="1551" w:type="dxa"/>
             <w:tcBorders/>
             <w:vAlign w:val="center"/>
           </w:tcPr>
@@ -7968,7 +8143,7 @@
         </w:tc>
         <w:tc>
           <w:tcPr>
-            <w:tcW w:w="1841" w:type="dxa"/>
+            <w:tcW w:w="1790" w:type="dxa"/>
             <w:tcBorders/>
             <w:vAlign w:val="center"/>
           </w:tcPr>
@@ -7989,7 +8164,7 @@
         </w:tc>
         <w:tc>
           <w:tcPr>
-            <w:tcW w:w="3540" w:type="dxa"/>
+            <w:tcW w:w="3377" w:type="dxa"/>
             <w:tcBorders/>
             <w:vAlign w:val="center"/>
           </w:tcPr>
@@ -8019,7 +8194,7 @@
         <w:trPr/>
         <w:tc>
           <w:tcPr>
-            <w:tcW w:w="4730" w:type="dxa"/>
+            <w:tcW w:w="4621" w:type="dxa"/>
             <w:tcBorders/>
             <w:vAlign w:val="center"/>
           </w:tcPr>
@@ -8042,7 +8217,7 @@
         </w:tc>
         <w:tc>
           <w:tcPr>
-            <w:tcW w:w="1699" w:type="dxa"/>
+            <w:tcW w:w="1551" w:type="dxa"/>
             <w:tcBorders/>
             <w:vAlign w:val="center"/>
           </w:tcPr>
@@ -8063,7 +8238,7 @@
         </w:tc>
         <w:tc>
           <w:tcPr>
-            <w:tcW w:w="1841" w:type="dxa"/>
+            <w:tcW w:w="1790" w:type="dxa"/>
             <w:tcBorders/>
             <w:vAlign w:val="center"/>
           </w:tcPr>
@@ -8084,7 +8259,7 @@
         </w:tc>
         <w:tc>
           <w:tcPr>
-            <w:tcW w:w="3540" w:type="dxa"/>
+            <w:tcW w:w="3377" w:type="dxa"/>
             <w:tcBorders/>
             <w:vAlign w:val="center"/>
           </w:tcPr>
@@ -8124,7 +8299,7 @@
         <w:trPr/>
         <w:tc>
           <w:tcPr>
-            <w:tcW w:w="4730" w:type="dxa"/>
+            <w:tcW w:w="4621" w:type="dxa"/>
             <w:tcBorders/>
             <w:vAlign w:val="center"/>
           </w:tcPr>
@@ -8157,7 +8332,7 @@
         </w:tc>
         <w:tc>
           <w:tcPr>
-            <w:tcW w:w="1699" w:type="dxa"/>
+            <w:tcW w:w="1551" w:type="dxa"/>
             <w:tcBorders/>
             <w:vAlign w:val="center"/>
           </w:tcPr>
@@ -8178,7 +8353,7 @@
         </w:tc>
         <w:tc>
           <w:tcPr>
-            <w:tcW w:w="1841" w:type="dxa"/>
+            <w:tcW w:w="1790" w:type="dxa"/>
             <w:tcBorders/>
             <w:vAlign w:val="center"/>
           </w:tcPr>
@@ -8199,7 +8374,7 @@
         </w:tc>
         <w:tc>
           <w:tcPr>
-            <w:tcW w:w="3540" w:type="dxa"/>
+            <w:tcW w:w="3377" w:type="dxa"/>
             <w:tcBorders/>
             <w:vAlign w:val="center"/>
           </w:tcPr>
@@ -8223,7 +8398,7 @@
         <w:trPr/>
         <w:tc>
           <w:tcPr>
-            <w:tcW w:w="4730" w:type="dxa"/>
+            <w:tcW w:w="4621" w:type="dxa"/>
             <w:tcBorders/>
             <w:vAlign w:val="center"/>
           </w:tcPr>
@@ -8246,7 +8421,7 @@
         </w:tc>
         <w:tc>
           <w:tcPr>
-            <w:tcW w:w="1699" w:type="dxa"/>
+            <w:tcW w:w="1551" w:type="dxa"/>
             <w:tcBorders/>
             <w:vAlign w:val="center"/>
           </w:tcPr>
@@ -8267,7 +8442,7 @@
         </w:tc>
         <w:tc>
           <w:tcPr>
-            <w:tcW w:w="1841" w:type="dxa"/>
+            <w:tcW w:w="1790" w:type="dxa"/>
             <w:tcBorders/>
             <w:vAlign w:val="center"/>
           </w:tcPr>
@@ -8294,7 +8469,7 @@
         </w:tc>
         <w:tc>
           <w:tcPr>
-            <w:tcW w:w="3540" w:type="dxa"/>
+            <w:tcW w:w="3377" w:type="dxa"/>
             <w:tcBorders/>
             <w:vAlign w:val="center"/>
           </w:tcPr>
@@ -8334,7 +8509,7 @@
         <w:trPr/>
         <w:tc>
           <w:tcPr>
-            <w:tcW w:w="4730" w:type="dxa"/>
+            <w:tcW w:w="4621" w:type="dxa"/>
             <w:tcBorders/>
             <w:vAlign w:val="center"/>
           </w:tcPr>
@@ -8357,7 +8532,7 @@
         </w:tc>
         <w:tc>
           <w:tcPr>
-            <w:tcW w:w="1699" w:type="dxa"/>
+            <w:tcW w:w="1551" w:type="dxa"/>
             <w:tcBorders/>
             <w:vAlign w:val="center"/>
           </w:tcPr>
@@ -8378,7 +8553,7 @@
         </w:tc>
         <w:tc>
           <w:tcPr>
-            <w:tcW w:w="1841" w:type="dxa"/>
+            <w:tcW w:w="1790" w:type="dxa"/>
             <w:tcBorders/>
             <w:vAlign w:val="center"/>
           </w:tcPr>
@@ -8399,7 +8574,7 @@
         </w:tc>
         <w:tc>
           <w:tcPr>
-            <w:tcW w:w="3540" w:type="dxa"/>
+            <w:tcW w:w="3377" w:type="dxa"/>
             <w:tcBorders/>
             <w:vAlign w:val="center"/>
           </w:tcPr>
@@ -8429,7 +8604,7 @@
         <w:trPr/>
         <w:tc>
           <w:tcPr>
-            <w:tcW w:w="4730" w:type="dxa"/>
+            <w:tcW w:w="4621" w:type="dxa"/>
             <w:tcBorders/>
             <w:vAlign w:val="center"/>
           </w:tcPr>
@@ -8452,7 +8627,7 @@
         </w:tc>
         <w:tc>
           <w:tcPr>
-            <w:tcW w:w="1699" w:type="dxa"/>
+            <w:tcW w:w="1551" w:type="dxa"/>
             <w:tcBorders/>
             <w:vAlign w:val="center"/>
           </w:tcPr>
@@ -8473,7 +8648,7 @@
         </w:tc>
         <w:tc>
           <w:tcPr>
-            <w:tcW w:w="1841" w:type="dxa"/>
+            <w:tcW w:w="1790" w:type="dxa"/>
             <w:tcBorders/>
             <w:vAlign w:val="center"/>
           </w:tcPr>
@@ -8504,7 +8679,7 @@
         </w:tc>
         <w:tc>
           <w:tcPr>
-            <w:tcW w:w="3540" w:type="dxa"/>
+            <w:tcW w:w="3377" w:type="dxa"/>
             <w:tcBorders/>
             <w:vAlign w:val="center"/>
           </w:tcPr>
@@ -9739,9 +9914,9 @@
     </w:p>
     <w:tbl>
       <w:tblPr>
-        <w:tblW w:w="11810" w:type="dxa"/>
+        <w:tblW w:w="11339" w:type="dxa"/>
         <w:jc w:val="left"/>
-        <w:tblInd w:w="0" w:type="dxa"/>
+        <w:tblInd w:w="28" w:type="dxa"/>
         <w:tblLayout w:type="fixed"/>
         <w:tblCellMar>
           <w:top w:w="28" w:type="dxa"/>
@@ -9751,10 +9926,10 @@
         </w:tblCellMar>
       </w:tblPr>
       <w:tblGrid>
-        <w:gridCol w:w="2554"/>
-        <w:gridCol w:w="4096"/>
-        <w:gridCol w:w="1859"/>
-        <w:gridCol w:w="3301"/>
+        <w:gridCol w:w="2285"/>
+        <w:gridCol w:w="4100"/>
+        <w:gridCol w:w="1802"/>
+        <w:gridCol w:w="3152"/>
       </w:tblGrid>
       <w:tr>
         <w:trPr>
@@ -9762,7 +9937,7 @@
         </w:trPr>
         <w:tc>
           <w:tcPr>
-            <w:tcW w:w="2554" w:type="dxa"/>
+            <w:tcW w:w="2285" w:type="dxa"/>
             <w:tcBorders/>
             <w:vAlign w:val="center"/>
           </w:tcPr>
@@ -9784,7 +9959,7 @@
         </w:tc>
         <w:tc>
           <w:tcPr>
-            <w:tcW w:w="4096" w:type="dxa"/>
+            <w:tcW w:w="4100" w:type="dxa"/>
             <w:tcBorders/>
             <w:vAlign w:val="center"/>
           </w:tcPr>
@@ -9806,7 +9981,7 @@
         </w:tc>
         <w:tc>
           <w:tcPr>
-            <w:tcW w:w="1859" w:type="dxa"/>
+            <w:tcW w:w="1802" w:type="dxa"/>
             <w:tcBorders/>
             <w:vAlign w:val="center"/>
           </w:tcPr>
@@ -9828,7 +10003,7 @@
         </w:tc>
         <w:tc>
           <w:tcPr>
-            <w:tcW w:w="3301" w:type="dxa"/>
+            <w:tcW w:w="3152" w:type="dxa"/>
             <w:tcBorders/>
             <w:vAlign w:val="center"/>
           </w:tcPr>
@@ -9853,7 +10028,7 @@
         <w:trPr/>
         <w:tc>
           <w:tcPr>
-            <w:tcW w:w="2554" w:type="dxa"/>
+            <w:tcW w:w="2285" w:type="dxa"/>
             <w:tcBorders/>
             <w:vAlign w:val="center"/>
           </w:tcPr>
@@ -9890,7 +10065,7 @@
         </w:tc>
         <w:tc>
           <w:tcPr>
-            <w:tcW w:w="4096" w:type="dxa"/>
+            <w:tcW w:w="4100" w:type="dxa"/>
             <w:tcBorders/>
             <w:vAlign w:val="center"/>
           </w:tcPr>
@@ -9913,7 +10088,7 @@
         </w:tc>
         <w:tc>
           <w:tcPr>
-            <w:tcW w:w="1859" w:type="dxa"/>
+            <w:tcW w:w="1802" w:type="dxa"/>
             <w:tcBorders/>
             <w:vAlign w:val="center"/>
           </w:tcPr>
@@ -9936,7 +10111,7 @@
         </w:tc>
         <w:tc>
           <w:tcPr>
-            <w:tcW w:w="3301" w:type="dxa"/>
+            <w:tcW w:w="3152" w:type="dxa"/>
             <w:tcBorders/>
             <w:vAlign w:val="center"/>
           </w:tcPr>
@@ -9960,7 +10135,7 @@
         <w:trPr/>
         <w:tc>
           <w:tcPr>
-            <w:tcW w:w="2554" w:type="dxa"/>
+            <w:tcW w:w="2285" w:type="dxa"/>
             <w:tcBorders/>
             <w:vAlign w:val="center"/>
           </w:tcPr>
@@ -9981,7 +10156,7 @@
         </w:tc>
         <w:tc>
           <w:tcPr>
-            <w:tcW w:w="4096" w:type="dxa"/>
+            <w:tcW w:w="4100" w:type="dxa"/>
             <w:tcBorders/>
             <w:vAlign w:val="center"/>
           </w:tcPr>
@@ -10004,7 +10179,7 @@
         </w:tc>
         <w:tc>
           <w:tcPr>
-            <w:tcW w:w="1859" w:type="dxa"/>
+            <w:tcW w:w="1802" w:type="dxa"/>
             <w:tcBorders/>
             <w:vAlign w:val="center"/>
           </w:tcPr>
@@ -10077,7 +10252,7 @@
         </w:tc>
         <w:tc>
           <w:tcPr>
-            <w:tcW w:w="3301" w:type="dxa"/>
+            <w:tcW w:w="3152" w:type="dxa"/>
             <w:tcBorders/>
             <w:vAlign w:val="center"/>
           </w:tcPr>
@@ -10101,7 +10276,7 @@
         <w:trPr/>
         <w:tc>
           <w:tcPr>
-            <w:tcW w:w="2554" w:type="dxa"/>
+            <w:tcW w:w="2285" w:type="dxa"/>
             <w:tcBorders/>
             <w:vAlign w:val="center"/>
           </w:tcPr>
@@ -10122,7 +10297,7 @@
         </w:tc>
         <w:tc>
           <w:tcPr>
-            <w:tcW w:w="4096" w:type="dxa"/>
+            <w:tcW w:w="4100" w:type="dxa"/>
             <w:tcBorders/>
             <w:vAlign w:val="center"/>
           </w:tcPr>
@@ -10145,7 +10320,7 @@
         </w:tc>
         <w:tc>
           <w:tcPr>
-            <w:tcW w:w="1859" w:type="dxa"/>
+            <w:tcW w:w="1802" w:type="dxa"/>
             <w:tcBorders/>
             <w:vAlign w:val="center"/>
           </w:tcPr>
@@ -10166,7 +10341,7 @@
         </w:tc>
         <w:tc>
           <w:tcPr>
-            <w:tcW w:w="3301" w:type="dxa"/>
+            <w:tcW w:w="3152" w:type="dxa"/>
             <w:tcBorders/>
             <w:vAlign w:val="center"/>
           </w:tcPr>
@@ -10190,7 +10365,7 @@
         <w:trPr/>
         <w:tc>
           <w:tcPr>
-            <w:tcW w:w="2554" w:type="dxa"/>
+            <w:tcW w:w="2285" w:type="dxa"/>
             <w:tcBorders/>
             <w:vAlign w:val="center"/>
           </w:tcPr>
@@ -10211,7 +10386,7 @@
         </w:tc>
         <w:tc>
           <w:tcPr>
-            <w:tcW w:w="4096" w:type="dxa"/>
+            <w:tcW w:w="4100" w:type="dxa"/>
             <w:tcBorders/>
             <w:vAlign w:val="center"/>
           </w:tcPr>
@@ -10234,7 +10409,7 @@
         </w:tc>
         <w:tc>
           <w:tcPr>
-            <w:tcW w:w="1859" w:type="dxa"/>
+            <w:tcW w:w="1802" w:type="dxa"/>
             <w:tcBorders/>
             <w:vAlign w:val="center"/>
           </w:tcPr>
@@ -10257,7 +10432,7 @@
         </w:tc>
         <w:tc>
           <w:tcPr>
-            <w:tcW w:w="3301" w:type="dxa"/>
+            <w:tcW w:w="3152" w:type="dxa"/>
             <w:tcBorders/>
             <w:vAlign w:val="center"/>
           </w:tcPr>
@@ -10281,7 +10456,7 @@
         <w:trPr/>
         <w:tc>
           <w:tcPr>
-            <w:tcW w:w="2554" w:type="dxa"/>
+            <w:tcW w:w="2285" w:type="dxa"/>
             <w:tcBorders/>
             <w:vAlign w:val="center"/>
           </w:tcPr>
@@ -10302,7 +10477,7 @@
         </w:tc>
         <w:tc>
           <w:tcPr>
-            <w:tcW w:w="4096" w:type="dxa"/>
+            <w:tcW w:w="4100" w:type="dxa"/>
             <w:tcBorders/>
             <w:vAlign w:val="center"/>
           </w:tcPr>
@@ -10325,7 +10500,7 @@
         </w:tc>
         <w:tc>
           <w:tcPr>
-            <w:tcW w:w="1859" w:type="dxa"/>
+            <w:tcW w:w="1802" w:type="dxa"/>
             <w:tcBorders/>
             <w:vAlign w:val="center"/>
           </w:tcPr>
@@ -10348,7 +10523,7 @@
         </w:tc>
         <w:tc>
           <w:tcPr>
-            <w:tcW w:w="3301" w:type="dxa"/>
+            <w:tcW w:w="3152" w:type="dxa"/>
             <w:tcBorders/>
             <w:vAlign w:val="center"/>
           </w:tcPr>
@@ -10372,7 +10547,7 @@
         <w:trPr/>
         <w:tc>
           <w:tcPr>
-            <w:tcW w:w="2554" w:type="dxa"/>
+            <w:tcW w:w="2285" w:type="dxa"/>
             <w:tcBorders/>
             <w:vAlign w:val="center"/>
           </w:tcPr>
@@ -10399,7 +10574,7 @@
         </w:tc>
         <w:tc>
           <w:tcPr>
-            <w:tcW w:w="4096" w:type="dxa"/>
+            <w:tcW w:w="4100" w:type="dxa"/>
             <w:tcBorders/>
             <w:vAlign w:val="center"/>
           </w:tcPr>
@@ -10422,7 +10597,7 @@
         </w:tc>
         <w:tc>
           <w:tcPr>
-            <w:tcW w:w="1859" w:type="dxa"/>
+            <w:tcW w:w="1802" w:type="dxa"/>
             <w:tcBorders/>
             <w:vAlign w:val="center"/>
           </w:tcPr>
@@ -10445,7 +10620,7 @@
         </w:tc>
         <w:tc>
           <w:tcPr>
-            <w:tcW w:w="3301" w:type="dxa"/>
+            <w:tcW w:w="3152" w:type="dxa"/>
             <w:tcBorders/>
             <w:vAlign w:val="center"/>
           </w:tcPr>
@@ -10479,7 +10654,7 @@
         <w:trPr/>
         <w:tc>
           <w:tcPr>
-            <w:tcW w:w="2554" w:type="dxa"/>
+            <w:tcW w:w="2285" w:type="dxa"/>
             <w:tcBorders/>
             <w:vAlign w:val="center"/>
           </w:tcPr>
@@ -10502,7 +10677,7 @@
         </w:tc>
         <w:tc>
           <w:tcPr>
-            <w:tcW w:w="4096" w:type="dxa"/>
+            <w:tcW w:w="4100" w:type="dxa"/>
             <w:tcBorders/>
             <w:vAlign w:val="center"/>
           </w:tcPr>
@@ -10525,7 +10700,7 @@
         </w:tc>
         <w:tc>
           <w:tcPr>
-            <w:tcW w:w="1859" w:type="dxa"/>
+            <w:tcW w:w="1802" w:type="dxa"/>
             <w:tcBorders/>
             <w:vAlign w:val="center"/>
           </w:tcPr>
@@ -10548,7 +10723,7 @@
         </w:tc>
         <w:tc>
           <w:tcPr>
-            <w:tcW w:w="3301" w:type="dxa"/>
+            <w:tcW w:w="3152" w:type="dxa"/>
             <w:tcBorders/>
             <w:vAlign w:val="center"/>
           </w:tcPr>
@@ -10602,7 +10777,7 @@
         <w:trPr/>
         <w:tc>
           <w:tcPr>
-            <w:tcW w:w="2554" w:type="dxa"/>
+            <w:tcW w:w="2285" w:type="dxa"/>
             <w:tcBorders/>
             <w:vAlign w:val="center"/>
           </w:tcPr>
@@ -10639,7 +10814,7 @@
         </w:tc>
         <w:tc>
           <w:tcPr>
-            <w:tcW w:w="4096" w:type="dxa"/>
+            <w:tcW w:w="4100" w:type="dxa"/>
             <w:tcBorders/>
             <w:vAlign w:val="center"/>
           </w:tcPr>
@@ -10662,7 +10837,7 @@
         </w:tc>
         <w:tc>
           <w:tcPr>
-            <w:tcW w:w="1859" w:type="dxa"/>
+            <w:tcW w:w="1802" w:type="dxa"/>
             <w:tcBorders/>
             <w:vAlign w:val="center"/>
           </w:tcPr>
@@ -10685,7 +10860,7 @@
         </w:tc>
         <w:tc>
           <w:tcPr>
-            <w:tcW w:w="3301" w:type="dxa"/>
+            <w:tcW w:w="3152" w:type="dxa"/>
             <w:tcBorders/>
             <w:vAlign w:val="center"/>
           </w:tcPr>
@@ -10719,7 +10894,7 @@
         <w:trPr/>
         <w:tc>
           <w:tcPr>
-            <w:tcW w:w="2554" w:type="dxa"/>
+            <w:tcW w:w="2285" w:type="dxa"/>
             <w:tcBorders/>
             <w:vAlign w:val="center"/>
           </w:tcPr>
@@ -10742,7 +10917,7 @@
         </w:tc>
         <w:tc>
           <w:tcPr>
-            <w:tcW w:w="4096" w:type="dxa"/>
+            <w:tcW w:w="4100" w:type="dxa"/>
             <w:tcBorders/>
             <w:vAlign w:val="center"/>
           </w:tcPr>
@@ -10765,7 +10940,7 @@
         </w:tc>
         <w:tc>
           <w:tcPr>
-            <w:tcW w:w="1859" w:type="dxa"/>
+            <w:tcW w:w="1802" w:type="dxa"/>
             <w:tcBorders/>
             <w:vAlign w:val="center"/>
           </w:tcPr>
@@ -10788,7 +10963,7 @@
         </w:tc>
         <w:tc>
           <w:tcPr>
-            <w:tcW w:w="3301" w:type="dxa"/>
+            <w:tcW w:w="3152" w:type="dxa"/>
             <w:tcBorders/>
             <w:vAlign w:val="center"/>
           </w:tcPr>
@@ -10812,7 +10987,7 @@
         <w:trPr/>
         <w:tc>
           <w:tcPr>
-            <w:tcW w:w="2554" w:type="dxa"/>
+            <w:tcW w:w="2285" w:type="dxa"/>
             <w:tcBorders/>
             <w:vAlign w:val="center"/>
           </w:tcPr>
@@ -10835,7 +11010,7 @@
         </w:tc>
         <w:tc>
           <w:tcPr>
-            <w:tcW w:w="4096" w:type="dxa"/>
+            <w:tcW w:w="4100" w:type="dxa"/>
             <w:tcBorders/>
             <w:vAlign w:val="center"/>
           </w:tcPr>
@@ -10858,7 +11033,7 @@
         </w:tc>
         <w:tc>
           <w:tcPr>
-            <w:tcW w:w="1859" w:type="dxa"/>
+            <w:tcW w:w="1802" w:type="dxa"/>
             <w:tcBorders/>
             <w:vAlign w:val="center"/>
           </w:tcPr>
@@ -10881,7 +11056,7 @@
         </w:tc>
         <w:tc>
           <w:tcPr>
-            <w:tcW w:w="3301" w:type="dxa"/>
+            <w:tcW w:w="3152" w:type="dxa"/>
             <w:tcBorders/>
             <w:vAlign w:val="center"/>
           </w:tcPr>
@@ -10905,7 +11080,7 @@
         <w:trPr/>
         <w:tc>
           <w:tcPr>
-            <w:tcW w:w="2554" w:type="dxa"/>
+            <w:tcW w:w="2285" w:type="dxa"/>
             <w:tcBorders/>
             <w:vAlign w:val="center"/>
           </w:tcPr>
@@ -10928,7 +11103,7 @@
         </w:tc>
         <w:tc>
           <w:tcPr>
-            <w:tcW w:w="4096" w:type="dxa"/>
+            <w:tcW w:w="4100" w:type="dxa"/>
             <w:tcBorders/>
             <w:vAlign w:val="center"/>
           </w:tcPr>
@@ -10951,7 +11126,7 @@
         </w:tc>
         <w:tc>
           <w:tcPr>
-            <w:tcW w:w="1859" w:type="dxa"/>
+            <w:tcW w:w="1802" w:type="dxa"/>
             <w:tcBorders/>
             <w:vAlign w:val="center"/>
           </w:tcPr>
@@ -10974,7 +11149,7 @@
         </w:tc>
         <w:tc>
           <w:tcPr>
-            <w:tcW w:w="3301" w:type="dxa"/>
+            <w:tcW w:w="3152" w:type="dxa"/>
             <w:tcBorders/>
             <w:vAlign w:val="center"/>
           </w:tcPr>
@@ -11194,9 +11369,9 @@
     </w:p>
     <w:tbl>
       <w:tblPr>
-        <w:tblW w:w="11253" w:type="dxa"/>
+        <w:tblW w:w="10959" w:type="dxa"/>
         <w:jc w:val="left"/>
-        <w:tblInd w:w="0" w:type="dxa"/>
+        <w:tblInd w:w="28" w:type="dxa"/>
         <w:tblLayout w:type="fixed"/>
         <w:tblCellMar>
           <w:top w:w="28" w:type="dxa"/>
@@ -11206,9 +11381,9 @@
         </w:tblCellMar>
       </w:tblPr>
       <w:tblGrid>
-        <w:gridCol w:w="3751"/>
-        <w:gridCol w:w="3091"/>
-        <w:gridCol w:w="4411"/>
+        <w:gridCol w:w="3762"/>
+        <w:gridCol w:w="2975"/>
+        <w:gridCol w:w="4222"/>
       </w:tblGrid>
       <w:tr>
         <w:trPr>
@@ -11216,7 +11391,7 @@
         </w:trPr>
         <w:tc>
           <w:tcPr>
-            <w:tcW w:w="3751" w:type="dxa"/>
+            <w:tcW w:w="3762" w:type="dxa"/>
             <w:tcBorders/>
             <w:vAlign w:val="center"/>
           </w:tcPr>
@@ -11238,7 +11413,7 @@
         </w:tc>
         <w:tc>
           <w:tcPr>
-            <w:tcW w:w="3091" w:type="dxa"/>
+            <w:tcW w:w="2975" w:type="dxa"/>
             <w:tcBorders/>
             <w:vAlign w:val="center"/>
           </w:tcPr>
@@ -11260,7 +11435,7 @@
         </w:tc>
         <w:tc>
           <w:tcPr>
-            <w:tcW w:w="4411" w:type="dxa"/>
+            <w:tcW w:w="4222" w:type="dxa"/>
             <w:tcBorders/>
             <w:vAlign w:val="center"/>
           </w:tcPr>
@@ -11285,7 +11460,7 @@
         <w:trPr/>
         <w:tc>
           <w:tcPr>
-            <w:tcW w:w="3751" w:type="dxa"/>
+            <w:tcW w:w="3762" w:type="dxa"/>
             <w:tcBorders/>
             <w:vAlign w:val="center"/>
           </w:tcPr>
@@ -11308,7 +11483,7 @@
         </w:tc>
         <w:tc>
           <w:tcPr>
-            <w:tcW w:w="3091" w:type="dxa"/>
+            <w:tcW w:w="2975" w:type="dxa"/>
             <w:tcBorders/>
             <w:vAlign w:val="center"/>
           </w:tcPr>
@@ -11329,7 +11504,7 @@
         </w:tc>
         <w:tc>
           <w:tcPr>
-            <w:tcW w:w="4411" w:type="dxa"/>
+            <w:tcW w:w="4222" w:type="dxa"/>
             <w:tcBorders/>
             <w:vAlign w:val="center"/>
           </w:tcPr>
@@ -11353,7 +11528,7 @@
         <w:trPr/>
         <w:tc>
           <w:tcPr>
-            <w:tcW w:w="3751" w:type="dxa"/>
+            <w:tcW w:w="3762" w:type="dxa"/>
             <w:tcBorders/>
             <w:vAlign w:val="center"/>
           </w:tcPr>
@@ -11376,7 +11551,7 @@
         </w:tc>
         <w:tc>
           <w:tcPr>
-            <w:tcW w:w="3091" w:type="dxa"/>
+            <w:tcW w:w="2975" w:type="dxa"/>
             <w:tcBorders/>
             <w:vAlign w:val="center"/>
           </w:tcPr>
@@ -11397,7 +11572,7 @@
         </w:tc>
         <w:tc>
           <w:tcPr>
-            <w:tcW w:w="4411" w:type="dxa"/>
+            <w:tcW w:w="4222" w:type="dxa"/>
             <w:tcBorders/>
             <w:vAlign w:val="center"/>
           </w:tcPr>
@@ -11878,9 +12053,9 @@
     </w:p>
     <w:tbl>
       <w:tblPr>
-        <w:tblW w:w="11810" w:type="dxa"/>
+        <w:tblW w:w="11339" w:type="dxa"/>
         <w:jc w:val="left"/>
-        <w:tblInd w:w="0" w:type="dxa"/>
+        <w:tblInd w:w="28" w:type="dxa"/>
         <w:tblLayout w:type="fixed"/>
         <w:tblCellMar>
           <w:top w:w="28" w:type="dxa"/>
@@ -11890,9 +12065,9 @@
         </w:tblCellMar>
       </w:tblPr>
       <w:tblGrid>
-        <w:gridCol w:w="1186"/>
-        <w:gridCol w:w="8225"/>
-        <w:gridCol w:w="2399"/>
+        <w:gridCol w:w="1180"/>
+        <w:gridCol w:w="7903"/>
+        <w:gridCol w:w="2256"/>
       </w:tblGrid>
       <w:tr>
         <w:trPr>
@@ -11900,7 +12075,7 @@
         </w:trPr>
         <w:tc>
           <w:tcPr>
-            <w:tcW w:w="1186" w:type="dxa"/>
+            <w:tcW w:w="1180" w:type="dxa"/>
             <w:tcBorders/>
             <w:vAlign w:val="center"/>
           </w:tcPr>
@@ -11922,7 +12097,7 @@
         </w:tc>
         <w:tc>
           <w:tcPr>
-            <w:tcW w:w="8225" w:type="dxa"/>
+            <w:tcW w:w="7903" w:type="dxa"/>
             <w:tcBorders/>
             <w:vAlign w:val="center"/>
           </w:tcPr>
@@ -11944,7 +12119,7 @@
         </w:tc>
         <w:tc>
           <w:tcPr>
-            <w:tcW w:w="2399" w:type="dxa"/>
+            <w:tcW w:w="2256" w:type="dxa"/>
             <w:tcBorders/>
             <w:vAlign w:val="center"/>
           </w:tcPr>
@@ -11979,7 +12154,7 @@
         <w:trPr/>
         <w:tc>
           <w:tcPr>
-            <w:tcW w:w="1186" w:type="dxa"/>
+            <w:tcW w:w="1180" w:type="dxa"/>
             <w:tcBorders/>
             <w:vAlign w:val="center"/>
           </w:tcPr>
@@ -12002,7 +12177,7 @@
         </w:tc>
         <w:tc>
           <w:tcPr>
-            <w:tcW w:w="8225" w:type="dxa"/>
+            <w:tcW w:w="7903" w:type="dxa"/>
             <w:tcBorders/>
             <w:vAlign w:val="center"/>
           </w:tcPr>
@@ -12033,7 +12208,7 @@
         </w:tc>
         <w:tc>
           <w:tcPr>
-            <w:tcW w:w="2399" w:type="dxa"/>
+            <w:tcW w:w="2256" w:type="dxa"/>
             <w:tcBorders/>
             <w:vAlign w:val="center"/>
           </w:tcPr>
@@ -12077,7 +12252,7 @@
         <w:trPr/>
         <w:tc>
           <w:tcPr>
-            <w:tcW w:w="1186" w:type="dxa"/>
+            <w:tcW w:w="1180" w:type="dxa"/>
             <w:tcBorders/>
             <w:vAlign w:val="center"/>
           </w:tcPr>
@@ -12100,7 +12275,7 @@
         </w:tc>
         <w:tc>
           <w:tcPr>
-            <w:tcW w:w="8225" w:type="dxa"/>
+            <w:tcW w:w="7903" w:type="dxa"/>
             <w:tcBorders/>
             <w:vAlign w:val="center"/>
           </w:tcPr>
@@ -12131,7 +12306,7 @@
         </w:tc>
         <w:tc>
           <w:tcPr>
-            <w:tcW w:w="2399" w:type="dxa"/>
+            <w:tcW w:w="2256" w:type="dxa"/>
             <w:tcBorders/>
             <w:vAlign w:val="center"/>
           </w:tcPr>
@@ -12175,7 +12350,7 @@
         <w:trPr/>
         <w:tc>
           <w:tcPr>
-            <w:tcW w:w="1186" w:type="dxa"/>
+            <w:tcW w:w="1180" w:type="dxa"/>
             <w:tcBorders/>
             <w:vAlign w:val="center"/>
           </w:tcPr>
@@ -12198,7 +12373,7 @@
         </w:tc>
         <w:tc>
           <w:tcPr>
-            <w:tcW w:w="8225" w:type="dxa"/>
+            <w:tcW w:w="7903" w:type="dxa"/>
             <w:tcBorders/>
             <w:vAlign w:val="center"/>
           </w:tcPr>
@@ -12219,7 +12394,7 @@
         </w:tc>
         <w:tc>
           <w:tcPr>
-            <w:tcW w:w="2399" w:type="dxa"/>
+            <w:tcW w:w="2256" w:type="dxa"/>
             <w:tcBorders/>
             <w:vAlign w:val="center"/>
           </w:tcPr>
@@ -12249,7 +12424,7 @@
         <w:trPr/>
         <w:tc>
           <w:tcPr>
-            <w:tcW w:w="1186" w:type="dxa"/>
+            <w:tcW w:w="1180" w:type="dxa"/>
             <w:tcBorders/>
             <w:vAlign w:val="center"/>
           </w:tcPr>
@@ -12272,7 +12447,7 @@
         </w:tc>
         <w:tc>
           <w:tcPr>
-            <w:tcW w:w="8225" w:type="dxa"/>
+            <w:tcW w:w="7903" w:type="dxa"/>
             <w:tcBorders/>
             <w:vAlign w:val="center"/>
           </w:tcPr>
@@ -12355,7 +12530,7 @@
         </w:tc>
         <w:tc>
           <w:tcPr>
-            <w:tcW w:w="2399" w:type="dxa"/>
+            <w:tcW w:w="2256" w:type="dxa"/>
             <w:tcBorders/>
             <w:vAlign w:val="center"/>
           </w:tcPr>
@@ -12379,7 +12554,7 @@
         <w:trPr/>
         <w:tc>
           <w:tcPr>
-            <w:tcW w:w="1186" w:type="dxa"/>
+            <w:tcW w:w="1180" w:type="dxa"/>
             <w:tcBorders/>
             <w:vAlign w:val="center"/>
           </w:tcPr>
@@ -12402,7 +12577,7 @@
         </w:tc>
         <w:tc>
           <w:tcPr>
-            <w:tcW w:w="8225" w:type="dxa"/>
+            <w:tcW w:w="7903" w:type="dxa"/>
             <w:tcBorders/>
             <w:vAlign w:val="center"/>
           </w:tcPr>
@@ -12423,7 +12598,7 @@
         </w:tc>
         <w:tc>
           <w:tcPr>
-            <w:tcW w:w="2399" w:type="dxa"/>
+            <w:tcW w:w="2256" w:type="dxa"/>
             <w:tcBorders/>
             <w:vAlign w:val="center"/>
           </w:tcPr>
@@ -12503,9 +12678,9 @@
     </w:p>
     <w:tbl>
       <w:tblPr>
-        <w:tblW w:w="11810" w:type="dxa"/>
+        <w:tblW w:w="11339" w:type="dxa"/>
         <w:jc w:val="left"/>
-        <w:tblInd w:w="0" w:type="dxa"/>
+        <w:tblInd w:w="28" w:type="dxa"/>
         <w:tblLayout w:type="fixed"/>
         <w:tblCellMar>
           <w:top w:w="28" w:type="dxa"/>
@@ -12515,8 +12690,8 @@
         </w:tblCellMar>
       </w:tblPr>
       <w:tblGrid>
-        <w:gridCol w:w="5490"/>
-        <w:gridCol w:w="6320"/>
+        <w:gridCol w:w="5449"/>
+        <w:gridCol w:w="5890"/>
       </w:tblGrid>
       <w:tr>
         <w:trPr>
@@ -12524,7 +12699,7 @@
         </w:trPr>
         <w:tc>
           <w:tcPr>
-            <w:tcW w:w="5490" w:type="dxa"/>
+            <w:tcW w:w="5449" w:type="dxa"/>
             <w:tcBorders/>
             <w:vAlign w:val="center"/>
           </w:tcPr>
@@ -12546,7 +12721,7 @@
         </w:tc>
         <w:tc>
           <w:tcPr>
-            <w:tcW w:w="6320" w:type="dxa"/>
+            <w:tcW w:w="5890" w:type="dxa"/>
             <w:tcBorders/>
             <w:vAlign w:val="center"/>
           </w:tcPr>
@@ -12571,7 +12746,7 @@
         <w:trPr/>
         <w:tc>
           <w:tcPr>
-            <w:tcW w:w="5490" w:type="dxa"/>
+            <w:tcW w:w="5449" w:type="dxa"/>
             <w:tcBorders/>
             <w:vAlign w:val="center"/>
           </w:tcPr>
@@ -12594,7 +12769,7 @@
         </w:tc>
         <w:tc>
           <w:tcPr>
-            <w:tcW w:w="6320" w:type="dxa"/>
+            <w:tcW w:w="5890" w:type="dxa"/>
             <w:tcBorders/>
             <w:vAlign w:val="center"/>
           </w:tcPr>
@@ -12618,7 +12793,7 @@
         <w:trPr/>
         <w:tc>
           <w:tcPr>
-            <w:tcW w:w="5490" w:type="dxa"/>
+            <w:tcW w:w="5449" w:type="dxa"/>
             <w:tcBorders/>
             <w:vAlign w:val="center"/>
           </w:tcPr>
@@ -12641,7 +12816,7 @@
         </w:tc>
         <w:tc>
           <w:tcPr>
-            <w:tcW w:w="6320" w:type="dxa"/>
+            <w:tcW w:w="5890" w:type="dxa"/>
             <w:tcBorders/>
             <w:vAlign w:val="center"/>
           </w:tcPr>
@@ -12675,7 +12850,7 @@
         <w:trPr/>
         <w:tc>
           <w:tcPr>
-            <w:tcW w:w="5490" w:type="dxa"/>
+            <w:tcW w:w="5449" w:type="dxa"/>
             <w:tcBorders/>
             <w:vAlign w:val="center"/>
           </w:tcPr>
@@ -12698,7 +12873,7 @@
         </w:tc>
         <w:tc>
           <w:tcPr>
-            <w:tcW w:w="6320" w:type="dxa"/>
+            <w:tcW w:w="5890" w:type="dxa"/>
             <w:tcBorders/>
             <w:vAlign w:val="center"/>
           </w:tcPr>
@@ -12722,7 +12897,7 @@
         <w:trPr/>
         <w:tc>
           <w:tcPr>
-            <w:tcW w:w="5490" w:type="dxa"/>
+            <w:tcW w:w="5449" w:type="dxa"/>
             <w:tcBorders/>
             <w:vAlign w:val="center"/>
           </w:tcPr>
@@ -12745,7 +12920,7 @@
         </w:tc>
         <w:tc>
           <w:tcPr>
-            <w:tcW w:w="6320" w:type="dxa"/>
+            <w:tcW w:w="5890" w:type="dxa"/>
             <w:tcBorders/>
             <w:vAlign w:val="center"/>
           </w:tcPr>
@@ -12769,7 +12944,7 @@
         <w:trPr/>
         <w:tc>
           <w:tcPr>
-            <w:tcW w:w="5490" w:type="dxa"/>
+            <w:tcW w:w="5449" w:type="dxa"/>
             <w:tcBorders/>
             <w:vAlign w:val="center"/>
           </w:tcPr>
@@ -12792,7 +12967,7 @@
         </w:tc>
         <w:tc>
           <w:tcPr>
-            <w:tcW w:w="6320" w:type="dxa"/>
+            <w:tcW w:w="5890" w:type="dxa"/>
             <w:tcBorders/>
             <w:vAlign w:val="center"/>
           </w:tcPr>
@@ -12816,7 +12991,7 @@
         <w:trPr/>
         <w:tc>
           <w:tcPr>
-            <w:tcW w:w="5490" w:type="dxa"/>
+            <w:tcW w:w="5449" w:type="dxa"/>
             <w:tcBorders/>
             <w:vAlign w:val="center"/>
           </w:tcPr>
@@ -12839,7 +13014,7 @@
         </w:tc>
         <w:tc>
           <w:tcPr>
-            <w:tcW w:w="6320" w:type="dxa"/>
+            <w:tcW w:w="5890" w:type="dxa"/>
             <w:tcBorders/>
             <w:vAlign w:val="center"/>
           </w:tcPr>
@@ -12863,7 +13038,7 @@
         <w:trPr/>
         <w:tc>
           <w:tcPr>
-            <w:tcW w:w="5490" w:type="dxa"/>
+            <w:tcW w:w="5449" w:type="dxa"/>
             <w:tcBorders/>
             <w:vAlign w:val="center"/>
           </w:tcPr>
@@ -12896,7 +13071,7 @@
         </w:tc>
         <w:tc>
           <w:tcPr>
-            <w:tcW w:w="6320" w:type="dxa"/>
+            <w:tcW w:w="5890" w:type="dxa"/>
             <w:tcBorders/>
             <w:vAlign w:val="center"/>
           </w:tcPr>
@@ -12940,7 +13115,7 @@
         <w:trPr/>
         <w:tc>
           <w:tcPr>
-            <w:tcW w:w="5490" w:type="dxa"/>
+            <w:tcW w:w="5449" w:type="dxa"/>
             <w:tcBorders/>
             <w:vAlign w:val="center"/>
           </w:tcPr>
@@ -12963,7 +13138,7 @@
         </w:tc>
         <w:tc>
           <w:tcPr>
-            <w:tcW w:w="6320" w:type="dxa"/>
+            <w:tcW w:w="5890" w:type="dxa"/>
             <w:tcBorders/>
             <w:vAlign w:val="center"/>
           </w:tcPr>
@@ -13017,7 +13192,7 @@
         <w:trPr/>
         <w:tc>
           <w:tcPr>
-            <w:tcW w:w="5490" w:type="dxa"/>
+            <w:tcW w:w="5449" w:type="dxa"/>
             <w:tcBorders/>
             <w:vAlign w:val="center"/>
           </w:tcPr>
@@ -13040,7 +13215,7 @@
         </w:tc>
         <w:tc>
           <w:tcPr>
-            <w:tcW w:w="6320" w:type="dxa"/>
+            <w:tcW w:w="5890" w:type="dxa"/>
             <w:tcBorders/>
             <w:vAlign w:val="center"/>
           </w:tcPr>
@@ -13070,7 +13245,7 @@
         <w:trPr/>
         <w:tc>
           <w:tcPr>
-            <w:tcW w:w="5490" w:type="dxa"/>
+            <w:tcW w:w="5449" w:type="dxa"/>
             <w:tcBorders/>
             <w:vAlign w:val="center"/>
           </w:tcPr>
@@ -13093,7 +13268,7 @@
         </w:tc>
         <w:tc>
           <w:tcPr>
-            <w:tcW w:w="6320" w:type="dxa"/>
+            <w:tcW w:w="5890" w:type="dxa"/>
             <w:tcBorders/>
             <w:vAlign w:val="center"/>
           </w:tcPr>
@@ -13127,7 +13302,7 @@
         <w:trPr/>
         <w:tc>
           <w:tcPr>
-            <w:tcW w:w="5490" w:type="dxa"/>
+            <w:tcW w:w="5449" w:type="dxa"/>
             <w:tcBorders/>
             <w:vAlign w:val="center"/>
           </w:tcPr>
@@ -13150,7 +13325,7 @@
         </w:tc>
         <w:tc>
           <w:tcPr>
-            <w:tcW w:w="6320" w:type="dxa"/>
+            <w:tcW w:w="5890" w:type="dxa"/>
             <w:tcBorders/>
             <w:vAlign w:val="center"/>
           </w:tcPr>
@@ -13180,7 +13355,7 @@
         <w:trPr/>
         <w:tc>
           <w:tcPr>
-            <w:tcW w:w="5490" w:type="dxa"/>
+            <w:tcW w:w="5449" w:type="dxa"/>
             <w:tcBorders/>
             <w:vAlign w:val="center"/>
           </w:tcPr>
@@ -13203,7 +13378,7 @@
         </w:tc>
         <w:tc>
           <w:tcPr>
-            <w:tcW w:w="6320" w:type="dxa"/>
+            <w:tcW w:w="5890" w:type="dxa"/>
             <w:tcBorders/>
             <w:vAlign w:val="center"/>
           </w:tcPr>
@@ -13247,7 +13422,7 @@
         <w:trPr/>
         <w:tc>
           <w:tcPr>
-            <w:tcW w:w="5490" w:type="dxa"/>
+            <w:tcW w:w="5449" w:type="dxa"/>
             <w:tcBorders/>
             <w:vAlign w:val="center"/>
           </w:tcPr>
@@ -13270,7 +13445,7 @@
         </w:tc>
         <w:tc>
           <w:tcPr>
-            <w:tcW w:w="6320" w:type="dxa"/>
+            <w:tcW w:w="5890" w:type="dxa"/>
             <w:tcBorders/>
             <w:vAlign w:val="center"/>
           </w:tcPr>
@@ -16282,7 +16457,7 @@
       <w:start w:val="1"/>
       <w:numFmt w:val="none"/>
       <w:suff w:val="nothing"/>
-      <w:lvlText w:val="%1"/>
+      <w:lvlText w:val=""/>
       <w:lvlJc w:val="left"/>
       <w:pPr>
         <w:tabs>
@@ -16293,10 +16468,51 @@
     </w:lvl>
     <w:lvl w:ilvl="1">
       <w:start w:val="1"/>
+      <w:numFmt w:val="none"/>
       <w:pStyle w:val="Heading2"/>
+      <w:suff w:val="nothing"/>
+      <w:lvlText w:val=""/>
+      <w:lvlJc w:val="left"/>
+      <w:pPr>
+        <w:tabs>
+          <w:tab w:val="num" w:pos="0"/>
+        </w:tabs>
+        <w:ind w:left="0" w:hanging="0"/>
+      </w:pPr>
+    </w:lvl>
+    <w:lvl w:ilvl="2">
+      <w:start w:val="1"/>
+      <w:numFmt w:val="none"/>
+      <w:pStyle w:val="Heading3"/>
+      <w:suff w:val="nothing"/>
+      <w:lvlText w:val=""/>
+      <w:lvlJc w:val="left"/>
+      <w:pPr>
+        <w:tabs>
+          <w:tab w:val="num" w:pos="0"/>
+        </w:tabs>
+        <w:ind w:left="0" w:hanging="0"/>
+      </w:pPr>
+    </w:lvl>
+    <w:lvl w:ilvl="3">
+      <w:start w:val="1"/>
+      <w:numFmt w:val="none"/>
+      <w:pStyle w:val="Heading4"/>
+      <w:suff w:val="nothing"/>
+      <w:lvlText w:val=""/>
+      <w:lvlJc w:val="left"/>
+      <w:pPr>
+        <w:tabs>
+          <w:tab w:val="num" w:pos="0"/>
+        </w:tabs>
+        <w:ind w:left="0" w:hanging="0"/>
+      </w:pPr>
+    </w:lvl>
+    <w:lvl w:ilvl="4">
+      <w:start w:val="1"/>
       <w:numFmt w:val="none"/>
       <w:suff w:val="nothing"/>
-      <w:lvlText w:val="%2"/>
+      <w:lvlText w:val=""/>
       <w:lvlJc w:val="left"/>
       <w:pPr>
         <w:tabs>
@@ -16305,12 +16521,11 @@
         <w:ind w:left="0" w:hanging="0"/>
       </w:pPr>
     </w:lvl>
-    <w:lvl w:ilvl="2">
-      <w:start w:val="1"/>
-      <w:pStyle w:val="Heading3"/>
+    <w:lvl w:ilvl="5">
+      <w:start w:val="1"/>
       <w:numFmt w:val="none"/>
       <w:suff w:val="nothing"/>
-      <w:lvlText w:val="%3"/>
+      <w:lvlText w:val=""/>
       <w:lvlJc w:val="left"/>
       <w:pPr>
         <w:tabs>
@@ -16319,12 +16534,11 @@
         <w:ind w:left="0" w:hanging="0"/>
       </w:pPr>
     </w:lvl>
-    <w:lvl w:ilvl="3">
-      <w:start w:val="1"/>
-      <w:pStyle w:val="Heading4"/>
+    <w:lvl w:ilvl="6">
+      <w:start w:val="1"/>
       <w:numFmt w:val="none"/>
       <w:suff w:val="nothing"/>
-      <w:lvlText w:val="%4"/>
+      <w:lvlText w:val=""/>
       <w:lvlJc w:val="left"/>
       <w:pPr>
         <w:tabs>
@@ -16333,11 +16547,11 @@
         <w:ind w:left="0" w:hanging="0"/>
       </w:pPr>
     </w:lvl>
-    <w:lvl w:ilvl="4">
+    <w:lvl w:ilvl="7">
       <w:start w:val="1"/>
       <w:numFmt w:val="none"/>
       <w:suff w:val="nothing"/>
-      <w:lvlText w:val="%5"/>
+      <w:lvlText w:val=""/>
       <w:lvlJc w:val="left"/>
       <w:pPr>
         <w:tabs>
@@ -16346,50 +16560,11 @@
         <w:ind w:left="0" w:hanging="0"/>
       </w:pPr>
     </w:lvl>
-    <w:lvl w:ilvl="5">
+    <w:lvl w:ilvl="8">
       <w:start w:val="1"/>
       <w:numFmt w:val="none"/>
       <w:suff w:val="nothing"/>
-      <w:lvlText w:val="%6"/>
-      <w:lvlJc w:val="left"/>
-      <w:pPr>
-        <w:tabs>
-          <w:tab w:val="num" w:pos="0"/>
-        </w:tabs>
-        <w:ind w:left="0" w:hanging="0"/>
-      </w:pPr>
-    </w:lvl>
-    <w:lvl w:ilvl="6">
-      <w:start w:val="1"/>
-      <w:numFmt w:val="none"/>
-      <w:suff w:val="nothing"/>
-      <w:lvlText w:val="%7"/>
-      <w:lvlJc w:val="left"/>
-      <w:pPr>
-        <w:tabs>
-          <w:tab w:val="num" w:pos="0"/>
-        </w:tabs>
-        <w:ind w:left="0" w:hanging="0"/>
-      </w:pPr>
-    </w:lvl>
-    <w:lvl w:ilvl="7">
-      <w:start w:val="1"/>
-      <w:numFmt w:val="none"/>
-      <w:suff w:val="nothing"/>
-      <w:lvlText w:val="%8"/>
-      <w:lvlJc w:val="left"/>
-      <w:pPr>
-        <w:tabs>
-          <w:tab w:val="num" w:pos="0"/>
-        </w:tabs>
-        <w:ind w:left="0" w:hanging="0"/>
-      </w:pPr>
-    </w:lvl>
-    <w:lvl w:ilvl="8">
-      <w:start w:val="1"/>
-      <w:numFmt w:val="none"/>
-      <w:suff w:val="nothing"/>
-      <w:lvlText w:val="%9"/>
+      <w:lvlText w:val=""/>
       <w:lvlJc w:val="left"/>
       <w:pPr>
         <w:tabs>
@@ -16470,7 +16645,7 @@
   <w:docDefaults>
     <w:rPrDefault>
       <w:rPr>
-        <w:rFonts w:ascii="Liberation Serif" w:hAnsi="Liberation Serif" w:eastAsia="WenQuanYi Zen Hei" w:cs="FreeSans"/>
+        <w:rFonts w:ascii="Liberation Serif" w:hAnsi="Liberation Serif" w:eastAsia="Noto Serif CJK SC" w:cs="Noto Sans Devanagari"/>
         <w:sz w:val="24"/>
         <w:szCs w:val="24"/>
         <w:lang w:val="en-US" w:eastAsia="zh-CN" w:bidi="hi-IN"/>
@@ -16500,7 +16675,7 @@
     </w:rPr>
   </w:style>
   <w:style w:type="paragraph" w:styleId="Heading1">
-    <w:name w:val="Heading 1"/>
+    <w:name w:val="heading 1"/>
     <w:basedOn w:val="Heading"/>
     <w:next w:val="BodyText"/>
     <w:qFormat/>
@@ -16508,7 +16683,6 @@
       <w:spacing w:before="240" w:after="80"/>
     </w:pPr>
     <w:rPr>
-      <w:rFonts w:ascii="Noto Sans" w:hAnsi="Noto Sans"/>
       <w:b/>
       <w:bCs/>
       <w:color w:val="88C0D0"/>
@@ -16517,7 +16691,7 @@
     </w:rPr>
   </w:style>
   <w:style w:type="paragraph" w:styleId="Heading2">
-    <w:name w:val="Heading 2"/>
+    <w:name w:val="heading 2"/>
     <w:basedOn w:val="Heading"/>
     <w:next w:val="BodyText"/>
     <w:qFormat/>
@@ -16530,7 +16704,7 @@
       <w:outlineLvl w:val="1"/>
     </w:pPr>
     <w:rPr>
-      <w:rFonts w:ascii="Liberation Serif" w:hAnsi="Liberation Serif" w:eastAsia="WenQuanYi Zen Hei" w:cs="FreeSans"/>
+      <w:rFonts w:ascii="Liberation Serif" w:hAnsi="Liberation Serif" w:eastAsia="Noto Serif CJK SC" w:cs="Noto Sans Devanagari"/>
       <w:b/>
       <w:bCs/>
       <w:color w:val="88C0D0"/>
@@ -16539,7 +16713,7 @@
     </w:rPr>
   </w:style>
   <w:style w:type="paragraph" w:styleId="Heading3">
-    <w:name w:val="Heading 3"/>
+    <w:name w:val="heading 3"/>
     <w:basedOn w:val="Heading"/>
     <w:next w:val="BodyText"/>
     <w:qFormat/>
@@ -16549,7 +16723,7 @@
       <w:outlineLvl w:val="2"/>
     </w:pPr>
     <w:rPr>
-      <w:rFonts w:ascii="Liberation Serif" w:hAnsi="Liberation Serif" w:eastAsia="WenQuanYi Zen Hei" w:cs="FreeSans"/>
+      <w:rFonts w:ascii="Liberation Serif" w:hAnsi="Liberation Serif" w:eastAsia="Noto Serif CJK SC" w:cs="Noto Sans Devanagari"/>
       <w:b/>
       <w:bCs/>
       <w:color w:val="88C0D0"/>
@@ -16558,7 +16732,7 @@
     </w:rPr>
   </w:style>
   <w:style w:type="paragraph" w:styleId="Heading4">
-    <w:name w:val="Heading 4"/>
+    <w:name w:val="heading 4"/>
     <w:basedOn w:val="Heading"/>
     <w:next w:val="BodyText"/>
     <w:qFormat/>
@@ -16567,11 +16741,23 @@
       <w:outlineLvl w:val="3"/>
     </w:pPr>
     <w:rPr>
-      <w:rFonts w:ascii="Liberation Serif" w:hAnsi="Liberation Serif" w:eastAsia="WenQuanYi Zen Hei" w:cs="FreeSans"/>
+      <w:rFonts w:ascii="Liberation Serif" w:hAnsi="Liberation Serif" w:eastAsia="Noto Serif CJK SC" w:cs="Noto Sans Devanagari"/>
       <w:b/>
       <w:bCs/>
       <w:sz w:val="24"/>
       <w:szCs w:val="24"/>
+    </w:rPr>
+  </w:style>
+  <w:style w:type="character" w:styleId="EndnoteReference">
+    <w:name w:val="endnote reference"/>
+    <w:rPr>
+      <w:vertAlign w:val="superscript"/>
+    </w:rPr>
+  </w:style>
+  <w:style w:type="character" w:styleId="FootnoteReference">
+    <w:name w:val="footnote reference"/>
+    <w:rPr>
+      <w:vertAlign w:val="superscript"/>
     </w:rPr>
   </w:style>
   <w:style w:type="character" w:styleId="EndnoteCharacters">
@@ -16651,7 +16837,7 @@
     </w:rPr>
   </w:style>
   <w:style w:type="paragraph" w:styleId="EnvelopeReturn">
-    <w:name w:val="Envelope Return"/>
+    <w:name w:val="envelope return"/>
     <w:basedOn w:val="Normal"/>
     <w:pPr/>
     <w:rPr>
@@ -16670,46 +16856,6 @@
       <w:color w:val="ECEFF4"/>
     </w:rPr>
   </w:style>
-  <w:style w:type="paragraph" w:styleId="Footer">
-    <w:name w:val="Footer"/>
-    <w:basedOn w:val="Normal"/>
-    <w:pPr>
-      <w:suppressLineNumbers/>
-      <w:tabs>
-        <w:tab w:val="clear" w:pos="1134"/>
-        <w:tab w:val="center" w:pos="5952" w:leader="none"/>
-        <w:tab w:val="right" w:pos="10771" w:leader="none"/>
-      </w:tabs>
-    </w:pPr>
-    <w:rPr/>
-  </w:style>
-  <w:style w:type="paragraph" w:styleId="Header">
-    <w:name w:val="Header"/>
-    <w:basedOn w:val="Normal"/>
-    <w:pPr>
-      <w:suppressLineNumbers/>
-      <w:tabs>
-        <w:tab w:val="clear" w:pos="1134"/>
-        <w:tab w:val="center" w:pos="5952" w:leader="none"/>
-        <w:tab w:val="right" w:pos="10771" w:leader="none"/>
-      </w:tabs>
-    </w:pPr>
-    <w:rPr/>
-  </w:style>
-  <w:style w:type="paragraph" w:styleId="HeaderandFooter">
-    <w:name w:val="Header and Footer"/>
-    <w:basedOn w:val="Normal"/>
-    <w:qFormat/>
-    <w:pPr>
-      <w:suppressLineNumbers/>
-      <w:tabs>
-        <w:tab w:val="clear" w:pos="1134"/>
-        <w:tab w:val="center" w:pos="5953" w:leader="none"/>
-        <w:tab w:val="right" w:pos="10772" w:leader="none"/>
-      </w:tabs>
-    </w:pPr>
-    <w:rPr/>
-  </w:style>
   <w:style w:type="paragraph" w:styleId="Index">
     <w:name w:val="Index"/>
     <w:basedOn w:val="Normal"/>
@@ -16718,11 +16864,11 @@
       <w:suppressLineNumbers/>
     </w:pPr>
     <w:rPr>
-      <w:rFonts w:cs="FreeSans"/>
+      <w:rFonts w:cs="Noto Sans Devanagari"/>
     </w:rPr>
   </w:style>
   <w:style w:type="paragraph" w:styleId="Caption">
-    <w:name w:val="Caption"/>
+    <w:name w:val="caption"/>
     <w:basedOn w:val="Normal"/>
     <w:qFormat/>
     <w:pPr>
@@ -16730,7 +16876,7 @@
       <w:spacing w:before="120" w:after="120"/>
     </w:pPr>
     <w:rPr>
-      <w:rFonts w:cs="FreeSans"/>
+      <w:rFonts w:cs="Noto Sans Devanagari"/>
       <w:i/>
       <w:iCs/>
       <w:sz w:val="24"/>
@@ -16742,7 +16888,7 @@
     <w:basedOn w:val="BodyText"/>
     <w:pPr/>
     <w:rPr>
-      <w:rFonts w:cs="FreeSans"/>
+      <w:rFonts w:cs="Noto Sans Devanagari"/>
     </w:rPr>
   </w:style>
   <w:style w:type="paragraph" w:styleId="BodyText">
@@ -16784,7 +16930,7 @@
       <w:ind w:left="160" w:right="160"/>
     </w:pPr>
     <w:rPr>
-      <w:rFonts w:ascii="Liberation Mono" w:hAnsi="Liberation Mono" w:eastAsia="Liberation Mono" w:cs="Liberation Mono"/>
+      <w:rFonts w:ascii="Liberation Mono" w:hAnsi="Liberation Mono" w:eastAsia="Noto Sans Mono CJK SC" w:cs="Liberation Mono"/>
       <w:sz w:val="20"/>
       <w:szCs w:val="20"/>
     </w:rPr>
@@ -16825,37 +16971,37 @@
         <a:srgbClr val="000000"/>
       </a:dk1>
       <a:lt1>
-        <a:srgbClr val="ffffff"/>
+        <a:srgbClr val="FFFFFF"/>
       </a:lt1>
       <a:dk2>
         <a:srgbClr val="000000"/>
       </a:dk2>
       <a:lt2>
-        <a:srgbClr val="ffffff"/>
+        <a:srgbClr val="FFFFFF"/>
       </a:lt2>
       <a:accent1>
-        <a:srgbClr val="18a303"/>
+        <a:srgbClr val="18A303"/>
       </a:accent1>
       <a:accent2>
-        <a:srgbClr val="0369a3"/>
+        <a:srgbClr val="0369A3"/>
       </a:accent2>
       <a:accent3>
-        <a:srgbClr val="a33e03"/>
+        <a:srgbClr val="A33E03"/>
       </a:accent3>
       <a:accent4>
-        <a:srgbClr val="8e03a3"/>
+        <a:srgbClr val="8E03A3"/>
       </a:accent4>
       <a:accent5>
-        <a:srgbClr val="c99c00"/>
+        <a:srgbClr val="C99C00"/>
       </a:accent5>
       <a:accent6>
-        <a:srgbClr val="c9211e"/>
+        <a:srgbClr val="C9211E"/>
       </a:accent6>
       <a:hlink>
-        <a:srgbClr val="0000ee"/>
+        <a:srgbClr val="0000EE"/>
       </a:hlink>
       <a:folHlink>
-        <a:srgbClr val="551a8b"/>
+        <a:srgbClr val="551A8B"/>
       </a:folHlink>
     </a:clrScheme>
     <a:fontScheme name="Office">

</xml_diff>

<commit_message>
T-0029: rebuild the troubleshooting guide (build.py --guide troubleshooting; LibreOffice 26.2.5.2, not Microsoft Word) with the subagent never-list section and main's T-0088 entries
</commit_message>
<xml_diff>
--- a/docs/guides/crew/crew-1.0-troubleshooting.docx
+++ b/docs/guides/crew/crew-1.0-troubleshooting.docx
@@ -1,6 +1,6 @@
 
 <file path=word/document.xml><?xml version="1.0" encoding="utf-8"?>
-<w:document xmlns:o="urn:schemas-microsoft-com:office:office" xmlns:r="http://schemas.openxmlformats.org/officeDocument/2006/relationships" xmlns:v="urn:schemas-microsoft-com:vml" xmlns:w="http://schemas.openxmlformats.org/wordprocessingml/2006/main" xmlns:w10="urn:schemas-microsoft-com:office:word" xmlns:wp="http://schemas.openxmlformats.org/drawingml/2006/wordprocessingDrawing" xmlns:wps="http://schemas.microsoft.com/office/word/2010/wordprocessingShape" xmlns:wpg="http://schemas.microsoft.com/office/word/2010/wordprocessingGroup" xmlns:mc="http://schemas.openxmlformats.org/markup-compatibility/2006" xmlns:wp14="http://schemas.microsoft.com/office/word/2010/wordprocessingDrawing" xmlns:w14="http://schemas.microsoft.com/office/word/2010/wordml" xmlns:w15="http://schemas.microsoft.com/office/word/2012/wordml" mc:Ignorable="w14 wp14 w15">
+<w:document xmlns:o="urn:schemas-microsoft-com:office:office" xmlns:r="http://schemas.openxmlformats.org/officeDocument/2006/relationships" xmlns:v="urn:schemas-microsoft-com:vml" xmlns:w="http://schemas.openxmlformats.org/wordprocessingml/2006/main" xmlns:w10="urn:schemas-microsoft-com:office:word" xmlns:wp="http://schemas.openxmlformats.org/drawingml/2006/wordprocessingDrawing" xmlns:pic="http://schemas.openxmlformats.org/drawingml/2006/picture" xmlns:wps="http://schemas.microsoft.com/office/word/2010/wordprocessingShape" xmlns:wpg="http://schemas.microsoft.com/office/word/2010/wordprocessingGroup" xmlns:mc="http://schemas.openxmlformats.org/markup-compatibility/2006" xmlns:wp14="http://schemas.microsoft.com/office/word/2010/wordprocessingDrawing" xmlns:w14="http://schemas.microsoft.com/office/word/2010/wordml" xmlns:w15="http://schemas.microsoft.com/office/word/2012/wordml" mc:Ignorable="w14 wp14 w15">
   <w:body>
     <w:p>
       <w:pPr>
@@ -545,9 +545,9 @@
     </w:p>
     <w:tbl>
       <w:tblPr>
-        <w:tblW w:w="11810" w:type="dxa"/>
+        <w:tblW w:w="11731" w:type="dxa"/>
         <w:jc w:val="left"/>
-        <w:tblInd w:w="0" w:type="dxa"/>
+        <w:tblInd w:w="28" w:type="dxa"/>
         <w:tblLayout w:type="fixed"/>
         <w:tblCellMar>
           <w:top w:w="28" w:type="dxa"/>
@@ -557,11 +557,11 @@
         </w:tblCellMar>
       </w:tblPr>
       <w:tblGrid>
-        <w:gridCol w:w="2116"/>
-        <w:gridCol w:w="2446"/>
-        <w:gridCol w:w="2131"/>
+        <w:gridCol w:w="2119"/>
+        <w:gridCol w:w="2456"/>
+        <w:gridCol w:w="2022"/>
         <w:gridCol w:w="2986"/>
-        <w:gridCol w:w="2131"/>
+        <w:gridCol w:w="2148"/>
       </w:tblGrid>
       <w:tr>
         <w:trPr>
@@ -569,7 +569,7 @@
         </w:trPr>
         <w:tc>
           <w:tcPr>
-            <w:tcW w:w="2116" w:type="dxa"/>
+            <w:tcW w:w="2119" w:type="dxa"/>
             <w:tcBorders/>
             <w:vAlign w:val="center"/>
           </w:tcPr>
@@ -591,7 +591,7 @@
         </w:tc>
         <w:tc>
           <w:tcPr>
-            <w:tcW w:w="2446" w:type="dxa"/>
+            <w:tcW w:w="2456" w:type="dxa"/>
             <w:tcBorders/>
             <w:vAlign w:val="center"/>
           </w:tcPr>
@@ -613,7 +613,7 @@
         </w:tc>
         <w:tc>
           <w:tcPr>
-            <w:tcW w:w="2131" w:type="dxa"/>
+            <w:tcW w:w="2022" w:type="dxa"/>
             <w:tcBorders/>
             <w:vAlign w:val="center"/>
           </w:tcPr>
@@ -657,7 +657,7 @@
         </w:tc>
         <w:tc>
           <w:tcPr>
-            <w:tcW w:w="2131" w:type="dxa"/>
+            <w:tcW w:w="2148" w:type="dxa"/>
             <w:tcBorders/>
             <w:vAlign w:val="center"/>
           </w:tcPr>
@@ -682,7 +682,7 @@
         <w:trPr/>
         <w:tc>
           <w:tcPr>
-            <w:tcW w:w="2116" w:type="dxa"/>
+            <w:tcW w:w="2119" w:type="dxa"/>
             <w:tcBorders/>
             <w:vAlign w:val="center"/>
           </w:tcPr>
@@ -705,7 +705,7 @@
         </w:tc>
         <w:tc>
           <w:tcPr>
-            <w:tcW w:w="2446" w:type="dxa"/>
+            <w:tcW w:w="2456" w:type="dxa"/>
             <w:tcBorders/>
             <w:vAlign w:val="center"/>
           </w:tcPr>
@@ -728,7 +728,7 @@
         </w:tc>
         <w:tc>
           <w:tcPr>
-            <w:tcW w:w="2131" w:type="dxa"/>
+            <w:tcW w:w="2022" w:type="dxa"/>
             <w:tcBorders/>
             <w:vAlign w:val="center"/>
           </w:tcPr>
@@ -794,7 +794,7 @@
         </w:tc>
         <w:tc>
           <w:tcPr>
-            <w:tcW w:w="2131" w:type="dxa"/>
+            <w:tcW w:w="2148" w:type="dxa"/>
             <w:tcBorders/>
             <w:vAlign w:val="center"/>
           </w:tcPr>
@@ -818,7 +818,7 @@
         <w:trPr/>
         <w:tc>
           <w:tcPr>
-            <w:tcW w:w="2116" w:type="dxa"/>
+            <w:tcW w:w="2119" w:type="dxa"/>
             <w:tcBorders/>
             <w:vAlign w:val="center"/>
           </w:tcPr>
@@ -841,7 +841,7 @@
         </w:tc>
         <w:tc>
           <w:tcPr>
-            <w:tcW w:w="2446" w:type="dxa"/>
+            <w:tcW w:w="2456" w:type="dxa"/>
             <w:tcBorders/>
             <w:vAlign w:val="center"/>
           </w:tcPr>
@@ -864,7 +864,7 @@
         </w:tc>
         <w:tc>
           <w:tcPr>
-            <w:tcW w:w="2131" w:type="dxa"/>
+            <w:tcW w:w="2022" w:type="dxa"/>
             <w:tcBorders/>
             <w:vAlign w:val="center"/>
           </w:tcPr>
@@ -916,7 +916,7 @@
         </w:tc>
         <w:tc>
           <w:tcPr>
-            <w:tcW w:w="2131" w:type="dxa"/>
+            <w:tcW w:w="2148" w:type="dxa"/>
             <w:tcBorders/>
             <w:vAlign w:val="center"/>
           </w:tcPr>
@@ -940,7 +940,7 @@
         <w:trPr/>
         <w:tc>
           <w:tcPr>
-            <w:tcW w:w="2116" w:type="dxa"/>
+            <w:tcW w:w="2119" w:type="dxa"/>
             <w:tcBorders/>
             <w:vAlign w:val="center"/>
           </w:tcPr>
@@ -993,7 +993,7 @@
         </w:tc>
         <w:tc>
           <w:tcPr>
-            <w:tcW w:w="2446" w:type="dxa"/>
+            <w:tcW w:w="2456" w:type="dxa"/>
             <w:tcBorders/>
             <w:vAlign w:val="center"/>
           </w:tcPr>
@@ -1016,7 +1016,7 @@
         </w:tc>
         <w:tc>
           <w:tcPr>
-            <w:tcW w:w="2131" w:type="dxa"/>
+            <w:tcW w:w="2022" w:type="dxa"/>
             <w:tcBorders/>
             <w:vAlign w:val="center"/>
           </w:tcPr>
@@ -1074,7 +1074,7 @@
         </w:tc>
         <w:tc>
           <w:tcPr>
-            <w:tcW w:w="2131" w:type="dxa"/>
+            <w:tcW w:w="2148" w:type="dxa"/>
             <w:tcBorders/>
             <w:vAlign w:val="center"/>
           </w:tcPr>
@@ -1110,7 +1110,7 @@
         <w:trPr/>
         <w:tc>
           <w:tcPr>
-            <w:tcW w:w="2116" w:type="dxa"/>
+            <w:tcW w:w="2119" w:type="dxa"/>
             <w:tcBorders/>
             <w:vAlign w:val="center"/>
           </w:tcPr>
@@ -1133,7 +1133,7 @@
         </w:tc>
         <w:tc>
           <w:tcPr>
-            <w:tcW w:w="2446" w:type="dxa"/>
+            <w:tcW w:w="2456" w:type="dxa"/>
             <w:tcBorders/>
             <w:vAlign w:val="center"/>
           </w:tcPr>
@@ -1156,7 +1156,7 @@
         </w:tc>
         <w:tc>
           <w:tcPr>
-            <w:tcW w:w="2131" w:type="dxa"/>
+            <w:tcW w:w="2022" w:type="dxa"/>
             <w:tcBorders/>
             <w:vAlign w:val="center"/>
           </w:tcPr>
@@ -1214,7 +1214,7 @@
         </w:tc>
         <w:tc>
           <w:tcPr>
-            <w:tcW w:w="2131" w:type="dxa"/>
+            <w:tcW w:w="2148" w:type="dxa"/>
             <w:tcBorders/>
             <w:vAlign w:val="center"/>
           </w:tcPr>
@@ -1238,7 +1238,7 @@
         <w:trPr/>
         <w:tc>
           <w:tcPr>
-            <w:tcW w:w="2116" w:type="dxa"/>
+            <w:tcW w:w="2119" w:type="dxa"/>
             <w:tcBorders/>
             <w:vAlign w:val="center"/>
           </w:tcPr>
@@ -1285,7 +1285,7 @@
         </w:tc>
         <w:tc>
           <w:tcPr>
-            <w:tcW w:w="2446" w:type="dxa"/>
+            <w:tcW w:w="2456" w:type="dxa"/>
             <w:tcBorders/>
             <w:vAlign w:val="center"/>
           </w:tcPr>
@@ -1308,7 +1308,7 @@
         </w:tc>
         <w:tc>
           <w:tcPr>
-            <w:tcW w:w="2131" w:type="dxa"/>
+            <w:tcW w:w="2022" w:type="dxa"/>
             <w:tcBorders/>
             <w:vAlign w:val="center"/>
           </w:tcPr>
@@ -1428,7 +1428,7 @@
         </w:tc>
         <w:tc>
           <w:tcPr>
-            <w:tcW w:w="2131" w:type="dxa"/>
+            <w:tcW w:w="2148" w:type="dxa"/>
             <w:tcBorders/>
             <w:vAlign w:val="center"/>
           </w:tcPr>
@@ -1468,7 +1468,7 @@
         <w:trPr/>
         <w:tc>
           <w:tcPr>
-            <w:tcW w:w="2116" w:type="dxa"/>
+            <w:tcW w:w="2119" w:type="dxa"/>
             <w:tcBorders/>
             <w:vAlign w:val="center"/>
           </w:tcPr>
@@ -1515,7 +1515,7 @@
         </w:tc>
         <w:tc>
           <w:tcPr>
-            <w:tcW w:w="2446" w:type="dxa"/>
+            <w:tcW w:w="2456" w:type="dxa"/>
             <w:tcBorders/>
             <w:vAlign w:val="center"/>
           </w:tcPr>
@@ -1538,7 +1538,7 @@
         </w:tc>
         <w:tc>
           <w:tcPr>
-            <w:tcW w:w="2131" w:type="dxa"/>
+            <w:tcW w:w="2022" w:type="dxa"/>
             <w:tcBorders/>
             <w:vAlign w:val="center"/>
           </w:tcPr>
@@ -1616,7 +1616,7 @@
         </w:tc>
         <w:tc>
           <w:tcPr>
-            <w:tcW w:w="2131" w:type="dxa"/>
+            <w:tcW w:w="2148" w:type="dxa"/>
             <w:tcBorders/>
             <w:vAlign w:val="center"/>
           </w:tcPr>
@@ -1642,7 +1642,7 @@
         <w:trPr/>
         <w:tc>
           <w:tcPr>
-            <w:tcW w:w="2116" w:type="dxa"/>
+            <w:tcW w:w="2119" w:type="dxa"/>
             <w:tcBorders/>
             <w:vAlign w:val="center"/>
           </w:tcPr>
@@ -1689,7 +1689,7 @@
         </w:tc>
         <w:tc>
           <w:tcPr>
-            <w:tcW w:w="2446" w:type="dxa"/>
+            <w:tcW w:w="2456" w:type="dxa"/>
             <w:tcBorders/>
             <w:vAlign w:val="center"/>
           </w:tcPr>
@@ -1712,7 +1712,7 @@
         </w:tc>
         <w:tc>
           <w:tcPr>
-            <w:tcW w:w="2131" w:type="dxa"/>
+            <w:tcW w:w="2022" w:type="dxa"/>
             <w:tcBorders/>
             <w:vAlign w:val="center"/>
           </w:tcPr>
@@ -1810,7 +1810,7 @@
         </w:tc>
         <w:tc>
           <w:tcPr>
-            <w:tcW w:w="2131" w:type="dxa"/>
+            <w:tcW w:w="2148" w:type="dxa"/>
             <w:tcBorders/>
             <w:vAlign w:val="center"/>
           </w:tcPr>
@@ -1836,7 +1836,7 @@
         <w:trPr/>
         <w:tc>
           <w:tcPr>
-            <w:tcW w:w="2116" w:type="dxa"/>
+            <w:tcW w:w="2119" w:type="dxa"/>
             <w:tcBorders/>
             <w:vAlign w:val="center"/>
           </w:tcPr>
@@ -1923,7 +1923,7 @@
         </w:tc>
         <w:tc>
           <w:tcPr>
-            <w:tcW w:w="2446" w:type="dxa"/>
+            <w:tcW w:w="2456" w:type="dxa"/>
             <w:tcBorders/>
             <w:vAlign w:val="center"/>
           </w:tcPr>
@@ -1946,7 +1946,7 @@
         </w:tc>
         <w:tc>
           <w:tcPr>
-            <w:tcW w:w="2131" w:type="dxa"/>
+            <w:tcW w:w="2022" w:type="dxa"/>
             <w:tcBorders/>
             <w:vAlign w:val="center"/>
           </w:tcPr>
@@ -2040,7 +2040,7 @@
         </w:tc>
         <w:tc>
           <w:tcPr>
-            <w:tcW w:w="2131" w:type="dxa"/>
+            <w:tcW w:w="2148" w:type="dxa"/>
             <w:tcBorders/>
             <w:vAlign w:val="center"/>
           </w:tcPr>
@@ -2076,7 +2076,7 @@
         <w:trPr/>
         <w:tc>
           <w:tcPr>
-            <w:tcW w:w="2116" w:type="dxa"/>
+            <w:tcW w:w="2119" w:type="dxa"/>
             <w:tcBorders/>
             <w:vAlign w:val="center"/>
           </w:tcPr>
@@ -2099,7 +2099,7 @@
         </w:tc>
         <w:tc>
           <w:tcPr>
-            <w:tcW w:w="2446" w:type="dxa"/>
+            <w:tcW w:w="2456" w:type="dxa"/>
             <w:tcBorders/>
             <w:vAlign w:val="center"/>
           </w:tcPr>
@@ -2122,7 +2122,7 @@
         </w:tc>
         <w:tc>
           <w:tcPr>
-            <w:tcW w:w="2131" w:type="dxa"/>
+            <w:tcW w:w="2022" w:type="dxa"/>
             <w:tcBorders/>
             <w:vAlign w:val="center"/>
           </w:tcPr>
@@ -2176,7 +2176,7 @@
         </w:tc>
         <w:tc>
           <w:tcPr>
-            <w:tcW w:w="2131" w:type="dxa"/>
+            <w:tcW w:w="2148" w:type="dxa"/>
             <w:tcBorders/>
             <w:vAlign w:val="center"/>
           </w:tcPr>
@@ -2200,7 +2200,7 @@
         <w:trPr/>
         <w:tc>
           <w:tcPr>
-            <w:tcW w:w="2116" w:type="dxa"/>
+            <w:tcW w:w="2119" w:type="dxa"/>
             <w:tcBorders/>
             <w:vAlign w:val="center"/>
           </w:tcPr>
@@ -2223,7 +2223,7 @@
         </w:tc>
         <w:tc>
           <w:tcPr>
-            <w:tcW w:w="2446" w:type="dxa"/>
+            <w:tcW w:w="2456" w:type="dxa"/>
             <w:tcBorders/>
             <w:vAlign w:val="center"/>
           </w:tcPr>
@@ -2246,7 +2246,7 @@
         </w:tc>
         <w:tc>
           <w:tcPr>
-            <w:tcW w:w="2131" w:type="dxa"/>
+            <w:tcW w:w="2022" w:type="dxa"/>
             <w:tcBorders/>
             <w:vAlign w:val="center"/>
           </w:tcPr>
@@ -2310,7 +2310,7 @@
         </w:tc>
         <w:tc>
           <w:tcPr>
-            <w:tcW w:w="2131" w:type="dxa"/>
+            <w:tcW w:w="2148" w:type="dxa"/>
             <w:tcBorders/>
             <w:vAlign w:val="center"/>
           </w:tcPr>
@@ -2336,7 +2336,7 @@
         <w:trPr/>
         <w:tc>
           <w:tcPr>
-            <w:tcW w:w="2116" w:type="dxa"/>
+            <w:tcW w:w="2119" w:type="dxa"/>
             <w:tcBorders/>
             <w:vAlign w:val="center"/>
           </w:tcPr>
@@ -2359,7 +2359,7 @@
         </w:tc>
         <w:tc>
           <w:tcPr>
-            <w:tcW w:w="2446" w:type="dxa"/>
+            <w:tcW w:w="2456" w:type="dxa"/>
             <w:tcBorders/>
             <w:vAlign w:val="center"/>
           </w:tcPr>
@@ -2382,7 +2382,7 @@
         </w:tc>
         <w:tc>
           <w:tcPr>
-            <w:tcW w:w="2131" w:type="dxa"/>
+            <w:tcW w:w="2022" w:type="dxa"/>
             <w:tcBorders/>
             <w:vAlign w:val="center"/>
           </w:tcPr>
@@ -2440,7 +2440,7 @@
         </w:tc>
         <w:tc>
           <w:tcPr>
-            <w:tcW w:w="2131" w:type="dxa"/>
+            <w:tcW w:w="2148" w:type="dxa"/>
             <w:tcBorders/>
             <w:vAlign w:val="center"/>
           </w:tcPr>
@@ -2466,7 +2466,7 @@
         <w:trPr/>
         <w:tc>
           <w:tcPr>
-            <w:tcW w:w="2116" w:type="dxa"/>
+            <w:tcW w:w="2119" w:type="dxa"/>
             <w:tcBorders/>
             <w:vAlign w:val="center"/>
           </w:tcPr>
@@ -2489,7 +2489,7 @@
         </w:tc>
         <w:tc>
           <w:tcPr>
-            <w:tcW w:w="2446" w:type="dxa"/>
+            <w:tcW w:w="2456" w:type="dxa"/>
             <w:tcBorders/>
             <w:vAlign w:val="center"/>
           </w:tcPr>
@@ -2512,7 +2512,7 @@
         </w:tc>
         <w:tc>
           <w:tcPr>
-            <w:tcW w:w="2131" w:type="dxa"/>
+            <w:tcW w:w="2022" w:type="dxa"/>
             <w:tcBorders/>
             <w:vAlign w:val="center"/>
           </w:tcPr>
@@ -2596,7 +2596,7 @@
         </w:tc>
         <w:tc>
           <w:tcPr>
-            <w:tcW w:w="2131" w:type="dxa"/>
+            <w:tcW w:w="2148" w:type="dxa"/>
             <w:tcBorders/>
             <w:vAlign w:val="center"/>
           </w:tcPr>
@@ -2626,7 +2626,7 @@
         <w:trPr/>
         <w:tc>
           <w:tcPr>
-            <w:tcW w:w="2116" w:type="dxa"/>
+            <w:tcW w:w="2119" w:type="dxa"/>
             <w:tcBorders/>
             <w:vAlign w:val="center"/>
           </w:tcPr>
@@ -2649,7 +2649,7 @@
         </w:tc>
         <w:tc>
           <w:tcPr>
-            <w:tcW w:w="2446" w:type="dxa"/>
+            <w:tcW w:w="2456" w:type="dxa"/>
             <w:tcBorders/>
             <w:vAlign w:val="center"/>
           </w:tcPr>
@@ -2672,7 +2672,7 @@
         </w:tc>
         <w:tc>
           <w:tcPr>
-            <w:tcW w:w="2131" w:type="dxa"/>
+            <w:tcW w:w="2022" w:type="dxa"/>
             <w:tcBorders/>
             <w:vAlign w:val="center"/>
           </w:tcPr>
@@ -2716,7 +2716,7 @@
         </w:tc>
         <w:tc>
           <w:tcPr>
-            <w:tcW w:w="2131" w:type="dxa"/>
+            <w:tcW w:w="2148" w:type="dxa"/>
             <w:tcBorders/>
             <w:vAlign w:val="center"/>
           </w:tcPr>
@@ -4324,6 +4324,285 @@
         <w:rPr>
           <w:rStyle w:val="Strong"/>
         </w:rPr>
+        <w:t xml:space="preserve">Symptom: a </w:t>
+      </w:r>
+      <w:r>
+        <w:rPr>
+          <w:rStyle w:val="SourceText"/>
+        </w:rPr>
+        <w:t>/crew:autopilot wave</w:t>
+      </w:r>
+      <w:r>
+        <w:rPr>
+          <w:rStyle w:val="Strong"/>
+        </w:rPr>
+        <w:t xml:space="preserve"> lane stops on "a lane may not accept, reject or admin-merge".</w:t>
+      </w:r>
+      <w:r>
+        <w:rPr/>
+        <w:t xml:space="preserve"> This is the subagent never-list, and it is working as designed. When the hook payload carries a non-empty </w:t>
+      </w:r>
+      <w:r>
+        <w:rPr>
+          <w:rStyle w:val="SourceText"/>
+        </w:rPr>
+        <w:t>agent_type</w:t>
+      </w:r>
+      <w:r>
+        <w:rPr/>
+        <w:t xml:space="preserve"> — every wave lane is a subagent — </w:t>
+      </w:r>
+      <w:r>
+        <w:rPr>
+          <w:rStyle w:val="SourceText"/>
+        </w:rPr>
+        <w:t>scope_guard.py</w:t>
+      </w:r>
+      <w:r>
+        <w:rPr/>
+        <w:t xml:space="preserve"> refuses, in every </w:t>
+      </w:r>
+      <w:r>
+        <w:rPr>
+          <w:rStyle w:val="SourceText"/>
+        </w:rPr>
+        <w:t>scope.mode</w:t>
+      </w:r>
+      <w:r>
+        <w:rPr/>
+        <w:t xml:space="preserve"> but </w:t>
+      </w:r>
+      <w:r>
+        <w:rPr>
+          <w:rStyle w:val="SourceText"/>
+        </w:rPr>
+        <w:t>off</w:t>
+      </w:r>
+      <w:r>
+        <w:rPr/>
+        <w:t xml:space="preserve">, any shell command that runs </w:t>
+      </w:r>
+      <w:r>
+        <w:rPr>
+          <w:rStyle w:val="SourceText"/>
+        </w:rPr>
+        <w:t>review_ledger.py --accept</w:t>
+      </w:r>
+      <w:r>
+        <w:rPr/>
+        <w:t xml:space="preserve"> or </w:t>
+      </w:r>
+      <w:r>
+        <w:rPr>
+          <w:rStyle w:val="SourceText"/>
+        </w:rPr>
+        <w:t>--reject</w:t>
+      </w:r>
+      <w:r>
+        <w:rPr/>
+        <w:t xml:space="preserve"> (and every abbreviation argparse would once have expanded to them, </w:t>
+      </w:r>
+      <w:r>
+        <w:rPr>
+          <w:rStyle w:val="SourceText"/>
+        </w:rPr>
+        <w:t>--a</w:t>
+      </w:r>
+      <w:r>
+        <w:rPr/>
+        <w:t xml:space="preserve"> up to </w:t>
+      </w:r>
+      <w:r>
+        <w:rPr>
+          <w:rStyle w:val="SourceText"/>
+        </w:rPr>
+        <w:t>--accept</w:t>
+      </w:r>
+      <w:r>
+        <w:rPr/>
+        <w:t xml:space="preserve">, </w:t>
+      </w:r>
+      <w:r>
+        <w:rPr>
+          <w:rStyle w:val="SourceText"/>
+        </w:rPr>
+        <w:t>--rej</w:t>
+      </w:r>
+      <w:r>
+        <w:rPr/>
+        <w:t xml:space="preserve"> up to </w:t>
+      </w:r>
+      <w:r>
+        <w:rPr>
+          <w:rStyle w:val="SourceText"/>
+        </w:rPr>
+        <w:t>--reject</w:t>
+      </w:r>
+      <w:r>
+        <w:rPr/>
+        <w:t xml:space="preserve">) or </w:t>
+      </w:r>
+      <w:r>
+        <w:rPr>
+          <w:rStyle w:val="SourceText"/>
+        </w:rPr>
+        <w:t>gh pr merge ... --admin</w:t>
+      </w:r>
+      <w:r>
+        <w:rPr/>
+        <w:t xml:space="preserve">. </w:t>
+      </w:r>
+      <w:r>
+        <w:rPr>
+          <w:rStyle w:val="SourceText"/>
+        </w:rPr>
+        <w:t>crew_ticket.py approve</w:t>
+      </w:r>
+      <w:r>
+        <w:rPr/>
+        <w:t xml:space="preserve"> stays refused for everyone, lane or not. The refusal is logged to </w:t>
+      </w:r>
+      <w:r>
+        <w:rPr>
+          <w:rStyle w:val="SourceText"/>
+        </w:rPr>
+        <w:t>.crew/guard.log</w:t>
+      </w:r>
+      <w:r>
+        <w:rPr/>
+        <w:t xml:space="preserve"> as </w:t>
+      </w:r>
+      <w:r>
+        <w:rPr>
+          <w:rStyle w:val="SourceText"/>
+        </w:rPr>
+        <w:t>lane-never-list</w:t>
+      </w:r>
+      <w:r>
+        <w:rPr/>
+        <w:t xml:space="preserve">. </w:t>
+      </w:r>
+      <w:r>
+        <w:rPr>
+          <w:rStyle w:val="SourceText"/>
+        </w:rPr>
+        <w:t>review_ledger.py</w:t>
+      </w:r>
+      <w:r>
+        <w:rPr/>
+        <w:t xml:space="preserve"> also parses with </w:t>
+      </w:r>
+      <w:r>
+        <w:rPr>
+          <w:rStyle w:val="SourceText"/>
+        </w:rPr>
+        <w:t>allow_abbrev=False</w:t>
+      </w:r>
+      <w:r>
+        <w:rPr/>
+        <w:t xml:space="preserve">, so </w:t>
+      </w:r>
+      <w:r>
+        <w:rPr>
+          <w:rStyle w:val="SourceText"/>
+        </w:rPr>
+        <w:t>--acc</w:t>
+      </w:r>
+      <w:r>
+        <w:rPr/>
+        <w:t xml:space="preserve"> is an argparse error that changes no ledger, from any session. A lane may still run </w:t>
+      </w:r>
+      <w:r>
+        <w:rPr>
+          <w:rStyle w:val="SourceText"/>
+        </w:rPr>
+        <w:t>review_ledger.py --status</w:t>
+      </w:r>
+      <w:r>
+        <w:rPr/>
+        <w:t>/</w:t>
+      </w:r>
+      <w:r>
+        <w:rPr>
+          <w:rStyle w:val="SourceText"/>
+        </w:rPr>
+        <w:t>--reserve</w:t>
+      </w:r>
+      <w:r>
+        <w:rPr/>
+        <w:t xml:space="preserve"> and </w:t>
+      </w:r>
+      <w:r>
+        <w:rPr>
+          <w:rStyle w:val="SourceText"/>
+        </w:rPr>
+        <w:t>review_run.py --reserve-only</w:t>
+      </w:r>
+      <w:r>
+        <w:rPr/>
+        <w:t>/</w:t>
+      </w:r>
+      <w:r>
+        <w:rPr>
+          <w:rStyle w:val="SourceText"/>
+        </w:rPr>
+        <w:t>--round N</w:t>
+      </w:r>
+      <w:r>
+        <w:rPr/>
+        <w:t xml:space="preserve">, and write inside its own worktree's Touch. </w:t>
+      </w:r>
+      <w:r>
+        <w:rPr>
+          <w:rStyle w:val="Strong"/>
+        </w:rPr>
+        <w:t>Fix:</w:t>
+      </w:r>
+      <w:r>
+        <w:rPr/>
+        <w:t xml:space="preserve"> none in the lane. It writes the decision as a question and stops; </w:t>
+      </w:r>
+      <w:r>
+        <w:rPr>
+          <w:rStyle w:val="SourceText"/>
+        </w:rPr>
+        <w:t>crew_wave.py collect</w:t>
+      </w:r>
+      <w:r>
+        <w:rPr/>
+        <w:t xml:space="preserve"> shows it to the owner, who accepts, rejects or merges from the main session, where no </w:t>
+      </w:r>
+      <w:r>
+        <w:rPr>
+          <w:rStyle w:val="SourceText"/>
+        </w:rPr>
+        <w:t>agent_type</w:t>
+      </w:r>
+      <w:r>
+        <w:rPr/>
+        <w:t xml:space="preserve"> is present and nothing on this list is refused.</w:t>
+      </w:r>
+    </w:p>
+    <w:p>
+      <w:pPr>
+        <w:pStyle w:val="BodyText"/>
+        <w:numPr>
+          <w:ilvl w:val="0"/>
+          <w:numId w:val="10"/>
+        </w:numPr>
+        <w:tabs>
+          <w:tab w:val="clear" w:pos="1134"/>
+          <w:tab w:val="left" w:pos="829" w:leader="none"/>
+        </w:tabs>
+        <w:bidi w:val="0"/>
+        <w:ind w:hanging="283" w:left="829"/>
+        <w:jc w:val="left"/>
+        <w:rPr/>
+      </w:pPr>
+      <w:r>
+        <w:rPr>
+          <w:rStyle w:val="Strong"/>
+        </w:rPr>
         <w:t xml:space="preserve">Symptom: </w:t>
       </w:r>
       <w:r>
@@ -6921,9 +7200,9 @@
     </w:p>
     <w:tbl>
       <w:tblPr>
-        <w:tblW w:w="11810" w:type="dxa"/>
+        <w:tblW w:w="11339" w:type="dxa"/>
         <w:jc w:val="left"/>
-        <w:tblInd w:w="0" w:type="dxa"/>
+        <w:tblInd w:w="28" w:type="dxa"/>
         <w:tblLayout w:type="fixed"/>
         <w:tblCellMar>
           <w:top w:w="28" w:type="dxa"/>
@@ -6933,10 +7212,10 @@
         </w:tblCellMar>
       </w:tblPr>
       <w:tblGrid>
-        <w:gridCol w:w="4730"/>
-        <w:gridCol w:w="1699"/>
-        <w:gridCol w:w="1841"/>
-        <w:gridCol w:w="3540"/>
+        <w:gridCol w:w="4621"/>
+        <w:gridCol w:w="1551"/>
+        <w:gridCol w:w="1790"/>
+        <w:gridCol w:w="3377"/>
       </w:tblGrid>
       <w:tr>
         <w:trPr>
@@ -6944,7 +7223,7 @@
         </w:trPr>
         <w:tc>
           <w:tcPr>
-            <w:tcW w:w="4730" w:type="dxa"/>
+            <w:tcW w:w="4621" w:type="dxa"/>
             <w:tcBorders/>
             <w:vAlign w:val="center"/>
           </w:tcPr>
@@ -6966,7 +7245,7 @@
         </w:tc>
         <w:tc>
           <w:tcPr>
-            <w:tcW w:w="1699" w:type="dxa"/>
+            <w:tcW w:w="1551" w:type="dxa"/>
             <w:tcBorders/>
             <w:vAlign w:val="center"/>
           </w:tcPr>
@@ -6988,7 +7267,7 @@
         </w:tc>
         <w:tc>
           <w:tcPr>
-            <w:tcW w:w="1841" w:type="dxa"/>
+            <w:tcW w:w="1790" w:type="dxa"/>
             <w:tcBorders/>
             <w:vAlign w:val="center"/>
           </w:tcPr>
@@ -7010,7 +7289,7 @@
         </w:tc>
         <w:tc>
           <w:tcPr>
-            <w:tcW w:w="3540" w:type="dxa"/>
+            <w:tcW w:w="3377" w:type="dxa"/>
             <w:tcBorders/>
             <w:vAlign w:val="center"/>
           </w:tcPr>
@@ -7035,7 +7314,7 @@
         <w:trPr/>
         <w:tc>
           <w:tcPr>
-            <w:tcW w:w="4730" w:type="dxa"/>
+            <w:tcW w:w="4621" w:type="dxa"/>
             <w:tcBorders/>
             <w:vAlign w:val="center"/>
           </w:tcPr>
@@ -7058,7 +7337,7 @@
         </w:tc>
         <w:tc>
           <w:tcPr>
-            <w:tcW w:w="1699" w:type="dxa"/>
+            <w:tcW w:w="1551" w:type="dxa"/>
             <w:tcBorders/>
             <w:vAlign w:val="center"/>
           </w:tcPr>
@@ -7079,7 +7358,7 @@
         </w:tc>
         <w:tc>
           <w:tcPr>
-            <w:tcW w:w="1841" w:type="dxa"/>
+            <w:tcW w:w="1790" w:type="dxa"/>
             <w:tcBorders/>
             <w:vAlign w:val="center"/>
           </w:tcPr>
@@ -7100,7 +7379,7 @@
         </w:tc>
         <w:tc>
           <w:tcPr>
-            <w:tcW w:w="3540" w:type="dxa"/>
+            <w:tcW w:w="3377" w:type="dxa"/>
             <w:tcBorders/>
             <w:vAlign w:val="center"/>
           </w:tcPr>
@@ -7140,7 +7419,7 @@
         <w:trPr/>
         <w:tc>
           <w:tcPr>
-            <w:tcW w:w="4730" w:type="dxa"/>
+            <w:tcW w:w="4621" w:type="dxa"/>
             <w:tcBorders/>
             <w:vAlign w:val="center"/>
           </w:tcPr>
@@ -7163,7 +7442,7 @@
         </w:tc>
         <w:tc>
           <w:tcPr>
-            <w:tcW w:w="1699" w:type="dxa"/>
+            <w:tcW w:w="1551" w:type="dxa"/>
             <w:tcBorders/>
             <w:vAlign w:val="center"/>
           </w:tcPr>
@@ -7184,7 +7463,7 @@
         </w:tc>
         <w:tc>
           <w:tcPr>
-            <w:tcW w:w="1841" w:type="dxa"/>
+            <w:tcW w:w="1790" w:type="dxa"/>
             <w:tcBorders/>
             <w:vAlign w:val="center"/>
           </w:tcPr>
@@ -7227,7 +7506,7 @@
         </w:tc>
         <w:tc>
           <w:tcPr>
-            <w:tcW w:w="3540" w:type="dxa"/>
+            <w:tcW w:w="3377" w:type="dxa"/>
             <w:tcBorders/>
             <w:vAlign w:val="center"/>
           </w:tcPr>
@@ -7257,7 +7536,7 @@
         <w:trPr/>
         <w:tc>
           <w:tcPr>
-            <w:tcW w:w="4730" w:type="dxa"/>
+            <w:tcW w:w="4621" w:type="dxa"/>
             <w:tcBorders/>
             <w:vAlign w:val="center"/>
           </w:tcPr>
@@ -7280,7 +7559,7 @@
         </w:tc>
         <w:tc>
           <w:tcPr>
-            <w:tcW w:w="1699" w:type="dxa"/>
+            <w:tcW w:w="1551" w:type="dxa"/>
             <w:tcBorders/>
             <w:vAlign w:val="center"/>
           </w:tcPr>
@@ -7301,7 +7580,7 @@
         </w:tc>
         <w:tc>
           <w:tcPr>
-            <w:tcW w:w="1841" w:type="dxa"/>
+            <w:tcW w:w="1790" w:type="dxa"/>
             <w:tcBorders/>
             <w:vAlign w:val="center"/>
           </w:tcPr>
@@ -7344,7 +7623,7 @@
         </w:tc>
         <w:tc>
           <w:tcPr>
-            <w:tcW w:w="3540" w:type="dxa"/>
+            <w:tcW w:w="3377" w:type="dxa"/>
             <w:tcBorders/>
             <w:vAlign w:val="center"/>
           </w:tcPr>
@@ -7374,7 +7653,7 @@
         <w:trPr/>
         <w:tc>
           <w:tcPr>
-            <w:tcW w:w="4730" w:type="dxa"/>
+            <w:tcW w:w="4621" w:type="dxa"/>
             <w:tcBorders/>
             <w:vAlign w:val="center"/>
           </w:tcPr>
@@ -7447,7 +7726,7 @@
         </w:tc>
         <w:tc>
           <w:tcPr>
-            <w:tcW w:w="1699" w:type="dxa"/>
+            <w:tcW w:w="1551" w:type="dxa"/>
             <w:tcBorders/>
             <w:vAlign w:val="center"/>
           </w:tcPr>
@@ -7468,7 +7747,7 @@
         </w:tc>
         <w:tc>
           <w:tcPr>
-            <w:tcW w:w="1841" w:type="dxa"/>
+            <w:tcW w:w="1790" w:type="dxa"/>
             <w:tcBorders/>
             <w:vAlign w:val="center"/>
           </w:tcPr>
@@ -7511,7 +7790,7 @@
         </w:tc>
         <w:tc>
           <w:tcPr>
-            <w:tcW w:w="3540" w:type="dxa"/>
+            <w:tcW w:w="3377" w:type="dxa"/>
             <w:tcBorders/>
             <w:vAlign w:val="center"/>
           </w:tcPr>
@@ -7545,7 +7824,7 @@
         <w:trPr/>
         <w:tc>
           <w:tcPr>
-            <w:tcW w:w="4730" w:type="dxa"/>
+            <w:tcW w:w="4621" w:type="dxa"/>
             <w:tcBorders/>
             <w:vAlign w:val="center"/>
           </w:tcPr>
@@ -7578,7 +7857,7 @@
         </w:tc>
         <w:tc>
           <w:tcPr>
-            <w:tcW w:w="1699" w:type="dxa"/>
+            <w:tcW w:w="1551" w:type="dxa"/>
             <w:tcBorders/>
             <w:vAlign w:val="center"/>
           </w:tcPr>
@@ -7599,7 +7878,7 @@
         </w:tc>
         <w:tc>
           <w:tcPr>
-            <w:tcW w:w="1841" w:type="dxa"/>
+            <w:tcW w:w="1790" w:type="dxa"/>
             <w:tcBorders/>
             <w:vAlign w:val="center"/>
           </w:tcPr>
@@ -7642,7 +7921,7 @@
         </w:tc>
         <w:tc>
           <w:tcPr>
-            <w:tcW w:w="3540" w:type="dxa"/>
+            <w:tcW w:w="3377" w:type="dxa"/>
             <w:tcBorders/>
             <w:vAlign w:val="center"/>
           </w:tcPr>
@@ -7672,7 +7951,7 @@
         <w:trPr/>
         <w:tc>
           <w:tcPr>
-            <w:tcW w:w="4730" w:type="dxa"/>
+            <w:tcW w:w="4621" w:type="dxa"/>
             <w:tcBorders/>
             <w:vAlign w:val="center"/>
           </w:tcPr>
@@ -7695,7 +7974,7 @@
         </w:tc>
         <w:tc>
           <w:tcPr>
-            <w:tcW w:w="1699" w:type="dxa"/>
+            <w:tcW w:w="1551" w:type="dxa"/>
             <w:tcBorders/>
             <w:vAlign w:val="center"/>
           </w:tcPr>
@@ -7716,7 +7995,7 @@
         </w:tc>
         <w:tc>
           <w:tcPr>
-            <w:tcW w:w="1841" w:type="dxa"/>
+            <w:tcW w:w="1790" w:type="dxa"/>
             <w:tcBorders/>
             <w:vAlign w:val="center"/>
           </w:tcPr>
@@ -7769,7 +8048,7 @@
         </w:tc>
         <w:tc>
           <w:tcPr>
-            <w:tcW w:w="3540" w:type="dxa"/>
+            <w:tcW w:w="3377" w:type="dxa"/>
             <w:tcBorders/>
             <w:vAlign w:val="center"/>
           </w:tcPr>
@@ -7799,7 +8078,7 @@
         <w:trPr/>
         <w:tc>
           <w:tcPr>
-            <w:tcW w:w="4730" w:type="dxa"/>
+            <w:tcW w:w="4621" w:type="dxa"/>
             <w:tcBorders/>
             <w:vAlign w:val="center"/>
           </w:tcPr>
@@ -7822,7 +8101,7 @@
         </w:tc>
         <w:tc>
           <w:tcPr>
-            <w:tcW w:w="1699" w:type="dxa"/>
+            <w:tcW w:w="1551" w:type="dxa"/>
             <w:tcBorders/>
             <w:vAlign w:val="center"/>
           </w:tcPr>
@@ -7843,7 +8122,7 @@
         </w:tc>
         <w:tc>
           <w:tcPr>
-            <w:tcW w:w="1841" w:type="dxa"/>
+            <w:tcW w:w="1790" w:type="dxa"/>
             <w:tcBorders/>
             <w:vAlign w:val="center"/>
           </w:tcPr>
@@ -7864,7 +8143,7 @@
         </w:tc>
         <w:tc>
           <w:tcPr>
-            <w:tcW w:w="3540" w:type="dxa"/>
+            <w:tcW w:w="3377" w:type="dxa"/>
             <w:tcBorders/>
             <w:vAlign w:val="center"/>
           </w:tcPr>
@@ -7924,7 +8203,7 @@
         <w:trPr/>
         <w:tc>
           <w:tcPr>
-            <w:tcW w:w="4730" w:type="dxa"/>
+            <w:tcW w:w="4621" w:type="dxa"/>
             <w:tcBorders/>
             <w:vAlign w:val="center"/>
           </w:tcPr>
@@ -7947,7 +8226,7 @@
         </w:tc>
         <w:tc>
           <w:tcPr>
-            <w:tcW w:w="1699" w:type="dxa"/>
+            <w:tcW w:w="1551" w:type="dxa"/>
             <w:tcBorders/>
             <w:vAlign w:val="center"/>
           </w:tcPr>
@@ -7968,7 +8247,7 @@
         </w:tc>
         <w:tc>
           <w:tcPr>
-            <w:tcW w:w="1841" w:type="dxa"/>
+            <w:tcW w:w="1790" w:type="dxa"/>
             <w:tcBorders/>
             <w:vAlign w:val="center"/>
           </w:tcPr>
@@ -7989,7 +8268,7 @@
         </w:tc>
         <w:tc>
           <w:tcPr>
-            <w:tcW w:w="3540" w:type="dxa"/>
+            <w:tcW w:w="3377" w:type="dxa"/>
             <w:tcBorders/>
             <w:vAlign w:val="center"/>
           </w:tcPr>
@@ -8019,7 +8298,7 @@
         <w:trPr/>
         <w:tc>
           <w:tcPr>
-            <w:tcW w:w="4730" w:type="dxa"/>
+            <w:tcW w:w="4621" w:type="dxa"/>
             <w:tcBorders/>
             <w:vAlign w:val="center"/>
           </w:tcPr>
@@ -8042,7 +8321,7 @@
         </w:tc>
         <w:tc>
           <w:tcPr>
-            <w:tcW w:w="1699" w:type="dxa"/>
+            <w:tcW w:w="1551" w:type="dxa"/>
             <w:tcBorders/>
             <w:vAlign w:val="center"/>
           </w:tcPr>
@@ -8063,7 +8342,7 @@
         </w:tc>
         <w:tc>
           <w:tcPr>
-            <w:tcW w:w="1841" w:type="dxa"/>
+            <w:tcW w:w="1790" w:type="dxa"/>
             <w:tcBorders/>
             <w:vAlign w:val="center"/>
           </w:tcPr>
@@ -8084,7 +8363,7 @@
         </w:tc>
         <w:tc>
           <w:tcPr>
-            <w:tcW w:w="3540" w:type="dxa"/>
+            <w:tcW w:w="3377" w:type="dxa"/>
             <w:tcBorders/>
             <w:vAlign w:val="center"/>
           </w:tcPr>
@@ -8124,7 +8403,7 @@
         <w:trPr/>
         <w:tc>
           <w:tcPr>
-            <w:tcW w:w="4730" w:type="dxa"/>
+            <w:tcW w:w="4621" w:type="dxa"/>
             <w:tcBorders/>
             <w:vAlign w:val="center"/>
           </w:tcPr>
@@ -8157,7 +8436,7 @@
         </w:tc>
         <w:tc>
           <w:tcPr>
-            <w:tcW w:w="1699" w:type="dxa"/>
+            <w:tcW w:w="1551" w:type="dxa"/>
             <w:tcBorders/>
             <w:vAlign w:val="center"/>
           </w:tcPr>
@@ -8178,7 +8457,7 @@
         </w:tc>
         <w:tc>
           <w:tcPr>
-            <w:tcW w:w="1841" w:type="dxa"/>
+            <w:tcW w:w="1790" w:type="dxa"/>
             <w:tcBorders/>
             <w:vAlign w:val="center"/>
           </w:tcPr>
@@ -8199,7 +8478,7 @@
         </w:tc>
         <w:tc>
           <w:tcPr>
-            <w:tcW w:w="3540" w:type="dxa"/>
+            <w:tcW w:w="3377" w:type="dxa"/>
             <w:tcBorders/>
             <w:vAlign w:val="center"/>
           </w:tcPr>
@@ -8223,7 +8502,7 @@
         <w:trPr/>
         <w:tc>
           <w:tcPr>
-            <w:tcW w:w="4730" w:type="dxa"/>
+            <w:tcW w:w="4621" w:type="dxa"/>
             <w:tcBorders/>
             <w:vAlign w:val="center"/>
           </w:tcPr>
@@ -8246,7 +8525,7 @@
         </w:tc>
         <w:tc>
           <w:tcPr>
-            <w:tcW w:w="1699" w:type="dxa"/>
+            <w:tcW w:w="1551" w:type="dxa"/>
             <w:tcBorders/>
             <w:vAlign w:val="center"/>
           </w:tcPr>
@@ -8267,7 +8546,7 @@
         </w:tc>
         <w:tc>
           <w:tcPr>
-            <w:tcW w:w="1841" w:type="dxa"/>
+            <w:tcW w:w="1790" w:type="dxa"/>
             <w:tcBorders/>
             <w:vAlign w:val="center"/>
           </w:tcPr>
@@ -8294,7 +8573,7 @@
         </w:tc>
         <w:tc>
           <w:tcPr>
-            <w:tcW w:w="3540" w:type="dxa"/>
+            <w:tcW w:w="3377" w:type="dxa"/>
             <w:tcBorders/>
             <w:vAlign w:val="center"/>
           </w:tcPr>
@@ -8334,7 +8613,7 @@
         <w:trPr/>
         <w:tc>
           <w:tcPr>
-            <w:tcW w:w="4730" w:type="dxa"/>
+            <w:tcW w:w="4621" w:type="dxa"/>
             <w:tcBorders/>
             <w:vAlign w:val="center"/>
           </w:tcPr>
@@ -8357,7 +8636,7 @@
         </w:tc>
         <w:tc>
           <w:tcPr>
-            <w:tcW w:w="1699" w:type="dxa"/>
+            <w:tcW w:w="1551" w:type="dxa"/>
             <w:tcBorders/>
             <w:vAlign w:val="center"/>
           </w:tcPr>
@@ -8378,7 +8657,7 @@
         </w:tc>
         <w:tc>
           <w:tcPr>
-            <w:tcW w:w="1841" w:type="dxa"/>
+            <w:tcW w:w="1790" w:type="dxa"/>
             <w:tcBorders/>
             <w:vAlign w:val="center"/>
           </w:tcPr>
@@ -8399,7 +8678,7 @@
         </w:tc>
         <w:tc>
           <w:tcPr>
-            <w:tcW w:w="3540" w:type="dxa"/>
+            <w:tcW w:w="3377" w:type="dxa"/>
             <w:tcBorders/>
             <w:vAlign w:val="center"/>
           </w:tcPr>
@@ -8429,7 +8708,7 @@
         <w:trPr/>
         <w:tc>
           <w:tcPr>
-            <w:tcW w:w="4730" w:type="dxa"/>
+            <w:tcW w:w="4621" w:type="dxa"/>
             <w:tcBorders/>
             <w:vAlign w:val="center"/>
           </w:tcPr>
@@ -8452,7 +8731,7 @@
         </w:tc>
         <w:tc>
           <w:tcPr>
-            <w:tcW w:w="1699" w:type="dxa"/>
+            <w:tcW w:w="1551" w:type="dxa"/>
             <w:tcBorders/>
             <w:vAlign w:val="center"/>
           </w:tcPr>
@@ -8473,7 +8752,7 @@
         </w:tc>
         <w:tc>
           <w:tcPr>
-            <w:tcW w:w="1841" w:type="dxa"/>
+            <w:tcW w:w="1790" w:type="dxa"/>
             <w:tcBorders/>
             <w:vAlign w:val="center"/>
           </w:tcPr>
@@ -8504,7 +8783,7 @@
         </w:tc>
         <w:tc>
           <w:tcPr>
-            <w:tcW w:w="3540" w:type="dxa"/>
+            <w:tcW w:w="3377" w:type="dxa"/>
             <w:tcBorders/>
             <w:vAlign w:val="center"/>
           </w:tcPr>
@@ -9739,9 +10018,9 @@
     </w:p>
     <w:tbl>
       <w:tblPr>
-        <w:tblW w:w="11810" w:type="dxa"/>
+        <w:tblW w:w="11339" w:type="dxa"/>
         <w:jc w:val="left"/>
-        <w:tblInd w:w="0" w:type="dxa"/>
+        <w:tblInd w:w="28" w:type="dxa"/>
         <w:tblLayout w:type="fixed"/>
         <w:tblCellMar>
           <w:top w:w="28" w:type="dxa"/>
@@ -9751,10 +10030,10 @@
         </w:tblCellMar>
       </w:tblPr>
       <w:tblGrid>
-        <w:gridCol w:w="2554"/>
-        <w:gridCol w:w="4096"/>
-        <w:gridCol w:w="1859"/>
-        <w:gridCol w:w="3301"/>
+        <w:gridCol w:w="2285"/>
+        <w:gridCol w:w="4100"/>
+        <w:gridCol w:w="1802"/>
+        <w:gridCol w:w="3152"/>
       </w:tblGrid>
       <w:tr>
         <w:trPr>
@@ -9762,7 +10041,7 @@
         </w:trPr>
         <w:tc>
           <w:tcPr>
-            <w:tcW w:w="2554" w:type="dxa"/>
+            <w:tcW w:w="2285" w:type="dxa"/>
             <w:tcBorders/>
             <w:vAlign w:val="center"/>
           </w:tcPr>
@@ -9784,7 +10063,7 @@
         </w:tc>
         <w:tc>
           <w:tcPr>
-            <w:tcW w:w="4096" w:type="dxa"/>
+            <w:tcW w:w="4100" w:type="dxa"/>
             <w:tcBorders/>
             <w:vAlign w:val="center"/>
           </w:tcPr>
@@ -9806,7 +10085,7 @@
         </w:tc>
         <w:tc>
           <w:tcPr>
-            <w:tcW w:w="1859" w:type="dxa"/>
+            <w:tcW w:w="1802" w:type="dxa"/>
             <w:tcBorders/>
             <w:vAlign w:val="center"/>
           </w:tcPr>
@@ -9828,7 +10107,7 @@
         </w:tc>
         <w:tc>
           <w:tcPr>
-            <w:tcW w:w="3301" w:type="dxa"/>
+            <w:tcW w:w="3152" w:type="dxa"/>
             <w:tcBorders/>
             <w:vAlign w:val="center"/>
           </w:tcPr>
@@ -9853,7 +10132,7 @@
         <w:trPr/>
         <w:tc>
           <w:tcPr>
-            <w:tcW w:w="2554" w:type="dxa"/>
+            <w:tcW w:w="2285" w:type="dxa"/>
             <w:tcBorders/>
             <w:vAlign w:val="center"/>
           </w:tcPr>
@@ -9890,7 +10169,7 @@
         </w:tc>
         <w:tc>
           <w:tcPr>
-            <w:tcW w:w="4096" w:type="dxa"/>
+            <w:tcW w:w="4100" w:type="dxa"/>
             <w:tcBorders/>
             <w:vAlign w:val="center"/>
           </w:tcPr>
@@ -9913,7 +10192,7 @@
         </w:tc>
         <w:tc>
           <w:tcPr>
-            <w:tcW w:w="1859" w:type="dxa"/>
+            <w:tcW w:w="1802" w:type="dxa"/>
             <w:tcBorders/>
             <w:vAlign w:val="center"/>
           </w:tcPr>
@@ -9936,7 +10215,7 @@
         </w:tc>
         <w:tc>
           <w:tcPr>
-            <w:tcW w:w="3301" w:type="dxa"/>
+            <w:tcW w:w="3152" w:type="dxa"/>
             <w:tcBorders/>
             <w:vAlign w:val="center"/>
           </w:tcPr>
@@ -9960,7 +10239,7 @@
         <w:trPr/>
         <w:tc>
           <w:tcPr>
-            <w:tcW w:w="2554" w:type="dxa"/>
+            <w:tcW w:w="2285" w:type="dxa"/>
             <w:tcBorders/>
             <w:vAlign w:val="center"/>
           </w:tcPr>
@@ -9981,7 +10260,7 @@
         </w:tc>
         <w:tc>
           <w:tcPr>
-            <w:tcW w:w="4096" w:type="dxa"/>
+            <w:tcW w:w="4100" w:type="dxa"/>
             <w:tcBorders/>
             <w:vAlign w:val="center"/>
           </w:tcPr>
@@ -10004,7 +10283,7 @@
         </w:tc>
         <w:tc>
           <w:tcPr>
-            <w:tcW w:w="1859" w:type="dxa"/>
+            <w:tcW w:w="1802" w:type="dxa"/>
             <w:tcBorders/>
             <w:vAlign w:val="center"/>
           </w:tcPr>
@@ -10077,7 +10356,7 @@
         </w:tc>
         <w:tc>
           <w:tcPr>
-            <w:tcW w:w="3301" w:type="dxa"/>
+            <w:tcW w:w="3152" w:type="dxa"/>
             <w:tcBorders/>
             <w:vAlign w:val="center"/>
           </w:tcPr>
@@ -10101,7 +10380,7 @@
         <w:trPr/>
         <w:tc>
           <w:tcPr>
-            <w:tcW w:w="2554" w:type="dxa"/>
+            <w:tcW w:w="2285" w:type="dxa"/>
             <w:tcBorders/>
             <w:vAlign w:val="center"/>
           </w:tcPr>
@@ -10122,7 +10401,7 @@
         </w:tc>
         <w:tc>
           <w:tcPr>
-            <w:tcW w:w="4096" w:type="dxa"/>
+            <w:tcW w:w="4100" w:type="dxa"/>
             <w:tcBorders/>
             <w:vAlign w:val="center"/>
           </w:tcPr>
@@ -10145,7 +10424,7 @@
         </w:tc>
         <w:tc>
           <w:tcPr>
-            <w:tcW w:w="1859" w:type="dxa"/>
+            <w:tcW w:w="1802" w:type="dxa"/>
             <w:tcBorders/>
             <w:vAlign w:val="center"/>
           </w:tcPr>
@@ -10166,7 +10445,7 @@
         </w:tc>
         <w:tc>
           <w:tcPr>
-            <w:tcW w:w="3301" w:type="dxa"/>
+            <w:tcW w:w="3152" w:type="dxa"/>
             <w:tcBorders/>
             <w:vAlign w:val="center"/>
           </w:tcPr>
@@ -10190,7 +10469,7 @@
         <w:trPr/>
         <w:tc>
           <w:tcPr>
-            <w:tcW w:w="2554" w:type="dxa"/>
+            <w:tcW w:w="2285" w:type="dxa"/>
             <w:tcBorders/>
             <w:vAlign w:val="center"/>
           </w:tcPr>
@@ -10211,7 +10490,7 @@
         </w:tc>
         <w:tc>
           <w:tcPr>
-            <w:tcW w:w="4096" w:type="dxa"/>
+            <w:tcW w:w="4100" w:type="dxa"/>
             <w:tcBorders/>
             <w:vAlign w:val="center"/>
           </w:tcPr>
@@ -10234,7 +10513,7 @@
         </w:tc>
         <w:tc>
           <w:tcPr>
-            <w:tcW w:w="1859" w:type="dxa"/>
+            <w:tcW w:w="1802" w:type="dxa"/>
             <w:tcBorders/>
             <w:vAlign w:val="center"/>
           </w:tcPr>
@@ -10257,7 +10536,7 @@
         </w:tc>
         <w:tc>
           <w:tcPr>
-            <w:tcW w:w="3301" w:type="dxa"/>
+            <w:tcW w:w="3152" w:type="dxa"/>
             <w:tcBorders/>
             <w:vAlign w:val="center"/>
           </w:tcPr>
@@ -10281,7 +10560,7 @@
         <w:trPr/>
         <w:tc>
           <w:tcPr>
-            <w:tcW w:w="2554" w:type="dxa"/>
+            <w:tcW w:w="2285" w:type="dxa"/>
             <w:tcBorders/>
             <w:vAlign w:val="center"/>
           </w:tcPr>
@@ -10302,7 +10581,7 @@
         </w:tc>
         <w:tc>
           <w:tcPr>
-            <w:tcW w:w="4096" w:type="dxa"/>
+            <w:tcW w:w="4100" w:type="dxa"/>
             <w:tcBorders/>
             <w:vAlign w:val="center"/>
           </w:tcPr>
@@ -10325,7 +10604,7 @@
         </w:tc>
         <w:tc>
           <w:tcPr>
-            <w:tcW w:w="1859" w:type="dxa"/>
+            <w:tcW w:w="1802" w:type="dxa"/>
             <w:tcBorders/>
             <w:vAlign w:val="center"/>
           </w:tcPr>
@@ -10348,7 +10627,7 @@
         </w:tc>
         <w:tc>
           <w:tcPr>
-            <w:tcW w:w="3301" w:type="dxa"/>
+            <w:tcW w:w="3152" w:type="dxa"/>
             <w:tcBorders/>
             <w:vAlign w:val="center"/>
           </w:tcPr>
@@ -10372,7 +10651,7 @@
         <w:trPr/>
         <w:tc>
           <w:tcPr>
-            <w:tcW w:w="2554" w:type="dxa"/>
+            <w:tcW w:w="2285" w:type="dxa"/>
             <w:tcBorders/>
             <w:vAlign w:val="center"/>
           </w:tcPr>
@@ -10399,7 +10678,7 @@
         </w:tc>
         <w:tc>
           <w:tcPr>
-            <w:tcW w:w="4096" w:type="dxa"/>
+            <w:tcW w:w="4100" w:type="dxa"/>
             <w:tcBorders/>
             <w:vAlign w:val="center"/>
           </w:tcPr>
@@ -10422,7 +10701,7 @@
         </w:tc>
         <w:tc>
           <w:tcPr>
-            <w:tcW w:w="1859" w:type="dxa"/>
+            <w:tcW w:w="1802" w:type="dxa"/>
             <w:tcBorders/>
             <w:vAlign w:val="center"/>
           </w:tcPr>
@@ -10445,7 +10724,7 @@
         </w:tc>
         <w:tc>
           <w:tcPr>
-            <w:tcW w:w="3301" w:type="dxa"/>
+            <w:tcW w:w="3152" w:type="dxa"/>
             <w:tcBorders/>
             <w:vAlign w:val="center"/>
           </w:tcPr>
@@ -10479,7 +10758,7 @@
         <w:trPr/>
         <w:tc>
           <w:tcPr>
-            <w:tcW w:w="2554" w:type="dxa"/>
+            <w:tcW w:w="2285" w:type="dxa"/>
             <w:tcBorders/>
             <w:vAlign w:val="center"/>
           </w:tcPr>
@@ -10502,7 +10781,7 @@
         </w:tc>
         <w:tc>
           <w:tcPr>
-            <w:tcW w:w="4096" w:type="dxa"/>
+            <w:tcW w:w="4100" w:type="dxa"/>
             <w:tcBorders/>
             <w:vAlign w:val="center"/>
           </w:tcPr>
@@ -10525,7 +10804,7 @@
         </w:tc>
         <w:tc>
           <w:tcPr>
-            <w:tcW w:w="1859" w:type="dxa"/>
+            <w:tcW w:w="1802" w:type="dxa"/>
             <w:tcBorders/>
             <w:vAlign w:val="center"/>
           </w:tcPr>
@@ -10548,7 +10827,7 @@
         </w:tc>
         <w:tc>
           <w:tcPr>
-            <w:tcW w:w="3301" w:type="dxa"/>
+            <w:tcW w:w="3152" w:type="dxa"/>
             <w:tcBorders/>
             <w:vAlign w:val="center"/>
           </w:tcPr>
@@ -10602,7 +10881,7 @@
         <w:trPr/>
         <w:tc>
           <w:tcPr>
-            <w:tcW w:w="2554" w:type="dxa"/>
+            <w:tcW w:w="2285" w:type="dxa"/>
             <w:tcBorders/>
             <w:vAlign w:val="center"/>
           </w:tcPr>
@@ -10639,7 +10918,7 @@
         </w:tc>
         <w:tc>
           <w:tcPr>
-            <w:tcW w:w="4096" w:type="dxa"/>
+            <w:tcW w:w="4100" w:type="dxa"/>
             <w:tcBorders/>
             <w:vAlign w:val="center"/>
           </w:tcPr>
@@ -10662,7 +10941,7 @@
         </w:tc>
         <w:tc>
           <w:tcPr>
-            <w:tcW w:w="1859" w:type="dxa"/>
+            <w:tcW w:w="1802" w:type="dxa"/>
             <w:tcBorders/>
             <w:vAlign w:val="center"/>
           </w:tcPr>
@@ -10685,7 +10964,7 @@
         </w:tc>
         <w:tc>
           <w:tcPr>
-            <w:tcW w:w="3301" w:type="dxa"/>
+            <w:tcW w:w="3152" w:type="dxa"/>
             <w:tcBorders/>
             <w:vAlign w:val="center"/>
           </w:tcPr>
@@ -10719,7 +10998,7 @@
         <w:trPr/>
         <w:tc>
           <w:tcPr>
-            <w:tcW w:w="2554" w:type="dxa"/>
+            <w:tcW w:w="2285" w:type="dxa"/>
             <w:tcBorders/>
             <w:vAlign w:val="center"/>
           </w:tcPr>
@@ -10742,7 +11021,7 @@
         </w:tc>
         <w:tc>
           <w:tcPr>
-            <w:tcW w:w="4096" w:type="dxa"/>
+            <w:tcW w:w="4100" w:type="dxa"/>
             <w:tcBorders/>
             <w:vAlign w:val="center"/>
           </w:tcPr>
@@ -10765,7 +11044,7 @@
         </w:tc>
         <w:tc>
           <w:tcPr>
-            <w:tcW w:w="1859" w:type="dxa"/>
+            <w:tcW w:w="1802" w:type="dxa"/>
             <w:tcBorders/>
             <w:vAlign w:val="center"/>
           </w:tcPr>
@@ -10788,7 +11067,7 @@
         </w:tc>
         <w:tc>
           <w:tcPr>
-            <w:tcW w:w="3301" w:type="dxa"/>
+            <w:tcW w:w="3152" w:type="dxa"/>
             <w:tcBorders/>
             <w:vAlign w:val="center"/>
           </w:tcPr>
@@ -10812,7 +11091,7 @@
         <w:trPr/>
         <w:tc>
           <w:tcPr>
-            <w:tcW w:w="2554" w:type="dxa"/>
+            <w:tcW w:w="2285" w:type="dxa"/>
             <w:tcBorders/>
             <w:vAlign w:val="center"/>
           </w:tcPr>
@@ -10835,7 +11114,7 @@
         </w:tc>
         <w:tc>
           <w:tcPr>
-            <w:tcW w:w="4096" w:type="dxa"/>
+            <w:tcW w:w="4100" w:type="dxa"/>
             <w:tcBorders/>
             <w:vAlign w:val="center"/>
           </w:tcPr>
@@ -10858,7 +11137,7 @@
         </w:tc>
         <w:tc>
           <w:tcPr>
-            <w:tcW w:w="1859" w:type="dxa"/>
+            <w:tcW w:w="1802" w:type="dxa"/>
             <w:tcBorders/>
             <w:vAlign w:val="center"/>
           </w:tcPr>
@@ -10881,7 +11160,7 @@
         </w:tc>
         <w:tc>
           <w:tcPr>
-            <w:tcW w:w="3301" w:type="dxa"/>
+            <w:tcW w:w="3152" w:type="dxa"/>
             <w:tcBorders/>
             <w:vAlign w:val="center"/>
           </w:tcPr>
@@ -10905,7 +11184,7 @@
         <w:trPr/>
         <w:tc>
           <w:tcPr>
-            <w:tcW w:w="2554" w:type="dxa"/>
+            <w:tcW w:w="2285" w:type="dxa"/>
             <w:tcBorders/>
             <w:vAlign w:val="center"/>
           </w:tcPr>
@@ -10928,7 +11207,7 @@
         </w:tc>
         <w:tc>
           <w:tcPr>
-            <w:tcW w:w="4096" w:type="dxa"/>
+            <w:tcW w:w="4100" w:type="dxa"/>
             <w:tcBorders/>
             <w:vAlign w:val="center"/>
           </w:tcPr>
@@ -10951,7 +11230,7 @@
         </w:tc>
         <w:tc>
           <w:tcPr>
-            <w:tcW w:w="1859" w:type="dxa"/>
+            <w:tcW w:w="1802" w:type="dxa"/>
             <w:tcBorders/>
             <w:vAlign w:val="center"/>
           </w:tcPr>
@@ -10974,7 +11253,7 @@
         </w:tc>
         <w:tc>
           <w:tcPr>
-            <w:tcW w:w="3301" w:type="dxa"/>
+            <w:tcW w:w="3152" w:type="dxa"/>
             <w:tcBorders/>
             <w:vAlign w:val="center"/>
           </w:tcPr>
@@ -11194,9 +11473,9 @@
     </w:p>
     <w:tbl>
       <w:tblPr>
-        <w:tblW w:w="11253" w:type="dxa"/>
+        <w:tblW w:w="10959" w:type="dxa"/>
         <w:jc w:val="left"/>
-        <w:tblInd w:w="0" w:type="dxa"/>
+        <w:tblInd w:w="28" w:type="dxa"/>
         <w:tblLayout w:type="fixed"/>
         <w:tblCellMar>
           <w:top w:w="28" w:type="dxa"/>
@@ -11206,9 +11485,9 @@
         </w:tblCellMar>
       </w:tblPr>
       <w:tblGrid>
-        <w:gridCol w:w="3751"/>
-        <w:gridCol w:w="3091"/>
-        <w:gridCol w:w="4411"/>
+        <w:gridCol w:w="3762"/>
+        <w:gridCol w:w="2975"/>
+        <w:gridCol w:w="4222"/>
       </w:tblGrid>
       <w:tr>
         <w:trPr>
@@ -11216,7 +11495,7 @@
         </w:trPr>
         <w:tc>
           <w:tcPr>
-            <w:tcW w:w="3751" w:type="dxa"/>
+            <w:tcW w:w="3762" w:type="dxa"/>
             <w:tcBorders/>
             <w:vAlign w:val="center"/>
           </w:tcPr>
@@ -11238,7 +11517,7 @@
         </w:tc>
         <w:tc>
           <w:tcPr>
-            <w:tcW w:w="3091" w:type="dxa"/>
+            <w:tcW w:w="2975" w:type="dxa"/>
             <w:tcBorders/>
             <w:vAlign w:val="center"/>
           </w:tcPr>
@@ -11260,7 +11539,7 @@
         </w:tc>
         <w:tc>
           <w:tcPr>
-            <w:tcW w:w="4411" w:type="dxa"/>
+            <w:tcW w:w="4222" w:type="dxa"/>
             <w:tcBorders/>
             <w:vAlign w:val="center"/>
           </w:tcPr>
@@ -11285,7 +11564,7 @@
         <w:trPr/>
         <w:tc>
           <w:tcPr>
-            <w:tcW w:w="3751" w:type="dxa"/>
+            <w:tcW w:w="3762" w:type="dxa"/>
             <w:tcBorders/>
             <w:vAlign w:val="center"/>
           </w:tcPr>
@@ -11308,7 +11587,7 @@
         </w:tc>
         <w:tc>
           <w:tcPr>
-            <w:tcW w:w="3091" w:type="dxa"/>
+            <w:tcW w:w="2975" w:type="dxa"/>
             <w:tcBorders/>
             <w:vAlign w:val="center"/>
           </w:tcPr>
@@ -11329,7 +11608,7 @@
         </w:tc>
         <w:tc>
           <w:tcPr>
-            <w:tcW w:w="4411" w:type="dxa"/>
+            <w:tcW w:w="4222" w:type="dxa"/>
             <w:tcBorders/>
             <w:vAlign w:val="center"/>
           </w:tcPr>
@@ -11353,7 +11632,7 @@
         <w:trPr/>
         <w:tc>
           <w:tcPr>
-            <w:tcW w:w="3751" w:type="dxa"/>
+            <w:tcW w:w="3762" w:type="dxa"/>
             <w:tcBorders/>
             <w:vAlign w:val="center"/>
           </w:tcPr>
@@ -11376,7 +11655,7 @@
         </w:tc>
         <w:tc>
           <w:tcPr>
-            <w:tcW w:w="3091" w:type="dxa"/>
+            <w:tcW w:w="2975" w:type="dxa"/>
             <w:tcBorders/>
             <w:vAlign w:val="center"/>
           </w:tcPr>
@@ -11397,7 +11676,7 @@
         </w:tc>
         <w:tc>
           <w:tcPr>
-            <w:tcW w:w="4411" w:type="dxa"/>
+            <w:tcW w:w="4222" w:type="dxa"/>
             <w:tcBorders/>
             <w:vAlign w:val="center"/>
           </w:tcPr>
@@ -11878,9 +12157,9 @@
     </w:p>
     <w:tbl>
       <w:tblPr>
-        <w:tblW w:w="11810" w:type="dxa"/>
+        <w:tblW w:w="11339" w:type="dxa"/>
         <w:jc w:val="left"/>
-        <w:tblInd w:w="0" w:type="dxa"/>
+        <w:tblInd w:w="28" w:type="dxa"/>
         <w:tblLayout w:type="fixed"/>
         <w:tblCellMar>
           <w:top w:w="28" w:type="dxa"/>
@@ -11890,9 +12169,9 @@
         </w:tblCellMar>
       </w:tblPr>
       <w:tblGrid>
-        <w:gridCol w:w="1186"/>
-        <w:gridCol w:w="8225"/>
-        <w:gridCol w:w="2399"/>
+        <w:gridCol w:w="1180"/>
+        <w:gridCol w:w="7903"/>
+        <w:gridCol w:w="2256"/>
       </w:tblGrid>
       <w:tr>
         <w:trPr>
@@ -11900,7 +12179,7 @@
         </w:trPr>
         <w:tc>
           <w:tcPr>
-            <w:tcW w:w="1186" w:type="dxa"/>
+            <w:tcW w:w="1180" w:type="dxa"/>
             <w:tcBorders/>
             <w:vAlign w:val="center"/>
           </w:tcPr>
@@ -11922,7 +12201,7 @@
         </w:tc>
         <w:tc>
           <w:tcPr>
-            <w:tcW w:w="8225" w:type="dxa"/>
+            <w:tcW w:w="7903" w:type="dxa"/>
             <w:tcBorders/>
             <w:vAlign w:val="center"/>
           </w:tcPr>
@@ -11944,7 +12223,7 @@
         </w:tc>
         <w:tc>
           <w:tcPr>
-            <w:tcW w:w="2399" w:type="dxa"/>
+            <w:tcW w:w="2256" w:type="dxa"/>
             <w:tcBorders/>
             <w:vAlign w:val="center"/>
           </w:tcPr>
@@ -11979,7 +12258,7 @@
         <w:trPr/>
         <w:tc>
           <w:tcPr>
-            <w:tcW w:w="1186" w:type="dxa"/>
+            <w:tcW w:w="1180" w:type="dxa"/>
             <w:tcBorders/>
             <w:vAlign w:val="center"/>
           </w:tcPr>
@@ -12002,7 +12281,7 @@
         </w:tc>
         <w:tc>
           <w:tcPr>
-            <w:tcW w:w="8225" w:type="dxa"/>
+            <w:tcW w:w="7903" w:type="dxa"/>
             <w:tcBorders/>
             <w:vAlign w:val="center"/>
           </w:tcPr>
@@ -12033,7 +12312,7 @@
         </w:tc>
         <w:tc>
           <w:tcPr>
-            <w:tcW w:w="2399" w:type="dxa"/>
+            <w:tcW w:w="2256" w:type="dxa"/>
             <w:tcBorders/>
             <w:vAlign w:val="center"/>
           </w:tcPr>
@@ -12077,7 +12356,7 @@
         <w:trPr/>
         <w:tc>
           <w:tcPr>
-            <w:tcW w:w="1186" w:type="dxa"/>
+            <w:tcW w:w="1180" w:type="dxa"/>
             <w:tcBorders/>
             <w:vAlign w:val="center"/>
           </w:tcPr>
@@ -12100,7 +12379,7 @@
         </w:tc>
         <w:tc>
           <w:tcPr>
-            <w:tcW w:w="8225" w:type="dxa"/>
+            <w:tcW w:w="7903" w:type="dxa"/>
             <w:tcBorders/>
             <w:vAlign w:val="center"/>
           </w:tcPr>
@@ -12131,7 +12410,7 @@
         </w:tc>
         <w:tc>
           <w:tcPr>
-            <w:tcW w:w="2399" w:type="dxa"/>
+            <w:tcW w:w="2256" w:type="dxa"/>
             <w:tcBorders/>
             <w:vAlign w:val="center"/>
           </w:tcPr>
@@ -12175,7 +12454,7 @@
         <w:trPr/>
         <w:tc>
           <w:tcPr>
-            <w:tcW w:w="1186" w:type="dxa"/>
+            <w:tcW w:w="1180" w:type="dxa"/>
             <w:tcBorders/>
             <w:vAlign w:val="center"/>
           </w:tcPr>
@@ -12198,7 +12477,7 @@
         </w:tc>
         <w:tc>
           <w:tcPr>
-            <w:tcW w:w="8225" w:type="dxa"/>
+            <w:tcW w:w="7903" w:type="dxa"/>
             <w:tcBorders/>
             <w:vAlign w:val="center"/>
           </w:tcPr>
@@ -12219,7 +12498,7 @@
         </w:tc>
         <w:tc>
           <w:tcPr>
-            <w:tcW w:w="2399" w:type="dxa"/>
+            <w:tcW w:w="2256" w:type="dxa"/>
             <w:tcBorders/>
             <w:vAlign w:val="center"/>
           </w:tcPr>
@@ -12249,7 +12528,7 @@
         <w:trPr/>
         <w:tc>
           <w:tcPr>
-            <w:tcW w:w="1186" w:type="dxa"/>
+            <w:tcW w:w="1180" w:type="dxa"/>
             <w:tcBorders/>
             <w:vAlign w:val="center"/>
           </w:tcPr>
@@ -12272,7 +12551,7 @@
         </w:tc>
         <w:tc>
           <w:tcPr>
-            <w:tcW w:w="8225" w:type="dxa"/>
+            <w:tcW w:w="7903" w:type="dxa"/>
             <w:tcBorders/>
             <w:vAlign w:val="center"/>
           </w:tcPr>
@@ -12355,7 +12634,7 @@
         </w:tc>
         <w:tc>
           <w:tcPr>
-            <w:tcW w:w="2399" w:type="dxa"/>
+            <w:tcW w:w="2256" w:type="dxa"/>
             <w:tcBorders/>
             <w:vAlign w:val="center"/>
           </w:tcPr>
@@ -12379,7 +12658,7 @@
         <w:trPr/>
         <w:tc>
           <w:tcPr>
-            <w:tcW w:w="1186" w:type="dxa"/>
+            <w:tcW w:w="1180" w:type="dxa"/>
             <w:tcBorders/>
             <w:vAlign w:val="center"/>
           </w:tcPr>
@@ -12402,7 +12681,7 @@
         </w:tc>
         <w:tc>
           <w:tcPr>
-            <w:tcW w:w="8225" w:type="dxa"/>
+            <w:tcW w:w="7903" w:type="dxa"/>
             <w:tcBorders/>
             <w:vAlign w:val="center"/>
           </w:tcPr>
@@ -12423,7 +12702,7 @@
         </w:tc>
         <w:tc>
           <w:tcPr>
-            <w:tcW w:w="2399" w:type="dxa"/>
+            <w:tcW w:w="2256" w:type="dxa"/>
             <w:tcBorders/>
             <w:vAlign w:val="center"/>
           </w:tcPr>
@@ -12503,9 +12782,9 @@
     </w:p>
     <w:tbl>
       <w:tblPr>
-        <w:tblW w:w="11810" w:type="dxa"/>
+        <w:tblW w:w="11339" w:type="dxa"/>
         <w:jc w:val="left"/>
-        <w:tblInd w:w="0" w:type="dxa"/>
+        <w:tblInd w:w="28" w:type="dxa"/>
         <w:tblLayout w:type="fixed"/>
         <w:tblCellMar>
           <w:top w:w="28" w:type="dxa"/>
@@ -12515,8 +12794,8 @@
         </w:tblCellMar>
       </w:tblPr>
       <w:tblGrid>
-        <w:gridCol w:w="5490"/>
-        <w:gridCol w:w="6320"/>
+        <w:gridCol w:w="5449"/>
+        <w:gridCol w:w="5890"/>
       </w:tblGrid>
       <w:tr>
         <w:trPr>
@@ -12524,7 +12803,7 @@
         </w:trPr>
         <w:tc>
           <w:tcPr>
-            <w:tcW w:w="5490" w:type="dxa"/>
+            <w:tcW w:w="5449" w:type="dxa"/>
             <w:tcBorders/>
             <w:vAlign w:val="center"/>
           </w:tcPr>
@@ -12546,7 +12825,7 @@
         </w:tc>
         <w:tc>
           <w:tcPr>
-            <w:tcW w:w="6320" w:type="dxa"/>
+            <w:tcW w:w="5890" w:type="dxa"/>
             <w:tcBorders/>
             <w:vAlign w:val="center"/>
           </w:tcPr>
@@ -12571,7 +12850,7 @@
         <w:trPr/>
         <w:tc>
           <w:tcPr>
-            <w:tcW w:w="5490" w:type="dxa"/>
+            <w:tcW w:w="5449" w:type="dxa"/>
             <w:tcBorders/>
             <w:vAlign w:val="center"/>
           </w:tcPr>
@@ -12594,7 +12873,7 @@
         </w:tc>
         <w:tc>
           <w:tcPr>
-            <w:tcW w:w="6320" w:type="dxa"/>
+            <w:tcW w:w="5890" w:type="dxa"/>
             <w:tcBorders/>
             <w:vAlign w:val="center"/>
           </w:tcPr>
@@ -12618,7 +12897,7 @@
         <w:trPr/>
         <w:tc>
           <w:tcPr>
-            <w:tcW w:w="5490" w:type="dxa"/>
+            <w:tcW w:w="5449" w:type="dxa"/>
             <w:tcBorders/>
             <w:vAlign w:val="center"/>
           </w:tcPr>
@@ -12641,7 +12920,7 @@
         </w:tc>
         <w:tc>
           <w:tcPr>
-            <w:tcW w:w="6320" w:type="dxa"/>
+            <w:tcW w:w="5890" w:type="dxa"/>
             <w:tcBorders/>
             <w:vAlign w:val="center"/>
           </w:tcPr>
@@ -12675,7 +12954,7 @@
         <w:trPr/>
         <w:tc>
           <w:tcPr>
-            <w:tcW w:w="5490" w:type="dxa"/>
+            <w:tcW w:w="5449" w:type="dxa"/>
             <w:tcBorders/>
             <w:vAlign w:val="center"/>
           </w:tcPr>
@@ -12698,7 +12977,7 @@
         </w:tc>
         <w:tc>
           <w:tcPr>
-            <w:tcW w:w="6320" w:type="dxa"/>
+            <w:tcW w:w="5890" w:type="dxa"/>
             <w:tcBorders/>
             <w:vAlign w:val="center"/>
           </w:tcPr>
@@ -12722,7 +13001,7 @@
         <w:trPr/>
         <w:tc>
           <w:tcPr>
-            <w:tcW w:w="5490" w:type="dxa"/>
+            <w:tcW w:w="5449" w:type="dxa"/>
             <w:tcBorders/>
             <w:vAlign w:val="center"/>
           </w:tcPr>
@@ -12745,7 +13024,7 @@
         </w:tc>
         <w:tc>
           <w:tcPr>
-            <w:tcW w:w="6320" w:type="dxa"/>
+            <w:tcW w:w="5890" w:type="dxa"/>
             <w:tcBorders/>
             <w:vAlign w:val="center"/>
           </w:tcPr>
@@ -12769,7 +13048,7 @@
         <w:trPr/>
         <w:tc>
           <w:tcPr>
-            <w:tcW w:w="5490" w:type="dxa"/>
+            <w:tcW w:w="5449" w:type="dxa"/>
             <w:tcBorders/>
             <w:vAlign w:val="center"/>
           </w:tcPr>
@@ -12792,7 +13071,7 @@
         </w:tc>
         <w:tc>
           <w:tcPr>
-            <w:tcW w:w="6320" w:type="dxa"/>
+            <w:tcW w:w="5890" w:type="dxa"/>
             <w:tcBorders/>
             <w:vAlign w:val="center"/>
           </w:tcPr>
@@ -12816,7 +13095,7 @@
         <w:trPr/>
         <w:tc>
           <w:tcPr>
-            <w:tcW w:w="5490" w:type="dxa"/>
+            <w:tcW w:w="5449" w:type="dxa"/>
             <w:tcBorders/>
             <w:vAlign w:val="center"/>
           </w:tcPr>
@@ -12839,7 +13118,7 @@
         </w:tc>
         <w:tc>
           <w:tcPr>
-            <w:tcW w:w="6320" w:type="dxa"/>
+            <w:tcW w:w="5890" w:type="dxa"/>
             <w:tcBorders/>
             <w:vAlign w:val="center"/>
           </w:tcPr>
@@ -12863,7 +13142,7 @@
         <w:trPr/>
         <w:tc>
           <w:tcPr>
-            <w:tcW w:w="5490" w:type="dxa"/>
+            <w:tcW w:w="5449" w:type="dxa"/>
             <w:tcBorders/>
             <w:vAlign w:val="center"/>
           </w:tcPr>
@@ -12896,7 +13175,7 @@
         </w:tc>
         <w:tc>
           <w:tcPr>
-            <w:tcW w:w="6320" w:type="dxa"/>
+            <w:tcW w:w="5890" w:type="dxa"/>
             <w:tcBorders/>
             <w:vAlign w:val="center"/>
           </w:tcPr>
@@ -12940,7 +13219,7 @@
         <w:trPr/>
         <w:tc>
           <w:tcPr>
-            <w:tcW w:w="5490" w:type="dxa"/>
+            <w:tcW w:w="5449" w:type="dxa"/>
             <w:tcBorders/>
             <w:vAlign w:val="center"/>
           </w:tcPr>
@@ -12963,7 +13242,7 @@
         </w:tc>
         <w:tc>
           <w:tcPr>
-            <w:tcW w:w="6320" w:type="dxa"/>
+            <w:tcW w:w="5890" w:type="dxa"/>
             <w:tcBorders/>
             <w:vAlign w:val="center"/>
           </w:tcPr>
@@ -13017,7 +13296,7 @@
         <w:trPr/>
         <w:tc>
           <w:tcPr>
-            <w:tcW w:w="5490" w:type="dxa"/>
+            <w:tcW w:w="5449" w:type="dxa"/>
             <w:tcBorders/>
             <w:vAlign w:val="center"/>
           </w:tcPr>
@@ -13040,7 +13319,7 @@
         </w:tc>
         <w:tc>
           <w:tcPr>
-            <w:tcW w:w="6320" w:type="dxa"/>
+            <w:tcW w:w="5890" w:type="dxa"/>
             <w:tcBorders/>
             <w:vAlign w:val="center"/>
           </w:tcPr>
@@ -13070,7 +13349,7 @@
         <w:trPr/>
         <w:tc>
           <w:tcPr>
-            <w:tcW w:w="5490" w:type="dxa"/>
+            <w:tcW w:w="5449" w:type="dxa"/>
             <w:tcBorders/>
             <w:vAlign w:val="center"/>
           </w:tcPr>
@@ -13093,7 +13372,7 @@
         </w:tc>
         <w:tc>
           <w:tcPr>
-            <w:tcW w:w="6320" w:type="dxa"/>
+            <w:tcW w:w="5890" w:type="dxa"/>
             <w:tcBorders/>
             <w:vAlign w:val="center"/>
           </w:tcPr>
@@ -13127,7 +13406,7 @@
         <w:trPr/>
         <w:tc>
           <w:tcPr>
-            <w:tcW w:w="5490" w:type="dxa"/>
+            <w:tcW w:w="5449" w:type="dxa"/>
             <w:tcBorders/>
             <w:vAlign w:val="center"/>
           </w:tcPr>
@@ -13150,7 +13429,7 @@
         </w:tc>
         <w:tc>
           <w:tcPr>
-            <w:tcW w:w="6320" w:type="dxa"/>
+            <w:tcW w:w="5890" w:type="dxa"/>
             <w:tcBorders/>
             <w:vAlign w:val="center"/>
           </w:tcPr>
@@ -13180,7 +13459,7 @@
         <w:trPr/>
         <w:tc>
           <w:tcPr>
-            <w:tcW w:w="5490" w:type="dxa"/>
+            <w:tcW w:w="5449" w:type="dxa"/>
             <w:tcBorders/>
             <w:vAlign w:val="center"/>
           </w:tcPr>
@@ -13203,7 +13482,7 @@
         </w:tc>
         <w:tc>
           <w:tcPr>
-            <w:tcW w:w="6320" w:type="dxa"/>
+            <w:tcW w:w="5890" w:type="dxa"/>
             <w:tcBorders/>
             <w:vAlign w:val="center"/>
           </w:tcPr>
@@ -13247,7 +13526,7 @@
         <w:trPr/>
         <w:tc>
           <w:tcPr>
-            <w:tcW w:w="5490" w:type="dxa"/>
+            <w:tcW w:w="5449" w:type="dxa"/>
             <w:tcBorders/>
             <w:vAlign w:val="center"/>
           </w:tcPr>
@@ -13270,7 +13549,7 @@
         </w:tc>
         <w:tc>
           <w:tcPr>
-            <w:tcW w:w="6320" w:type="dxa"/>
+            <w:tcW w:w="5890" w:type="dxa"/>
             <w:tcBorders/>
             <w:vAlign w:val="center"/>
           </w:tcPr>
@@ -16282,7 +16561,7 @@
       <w:start w:val="1"/>
       <w:numFmt w:val="none"/>
       <w:suff w:val="nothing"/>
-      <w:lvlText w:val="%1"/>
+      <w:lvlText w:val=""/>
       <w:lvlJc w:val="left"/>
       <w:pPr>
         <w:tabs>
@@ -16293,10 +16572,51 @@
     </w:lvl>
     <w:lvl w:ilvl="1">
       <w:start w:val="1"/>
+      <w:numFmt w:val="none"/>
       <w:pStyle w:val="Heading2"/>
+      <w:suff w:val="nothing"/>
+      <w:lvlText w:val=""/>
+      <w:lvlJc w:val="left"/>
+      <w:pPr>
+        <w:tabs>
+          <w:tab w:val="num" w:pos="0"/>
+        </w:tabs>
+        <w:ind w:left="0" w:hanging="0"/>
+      </w:pPr>
+    </w:lvl>
+    <w:lvl w:ilvl="2">
+      <w:start w:val="1"/>
+      <w:numFmt w:val="none"/>
+      <w:pStyle w:val="Heading3"/>
+      <w:suff w:val="nothing"/>
+      <w:lvlText w:val=""/>
+      <w:lvlJc w:val="left"/>
+      <w:pPr>
+        <w:tabs>
+          <w:tab w:val="num" w:pos="0"/>
+        </w:tabs>
+        <w:ind w:left="0" w:hanging="0"/>
+      </w:pPr>
+    </w:lvl>
+    <w:lvl w:ilvl="3">
+      <w:start w:val="1"/>
+      <w:numFmt w:val="none"/>
+      <w:pStyle w:val="Heading4"/>
+      <w:suff w:val="nothing"/>
+      <w:lvlText w:val=""/>
+      <w:lvlJc w:val="left"/>
+      <w:pPr>
+        <w:tabs>
+          <w:tab w:val="num" w:pos="0"/>
+        </w:tabs>
+        <w:ind w:left="0" w:hanging="0"/>
+      </w:pPr>
+    </w:lvl>
+    <w:lvl w:ilvl="4">
+      <w:start w:val="1"/>
       <w:numFmt w:val="none"/>
       <w:suff w:val="nothing"/>
-      <w:lvlText w:val="%2"/>
+      <w:lvlText w:val=""/>
       <w:lvlJc w:val="left"/>
       <w:pPr>
         <w:tabs>
@@ -16305,12 +16625,11 @@
         <w:ind w:left="0" w:hanging="0"/>
       </w:pPr>
     </w:lvl>
-    <w:lvl w:ilvl="2">
-      <w:start w:val="1"/>
-      <w:pStyle w:val="Heading3"/>
+    <w:lvl w:ilvl="5">
+      <w:start w:val="1"/>
       <w:numFmt w:val="none"/>
       <w:suff w:val="nothing"/>
-      <w:lvlText w:val="%3"/>
+      <w:lvlText w:val=""/>
       <w:lvlJc w:val="left"/>
       <w:pPr>
         <w:tabs>
@@ -16319,12 +16638,11 @@
         <w:ind w:left="0" w:hanging="0"/>
       </w:pPr>
     </w:lvl>
-    <w:lvl w:ilvl="3">
-      <w:start w:val="1"/>
-      <w:pStyle w:val="Heading4"/>
+    <w:lvl w:ilvl="6">
+      <w:start w:val="1"/>
       <w:numFmt w:val="none"/>
       <w:suff w:val="nothing"/>
-      <w:lvlText w:val="%4"/>
+      <w:lvlText w:val=""/>
       <w:lvlJc w:val="left"/>
       <w:pPr>
         <w:tabs>
@@ -16333,11 +16651,11 @@
         <w:ind w:left="0" w:hanging="0"/>
       </w:pPr>
     </w:lvl>
-    <w:lvl w:ilvl="4">
+    <w:lvl w:ilvl="7">
       <w:start w:val="1"/>
       <w:numFmt w:val="none"/>
       <w:suff w:val="nothing"/>
-      <w:lvlText w:val="%5"/>
+      <w:lvlText w:val=""/>
       <w:lvlJc w:val="left"/>
       <w:pPr>
         <w:tabs>
@@ -16346,50 +16664,11 @@
         <w:ind w:left="0" w:hanging="0"/>
       </w:pPr>
     </w:lvl>
-    <w:lvl w:ilvl="5">
+    <w:lvl w:ilvl="8">
       <w:start w:val="1"/>
       <w:numFmt w:val="none"/>
       <w:suff w:val="nothing"/>
-      <w:lvlText w:val="%6"/>
-      <w:lvlJc w:val="left"/>
-      <w:pPr>
-        <w:tabs>
-          <w:tab w:val="num" w:pos="0"/>
-        </w:tabs>
-        <w:ind w:left="0" w:hanging="0"/>
-      </w:pPr>
-    </w:lvl>
-    <w:lvl w:ilvl="6">
-      <w:start w:val="1"/>
-      <w:numFmt w:val="none"/>
-      <w:suff w:val="nothing"/>
-      <w:lvlText w:val="%7"/>
-      <w:lvlJc w:val="left"/>
-      <w:pPr>
-        <w:tabs>
-          <w:tab w:val="num" w:pos="0"/>
-        </w:tabs>
-        <w:ind w:left="0" w:hanging="0"/>
-      </w:pPr>
-    </w:lvl>
-    <w:lvl w:ilvl="7">
-      <w:start w:val="1"/>
-      <w:numFmt w:val="none"/>
-      <w:suff w:val="nothing"/>
-      <w:lvlText w:val="%8"/>
-      <w:lvlJc w:val="left"/>
-      <w:pPr>
-        <w:tabs>
-          <w:tab w:val="num" w:pos="0"/>
-        </w:tabs>
-        <w:ind w:left="0" w:hanging="0"/>
-      </w:pPr>
-    </w:lvl>
-    <w:lvl w:ilvl="8">
-      <w:start w:val="1"/>
-      <w:numFmt w:val="none"/>
-      <w:suff w:val="nothing"/>
-      <w:lvlText w:val="%9"/>
+      <w:lvlText w:val=""/>
       <w:lvlJc w:val="left"/>
       <w:pPr>
         <w:tabs>
@@ -16470,7 +16749,7 @@
   <w:docDefaults>
     <w:rPrDefault>
       <w:rPr>
-        <w:rFonts w:ascii="Liberation Serif" w:hAnsi="Liberation Serif" w:eastAsia="WenQuanYi Zen Hei" w:cs="FreeSans"/>
+        <w:rFonts w:ascii="Liberation Serif" w:hAnsi="Liberation Serif" w:eastAsia="Noto Serif CJK SC" w:cs="Noto Sans Devanagari"/>
         <w:sz w:val="24"/>
         <w:szCs w:val="24"/>
         <w:lang w:val="en-US" w:eastAsia="zh-CN" w:bidi="hi-IN"/>
@@ -16500,7 +16779,7 @@
     </w:rPr>
   </w:style>
   <w:style w:type="paragraph" w:styleId="Heading1">
-    <w:name w:val="Heading 1"/>
+    <w:name w:val="heading 1"/>
     <w:basedOn w:val="Heading"/>
     <w:next w:val="BodyText"/>
     <w:qFormat/>
@@ -16508,7 +16787,6 @@
       <w:spacing w:before="240" w:after="80"/>
     </w:pPr>
     <w:rPr>
-      <w:rFonts w:ascii="Noto Sans" w:hAnsi="Noto Sans"/>
       <w:b/>
       <w:bCs/>
       <w:color w:val="88C0D0"/>
@@ -16517,7 +16795,7 @@
     </w:rPr>
   </w:style>
   <w:style w:type="paragraph" w:styleId="Heading2">
-    <w:name w:val="Heading 2"/>
+    <w:name w:val="heading 2"/>
     <w:basedOn w:val="Heading"/>
     <w:next w:val="BodyText"/>
     <w:qFormat/>
@@ -16530,7 +16808,7 @@
       <w:outlineLvl w:val="1"/>
     </w:pPr>
     <w:rPr>
-      <w:rFonts w:ascii="Liberation Serif" w:hAnsi="Liberation Serif" w:eastAsia="WenQuanYi Zen Hei" w:cs="FreeSans"/>
+      <w:rFonts w:ascii="Liberation Serif" w:hAnsi="Liberation Serif" w:eastAsia="Noto Serif CJK SC" w:cs="Noto Sans Devanagari"/>
       <w:b/>
       <w:bCs/>
       <w:color w:val="88C0D0"/>
@@ -16539,7 +16817,7 @@
     </w:rPr>
   </w:style>
   <w:style w:type="paragraph" w:styleId="Heading3">
-    <w:name w:val="Heading 3"/>
+    <w:name w:val="heading 3"/>
     <w:basedOn w:val="Heading"/>
     <w:next w:val="BodyText"/>
     <w:qFormat/>
@@ -16549,7 +16827,7 @@
       <w:outlineLvl w:val="2"/>
     </w:pPr>
     <w:rPr>
-      <w:rFonts w:ascii="Liberation Serif" w:hAnsi="Liberation Serif" w:eastAsia="WenQuanYi Zen Hei" w:cs="FreeSans"/>
+      <w:rFonts w:ascii="Liberation Serif" w:hAnsi="Liberation Serif" w:eastAsia="Noto Serif CJK SC" w:cs="Noto Sans Devanagari"/>
       <w:b/>
       <w:bCs/>
       <w:color w:val="88C0D0"/>
@@ -16558,7 +16836,7 @@
     </w:rPr>
   </w:style>
   <w:style w:type="paragraph" w:styleId="Heading4">
-    <w:name w:val="Heading 4"/>
+    <w:name w:val="heading 4"/>
     <w:basedOn w:val="Heading"/>
     <w:next w:val="BodyText"/>
     <w:qFormat/>
@@ -16567,11 +16845,23 @@
       <w:outlineLvl w:val="3"/>
     </w:pPr>
     <w:rPr>
-      <w:rFonts w:ascii="Liberation Serif" w:hAnsi="Liberation Serif" w:eastAsia="WenQuanYi Zen Hei" w:cs="FreeSans"/>
+      <w:rFonts w:ascii="Liberation Serif" w:hAnsi="Liberation Serif" w:eastAsia="Noto Serif CJK SC" w:cs="Noto Sans Devanagari"/>
       <w:b/>
       <w:bCs/>
       <w:sz w:val="24"/>
       <w:szCs w:val="24"/>
+    </w:rPr>
+  </w:style>
+  <w:style w:type="character" w:styleId="EndnoteReference">
+    <w:name w:val="endnote reference"/>
+    <w:rPr>
+      <w:vertAlign w:val="superscript"/>
+    </w:rPr>
+  </w:style>
+  <w:style w:type="character" w:styleId="FootnoteReference">
+    <w:name w:val="footnote reference"/>
+    <w:rPr>
+      <w:vertAlign w:val="superscript"/>
     </w:rPr>
   </w:style>
   <w:style w:type="character" w:styleId="EndnoteCharacters">
@@ -16651,7 +16941,7 @@
     </w:rPr>
   </w:style>
   <w:style w:type="paragraph" w:styleId="EnvelopeReturn">
-    <w:name w:val="Envelope Return"/>
+    <w:name w:val="envelope return"/>
     <w:basedOn w:val="Normal"/>
     <w:pPr/>
     <w:rPr>
@@ -16670,46 +16960,6 @@
       <w:color w:val="ECEFF4"/>
     </w:rPr>
   </w:style>
-  <w:style w:type="paragraph" w:styleId="Footer">
-    <w:name w:val="Footer"/>
-    <w:basedOn w:val="Normal"/>
-    <w:pPr>
-      <w:suppressLineNumbers/>
-      <w:tabs>
-        <w:tab w:val="clear" w:pos="1134"/>
-        <w:tab w:val="center" w:pos="5952" w:leader="none"/>
-        <w:tab w:val="right" w:pos="10771" w:leader="none"/>
-      </w:tabs>
-    </w:pPr>
-    <w:rPr/>
-  </w:style>
-  <w:style w:type="paragraph" w:styleId="Header">
-    <w:name w:val="Header"/>
-    <w:basedOn w:val="Normal"/>
-    <w:pPr>
-      <w:suppressLineNumbers/>
-      <w:tabs>
-        <w:tab w:val="clear" w:pos="1134"/>
-        <w:tab w:val="center" w:pos="5952" w:leader="none"/>
-        <w:tab w:val="right" w:pos="10771" w:leader="none"/>
-      </w:tabs>
-    </w:pPr>
-    <w:rPr/>
-  </w:style>
-  <w:style w:type="paragraph" w:styleId="HeaderandFooter">
-    <w:name w:val="Header and Footer"/>
-    <w:basedOn w:val="Normal"/>
-    <w:qFormat/>
-    <w:pPr>
-      <w:suppressLineNumbers/>
-      <w:tabs>
-        <w:tab w:val="clear" w:pos="1134"/>
-        <w:tab w:val="center" w:pos="5953" w:leader="none"/>
-        <w:tab w:val="right" w:pos="10772" w:leader="none"/>
-      </w:tabs>
-    </w:pPr>
-    <w:rPr/>
-  </w:style>
   <w:style w:type="paragraph" w:styleId="Index">
     <w:name w:val="Index"/>
     <w:basedOn w:val="Normal"/>
@@ -16718,11 +16968,11 @@
       <w:suppressLineNumbers/>
     </w:pPr>
     <w:rPr>
-      <w:rFonts w:cs="FreeSans"/>
+      <w:rFonts w:cs="Noto Sans Devanagari"/>
     </w:rPr>
   </w:style>
   <w:style w:type="paragraph" w:styleId="Caption">
-    <w:name w:val="Caption"/>
+    <w:name w:val="caption"/>
     <w:basedOn w:val="Normal"/>
     <w:qFormat/>
     <w:pPr>
@@ -16730,7 +16980,7 @@
       <w:spacing w:before="120" w:after="120"/>
     </w:pPr>
     <w:rPr>
-      <w:rFonts w:cs="FreeSans"/>
+      <w:rFonts w:cs="Noto Sans Devanagari"/>
       <w:i/>
       <w:iCs/>
       <w:sz w:val="24"/>
@@ -16742,7 +16992,7 @@
     <w:basedOn w:val="BodyText"/>
     <w:pPr/>
     <w:rPr>
-      <w:rFonts w:cs="FreeSans"/>
+      <w:rFonts w:cs="Noto Sans Devanagari"/>
     </w:rPr>
   </w:style>
   <w:style w:type="paragraph" w:styleId="BodyText">
@@ -16784,7 +17034,7 @@
       <w:ind w:left="160" w:right="160"/>
     </w:pPr>
     <w:rPr>
-      <w:rFonts w:ascii="Liberation Mono" w:hAnsi="Liberation Mono" w:eastAsia="Liberation Mono" w:cs="Liberation Mono"/>
+      <w:rFonts w:ascii="Liberation Mono" w:hAnsi="Liberation Mono" w:eastAsia="Noto Sans Mono CJK SC" w:cs="Liberation Mono"/>
       <w:sz w:val="20"/>
       <w:szCs w:val="20"/>
     </w:rPr>
@@ -16825,37 +17075,37 @@
         <a:srgbClr val="000000"/>
       </a:dk1>
       <a:lt1>
-        <a:srgbClr val="ffffff"/>
+        <a:srgbClr val="FFFFFF"/>
       </a:lt1>
       <a:dk2>
         <a:srgbClr val="000000"/>
       </a:dk2>
       <a:lt2>
-        <a:srgbClr val="ffffff"/>
+        <a:srgbClr val="FFFFFF"/>
       </a:lt2>
       <a:accent1>
-        <a:srgbClr val="18a303"/>
+        <a:srgbClr val="18A303"/>
       </a:accent1>
       <a:accent2>
-        <a:srgbClr val="0369a3"/>
+        <a:srgbClr val="0369A3"/>
       </a:accent2>
       <a:accent3>
-        <a:srgbClr val="a33e03"/>
+        <a:srgbClr val="A33E03"/>
       </a:accent3>
       <a:accent4>
-        <a:srgbClr val="8e03a3"/>
+        <a:srgbClr val="8E03A3"/>
       </a:accent4>
       <a:accent5>
-        <a:srgbClr val="c99c00"/>
+        <a:srgbClr val="C99C00"/>
       </a:accent5>
       <a:accent6>
-        <a:srgbClr val="c9211e"/>
+        <a:srgbClr val="C9211E"/>
       </a:accent6>
       <a:hlink>
-        <a:srgbClr val="0000ee"/>
+        <a:srgbClr val="0000EE"/>
       </a:hlink>
       <a:folHlink>
-        <a:srgbClr val="551a8b"/>
+        <a:srgbClr val="551A8B"/>
       </a:folHlink>
     </a:clrScheme>
     <a:fontScheme name="Office">

</xml_diff>

<commit_message>
T-0100 docs after the merge of main a61a6f38: troubleshooting guide rebuilt from the merged source (DOCX, PDF; HTML unchanged; LibreOffice 26.2.5.2, not Word)
</commit_message>
<xml_diff>
--- a/docs/guides/crew/crew-1.0-troubleshooting.docx
+++ b/docs/guides/crew/crew-1.0-troubleshooting.docx
@@ -1,6 +1,6 @@
 
 <file path=word/document.xml><?xml version="1.0" encoding="utf-8"?>
-<w:document xmlns:o="urn:schemas-microsoft-com:office:office" xmlns:r="http://schemas.openxmlformats.org/officeDocument/2006/relationships" xmlns:v="urn:schemas-microsoft-com:vml" xmlns:w="http://schemas.openxmlformats.org/wordprocessingml/2006/main" xmlns:w10="urn:schemas-microsoft-com:office:word" xmlns:wp="http://schemas.openxmlformats.org/drawingml/2006/wordprocessingDrawing" xmlns:wps="http://schemas.microsoft.com/office/word/2010/wordprocessingShape" xmlns:wpg="http://schemas.microsoft.com/office/word/2010/wordprocessingGroup" xmlns:mc="http://schemas.openxmlformats.org/markup-compatibility/2006" xmlns:wp14="http://schemas.microsoft.com/office/word/2010/wordprocessingDrawing" xmlns:w14="http://schemas.microsoft.com/office/word/2010/wordml" xmlns:w15="http://schemas.microsoft.com/office/word/2012/wordml" mc:Ignorable="w14 wp14 w15">
+<w:document xmlns:o="urn:schemas-microsoft-com:office:office" xmlns:r="http://schemas.openxmlformats.org/officeDocument/2006/relationships" xmlns:v="urn:schemas-microsoft-com:vml" xmlns:w="http://schemas.openxmlformats.org/wordprocessingml/2006/main" xmlns:w10="urn:schemas-microsoft-com:office:word" xmlns:wp="http://schemas.openxmlformats.org/drawingml/2006/wordprocessingDrawing" xmlns:pic="http://schemas.openxmlformats.org/drawingml/2006/picture" xmlns:wps="http://schemas.microsoft.com/office/word/2010/wordprocessingShape" xmlns:wpg="http://schemas.microsoft.com/office/word/2010/wordprocessingGroup" xmlns:mc="http://schemas.openxmlformats.org/markup-compatibility/2006" xmlns:wp14="http://schemas.microsoft.com/office/word/2010/wordprocessingDrawing" xmlns:w14="http://schemas.microsoft.com/office/word/2010/wordml" xmlns:w15="http://schemas.microsoft.com/office/word/2012/wordml" mc:Ignorable="w14 wp14 w15">
   <w:body>
     <w:p>
       <w:pPr>
@@ -545,9 +545,9 @@
     </w:p>
     <w:tbl>
       <w:tblPr>
-        <w:tblW w:w="11810" w:type="dxa"/>
+        <w:tblW w:w="11731" w:type="dxa"/>
         <w:jc w:val="left"/>
-        <w:tblInd w:w="0" w:type="dxa"/>
+        <w:tblInd w:w="28" w:type="dxa"/>
         <w:tblLayout w:type="fixed"/>
         <w:tblCellMar>
           <w:top w:w="28" w:type="dxa"/>
@@ -557,11 +557,11 @@
         </w:tblCellMar>
       </w:tblPr>
       <w:tblGrid>
-        <w:gridCol w:w="2116"/>
-        <w:gridCol w:w="2446"/>
-        <w:gridCol w:w="2131"/>
+        <w:gridCol w:w="2119"/>
+        <w:gridCol w:w="2456"/>
+        <w:gridCol w:w="2022"/>
         <w:gridCol w:w="2986"/>
-        <w:gridCol w:w="2131"/>
+        <w:gridCol w:w="2148"/>
       </w:tblGrid>
       <w:tr>
         <w:trPr>
@@ -569,7 +569,7 @@
         </w:trPr>
         <w:tc>
           <w:tcPr>
-            <w:tcW w:w="2116" w:type="dxa"/>
+            <w:tcW w:w="2119" w:type="dxa"/>
             <w:tcBorders/>
             <w:vAlign w:val="center"/>
           </w:tcPr>
@@ -591,7 +591,7 @@
         </w:tc>
         <w:tc>
           <w:tcPr>
-            <w:tcW w:w="2446" w:type="dxa"/>
+            <w:tcW w:w="2456" w:type="dxa"/>
             <w:tcBorders/>
             <w:vAlign w:val="center"/>
           </w:tcPr>
@@ -613,7 +613,7 @@
         </w:tc>
         <w:tc>
           <w:tcPr>
-            <w:tcW w:w="2131" w:type="dxa"/>
+            <w:tcW w:w="2022" w:type="dxa"/>
             <w:tcBorders/>
             <w:vAlign w:val="center"/>
           </w:tcPr>
@@ -657,7 +657,7 @@
         </w:tc>
         <w:tc>
           <w:tcPr>
-            <w:tcW w:w="2131" w:type="dxa"/>
+            <w:tcW w:w="2148" w:type="dxa"/>
             <w:tcBorders/>
             <w:vAlign w:val="center"/>
           </w:tcPr>
@@ -682,7 +682,7 @@
         <w:trPr/>
         <w:tc>
           <w:tcPr>
-            <w:tcW w:w="2116" w:type="dxa"/>
+            <w:tcW w:w="2119" w:type="dxa"/>
             <w:tcBorders/>
             <w:vAlign w:val="center"/>
           </w:tcPr>
@@ -705,7 +705,7 @@
         </w:tc>
         <w:tc>
           <w:tcPr>
-            <w:tcW w:w="2446" w:type="dxa"/>
+            <w:tcW w:w="2456" w:type="dxa"/>
             <w:tcBorders/>
             <w:vAlign w:val="center"/>
           </w:tcPr>
@@ -728,7 +728,7 @@
         </w:tc>
         <w:tc>
           <w:tcPr>
-            <w:tcW w:w="2131" w:type="dxa"/>
+            <w:tcW w:w="2022" w:type="dxa"/>
             <w:tcBorders/>
             <w:vAlign w:val="center"/>
           </w:tcPr>
@@ -794,7 +794,7 @@
         </w:tc>
         <w:tc>
           <w:tcPr>
-            <w:tcW w:w="2131" w:type="dxa"/>
+            <w:tcW w:w="2148" w:type="dxa"/>
             <w:tcBorders/>
             <w:vAlign w:val="center"/>
           </w:tcPr>
@@ -818,7 +818,7 @@
         <w:trPr/>
         <w:tc>
           <w:tcPr>
-            <w:tcW w:w="2116" w:type="dxa"/>
+            <w:tcW w:w="2119" w:type="dxa"/>
             <w:tcBorders/>
             <w:vAlign w:val="center"/>
           </w:tcPr>
@@ -841,7 +841,7 @@
         </w:tc>
         <w:tc>
           <w:tcPr>
-            <w:tcW w:w="2446" w:type="dxa"/>
+            <w:tcW w:w="2456" w:type="dxa"/>
             <w:tcBorders/>
             <w:vAlign w:val="center"/>
           </w:tcPr>
@@ -864,7 +864,7 @@
         </w:tc>
         <w:tc>
           <w:tcPr>
-            <w:tcW w:w="2131" w:type="dxa"/>
+            <w:tcW w:w="2022" w:type="dxa"/>
             <w:tcBorders/>
             <w:vAlign w:val="center"/>
           </w:tcPr>
@@ -916,7 +916,7 @@
         </w:tc>
         <w:tc>
           <w:tcPr>
-            <w:tcW w:w="2131" w:type="dxa"/>
+            <w:tcW w:w="2148" w:type="dxa"/>
             <w:tcBorders/>
             <w:vAlign w:val="center"/>
           </w:tcPr>
@@ -940,7 +940,7 @@
         <w:trPr/>
         <w:tc>
           <w:tcPr>
-            <w:tcW w:w="2116" w:type="dxa"/>
+            <w:tcW w:w="2119" w:type="dxa"/>
             <w:tcBorders/>
             <w:vAlign w:val="center"/>
           </w:tcPr>
@@ -993,7 +993,7 @@
         </w:tc>
         <w:tc>
           <w:tcPr>
-            <w:tcW w:w="2446" w:type="dxa"/>
+            <w:tcW w:w="2456" w:type="dxa"/>
             <w:tcBorders/>
             <w:vAlign w:val="center"/>
           </w:tcPr>
@@ -1016,7 +1016,7 @@
         </w:tc>
         <w:tc>
           <w:tcPr>
-            <w:tcW w:w="2131" w:type="dxa"/>
+            <w:tcW w:w="2022" w:type="dxa"/>
             <w:tcBorders/>
             <w:vAlign w:val="center"/>
           </w:tcPr>
@@ -1074,7 +1074,7 @@
         </w:tc>
         <w:tc>
           <w:tcPr>
-            <w:tcW w:w="2131" w:type="dxa"/>
+            <w:tcW w:w="2148" w:type="dxa"/>
             <w:tcBorders/>
             <w:vAlign w:val="center"/>
           </w:tcPr>
@@ -1110,7 +1110,7 @@
         <w:trPr/>
         <w:tc>
           <w:tcPr>
-            <w:tcW w:w="2116" w:type="dxa"/>
+            <w:tcW w:w="2119" w:type="dxa"/>
             <w:tcBorders/>
             <w:vAlign w:val="center"/>
           </w:tcPr>
@@ -1133,7 +1133,7 @@
         </w:tc>
         <w:tc>
           <w:tcPr>
-            <w:tcW w:w="2446" w:type="dxa"/>
+            <w:tcW w:w="2456" w:type="dxa"/>
             <w:tcBorders/>
             <w:vAlign w:val="center"/>
           </w:tcPr>
@@ -1156,7 +1156,7 @@
         </w:tc>
         <w:tc>
           <w:tcPr>
-            <w:tcW w:w="2131" w:type="dxa"/>
+            <w:tcW w:w="2022" w:type="dxa"/>
             <w:tcBorders/>
             <w:vAlign w:val="center"/>
           </w:tcPr>
@@ -1214,7 +1214,7 @@
         </w:tc>
         <w:tc>
           <w:tcPr>
-            <w:tcW w:w="2131" w:type="dxa"/>
+            <w:tcW w:w="2148" w:type="dxa"/>
             <w:tcBorders/>
             <w:vAlign w:val="center"/>
           </w:tcPr>
@@ -1238,7 +1238,7 @@
         <w:trPr/>
         <w:tc>
           <w:tcPr>
-            <w:tcW w:w="2116" w:type="dxa"/>
+            <w:tcW w:w="2119" w:type="dxa"/>
             <w:tcBorders/>
             <w:vAlign w:val="center"/>
           </w:tcPr>
@@ -1285,7 +1285,7 @@
         </w:tc>
         <w:tc>
           <w:tcPr>
-            <w:tcW w:w="2446" w:type="dxa"/>
+            <w:tcW w:w="2456" w:type="dxa"/>
             <w:tcBorders/>
             <w:vAlign w:val="center"/>
           </w:tcPr>
@@ -1308,7 +1308,7 @@
         </w:tc>
         <w:tc>
           <w:tcPr>
-            <w:tcW w:w="2131" w:type="dxa"/>
+            <w:tcW w:w="2022" w:type="dxa"/>
             <w:tcBorders/>
             <w:vAlign w:val="center"/>
           </w:tcPr>
@@ -1428,7 +1428,7 @@
         </w:tc>
         <w:tc>
           <w:tcPr>
-            <w:tcW w:w="2131" w:type="dxa"/>
+            <w:tcW w:w="2148" w:type="dxa"/>
             <w:tcBorders/>
             <w:vAlign w:val="center"/>
           </w:tcPr>
@@ -1468,7 +1468,7 @@
         <w:trPr/>
         <w:tc>
           <w:tcPr>
-            <w:tcW w:w="2116" w:type="dxa"/>
+            <w:tcW w:w="2119" w:type="dxa"/>
             <w:tcBorders/>
             <w:vAlign w:val="center"/>
           </w:tcPr>
@@ -1515,7 +1515,7 @@
         </w:tc>
         <w:tc>
           <w:tcPr>
-            <w:tcW w:w="2446" w:type="dxa"/>
+            <w:tcW w:w="2456" w:type="dxa"/>
             <w:tcBorders/>
             <w:vAlign w:val="center"/>
           </w:tcPr>
@@ -1538,7 +1538,7 @@
         </w:tc>
         <w:tc>
           <w:tcPr>
-            <w:tcW w:w="2131" w:type="dxa"/>
+            <w:tcW w:w="2022" w:type="dxa"/>
             <w:tcBorders/>
             <w:vAlign w:val="center"/>
           </w:tcPr>
@@ -1616,7 +1616,7 @@
         </w:tc>
         <w:tc>
           <w:tcPr>
-            <w:tcW w:w="2131" w:type="dxa"/>
+            <w:tcW w:w="2148" w:type="dxa"/>
             <w:tcBorders/>
             <w:vAlign w:val="center"/>
           </w:tcPr>
@@ -1642,7 +1642,7 @@
         <w:trPr/>
         <w:tc>
           <w:tcPr>
-            <w:tcW w:w="2116" w:type="dxa"/>
+            <w:tcW w:w="2119" w:type="dxa"/>
             <w:tcBorders/>
             <w:vAlign w:val="center"/>
           </w:tcPr>
@@ -1689,7 +1689,7 @@
         </w:tc>
         <w:tc>
           <w:tcPr>
-            <w:tcW w:w="2446" w:type="dxa"/>
+            <w:tcW w:w="2456" w:type="dxa"/>
             <w:tcBorders/>
             <w:vAlign w:val="center"/>
           </w:tcPr>
@@ -1712,7 +1712,7 @@
         </w:tc>
         <w:tc>
           <w:tcPr>
-            <w:tcW w:w="2131" w:type="dxa"/>
+            <w:tcW w:w="2022" w:type="dxa"/>
             <w:tcBorders/>
             <w:vAlign w:val="center"/>
           </w:tcPr>
@@ -1810,7 +1810,7 @@
         </w:tc>
         <w:tc>
           <w:tcPr>
-            <w:tcW w:w="2131" w:type="dxa"/>
+            <w:tcW w:w="2148" w:type="dxa"/>
             <w:tcBorders/>
             <w:vAlign w:val="center"/>
           </w:tcPr>
@@ -1836,7 +1836,7 @@
         <w:trPr/>
         <w:tc>
           <w:tcPr>
-            <w:tcW w:w="2116" w:type="dxa"/>
+            <w:tcW w:w="2119" w:type="dxa"/>
             <w:tcBorders/>
             <w:vAlign w:val="center"/>
           </w:tcPr>
@@ -1923,7 +1923,7 @@
         </w:tc>
         <w:tc>
           <w:tcPr>
-            <w:tcW w:w="2446" w:type="dxa"/>
+            <w:tcW w:w="2456" w:type="dxa"/>
             <w:tcBorders/>
             <w:vAlign w:val="center"/>
           </w:tcPr>
@@ -1946,7 +1946,7 @@
         </w:tc>
         <w:tc>
           <w:tcPr>
-            <w:tcW w:w="2131" w:type="dxa"/>
+            <w:tcW w:w="2022" w:type="dxa"/>
             <w:tcBorders/>
             <w:vAlign w:val="center"/>
           </w:tcPr>
@@ -2040,7 +2040,7 @@
         </w:tc>
         <w:tc>
           <w:tcPr>
-            <w:tcW w:w="2131" w:type="dxa"/>
+            <w:tcW w:w="2148" w:type="dxa"/>
             <w:tcBorders/>
             <w:vAlign w:val="center"/>
           </w:tcPr>
@@ -2076,7 +2076,7 @@
         <w:trPr/>
         <w:tc>
           <w:tcPr>
-            <w:tcW w:w="2116" w:type="dxa"/>
+            <w:tcW w:w="2119" w:type="dxa"/>
             <w:tcBorders/>
             <w:vAlign w:val="center"/>
           </w:tcPr>
@@ -2099,7 +2099,7 @@
         </w:tc>
         <w:tc>
           <w:tcPr>
-            <w:tcW w:w="2446" w:type="dxa"/>
+            <w:tcW w:w="2456" w:type="dxa"/>
             <w:tcBorders/>
             <w:vAlign w:val="center"/>
           </w:tcPr>
@@ -2122,7 +2122,7 @@
         </w:tc>
         <w:tc>
           <w:tcPr>
-            <w:tcW w:w="2131" w:type="dxa"/>
+            <w:tcW w:w="2022" w:type="dxa"/>
             <w:tcBorders/>
             <w:vAlign w:val="center"/>
           </w:tcPr>
@@ -2176,7 +2176,7 @@
         </w:tc>
         <w:tc>
           <w:tcPr>
-            <w:tcW w:w="2131" w:type="dxa"/>
+            <w:tcW w:w="2148" w:type="dxa"/>
             <w:tcBorders/>
             <w:vAlign w:val="center"/>
           </w:tcPr>
@@ -2200,7 +2200,7 @@
         <w:trPr/>
         <w:tc>
           <w:tcPr>
-            <w:tcW w:w="2116" w:type="dxa"/>
+            <w:tcW w:w="2119" w:type="dxa"/>
             <w:tcBorders/>
             <w:vAlign w:val="center"/>
           </w:tcPr>
@@ -2223,7 +2223,7 @@
         </w:tc>
         <w:tc>
           <w:tcPr>
-            <w:tcW w:w="2446" w:type="dxa"/>
+            <w:tcW w:w="2456" w:type="dxa"/>
             <w:tcBorders/>
             <w:vAlign w:val="center"/>
           </w:tcPr>
@@ -2246,7 +2246,7 @@
         </w:tc>
         <w:tc>
           <w:tcPr>
-            <w:tcW w:w="2131" w:type="dxa"/>
+            <w:tcW w:w="2022" w:type="dxa"/>
             <w:tcBorders/>
             <w:vAlign w:val="center"/>
           </w:tcPr>
@@ -2310,7 +2310,7 @@
         </w:tc>
         <w:tc>
           <w:tcPr>
-            <w:tcW w:w="2131" w:type="dxa"/>
+            <w:tcW w:w="2148" w:type="dxa"/>
             <w:tcBorders/>
             <w:vAlign w:val="center"/>
           </w:tcPr>
@@ -2336,7 +2336,7 @@
         <w:trPr/>
         <w:tc>
           <w:tcPr>
-            <w:tcW w:w="2116" w:type="dxa"/>
+            <w:tcW w:w="2119" w:type="dxa"/>
             <w:tcBorders/>
             <w:vAlign w:val="center"/>
           </w:tcPr>
@@ -2359,7 +2359,7 @@
         </w:tc>
         <w:tc>
           <w:tcPr>
-            <w:tcW w:w="2446" w:type="dxa"/>
+            <w:tcW w:w="2456" w:type="dxa"/>
             <w:tcBorders/>
             <w:vAlign w:val="center"/>
           </w:tcPr>
@@ -2382,7 +2382,7 @@
         </w:tc>
         <w:tc>
           <w:tcPr>
-            <w:tcW w:w="2131" w:type="dxa"/>
+            <w:tcW w:w="2022" w:type="dxa"/>
             <w:tcBorders/>
             <w:vAlign w:val="center"/>
           </w:tcPr>
@@ -2440,7 +2440,7 @@
         </w:tc>
         <w:tc>
           <w:tcPr>
-            <w:tcW w:w="2131" w:type="dxa"/>
+            <w:tcW w:w="2148" w:type="dxa"/>
             <w:tcBorders/>
             <w:vAlign w:val="center"/>
           </w:tcPr>
@@ -2466,7 +2466,7 @@
         <w:trPr/>
         <w:tc>
           <w:tcPr>
-            <w:tcW w:w="2116" w:type="dxa"/>
+            <w:tcW w:w="2119" w:type="dxa"/>
             <w:tcBorders/>
             <w:vAlign w:val="center"/>
           </w:tcPr>
@@ -2489,7 +2489,7 @@
         </w:tc>
         <w:tc>
           <w:tcPr>
-            <w:tcW w:w="2446" w:type="dxa"/>
+            <w:tcW w:w="2456" w:type="dxa"/>
             <w:tcBorders/>
             <w:vAlign w:val="center"/>
           </w:tcPr>
@@ -2512,7 +2512,7 @@
         </w:tc>
         <w:tc>
           <w:tcPr>
-            <w:tcW w:w="2131" w:type="dxa"/>
+            <w:tcW w:w="2022" w:type="dxa"/>
             <w:tcBorders/>
             <w:vAlign w:val="center"/>
           </w:tcPr>
@@ -2596,7 +2596,7 @@
         </w:tc>
         <w:tc>
           <w:tcPr>
-            <w:tcW w:w="2131" w:type="dxa"/>
+            <w:tcW w:w="2148" w:type="dxa"/>
             <w:tcBorders/>
             <w:vAlign w:val="center"/>
           </w:tcPr>
@@ -2626,7 +2626,7 @@
         <w:trPr/>
         <w:tc>
           <w:tcPr>
-            <w:tcW w:w="2116" w:type="dxa"/>
+            <w:tcW w:w="2119" w:type="dxa"/>
             <w:tcBorders/>
             <w:vAlign w:val="center"/>
           </w:tcPr>
@@ -2649,7 +2649,7 @@
         </w:tc>
         <w:tc>
           <w:tcPr>
-            <w:tcW w:w="2446" w:type="dxa"/>
+            <w:tcW w:w="2456" w:type="dxa"/>
             <w:tcBorders/>
             <w:vAlign w:val="center"/>
           </w:tcPr>
@@ -2672,7 +2672,7 @@
         </w:tc>
         <w:tc>
           <w:tcPr>
-            <w:tcW w:w="2131" w:type="dxa"/>
+            <w:tcW w:w="2022" w:type="dxa"/>
             <w:tcBorders/>
             <w:vAlign w:val="center"/>
           </w:tcPr>
@@ -2716,7 +2716,7 @@
         </w:tc>
         <w:tc>
           <w:tcPr>
-            <w:tcW w:w="2131" w:type="dxa"/>
+            <w:tcW w:w="2148" w:type="dxa"/>
             <w:tcBorders/>
             <w:vAlign w:val="center"/>
           </w:tcPr>
@@ -4430,7 +4430,137 @@
       </w:r>
       <w:r>
         <w:rPr/>
-        <w:t xml:space="preserve"> — the commit the ticket started from) across committed, staged, unstaged and untracked changes, so a shell-made write is caught here even though nothing blocked it at the time. </w:t>
+        <w:t xml:space="preserve"> — the commit the ticket started from) across committed, staged, unstaged and untracked changes, so a shell-made write is caught here even though nothing blocked it at the time. A file byte-identical to main as last merged is not counted; a </w:t>
+      </w:r>
+      <w:r>
+        <w:rPr>
+          <w:rStyle w:val="SourceText"/>
+        </w:rPr>
+        <w:t>merged main: could not tell</w:t>
+      </w:r>
+      <w:r>
+        <w:rPr/>
+        <w:t xml:space="preserve"> line (a detached HEAD, none of </w:t>
+      </w:r>
+      <w:r>
+        <w:rPr>
+          <w:rStyle w:val="SourceText"/>
+        </w:rPr>
+        <w:t>origin/HEAD</w:t>
+      </w:r>
+      <w:r>
+        <w:rPr/>
+        <w:t xml:space="preserve">, </w:t>
+      </w:r>
+      <w:r>
+        <w:rPr>
+          <w:rStyle w:val="SourceText"/>
+        </w:rPr>
+        <w:t>origin/main</w:t>
+      </w:r>
+      <w:r>
+        <w:rPr/>
+        <w:t xml:space="preserve"> and </w:t>
+      </w:r>
+      <w:r>
+        <w:rPr>
+          <w:rStyle w:val="SourceText"/>
+        </w:rPr>
+        <w:t>main</w:t>
+      </w:r>
+      <w:r>
+        <w:rPr/>
+        <w:t xml:space="preserve"> naming a commit, or a git error) means every merged-in file was counted, so check out the ticket branch and rerun. A missing </w:t>
+      </w:r>
+      <w:r>
+        <w:rPr>
+          <w:rStyle w:val="SourceText"/>
+        </w:rPr>
+        <w:t>origin/main</w:t>
+      </w:r>
+      <w:r>
+        <w:rPr/>
+        <w:t xml:space="preserve"> alone is not that: a local </w:t>
+      </w:r>
+      <w:r>
+        <w:rPr>
+          <w:rStyle w:val="SourceText"/>
+        </w:rPr>
+        <w:t>main</w:t>
+      </w:r>
+      <w:r>
+        <w:rPr/>
+        <w:t xml:space="preserve"> is used instead. An untracked merged-in file (after </w:t>
+      </w:r>
+      <w:r>
+        <w:rPr>
+          <w:rStyle w:val="SourceText"/>
+        </w:rPr>
+        <w:t>git rm --cached</w:t>
+      </w:r>
+      <w:r>
+        <w:rPr/>
+        <w:t xml:space="preserve">) is main's only when </w:t>
+      </w:r>
+      <w:r>
+        <w:rPr>
+          <w:rStyle w:val="SourceText"/>
+        </w:rPr>
+        <w:t>git add</w:t>
+      </w:r>
+      <w:r>
+        <w:rPr/>
+        <w:t xml:space="preserve"> would record it identically: with </w:t>
+      </w:r>
+      <w:r>
+        <w:rPr>
+          <w:rStyle w:val="SourceText"/>
+        </w:rPr>
+        <w:t>core.fileMode=false</w:t>
+      </w:r>
+      <w:r>
+        <w:rPr/>
+        <w:t xml:space="preserve"> its execute bit is ignored, as git ignores it. On the review side, </w:t>
+      </w:r>
+      <w:r>
+        <w:rPr>
+          <w:rStyle w:val="SourceText"/>
+        </w:rPr>
+        <w:t>diffed-from-merged=could-not-tell</w:t>
+      </w:r>
+      <w:r>
+        <w:rPr/>
+        <w:t xml:space="preserve"> (or </w:t>
+      </w:r>
+      <w:r>
+        <w:rPr>
+          <w:rStyle w:val="SourceText"/>
+        </w:rPr>
+        <w:t>fork: could not tell</w:t>
+      </w:r>
+      <w:r>
+        <w:rPr/>
+        <w:t xml:space="preserve"> from </w:t>
+      </w:r>
+      <w:r>
+        <w:rPr>
+          <w:rStyle w:val="SourceText"/>
+        </w:rPr>
+        <w:t>--check-receipt</w:t>
+      </w:r>
+      <w:r>
+        <w:rPr/>
+        <w:t xml:space="preserve">) means </w:t>
+      </w:r>
+      <w:r>
+        <w:rPr>
+          <w:rStyle w:val="SourceText"/>
+        </w:rPr>
+        <w:t>git merge-base &lt;start&gt; &lt;merged&gt;</w:t>
+      </w:r>
+      <w:r>
+        <w:rPr/>
+        <w:t xml:space="preserve"> gave no answer, so a file main also changed shows main's lines as the ticket's: fetch, check the start commit still exists, and rebuild. </w:t>
       </w:r>
       <w:r>
         <w:rPr>
@@ -6921,9 +7051,9 @@
     </w:p>
     <w:tbl>
       <w:tblPr>
-        <w:tblW w:w="11810" w:type="dxa"/>
+        <w:tblW w:w="11339" w:type="dxa"/>
         <w:jc w:val="left"/>
-        <w:tblInd w:w="0" w:type="dxa"/>
+        <w:tblInd w:w="28" w:type="dxa"/>
         <w:tblLayout w:type="fixed"/>
         <w:tblCellMar>
           <w:top w:w="28" w:type="dxa"/>
@@ -6933,10 +7063,10 @@
         </w:tblCellMar>
       </w:tblPr>
       <w:tblGrid>
-        <w:gridCol w:w="4730"/>
-        <w:gridCol w:w="1699"/>
-        <w:gridCol w:w="1841"/>
-        <w:gridCol w:w="3540"/>
+        <w:gridCol w:w="4621"/>
+        <w:gridCol w:w="1551"/>
+        <w:gridCol w:w="1790"/>
+        <w:gridCol w:w="3377"/>
       </w:tblGrid>
       <w:tr>
         <w:trPr>
@@ -6944,7 +7074,7 @@
         </w:trPr>
         <w:tc>
           <w:tcPr>
-            <w:tcW w:w="4730" w:type="dxa"/>
+            <w:tcW w:w="4621" w:type="dxa"/>
             <w:tcBorders/>
             <w:vAlign w:val="center"/>
           </w:tcPr>
@@ -6966,7 +7096,7 @@
         </w:tc>
         <w:tc>
           <w:tcPr>
-            <w:tcW w:w="1699" w:type="dxa"/>
+            <w:tcW w:w="1551" w:type="dxa"/>
             <w:tcBorders/>
             <w:vAlign w:val="center"/>
           </w:tcPr>
@@ -6988,7 +7118,7 @@
         </w:tc>
         <w:tc>
           <w:tcPr>
-            <w:tcW w:w="1841" w:type="dxa"/>
+            <w:tcW w:w="1790" w:type="dxa"/>
             <w:tcBorders/>
             <w:vAlign w:val="center"/>
           </w:tcPr>
@@ -7010,7 +7140,7 @@
         </w:tc>
         <w:tc>
           <w:tcPr>
-            <w:tcW w:w="3540" w:type="dxa"/>
+            <w:tcW w:w="3377" w:type="dxa"/>
             <w:tcBorders/>
             <w:vAlign w:val="center"/>
           </w:tcPr>
@@ -7035,7 +7165,7 @@
         <w:trPr/>
         <w:tc>
           <w:tcPr>
-            <w:tcW w:w="4730" w:type="dxa"/>
+            <w:tcW w:w="4621" w:type="dxa"/>
             <w:tcBorders/>
             <w:vAlign w:val="center"/>
           </w:tcPr>
@@ -7058,7 +7188,7 @@
         </w:tc>
         <w:tc>
           <w:tcPr>
-            <w:tcW w:w="1699" w:type="dxa"/>
+            <w:tcW w:w="1551" w:type="dxa"/>
             <w:tcBorders/>
             <w:vAlign w:val="center"/>
           </w:tcPr>
@@ -7079,7 +7209,7 @@
         </w:tc>
         <w:tc>
           <w:tcPr>
-            <w:tcW w:w="1841" w:type="dxa"/>
+            <w:tcW w:w="1790" w:type="dxa"/>
             <w:tcBorders/>
             <w:vAlign w:val="center"/>
           </w:tcPr>
@@ -7100,7 +7230,7 @@
         </w:tc>
         <w:tc>
           <w:tcPr>
-            <w:tcW w:w="3540" w:type="dxa"/>
+            <w:tcW w:w="3377" w:type="dxa"/>
             <w:tcBorders/>
             <w:vAlign w:val="center"/>
           </w:tcPr>
@@ -7140,7 +7270,7 @@
         <w:trPr/>
         <w:tc>
           <w:tcPr>
-            <w:tcW w:w="4730" w:type="dxa"/>
+            <w:tcW w:w="4621" w:type="dxa"/>
             <w:tcBorders/>
             <w:vAlign w:val="center"/>
           </w:tcPr>
@@ -7163,7 +7293,7 @@
         </w:tc>
         <w:tc>
           <w:tcPr>
-            <w:tcW w:w="1699" w:type="dxa"/>
+            <w:tcW w:w="1551" w:type="dxa"/>
             <w:tcBorders/>
             <w:vAlign w:val="center"/>
           </w:tcPr>
@@ -7184,7 +7314,7 @@
         </w:tc>
         <w:tc>
           <w:tcPr>
-            <w:tcW w:w="1841" w:type="dxa"/>
+            <w:tcW w:w="1790" w:type="dxa"/>
             <w:tcBorders/>
             <w:vAlign w:val="center"/>
           </w:tcPr>
@@ -7227,7 +7357,7 @@
         </w:tc>
         <w:tc>
           <w:tcPr>
-            <w:tcW w:w="3540" w:type="dxa"/>
+            <w:tcW w:w="3377" w:type="dxa"/>
             <w:tcBorders/>
             <w:vAlign w:val="center"/>
           </w:tcPr>
@@ -7257,7 +7387,7 @@
         <w:trPr/>
         <w:tc>
           <w:tcPr>
-            <w:tcW w:w="4730" w:type="dxa"/>
+            <w:tcW w:w="4621" w:type="dxa"/>
             <w:tcBorders/>
             <w:vAlign w:val="center"/>
           </w:tcPr>
@@ -7280,7 +7410,7 @@
         </w:tc>
         <w:tc>
           <w:tcPr>
-            <w:tcW w:w="1699" w:type="dxa"/>
+            <w:tcW w:w="1551" w:type="dxa"/>
             <w:tcBorders/>
             <w:vAlign w:val="center"/>
           </w:tcPr>
@@ -7301,7 +7431,7 @@
         </w:tc>
         <w:tc>
           <w:tcPr>
-            <w:tcW w:w="1841" w:type="dxa"/>
+            <w:tcW w:w="1790" w:type="dxa"/>
             <w:tcBorders/>
             <w:vAlign w:val="center"/>
           </w:tcPr>
@@ -7344,7 +7474,7 @@
         </w:tc>
         <w:tc>
           <w:tcPr>
-            <w:tcW w:w="3540" w:type="dxa"/>
+            <w:tcW w:w="3377" w:type="dxa"/>
             <w:tcBorders/>
             <w:vAlign w:val="center"/>
           </w:tcPr>
@@ -7374,7 +7504,7 @@
         <w:trPr/>
         <w:tc>
           <w:tcPr>
-            <w:tcW w:w="4730" w:type="dxa"/>
+            <w:tcW w:w="4621" w:type="dxa"/>
             <w:tcBorders/>
             <w:vAlign w:val="center"/>
           </w:tcPr>
@@ -7447,7 +7577,7 @@
         </w:tc>
         <w:tc>
           <w:tcPr>
-            <w:tcW w:w="1699" w:type="dxa"/>
+            <w:tcW w:w="1551" w:type="dxa"/>
             <w:tcBorders/>
             <w:vAlign w:val="center"/>
           </w:tcPr>
@@ -7468,7 +7598,7 @@
         </w:tc>
         <w:tc>
           <w:tcPr>
-            <w:tcW w:w="1841" w:type="dxa"/>
+            <w:tcW w:w="1790" w:type="dxa"/>
             <w:tcBorders/>
             <w:vAlign w:val="center"/>
           </w:tcPr>
@@ -7511,7 +7641,7 @@
         </w:tc>
         <w:tc>
           <w:tcPr>
-            <w:tcW w:w="3540" w:type="dxa"/>
+            <w:tcW w:w="3377" w:type="dxa"/>
             <w:tcBorders/>
             <w:vAlign w:val="center"/>
           </w:tcPr>
@@ -7545,7 +7675,7 @@
         <w:trPr/>
         <w:tc>
           <w:tcPr>
-            <w:tcW w:w="4730" w:type="dxa"/>
+            <w:tcW w:w="4621" w:type="dxa"/>
             <w:tcBorders/>
             <w:vAlign w:val="center"/>
           </w:tcPr>
@@ -7578,7 +7708,7 @@
         </w:tc>
         <w:tc>
           <w:tcPr>
-            <w:tcW w:w="1699" w:type="dxa"/>
+            <w:tcW w:w="1551" w:type="dxa"/>
             <w:tcBorders/>
             <w:vAlign w:val="center"/>
           </w:tcPr>
@@ -7599,7 +7729,7 @@
         </w:tc>
         <w:tc>
           <w:tcPr>
-            <w:tcW w:w="1841" w:type="dxa"/>
+            <w:tcW w:w="1790" w:type="dxa"/>
             <w:tcBorders/>
             <w:vAlign w:val="center"/>
           </w:tcPr>
@@ -7642,7 +7772,7 @@
         </w:tc>
         <w:tc>
           <w:tcPr>
-            <w:tcW w:w="3540" w:type="dxa"/>
+            <w:tcW w:w="3377" w:type="dxa"/>
             <w:tcBorders/>
             <w:vAlign w:val="center"/>
           </w:tcPr>
@@ -7672,7 +7802,7 @@
         <w:trPr/>
         <w:tc>
           <w:tcPr>
-            <w:tcW w:w="4730" w:type="dxa"/>
+            <w:tcW w:w="4621" w:type="dxa"/>
             <w:tcBorders/>
             <w:vAlign w:val="center"/>
           </w:tcPr>
@@ -7695,7 +7825,7 @@
         </w:tc>
         <w:tc>
           <w:tcPr>
-            <w:tcW w:w="1699" w:type="dxa"/>
+            <w:tcW w:w="1551" w:type="dxa"/>
             <w:tcBorders/>
             <w:vAlign w:val="center"/>
           </w:tcPr>
@@ -7716,7 +7846,7 @@
         </w:tc>
         <w:tc>
           <w:tcPr>
-            <w:tcW w:w="1841" w:type="dxa"/>
+            <w:tcW w:w="1790" w:type="dxa"/>
             <w:tcBorders/>
             <w:vAlign w:val="center"/>
           </w:tcPr>
@@ -7769,7 +7899,7 @@
         </w:tc>
         <w:tc>
           <w:tcPr>
-            <w:tcW w:w="3540" w:type="dxa"/>
+            <w:tcW w:w="3377" w:type="dxa"/>
             <w:tcBorders/>
             <w:vAlign w:val="center"/>
           </w:tcPr>
@@ -7799,7 +7929,7 @@
         <w:trPr/>
         <w:tc>
           <w:tcPr>
-            <w:tcW w:w="4730" w:type="dxa"/>
+            <w:tcW w:w="4621" w:type="dxa"/>
             <w:tcBorders/>
             <w:vAlign w:val="center"/>
           </w:tcPr>
@@ -7822,7 +7952,7 @@
         </w:tc>
         <w:tc>
           <w:tcPr>
-            <w:tcW w:w="1699" w:type="dxa"/>
+            <w:tcW w:w="1551" w:type="dxa"/>
             <w:tcBorders/>
             <w:vAlign w:val="center"/>
           </w:tcPr>
@@ -7843,7 +7973,7 @@
         </w:tc>
         <w:tc>
           <w:tcPr>
-            <w:tcW w:w="1841" w:type="dxa"/>
+            <w:tcW w:w="1790" w:type="dxa"/>
             <w:tcBorders/>
             <w:vAlign w:val="center"/>
           </w:tcPr>
@@ -7864,7 +7994,7 @@
         </w:tc>
         <w:tc>
           <w:tcPr>
-            <w:tcW w:w="3540" w:type="dxa"/>
+            <w:tcW w:w="3377" w:type="dxa"/>
             <w:tcBorders/>
             <w:vAlign w:val="center"/>
           </w:tcPr>
@@ -7924,7 +8054,7 @@
         <w:trPr/>
         <w:tc>
           <w:tcPr>
-            <w:tcW w:w="4730" w:type="dxa"/>
+            <w:tcW w:w="4621" w:type="dxa"/>
             <w:tcBorders/>
             <w:vAlign w:val="center"/>
           </w:tcPr>
@@ -7947,7 +8077,7 @@
         </w:tc>
         <w:tc>
           <w:tcPr>
-            <w:tcW w:w="1699" w:type="dxa"/>
+            <w:tcW w:w="1551" w:type="dxa"/>
             <w:tcBorders/>
             <w:vAlign w:val="center"/>
           </w:tcPr>
@@ -7968,7 +8098,7 @@
         </w:tc>
         <w:tc>
           <w:tcPr>
-            <w:tcW w:w="1841" w:type="dxa"/>
+            <w:tcW w:w="1790" w:type="dxa"/>
             <w:tcBorders/>
             <w:vAlign w:val="center"/>
           </w:tcPr>
@@ -7989,7 +8119,7 @@
         </w:tc>
         <w:tc>
           <w:tcPr>
-            <w:tcW w:w="3540" w:type="dxa"/>
+            <w:tcW w:w="3377" w:type="dxa"/>
             <w:tcBorders/>
             <w:vAlign w:val="center"/>
           </w:tcPr>
@@ -8019,7 +8149,7 @@
         <w:trPr/>
         <w:tc>
           <w:tcPr>
-            <w:tcW w:w="4730" w:type="dxa"/>
+            <w:tcW w:w="4621" w:type="dxa"/>
             <w:tcBorders/>
             <w:vAlign w:val="center"/>
           </w:tcPr>
@@ -8042,7 +8172,7 @@
         </w:tc>
         <w:tc>
           <w:tcPr>
-            <w:tcW w:w="1699" w:type="dxa"/>
+            <w:tcW w:w="1551" w:type="dxa"/>
             <w:tcBorders/>
             <w:vAlign w:val="center"/>
           </w:tcPr>
@@ -8063,7 +8193,7 @@
         </w:tc>
         <w:tc>
           <w:tcPr>
-            <w:tcW w:w="1841" w:type="dxa"/>
+            <w:tcW w:w="1790" w:type="dxa"/>
             <w:tcBorders/>
             <w:vAlign w:val="center"/>
           </w:tcPr>
@@ -8084,7 +8214,7 @@
         </w:tc>
         <w:tc>
           <w:tcPr>
-            <w:tcW w:w="3540" w:type="dxa"/>
+            <w:tcW w:w="3377" w:type="dxa"/>
             <w:tcBorders/>
             <w:vAlign w:val="center"/>
           </w:tcPr>
@@ -8124,7 +8254,7 @@
         <w:trPr/>
         <w:tc>
           <w:tcPr>
-            <w:tcW w:w="4730" w:type="dxa"/>
+            <w:tcW w:w="4621" w:type="dxa"/>
             <w:tcBorders/>
             <w:vAlign w:val="center"/>
           </w:tcPr>
@@ -8157,7 +8287,7 @@
         </w:tc>
         <w:tc>
           <w:tcPr>
-            <w:tcW w:w="1699" w:type="dxa"/>
+            <w:tcW w:w="1551" w:type="dxa"/>
             <w:tcBorders/>
             <w:vAlign w:val="center"/>
           </w:tcPr>
@@ -8178,7 +8308,7 @@
         </w:tc>
         <w:tc>
           <w:tcPr>
-            <w:tcW w:w="1841" w:type="dxa"/>
+            <w:tcW w:w="1790" w:type="dxa"/>
             <w:tcBorders/>
             <w:vAlign w:val="center"/>
           </w:tcPr>
@@ -8199,7 +8329,7 @@
         </w:tc>
         <w:tc>
           <w:tcPr>
-            <w:tcW w:w="3540" w:type="dxa"/>
+            <w:tcW w:w="3377" w:type="dxa"/>
             <w:tcBorders/>
             <w:vAlign w:val="center"/>
           </w:tcPr>
@@ -8223,7 +8353,7 @@
         <w:trPr/>
         <w:tc>
           <w:tcPr>
-            <w:tcW w:w="4730" w:type="dxa"/>
+            <w:tcW w:w="4621" w:type="dxa"/>
             <w:tcBorders/>
             <w:vAlign w:val="center"/>
           </w:tcPr>
@@ -8246,7 +8376,7 @@
         </w:tc>
         <w:tc>
           <w:tcPr>
-            <w:tcW w:w="1699" w:type="dxa"/>
+            <w:tcW w:w="1551" w:type="dxa"/>
             <w:tcBorders/>
             <w:vAlign w:val="center"/>
           </w:tcPr>
@@ -8267,7 +8397,7 @@
         </w:tc>
         <w:tc>
           <w:tcPr>
-            <w:tcW w:w="1841" w:type="dxa"/>
+            <w:tcW w:w="1790" w:type="dxa"/>
             <w:tcBorders/>
             <w:vAlign w:val="center"/>
           </w:tcPr>
@@ -8294,7 +8424,7 @@
         </w:tc>
         <w:tc>
           <w:tcPr>
-            <w:tcW w:w="3540" w:type="dxa"/>
+            <w:tcW w:w="3377" w:type="dxa"/>
             <w:tcBorders/>
             <w:vAlign w:val="center"/>
           </w:tcPr>
@@ -8334,7 +8464,7 @@
         <w:trPr/>
         <w:tc>
           <w:tcPr>
-            <w:tcW w:w="4730" w:type="dxa"/>
+            <w:tcW w:w="4621" w:type="dxa"/>
             <w:tcBorders/>
             <w:vAlign w:val="center"/>
           </w:tcPr>
@@ -8357,7 +8487,7 @@
         </w:tc>
         <w:tc>
           <w:tcPr>
-            <w:tcW w:w="1699" w:type="dxa"/>
+            <w:tcW w:w="1551" w:type="dxa"/>
             <w:tcBorders/>
             <w:vAlign w:val="center"/>
           </w:tcPr>
@@ -8378,7 +8508,7 @@
         </w:tc>
         <w:tc>
           <w:tcPr>
-            <w:tcW w:w="1841" w:type="dxa"/>
+            <w:tcW w:w="1790" w:type="dxa"/>
             <w:tcBorders/>
             <w:vAlign w:val="center"/>
           </w:tcPr>
@@ -8399,7 +8529,7 @@
         </w:tc>
         <w:tc>
           <w:tcPr>
-            <w:tcW w:w="3540" w:type="dxa"/>
+            <w:tcW w:w="3377" w:type="dxa"/>
             <w:tcBorders/>
             <w:vAlign w:val="center"/>
           </w:tcPr>
@@ -8429,7 +8559,7 @@
         <w:trPr/>
         <w:tc>
           <w:tcPr>
-            <w:tcW w:w="4730" w:type="dxa"/>
+            <w:tcW w:w="4621" w:type="dxa"/>
             <w:tcBorders/>
             <w:vAlign w:val="center"/>
           </w:tcPr>
@@ -8452,7 +8582,7 @@
         </w:tc>
         <w:tc>
           <w:tcPr>
-            <w:tcW w:w="1699" w:type="dxa"/>
+            <w:tcW w:w="1551" w:type="dxa"/>
             <w:tcBorders/>
             <w:vAlign w:val="center"/>
           </w:tcPr>
@@ -8473,7 +8603,7 @@
         </w:tc>
         <w:tc>
           <w:tcPr>
-            <w:tcW w:w="1841" w:type="dxa"/>
+            <w:tcW w:w="1790" w:type="dxa"/>
             <w:tcBorders/>
             <w:vAlign w:val="center"/>
           </w:tcPr>
@@ -8504,7 +8634,7 @@
         </w:tc>
         <w:tc>
           <w:tcPr>
-            <w:tcW w:w="3540" w:type="dxa"/>
+            <w:tcW w:w="3377" w:type="dxa"/>
             <w:tcBorders/>
             <w:vAlign w:val="center"/>
           </w:tcPr>
@@ -9739,9 +9869,9 @@
     </w:p>
     <w:tbl>
       <w:tblPr>
-        <w:tblW w:w="11810" w:type="dxa"/>
+        <w:tblW w:w="11339" w:type="dxa"/>
         <w:jc w:val="left"/>
-        <w:tblInd w:w="0" w:type="dxa"/>
+        <w:tblInd w:w="28" w:type="dxa"/>
         <w:tblLayout w:type="fixed"/>
         <w:tblCellMar>
           <w:top w:w="28" w:type="dxa"/>
@@ -9751,10 +9881,10 @@
         </w:tblCellMar>
       </w:tblPr>
       <w:tblGrid>
-        <w:gridCol w:w="2554"/>
-        <w:gridCol w:w="4096"/>
-        <w:gridCol w:w="1859"/>
-        <w:gridCol w:w="3301"/>
+        <w:gridCol w:w="2285"/>
+        <w:gridCol w:w="4100"/>
+        <w:gridCol w:w="1802"/>
+        <w:gridCol w:w="3152"/>
       </w:tblGrid>
       <w:tr>
         <w:trPr>
@@ -9762,7 +9892,7 @@
         </w:trPr>
         <w:tc>
           <w:tcPr>
-            <w:tcW w:w="2554" w:type="dxa"/>
+            <w:tcW w:w="2285" w:type="dxa"/>
             <w:tcBorders/>
             <w:vAlign w:val="center"/>
           </w:tcPr>
@@ -9784,7 +9914,7 @@
         </w:tc>
         <w:tc>
           <w:tcPr>
-            <w:tcW w:w="4096" w:type="dxa"/>
+            <w:tcW w:w="4100" w:type="dxa"/>
             <w:tcBorders/>
             <w:vAlign w:val="center"/>
           </w:tcPr>
@@ -9806,7 +9936,7 @@
         </w:tc>
         <w:tc>
           <w:tcPr>
-            <w:tcW w:w="1859" w:type="dxa"/>
+            <w:tcW w:w="1802" w:type="dxa"/>
             <w:tcBorders/>
             <w:vAlign w:val="center"/>
           </w:tcPr>
@@ -9828,7 +9958,7 @@
         </w:tc>
         <w:tc>
           <w:tcPr>
-            <w:tcW w:w="3301" w:type="dxa"/>
+            <w:tcW w:w="3152" w:type="dxa"/>
             <w:tcBorders/>
             <w:vAlign w:val="center"/>
           </w:tcPr>
@@ -9853,7 +9983,7 @@
         <w:trPr/>
         <w:tc>
           <w:tcPr>
-            <w:tcW w:w="2554" w:type="dxa"/>
+            <w:tcW w:w="2285" w:type="dxa"/>
             <w:tcBorders/>
             <w:vAlign w:val="center"/>
           </w:tcPr>
@@ -9890,7 +10020,7 @@
         </w:tc>
         <w:tc>
           <w:tcPr>
-            <w:tcW w:w="4096" w:type="dxa"/>
+            <w:tcW w:w="4100" w:type="dxa"/>
             <w:tcBorders/>
             <w:vAlign w:val="center"/>
           </w:tcPr>
@@ -9913,7 +10043,7 @@
         </w:tc>
         <w:tc>
           <w:tcPr>
-            <w:tcW w:w="1859" w:type="dxa"/>
+            <w:tcW w:w="1802" w:type="dxa"/>
             <w:tcBorders/>
             <w:vAlign w:val="center"/>
           </w:tcPr>
@@ -9936,7 +10066,7 @@
         </w:tc>
         <w:tc>
           <w:tcPr>
-            <w:tcW w:w="3301" w:type="dxa"/>
+            <w:tcW w:w="3152" w:type="dxa"/>
             <w:tcBorders/>
             <w:vAlign w:val="center"/>
           </w:tcPr>
@@ -9960,7 +10090,7 @@
         <w:trPr/>
         <w:tc>
           <w:tcPr>
-            <w:tcW w:w="2554" w:type="dxa"/>
+            <w:tcW w:w="2285" w:type="dxa"/>
             <w:tcBorders/>
             <w:vAlign w:val="center"/>
           </w:tcPr>
@@ -9981,7 +10111,7 @@
         </w:tc>
         <w:tc>
           <w:tcPr>
-            <w:tcW w:w="4096" w:type="dxa"/>
+            <w:tcW w:w="4100" w:type="dxa"/>
             <w:tcBorders/>
             <w:vAlign w:val="center"/>
           </w:tcPr>
@@ -10004,7 +10134,7 @@
         </w:tc>
         <w:tc>
           <w:tcPr>
-            <w:tcW w:w="1859" w:type="dxa"/>
+            <w:tcW w:w="1802" w:type="dxa"/>
             <w:tcBorders/>
             <w:vAlign w:val="center"/>
           </w:tcPr>
@@ -10077,7 +10207,7 @@
         </w:tc>
         <w:tc>
           <w:tcPr>
-            <w:tcW w:w="3301" w:type="dxa"/>
+            <w:tcW w:w="3152" w:type="dxa"/>
             <w:tcBorders/>
             <w:vAlign w:val="center"/>
           </w:tcPr>
@@ -10101,7 +10231,7 @@
         <w:trPr/>
         <w:tc>
           <w:tcPr>
-            <w:tcW w:w="2554" w:type="dxa"/>
+            <w:tcW w:w="2285" w:type="dxa"/>
             <w:tcBorders/>
             <w:vAlign w:val="center"/>
           </w:tcPr>
@@ -10122,7 +10252,7 @@
         </w:tc>
         <w:tc>
           <w:tcPr>
-            <w:tcW w:w="4096" w:type="dxa"/>
+            <w:tcW w:w="4100" w:type="dxa"/>
             <w:tcBorders/>
             <w:vAlign w:val="center"/>
           </w:tcPr>
@@ -10145,7 +10275,7 @@
         </w:tc>
         <w:tc>
           <w:tcPr>
-            <w:tcW w:w="1859" w:type="dxa"/>
+            <w:tcW w:w="1802" w:type="dxa"/>
             <w:tcBorders/>
             <w:vAlign w:val="center"/>
           </w:tcPr>
@@ -10166,7 +10296,7 @@
         </w:tc>
         <w:tc>
           <w:tcPr>
-            <w:tcW w:w="3301" w:type="dxa"/>
+            <w:tcW w:w="3152" w:type="dxa"/>
             <w:tcBorders/>
             <w:vAlign w:val="center"/>
           </w:tcPr>
@@ -10190,7 +10320,7 @@
         <w:trPr/>
         <w:tc>
           <w:tcPr>
-            <w:tcW w:w="2554" w:type="dxa"/>
+            <w:tcW w:w="2285" w:type="dxa"/>
             <w:tcBorders/>
             <w:vAlign w:val="center"/>
           </w:tcPr>
@@ -10211,7 +10341,7 @@
         </w:tc>
         <w:tc>
           <w:tcPr>
-            <w:tcW w:w="4096" w:type="dxa"/>
+            <w:tcW w:w="4100" w:type="dxa"/>
             <w:tcBorders/>
             <w:vAlign w:val="center"/>
           </w:tcPr>
@@ -10234,7 +10364,7 @@
         </w:tc>
         <w:tc>
           <w:tcPr>
-            <w:tcW w:w="1859" w:type="dxa"/>
+            <w:tcW w:w="1802" w:type="dxa"/>
             <w:tcBorders/>
             <w:vAlign w:val="center"/>
           </w:tcPr>
@@ -10257,7 +10387,7 @@
         </w:tc>
         <w:tc>
           <w:tcPr>
-            <w:tcW w:w="3301" w:type="dxa"/>
+            <w:tcW w:w="3152" w:type="dxa"/>
             <w:tcBorders/>
             <w:vAlign w:val="center"/>
           </w:tcPr>
@@ -10281,7 +10411,7 @@
         <w:trPr/>
         <w:tc>
           <w:tcPr>
-            <w:tcW w:w="2554" w:type="dxa"/>
+            <w:tcW w:w="2285" w:type="dxa"/>
             <w:tcBorders/>
             <w:vAlign w:val="center"/>
           </w:tcPr>
@@ -10302,7 +10432,7 @@
         </w:tc>
         <w:tc>
           <w:tcPr>
-            <w:tcW w:w="4096" w:type="dxa"/>
+            <w:tcW w:w="4100" w:type="dxa"/>
             <w:tcBorders/>
             <w:vAlign w:val="center"/>
           </w:tcPr>
@@ -10325,7 +10455,7 @@
         </w:tc>
         <w:tc>
           <w:tcPr>
-            <w:tcW w:w="1859" w:type="dxa"/>
+            <w:tcW w:w="1802" w:type="dxa"/>
             <w:tcBorders/>
             <w:vAlign w:val="center"/>
           </w:tcPr>
@@ -10348,7 +10478,7 @@
         </w:tc>
         <w:tc>
           <w:tcPr>
-            <w:tcW w:w="3301" w:type="dxa"/>
+            <w:tcW w:w="3152" w:type="dxa"/>
             <w:tcBorders/>
             <w:vAlign w:val="center"/>
           </w:tcPr>
@@ -10372,7 +10502,7 @@
         <w:trPr/>
         <w:tc>
           <w:tcPr>
-            <w:tcW w:w="2554" w:type="dxa"/>
+            <w:tcW w:w="2285" w:type="dxa"/>
             <w:tcBorders/>
             <w:vAlign w:val="center"/>
           </w:tcPr>
@@ -10399,7 +10529,7 @@
         </w:tc>
         <w:tc>
           <w:tcPr>
-            <w:tcW w:w="4096" w:type="dxa"/>
+            <w:tcW w:w="4100" w:type="dxa"/>
             <w:tcBorders/>
             <w:vAlign w:val="center"/>
           </w:tcPr>
@@ -10422,7 +10552,7 @@
         </w:tc>
         <w:tc>
           <w:tcPr>
-            <w:tcW w:w="1859" w:type="dxa"/>
+            <w:tcW w:w="1802" w:type="dxa"/>
             <w:tcBorders/>
             <w:vAlign w:val="center"/>
           </w:tcPr>
@@ -10445,7 +10575,7 @@
         </w:tc>
         <w:tc>
           <w:tcPr>
-            <w:tcW w:w="3301" w:type="dxa"/>
+            <w:tcW w:w="3152" w:type="dxa"/>
             <w:tcBorders/>
             <w:vAlign w:val="center"/>
           </w:tcPr>
@@ -10479,7 +10609,7 @@
         <w:trPr/>
         <w:tc>
           <w:tcPr>
-            <w:tcW w:w="2554" w:type="dxa"/>
+            <w:tcW w:w="2285" w:type="dxa"/>
             <w:tcBorders/>
             <w:vAlign w:val="center"/>
           </w:tcPr>
@@ -10502,7 +10632,7 @@
         </w:tc>
         <w:tc>
           <w:tcPr>
-            <w:tcW w:w="4096" w:type="dxa"/>
+            <w:tcW w:w="4100" w:type="dxa"/>
             <w:tcBorders/>
             <w:vAlign w:val="center"/>
           </w:tcPr>
@@ -10525,7 +10655,7 @@
         </w:tc>
         <w:tc>
           <w:tcPr>
-            <w:tcW w:w="1859" w:type="dxa"/>
+            <w:tcW w:w="1802" w:type="dxa"/>
             <w:tcBorders/>
             <w:vAlign w:val="center"/>
           </w:tcPr>
@@ -10548,7 +10678,7 @@
         </w:tc>
         <w:tc>
           <w:tcPr>
-            <w:tcW w:w="3301" w:type="dxa"/>
+            <w:tcW w:w="3152" w:type="dxa"/>
             <w:tcBorders/>
             <w:vAlign w:val="center"/>
           </w:tcPr>
@@ -10602,7 +10732,7 @@
         <w:trPr/>
         <w:tc>
           <w:tcPr>
-            <w:tcW w:w="2554" w:type="dxa"/>
+            <w:tcW w:w="2285" w:type="dxa"/>
             <w:tcBorders/>
             <w:vAlign w:val="center"/>
           </w:tcPr>
@@ -10639,7 +10769,7 @@
         </w:tc>
         <w:tc>
           <w:tcPr>
-            <w:tcW w:w="4096" w:type="dxa"/>
+            <w:tcW w:w="4100" w:type="dxa"/>
             <w:tcBorders/>
             <w:vAlign w:val="center"/>
           </w:tcPr>
@@ -10662,7 +10792,7 @@
         </w:tc>
         <w:tc>
           <w:tcPr>
-            <w:tcW w:w="1859" w:type="dxa"/>
+            <w:tcW w:w="1802" w:type="dxa"/>
             <w:tcBorders/>
             <w:vAlign w:val="center"/>
           </w:tcPr>
@@ -10685,7 +10815,7 @@
         </w:tc>
         <w:tc>
           <w:tcPr>
-            <w:tcW w:w="3301" w:type="dxa"/>
+            <w:tcW w:w="3152" w:type="dxa"/>
             <w:tcBorders/>
             <w:vAlign w:val="center"/>
           </w:tcPr>
@@ -10719,7 +10849,7 @@
         <w:trPr/>
         <w:tc>
           <w:tcPr>
-            <w:tcW w:w="2554" w:type="dxa"/>
+            <w:tcW w:w="2285" w:type="dxa"/>
             <w:tcBorders/>
             <w:vAlign w:val="center"/>
           </w:tcPr>
@@ -10742,7 +10872,7 @@
         </w:tc>
         <w:tc>
           <w:tcPr>
-            <w:tcW w:w="4096" w:type="dxa"/>
+            <w:tcW w:w="4100" w:type="dxa"/>
             <w:tcBorders/>
             <w:vAlign w:val="center"/>
           </w:tcPr>
@@ -10765,7 +10895,7 @@
         </w:tc>
         <w:tc>
           <w:tcPr>
-            <w:tcW w:w="1859" w:type="dxa"/>
+            <w:tcW w:w="1802" w:type="dxa"/>
             <w:tcBorders/>
             <w:vAlign w:val="center"/>
           </w:tcPr>
@@ -10788,7 +10918,7 @@
         </w:tc>
         <w:tc>
           <w:tcPr>
-            <w:tcW w:w="3301" w:type="dxa"/>
+            <w:tcW w:w="3152" w:type="dxa"/>
             <w:tcBorders/>
             <w:vAlign w:val="center"/>
           </w:tcPr>
@@ -10812,7 +10942,7 @@
         <w:trPr/>
         <w:tc>
           <w:tcPr>
-            <w:tcW w:w="2554" w:type="dxa"/>
+            <w:tcW w:w="2285" w:type="dxa"/>
             <w:tcBorders/>
             <w:vAlign w:val="center"/>
           </w:tcPr>
@@ -10835,7 +10965,7 @@
         </w:tc>
         <w:tc>
           <w:tcPr>
-            <w:tcW w:w="4096" w:type="dxa"/>
+            <w:tcW w:w="4100" w:type="dxa"/>
             <w:tcBorders/>
             <w:vAlign w:val="center"/>
           </w:tcPr>
@@ -10858,7 +10988,7 @@
         </w:tc>
         <w:tc>
           <w:tcPr>
-            <w:tcW w:w="1859" w:type="dxa"/>
+            <w:tcW w:w="1802" w:type="dxa"/>
             <w:tcBorders/>
             <w:vAlign w:val="center"/>
           </w:tcPr>
@@ -10881,7 +11011,7 @@
         </w:tc>
         <w:tc>
           <w:tcPr>
-            <w:tcW w:w="3301" w:type="dxa"/>
+            <w:tcW w:w="3152" w:type="dxa"/>
             <w:tcBorders/>
             <w:vAlign w:val="center"/>
           </w:tcPr>
@@ -10905,7 +11035,7 @@
         <w:trPr/>
         <w:tc>
           <w:tcPr>
-            <w:tcW w:w="2554" w:type="dxa"/>
+            <w:tcW w:w="2285" w:type="dxa"/>
             <w:tcBorders/>
             <w:vAlign w:val="center"/>
           </w:tcPr>
@@ -10928,7 +11058,7 @@
         </w:tc>
         <w:tc>
           <w:tcPr>
-            <w:tcW w:w="4096" w:type="dxa"/>
+            <w:tcW w:w="4100" w:type="dxa"/>
             <w:tcBorders/>
             <w:vAlign w:val="center"/>
           </w:tcPr>
@@ -10951,7 +11081,7 @@
         </w:tc>
         <w:tc>
           <w:tcPr>
-            <w:tcW w:w="1859" w:type="dxa"/>
+            <w:tcW w:w="1802" w:type="dxa"/>
             <w:tcBorders/>
             <w:vAlign w:val="center"/>
           </w:tcPr>
@@ -10974,7 +11104,7 @@
         </w:tc>
         <w:tc>
           <w:tcPr>
-            <w:tcW w:w="3301" w:type="dxa"/>
+            <w:tcW w:w="3152" w:type="dxa"/>
             <w:tcBorders/>
             <w:vAlign w:val="center"/>
           </w:tcPr>
@@ -11194,9 +11324,9 @@
     </w:p>
     <w:tbl>
       <w:tblPr>
-        <w:tblW w:w="11253" w:type="dxa"/>
+        <w:tblW w:w="10959" w:type="dxa"/>
         <w:jc w:val="left"/>
-        <w:tblInd w:w="0" w:type="dxa"/>
+        <w:tblInd w:w="28" w:type="dxa"/>
         <w:tblLayout w:type="fixed"/>
         <w:tblCellMar>
           <w:top w:w="28" w:type="dxa"/>
@@ -11206,9 +11336,9 @@
         </w:tblCellMar>
       </w:tblPr>
       <w:tblGrid>
-        <w:gridCol w:w="3751"/>
-        <w:gridCol w:w="3091"/>
-        <w:gridCol w:w="4411"/>
+        <w:gridCol w:w="3762"/>
+        <w:gridCol w:w="2975"/>
+        <w:gridCol w:w="4222"/>
       </w:tblGrid>
       <w:tr>
         <w:trPr>
@@ -11216,7 +11346,7 @@
         </w:trPr>
         <w:tc>
           <w:tcPr>
-            <w:tcW w:w="3751" w:type="dxa"/>
+            <w:tcW w:w="3762" w:type="dxa"/>
             <w:tcBorders/>
             <w:vAlign w:val="center"/>
           </w:tcPr>
@@ -11238,7 +11368,7 @@
         </w:tc>
         <w:tc>
           <w:tcPr>
-            <w:tcW w:w="3091" w:type="dxa"/>
+            <w:tcW w:w="2975" w:type="dxa"/>
             <w:tcBorders/>
             <w:vAlign w:val="center"/>
           </w:tcPr>
@@ -11260,7 +11390,7 @@
         </w:tc>
         <w:tc>
           <w:tcPr>
-            <w:tcW w:w="4411" w:type="dxa"/>
+            <w:tcW w:w="4222" w:type="dxa"/>
             <w:tcBorders/>
             <w:vAlign w:val="center"/>
           </w:tcPr>
@@ -11285,7 +11415,7 @@
         <w:trPr/>
         <w:tc>
           <w:tcPr>
-            <w:tcW w:w="3751" w:type="dxa"/>
+            <w:tcW w:w="3762" w:type="dxa"/>
             <w:tcBorders/>
             <w:vAlign w:val="center"/>
           </w:tcPr>
@@ -11308,7 +11438,7 @@
         </w:tc>
         <w:tc>
           <w:tcPr>
-            <w:tcW w:w="3091" w:type="dxa"/>
+            <w:tcW w:w="2975" w:type="dxa"/>
             <w:tcBorders/>
             <w:vAlign w:val="center"/>
           </w:tcPr>
@@ -11329,7 +11459,7 @@
         </w:tc>
         <w:tc>
           <w:tcPr>
-            <w:tcW w:w="4411" w:type="dxa"/>
+            <w:tcW w:w="4222" w:type="dxa"/>
             <w:tcBorders/>
             <w:vAlign w:val="center"/>
           </w:tcPr>
@@ -11353,7 +11483,7 @@
         <w:trPr/>
         <w:tc>
           <w:tcPr>
-            <w:tcW w:w="3751" w:type="dxa"/>
+            <w:tcW w:w="3762" w:type="dxa"/>
             <w:tcBorders/>
             <w:vAlign w:val="center"/>
           </w:tcPr>
@@ -11376,7 +11506,7 @@
         </w:tc>
         <w:tc>
           <w:tcPr>
-            <w:tcW w:w="3091" w:type="dxa"/>
+            <w:tcW w:w="2975" w:type="dxa"/>
             <w:tcBorders/>
             <w:vAlign w:val="center"/>
           </w:tcPr>
@@ -11397,7 +11527,7 @@
         </w:tc>
         <w:tc>
           <w:tcPr>
-            <w:tcW w:w="4411" w:type="dxa"/>
+            <w:tcW w:w="4222" w:type="dxa"/>
             <w:tcBorders/>
             <w:vAlign w:val="center"/>
           </w:tcPr>
@@ -11878,9 +12008,9 @@
     </w:p>
     <w:tbl>
       <w:tblPr>
-        <w:tblW w:w="11810" w:type="dxa"/>
+        <w:tblW w:w="11339" w:type="dxa"/>
         <w:jc w:val="left"/>
-        <w:tblInd w:w="0" w:type="dxa"/>
+        <w:tblInd w:w="28" w:type="dxa"/>
         <w:tblLayout w:type="fixed"/>
         <w:tblCellMar>
           <w:top w:w="28" w:type="dxa"/>
@@ -11890,9 +12020,9 @@
         </w:tblCellMar>
       </w:tblPr>
       <w:tblGrid>
-        <w:gridCol w:w="1186"/>
-        <w:gridCol w:w="8225"/>
-        <w:gridCol w:w="2399"/>
+        <w:gridCol w:w="1180"/>
+        <w:gridCol w:w="7903"/>
+        <w:gridCol w:w="2256"/>
       </w:tblGrid>
       <w:tr>
         <w:trPr>
@@ -11900,7 +12030,7 @@
         </w:trPr>
         <w:tc>
           <w:tcPr>
-            <w:tcW w:w="1186" w:type="dxa"/>
+            <w:tcW w:w="1180" w:type="dxa"/>
             <w:tcBorders/>
             <w:vAlign w:val="center"/>
           </w:tcPr>
@@ -11922,7 +12052,7 @@
         </w:tc>
         <w:tc>
           <w:tcPr>
-            <w:tcW w:w="8225" w:type="dxa"/>
+            <w:tcW w:w="7903" w:type="dxa"/>
             <w:tcBorders/>
             <w:vAlign w:val="center"/>
           </w:tcPr>
@@ -11944,7 +12074,7 @@
         </w:tc>
         <w:tc>
           <w:tcPr>
-            <w:tcW w:w="2399" w:type="dxa"/>
+            <w:tcW w:w="2256" w:type="dxa"/>
             <w:tcBorders/>
             <w:vAlign w:val="center"/>
           </w:tcPr>
@@ -11979,7 +12109,7 @@
         <w:trPr/>
         <w:tc>
           <w:tcPr>
-            <w:tcW w:w="1186" w:type="dxa"/>
+            <w:tcW w:w="1180" w:type="dxa"/>
             <w:tcBorders/>
             <w:vAlign w:val="center"/>
           </w:tcPr>
@@ -12002,7 +12132,7 @@
         </w:tc>
         <w:tc>
           <w:tcPr>
-            <w:tcW w:w="8225" w:type="dxa"/>
+            <w:tcW w:w="7903" w:type="dxa"/>
             <w:tcBorders/>
             <w:vAlign w:val="center"/>
           </w:tcPr>
@@ -12033,7 +12163,7 @@
         </w:tc>
         <w:tc>
           <w:tcPr>
-            <w:tcW w:w="2399" w:type="dxa"/>
+            <w:tcW w:w="2256" w:type="dxa"/>
             <w:tcBorders/>
             <w:vAlign w:val="center"/>
           </w:tcPr>
@@ -12077,7 +12207,7 @@
         <w:trPr/>
         <w:tc>
           <w:tcPr>
-            <w:tcW w:w="1186" w:type="dxa"/>
+            <w:tcW w:w="1180" w:type="dxa"/>
             <w:tcBorders/>
             <w:vAlign w:val="center"/>
           </w:tcPr>
@@ -12100,7 +12230,7 @@
         </w:tc>
         <w:tc>
           <w:tcPr>
-            <w:tcW w:w="8225" w:type="dxa"/>
+            <w:tcW w:w="7903" w:type="dxa"/>
             <w:tcBorders/>
             <w:vAlign w:val="center"/>
           </w:tcPr>
@@ -12131,7 +12261,7 @@
         </w:tc>
         <w:tc>
           <w:tcPr>
-            <w:tcW w:w="2399" w:type="dxa"/>
+            <w:tcW w:w="2256" w:type="dxa"/>
             <w:tcBorders/>
             <w:vAlign w:val="center"/>
           </w:tcPr>
@@ -12175,7 +12305,7 @@
         <w:trPr/>
         <w:tc>
           <w:tcPr>
-            <w:tcW w:w="1186" w:type="dxa"/>
+            <w:tcW w:w="1180" w:type="dxa"/>
             <w:tcBorders/>
             <w:vAlign w:val="center"/>
           </w:tcPr>
@@ -12198,7 +12328,7 @@
         </w:tc>
         <w:tc>
           <w:tcPr>
-            <w:tcW w:w="8225" w:type="dxa"/>
+            <w:tcW w:w="7903" w:type="dxa"/>
             <w:tcBorders/>
             <w:vAlign w:val="center"/>
           </w:tcPr>
@@ -12219,7 +12349,7 @@
         </w:tc>
         <w:tc>
           <w:tcPr>
-            <w:tcW w:w="2399" w:type="dxa"/>
+            <w:tcW w:w="2256" w:type="dxa"/>
             <w:tcBorders/>
             <w:vAlign w:val="center"/>
           </w:tcPr>
@@ -12249,7 +12379,7 @@
         <w:trPr/>
         <w:tc>
           <w:tcPr>
-            <w:tcW w:w="1186" w:type="dxa"/>
+            <w:tcW w:w="1180" w:type="dxa"/>
             <w:tcBorders/>
             <w:vAlign w:val="center"/>
           </w:tcPr>
@@ -12272,7 +12402,7 @@
         </w:tc>
         <w:tc>
           <w:tcPr>
-            <w:tcW w:w="8225" w:type="dxa"/>
+            <w:tcW w:w="7903" w:type="dxa"/>
             <w:tcBorders/>
             <w:vAlign w:val="center"/>
           </w:tcPr>
@@ -12355,7 +12485,7 @@
         </w:tc>
         <w:tc>
           <w:tcPr>
-            <w:tcW w:w="2399" w:type="dxa"/>
+            <w:tcW w:w="2256" w:type="dxa"/>
             <w:tcBorders/>
             <w:vAlign w:val="center"/>
           </w:tcPr>
@@ -12379,7 +12509,7 @@
         <w:trPr/>
         <w:tc>
           <w:tcPr>
-            <w:tcW w:w="1186" w:type="dxa"/>
+            <w:tcW w:w="1180" w:type="dxa"/>
             <w:tcBorders/>
             <w:vAlign w:val="center"/>
           </w:tcPr>
@@ -12402,7 +12532,7 @@
         </w:tc>
         <w:tc>
           <w:tcPr>
-            <w:tcW w:w="8225" w:type="dxa"/>
+            <w:tcW w:w="7903" w:type="dxa"/>
             <w:tcBorders/>
             <w:vAlign w:val="center"/>
           </w:tcPr>
@@ -12423,7 +12553,7 @@
         </w:tc>
         <w:tc>
           <w:tcPr>
-            <w:tcW w:w="2399" w:type="dxa"/>
+            <w:tcW w:w="2256" w:type="dxa"/>
             <w:tcBorders/>
             <w:vAlign w:val="center"/>
           </w:tcPr>
@@ -12503,9 +12633,9 @@
     </w:p>
     <w:tbl>
       <w:tblPr>
-        <w:tblW w:w="11810" w:type="dxa"/>
+        <w:tblW w:w="11339" w:type="dxa"/>
         <w:jc w:val="left"/>
-        <w:tblInd w:w="0" w:type="dxa"/>
+        <w:tblInd w:w="28" w:type="dxa"/>
         <w:tblLayout w:type="fixed"/>
         <w:tblCellMar>
           <w:top w:w="28" w:type="dxa"/>
@@ -12515,8 +12645,8 @@
         </w:tblCellMar>
       </w:tblPr>
       <w:tblGrid>
-        <w:gridCol w:w="5490"/>
-        <w:gridCol w:w="6320"/>
+        <w:gridCol w:w="5449"/>
+        <w:gridCol w:w="5890"/>
       </w:tblGrid>
       <w:tr>
         <w:trPr>
@@ -12524,7 +12654,7 @@
         </w:trPr>
         <w:tc>
           <w:tcPr>
-            <w:tcW w:w="5490" w:type="dxa"/>
+            <w:tcW w:w="5449" w:type="dxa"/>
             <w:tcBorders/>
             <w:vAlign w:val="center"/>
           </w:tcPr>
@@ -12546,7 +12676,7 @@
         </w:tc>
         <w:tc>
           <w:tcPr>
-            <w:tcW w:w="6320" w:type="dxa"/>
+            <w:tcW w:w="5890" w:type="dxa"/>
             <w:tcBorders/>
             <w:vAlign w:val="center"/>
           </w:tcPr>
@@ -12571,7 +12701,7 @@
         <w:trPr/>
         <w:tc>
           <w:tcPr>
-            <w:tcW w:w="5490" w:type="dxa"/>
+            <w:tcW w:w="5449" w:type="dxa"/>
             <w:tcBorders/>
             <w:vAlign w:val="center"/>
           </w:tcPr>
@@ -12594,7 +12724,7 @@
         </w:tc>
         <w:tc>
           <w:tcPr>
-            <w:tcW w:w="6320" w:type="dxa"/>
+            <w:tcW w:w="5890" w:type="dxa"/>
             <w:tcBorders/>
             <w:vAlign w:val="center"/>
           </w:tcPr>
@@ -12618,7 +12748,7 @@
         <w:trPr/>
         <w:tc>
           <w:tcPr>
-            <w:tcW w:w="5490" w:type="dxa"/>
+            <w:tcW w:w="5449" w:type="dxa"/>
             <w:tcBorders/>
             <w:vAlign w:val="center"/>
           </w:tcPr>
@@ -12641,7 +12771,7 @@
         </w:tc>
         <w:tc>
           <w:tcPr>
-            <w:tcW w:w="6320" w:type="dxa"/>
+            <w:tcW w:w="5890" w:type="dxa"/>
             <w:tcBorders/>
             <w:vAlign w:val="center"/>
           </w:tcPr>
@@ -12675,7 +12805,7 @@
         <w:trPr/>
         <w:tc>
           <w:tcPr>
-            <w:tcW w:w="5490" w:type="dxa"/>
+            <w:tcW w:w="5449" w:type="dxa"/>
             <w:tcBorders/>
             <w:vAlign w:val="center"/>
           </w:tcPr>
@@ -12698,7 +12828,7 @@
         </w:tc>
         <w:tc>
           <w:tcPr>
-            <w:tcW w:w="6320" w:type="dxa"/>
+            <w:tcW w:w="5890" w:type="dxa"/>
             <w:tcBorders/>
             <w:vAlign w:val="center"/>
           </w:tcPr>
@@ -12722,7 +12852,7 @@
         <w:trPr/>
         <w:tc>
           <w:tcPr>
-            <w:tcW w:w="5490" w:type="dxa"/>
+            <w:tcW w:w="5449" w:type="dxa"/>
             <w:tcBorders/>
             <w:vAlign w:val="center"/>
           </w:tcPr>
@@ -12745,7 +12875,7 @@
         </w:tc>
         <w:tc>
           <w:tcPr>
-            <w:tcW w:w="6320" w:type="dxa"/>
+            <w:tcW w:w="5890" w:type="dxa"/>
             <w:tcBorders/>
             <w:vAlign w:val="center"/>
           </w:tcPr>
@@ -12769,7 +12899,7 @@
         <w:trPr/>
         <w:tc>
           <w:tcPr>
-            <w:tcW w:w="5490" w:type="dxa"/>
+            <w:tcW w:w="5449" w:type="dxa"/>
             <w:tcBorders/>
             <w:vAlign w:val="center"/>
           </w:tcPr>
@@ -12792,7 +12922,7 @@
         </w:tc>
         <w:tc>
           <w:tcPr>
-            <w:tcW w:w="6320" w:type="dxa"/>
+            <w:tcW w:w="5890" w:type="dxa"/>
             <w:tcBorders/>
             <w:vAlign w:val="center"/>
           </w:tcPr>
@@ -12816,7 +12946,7 @@
         <w:trPr/>
         <w:tc>
           <w:tcPr>
-            <w:tcW w:w="5490" w:type="dxa"/>
+            <w:tcW w:w="5449" w:type="dxa"/>
             <w:tcBorders/>
             <w:vAlign w:val="center"/>
           </w:tcPr>
@@ -12839,7 +12969,7 @@
         </w:tc>
         <w:tc>
           <w:tcPr>
-            <w:tcW w:w="6320" w:type="dxa"/>
+            <w:tcW w:w="5890" w:type="dxa"/>
             <w:tcBorders/>
             <w:vAlign w:val="center"/>
           </w:tcPr>
@@ -12863,7 +12993,7 @@
         <w:trPr/>
         <w:tc>
           <w:tcPr>
-            <w:tcW w:w="5490" w:type="dxa"/>
+            <w:tcW w:w="5449" w:type="dxa"/>
             <w:tcBorders/>
             <w:vAlign w:val="center"/>
           </w:tcPr>
@@ -12896,7 +13026,7 @@
         </w:tc>
         <w:tc>
           <w:tcPr>
-            <w:tcW w:w="6320" w:type="dxa"/>
+            <w:tcW w:w="5890" w:type="dxa"/>
             <w:tcBorders/>
             <w:vAlign w:val="center"/>
           </w:tcPr>
@@ -12940,7 +13070,7 @@
         <w:trPr/>
         <w:tc>
           <w:tcPr>
-            <w:tcW w:w="5490" w:type="dxa"/>
+            <w:tcW w:w="5449" w:type="dxa"/>
             <w:tcBorders/>
             <w:vAlign w:val="center"/>
           </w:tcPr>
@@ -12963,7 +13093,7 @@
         </w:tc>
         <w:tc>
           <w:tcPr>
-            <w:tcW w:w="6320" w:type="dxa"/>
+            <w:tcW w:w="5890" w:type="dxa"/>
             <w:tcBorders/>
             <w:vAlign w:val="center"/>
           </w:tcPr>
@@ -13017,7 +13147,7 @@
         <w:trPr/>
         <w:tc>
           <w:tcPr>
-            <w:tcW w:w="5490" w:type="dxa"/>
+            <w:tcW w:w="5449" w:type="dxa"/>
             <w:tcBorders/>
             <w:vAlign w:val="center"/>
           </w:tcPr>
@@ -13040,7 +13170,7 @@
         </w:tc>
         <w:tc>
           <w:tcPr>
-            <w:tcW w:w="6320" w:type="dxa"/>
+            <w:tcW w:w="5890" w:type="dxa"/>
             <w:tcBorders/>
             <w:vAlign w:val="center"/>
           </w:tcPr>
@@ -13070,7 +13200,7 @@
         <w:trPr/>
         <w:tc>
           <w:tcPr>
-            <w:tcW w:w="5490" w:type="dxa"/>
+            <w:tcW w:w="5449" w:type="dxa"/>
             <w:tcBorders/>
             <w:vAlign w:val="center"/>
           </w:tcPr>
@@ -13093,7 +13223,7 @@
         </w:tc>
         <w:tc>
           <w:tcPr>
-            <w:tcW w:w="6320" w:type="dxa"/>
+            <w:tcW w:w="5890" w:type="dxa"/>
             <w:tcBorders/>
             <w:vAlign w:val="center"/>
           </w:tcPr>
@@ -13127,7 +13257,7 @@
         <w:trPr/>
         <w:tc>
           <w:tcPr>
-            <w:tcW w:w="5490" w:type="dxa"/>
+            <w:tcW w:w="5449" w:type="dxa"/>
             <w:tcBorders/>
             <w:vAlign w:val="center"/>
           </w:tcPr>
@@ -13150,7 +13280,7 @@
         </w:tc>
         <w:tc>
           <w:tcPr>
-            <w:tcW w:w="6320" w:type="dxa"/>
+            <w:tcW w:w="5890" w:type="dxa"/>
             <w:tcBorders/>
             <w:vAlign w:val="center"/>
           </w:tcPr>
@@ -13180,7 +13310,7 @@
         <w:trPr/>
         <w:tc>
           <w:tcPr>
-            <w:tcW w:w="5490" w:type="dxa"/>
+            <w:tcW w:w="5449" w:type="dxa"/>
             <w:tcBorders/>
             <w:vAlign w:val="center"/>
           </w:tcPr>
@@ -13203,7 +13333,7 @@
         </w:tc>
         <w:tc>
           <w:tcPr>
-            <w:tcW w:w="6320" w:type="dxa"/>
+            <w:tcW w:w="5890" w:type="dxa"/>
             <w:tcBorders/>
             <w:vAlign w:val="center"/>
           </w:tcPr>
@@ -13247,7 +13377,7 @@
         <w:trPr/>
         <w:tc>
           <w:tcPr>
-            <w:tcW w:w="5490" w:type="dxa"/>
+            <w:tcW w:w="5449" w:type="dxa"/>
             <w:tcBorders/>
             <w:vAlign w:val="center"/>
           </w:tcPr>
@@ -13270,7 +13400,7 @@
         </w:tc>
         <w:tc>
           <w:tcPr>
-            <w:tcW w:w="6320" w:type="dxa"/>
+            <w:tcW w:w="5890" w:type="dxa"/>
             <w:tcBorders/>
             <w:vAlign w:val="center"/>
           </w:tcPr>
@@ -16282,7 +16412,7 @@
       <w:start w:val="1"/>
       <w:numFmt w:val="none"/>
       <w:suff w:val="nothing"/>
-      <w:lvlText w:val="%1"/>
+      <w:lvlText w:val=""/>
       <w:lvlJc w:val="left"/>
       <w:pPr>
         <w:tabs>
@@ -16293,10 +16423,51 @@
     </w:lvl>
     <w:lvl w:ilvl="1">
       <w:start w:val="1"/>
+      <w:numFmt w:val="none"/>
       <w:pStyle w:val="Heading2"/>
+      <w:suff w:val="nothing"/>
+      <w:lvlText w:val=""/>
+      <w:lvlJc w:val="left"/>
+      <w:pPr>
+        <w:tabs>
+          <w:tab w:val="num" w:pos="0"/>
+        </w:tabs>
+        <w:ind w:left="0" w:hanging="0"/>
+      </w:pPr>
+    </w:lvl>
+    <w:lvl w:ilvl="2">
+      <w:start w:val="1"/>
+      <w:numFmt w:val="none"/>
+      <w:pStyle w:val="Heading3"/>
+      <w:suff w:val="nothing"/>
+      <w:lvlText w:val=""/>
+      <w:lvlJc w:val="left"/>
+      <w:pPr>
+        <w:tabs>
+          <w:tab w:val="num" w:pos="0"/>
+        </w:tabs>
+        <w:ind w:left="0" w:hanging="0"/>
+      </w:pPr>
+    </w:lvl>
+    <w:lvl w:ilvl="3">
+      <w:start w:val="1"/>
+      <w:numFmt w:val="none"/>
+      <w:pStyle w:val="Heading4"/>
+      <w:suff w:val="nothing"/>
+      <w:lvlText w:val=""/>
+      <w:lvlJc w:val="left"/>
+      <w:pPr>
+        <w:tabs>
+          <w:tab w:val="num" w:pos="0"/>
+        </w:tabs>
+        <w:ind w:left="0" w:hanging="0"/>
+      </w:pPr>
+    </w:lvl>
+    <w:lvl w:ilvl="4">
+      <w:start w:val="1"/>
       <w:numFmt w:val="none"/>
       <w:suff w:val="nothing"/>
-      <w:lvlText w:val="%2"/>
+      <w:lvlText w:val=""/>
       <w:lvlJc w:val="left"/>
       <w:pPr>
         <w:tabs>
@@ -16305,12 +16476,11 @@
         <w:ind w:left="0" w:hanging="0"/>
       </w:pPr>
     </w:lvl>
-    <w:lvl w:ilvl="2">
-      <w:start w:val="1"/>
-      <w:pStyle w:val="Heading3"/>
+    <w:lvl w:ilvl="5">
+      <w:start w:val="1"/>
       <w:numFmt w:val="none"/>
       <w:suff w:val="nothing"/>
-      <w:lvlText w:val="%3"/>
+      <w:lvlText w:val=""/>
       <w:lvlJc w:val="left"/>
       <w:pPr>
         <w:tabs>
@@ -16319,12 +16489,11 @@
         <w:ind w:left="0" w:hanging="0"/>
       </w:pPr>
     </w:lvl>
-    <w:lvl w:ilvl="3">
-      <w:start w:val="1"/>
-      <w:pStyle w:val="Heading4"/>
+    <w:lvl w:ilvl="6">
+      <w:start w:val="1"/>
       <w:numFmt w:val="none"/>
       <w:suff w:val="nothing"/>
-      <w:lvlText w:val="%4"/>
+      <w:lvlText w:val=""/>
       <w:lvlJc w:val="left"/>
       <w:pPr>
         <w:tabs>
@@ -16333,11 +16502,11 @@
         <w:ind w:left="0" w:hanging="0"/>
       </w:pPr>
     </w:lvl>
-    <w:lvl w:ilvl="4">
+    <w:lvl w:ilvl="7">
       <w:start w:val="1"/>
       <w:numFmt w:val="none"/>
       <w:suff w:val="nothing"/>
-      <w:lvlText w:val="%5"/>
+      <w:lvlText w:val=""/>
       <w:lvlJc w:val="left"/>
       <w:pPr>
         <w:tabs>
@@ -16346,50 +16515,11 @@
         <w:ind w:left="0" w:hanging="0"/>
       </w:pPr>
     </w:lvl>
-    <w:lvl w:ilvl="5">
+    <w:lvl w:ilvl="8">
       <w:start w:val="1"/>
       <w:numFmt w:val="none"/>
       <w:suff w:val="nothing"/>
-      <w:lvlText w:val="%6"/>
-      <w:lvlJc w:val="left"/>
-      <w:pPr>
-        <w:tabs>
-          <w:tab w:val="num" w:pos="0"/>
-        </w:tabs>
-        <w:ind w:left="0" w:hanging="0"/>
-      </w:pPr>
-    </w:lvl>
-    <w:lvl w:ilvl="6">
-      <w:start w:val="1"/>
-      <w:numFmt w:val="none"/>
-      <w:suff w:val="nothing"/>
-      <w:lvlText w:val="%7"/>
-      <w:lvlJc w:val="left"/>
-      <w:pPr>
-        <w:tabs>
-          <w:tab w:val="num" w:pos="0"/>
-        </w:tabs>
-        <w:ind w:left="0" w:hanging="0"/>
-      </w:pPr>
-    </w:lvl>
-    <w:lvl w:ilvl="7">
-      <w:start w:val="1"/>
-      <w:numFmt w:val="none"/>
-      <w:suff w:val="nothing"/>
-      <w:lvlText w:val="%8"/>
-      <w:lvlJc w:val="left"/>
-      <w:pPr>
-        <w:tabs>
-          <w:tab w:val="num" w:pos="0"/>
-        </w:tabs>
-        <w:ind w:left="0" w:hanging="0"/>
-      </w:pPr>
-    </w:lvl>
-    <w:lvl w:ilvl="8">
-      <w:start w:val="1"/>
-      <w:numFmt w:val="none"/>
-      <w:suff w:val="nothing"/>
-      <w:lvlText w:val="%9"/>
+      <w:lvlText w:val=""/>
       <w:lvlJc w:val="left"/>
       <w:pPr>
         <w:tabs>
@@ -16470,7 +16600,7 @@
   <w:docDefaults>
     <w:rPrDefault>
       <w:rPr>
-        <w:rFonts w:ascii="Liberation Serif" w:hAnsi="Liberation Serif" w:eastAsia="WenQuanYi Zen Hei" w:cs="FreeSans"/>
+        <w:rFonts w:ascii="Liberation Serif" w:hAnsi="Liberation Serif" w:eastAsia="Noto Serif CJK SC" w:cs="Noto Sans Devanagari"/>
         <w:sz w:val="24"/>
         <w:szCs w:val="24"/>
         <w:lang w:val="en-US" w:eastAsia="zh-CN" w:bidi="hi-IN"/>
@@ -16500,7 +16630,7 @@
     </w:rPr>
   </w:style>
   <w:style w:type="paragraph" w:styleId="Heading1">
-    <w:name w:val="Heading 1"/>
+    <w:name w:val="heading 1"/>
     <w:basedOn w:val="Heading"/>
     <w:next w:val="BodyText"/>
     <w:qFormat/>
@@ -16508,7 +16638,6 @@
       <w:spacing w:before="240" w:after="80"/>
     </w:pPr>
     <w:rPr>
-      <w:rFonts w:ascii="Noto Sans" w:hAnsi="Noto Sans"/>
       <w:b/>
       <w:bCs/>
       <w:color w:val="88C0D0"/>
@@ -16517,7 +16646,7 @@
     </w:rPr>
   </w:style>
   <w:style w:type="paragraph" w:styleId="Heading2">
-    <w:name w:val="Heading 2"/>
+    <w:name w:val="heading 2"/>
     <w:basedOn w:val="Heading"/>
     <w:next w:val="BodyText"/>
     <w:qFormat/>
@@ -16530,7 +16659,7 @@
       <w:outlineLvl w:val="1"/>
     </w:pPr>
     <w:rPr>
-      <w:rFonts w:ascii="Liberation Serif" w:hAnsi="Liberation Serif" w:eastAsia="WenQuanYi Zen Hei" w:cs="FreeSans"/>
+      <w:rFonts w:ascii="Liberation Serif" w:hAnsi="Liberation Serif" w:eastAsia="Noto Serif CJK SC" w:cs="Noto Sans Devanagari"/>
       <w:b/>
       <w:bCs/>
       <w:color w:val="88C0D0"/>
@@ -16539,7 +16668,7 @@
     </w:rPr>
   </w:style>
   <w:style w:type="paragraph" w:styleId="Heading3">
-    <w:name w:val="Heading 3"/>
+    <w:name w:val="heading 3"/>
     <w:basedOn w:val="Heading"/>
     <w:next w:val="BodyText"/>
     <w:qFormat/>
@@ -16549,7 +16678,7 @@
       <w:outlineLvl w:val="2"/>
     </w:pPr>
     <w:rPr>
-      <w:rFonts w:ascii="Liberation Serif" w:hAnsi="Liberation Serif" w:eastAsia="WenQuanYi Zen Hei" w:cs="FreeSans"/>
+      <w:rFonts w:ascii="Liberation Serif" w:hAnsi="Liberation Serif" w:eastAsia="Noto Serif CJK SC" w:cs="Noto Sans Devanagari"/>
       <w:b/>
       <w:bCs/>
       <w:color w:val="88C0D0"/>
@@ -16558,7 +16687,7 @@
     </w:rPr>
   </w:style>
   <w:style w:type="paragraph" w:styleId="Heading4">
-    <w:name w:val="Heading 4"/>
+    <w:name w:val="heading 4"/>
     <w:basedOn w:val="Heading"/>
     <w:next w:val="BodyText"/>
     <w:qFormat/>
@@ -16567,11 +16696,23 @@
       <w:outlineLvl w:val="3"/>
     </w:pPr>
     <w:rPr>
-      <w:rFonts w:ascii="Liberation Serif" w:hAnsi="Liberation Serif" w:eastAsia="WenQuanYi Zen Hei" w:cs="FreeSans"/>
+      <w:rFonts w:ascii="Liberation Serif" w:hAnsi="Liberation Serif" w:eastAsia="Noto Serif CJK SC" w:cs="Noto Sans Devanagari"/>
       <w:b/>
       <w:bCs/>
       <w:sz w:val="24"/>
       <w:szCs w:val="24"/>
+    </w:rPr>
+  </w:style>
+  <w:style w:type="character" w:styleId="EndnoteReference">
+    <w:name w:val="endnote reference"/>
+    <w:rPr>
+      <w:vertAlign w:val="superscript"/>
+    </w:rPr>
+  </w:style>
+  <w:style w:type="character" w:styleId="FootnoteReference">
+    <w:name w:val="footnote reference"/>
+    <w:rPr>
+      <w:vertAlign w:val="superscript"/>
     </w:rPr>
   </w:style>
   <w:style w:type="character" w:styleId="EndnoteCharacters">
@@ -16651,7 +16792,7 @@
     </w:rPr>
   </w:style>
   <w:style w:type="paragraph" w:styleId="EnvelopeReturn">
-    <w:name w:val="Envelope Return"/>
+    <w:name w:val="envelope return"/>
     <w:basedOn w:val="Normal"/>
     <w:pPr/>
     <w:rPr>
@@ -16670,46 +16811,6 @@
       <w:color w:val="ECEFF4"/>
     </w:rPr>
   </w:style>
-  <w:style w:type="paragraph" w:styleId="Footer">
-    <w:name w:val="Footer"/>
-    <w:basedOn w:val="Normal"/>
-    <w:pPr>
-      <w:suppressLineNumbers/>
-      <w:tabs>
-        <w:tab w:val="clear" w:pos="1134"/>
-        <w:tab w:val="center" w:pos="5952" w:leader="none"/>
-        <w:tab w:val="right" w:pos="10771" w:leader="none"/>
-      </w:tabs>
-    </w:pPr>
-    <w:rPr/>
-  </w:style>
-  <w:style w:type="paragraph" w:styleId="Header">
-    <w:name w:val="Header"/>
-    <w:basedOn w:val="Normal"/>
-    <w:pPr>
-      <w:suppressLineNumbers/>
-      <w:tabs>
-        <w:tab w:val="clear" w:pos="1134"/>
-        <w:tab w:val="center" w:pos="5952" w:leader="none"/>
-        <w:tab w:val="right" w:pos="10771" w:leader="none"/>
-      </w:tabs>
-    </w:pPr>
-    <w:rPr/>
-  </w:style>
-  <w:style w:type="paragraph" w:styleId="HeaderandFooter">
-    <w:name w:val="Header and Footer"/>
-    <w:basedOn w:val="Normal"/>
-    <w:qFormat/>
-    <w:pPr>
-      <w:suppressLineNumbers/>
-      <w:tabs>
-        <w:tab w:val="clear" w:pos="1134"/>
-        <w:tab w:val="center" w:pos="5953" w:leader="none"/>
-        <w:tab w:val="right" w:pos="10772" w:leader="none"/>
-      </w:tabs>
-    </w:pPr>
-    <w:rPr/>
-  </w:style>
   <w:style w:type="paragraph" w:styleId="Index">
     <w:name w:val="Index"/>
     <w:basedOn w:val="Normal"/>
@@ -16718,11 +16819,11 @@
       <w:suppressLineNumbers/>
     </w:pPr>
     <w:rPr>
-      <w:rFonts w:cs="FreeSans"/>
+      <w:rFonts w:cs="Noto Sans Devanagari"/>
     </w:rPr>
   </w:style>
   <w:style w:type="paragraph" w:styleId="Caption">
-    <w:name w:val="Caption"/>
+    <w:name w:val="caption"/>
     <w:basedOn w:val="Normal"/>
     <w:qFormat/>
     <w:pPr>
@@ -16730,7 +16831,7 @@
       <w:spacing w:before="120" w:after="120"/>
     </w:pPr>
     <w:rPr>
-      <w:rFonts w:cs="FreeSans"/>
+      <w:rFonts w:cs="Noto Sans Devanagari"/>
       <w:i/>
       <w:iCs/>
       <w:sz w:val="24"/>
@@ -16742,7 +16843,7 @@
     <w:basedOn w:val="BodyText"/>
     <w:pPr/>
     <w:rPr>
-      <w:rFonts w:cs="FreeSans"/>
+      <w:rFonts w:cs="Noto Sans Devanagari"/>
     </w:rPr>
   </w:style>
   <w:style w:type="paragraph" w:styleId="BodyText">
@@ -16784,7 +16885,7 @@
       <w:ind w:left="160" w:right="160"/>
     </w:pPr>
     <w:rPr>
-      <w:rFonts w:ascii="Liberation Mono" w:hAnsi="Liberation Mono" w:eastAsia="Liberation Mono" w:cs="Liberation Mono"/>
+      <w:rFonts w:ascii="Liberation Mono" w:hAnsi="Liberation Mono" w:eastAsia="Noto Sans Mono CJK SC" w:cs="Liberation Mono"/>
       <w:sz w:val="20"/>
       <w:szCs w:val="20"/>
     </w:rPr>
@@ -16825,37 +16926,37 @@
         <a:srgbClr val="000000"/>
       </a:dk1>
       <a:lt1>
-        <a:srgbClr val="ffffff"/>
+        <a:srgbClr val="FFFFFF"/>
       </a:lt1>
       <a:dk2>
         <a:srgbClr val="000000"/>
       </a:dk2>
       <a:lt2>
-        <a:srgbClr val="ffffff"/>
+        <a:srgbClr val="FFFFFF"/>
       </a:lt2>
       <a:accent1>
-        <a:srgbClr val="18a303"/>
+        <a:srgbClr val="18A303"/>
       </a:accent1>
       <a:accent2>
-        <a:srgbClr val="0369a3"/>
+        <a:srgbClr val="0369A3"/>
       </a:accent2>
       <a:accent3>
-        <a:srgbClr val="a33e03"/>
+        <a:srgbClr val="A33E03"/>
       </a:accent3>
       <a:accent4>
-        <a:srgbClr val="8e03a3"/>
+        <a:srgbClr val="8E03A3"/>
       </a:accent4>
       <a:accent5>
-        <a:srgbClr val="c99c00"/>
+        <a:srgbClr val="C99C00"/>
       </a:accent5>
       <a:accent6>
-        <a:srgbClr val="c9211e"/>
+        <a:srgbClr val="C9211E"/>
       </a:accent6>
       <a:hlink>
-        <a:srgbClr val="0000ee"/>
+        <a:srgbClr val="0000EE"/>
       </a:hlink>
       <a:folHlink>
-        <a:srgbClr val="551a8b"/>
+        <a:srgbClr val="551A8B"/>
       </a:folHlink>
     </a:clrScheme>
     <a:fontScheme name="Office">

</xml_diff>

<commit_message>
L-0510: docs state the review closure policy
README (receipt paragraph, autopilot table row, review phase, stops), CONFIG.md
(what arming autopilot does not change), PLUGINS.md's autopilot row, the
troubleshooting guide (rebuilt HTML/DOCX/PDF with build.py, LibreOffice), and
BUDGETS.md's Markdown total (21,552).
</commit_message>
<xml_diff>
--- a/docs/guides/crew/crew-1.0-troubleshooting.docx
+++ b/docs/guides/crew/crew-1.0-troubleshooting.docx
@@ -3245,7 +3245,47 @@
       </w:r>
       <w:r>
         <w:rPr/>
-        <w:t xml:space="preserve"> own the FINDINGS with </w:t>
+        <w:t xml:space="preserve"> a final round with 0 BLOCK closes itself: </w:t>
+      </w:r>
+      <w:r>
+        <w:rPr>
+          <w:rStyle w:val="SourceText"/>
+        </w:rPr>
+        <w:t>review: auto-accept: eligible</w:t>
+      </w:r>
+      <w:r>
+        <w:rPr/>
+        <w:t xml:space="preserve">, then </w:t>
+      </w:r>
+      <w:r>
+        <w:rPr>
+          <w:rStyle w:val="SourceText"/>
+        </w:rPr>
+        <w:t>--auto-accept --follow-up &lt;id&gt;</w:t>
+      </w:r>
+      <w:r>
+        <w:rPr/>
+        <w:t xml:space="preserve"> writes an </w:t>
+      </w:r>
+      <w:r>
+        <w:rPr>
+          <w:rStyle w:val="SourceText"/>
+        </w:rPr>
+        <w:t>auto-accepted</w:t>
+      </w:r>
+      <w:r>
+        <w:rPr/>
+        <w:t xml:space="preserve"> receipt and its FIX/NIT lines go verbatim into one follow-up ticket. A </w:t>
+      </w:r>
+      <w:r>
+        <w:rPr>
+          <w:rStyle w:val="SourceText"/>
+        </w:rPr>
+        <w:t>review: auto-accept: refused - &lt;reason&gt;</w:t>
+      </w:r>
+      <w:r>
+        <w:rPr/>
+        <w:t xml:space="preserve"> line names what stopped it (any BLOCK, INCOMPLETE, not the final round, an open healer skip, a count it could not read). Otherwise own the FINDINGS with </w:t>
       </w:r>
       <w:r>
         <w:rPr>
@@ -3265,7 +3305,17 @@
       </w:r>
       <w:r>
         <w:rPr/>
-        <w:t xml:space="preserve">), or write a new plan and get it approved — </w:t>
+        <w:t xml:space="preserve">; a name starting </w:t>
+      </w:r>
+      <w:r>
+        <w:rPr>
+          <w:rStyle w:val="SourceText"/>
+        </w:rPr>
+        <w:t>auto:</w:t>
+      </w:r>
+      <w:r>
+        <w:rPr/>
+        <w:t xml:space="preserve"> is refused), or write a new plan and get it approved — </w:t>
       </w:r>
       <w:r>
         <w:rPr>
@@ -3565,7 +3615,57 @@
       </w:r>
       <w:r>
         <w:rPr/>
-        <w:t xml:space="preserve">. </w:t>
+        <w:t xml:space="preserve">, or </w:t>
+      </w:r>
+      <w:r>
+        <w:rPr>
+          <w:rStyle w:val="SourceText"/>
+        </w:rPr>
+        <w:t>--auto-accept</w:t>
+      </w:r>
+      <w:r>
+        <w:rPr/>
+        <w:t xml:space="preserve"> on a final 0-BLOCK round. An </w:t>
+      </w:r>
+      <w:r>
+        <w:rPr>
+          <w:rStyle w:val="SourceText"/>
+        </w:rPr>
+        <w:t>auto-accepted</w:t>
+      </w:r>
+      <w:r>
+        <w:rPr/>
+        <w:t xml:space="preserve"> receipt stands only while its round still reads 0 BLOCK with the same lines, and </w:t>
+      </w:r>
+      <w:r>
+        <w:rPr>
+          <w:rStyle w:val="SourceText"/>
+        </w:rPr>
+        <w:t>/crew:done</w:t>
+      </w:r>
+      <w:r>
+        <w:rPr/>
+        <w:t xml:space="preserve"> also runs </w:t>
+      </w:r>
+      <w:r>
+        <w:rPr>
+          <w:rStyle w:val="SourceText"/>
+        </w:rPr>
+        <w:t>--check-follow-up</w:t>
+      </w:r>
+      <w:r>
+        <w:rPr/>
+        <w:t xml:space="preserve">, which fails until the follow-up's </w:t>
+      </w:r>
+      <w:r>
+        <w:rPr>
+          <w:rStyle w:val="SourceText"/>
+        </w:rPr>
+        <w:t>direction.md</w:t>
+      </w:r>
+      <w:r>
+        <w:rPr/>
+        <w:t xml:space="preserve"> quotes every line. </w:t>
       </w:r>
       <w:r>
         <w:rPr>

</xml_diff>

<commit_message>
L-0510: docs stop claiming /crew:done runs --check-follow-up (done.md split to L-0568); troubleshooting guide rebuilt; BUDGETS count
README, CHANGELOG and the troubleshooting guide still described the done.md
check 1 paragraph that the tooling-PR split moved to L-0568. They now say
review_ledger.py --check-follow-up exists and /crew:done does not run it yet.
Owner decision 2026-10-01 #3. BUDGETS.md count is in scope without a Touch
amendment (owner 2026-09-28).
</commit_message>
<xml_diff>
--- a/docs/guides/crew/crew-1.0-troubleshooting.docx
+++ b/docs/guides/crew/crew-1.0-troubleshooting.docx
@@ -3635,7 +3635,27 @@
       </w:r>
       <w:r>
         <w:rPr/>
-        <w:t xml:space="preserve"> receipt stands only while its round still reads 0 BLOCK with the same lines, and </w:t>
+        <w:t xml:space="preserve"> receipt stands only while its round still reads 0 BLOCK with the same lines. </w:t>
+      </w:r>
+      <w:r>
+        <w:rPr>
+          <w:rStyle w:val="SourceText"/>
+        </w:rPr>
+        <w:t>--check-follow-up</w:t>
+      </w:r>
+      <w:r>
+        <w:rPr/>
+        <w:t xml:space="preserve"> fails until the follow-up's </w:t>
+      </w:r>
+      <w:r>
+        <w:rPr>
+          <w:rStyle w:val="SourceText"/>
+        </w:rPr>
+        <w:t>direction.md</w:t>
+      </w:r>
+      <w:r>
+        <w:rPr/>
+        <w:t xml:space="preserve"> quotes every line verbatim (a line the receipt carries twice, twice), and on a non-UTF-8 file or an unknown receipt kind. </w:t>
       </w:r>
       <w:r>
         <w:rPr>
@@ -3645,27 +3665,7 @@
       </w:r>
       <w:r>
         <w:rPr/>
-        <w:t xml:space="preserve"> also runs </w:t>
-      </w:r>
-      <w:r>
-        <w:rPr>
-          <w:rStyle w:val="SourceText"/>
-        </w:rPr>
-        <w:t>--check-follow-up</w:t>
-      </w:r>
-      <w:r>
-        <w:rPr/>
-        <w:t xml:space="preserve">, which fails until the follow-up's </w:t>
-      </w:r>
-      <w:r>
-        <w:rPr>
-          <w:rStyle w:val="SourceText"/>
-        </w:rPr>
-        <w:t>direction.md</w:t>
-      </w:r>
-      <w:r>
-        <w:rPr/>
-        <w:t xml:space="preserve"> quotes every line verbatim (a line the receipt carries twice, twice), and on a non-UTF-8 file or an unknown receipt kind. </w:t>
+        <w:t xml:space="preserve"> does not run it yet (L-0568 adds it to check 1), so run it yourself before closing. </w:t>
       </w:r>
       <w:r>
         <w:rPr>

</xml_diff>

<commit_message>
L-0510: rebuild the troubleshooting guide's HTML, DOCX and PDF from the merged src (renderer: LibreOffice 26.2.5.2, not Microsoft Word); picks up T-0040's shell-route item main's outputs lacked
</commit_message>
<xml_diff>
--- a/docs/guides/crew/crew-1.0-troubleshooting.docx
+++ b/docs/guides/crew/crew-1.0-troubleshooting.docx
@@ -3245,7 +3245,47 @@
       </w:r>
       <w:r>
         <w:rPr/>
-        <w:t xml:space="preserve"> own the FINDINGS with </w:t>
+        <w:t xml:space="preserve"> a final round with 0 BLOCK closes itself: </w:t>
+      </w:r>
+      <w:r>
+        <w:rPr>
+          <w:rStyle w:val="SourceText"/>
+        </w:rPr>
+        <w:t>review: auto-accept: eligible</w:t>
+      </w:r>
+      <w:r>
+        <w:rPr/>
+        <w:t xml:space="preserve">, then </w:t>
+      </w:r>
+      <w:r>
+        <w:rPr>
+          <w:rStyle w:val="SourceText"/>
+        </w:rPr>
+        <w:t>--auto-accept --follow-up &lt;id&gt;</w:t>
+      </w:r>
+      <w:r>
+        <w:rPr/>
+        <w:t xml:space="preserve"> writes an </w:t>
+      </w:r>
+      <w:r>
+        <w:rPr>
+          <w:rStyle w:val="SourceText"/>
+        </w:rPr>
+        <w:t>auto-accepted</w:t>
+      </w:r>
+      <w:r>
+        <w:rPr/>
+        <w:t xml:space="preserve"> receipt and its FIX/NIT lines go verbatim into one follow-up ticket. A </w:t>
+      </w:r>
+      <w:r>
+        <w:rPr>
+          <w:rStyle w:val="SourceText"/>
+        </w:rPr>
+        <w:t>review: auto-accept: refused - &lt;reason&gt;</w:t>
+      </w:r>
+      <w:r>
+        <w:rPr/>
+        <w:t xml:space="preserve"> line names what stopped it (any BLOCK, INCOMPLETE, not the final round, an open healer skip, a count it could not read). Otherwise own the FINDINGS with </w:t>
       </w:r>
       <w:r>
         <w:rPr>
@@ -3265,7 +3305,17 @@
       </w:r>
       <w:r>
         <w:rPr/>
-        <w:t xml:space="preserve">), or write a new plan and get it approved — </w:t>
+        <w:t xml:space="preserve">; a name starting </w:t>
+      </w:r>
+      <w:r>
+        <w:rPr>
+          <w:rStyle w:val="SourceText"/>
+        </w:rPr>
+        <w:t>auto:</w:t>
+      </w:r>
+      <w:r>
+        <w:rPr/>
+        <w:t xml:space="preserve"> is refused), or write a new plan and get it approved — </w:t>
       </w:r>
       <w:r>
         <w:rPr>
@@ -3565,7 +3615,57 @@
       </w:r>
       <w:r>
         <w:rPr/>
-        <w:t xml:space="preserve">. </w:t>
+        <w:t xml:space="preserve">, or </w:t>
+      </w:r>
+      <w:r>
+        <w:rPr>
+          <w:rStyle w:val="SourceText"/>
+        </w:rPr>
+        <w:t>--auto-accept</w:t>
+      </w:r>
+      <w:r>
+        <w:rPr/>
+        <w:t xml:space="preserve"> on a final 0-BLOCK round. An </w:t>
+      </w:r>
+      <w:r>
+        <w:rPr>
+          <w:rStyle w:val="SourceText"/>
+        </w:rPr>
+        <w:t>auto-accepted</w:t>
+      </w:r>
+      <w:r>
+        <w:rPr/>
+        <w:t xml:space="preserve"> receipt stands only while its round still reads 0 BLOCK with the same lines. </w:t>
+      </w:r>
+      <w:r>
+        <w:rPr>
+          <w:rStyle w:val="SourceText"/>
+        </w:rPr>
+        <w:t>--check-follow-up</w:t>
+      </w:r>
+      <w:r>
+        <w:rPr/>
+        <w:t xml:space="preserve"> fails until the follow-up's </w:t>
+      </w:r>
+      <w:r>
+        <w:rPr>
+          <w:rStyle w:val="SourceText"/>
+        </w:rPr>
+        <w:t>direction.md</w:t>
+      </w:r>
+      <w:r>
+        <w:rPr/>
+        <w:t xml:space="preserve"> quotes every line verbatim (a line the receipt carries twice, twice), and on a non-UTF-8 file or an unknown receipt kind. </w:t>
+      </w:r>
+      <w:r>
+        <w:rPr>
+          <w:rStyle w:val="SourceText"/>
+        </w:rPr>
+        <w:t>/crew:done</w:t>
+      </w:r>
+      <w:r>
+        <w:rPr/>
+        <w:t xml:space="preserve"> does not run it yet (L-0568 adds it to check 1), so run it yourself before closing. </w:t>
       </w:r>
       <w:r>
         <w:rPr>
@@ -10170,6 +10270,7 @@
           <w:tab w:val="left" w:pos="829" w:leader="none"/>
         </w:tabs>
         <w:bidi w:val="0"/>
+        <w:spacing w:before="120" w:after="0"/>
         <w:ind w:hanging="283" w:left="829"/>
         <w:jc w:val="left"/>
         <w:rPr/>
@@ -10233,6 +10334,173 @@
       <w:r>
         <w:rPr/>
         <w:t xml:space="preserve">) rather than the bash twin doing that job. </w:t>
+      </w:r>
+    </w:p>
+    <w:p>
+      <w:pPr>
+        <w:pStyle w:val="BodyText"/>
+        <w:numPr>
+          <w:ilvl w:val="0"/>
+          <w:numId w:val="21"/>
+        </w:numPr>
+        <w:tabs>
+          <w:tab w:val="clear" w:pos="1134"/>
+          <w:tab w:val="left" w:pos="829" w:leader="none"/>
+        </w:tabs>
+        <w:bidi w:val="0"/>
+        <w:ind w:hanging="283" w:left="829"/>
+        <w:jc w:val="left"/>
+        <w:rPr/>
+      </w:pPr>
+      <w:r>
+        <w:rPr>
+          <w:rStyle w:val="Strong"/>
+        </w:rPr>
+        <w:t>Tests and checks are slow on Windows.</w:t>
+      </w:r>
+      <w:r>
+        <w:rPr/>
+        <w:t xml:space="preserve"> Read </w:t>
+      </w:r>
+      <w:r>
+        <w:rPr>
+          <w:rStyle w:val="SourceText"/>
+        </w:rPr>
+        <w:t>/crew:status</w:t>
+      </w:r>
+      <w:r>
+        <w:rPr/>
+        <w:t xml:space="preserve">'s </w:t>
+      </w:r>
+      <w:r>
+        <w:rPr>
+          <w:rStyle w:val="SourceText"/>
+        </w:rPr>
+        <w:t>shell</w:t>
+      </w:r>
+      <w:r>
+        <w:rPr/>
+        <w:t xml:space="preserve"> line first. It names the shell route crew's jobs take (</w:t>
+      </w:r>
+      <w:r>
+        <w:rPr>
+          <w:rStyle w:val="SourceText"/>
+        </w:rPr>
+        <w:t>shellRoute.mode</w:t>
+      </w:r>
+      <w:r>
+        <w:rPr/>
+        <w:t xml:space="preserve">: </w:t>
+      </w:r>
+      <w:r>
+        <w:rPr>
+          <w:rStyle w:val="SourceText"/>
+        </w:rPr>
+        <w:t>auto</w:t>
+      </w:r>
+      <w:r>
+        <w:rPr/>
+        <w:t xml:space="preserve">, </w:t>
+      </w:r>
+      <w:r>
+        <w:rPr>
+          <w:rStyle w:val="SourceText"/>
+        </w:rPr>
+        <w:t>wsl</w:t>
+      </w:r>
+      <w:r>
+        <w:rPr/>
+        <w:t xml:space="preserve">, </w:t>
+      </w:r>
+      <w:r>
+        <w:rPr>
+          <w:rStyle w:val="SourceText"/>
+        </w:rPr>
+        <w:t>powershell</w:t>
+      </w:r>
+      <w:r>
+        <w:rPr/>
+        <w:t xml:space="preserve">, </w:t>
+      </w:r>
+      <w:r>
+        <w:rPr>
+          <w:rStyle w:val="SourceText"/>
+        </w:rPr>
+        <w:t>gitbash</w:t>
+      </w:r>
+      <w:r>
+        <w:rPr/>
+        <w:t xml:space="preserve">) and why. </w:t>
+      </w:r>
+      <w:r>
+        <w:rPr>
+          <w:rStyle w:val="SourceText"/>
+        </w:rPr>
+        <w:t>WSL never probed</w:t>
+      </w:r>
+      <w:r>
+        <w:rPr/>
+        <w:t xml:space="preserve"> means nobody ran </w:t>
+      </w:r>
+      <w:r>
+        <w:rPr>
+          <w:rStyle w:val="SourceText"/>
+        </w:rPr>
+        <w:t>crew_shell.py probe --write</w:t>
+      </w:r>
+      <w:r>
+        <w:rPr/>
+        <w:t xml:space="preserve">; </w:t>
+      </w:r>
+      <w:r>
+        <w:rPr>
+          <w:rStyle w:val="SourceText"/>
+        </w:rPr>
+        <w:t>not-installed</w:t>
+      </w:r>
+      <w:r>
+        <w:rPr/>
+        <w:t xml:space="preserve"> comes with the </w:t>
+      </w:r>
+      <w:r>
+        <w:rPr>
+          <w:rStyle w:val="SourceText"/>
+        </w:rPr>
+        <w:t>wsl --install -d Ubuntu</w:t>
+      </w:r>
+      <w:r>
+        <w:rPr/>
+        <w:t xml:space="preserve"> recommendation, which crew prints and never runs. A repo on a Windows drive goes to WSL under </w:t>
+      </w:r>
+      <w:r>
+        <w:rPr>
+          <w:rStyle w:val="SourceText"/>
+        </w:rPr>
+        <w:t>auto</w:t>
+      </w:r>
+      <w:r>
+        <w:rPr/>
+        <w:t xml:space="preserve"> only after </w:t>
+      </w:r>
+      <w:r>
+        <w:rPr>
+          <w:rStyle w:val="SourceText"/>
+        </w:rPr>
+        <w:t>crew_shell.py measure --write</w:t>
+      </w:r>
+      <w:r>
+        <w:rPr/>
+        <w:t xml:space="preserve"> has shown WSL faster there. See "Choosing the shell route on Windows" in </w:t>
+      </w:r>
+      <w:r>
+        <w:rPr>
+          <w:rStyle w:val="SourceText"/>
+        </w:rPr>
+        <w:t>plugin/crew/skills/crew-setup/platform.md</w:t>
+      </w:r>
+      <w:r>
+        <w:rPr/>
+        <w:t xml:space="preserve">. </w:t>
       </w:r>
     </w:p>
     <w:p>

</xml_diff>

<commit_message>
L-0510: docs state the family rule - review.md step 3, README, CONFIG, PLUGINS row, CHANGELOG, troubleshooting guide (HTML/DOCX/PDF rebuilt; renderer LibreOffice 26.2.5.2, not Microsoft Word); crew.md codemap cites _family_problem and the moved review_ledger.py lines; BUDGETS 21,822 -> 21,823; rules regenerated
</commit_message>
<xml_diff>
--- a/docs/guides/crew/crew-1.0-troubleshooting.docx
+++ b/docs/guides/crew/crew-1.0-troubleshooting.docx
@@ -3245,7 +3245,7 @@
       </w:r>
       <w:r>
         <w:rPr/>
-        <w:t xml:space="preserve"> a final round with 0 BLOCK closes itself: </w:t>
+        <w:t xml:space="preserve"> a final round with 0 BLOCK from a Codex or Kimi reviewer closes itself: </w:t>
       </w:r>
       <w:r>
         <w:rPr>
@@ -3285,7 +3285,7 @@
       </w:r>
       <w:r>
         <w:rPr/>
-        <w:t xml:space="preserve"> line names what stopped it (any BLOCK, INCOMPLETE, not the final round, an open healer skip, a count it could not read). Otherwise own the FINDINGS with </w:t>
+        <w:t xml:space="preserve"> line names what stopped it (any BLOCK, INCOMPLETE, not the final round, an open healer skip, a count it could not read, a same-family Claude-fallback round, or a provider or family it could not tell). Otherwise own the FINDINGS with </w:t>
       </w:r>
       <w:r>
         <w:rPr>
@@ -3635,7 +3635,7 @@
       </w:r>
       <w:r>
         <w:rPr/>
-        <w:t xml:space="preserve"> receipt stands only while its round still reads 0 BLOCK with the same lines. </w:t>
+        <w:t xml:space="preserve"> receipt stands only while its round still reads 0 BLOCK with the same lines from a Codex or Kimi reviewer. </w:t>
       </w:r>
       <w:r>
         <w:rPr>

</xml_diff>

<commit_message>
docs: rebuild the crew troubleshooting guide for L-0576's recovered verdict
</commit_message>
<xml_diff>
--- a/docs/guides/crew/crew-1.0-troubleshooting.docx
+++ b/docs/guides/crew/crew-1.0-troubleshooting.docx
@@ -3394,7 +3394,87 @@
       </w:r>
       <w:r>
         <w:rPr/>
-        <w:t xml:space="preserve"> means the output arrived and broke the contract. </w:t>
+        <w:t xml:space="preserve"> means the output arrived and broke the contract. Harmless prose, a heading or a code fence beside well-formed findings, with every part acknowledged and exit 0, no longer does that: the round is FINDINGS, and the ignored lines are printed on a </w:t>
+      </w:r>
+      <w:r>
+        <w:rPr>
+          <w:rStyle w:val="SourceText"/>
+        </w:rPr>
+        <w:t>review: FINDINGS kept; ...</w:t>
+      </w:r>
+      <w:r>
+        <w:rPr/>
+        <w:t xml:space="preserve"> line and kept in </w:t>
+      </w:r>
+      <w:r>
+        <w:rPr>
+          <w:rStyle w:val="SourceText"/>
+        </w:rPr>
+        <w:t>review.json</w:t>
+      </w:r>
+      <w:r>
+        <w:rPr/>
+        <w:t xml:space="preserve">'s </w:t>
+      </w:r>
+      <w:r>
+        <w:rPr>
+          <w:rStyle w:val="SourceText"/>
+        </w:rPr>
+        <w:t>ignored_lines</w:t>
+      </w:r>
+      <w:r>
+        <w:rPr/>
+        <w:t xml:space="preserve">. A stray line beside </w:t>
+      </w:r>
+      <w:r>
+        <w:rPr>
+          <w:rStyle w:val="SourceText"/>
+        </w:rPr>
+        <w:t>CLEAN</w:t>
+      </w:r>
+      <w:r>
+        <w:rPr/>
+        <w:t>, a misformatted contract line (</w:t>
+      </w:r>
+      <w:r>
+        <w:rPr>
+          <w:rStyle w:val="SourceText"/>
+        </w:rPr>
+        <w:t>- FIX|...</w:t>
+      </w:r>
+      <w:r>
+        <w:rPr/>
+        <w:t xml:space="preserve">, </w:t>
+      </w:r>
+      <w:r>
+        <w:rPr>
+          <w:rStyle w:val="SourceText"/>
+        </w:rPr>
+        <w:t>fix|...</w:t>
+      </w:r>
+      <w:r>
+        <w:rPr/>
+        <w:t xml:space="preserve">, a </w:t>
+      </w:r>
+      <w:r>
+        <w:rPr>
+          <w:rStyle w:val="SourceText"/>
+        </w:rPr>
+        <w:t>|</w:t>
+      </w:r>
+      <w:r>
+        <w:rPr/>
+        <w:t xml:space="preserve"> table row) or a line admitting the review fell short ("skipped", "truncated", "could not review") is still INCOMPLETE </w:t>
+      </w:r>
+      <w:r>
+        <w:rPr>
+          <w:rStyle w:val="SourceText"/>
+        </w:rPr>
+        <w:t>reviewer</w:t>
+      </w:r>
+      <w:r>
+        <w:rPr/>
+        <w:t xml:space="preserve">. </w:t>
       </w:r>
       <w:r>
         <w:rPr>
@@ -10180,6 +10260,7 @@
           <w:tab w:val="left" w:pos="829" w:leader="none"/>
         </w:tabs>
         <w:bidi w:val="0"/>
+        <w:spacing w:before="120" w:after="0"/>
         <w:ind w:hanging="283" w:left="829"/>
         <w:jc w:val="left"/>
         <w:rPr/>
@@ -10243,6 +10324,173 @@
       <w:r>
         <w:rPr/>
         <w:t xml:space="preserve">) rather than the bash twin doing that job. </w:t>
+      </w:r>
+    </w:p>
+    <w:p>
+      <w:pPr>
+        <w:pStyle w:val="BodyText"/>
+        <w:numPr>
+          <w:ilvl w:val="0"/>
+          <w:numId w:val="21"/>
+        </w:numPr>
+        <w:tabs>
+          <w:tab w:val="clear" w:pos="1134"/>
+          <w:tab w:val="left" w:pos="829" w:leader="none"/>
+        </w:tabs>
+        <w:bidi w:val="0"/>
+        <w:ind w:hanging="283" w:left="829"/>
+        <w:jc w:val="left"/>
+        <w:rPr/>
+      </w:pPr>
+      <w:r>
+        <w:rPr>
+          <w:rStyle w:val="Strong"/>
+        </w:rPr>
+        <w:t>Tests and checks are slow on Windows.</w:t>
+      </w:r>
+      <w:r>
+        <w:rPr/>
+        <w:t xml:space="preserve"> Read </w:t>
+      </w:r>
+      <w:r>
+        <w:rPr>
+          <w:rStyle w:val="SourceText"/>
+        </w:rPr>
+        <w:t>/crew:status</w:t>
+      </w:r>
+      <w:r>
+        <w:rPr/>
+        <w:t xml:space="preserve">'s </w:t>
+      </w:r>
+      <w:r>
+        <w:rPr>
+          <w:rStyle w:val="SourceText"/>
+        </w:rPr>
+        <w:t>shell</w:t>
+      </w:r>
+      <w:r>
+        <w:rPr/>
+        <w:t xml:space="preserve"> line first. It names the shell route crew's jobs take (</w:t>
+      </w:r>
+      <w:r>
+        <w:rPr>
+          <w:rStyle w:val="SourceText"/>
+        </w:rPr>
+        <w:t>shellRoute.mode</w:t>
+      </w:r>
+      <w:r>
+        <w:rPr/>
+        <w:t xml:space="preserve">: </w:t>
+      </w:r>
+      <w:r>
+        <w:rPr>
+          <w:rStyle w:val="SourceText"/>
+        </w:rPr>
+        <w:t>auto</w:t>
+      </w:r>
+      <w:r>
+        <w:rPr/>
+        <w:t xml:space="preserve">, </w:t>
+      </w:r>
+      <w:r>
+        <w:rPr>
+          <w:rStyle w:val="SourceText"/>
+        </w:rPr>
+        <w:t>wsl</w:t>
+      </w:r>
+      <w:r>
+        <w:rPr/>
+        <w:t xml:space="preserve">, </w:t>
+      </w:r>
+      <w:r>
+        <w:rPr>
+          <w:rStyle w:val="SourceText"/>
+        </w:rPr>
+        <w:t>powershell</w:t>
+      </w:r>
+      <w:r>
+        <w:rPr/>
+        <w:t xml:space="preserve">, </w:t>
+      </w:r>
+      <w:r>
+        <w:rPr>
+          <w:rStyle w:val="SourceText"/>
+        </w:rPr>
+        <w:t>gitbash</w:t>
+      </w:r>
+      <w:r>
+        <w:rPr/>
+        <w:t xml:space="preserve">) and why. </w:t>
+      </w:r>
+      <w:r>
+        <w:rPr>
+          <w:rStyle w:val="SourceText"/>
+        </w:rPr>
+        <w:t>WSL never probed</w:t>
+      </w:r>
+      <w:r>
+        <w:rPr/>
+        <w:t xml:space="preserve"> means nobody ran </w:t>
+      </w:r>
+      <w:r>
+        <w:rPr>
+          <w:rStyle w:val="SourceText"/>
+        </w:rPr>
+        <w:t>crew_shell.py probe --write</w:t>
+      </w:r>
+      <w:r>
+        <w:rPr/>
+        <w:t xml:space="preserve">; </w:t>
+      </w:r>
+      <w:r>
+        <w:rPr>
+          <w:rStyle w:val="SourceText"/>
+        </w:rPr>
+        <w:t>not-installed</w:t>
+      </w:r>
+      <w:r>
+        <w:rPr/>
+        <w:t xml:space="preserve"> comes with the </w:t>
+      </w:r>
+      <w:r>
+        <w:rPr>
+          <w:rStyle w:val="SourceText"/>
+        </w:rPr>
+        <w:t>wsl --install -d Ubuntu</w:t>
+      </w:r>
+      <w:r>
+        <w:rPr/>
+        <w:t xml:space="preserve"> recommendation, which crew prints and never runs. A repo on a Windows drive goes to WSL under </w:t>
+      </w:r>
+      <w:r>
+        <w:rPr>
+          <w:rStyle w:val="SourceText"/>
+        </w:rPr>
+        <w:t>auto</w:t>
+      </w:r>
+      <w:r>
+        <w:rPr/>
+        <w:t xml:space="preserve"> only after </w:t>
+      </w:r>
+      <w:r>
+        <w:rPr>
+          <w:rStyle w:val="SourceText"/>
+        </w:rPr>
+        <w:t>crew_shell.py measure --write</w:t>
+      </w:r>
+      <w:r>
+        <w:rPr/>
+        <w:t xml:space="preserve"> has shown WSL faster there. See "Choosing the shell route on Windows" in </w:t>
+      </w:r>
+      <w:r>
+        <w:rPr>
+          <w:rStyle w:val="SourceText"/>
+        </w:rPr>
+        <w:t>plugin/crew/skills/crew-setup/platform.md</w:t>
+      </w:r>
+      <w:r>
+        <w:rPr/>
+        <w:t xml:space="preserve">. </w:t>
       </w:r>
     </w:p>
     <w:p>

</xml_diff>

<commit_message>
L-0510: rebuild the troubleshooting guide's HTML, DOCX and PDF from the merged src (renderer: LibreOffice 26.2.5.2, not Microsoft Word)
</commit_message>
<xml_diff>
--- a/docs/guides/crew/crew-1.0-troubleshooting.docx
+++ b/docs/guides/crew/crew-1.0-troubleshooting.docx
@@ -3245,7 +3245,47 @@
       </w:r>
       <w:r>
         <w:rPr/>
-        <w:t xml:space="preserve"> own the FINDINGS with </w:t>
+        <w:t xml:space="preserve"> a final round with 0 BLOCK from a Codex or Kimi reviewer closes itself: </w:t>
+      </w:r>
+      <w:r>
+        <w:rPr>
+          <w:rStyle w:val="SourceText"/>
+        </w:rPr>
+        <w:t>review: auto-accept: eligible</w:t>
+      </w:r>
+      <w:r>
+        <w:rPr/>
+        <w:t xml:space="preserve">, then </w:t>
+      </w:r>
+      <w:r>
+        <w:rPr>
+          <w:rStyle w:val="SourceText"/>
+        </w:rPr>
+        <w:t>--auto-accept --follow-up &lt;id&gt;</w:t>
+      </w:r>
+      <w:r>
+        <w:rPr/>
+        <w:t xml:space="preserve"> writes an </w:t>
+      </w:r>
+      <w:r>
+        <w:rPr>
+          <w:rStyle w:val="SourceText"/>
+        </w:rPr>
+        <w:t>auto-accepted</w:t>
+      </w:r>
+      <w:r>
+        <w:rPr/>
+        <w:t xml:space="preserve"> receipt and its FIX/NIT lines go verbatim into one follow-up ticket. A </w:t>
+      </w:r>
+      <w:r>
+        <w:rPr>
+          <w:rStyle w:val="SourceText"/>
+        </w:rPr>
+        <w:t>review: auto-accept: refused - &lt;reason&gt;</w:t>
+      </w:r>
+      <w:r>
+        <w:rPr/>
+        <w:t xml:space="preserve"> line names what stopped it (any BLOCK, INCOMPLETE, not the final round, an open healer skip, a count it could not read, a same-family Claude-fallback round, or a provider or family it could not tell). Otherwise own the FINDINGS with </w:t>
       </w:r>
       <w:r>
         <w:rPr>
@@ -3265,7 +3305,17 @@
       </w:r>
       <w:r>
         <w:rPr/>
-        <w:t xml:space="preserve">), or write a new plan and get it approved — </w:t>
+        <w:t xml:space="preserve">; a name starting </w:t>
+      </w:r>
+      <w:r>
+        <w:rPr>
+          <w:rStyle w:val="SourceText"/>
+        </w:rPr>
+        <w:t>auto:</w:t>
+      </w:r>
+      <w:r>
+        <w:rPr/>
+        <w:t xml:space="preserve"> is refused), or write a new plan and get it approved — </w:t>
       </w:r>
       <w:r>
         <w:rPr>
@@ -3565,7 +3615,57 @@
       </w:r>
       <w:r>
         <w:rPr/>
-        <w:t xml:space="preserve">. </w:t>
+        <w:t xml:space="preserve">, or </w:t>
+      </w:r>
+      <w:r>
+        <w:rPr>
+          <w:rStyle w:val="SourceText"/>
+        </w:rPr>
+        <w:t>--auto-accept</w:t>
+      </w:r>
+      <w:r>
+        <w:rPr/>
+        <w:t xml:space="preserve"> on a final 0-BLOCK round. An </w:t>
+      </w:r>
+      <w:r>
+        <w:rPr>
+          <w:rStyle w:val="SourceText"/>
+        </w:rPr>
+        <w:t>auto-accepted</w:t>
+      </w:r>
+      <w:r>
+        <w:rPr/>
+        <w:t xml:space="preserve"> receipt stands only while its round still reads 0 BLOCK with the same lines from the same Codex or Kimi reviewer the receipt names. </w:t>
+      </w:r>
+      <w:r>
+        <w:rPr>
+          <w:rStyle w:val="SourceText"/>
+        </w:rPr>
+        <w:t>--check-follow-up</w:t>
+      </w:r>
+      <w:r>
+        <w:rPr/>
+        <w:t xml:space="preserve"> fails until the follow-up's </w:t>
+      </w:r>
+      <w:r>
+        <w:rPr>
+          <w:rStyle w:val="SourceText"/>
+        </w:rPr>
+        <w:t>direction.md</w:t>
+      </w:r>
+      <w:r>
+        <w:rPr/>
+        <w:t xml:space="preserve"> quotes every line verbatim (a line the receipt carries twice, twice), and on a non-UTF-8 file or an unknown receipt kind. </w:t>
+      </w:r>
+      <w:r>
+        <w:rPr>
+          <w:rStyle w:val="SourceText"/>
+        </w:rPr>
+        <w:t>/crew:done</w:t>
+      </w:r>
+      <w:r>
+        <w:rPr/>
+        <w:t xml:space="preserve"> does not run it yet (L-0568 adds it to check 1), so run it yourself before closing. </w:t>
       </w:r>
       <w:r>
         <w:rPr>
@@ -10180,6 +10280,7 @@
           <w:tab w:val="left" w:pos="829" w:leader="none"/>
         </w:tabs>
         <w:bidi w:val="0"/>
+        <w:spacing w:before="120" w:after="0"/>
         <w:ind w:hanging="283" w:left="829"/>
         <w:jc w:val="left"/>
         <w:rPr/>
@@ -10243,6 +10344,173 @@
       <w:r>
         <w:rPr/>
         <w:t xml:space="preserve">) rather than the bash twin doing that job. </w:t>
+      </w:r>
+    </w:p>
+    <w:p>
+      <w:pPr>
+        <w:pStyle w:val="BodyText"/>
+        <w:numPr>
+          <w:ilvl w:val="0"/>
+          <w:numId w:val="21"/>
+        </w:numPr>
+        <w:tabs>
+          <w:tab w:val="clear" w:pos="1134"/>
+          <w:tab w:val="left" w:pos="829" w:leader="none"/>
+        </w:tabs>
+        <w:bidi w:val="0"/>
+        <w:ind w:hanging="283" w:left="829"/>
+        <w:jc w:val="left"/>
+        <w:rPr/>
+      </w:pPr>
+      <w:r>
+        <w:rPr>
+          <w:rStyle w:val="Strong"/>
+        </w:rPr>
+        <w:t>Tests and checks are slow on Windows.</w:t>
+      </w:r>
+      <w:r>
+        <w:rPr/>
+        <w:t xml:space="preserve"> Read </w:t>
+      </w:r>
+      <w:r>
+        <w:rPr>
+          <w:rStyle w:val="SourceText"/>
+        </w:rPr>
+        <w:t>/crew:status</w:t>
+      </w:r>
+      <w:r>
+        <w:rPr/>
+        <w:t xml:space="preserve">'s </w:t>
+      </w:r>
+      <w:r>
+        <w:rPr>
+          <w:rStyle w:val="SourceText"/>
+        </w:rPr>
+        <w:t>shell</w:t>
+      </w:r>
+      <w:r>
+        <w:rPr/>
+        <w:t xml:space="preserve"> line first. It names the shell route crew's jobs take (</w:t>
+      </w:r>
+      <w:r>
+        <w:rPr>
+          <w:rStyle w:val="SourceText"/>
+        </w:rPr>
+        <w:t>shellRoute.mode</w:t>
+      </w:r>
+      <w:r>
+        <w:rPr/>
+        <w:t xml:space="preserve">: </w:t>
+      </w:r>
+      <w:r>
+        <w:rPr>
+          <w:rStyle w:val="SourceText"/>
+        </w:rPr>
+        <w:t>auto</w:t>
+      </w:r>
+      <w:r>
+        <w:rPr/>
+        <w:t xml:space="preserve">, </w:t>
+      </w:r>
+      <w:r>
+        <w:rPr>
+          <w:rStyle w:val="SourceText"/>
+        </w:rPr>
+        <w:t>wsl</w:t>
+      </w:r>
+      <w:r>
+        <w:rPr/>
+        <w:t xml:space="preserve">, </w:t>
+      </w:r>
+      <w:r>
+        <w:rPr>
+          <w:rStyle w:val="SourceText"/>
+        </w:rPr>
+        <w:t>powershell</w:t>
+      </w:r>
+      <w:r>
+        <w:rPr/>
+        <w:t xml:space="preserve">, </w:t>
+      </w:r>
+      <w:r>
+        <w:rPr>
+          <w:rStyle w:val="SourceText"/>
+        </w:rPr>
+        <w:t>gitbash</w:t>
+      </w:r>
+      <w:r>
+        <w:rPr/>
+        <w:t xml:space="preserve">) and why. </w:t>
+      </w:r>
+      <w:r>
+        <w:rPr>
+          <w:rStyle w:val="SourceText"/>
+        </w:rPr>
+        <w:t>WSL never probed</w:t>
+      </w:r>
+      <w:r>
+        <w:rPr/>
+        <w:t xml:space="preserve"> means nobody ran </w:t>
+      </w:r>
+      <w:r>
+        <w:rPr>
+          <w:rStyle w:val="SourceText"/>
+        </w:rPr>
+        <w:t>crew_shell.py probe --write</w:t>
+      </w:r>
+      <w:r>
+        <w:rPr/>
+        <w:t xml:space="preserve">; </w:t>
+      </w:r>
+      <w:r>
+        <w:rPr>
+          <w:rStyle w:val="SourceText"/>
+        </w:rPr>
+        <w:t>not-installed</w:t>
+      </w:r>
+      <w:r>
+        <w:rPr/>
+        <w:t xml:space="preserve"> comes with the </w:t>
+      </w:r>
+      <w:r>
+        <w:rPr>
+          <w:rStyle w:val="SourceText"/>
+        </w:rPr>
+        <w:t>wsl --install -d Ubuntu</w:t>
+      </w:r>
+      <w:r>
+        <w:rPr/>
+        <w:t xml:space="preserve"> recommendation, which crew prints and never runs. A repo on a Windows drive goes to WSL under </w:t>
+      </w:r>
+      <w:r>
+        <w:rPr>
+          <w:rStyle w:val="SourceText"/>
+        </w:rPr>
+        <w:t>auto</w:t>
+      </w:r>
+      <w:r>
+        <w:rPr/>
+        <w:t xml:space="preserve"> only after </w:t>
+      </w:r>
+      <w:r>
+        <w:rPr>
+          <w:rStyle w:val="SourceText"/>
+        </w:rPr>
+        <w:t>crew_shell.py measure --write</w:t>
+      </w:r>
+      <w:r>
+        <w:rPr/>
+        <w:t xml:space="preserve"> has shown WSL faster there. See "Choosing the shell route on Windows" in </w:t>
+      </w:r>
+      <w:r>
+        <w:rPr>
+          <w:rStyle w:val="SourceText"/>
+        </w:rPr>
+        <w:t>plugin/crew/skills/crew-setup/platform.md</w:t>
+      </w:r>
+      <w:r>
+        <w:rPr/>
+        <w:t xml:space="preserve">. </w:t>
       </w:r>
     </w:p>
     <w:p>

</xml_diff>

<commit_message>
L-0510: rebuild the troubleshooting guide's HTML, DOCX and PDF from src after decision #6's text (renderer: LibreOffice 26.2.5.2, not Microsoft Word)
</commit_message>
<xml_diff>
--- a/docs/guides/crew/crew-1.0-troubleshooting.docx
+++ b/docs/guides/crew/crew-1.0-troubleshooting.docx
@@ -3285,7 +3285,17 @@
       </w:r>
       <w:r>
         <w:rPr/>
-        <w:t xml:space="preserve"> line names what stopped it (any BLOCK, INCOMPLETE, not the final round, an open healer skip, a count it could not read, a same-family Claude-fallback round, or a provider or family it could not tell). Otherwise own the FINDINGS with </w:t>
+        <w:t xml:space="preserve"> line names what stopped it (any BLOCK, INCOMPLETE, not the final round, an open healer skip, a count it could not read, a same-family Claude-fallback round, a provider or family it could not tell, or a verdict recovered from stray lines - </w:t>
+      </w:r>
+      <w:r>
+        <w:rPr>
+          <w:rStyle w:val="SourceText"/>
+        </w:rPr>
+        <w:t>ignored_lines</w:t>
+      </w:r>
+      <w:r>
+        <w:rPr/>
+        <w:t xml:space="preserve"> above 0, or missing or unreadable, which is could-not-tell until L-0576 records it). Otherwise own the FINDINGS with </w:t>
       </w:r>
       <w:r>
         <w:rPr>

</xml_diff>

<commit_message>
T-0009: rebuild the troubleshooting guide (HTML, DOCX, PDF) from its merged source (build.py --guide troubleshooting, LibreOffice 26.2.5.2)
</commit_message>
<xml_diff>
--- a/docs/guides/crew/crew-1.0-troubleshooting.docx
+++ b/docs/guides/crew/crew-1.0-troubleshooting.docx
@@ -545,7 +545,7 @@
     </w:p>
     <w:tbl>
       <w:tblPr>
-        <w:tblW w:w="11731" w:type="dxa"/>
+        <w:tblW w:w="12926" w:type="dxa"/>
         <w:jc w:val="left"/>
         <w:tblInd w:w="28" w:type="dxa"/>
         <w:tblLayout w:type="fixed"/>
@@ -559,8 +559,8 @@
       <w:tblGrid>
         <w:gridCol w:w="2119"/>
         <w:gridCol w:w="2456"/>
-        <w:gridCol w:w="2022"/>
-        <w:gridCol w:w="2986"/>
+        <w:gridCol w:w="2808"/>
+        <w:gridCol w:w="3395"/>
         <w:gridCol w:w="2148"/>
       </w:tblGrid>
       <w:tr>
@@ -613,7 +613,7 @@
         </w:tc>
         <w:tc>
           <w:tcPr>
-            <w:tcW w:w="2022" w:type="dxa"/>
+            <w:tcW w:w="2808" w:type="dxa"/>
             <w:tcBorders/>
             <w:vAlign w:val="center"/>
           </w:tcPr>
@@ -635,7 +635,7 @@
         </w:tc>
         <w:tc>
           <w:tcPr>
-            <w:tcW w:w="2986" w:type="dxa"/>
+            <w:tcW w:w="3395" w:type="dxa"/>
             <w:tcBorders/>
             <w:vAlign w:val="center"/>
           </w:tcPr>
@@ -728,7 +728,7 @@
         </w:tc>
         <w:tc>
           <w:tcPr>
-            <w:tcW w:w="2022" w:type="dxa"/>
+            <w:tcW w:w="2808" w:type="dxa"/>
             <w:tcBorders/>
             <w:vAlign w:val="center"/>
           </w:tcPr>
@@ -769,7 +769,7 @@
         </w:tc>
         <w:tc>
           <w:tcPr>
-            <w:tcW w:w="2986" w:type="dxa"/>
+            <w:tcW w:w="3395" w:type="dxa"/>
             <w:tcBorders/>
             <w:vAlign w:val="center"/>
           </w:tcPr>
@@ -864,7 +864,7 @@
         </w:tc>
         <w:tc>
           <w:tcPr>
-            <w:tcW w:w="2022" w:type="dxa"/>
+            <w:tcW w:w="2808" w:type="dxa"/>
             <w:tcBorders/>
             <w:vAlign w:val="center"/>
           </w:tcPr>
@@ -891,7 +891,7 @@
         </w:tc>
         <w:tc>
           <w:tcPr>
-            <w:tcW w:w="2986" w:type="dxa"/>
+            <w:tcW w:w="3395" w:type="dxa"/>
             <w:tcBorders/>
             <w:vAlign w:val="center"/>
           </w:tcPr>
@@ -1016,7 +1016,7 @@
         </w:tc>
         <w:tc>
           <w:tcPr>
-            <w:tcW w:w="2022" w:type="dxa"/>
+            <w:tcW w:w="2808" w:type="dxa"/>
             <w:tcBorders/>
             <w:vAlign w:val="center"/>
           </w:tcPr>
@@ -1037,7 +1037,7 @@
         </w:tc>
         <w:tc>
           <w:tcPr>
-            <w:tcW w:w="2986" w:type="dxa"/>
+            <w:tcW w:w="3395" w:type="dxa"/>
             <w:tcBorders/>
             <w:vAlign w:val="center"/>
           </w:tcPr>
@@ -1156,7 +1156,7 @@
         </w:tc>
         <w:tc>
           <w:tcPr>
-            <w:tcW w:w="2022" w:type="dxa"/>
+            <w:tcW w:w="2808" w:type="dxa"/>
             <w:tcBorders/>
             <w:vAlign w:val="center"/>
           </w:tcPr>
@@ -1187,7 +1187,7 @@
         </w:tc>
         <w:tc>
           <w:tcPr>
-            <w:tcW w:w="2986" w:type="dxa"/>
+            <w:tcW w:w="3395" w:type="dxa"/>
             <w:tcBorders/>
             <w:vAlign w:val="center"/>
           </w:tcPr>
@@ -1308,7 +1308,7 @@
         </w:tc>
         <w:tc>
           <w:tcPr>
-            <w:tcW w:w="2022" w:type="dxa"/>
+            <w:tcW w:w="2808" w:type="dxa"/>
             <w:tcBorders/>
             <w:vAlign w:val="center"/>
           </w:tcPr>
@@ -1335,7 +1335,7 @@
         </w:tc>
         <w:tc>
           <w:tcPr>
-            <w:tcW w:w="2986" w:type="dxa"/>
+            <w:tcW w:w="3395" w:type="dxa"/>
             <w:tcBorders/>
             <w:vAlign w:val="center"/>
           </w:tcPr>
@@ -1538,7 +1538,7 @@
         </w:tc>
         <w:tc>
           <w:tcPr>
-            <w:tcW w:w="2022" w:type="dxa"/>
+            <w:tcW w:w="2808" w:type="dxa"/>
             <w:tcBorders/>
             <w:vAlign w:val="center"/>
           </w:tcPr>
@@ -1559,7 +1559,7 @@
         </w:tc>
         <w:tc>
           <w:tcPr>
-            <w:tcW w:w="2986" w:type="dxa"/>
+            <w:tcW w:w="3395" w:type="dxa"/>
             <w:tcBorders/>
             <w:vAlign w:val="center"/>
           </w:tcPr>
@@ -1712,7 +1712,7 @@
         </w:tc>
         <w:tc>
           <w:tcPr>
-            <w:tcW w:w="2022" w:type="dxa"/>
+            <w:tcW w:w="2808" w:type="dxa"/>
             <w:tcBorders/>
             <w:vAlign w:val="center"/>
           </w:tcPr>
@@ -1747,13 +1747,33 @@
             </w:r>
             <w:r>
               <w:rPr/>
-              <w:t xml:space="preserve"> commands and wrong-identity commands</w:t>
-            </w:r>
-          </w:p>
-        </w:tc>
-        <w:tc>
-          <w:tcPr>
-            <w:tcW w:w="2986" w:type="dxa"/>
+              <w:t xml:space="preserve"> commands, wrong-identity commands, and dispatches of workflows listed in </w:t>
+            </w:r>
+            <w:r>
+              <w:rPr>
+                <w:rStyle w:val="SourceText"/>
+              </w:rPr>
+              <w:t>environments.workflows</w:t>
+            </w:r>
+            <w:r>
+              <w:rPr/>
+              <w:t xml:space="preserve"> (</w:t>
+            </w:r>
+            <w:r>
+              <w:rPr>
+                <w:rStyle w:val="SourceText"/>
+              </w:rPr>
+              <w:t>guards.deployWorkflow</w:t>
+            </w:r>
+            <w:r>
+              <w:rPr/>
+              <w:t>) — judged only when every word on the line is a plain literal or a single-quoted word; anything else asks, and is refused unattended</w:t>
+            </w:r>
+          </w:p>
+        </w:tc>
+        <w:tc>
+          <w:tcPr>
+            <w:tcW w:w="3395" w:type="dxa"/>
             <w:tcBorders/>
             <w:vAlign w:val="center"/>
           </w:tcPr>
@@ -1863,7 +1883,7 @@
               <w:rPr>
                 <w:rStyle w:val="SourceText"/>
               </w:rPr>
-              <w:t>Write</w:t>
+              <w:t>Bash</w:t>
             </w:r>
             <w:r>
               <w:rPr/>
@@ -1873,46 +1893,6 @@
               <w:rPr>
                 <w:rStyle w:val="SourceText"/>
               </w:rPr>
-              <w:t>Edit</w:t>
-            </w:r>
-            <w:r>
-              <w:rPr/>
-              <w:t>|</w:t>
-            </w:r>
-            <w:r>
-              <w:rPr>
-                <w:rStyle w:val="SourceText"/>
-              </w:rPr>
-              <w:t>MultiEdit</w:t>
-            </w:r>
-            <w:r>
-              <w:rPr/>
-              <w:t>|</w:t>
-            </w:r>
-            <w:r>
-              <w:rPr>
-                <w:rStyle w:val="SourceText"/>
-              </w:rPr>
-              <w:t>NotebookEdit</w:t>
-            </w:r>
-            <w:r>
-              <w:rPr/>
-              <w:t>|</w:t>
-            </w:r>
-            <w:r>
-              <w:rPr>
-                <w:rStyle w:val="SourceText"/>
-              </w:rPr>
-              <w:t>Bash</w:t>
-            </w:r>
-            <w:r>
-              <w:rPr/>
-              <w:t>|</w:t>
-            </w:r>
-            <w:r>
-              <w:rPr>
-                <w:rStyle w:val="SourceText"/>
-              </w:rPr>
               <w:t>PowerShell</w:t>
             </w:r>
             <w:r>
@@ -1940,101 +1920,89 @@
               <w:rPr>
                 <w:rStyle w:val="SourceText"/>
               </w:rPr>
-              <w:t>scope-guard.sh</w:t>
-            </w:r>
-          </w:p>
-        </w:tc>
-        <w:tc>
-          <w:tcPr>
-            <w:tcW w:w="2022" w:type="dxa"/>
-            <w:tcBorders/>
-            <w:vAlign w:val="center"/>
-          </w:tcPr>
-          <w:p>
-            <w:pPr>
-              <w:pStyle w:val="TableContents"/>
-              <w:shd w:fill="2E3440" w:val="clear"/>
-              <w:bidi w:val="0"/>
-              <w:spacing w:before="120" w:after="120"/>
-              <w:jc w:val="left"/>
-              <w:rPr/>
-            </w:pPr>
-            <w:r>
-              <w:rPr/>
-              <w:t>plan-approval + ticket scope guard</w:t>
-            </w:r>
-          </w:p>
-        </w:tc>
-        <w:tc>
-          <w:tcPr>
-            <w:tcW w:w="2986" w:type="dxa"/>
-            <w:tcBorders/>
-            <w:vAlign w:val="center"/>
-          </w:tcPr>
-          <w:p>
-            <w:pPr>
-              <w:pStyle w:val="TableContents"/>
-              <w:shd w:fill="2E3440" w:val="clear"/>
-              <w:bidi w:val="0"/>
-              <w:spacing w:before="120" w:after="120"/>
-              <w:jc w:val="left"/>
-              <w:rPr/>
-            </w:pPr>
-            <w:r>
-              <w:rPr>
-                <w:rStyle w:val="SourceText"/>
-              </w:rPr>
-              <w:t>scope.mode</w:t>
-            </w:r>
-            <w:r>
-              <w:rPr/>
-              <w:t xml:space="preserve"> (</w:t>
-            </w:r>
-            <w:r>
-              <w:rPr>
-                <w:rStyle w:val="SourceText"/>
-              </w:rPr>
-              <w:t>off</w:t>
-            </w:r>
-            <w:r>
-              <w:rPr/>
-              <w:t>/</w:t>
-            </w:r>
-            <w:r>
-              <w:rPr>
-                <w:rStyle w:val="SourceText"/>
-              </w:rPr>
-              <w:t>report</w:t>
-            </w:r>
-            <w:r>
-              <w:rPr/>
-              <w:t>/</w:t>
-            </w:r>
-            <w:r>
-              <w:rPr>
-                <w:rStyle w:val="SourceText"/>
-              </w:rPr>
-              <w:t>block</w:t>
-            </w:r>
-            <w:r>
-              <w:rPr/>
-              <w:t>/</w:t>
-            </w:r>
-            <w:r>
-              <w:rPr>
-                <w:rStyle w:val="SourceText"/>
-              </w:rPr>
-              <w:t>auto</w:t>
-            </w:r>
-            <w:r>
-              <w:rPr/>
-              <w:t xml:space="preserve">), </w:t>
-            </w:r>
-            <w:r>
-              <w:rPr>
-                <w:rStyle w:val="SourceText"/>
-              </w:rPr>
-              <w:t>scope.allowCliApproval</w:t>
+              <w:t>cloud-guard.sh</w:t>
+            </w:r>
+            <w:r>
+              <w:rPr/>
+              <w:t>, environment layer (T-0005)</w:t>
+            </w:r>
+          </w:p>
+        </w:tc>
+        <w:tc>
+          <w:tcPr>
+            <w:tcW w:w="2808" w:type="dxa"/>
+            <w:tcBorders/>
+            <w:vAlign w:val="center"/>
+          </w:tcPr>
+          <w:p>
+            <w:pPr>
+              <w:pStyle w:val="TableContents"/>
+              <w:shd w:fill="2E3440" w:val="clear"/>
+              <w:bidi w:val="0"/>
+              <w:spacing w:before="120" w:after="120"/>
+              <w:jc w:val="left"/>
+              <w:rPr/>
+            </w:pPr>
+            <w:r>
+              <w:rPr/>
+              <w:t>a terraform apply judged by its target environment, and a destroy never applied unattended</w:t>
+            </w:r>
+          </w:p>
+        </w:tc>
+        <w:tc>
+          <w:tcPr>
+            <w:tcW w:w="3395" w:type="dxa"/>
+            <w:tcBorders/>
+            <w:vAlign w:val="center"/>
+          </w:tcPr>
+          <w:p>
+            <w:pPr>
+              <w:pStyle w:val="TableContents"/>
+              <w:shd w:fill="2E3440" w:val="clear"/>
+              <w:bidi w:val="0"/>
+              <w:spacing w:before="120" w:after="120"/>
+              <w:jc w:val="left"/>
+              <w:rPr/>
+            </w:pPr>
+            <w:r>
+              <w:rPr>
+                <w:rStyle w:val="SourceText"/>
+              </w:rPr>
+              <w:t>environments.nonProd</w:t>
+            </w:r>
+            <w:r>
+              <w:rPr/>
+              <w:t xml:space="preserve"> (repo only; globs naming non-production workspaces), </w:t>
+            </w:r>
+            <w:r>
+              <w:rPr>
+                <w:rStyle w:val="SourceText"/>
+              </w:rPr>
+              <w:t>environments.prodUnattended</w:t>
+            </w:r>
+            <w:r>
+              <w:rPr/>
+              <w:t xml:space="preserve"> (both layers; true only when </w:t>
+            </w:r>
+            <w:r>
+              <w:rPr>
+                <w:rStyle w:val="Strong"/>
+              </w:rPr>
+              <w:t>both</w:t>
+            </w:r>
+            <w:r>
+              <w:rPr/>
+              <w:t xml:space="preserve"> say </w:t>
+            </w:r>
+            <w:r>
+              <w:rPr>
+                <w:rStyle w:val="SourceText"/>
+              </w:rPr>
+              <w:t>true</w:t>
+            </w:r>
+            <w:r>
+              <w:rPr/>
+              <w:t>)</w:t>
             </w:r>
           </w:p>
         </w:tc>
@@ -2057,7 +2025,7 @@
               <w:rPr>
                 <w:rStyle w:val="SourceText"/>
               </w:rPr>
-              <w:t>off</w:t>
+              <w:t>[]</w:t>
             </w:r>
             <w:r>
               <w:rPr/>
@@ -2093,7 +2061,71 @@
               <w:rPr>
                 <w:rStyle w:val="SourceText"/>
               </w:rPr>
-              <w:t>PreCompact</w:t>
+              <w:t>PreToolUse</w:t>
+            </w:r>
+            <w:r>
+              <w:rPr/>
+              <w:t xml:space="preserve"> (</w:t>
+            </w:r>
+            <w:r>
+              <w:rPr>
+                <w:rStyle w:val="SourceText"/>
+              </w:rPr>
+              <w:t>Write</w:t>
+            </w:r>
+            <w:r>
+              <w:rPr/>
+              <w:t>|</w:t>
+            </w:r>
+            <w:r>
+              <w:rPr>
+                <w:rStyle w:val="SourceText"/>
+              </w:rPr>
+              <w:t>Edit</w:t>
+            </w:r>
+            <w:r>
+              <w:rPr/>
+              <w:t>|</w:t>
+            </w:r>
+            <w:r>
+              <w:rPr>
+                <w:rStyle w:val="SourceText"/>
+              </w:rPr>
+              <w:t>MultiEdit</w:t>
+            </w:r>
+            <w:r>
+              <w:rPr/>
+              <w:t>|</w:t>
+            </w:r>
+            <w:r>
+              <w:rPr>
+                <w:rStyle w:val="SourceText"/>
+              </w:rPr>
+              <w:t>NotebookEdit</w:t>
+            </w:r>
+            <w:r>
+              <w:rPr/>
+              <w:t>|</w:t>
+            </w:r>
+            <w:r>
+              <w:rPr>
+                <w:rStyle w:val="SourceText"/>
+              </w:rPr>
+              <w:t>Bash</w:t>
+            </w:r>
+            <w:r>
+              <w:rPr/>
+              <w:t>|</w:t>
+            </w:r>
+            <w:r>
+              <w:rPr>
+                <w:rStyle w:val="SourceText"/>
+              </w:rPr>
+              <w:t>PowerShell</w:t>
+            </w:r>
+            <w:r>
+              <w:rPr/>
+              <w:t>)</w:t>
             </w:r>
           </w:p>
         </w:tc>
@@ -2116,51 +2148,124 @@
               <w:rPr>
                 <w:rStyle w:val="SourceText"/>
               </w:rPr>
-              <w:t>handoff-write.sh</w:t>
-            </w:r>
-          </w:p>
-        </w:tc>
-        <w:tc>
-          <w:tcPr>
-            <w:tcW w:w="2022" w:type="dxa"/>
-            <w:tcBorders/>
-            <w:vAlign w:val="center"/>
-          </w:tcPr>
-          <w:p>
-            <w:pPr>
-              <w:pStyle w:val="TableContents"/>
-              <w:shd w:fill="2E3440" w:val="clear"/>
-              <w:bidi w:val="0"/>
-              <w:spacing w:before="120" w:after="120"/>
-              <w:jc w:val="left"/>
-              <w:rPr/>
-            </w:pPr>
-            <w:r>
-              <w:rPr/>
-              <w:t>writes the handoff note before compaction</w:t>
-            </w:r>
-          </w:p>
-        </w:tc>
-        <w:tc>
-          <w:tcPr>
-            <w:tcW w:w="2986" w:type="dxa"/>
-            <w:tcBorders/>
-            <w:vAlign w:val="center"/>
-          </w:tcPr>
-          <w:p>
-            <w:pPr>
-              <w:pStyle w:val="TableContents"/>
-              <w:shd w:fill="2E3440" w:val="clear"/>
-              <w:bidi w:val="0"/>
-              <w:spacing w:before="120" w:after="120"/>
-              <w:jc w:val="left"/>
-              <w:rPr/>
-            </w:pPr>
-            <w:r>
-              <w:rPr>
-                <w:rStyle w:val="SourceText"/>
-              </w:rPr>
-              <w:t>context.autoWrapUp</w:t>
+              <w:t>scope-guard.sh</w:t>
+            </w:r>
+          </w:p>
+        </w:tc>
+        <w:tc>
+          <w:tcPr>
+            <w:tcW w:w="2808" w:type="dxa"/>
+            <w:tcBorders/>
+            <w:vAlign w:val="center"/>
+          </w:tcPr>
+          <w:p>
+            <w:pPr>
+              <w:pStyle w:val="TableContents"/>
+              <w:shd w:fill="2E3440" w:val="clear"/>
+              <w:bidi w:val="0"/>
+              <w:spacing w:before="120" w:after="120"/>
+              <w:jc w:val="left"/>
+              <w:rPr/>
+            </w:pPr>
+            <w:r>
+              <w:rPr/>
+              <w:t>plan-approval + ticket scope guard</w:t>
+            </w:r>
+          </w:p>
+        </w:tc>
+        <w:tc>
+          <w:tcPr>
+            <w:tcW w:w="3395" w:type="dxa"/>
+            <w:tcBorders/>
+            <w:vAlign w:val="center"/>
+          </w:tcPr>
+          <w:p>
+            <w:pPr>
+              <w:pStyle w:val="TableContents"/>
+              <w:shd w:fill="2E3440" w:val="clear"/>
+              <w:bidi w:val="0"/>
+              <w:spacing w:before="120" w:after="120"/>
+              <w:jc w:val="left"/>
+              <w:rPr/>
+            </w:pPr>
+            <w:r>
+              <w:rPr>
+                <w:rStyle w:val="SourceText"/>
+              </w:rPr>
+              <w:t>scope.mode</w:t>
+            </w:r>
+            <w:r>
+              <w:rPr/>
+              <w:t xml:space="preserve"> (</w:t>
+            </w:r>
+            <w:r>
+              <w:rPr>
+                <w:rStyle w:val="SourceText"/>
+              </w:rPr>
+              <w:t>off</w:t>
+            </w:r>
+            <w:r>
+              <w:rPr/>
+              <w:t>/</w:t>
+            </w:r>
+            <w:r>
+              <w:rPr>
+                <w:rStyle w:val="SourceText"/>
+              </w:rPr>
+              <w:t>report</w:t>
+            </w:r>
+            <w:r>
+              <w:rPr/>
+              <w:t>/</w:t>
+            </w:r>
+            <w:r>
+              <w:rPr>
+                <w:rStyle w:val="SourceText"/>
+              </w:rPr>
+              <w:t>block</w:t>
+            </w:r>
+            <w:r>
+              <w:rPr/>
+              <w:t>/</w:t>
+            </w:r>
+            <w:r>
+              <w:rPr>
+                <w:rStyle w:val="SourceText"/>
+              </w:rPr>
+              <w:t>auto</w:t>
+            </w:r>
+            <w:r>
+              <w:rPr/>
+              <w:t xml:space="preserve">), </w:t>
+            </w:r>
+            <w:r>
+              <w:rPr>
+                <w:rStyle w:val="SourceText"/>
+              </w:rPr>
+              <w:t>scope.allowCliApproval</w:t>
+            </w:r>
+          </w:p>
+        </w:tc>
+        <w:tc>
+          <w:tcPr>
+            <w:tcW w:w="2148" w:type="dxa"/>
+            <w:tcBorders/>
+            <w:vAlign w:val="center"/>
+          </w:tcPr>
+          <w:p>
+            <w:pPr>
+              <w:pStyle w:val="TableContents"/>
+              <w:shd w:fill="2E3440" w:val="clear"/>
+              <w:bidi w:val="0"/>
+              <w:spacing w:before="120" w:after="120"/>
+              <w:jc w:val="left"/>
+              <w:rPr/>
+            </w:pPr>
+            <w:r>
+              <w:rPr>
+                <w:rStyle w:val="SourceText"/>
+              </w:rPr>
+              <w:t>off</w:t>
             </w:r>
             <w:r>
               <w:rPr/>
@@ -2170,28 +2275,7 @@
               <w:rPr>
                 <w:rStyle w:val="SourceText"/>
               </w:rPr>
-              <w:t>context.handoffPath</w:t>
-            </w:r>
-          </w:p>
-        </w:tc>
-        <w:tc>
-          <w:tcPr>
-            <w:tcW w:w="2148" w:type="dxa"/>
-            <w:tcBorders/>
-            <w:vAlign w:val="center"/>
-          </w:tcPr>
-          <w:p>
-            <w:pPr>
-              <w:pStyle w:val="TableContents"/>
-              <w:shd w:fill="2E3440" w:val="clear"/>
-              <w:bidi w:val="0"/>
-              <w:spacing w:before="120" w:after="120"/>
-              <w:jc w:val="left"/>
-              <w:rPr/>
-            </w:pPr>
-            <w:r>
-              <w:rPr/>
-              <w:t>on</w:t>
+              <w:t>false</w:t>
             </w:r>
           </w:p>
         </w:tc>
@@ -2217,7 +2301,7 @@
               <w:rPr>
                 <w:rStyle w:val="SourceText"/>
               </w:rPr>
-              <w:t>Notification</w:t>
+              <w:t>PreCompact</w:t>
             </w:r>
           </w:p>
         </w:tc>
@@ -2240,71 +2324,61 @@
               <w:rPr>
                 <w:rStyle w:val="SourceText"/>
               </w:rPr>
-              <w:t>notify.sh</w:t>
-            </w:r>
-          </w:p>
-        </w:tc>
-        <w:tc>
-          <w:tcPr>
-            <w:tcW w:w="2022" w:type="dxa"/>
-            <w:tcBorders/>
-            <w:vAlign w:val="center"/>
-          </w:tcPr>
-          <w:p>
-            <w:pPr>
-              <w:pStyle w:val="TableContents"/>
-              <w:shd w:fill="2E3440" w:val="clear"/>
-              <w:bidi w:val="0"/>
-              <w:spacing w:before="120" w:after="120"/>
-              <w:jc w:val="left"/>
-              <w:rPr/>
-            </w:pPr>
-            <w:r>
-              <w:rPr/>
-              <w:t>pings an external channel</w:t>
-            </w:r>
-          </w:p>
-        </w:tc>
-        <w:tc>
-          <w:tcPr>
-            <w:tcW w:w="2986" w:type="dxa"/>
-            <w:tcBorders/>
-            <w:vAlign w:val="center"/>
-          </w:tcPr>
-          <w:p>
-            <w:pPr>
-              <w:pStyle w:val="TableContents"/>
-              <w:shd w:fill="2E3440" w:val="clear"/>
-              <w:bidi w:val="0"/>
-              <w:spacing w:before="120" w:after="120"/>
-              <w:jc w:val="left"/>
-              <w:rPr/>
-            </w:pPr>
-            <w:r>
-              <w:rPr>
-                <w:rStyle w:val="SourceText"/>
-              </w:rPr>
-              <w:t>notify.provider</w:t>
-            </w:r>
-            <w:r>
-              <w:rPr/>
-              <w:t xml:space="preserve"> (</w:t>
-            </w:r>
-            <w:r>
-              <w:rPr>
-                <w:rStyle w:val="SourceText"/>
-              </w:rPr>
-              <w:t>none</w:t>
-            </w:r>
-            <w:r>
-              <w:rPr/>
-              <w:t xml:space="preserve"> disables it), </w:t>
-            </w:r>
-            <w:r>
-              <w:rPr>
-                <w:rStyle w:val="SourceText"/>
-              </w:rPr>
-              <w:t>notify.events</w:t>
+              <w:t>handoff-write.sh</w:t>
+            </w:r>
+          </w:p>
+        </w:tc>
+        <w:tc>
+          <w:tcPr>
+            <w:tcW w:w="2808" w:type="dxa"/>
+            <w:tcBorders/>
+            <w:vAlign w:val="center"/>
+          </w:tcPr>
+          <w:p>
+            <w:pPr>
+              <w:pStyle w:val="TableContents"/>
+              <w:shd w:fill="2E3440" w:val="clear"/>
+              <w:bidi w:val="0"/>
+              <w:spacing w:before="120" w:after="120"/>
+              <w:jc w:val="left"/>
+              <w:rPr/>
+            </w:pPr>
+            <w:r>
+              <w:rPr/>
+              <w:t>writes the handoff note before compaction</w:t>
+            </w:r>
+          </w:p>
+        </w:tc>
+        <w:tc>
+          <w:tcPr>
+            <w:tcW w:w="3395" w:type="dxa"/>
+            <w:tcBorders/>
+            <w:vAlign w:val="center"/>
+          </w:tcPr>
+          <w:p>
+            <w:pPr>
+              <w:pStyle w:val="TableContents"/>
+              <w:shd w:fill="2E3440" w:val="clear"/>
+              <w:bidi w:val="0"/>
+              <w:spacing w:before="120" w:after="120"/>
+              <w:jc w:val="left"/>
+              <w:rPr/>
+            </w:pPr>
+            <w:r>
+              <w:rPr>
+                <w:rStyle w:val="SourceText"/>
+              </w:rPr>
+              <w:t>context.autoWrapUp</w:t>
+            </w:r>
+            <w:r>
+              <w:rPr/>
+              <w:t xml:space="preserve">, </w:t>
+            </w:r>
+            <w:r>
+              <w:rPr>
+                <w:rStyle w:val="SourceText"/>
+              </w:rPr>
+              <w:t>context.handoffPath</w:t>
             </w:r>
           </w:p>
         </w:tc>
@@ -2324,10 +2398,8 @@
               <w:rPr/>
             </w:pPr>
             <w:r>
-              <w:rPr>
-                <w:rStyle w:val="SourceText"/>
-              </w:rPr>
-              <w:t>none</w:t>
+              <w:rPr/>
+              <w:t>on</w:t>
             </w:r>
           </w:p>
         </w:tc>
@@ -2353,7 +2425,7 @@
               <w:rPr>
                 <w:rStyle w:val="SourceText"/>
               </w:rPr>
-              <w:t>Stop</w:t>
+              <w:t>Notification</w:t>
             </w:r>
           </w:p>
         </w:tc>
@@ -2376,65 +2448,71 @@
               <w:rPr>
                 <w:rStyle w:val="SourceText"/>
               </w:rPr>
-              <w:t>verify-gate.sh</w:t>
-            </w:r>
-          </w:p>
-        </w:tc>
-        <w:tc>
-          <w:tcPr>
-            <w:tcW w:w="2022" w:type="dxa"/>
-            <w:tcBorders/>
-            <w:vAlign w:val="center"/>
-          </w:tcPr>
-          <w:p>
-            <w:pPr>
-              <w:pStyle w:val="TableContents"/>
-              <w:shd w:fill="2E3440" w:val="clear"/>
-              <w:bidi w:val="0"/>
-              <w:spacing w:before="120" w:after="120"/>
-              <w:jc w:val="left"/>
-              <w:rPr/>
-            </w:pPr>
-            <w:r>
-              <w:rPr/>
-              <w:t xml:space="preserve">runs </w:t>
-            </w:r>
-            <w:r>
-              <w:rPr>
-                <w:rStyle w:val="SourceText"/>
-              </w:rPr>
-              <w:t>.crew/verify.json</w:t>
-            </w:r>
-            <w:r>
-              <w:rPr/>
-              <w:t>'s checks</w:t>
-            </w:r>
-          </w:p>
-        </w:tc>
-        <w:tc>
-          <w:tcPr>
-            <w:tcW w:w="2986" w:type="dxa"/>
-            <w:tcBorders/>
-            <w:vAlign w:val="center"/>
-          </w:tcPr>
-          <w:p>
-            <w:pPr>
-              <w:pStyle w:val="TableContents"/>
-              <w:shd w:fill="2E3440" w:val="clear"/>
-              <w:bidi w:val="0"/>
-              <w:spacing w:before="120" w:after="120"/>
-              <w:jc w:val="left"/>
-              <w:rPr/>
-            </w:pPr>
-            <w:r>
-              <w:rPr>
-                <w:rStyle w:val="SourceText"/>
-              </w:rPr>
-              <w:t>verifyGate</w:t>
-            </w:r>
-            <w:r>
-              <w:rPr/>
-              <w:t xml:space="preserve"> (boolean)</w:t>
+              <w:t>notify.sh</w:t>
+            </w:r>
+          </w:p>
+        </w:tc>
+        <w:tc>
+          <w:tcPr>
+            <w:tcW w:w="2808" w:type="dxa"/>
+            <w:tcBorders/>
+            <w:vAlign w:val="center"/>
+          </w:tcPr>
+          <w:p>
+            <w:pPr>
+              <w:pStyle w:val="TableContents"/>
+              <w:shd w:fill="2E3440" w:val="clear"/>
+              <w:bidi w:val="0"/>
+              <w:spacing w:before="120" w:after="120"/>
+              <w:jc w:val="left"/>
+              <w:rPr/>
+            </w:pPr>
+            <w:r>
+              <w:rPr/>
+              <w:t>pings an external channel</w:t>
+            </w:r>
+          </w:p>
+        </w:tc>
+        <w:tc>
+          <w:tcPr>
+            <w:tcW w:w="3395" w:type="dxa"/>
+            <w:tcBorders/>
+            <w:vAlign w:val="center"/>
+          </w:tcPr>
+          <w:p>
+            <w:pPr>
+              <w:pStyle w:val="TableContents"/>
+              <w:shd w:fill="2E3440" w:val="clear"/>
+              <w:bidi w:val="0"/>
+              <w:spacing w:before="120" w:after="120"/>
+              <w:jc w:val="left"/>
+              <w:rPr/>
+            </w:pPr>
+            <w:r>
+              <w:rPr>
+                <w:rStyle w:val="SourceText"/>
+              </w:rPr>
+              <w:t>notify.provider</w:t>
+            </w:r>
+            <w:r>
+              <w:rPr/>
+              <w:t xml:space="preserve"> (</w:t>
+            </w:r>
+            <w:r>
+              <w:rPr>
+                <w:rStyle w:val="SourceText"/>
+              </w:rPr>
+              <w:t>none</w:t>
+            </w:r>
+            <w:r>
+              <w:rPr/>
+              <w:t xml:space="preserve"> disables it), </w:t>
+            </w:r>
+            <w:r>
+              <w:rPr>
+                <w:rStyle w:val="SourceText"/>
+              </w:rPr>
+              <w:t>notify.events</w:t>
             </w:r>
           </w:p>
         </w:tc>
@@ -2457,7 +2535,7 @@
               <w:rPr>
                 <w:rStyle w:val="SourceText"/>
               </w:rPr>
-              <w:t>true</w:t>
+              <w:t>none</w:t>
             </w:r>
           </w:p>
         </w:tc>
@@ -2506,91 +2584,65 @@
               <w:rPr>
                 <w:rStyle w:val="SourceText"/>
               </w:rPr>
-              <w:t>context-watch.sh</w:t>
-            </w:r>
-          </w:p>
-        </w:tc>
-        <w:tc>
-          <w:tcPr>
-            <w:tcW w:w="2022" w:type="dxa"/>
-            <w:tcBorders/>
-            <w:vAlign w:val="center"/>
-          </w:tcPr>
-          <w:p>
-            <w:pPr>
-              <w:pStyle w:val="TableContents"/>
-              <w:shd w:fill="2E3440" w:val="clear"/>
-              <w:bidi w:val="0"/>
-              <w:spacing w:before="120" w:after="120"/>
-              <w:jc w:val="left"/>
-              <w:rPr/>
-            </w:pPr>
-            <w:r>
-              <w:rPr/>
-              <w:t>nags for a handoff near the context budget, drives auto-clear</w:t>
-            </w:r>
-          </w:p>
-        </w:tc>
-        <w:tc>
-          <w:tcPr>
-            <w:tcW w:w="2986" w:type="dxa"/>
-            <w:tcBorders/>
-            <w:vAlign w:val="center"/>
-          </w:tcPr>
-          <w:p>
-            <w:pPr>
-              <w:pStyle w:val="TableContents"/>
-              <w:shd w:fill="2E3440" w:val="clear"/>
-              <w:bidi w:val="0"/>
-              <w:spacing w:before="120" w:after="120"/>
-              <w:jc w:val="left"/>
-              <w:rPr/>
-            </w:pPr>
-            <w:r>
-              <w:rPr>
-                <w:rStyle w:val="SourceText"/>
-              </w:rPr>
-              <w:t>context.enabled</w:t>
-            </w:r>
-            <w:r>
-              <w:rPr/>
-              <w:t xml:space="preserve">, </w:t>
-            </w:r>
-            <w:r>
-              <w:rPr>
-                <w:rStyle w:val="SourceText"/>
-              </w:rPr>
-              <w:t>context.warnAt</w:t>
-            </w:r>
-            <w:r>
-              <w:rPr/>
-              <w:t xml:space="preserve">, </w:t>
-            </w:r>
-            <w:r>
-              <w:rPr>
-                <w:rStyle w:val="SourceText"/>
-              </w:rPr>
-              <w:t>context.budgetTokens</w:t>
-            </w:r>
-            <w:r>
-              <w:rPr/>
-              <w:t xml:space="preserve">, </w:t>
-            </w:r>
-            <w:r>
-              <w:rPr>
-                <w:rStyle w:val="SourceText"/>
-              </w:rPr>
-              <w:t>context.reserveTokens</w:t>
-            </w:r>
-            <w:r>
-              <w:rPr/>
-              <w:t xml:space="preserve">, </w:t>
-            </w:r>
-            <w:r>
-              <w:rPr>
-                <w:rStyle w:val="SourceText"/>
-              </w:rPr>
-              <w:t>context.autoClear.*</w:t>
+              <w:t>verify-gate.sh</w:t>
+            </w:r>
+          </w:p>
+        </w:tc>
+        <w:tc>
+          <w:tcPr>
+            <w:tcW w:w="2808" w:type="dxa"/>
+            <w:tcBorders/>
+            <w:vAlign w:val="center"/>
+          </w:tcPr>
+          <w:p>
+            <w:pPr>
+              <w:pStyle w:val="TableContents"/>
+              <w:shd w:fill="2E3440" w:val="clear"/>
+              <w:bidi w:val="0"/>
+              <w:spacing w:before="120" w:after="120"/>
+              <w:jc w:val="left"/>
+              <w:rPr/>
+            </w:pPr>
+            <w:r>
+              <w:rPr/>
+              <w:t xml:space="preserve">runs </w:t>
+            </w:r>
+            <w:r>
+              <w:rPr>
+                <w:rStyle w:val="SourceText"/>
+              </w:rPr>
+              <w:t>.crew/verify.json</w:t>
+            </w:r>
+            <w:r>
+              <w:rPr/>
+              <w:t>'s checks</w:t>
+            </w:r>
+          </w:p>
+        </w:tc>
+        <w:tc>
+          <w:tcPr>
+            <w:tcW w:w="3395" w:type="dxa"/>
+            <w:tcBorders/>
+            <w:vAlign w:val="center"/>
+          </w:tcPr>
+          <w:p>
+            <w:pPr>
+              <w:pStyle w:val="TableContents"/>
+              <w:shd w:fill="2E3440" w:val="clear"/>
+              <w:bidi w:val="0"/>
+              <w:spacing w:before="120" w:after="120"/>
+              <w:jc w:val="left"/>
+              <w:rPr/>
+            </w:pPr>
+            <w:r>
+              <w:rPr>
+                <w:rStyle w:val="SourceText"/>
+              </w:rPr>
+              <w:t>verifyGate</w:t>
+            </w:r>
+            <w:r>
+              <w:rPr/>
+              <w:t xml:space="preserve"> (boolean)</w:t>
             </w:r>
           </w:p>
         </w:tc>
@@ -2610,14 +2662,10 @@
               <w:rPr/>
             </w:pPr>
             <w:r>
-              <w:rPr/>
-              <w:t xml:space="preserve">on, </w:t>
-            </w:r>
-            <w:r>
-              <w:rPr>
-                <w:rStyle w:val="SourceText"/>
-              </w:rPr>
-              <w:t>warnAt: 0.5</w:t>
+              <w:rPr>
+                <w:rStyle w:val="SourceText"/>
+              </w:rPr>
+              <w:t>true</w:t>
             </w:r>
           </w:p>
         </w:tc>
@@ -2666,13 +2714,173 @@
               <w:rPr>
                 <w:rStyle w:val="SourceText"/>
               </w:rPr>
+              <w:t>context-watch.sh</w:t>
+            </w:r>
+          </w:p>
+        </w:tc>
+        <w:tc>
+          <w:tcPr>
+            <w:tcW w:w="2808" w:type="dxa"/>
+            <w:tcBorders/>
+            <w:vAlign w:val="center"/>
+          </w:tcPr>
+          <w:p>
+            <w:pPr>
+              <w:pStyle w:val="TableContents"/>
+              <w:shd w:fill="2E3440" w:val="clear"/>
+              <w:bidi w:val="0"/>
+              <w:spacing w:before="120" w:after="120"/>
+              <w:jc w:val="left"/>
+              <w:rPr/>
+            </w:pPr>
+            <w:r>
+              <w:rPr/>
+              <w:t>nags for a handoff near the context budget, drives auto-clear</w:t>
+            </w:r>
+          </w:p>
+        </w:tc>
+        <w:tc>
+          <w:tcPr>
+            <w:tcW w:w="3395" w:type="dxa"/>
+            <w:tcBorders/>
+            <w:vAlign w:val="center"/>
+          </w:tcPr>
+          <w:p>
+            <w:pPr>
+              <w:pStyle w:val="TableContents"/>
+              <w:shd w:fill="2E3440" w:val="clear"/>
+              <w:bidi w:val="0"/>
+              <w:spacing w:before="120" w:after="120"/>
+              <w:jc w:val="left"/>
+              <w:rPr/>
+            </w:pPr>
+            <w:r>
+              <w:rPr>
+                <w:rStyle w:val="SourceText"/>
+              </w:rPr>
+              <w:t>context.enabled</w:t>
+            </w:r>
+            <w:r>
+              <w:rPr/>
+              <w:t xml:space="preserve">, </w:t>
+            </w:r>
+            <w:r>
+              <w:rPr>
+                <w:rStyle w:val="SourceText"/>
+              </w:rPr>
+              <w:t>context.warnAt</w:t>
+            </w:r>
+            <w:r>
+              <w:rPr/>
+              <w:t xml:space="preserve">, </w:t>
+            </w:r>
+            <w:r>
+              <w:rPr>
+                <w:rStyle w:val="SourceText"/>
+              </w:rPr>
+              <w:t>context.budgetTokens</w:t>
+            </w:r>
+            <w:r>
+              <w:rPr/>
+              <w:t xml:space="preserve">, </w:t>
+            </w:r>
+            <w:r>
+              <w:rPr>
+                <w:rStyle w:val="SourceText"/>
+              </w:rPr>
+              <w:t>context.reserveTokens</w:t>
+            </w:r>
+            <w:r>
+              <w:rPr/>
+              <w:t xml:space="preserve">, </w:t>
+            </w:r>
+            <w:r>
+              <w:rPr>
+                <w:rStyle w:val="SourceText"/>
+              </w:rPr>
+              <w:t>context.autoClear.*</w:t>
+            </w:r>
+          </w:p>
+        </w:tc>
+        <w:tc>
+          <w:tcPr>
+            <w:tcW w:w="2148" w:type="dxa"/>
+            <w:tcBorders/>
+            <w:vAlign w:val="center"/>
+          </w:tcPr>
+          <w:p>
+            <w:pPr>
+              <w:pStyle w:val="TableContents"/>
+              <w:shd w:fill="2E3440" w:val="clear"/>
+              <w:bidi w:val="0"/>
+              <w:spacing w:before="120" w:after="120"/>
+              <w:jc w:val="left"/>
+              <w:rPr/>
+            </w:pPr>
+            <w:r>
+              <w:rPr/>
+              <w:t xml:space="preserve">on, </w:t>
+            </w:r>
+            <w:r>
+              <w:rPr>
+                <w:rStyle w:val="SourceText"/>
+              </w:rPr>
+              <w:t>warnAt: 0.5</w:t>
+            </w:r>
+          </w:p>
+        </w:tc>
+      </w:tr>
+      <w:tr>
+        <w:trPr/>
+        <w:tc>
+          <w:tcPr>
+            <w:tcW w:w="2119" w:type="dxa"/>
+            <w:tcBorders/>
+            <w:vAlign w:val="center"/>
+          </w:tcPr>
+          <w:p>
+            <w:pPr>
+              <w:pStyle w:val="TableContents"/>
+              <w:shd w:fill="2E3440" w:val="clear"/>
+              <w:bidi w:val="0"/>
+              <w:spacing w:before="120" w:after="120"/>
+              <w:jc w:val="left"/>
+              <w:rPr/>
+            </w:pPr>
+            <w:r>
+              <w:rPr>
+                <w:rStyle w:val="SourceText"/>
+              </w:rPr>
+              <w:t>Stop</w:t>
+            </w:r>
+          </w:p>
+        </w:tc>
+        <w:tc>
+          <w:tcPr>
+            <w:tcW w:w="2456" w:type="dxa"/>
+            <w:tcBorders/>
+            <w:vAlign w:val="center"/>
+          </w:tcPr>
+          <w:p>
+            <w:pPr>
+              <w:pStyle w:val="TableContents"/>
+              <w:shd w:fill="2E3440" w:val="clear"/>
+              <w:bidi w:val="0"/>
+              <w:spacing w:before="120" w:after="120"/>
+              <w:jc w:val="left"/>
+              <w:rPr/>
+            </w:pPr>
+            <w:r>
+              <w:rPr>
+                <w:rStyle w:val="SourceText"/>
+              </w:rPr>
               <w:t>completion-audit.sh</w:t>
             </w:r>
           </w:p>
         </w:tc>
         <w:tc>
           <w:tcPr>
-            <w:tcW w:w="2022" w:type="dxa"/>
+            <w:tcW w:w="2808" w:type="dxa"/>
             <w:tcBorders/>
             <w:vAlign w:val="center"/>
           </w:tcPr>
@@ -2693,7 +2901,7 @@
         </w:tc>
         <w:tc>
           <w:tcPr>
-            <w:tcW w:w="2986" w:type="dxa"/>
+            <w:tcW w:w="3395" w:type="dxa"/>
             <w:tcBorders/>
             <w:vAlign w:val="center"/>
           </w:tcPr>
@@ -3420,11 +3628,21 @@
         <w:rPr>
           <w:rStyle w:val="SourceText"/>
         </w:rPr>
+        <w:t>ignored_text</w:t>
+      </w:r>
+      <w:r>
+        <w:rPr/>
+        <w:t xml:space="preserve"> (</w:t>
+      </w:r>
+      <w:r>
+        <w:rPr>
+          <w:rStyle w:val="SourceText"/>
+        </w:rPr>
         <w:t>ignored_lines</w:t>
       </w:r>
       <w:r>
         <w:rPr/>
-        <w:t xml:space="preserve">. A stray line beside </w:t>
+        <w:t xml:space="preserve"> is their count). A stray line beside </w:t>
       </w:r>
       <w:r>
         <w:rPr>
@@ -6321,7 +6539,394 @@
       </w:r>
       <w:r>
         <w:rPr/>
-        <w:t xml:space="preserve"> mode while testing, or approve the one-shot marker the deny message names.</w:t>
+        <w:t xml:space="preserve"> mode while testing, or approve the one-shot marker the deny message names. A literal </w:t>
+      </w:r>
+      <w:r>
+        <w:rPr>
+          <w:rStyle w:val="SourceText"/>
+        </w:rPr>
+        <w:t>gh workflow run ... --help</w:t>
+      </w:r>
+      <w:r>
+        <w:rPr/>
+        <w:t xml:space="preserve"> (or </w:t>
+      </w:r>
+      <w:r>
+        <w:rPr>
+          <w:rStyle w:val="SourceText"/>
+        </w:rPr>
+        <w:t>-h</w:t>
+      </w:r>
+      <w:r>
+        <w:rPr/>
+        <w:t xml:space="preserve">) is the exception: gh prints help and dispatches nothing, so the line is not judged at all; terraform's </w:t>
+      </w:r>
+      <w:r>
+        <w:rPr>
+          <w:rStyle w:val="SourceText"/>
+        </w:rPr>
+        <w:t>--help</w:t>
+      </w:r>
+      <w:r>
+        <w:rPr/>
+        <w:t xml:space="preserve"> still is.</w:t>
+      </w:r>
+    </w:p>
+    <w:p>
+      <w:pPr>
+        <w:pStyle w:val="BodyText"/>
+        <w:numPr>
+          <w:ilvl w:val="0"/>
+          <w:numId w:val="16"/>
+        </w:numPr>
+        <w:tabs>
+          <w:tab w:val="clear" w:pos="1134"/>
+          <w:tab w:val="left" w:pos="829" w:leader="none"/>
+        </w:tabs>
+        <w:bidi w:val="0"/>
+        <w:ind w:hanging="283" w:left="829"/>
+        <w:jc w:val="left"/>
+        <w:rPr/>
+      </w:pPr>
+      <w:r>
+        <w:rPr>
+          <w:rStyle w:val="Strong"/>
+        </w:rPr>
+        <w:t>A workflow dispatch is refused as "could not tell" although it looks fine.</w:t>
+      </w:r>
+      <w:r>
+        <w:rPr/>
+        <w:t xml:space="preserve"> With </w:t>
+      </w:r>
+      <w:r>
+        <w:rPr>
+          <w:rStyle w:val="SourceText"/>
+        </w:rPr>
+        <w:t>environments.workflows</w:t>
+      </w:r>
+      <w:r>
+        <w:rPr/>
+        <w:t xml:space="preserve"> set, a </w:t>
+      </w:r>
+      <w:r>
+        <w:rPr>
+          <w:rStyle w:val="SourceText"/>
+        </w:rPr>
+        <w:t>gh workflow run</w:t>
+      </w:r>
+      <w:r>
+        <w:rPr/>
+        <w:t xml:space="preserve"> or </w:t>
+      </w:r>
+      <w:r>
+        <w:rPr>
+          <w:rStyle w:val="SourceText"/>
+        </w:rPr>
+        <w:t>gh api .../dispatches</w:t>
+      </w:r>
+      <w:r>
+        <w:rPr/>
+        <w:t xml:space="preserve"> line is judged only when every word on it is a plain literal (letters, digits, </w:t>
+      </w:r>
+      <w:r>
+        <w:rPr>
+          <w:rStyle w:val="SourceText"/>
+        </w:rPr>
+        <w:t>_./:=@%+,-</w:t>
+      </w:r>
+      <w:r>
+        <w:rPr/>
+        <w:t xml:space="preserve">) or one whole single-quoted word, joined only by </w:t>
+      </w:r>
+      <w:r>
+        <w:rPr>
+          <w:rStyle w:val="SourceText"/>
+        </w:rPr>
+        <w:t>;</w:t>
+      </w:r>
+      <w:r>
+        <w:rPr/>
+        <w:t xml:space="preserve">, </w:t>
+      </w:r>
+      <w:r>
+        <w:rPr>
+          <w:rStyle w:val="SourceText"/>
+        </w:rPr>
+        <w:t>&amp;&amp;</w:t>
+      </w:r>
+      <w:r>
+        <w:rPr/>
+        <w:t xml:space="preserve">, </w:t>
+      </w:r>
+      <w:r>
+        <w:rPr>
+          <w:rStyle w:val="SourceText"/>
+        </w:rPr>
+        <w:t>||</w:t>
+      </w:r>
+      <w:r>
+        <w:rPr/>
+        <w:t xml:space="preserve">, </w:t>
+      </w:r>
+      <w:r>
+        <w:rPr>
+          <w:rStyle w:val="SourceText"/>
+        </w:rPr>
+        <w:t>&amp;</w:t>
+      </w:r>
+      <w:r>
+        <w:rPr/>
+        <w:t xml:space="preserve">, newlines, </w:t>
+      </w:r>
+      <w:r>
+        <w:rPr>
+          <w:rStyle w:val="SourceText"/>
+        </w:rPr>
+        <w:t>&gt;</w:t>
+      </w:r>
+      <w:r>
+        <w:rPr/>
+        <w:t>/</w:t>
+      </w:r>
+      <w:r>
+        <w:rPr>
+          <w:rStyle w:val="SourceText"/>
+        </w:rPr>
+        <w:t>&gt;&gt;</w:t>
+      </w:r>
+      <w:r>
+        <w:rPr/>
+        <w:t>/</w:t>
+      </w:r>
+      <w:r>
+        <w:rPr>
+          <w:rStyle w:val="SourceText"/>
+        </w:rPr>
+        <w:t>&amp;&gt;</w:t>
+      </w:r>
+      <w:r>
+        <w:rPr/>
+        <w:t>/</w:t>
+      </w:r>
+      <w:r>
+        <w:rPr>
+          <w:rStyle w:val="SourceText"/>
+        </w:rPr>
+        <w:t>&amp;&gt;&gt;</w:t>
+      </w:r>
+      <w:r>
+        <w:rPr/>
+        <w:t xml:space="preserve"> to a plain word and </w:t>
+      </w:r>
+      <w:r>
+        <w:rPr>
+          <w:rStyle w:val="SourceText"/>
+        </w:rPr>
+        <w:t>2&gt;&amp;1</w:t>
+      </w:r>
+      <w:r>
+        <w:rPr/>
+        <w:t xml:space="preserve">. A pipe, any </w:t>
+      </w:r>
+      <w:r>
+        <w:rPr>
+          <w:rStyle w:val="SourceText"/>
+        </w:rPr>
+        <w:t>&lt;</w:t>
+      </w:r>
+      <w:r>
+        <w:rPr/>
+        <w:t xml:space="preserve">, double quotes, </w:t>
+      </w:r>
+      <w:r>
+        <w:rPr>
+          <w:rStyle w:val="SourceText"/>
+        </w:rPr>
+        <w:t>$</w:t>
+      </w:r>
+      <w:r>
+        <w:rPr/>
+        <w:t xml:space="preserve">, a glob, </w:t>
+      </w:r>
+      <w:r>
+        <w:rPr>
+          <w:rStyle w:val="SourceText"/>
+        </w:rPr>
+        <w:t>bash -c '...'</w:t>
+      </w:r>
+      <w:r>
+        <w:rPr/>
+        <w:t xml:space="preserve">, </w:t>
+      </w:r>
+      <w:r>
+        <w:rPr>
+          <w:rStyle w:val="SourceText"/>
+        </w:rPr>
+        <w:t>xargs</w:t>
+      </w:r>
+      <w:r>
+        <w:rPr/>
+        <w:t>, a command word built at run time (</w:t>
+      </w:r>
+      <w:r>
+        <w:rPr>
+          <w:rStyle w:val="SourceText"/>
+        </w:rPr>
+        <w:t>$X $Y run ...</w:t>
+      </w:r>
+      <w:r>
+        <w:rPr/>
+        <w:t xml:space="preserve">, </w:t>
+      </w:r>
+      <w:r>
+        <w:rPr>
+          <w:rStyle w:val="SourceText"/>
+        </w:rPr>
+        <w:t>Start-Process $x</w:t>
+      </w:r>
+      <w:r>
+        <w:rPr/>
+        <w:t>, an alias to a variable), gh reading stdin or a file (</w:t>
+      </w:r>
+      <w:r>
+        <w:rPr>
+          <w:rStyle w:val="SourceText"/>
+        </w:rPr>
+        <w:t>--json</w:t>
+      </w:r>
+      <w:r>
+        <w:rPr/>
+        <w:t xml:space="preserve">, </w:t>
+      </w:r>
+      <w:r>
+        <w:rPr>
+          <w:rStyle w:val="SourceText"/>
+        </w:rPr>
+        <w:t>--input</w:t>
+      </w:r>
+      <w:r>
+        <w:rPr/>
+        <w:t xml:space="preserve">, </w:t>
+      </w:r>
+      <w:r>
+        <w:rPr>
+          <w:rStyle w:val="SourceText"/>
+        </w:rPr>
+        <w:t>-F k=@f</w:t>
+      </w:r>
+      <w:r>
+        <w:rPr/>
+        <w:t xml:space="preserve">), and a malformed </w:t>
+      </w:r>
+      <w:r>
+        <w:rPr>
+          <w:rStyle w:val="SourceText"/>
+        </w:rPr>
+        <w:t>environments</w:t>
+      </w:r>
+      <w:r>
+        <w:rPr/>
+        <w:t xml:space="preserve"> block in either config layer make the line could-not-tell: it asks when you are there and is denied unattended at every setting. </w:t>
+      </w:r>
+      <w:r>
+        <w:rPr>
+          <w:rStyle w:val="Strong"/>
+        </w:rPr>
+        <w:t>Fix:</w:t>
+      </w:r>
+      <w:r>
+        <w:rPr/>
+        <w:t xml:space="preserve"> write the literal form — </w:t>
+      </w:r>
+      <w:r>
+        <w:rPr>
+          <w:rStyle w:val="SourceText"/>
+        </w:rPr>
+        <w:t>-f environment=staging</w:t>
+      </w:r>
+      <w:r>
+        <w:rPr/>
+        <w:t xml:space="preserve"> instead of a </w:t>
+      </w:r>
+      <w:r>
+        <w:rPr>
+          <w:rStyle w:val="SourceText"/>
+        </w:rPr>
+        <w:t>--json</w:t>
+      </w:r>
+      <w:r>
+        <w:rPr/>
+        <w:t xml:space="preserve"> body, </w:t>
+      </w:r>
+      <w:r>
+        <w:rPr>
+          <w:rStyle w:val="SourceText"/>
+        </w:rPr>
+        <w:t>'Deploy Staging'</w:t>
+      </w:r>
+      <w:r>
+        <w:rPr/>
+        <w:t xml:space="preserve"> instead of </w:t>
+      </w:r>
+      <w:r>
+        <w:rPr>
+          <w:rStyle w:val="SourceText"/>
+        </w:rPr>
+        <w:t>"Deploy Staging"</w:t>
+      </w:r>
+      <w:r>
+        <w:rPr/>
+        <w:t xml:space="preserve">, </w:t>
+      </w:r>
+      <w:r>
+        <w:rPr>
+          <w:rStyle w:val="SourceText"/>
+        </w:rPr>
+        <w:t>&gt; log</w:t>
+      </w:r>
+      <w:r>
+        <w:rPr/>
+        <w:t xml:space="preserve"> instead of </w:t>
+      </w:r>
+      <w:r>
+        <w:rPr>
+          <w:rStyle w:val="SourceText"/>
+        </w:rPr>
+        <w:t>| tee log</w:t>
+      </w:r>
+      <w:r>
+        <w:rPr/>
+        <w:t xml:space="preserve">, the value instead of </w:t>
+      </w:r>
+      <w:r>
+        <w:rPr>
+          <w:rStyle w:val="SourceText"/>
+        </w:rPr>
+        <w:t>$ENV</w:t>
+      </w:r>
+      <w:r>
+        <w:rPr/>
+        <w:t xml:space="preserve"> — or approve the one command with the marker the refusal names (it covers those exact bytes only). Other </w:t>
+      </w:r>
+      <w:r>
+        <w:rPr>
+          <w:rStyle w:val="SourceText"/>
+        </w:rPr>
+        <w:t>gh</w:t>
+      </w:r>
+      <w:r>
+        <w:rPr/>
+        <w:t xml:space="preserve"> commands (</w:t>
+      </w:r>
+      <w:r>
+        <w:rPr>
+          <w:rStyle w:val="SourceText"/>
+        </w:rPr>
+        <w:t>gh pr create --title "..."</w:t>
+      </w:r>
+      <w:r>
+        <w:rPr/>
+        <w:t>) are never gated.</w:t>
       </w:r>
     </w:p>
     <w:p>
@@ -8067,10 +8672,10 @@
         </w:tblCellMar>
       </w:tblPr>
       <w:tblGrid>
-        <w:gridCol w:w="4621"/>
-        <w:gridCol w:w="1551"/>
-        <w:gridCol w:w="1790"/>
-        <w:gridCol w:w="3377"/>
+        <w:gridCol w:w="3919"/>
+        <w:gridCol w:w="1272"/>
+        <w:gridCol w:w="1495"/>
+        <w:gridCol w:w="4653"/>
       </w:tblGrid>
       <w:tr>
         <w:trPr>
@@ -8078,7 +8683,7 @@
         </w:trPr>
         <w:tc>
           <w:tcPr>
-            <w:tcW w:w="4621" w:type="dxa"/>
+            <w:tcW w:w="3919" w:type="dxa"/>
             <w:tcBorders/>
             <w:vAlign w:val="center"/>
           </w:tcPr>
@@ -8100,7 +8705,7 @@
         </w:tc>
         <w:tc>
           <w:tcPr>
-            <w:tcW w:w="1551" w:type="dxa"/>
+            <w:tcW w:w="1272" w:type="dxa"/>
             <w:tcBorders/>
             <w:vAlign w:val="center"/>
           </w:tcPr>
@@ -8122,7 +8727,7 @@
         </w:tc>
         <w:tc>
           <w:tcPr>
-            <w:tcW w:w="1790" w:type="dxa"/>
+            <w:tcW w:w="1495" w:type="dxa"/>
             <w:tcBorders/>
             <w:vAlign w:val="center"/>
           </w:tcPr>
@@ -8144,7 +8749,7 @@
         </w:tc>
         <w:tc>
           <w:tcPr>
-            <w:tcW w:w="3377" w:type="dxa"/>
+            <w:tcW w:w="4653" w:type="dxa"/>
             <w:tcBorders/>
             <w:vAlign w:val="center"/>
           </w:tcPr>
@@ -8169,7 +8774,7 @@
         <w:trPr/>
         <w:tc>
           <w:tcPr>
-            <w:tcW w:w="4621" w:type="dxa"/>
+            <w:tcW w:w="3919" w:type="dxa"/>
             <w:tcBorders/>
             <w:vAlign w:val="center"/>
           </w:tcPr>
@@ -8192,7 +8797,7 @@
         </w:tc>
         <w:tc>
           <w:tcPr>
-            <w:tcW w:w="1551" w:type="dxa"/>
+            <w:tcW w:w="1272" w:type="dxa"/>
             <w:tcBorders/>
             <w:vAlign w:val="center"/>
           </w:tcPr>
@@ -8213,7 +8818,7 @@
         </w:tc>
         <w:tc>
           <w:tcPr>
-            <w:tcW w:w="1790" w:type="dxa"/>
+            <w:tcW w:w="1495" w:type="dxa"/>
             <w:tcBorders/>
             <w:vAlign w:val="center"/>
           </w:tcPr>
@@ -8234,7 +8839,7 @@
         </w:tc>
         <w:tc>
           <w:tcPr>
-            <w:tcW w:w="3377" w:type="dxa"/>
+            <w:tcW w:w="4653" w:type="dxa"/>
             <w:tcBorders/>
             <w:vAlign w:val="center"/>
           </w:tcPr>
@@ -8274,7 +8879,7 @@
         <w:trPr/>
         <w:tc>
           <w:tcPr>
-            <w:tcW w:w="4621" w:type="dxa"/>
+            <w:tcW w:w="3919" w:type="dxa"/>
             <w:tcBorders/>
             <w:vAlign w:val="center"/>
           </w:tcPr>
@@ -8297,7 +8902,7 @@
         </w:tc>
         <w:tc>
           <w:tcPr>
-            <w:tcW w:w="1551" w:type="dxa"/>
+            <w:tcW w:w="1272" w:type="dxa"/>
             <w:tcBorders/>
             <w:vAlign w:val="center"/>
           </w:tcPr>
@@ -8318,7 +8923,7 @@
         </w:tc>
         <w:tc>
           <w:tcPr>
-            <w:tcW w:w="1790" w:type="dxa"/>
+            <w:tcW w:w="1495" w:type="dxa"/>
             <w:tcBorders/>
             <w:vAlign w:val="center"/>
           </w:tcPr>
@@ -8361,7 +8966,7 @@
         </w:tc>
         <w:tc>
           <w:tcPr>
-            <w:tcW w:w="3377" w:type="dxa"/>
+            <w:tcW w:w="4653" w:type="dxa"/>
             <w:tcBorders/>
             <w:vAlign w:val="center"/>
           </w:tcPr>
@@ -8391,7 +8996,7 @@
         <w:trPr/>
         <w:tc>
           <w:tcPr>
-            <w:tcW w:w="4621" w:type="dxa"/>
+            <w:tcW w:w="3919" w:type="dxa"/>
             <w:tcBorders/>
             <w:vAlign w:val="center"/>
           </w:tcPr>
@@ -8414,7 +9019,7 @@
         </w:tc>
         <w:tc>
           <w:tcPr>
-            <w:tcW w:w="1551" w:type="dxa"/>
+            <w:tcW w:w="1272" w:type="dxa"/>
             <w:tcBorders/>
             <w:vAlign w:val="center"/>
           </w:tcPr>
@@ -8435,7 +9040,7 @@
         </w:tc>
         <w:tc>
           <w:tcPr>
-            <w:tcW w:w="1790" w:type="dxa"/>
+            <w:tcW w:w="1495" w:type="dxa"/>
             <w:tcBorders/>
             <w:vAlign w:val="center"/>
           </w:tcPr>
@@ -8478,7 +9083,7 @@
         </w:tc>
         <w:tc>
           <w:tcPr>
-            <w:tcW w:w="3377" w:type="dxa"/>
+            <w:tcW w:w="4653" w:type="dxa"/>
             <w:tcBorders/>
             <w:vAlign w:val="center"/>
           </w:tcPr>
@@ -8508,7 +9113,7 @@
         <w:trPr/>
         <w:tc>
           <w:tcPr>
-            <w:tcW w:w="4621" w:type="dxa"/>
+            <w:tcW w:w="3919" w:type="dxa"/>
             <w:tcBorders/>
             <w:vAlign w:val="center"/>
           </w:tcPr>
@@ -8581,7 +9186,7 @@
         </w:tc>
         <w:tc>
           <w:tcPr>
-            <w:tcW w:w="1551" w:type="dxa"/>
+            <w:tcW w:w="1272" w:type="dxa"/>
             <w:tcBorders/>
             <w:vAlign w:val="center"/>
           </w:tcPr>
@@ -8602,7 +9207,7 @@
         </w:tc>
         <w:tc>
           <w:tcPr>
-            <w:tcW w:w="1790" w:type="dxa"/>
+            <w:tcW w:w="1495" w:type="dxa"/>
             <w:tcBorders/>
             <w:vAlign w:val="center"/>
           </w:tcPr>
@@ -8645,7 +9250,7 @@
         </w:tc>
         <w:tc>
           <w:tcPr>
-            <w:tcW w:w="3377" w:type="dxa"/>
+            <w:tcW w:w="4653" w:type="dxa"/>
             <w:tcBorders/>
             <w:vAlign w:val="center"/>
           </w:tcPr>
@@ -8679,40 +9284,30 @@
         <w:trPr/>
         <w:tc>
           <w:tcPr>
-            <w:tcW w:w="4621" w:type="dxa"/>
-            <w:tcBorders/>
-            <w:vAlign w:val="center"/>
-          </w:tcPr>
-          <w:p>
-            <w:pPr>
-              <w:pStyle w:val="TableContents"/>
-              <w:shd w:fill="2E3440" w:val="clear"/>
-              <w:bidi w:val="0"/>
-              <w:spacing w:before="120" w:after="120"/>
-              <w:jc w:val="left"/>
-              <w:rPr/>
-            </w:pPr>
-            <w:r>
-              <w:rPr>
-                <w:rStyle w:val="SourceText"/>
-              </w:rPr>
-              <w:t>guards.prodDatabase</w:t>
-            </w:r>
-            <w:r>
-              <w:rPr/>
-              <w:t xml:space="preserve">, </w:t>
-            </w:r>
-            <w:r>
-              <w:rPr>
-                <w:rStyle w:val="SourceText"/>
-              </w:rPr>
-              <w:t>guards.prodServer</w:t>
-            </w:r>
-          </w:p>
-        </w:tc>
-        <w:tc>
-          <w:tcPr>
-            <w:tcW w:w="1551" w:type="dxa"/>
+            <w:tcW w:w="3919" w:type="dxa"/>
+            <w:tcBorders/>
+            <w:vAlign w:val="center"/>
+          </w:tcPr>
+          <w:p>
+            <w:pPr>
+              <w:pStyle w:val="TableContents"/>
+              <w:shd w:fill="2E3440" w:val="clear"/>
+              <w:bidi w:val="0"/>
+              <w:spacing w:before="120" w:after="120"/>
+              <w:jc w:val="left"/>
+              <w:rPr/>
+            </w:pPr>
+            <w:r>
+              <w:rPr>
+                <w:rStyle w:val="SourceText"/>
+              </w:rPr>
+              <w:t>guards.deployWorkflow</w:t>
+            </w:r>
+          </w:p>
+        </w:tc>
+        <w:tc>
+          <w:tcPr>
+            <w:tcW w:w="1272" w:type="dxa"/>
             <w:tcBorders/>
             <w:vAlign w:val="center"/>
           </w:tcPr>
@@ -8733,24 +9328,24 @@
         </w:tc>
         <w:tc>
           <w:tcPr>
-            <w:tcW w:w="1790" w:type="dxa"/>
-            <w:tcBorders/>
-            <w:vAlign w:val="center"/>
-          </w:tcPr>
-          <w:p>
-            <w:pPr>
-              <w:pStyle w:val="TableContents"/>
-              <w:shd w:fill="2E3440" w:val="clear"/>
-              <w:bidi w:val="0"/>
-              <w:spacing w:before="120" w:after="120"/>
-              <w:jc w:val="left"/>
-              <w:rPr/>
-            </w:pPr>
-            <w:r>
-              <w:rPr>
-                <w:rStyle w:val="SourceText"/>
-              </w:rPr>
-              <w:t>none</w:t>
+            <w:tcW w:w="1495" w:type="dxa"/>
+            <w:tcBorders/>
+            <w:vAlign w:val="center"/>
+          </w:tcPr>
+          <w:p>
+            <w:pPr>
+              <w:pStyle w:val="TableContents"/>
+              <w:shd w:fill="2E3440" w:val="clear"/>
+              <w:bidi w:val="0"/>
+              <w:spacing w:before="120" w:after="120"/>
+              <w:jc w:val="left"/>
+              <w:rPr/>
+            </w:pPr>
+            <w:r>
+              <w:rPr>
+                <w:rStyle w:val="SourceText"/>
+              </w:rPr>
+              <w:t>block</w:t>
             </w:r>
             <w:r>
               <w:rPr/>
@@ -8760,7 +9355,7 @@
               <w:rPr>
                 <w:rStyle w:val="SourceText"/>
               </w:rPr>
-              <w:t>read</w:t>
+              <w:t>ask</w:t>
             </w:r>
             <w:r>
               <w:rPr/>
@@ -8770,34 +9365,54 @@
               <w:rPr>
                 <w:rStyle w:val="SourceText"/>
               </w:rPr>
-              <w:t>full</w:t>
-            </w:r>
-          </w:p>
-        </w:tc>
-        <w:tc>
-          <w:tcPr>
-            <w:tcW w:w="3377" w:type="dxa"/>
-            <w:tcBorders/>
-            <w:vAlign w:val="center"/>
-          </w:tcPr>
-          <w:p>
-            <w:pPr>
-              <w:pStyle w:val="TableContents"/>
-              <w:shd w:fill="2E3440" w:val="clear"/>
-              <w:bidi w:val="0"/>
-              <w:spacing w:before="120" w:after="120"/>
-              <w:jc w:val="left"/>
-              <w:rPr/>
-            </w:pPr>
-            <w:r>
-              <w:rPr>
-                <w:rStyle w:val="SourceText"/>
-              </w:rPr>
-              <w:t>none</w:t>
-            </w:r>
-            <w:r>
-              <w:rPr/>
-              <w:t xml:space="preserve"> is both the default and the floor</w:t>
+              <w:t>allow</w:t>
+            </w:r>
+          </w:p>
+        </w:tc>
+        <w:tc>
+          <w:tcPr>
+            <w:tcW w:w="4653" w:type="dxa"/>
+            <w:tcBorders/>
+            <w:vAlign w:val="center"/>
+          </w:tcPr>
+          <w:p>
+            <w:pPr>
+              <w:pStyle w:val="TableContents"/>
+              <w:shd w:fill="2E3440" w:val="clear"/>
+              <w:bidi w:val="0"/>
+              <w:spacing w:before="120" w:after="120"/>
+              <w:jc w:val="left"/>
+              <w:rPr/>
+            </w:pPr>
+            <w:r>
+              <w:rPr>
+                <w:rStyle w:val="SourceText"/>
+              </w:rPr>
+              <w:t>block</w:t>
+            </w:r>
+            <w:r>
+              <w:rPr/>
+              <w:t xml:space="preserve"> is default and floor; </w:t>
+            </w:r>
+            <w:r>
+              <w:rPr>
+                <w:rStyle w:val="SourceText"/>
+              </w:rPr>
+              <w:t>allow</w:t>
+            </w:r>
+            <w:r>
+              <w:rPr/>
+              <w:t xml:space="preserve"> covers nonProd only — production without </w:t>
+            </w:r>
+            <w:r>
+              <w:rPr>
+                <w:rStyle w:val="SourceText"/>
+              </w:rPr>
+              <w:t>environments.prodUnattended</w:t>
+            </w:r>
+            <w:r>
+              <w:rPr/>
+              <w:t xml:space="preserve"> in both layers, and an unknown environment, still ask (denied unattended)</w:t>
             </w:r>
           </w:p>
         </w:tc>
@@ -8806,30 +9421,30 @@
         <w:trPr/>
         <w:tc>
           <w:tcPr>
-            <w:tcW w:w="4621" w:type="dxa"/>
-            <w:tcBorders/>
-            <w:vAlign w:val="center"/>
-          </w:tcPr>
-          <w:p>
-            <w:pPr>
-              <w:pStyle w:val="TableContents"/>
-              <w:shd w:fill="2E3440" w:val="clear"/>
-              <w:bidi w:val="0"/>
-              <w:spacing w:before="120" w:after="120"/>
-              <w:jc w:val="left"/>
-              <w:rPr/>
-            </w:pPr>
-            <w:r>
-              <w:rPr>
-                <w:rStyle w:val="SourceText"/>
-              </w:rPr>
-              <w:t>scope.mode</w:t>
-            </w:r>
-          </w:p>
-        </w:tc>
-        <w:tc>
-          <w:tcPr>
-            <w:tcW w:w="1551" w:type="dxa"/>
+            <w:tcW w:w="3919" w:type="dxa"/>
+            <w:tcBorders/>
+            <w:vAlign w:val="center"/>
+          </w:tcPr>
+          <w:p>
+            <w:pPr>
+              <w:pStyle w:val="TableContents"/>
+              <w:shd w:fill="2E3440" w:val="clear"/>
+              <w:bidi w:val="0"/>
+              <w:spacing w:before="120" w:after="120"/>
+              <w:jc w:val="left"/>
+              <w:rPr/>
+            </w:pPr>
+            <w:r>
+              <w:rPr>
+                <w:rStyle w:val="SourceText"/>
+              </w:rPr>
+              <w:t>environments.nonProd</w:t>
+            </w:r>
+          </w:p>
+        </w:tc>
+        <w:tc>
+          <w:tcPr>
+            <w:tcW w:w="1272" w:type="dxa"/>
             <w:tcBorders/>
             <w:vAlign w:val="center"/>
           </w:tcPr>
@@ -8850,81 +9465,49 @@
         </w:tc>
         <w:tc>
           <w:tcPr>
-            <w:tcW w:w="1790" w:type="dxa"/>
-            <w:tcBorders/>
-            <w:vAlign w:val="center"/>
-          </w:tcPr>
-          <w:p>
-            <w:pPr>
-              <w:pStyle w:val="TableContents"/>
-              <w:shd w:fill="2E3440" w:val="clear"/>
-              <w:bidi w:val="0"/>
-              <w:spacing w:before="120" w:after="120"/>
-              <w:jc w:val="left"/>
-              <w:rPr/>
-            </w:pPr>
-            <w:r>
-              <w:rPr>
-                <w:rStyle w:val="SourceText"/>
-              </w:rPr>
-              <w:t>off</w:t>
-            </w:r>
-            <w:r>
-              <w:rPr/>
-              <w:t>/</w:t>
-            </w:r>
-            <w:r>
-              <w:rPr>
-                <w:rStyle w:val="SourceText"/>
-              </w:rPr>
-              <w:t>report</w:t>
-            </w:r>
-            <w:r>
-              <w:rPr/>
-              <w:t>/</w:t>
-            </w:r>
-            <w:r>
-              <w:rPr>
-                <w:rStyle w:val="SourceText"/>
-              </w:rPr>
-              <w:t>block</w:t>
-            </w:r>
-            <w:r>
-              <w:rPr/>
-              <w:t>/</w:t>
-            </w:r>
-            <w:r>
-              <w:rPr>
-                <w:rStyle w:val="SourceText"/>
-              </w:rPr>
-              <w:t>auto</w:t>
-            </w:r>
-          </w:p>
-        </w:tc>
-        <w:tc>
-          <w:tcPr>
-            <w:tcW w:w="3377" w:type="dxa"/>
-            <w:tcBorders/>
-            <w:vAlign w:val="center"/>
-          </w:tcPr>
-          <w:p>
-            <w:pPr>
-              <w:pStyle w:val="TableContents"/>
-              <w:shd w:fill="2E3440" w:val="clear"/>
-              <w:bidi w:val="0"/>
-              <w:spacing w:before="120" w:after="120"/>
-              <w:jc w:val="left"/>
-              <w:rPr/>
-            </w:pPr>
-            <w:r>
-              <w:rPr>
-                <w:rStyle w:val="SourceText"/>
-              </w:rPr>
-              <w:t>off</w:t>
-            </w:r>
-            <w:r>
-              <w:rPr/>
-              <w:t>: neither the edit guard nor the completion audit runs</w:t>
+            <w:tcW w:w="1495" w:type="dxa"/>
+            <w:tcBorders/>
+            <w:vAlign w:val="center"/>
+          </w:tcPr>
+          <w:p>
+            <w:pPr>
+              <w:pStyle w:val="TableContents"/>
+              <w:shd w:fill="2E3440" w:val="clear"/>
+              <w:bidi w:val="0"/>
+              <w:spacing w:before="120" w:after="120"/>
+              <w:jc w:val="left"/>
+              <w:rPr/>
+            </w:pPr>
+            <w:r>
+              <w:rPr/>
+              <w:t>list of globs</w:t>
+            </w:r>
+          </w:p>
+        </w:tc>
+        <w:tc>
+          <w:tcPr>
+            <w:tcW w:w="4653" w:type="dxa"/>
+            <w:tcBorders/>
+            <w:vAlign w:val="center"/>
+          </w:tcPr>
+          <w:p>
+            <w:pPr>
+              <w:pStyle w:val="TableContents"/>
+              <w:shd w:fill="2E3440" w:val="clear"/>
+              <w:bidi w:val="0"/>
+              <w:spacing w:before="120" w:after="120"/>
+              <w:jc w:val="left"/>
+              <w:rPr/>
+            </w:pPr>
+            <w:r>
+              <w:rPr>
+                <w:rStyle w:val="SourceText"/>
+              </w:rPr>
+              <w:t>[]</w:t>
+            </w:r>
+            <w:r>
+              <w:rPr/>
+              <w:t>: nothing is nonProd, so every terraform apply asks (denied unattended)</w:t>
             </w:r>
           </w:p>
         </w:tc>
@@ -8933,51 +9516,61 @@
         <w:trPr/>
         <w:tc>
           <w:tcPr>
-            <w:tcW w:w="4621" w:type="dxa"/>
-            <w:tcBorders/>
-            <w:vAlign w:val="center"/>
-          </w:tcPr>
-          <w:p>
-            <w:pPr>
-              <w:pStyle w:val="TableContents"/>
-              <w:shd w:fill="2E3440" w:val="clear"/>
-              <w:bidi w:val="0"/>
-              <w:spacing w:before="120" w:after="120"/>
-              <w:jc w:val="left"/>
-              <w:rPr/>
-            </w:pPr>
-            <w:r>
-              <w:rPr>
-                <w:rStyle w:val="SourceText"/>
-              </w:rPr>
-              <w:t>scope.allowCliApproval</w:t>
-            </w:r>
-          </w:p>
-        </w:tc>
-        <w:tc>
-          <w:tcPr>
-            <w:tcW w:w="1551" w:type="dxa"/>
-            <w:tcBorders/>
-            <w:vAlign w:val="center"/>
-          </w:tcPr>
-          <w:p>
-            <w:pPr>
-              <w:pStyle w:val="TableContents"/>
-              <w:shd w:fill="2E3440" w:val="clear"/>
-              <w:bidi w:val="0"/>
-              <w:spacing w:before="120" w:after="120"/>
-              <w:jc w:val="left"/>
-              <w:rPr/>
-            </w:pPr>
-            <w:r>
-              <w:rPr/>
-              <w:t>repo only</w:t>
-            </w:r>
-          </w:p>
-        </w:tc>
-        <w:tc>
-          <w:tcPr>
-            <w:tcW w:w="1790" w:type="dxa"/>
+            <w:tcW w:w="3919" w:type="dxa"/>
+            <w:tcBorders/>
+            <w:vAlign w:val="center"/>
+          </w:tcPr>
+          <w:p>
+            <w:pPr>
+              <w:pStyle w:val="TableContents"/>
+              <w:shd w:fill="2E3440" w:val="clear"/>
+              <w:bidi w:val="0"/>
+              <w:spacing w:before="120" w:after="120"/>
+              <w:jc w:val="left"/>
+              <w:rPr/>
+            </w:pPr>
+            <w:r>
+              <w:rPr>
+                <w:rStyle w:val="SourceText"/>
+              </w:rPr>
+              <w:t>environments.prodUnattended</w:t>
+            </w:r>
+          </w:p>
+        </w:tc>
+        <w:tc>
+          <w:tcPr>
+            <w:tcW w:w="1272" w:type="dxa"/>
+            <w:tcBorders/>
+            <w:vAlign w:val="center"/>
+          </w:tcPr>
+          <w:p>
+            <w:pPr>
+              <w:pStyle w:val="TableContents"/>
+              <w:shd w:fill="2E3440" w:val="clear"/>
+              <w:bidi w:val="0"/>
+              <w:spacing w:before="120" w:after="120"/>
+              <w:jc w:val="left"/>
+              <w:rPr/>
+            </w:pPr>
+            <w:r>
+              <w:rPr/>
+              <w:t xml:space="preserve">both layers, ratchets (true only when both say </w:t>
+            </w:r>
+            <w:r>
+              <w:rPr>
+                <w:rStyle w:val="SourceText"/>
+              </w:rPr>
+              <w:t>true</w:t>
+            </w:r>
+            <w:r>
+              <w:rPr/>
+              <w:t>)</w:t>
+            </w:r>
+          </w:p>
+        </w:tc>
+        <w:tc>
+          <w:tcPr>
+            <w:tcW w:w="1495" w:type="dxa"/>
             <w:tcBorders/>
             <w:vAlign w:val="center"/>
           </w:tcPr>
@@ -8998,7 +9591,7 @@
         </w:tc>
         <w:tc>
           <w:tcPr>
-            <w:tcW w:w="3377" w:type="dxa"/>
+            <w:tcW w:w="4653" w:type="dxa"/>
             <w:tcBorders/>
             <w:vAlign w:val="center"/>
           </w:tcPr>
@@ -9019,37 +9612,7 @@
             </w:r>
             <w:r>
               <w:rPr/>
-              <w:t xml:space="preserve">: only a </w:t>
-            </w:r>
-            <w:r>
-              <w:rPr>
-                <w:rStyle w:val="SourceText"/>
-              </w:rPr>
-              <w:t>/crew:approve</w:t>
-            </w:r>
-            <w:r>
-              <w:rPr/>
-              <w:t xml:space="preserve"> typed by the user counts (no </w:t>
-            </w:r>
-            <w:r>
-              <w:rPr>
-                <w:rStyle w:val="SourceText"/>
-              </w:rPr>
-              <w:t>cli</w:t>
-            </w:r>
-            <w:r>
-              <w:rPr/>
-              <w:t xml:space="preserve"> or </w:t>
-            </w:r>
-            <w:r>
-              <w:rPr>
-                <w:rStyle w:val="SourceText"/>
-              </w:rPr>
-              <w:t>autopilot</w:t>
-            </w:r>
-            <w:r>
-              <w:rPr/>
-              <w:t xml:space="preserve"> receipt)</w:t>
+              <w:t xml:space="preserve"> in either layer holds it down: production applies and dispatches ask</w:t>
             </w:r>
           </w:p>
         </w:tc>
@@ -9058,93 +9621,125 @@
         <w:trPr/>
         <w:tc>
           <w:tcPr>
-            <w:tcW w:w="4621" w:type="dxa"/>
-            <w:tcBorders/>
-            <w:vAlign w:val="center"/>
-          </w:tcPr>
-          <w:p>
-            <w:pPr>
-              <w:pStyle w:val="TableContents"/>
-              <w:shd w:fill="2E3440" w:val="clear"/>
-              <w:bidi w:val="0"/>
-              <w:spacing w:before="120" w:after="120"/>
-              <w:jc w:val="left"/>
-              <w:rPr/>
-            </w:pPr>
-            <w:r>
-              <w:rPr>
-                <w:rStyle w:val="SourceText"/>
-              </w:rPr>
-              <w:t>verifyGate</w:t>
-            </w:r>
-          </w:p>
-        </w:tc>
-        <w:tc>
-          <w:tcPr>
-            <w:tcW w:w="1551" w:type="dxa"/>
-            <w:tcBorders/>
-            <w:vAlign w:val="center"/>
-          </w:tcPr>
-          <w:p>
-            <w:pPr>
-              <w:pStyle w:val="TableContents"/>
-              <w:shd w:fill="2E3440" w:val="clear"/>
-              <w:bidi w:val="0"/>
-              <w:spacing w:before="120" w:after="120"/>
-              <w:jc w:val="left"/>
-              <w:rPr/>
-            </w:pPr>
-            <w:r>
-              <w:rPr/>
-              <w:t>repo only</w:t>
-            </w:r>
-          </w:p>
-        </w:tc>
-        <w:tc>
-          <w:tcPr>
-            <w:tcW w:w="1790" w:type="dxa"/>
-            <w:tcBorders/>
-            <w:vAlign w:val="center"/>
-          </w:tcPr>
-          <w:p>
-            <w:pPr>
-              <w:pStyle w:val="TableContents"/>
-              <w:shd w:fill="2E3440" w:val="clear"/>
-              <w:bidi w:val="0"/>
-              <w:spacing w:before="120" w:after="120"/>
-              <w:jc w:val="left"/>
-              <w:rPr/>
-            </w:pPr>
-            <w:r>
-              <w:rPr/>
-              <w:t>bool</w:t>
-            </w:r>
-          </w:p>
-        </w:tc>
-        <w:tc>
-          <w:tcPr>
-            <w:tcW w:w="3377" w:type="dxa"/>
-            <w:tcBorders/>
-            <w:vAlign w:val="center"/>
-          </w:tcPr>
-          <w:p>
-            <w:pPr>
-              <w:pStyle w:val="TableContents"/>
-              <w:shd w:fill="2E3440" w:val="clear"/>
-              <w:bidi w:val="0"/>
-              <w:spacing w:before="120" w:after="120"/>
-              <w:jc w:val="left"/>
-              <w:rPr/>
-            </w:pPr>
-            <w:r>
-              <w:rPr>
-                <w:rStyle w:val="SourceText"/>
-              </w:rPr>
-              <w:t>false</w:t>
-            </w:r>
-            <w:r>
-              <w:rPr/>
-              <w:t>: the Stop verify gate does not run at all</w:t>
+            <w:tcW w:w="3919" w:type="dxa"/>
+            <w:tcBorders/>
+            <w:vAlign w:val="center"/>
+          </w:tcPr>
+          <w:p>
+            <w:pPr>
+              <w:pStyle w:val="TableContents"/>
+              <w:shd w:fill="2E3440" w:val="clear"/>
+              <w:bidi w:val="0"/>
+              <w:spacing w:before="120" w:after="120"/>
+              <w:jc w:val="left"/>
+              <w:rPr/>
+            </w:pPr>
+            <w:r>
+              <w:rPr>
+                <w:rStyle w:val="SourceText"/>
+              </w:rPr>
+              <w:t>guards.prodDatabase</w:t>
+            </w:r>
+            <w:r>
+              <w:rPr/>
+              <w:t xml:space="preserve">, </w:t>
+            </w:r>
+            <w:r>
+              <w:rPr>
+                <w:rStyle w:val="SourceText"/>
+              </w:rPr>
+              <w:t>guards.prodServer</w:t>
+            </w:r>
+          </w:p>
+        </w:tc>
+        <w:tc>
+          <w:tcPr>
+            <w:tcW w:w="1272" w:type="dxa"/>
+            <w:tcBorders/>
+            <w:vAlign w:val="center"/>
+          </w:tcPr>
+          <w:p>
+            <w:pPr>
+              <w:pStyle w:val="TableContents"/>
+              <w:shd w:fill="2E3440" w:val="clear"/>
+              <w:bidi w:val="0"/>
+              <w:spacing w:before="120" w:after="120"/>
+              <w:jc w:val="left"/>
+              <w:rPr/>
+            </w:pPr>
+            <w:r>
+              <w:rPr/>
+              <w:t>both layers, ratchets</w:t>
+            </w:r>
+          </w:p>
+        </w:tc>
+        <w:tc>
+          <w:tcPr>
+            <w:tcW w:w="1495" w:type="dxa"/>
+            <w:tcBorders/>
+            <w:vAlign w:val="center"/>
+          </w:tcPr>
+          <w:p>
+            <w:pPr>
+              <w:pStyle w:val="TableContents"/>
+              <w:shd w:fill="2E3440" w:val="clear"/>
+              <w:bidi w:val="0"/>
+              <w:spacing w:before="120" w:after="120"/>
+              <w:jc w:val="left"/>
+              <w:rPr/>
+            </w:pPr>
+            <w:r>
+              <w:rPr>
+                <w:rStyle w:val="SourceText"/>
+              </w:rPr>
+              <w:t>none</w:t>
+            </w:r>
+            <w:r>
+              <w:rPr/>
+              <w:t>/</w:t>
+            </w:r>
+            <w:r>
+              <w:rPr>
+                <w:rStyle w:val="SourceText"/>
+              </w:rPr>
+              <w:t>read</w:t>
+            </w:r>
+            <w:r>
+              <w:rPr/>
+              <w:t>/</w:t>
+            </w:r>
+            <w:r>
+              <w:rPr>
+                <w:rStyle w:val="SourceText"/>
+              </w:rPr>
+              <w:t>full</w:t>
+            </w:r>
+          </w:p>
+        </w:tc>
+        <w:tc>
+          <w:tcPr>
+            <w:tcW w:w="4653" w:type="dxa"/>
+            <w:tcBorders/>
+            <w:vAlign w:val="center"/>
+          </w:tcPr>
+          <w:p>
+            <w:pPr>
+              <w:pStyle w:val="TableContents"/>
+              <w:shd w:fill="2E3440" w:val="clear"/>
+              <w:bidi w:val="0"/>
+              <w:spacing w:before="120" w:after="120"/>
+              <w:jc w:val="left"/>
+              <w:rPr/>
+            </w:pPr>
+            <w:r>
+              <w:rPr>
+                <w:rStyle w:val="SourceText"/>
+              </w:rPr>
+              <w:t>none</w:t>
+            </w:r>
+            <w:r>
+              <w:rPr/>
+              <w:t xml:space="preserve"> is both the default and the floor</w:t>
             </w:r>
           </w:p>
         </w:tc>
@@ -9153,103 +9748,125 @@
         <w:trPr/>
         <w:tc>
           <w:tcPr>
-            <w:tcW w:w="4621" w:type="dxa"/>
-            <w:tcBorders/>
-            <w:vAlign w:val="center"/>
-          </w:tcPr>
-          <w:p>
-            <w:pPr>
-              <w:pStyle w:val="TableContents"/>
-              <w:shd w:fill="2E3440" w:val="clear"/>
-              <w:bidi w:val="0"/>
-              <w:spacing w:before="120" w:after="120"/>
-              <w:jc w:val="left"/>
-              <w:rPr/>
-            </w:pPr>
-            <w:r>
-              <w:rPr>
-                <w:rStyle w:val="SourceText"/>
-              </w:rPr>
-              <w:t>context.enabled</w:t>
-            </w:r>
-          </w:p>
-        </w:tc>
-        <w:tc>
-          <w:tcPr>
-            <w:tcW w:w="1551" w:type="dxa"/>
-            <w:tcBorders/>
-            <w:vAlign w:val="center"/>
-          </w:tcPr>
-          <w:p>
-            <w:pPr>
-              <w:pStyle w:val="TableContents"/>
-              <w:shd w:fill="2E3440" w:val="clear"/>
-              <w:bidi w:val="0"/>
-              <w:spacing w:before="120" w:after="120"/>
-              <w:jc w:val="left"/>
-              <w:rPr/>
-            </w:pPr>
-            <w:r>
-              <w:rPr/>
-              <w:t>both layers</w:t>
-            </w:r>
-          </w:p>
-        </w:tc>
-        <w:tc>
-          <w:tcPr>
-            <w:tcW w:w="1790" w:type="dxa"/>
-            <w:tcBorders/>
-            <w:vAlign w:val="center"/>
-          </w:tcPr>
-          <w:p>
-            <w:pPr>
-              <w:pStyle w:val="TableContents"/>
-              <w:shd w:fill="2E3440" w:val="clear"/>
-              <w:bidi w:val="0"/>
-              <w:spacing w:before="120" w:after="120"/>
-              <w:jc w:val="left"/>
-              <w:rPr/>
-            </w:pPr>
-            <w:r>
-              <w:rPr/>
-              <w:t>bool</w:t>
-            </w:r>
-          </w:p>
-        </w:tc>
-        <w:tc>
-          <w:tcPr>
-            <w:tcW w:w="3377" w:type="dxa"/>
-            <w:tcBorders/>
-            <w:vAlign w:val="center"/>
-          </w:tcPr>
-          <w:p>
-            <w:pPr>
-              <w:pStyle w:val="TableContents"/>
-              <w:shd w:fill="2E3440" w:val="clear"/>
-              <w:bidi w:val="0"/>
-              <w:spacing w:before="120" w:after="120"/>
-              <w:jc w:val="left"/>
-              <w:rPr/>
-            </w:pPr>
-            <w:r>
-              <w:rPr>
-                <w:rStyle w:val="SourceText"/>
-              </w:rPr>
-              <w:t>false</w:t>
-            </w:r>
-            <w:r>
-              <w:rPr/>
-              <w:t xml:space="preserve">: </w:t>
-            </w:r>
-            <w:r>
-              <w:rPr>
-                <w:rStyle w:val="SourceText"/>
-              </w:rPr>
-              <w:t>context-watch.sh</w:t>
-            </w:r>
-            <w:r>
-              <w:rPr/>
-              <w:t xml:space="preserve"> (the Stop nag) does nothing</w:t>
+            <w:tcW w:w="3919" w:type="dxa"/>
+            <w:tcBorders/>
+            <w:vAlign w:val="center"/>
+          </w:tcPr>
+          <w:p>
+            <w:pPr>
+              <w:pStyle w:val="TableContents"/>
+              <w:shd w:fill="2E3440" w:val="clear"/>
+              <w:bidi w:val="0"/>
+              <w:spacing w:before="120" w:after="120"/>
+              <w:jc w:val="left"/>
+              <w:rPr/>
+            </w:pPr>
+            <w:r>
+              <w:rPr>
+                <w:rStyle w:val="SourceText"/>
+              </w:rPr>
+              <w:t>scope.mode</w:t>
+            </w:r>
+          </w:p>
+        </w:tc>
+        <w:tc>
+          <w:tcPr>
+            <w:tcW w:w="1272" w:type="dxa"/>
+            <w:tcBorders/>
+            <w:vAlign w:val="center"/>
+          </w:tcPr>
+          <w:p>
+            <w:pPr>
+              <w:pStyle w:val="TableContents"/>
+              <w:shd w:fill="2E3440" w:val="clear"/>
+              <w:bidi w:val="0"/>
+              <w:spacing w:before="120" w:after="120"/>
+              <w:jc w:val="left"/>
+              <w:rPr/>
+            </w:pPr>
+            <w:r>
+              <w:rPr/>
+              <w:t>repo only</w:t>
+            </w:r>
+          </w:p>
+        </w:tc>
+        <w:tc>
+          <w:tcPr>
+            <w:tcW w:w="1495" w:type="dxa"/>
+            <w:tcBorders/>
+            <w:vAlign w:val="center"/>
+          </w:tcPr>
+          <w:p>
+            <w:pPr>
+              <w:pStyle w:val="TableContents"/>
+              <w:shd w:fill="2E3440" w:val="clear"/>
+              <w:bidi w:val="0"/>
+              <w:spacing w:before="120" w:after="120"/>
+              <w:jc w:val="left"/>
+              <w:rPr/>
+            </w:pPr>
+            <w:r>
+              <w:rPr>
+                <w:rStyle w:val="SourceText"/>
+              </w:rPr>
+              <w:t>off</w:t>
+            </w:r>
+            <w:r>
+              <w:rPr/>
+              <w:t>/</w:t>
+            </w:r>
+            <w:r>
+              <w:rPr>
+                <w:rStyle w:val="SourceText"/>
+              </w:rPr>
+              <w:t>report</w:t>
+            </w:r>
+            <w:r>
+              <w:rPr/>
+              <w:t>/</w:t>
+            </w:r>
+            <w:r>
+              <w:rPr>
+                <w:rStyle w:val="SourceText"/>
+              </w:rPr>
+              <w:t>block</w:t>
+            </w:r>
+            <w:r>
+              <w:rPr/>
+              <w:t>/</w:t>
+            </w:r>
+            <w:r>
+              <w:rPr>
+                <w:rStyle w:val="SourceText"/>
+              </w:rPr>
+              <w:t>auto</w:t>
+            </w:r>
+          </w:p>
+        </w:tc>
+        <w:tc>
+          <w:tcPr>
+            <w:tcW w:w="4653" w:type="dxa"/>
+            <w:tcBorders/>
+            <w:vAlign w:val="center"/>
+          </w:tcPr>
+          <w:p>
+            <w:pPr>
+              <w:pStyle w:val="TableContents"/>
+              <w:shd w:fill="2E3440" w:val="clear"/>
+              <w:bidi w:val="0"/>
+              <w:spacing w:before="120" w:after="120"/>
+              <w:jc w:val="left"/>
+              <w:rPr/>
+            </w:pPr>
+            <w:r>
+              <w:rPr>
+                <w:rStyle w:val="SourceText"/>
+              </w:rPr>
+              <w:t>off</w:t>
+            </w:r>
+            <w:r>
+              <w:rPr/>
+              <w:t>: neither the edit guard nor the completion audit runs</w:t>
             </w:r>
           </w:p>
         </w:tc>
@@ -9258,61 +9875,51 @@
         <w:trPr/>
         <w:tc>
           <w:tcPr>
-            <w:tcW w:w="4621" w:type="dxa"/>
-            <w:tcBorders/>
-            <w:vAlign w:val="center"/>
-          </w:tcPr>
-          <w:p>
-            <w:pPr>
-              <w:pStyle w:val="TableContents"/>
-              <w:shd w:fill="2E3440" w:val="clear"/>
-              <w:bidi w:val="0"/>
-              <w:spacing w:before="120" w:after="120"/>
-              <w:jc w:val="left"/>
-              <w:rPr/>
-            </w:pPr>
-            <w:r>
-              <w:rPr>
-                <w:rStyle w:val="SourceText"/>
-              </w:rPr>
-              <w:t>context.autoClear.enabled</w:t>
-            </w:r>
-            <w:r>
-              <w:rPr/>
-              <w:t xml:space="preserve">, </w:t>
-            </w:r>
-            <w:r>
-              <w:rPr>
-                <w:rStyle w:val="SourceText"/>
-              </w:rPr>
-              <w:t>autoWrapUp</w:t>
-            </w:r>
-          </w:p>
-        </w:tc>
-        <w:tc>
-          <w:tcPr>
-            <w:tcW w:w="1551" w:type="dxa"/>
-            <w:tcBorders/>
-            <w:vAlign w:val="center"/>
-          </w:tcPr>
-          <w:p>
-            <w:pPr>
-              <w:pStyle w:val="TableContents"/>
-              <w:shd w:fill="2E3440" w:val="clear"/>
-              <w:bidi w:val="0"/>
-              <w:spacing w:before="120" w:after="120"/>
-              <w:jc w:val="left"/>
-              <w:rPr/>
-            </w:pPr>
-            <w:r>
-              <w:rPr/>
-              <w:t>both layers</w:t>
-            </w:r>
-          </w:p>
-        </w:tc>
-        <w:tc>
-          <w:tcPr>
-            <w:tcW w:w="1790" w:type="dxa"/>
+            <w:tcW w:w="3919" w:type="dxa"/>
+            <w:tcBorders/>
+            <w:vAlign w:val="center"/>
+          </w:tcPr>
+          <w:p>
+            <w:pPr>
+              <w:pStyle w:val="TableContents"/>
+              <w:shd w:fill="2E3440" w:val="clear"/>
+              <w:bidi w:val="0"/>
+              <w:spacing w:before="120" w:after="120"/>
+              <w:jc w:val="left"/>
+              <w:rPr/>
+            </w:pPr>
+            <w:r>
+              <w:rPr>
+                <w:rStyle w:val="SourceText"/>
+              </w:rPr>
+              <w:t>scope.allowCliApproval</w:t>
+            </w:r>
+          </w:p>
+        </w:tc>
+        <w:tc>
+          <w:tcPr>
+            <w:tcW w:w="1272" w:type="dxa"/>
+            <w:tcBorders/>
+            <w:vAlign w:val="center"/>
+          </w:tcPr>
+          <w:p>
+            <w:pPr>
+              <w:pStyle w:val="TableContents"/>
+              <w:shd w:fill="2E3440" w:val="clear"/>
+              <w:bidi w:val="0"/>
+              <w:spacing w:before="120" w:after="120"/>
+              <w:jc w:val="left"/>
+              <w:rPr/>
+            </w:pPr>
+            <w:r>
+              <w:rPr/>
+              <w:t>repo only</w:t>
+            </w:r>
+          </w:p>
+        </w:tc>
+        <w:tc>
+          <w:tcPr>
+            <w:tcW w:w="1495" w:type="dxa"/>
             <w:tcBorders/>
             <w:vAlign w:val="center"/>
           </w:tcPr>
@@ -9333,22 +9940,58 @@
         </w:tc>
         <w:tc>
           <w:tcPr>
-            <w:tcW w:w="3377" w:type="dxa"/>
-            <w:tcBorders/>
-            <w:vAlign w:val="center"/>
-          </w:tcPr>
-          <w:p>
-            <w:pPr>
-              <w:pStyle w:val="TableContents"/>
-              <w:shd w:fill="2E3440" w:val="clear"/>
-              <w:bidi w:val="0"/>
-              <w:spacing w:before="120" w:after="120"/>
-              <w:jc w:val="left"/>
-              <w:rPr/>
-            </w:pPr>
-            <w:r>
-              <w:rPr/>
-              <w:t>each independently disables one leg of the wrap-up/clear loop</w:t>
+            <w:tcW w:w="4653" w:type="dxa"/>
+            <w:tcBorders/>
+            <w:vAlign w:val="center"/>
+          </w:tcPr>
+          <w:p>
+            <w:pPr>
+              <w:pStyle w:val="TableContents"/>
+              <w:shd w:fill="2E3440" w:val="clear"/>
+              <w:bidi w:val="0"/>
+              <w:spacing w:before="120" w:after="120"/>
+              <w:jc w:val="left"/>
+              <w:rPr/>
+            </w:pPr>
+            <w:r>
+              <w:rPr>
+                <w:rStyle w:val="SourceText"/>
+              </w:rPr>
+              <w:t>false</w:t>
+            </w:r>
+            <w:r>
+              <w:rPr/>
+              <w:t xml:space="preserve">: only a </w:t>
+            </w:r>
+            <w:r>
+              <w:rPr>
+                <w:rStyle w:val="SourceText"/>
+              </w:rPr>
+              <w:t>/crew:approve</w:t>
+            </w:r>
+            <w:r>
+              <w:rPr/>
+              <w:t xml:space="preserve"> typed by the user counts (no </w:t>
+            </w:r>
+            <w:r>
+              <w:rPr>
+                <w:rStyle w:val="SourceText"/>
+              </w:rPr>
+              <w:t>cli</w:t>
+            </w:r>
+            <w:r>
+              <w:rPr/>
+              <w:t xml:space="preserve"> or </w:t>
+            </w:r>
+            <w:r>
+              <w:rPr>
+                <w:rStyle w:val="SourceText"/>
+              </w:rPr>
+              <w:t>autopilot</w:t>
+            </w:r>
+            <w:r>
+              <w:rPr/>
+              <w:t xml:space="preserve"> receipt)</w:t>
             </w:r>
           </w:p>
         </w:tc>
@@ -9357,109 +10000,93 @@
         <w:trPr/>
         <w:tc>
           <w:tcPr>
-            <w:tcW w:w="4621" w:type="dxa"/>
-            <w:tcBorders/>
-            <w:vAlign w:val="center"/>
-          </w:tcPr>
-          <w:p>
-            <w:pPr>
-              <w:pStyle w:val="TableContents"/>
-              <w:shd w:fill="2E3440" w:val="clear"/>
-              <w:bidi w:val="0"/>
-              <w:spacing w:before="120" w:after="120"/>
-              <w:jc w:val="left"/>
-              <w:rPr/>
-            </w:pPr>
-            <w:r>
-              <w:rPr>
-                <w:rStyle w:val="SourceText"/>
-              </w:rPr>
-              <w:t>notify.provider</w:t>
-            </w:r>
-          </w:p>
-        </w:tc>
-        <w:tc>
-          <w:tcPr>
-            <w:tcW w:w="1551" w:type="dxa"/>
-            <w:tcBorders/>
-            <w:vAlign w:val="center"/>
-          </w:tcPr>
-          <w:p>
-            <w:pPr>
-              <w:pStyle w:val="TableContents"/>
-              <w:shd w:fill="2E3440" w:val="clear"/>
-              <w:bidi w:val="0"/>
-              <w:spacing w:before="120" w:after="120"/>
-              <w:jc w:val="left"/>
-              <w:rPr/>
-            </w:pPr>
-            <w:r>
-              <w:rPr/>
-              <w:t>both layers</w:t>
-            </w:r>
-          </w:p>
-        </w:tc>
-        <w:tc>
-          <w:tcPr>
-            <w:tcW w:w="1790" w:type="dxa"/>
-            <w:tcBorders/>
-            <w:vAlign w:val="center"/>
-          </w:tcPr>
-          <w:p>
-            <w:pPr>
-              <w:pStyle w:val="TableContents"/>
-              <w:shd w:fill="2E3440" w:val="clear"/>
-              <w:bidi w:val="0"/>
-              <w:spacing w:before="120" w:after="120"/>
-              <w:jc w:val="left"/>
-              <w:rPr/>
-            </w:pPr>
-            <w:r>
-              <w:rPr/>
-              <w:t xml:space="preserve">provider name / </w:t>
-            </w:r>
-            <w:r>
-              <w:rPr>
-                <w:rStyle w:val="SourceText"/>
-              </w:rPr>
-              <w:t>none</w:t>
-            </w:r>
-          </w:p>
-        </w:tc>
-        <w:tc>
-          <w:tcPr>
-            <w:tcW w:w="3377" w:type="dxa"/>
-            <w:tcBorders/>
-            <w:vAlign w:val="center"/>
-          </w:tcPr>
-          <w:p>
-            <w:pPr>
-              <w:pStyle w:val="TableContents"/>
-              <w:shd w:fill="2E3440" w:val="clear"/>
-              <w:bidi w:val="0"/>
-              <w:spacing w:before="120" w:after="120"/>
-              <w:jc w:val="left"/>
-              <w:rPr/>
-            </w:pPr>
-            <w:r>
-              <w:rPr>
-                <w:rStyle w:val="SourceText"/>
-              </w:rPr>
-              <w:t>none</w:t>
-            </w:r>
-            <w:r>
-              <w:rPr/>
-              <w:t xml:space="preserve">: the </w:t>
-            </w:r>
-            <w:r>
-              <w:rPr>
-                <w:rStyle w:val="SourceText"/>
-              </w:rPr>
-              <w:t>Notification</w:t>
-            </w:r>
-            <w:r>
-              <w:rPr/>
-              <w:t xml:space="preserve"> hook sends nothing</w:t>
+            <w:tcW w:w="3919" w:type="dxa"/>
+            <w:tcBorders/>
+            <w:vAlign w:val="center"/>
+          </w:tcPr>
+          <w:p>
+            <w:pPr>
+              <w:pStyle w:val="TableContents"/>
+              <w:shd w:fill="2E3440" w:val="clear"/>
+              <w:bidi w:val="0"/>
+              <w:spacing w:before="120" w:after="120"/>
+              <w:jc w:val="left"/>
+              <w:rPr/>
+            </w:pPr>
+            <w:r>
+              <w:rPr>
+                <w:rStyle w:val="SourceText"/>
+              </w:rPr>
+              <w:t>verifyGate</w:t>
+            </w:r>
+          </w:p>
+        </w:tc>
+        <w:tc>
+          <w:tcPr>
+            <w:tcW w:w="1272" w:type="dxa"/>
+            <w:tcBorders/>
+            <w:vAlign w:val="center"/>
+          </w:tcPr>
+          <w:p>
+            <w:pPr>
+              <w:pStyle w:val="TableContents"/>
+              <w:shd w:fill="2E3440" w:val="clear"/>
+              <w:bidi w:val="0"/>
+              <w:spacing w:before="120" w:after="120"/>
+              <w:jc w:val="left"/>
+              <w:rPr/>
+            </w:pPr>
+            <w:r>
+              <w:rPr/>
+              <w:t>repo only</w:t>
+            </w:r>
+          </w:p>
+        </w:tc>
+        <w:tc>
+          <w:tcPr>
+            <w:tcW w:w="1495" w:type="dxa"/>
+            <w:tcBorders/>
+            <w:vAlign w:val="center"/>
+          </w:tcPr>
+          <w:p>
+            <w:pPr>
+              <w:pStyle w:val="TableContents"/>
+              <w:shd w:fill="2E3440" w:val="clear"/>
+              <w:bidi w:val="0"/>
+              <w:spacing w:before="120" w:after="120"/>
+              <w:jc w:val="left"/>
+              <w:rPr/>
+            </w:pPr>
+            <w:r>
+              <w:rPr/>
+              <w:t>bool</w:t>
+            </w:r>
+          </w:p>
+        </w:tc>
+        <w:tc>
+          <w:tcPr>
+            <w:tcW w:w="4653" w:type="dxa"/>
+            <w:tcBorders/>
+            <w:vAlign w:val="center"/>
+          </w:tcPr>
+          <w:p>
+            <w:pPr>
+              <w:pStyle w:val="TableContents"/>
+              <w:shd w:fill="2E3440" w:val="clear"/>
+              <w:bidi w:val="0"/>
+              <w:spacing w:before="120" w:after="120"/>
+              <w:jc w:val="left"/>
+              <w:rPr/>
+            </w:pPr>
+            <w:r>
+              <w:rPr>
+                <w:rStyle w:val="SourceText"/>
+              </w:rPr>
+              <w:t>false</w:t>
+            </w:r>
+            <w:r>
+              <w:rPr/>
+              <w:t>: the Stop verify gate does not run at all</w:t>
             </w:r>
           </w:p>
         </w:tc>
@@ -9468,51 +10095,51 @@
         <w:trPr/>
         <w:tc>
           <w:tcPr>
-            <w:tcW w:w="4621" w:type="dxa"/>
-            <w:tcBorders/>
-            <w:vAlign w:val="center"/>
-          </w:tcPr>
-          <w:p>
-            <w:pPr>
-              <w:pStyle w:val="TableContents"/>
-              <w:shd w:fill="2E3440" w:val="clear"/>
-              <w:bidi w:val="0"/>
-              <w:spacing w:before="120" w:after="120"/>
-              <w:jc w:val="left"/>
-              <w:rPr/>
-            </w:pPr>
-            <w:r>
-              <w:rPr>
-                <w:rStyle w:val="SourceText"/>
-              </w:rPr>
-              <w:t>change.requireForProduction</w:t>
-            </w:r>
-          </w:p>
-        </w:tc>
-        <w:tc>
-          <w:tcPr>
-            <w:tcW w:w="1551" w:type="dxa"/>
-            <w:tcBorders/>
-            <w:vAlign w:val="center"/>
-          </w:tcPr>
-          <w:p>
-            <w:pPr>
-              <w:pStyle w:val="TableContents"/>
-              <w:shd w:fill="2E3440" w:val="clear"/>
-              <w:bidi w:val="0"/>
-              <w:spacing w:before="120" w:after="120"/>
-              <w:jc w:val="left"/>
-              <w:rPr/>
-            </w:pPr>
-            <w:r>
-              <w:rPr/>
-              <w:t>both layers, ratchets (may only turn ON)</w:t>
-            </w:r>
-          </w:p>
-        </w:tc>
-        <w:tc>
-          <w:tcPr>
-            <w:tcW w:w="1790" w:type="dxa"/>
+            <w:tcW w:w="3919" w:type="dxa"/>
+            <w:tcBorders/>
+            <w:vAlign w:val="center"/>
+          </w:tcPr>
+          <w:p>
+            <w:pPr>
+              <w:pStyle w:val="TableContents"/>
+              <w:shd w:fill="2E3440" w:val="clear"/>
+              <w:bidi w:val="0"/>
+              <w:spacing w:before="120" w:after="120"/>
+              <w:jc w:val="left"/>
+              <w:rPr/>
+            </w:pPr>
+            <w:r>
+              <w:rPr>
+                <w:rStyle w:val="SourceText"/>
+              </w:rPr>
+              <w:t>context.enabled</w:t>
+            </w:r>
+          </w:p>
+        </w:tc>
+        <w:tc>
+          <w:tcPr>
+            <w:tcW w:w="1272" w:type="dxa"/>
+            <w:tcBorders/>
+            <w:vAlign w:val="center"/>
+          </w:tcPr>
+          <w:p>
+            <w:pPr>
+              <w:pStyle w:val="TableContents"/>
+              <w:shd w:fill="2E3440" w:val="clear"/>
+              <w:bidi w:val="0"/>
+              <w:spacing w:before="120" w:after="120"/>
+              <w:jc w:val="left"/>
+              <w:rPr/>
+            </w:pPr>
+            <w:r>
+              <w:rPr/>
+              <w:t>both layers</w:t>
+            </w:r>
+          </w:p>
+        </w:tc>
+        <w:tc>
+          <w:tcPr>
+            <w:tcW w:w="1495" w:type="dxa"/>
             <w:tcBorders/>
             <w:vAlign w:val="center"/>
           </w:tcPr>
@@ -9533,7 +10160,7 @@
         </w:tc>
         <w:tc>
           <w:tcPr>
-            <w:tcW w:w="3377" w:type="dxa"/>
+            <w:tcW w:w="4653" w:type="dxa"/>
             <w:tcBorders/>
             <w:vAlign w:val="center"/>
           </w:tcPr>
@@ -9554,7 +10181,17 @@
             </w:r>
             <w:r>
               <w:rPr/>
-              <w:t>: promoting needs no approved change request</w:t>
+              <w:t xml:space="preserve">: </w:t>
+            </w:r>
+            <w:r>
+              <w:rPr>
+                <w:rStyle w:val="SourceText"/>
+              </w:rPr>
+              <w:t>context-watch.sh</w:t>
+            </w:r>
+            <w:r>
+              <w:rPr/>
+              <w:t xml:space="preserve"> (the Stop nag) does nothing</w:t>
             </w:r>
           </w:p>
         </w:tc>
@@ -9563,7 +10200,312 @@
         <w:trPr/>
         <w:tc>
           <w:tcPr>
-            <w:tcW w:w="4621" w:type="dxa"/>
+            <w:tcW w:w="3919" w:type="dxa"/>
+            <w:tcBorders/>
+            <w:vAlign w:val="center"/>
+          </w:tcPr>
+          <w:p>
+            <w:pPr>
+              <w:pStyle w:val="TableContents"/>
+              <w:shd w:fill="2E3440" w:val="clear"/>
+              <w:bidi w:val="0"/>
+              <w:spacing w:before="120" w:after="120"/>
+              <w:jc w:val="left"/>
+              <w:rPr/>
+            </w:pPr>
+            <w:r>
+              <w:rPr>
+                <w:rStyle w:val="SourceText"/>
+              </w:rPr>
+              <w:t>context.autoClear.enabled</w:t>
+            </w:r>
+            <w:r>
+              <w:rPr/>
+              <w:t xml:space="preserve">, </w:t>
+            </w:r>
+            <w:r>
+              <w:rPr>
+                <w:rStyle w:val="SourceText"/>
+              </w:rPr>
+              <w:t>autoWrapUp</w:t>
+            </w:r>
+          </w:p>
+        </w:tc>
+        <w:tc>
+          <w:tcPr>
+            <w:tcW w:w="1272" w:type="dxa"/>
+            <w:tcBorders/>
+            <w:vAlign w:val="center"/>
+          </w:tcPr>
+          <w:p>
+            <w:pPr>
+              <w:pStyle w:val="TableContents"/>
+              <w:shd w:fill="2E3440" w:val="clear"/>
+              <w:bidi w:val="0"/>
+              <w:spacing w:before="120" w:after="120"/>
+              <w:jc w:val="left"/>
+              <w:rPr/>
+            </w:pPr>
+            <w:r>
+              <w:rPr/>
+              <w:t>both layers</w:t>
+            </w:r>
+          </w:p>
+        </w:tc>
+        <w:tc>
+          <w:tcPr>
+            <w:tcW w:w="1495" w:type="dxa"/>
+            <w:tcBorders/>
+            <w:vAlign w:val="center"/>
+          </w:tcPr>
+          <w:p>
+            <w:pPr>
+              <w:pStyle w:val="TableContents"/>
+              <w:shd w:fill="2E3440" w:val="clear"/>
+              <w:bidi w:val="0"/>
+              <w:spacing w:before="120" w:after="120"/>
+              <w:jc w:val="left"/>
+              <w:rPr/>
+            </w:pPr>
+            <w:r>
+              <w:rPr/>
+              <w:t>bool</w:t>
+            </w:r>
+          </w:p>
+        </w:tc>
+        <w:tc>
+          <w:tcPr>
+            <w:tcW w:w="4653" w:type="dxa"/>
+            <w:tcBorders/>
+            <w:vAlign w:val="center"/>
+          </w:tcPr>
+          <w:p>
+            <w:pPr>
+              <w:pStyle w:val="TableContents"/>
+              <w:shd w:fill="2E3440" w:val="clear"/>
+              <w:bidi w:val="0"/>
+              <w:spacing w:before="120" w:after="120"/>
+              <w:jc w:val="left"/>
+              <w:rPr/>
+            </w:pPr>
+            <w:r>
+              <w:rPr/>
+              <w:t>each independently disables one leg of the wrap-up/clear loop</w:t>
+            </w:r>
+          </w:p>
+        </w:tc>
+      </w:tr>
+      <w:tr>
+        <w:trPr/>
+        <w:tc>
+          <w:tcPr>
+            <w:tcW w:w="3919" w:type="dxa"/>
+            <w:tcBorders/>
+            <w:vAlign w:val="center"/>
+          </w:tcPr>
+          <w:p>
+            <w:pPr>
+              <w:pStyle w:val="TableContents"/>
+              <w:shd w:fill="2E3440" w:val="clear"/>
+              <w:bidi w:val="0"/>
+              <w:spacing w:before="120" w:after="120"/>
+              <w:jc w:val="left"/>
+              <w:rPr/>
+            </w:pPr>
+            <w:r>
+              <w:rPr>
+                <w:rStyle w:val="SourceText"/>
+              </w:rPr>
+              <w:t>notify.provider</w:t>
+            </w:r>
+          </w:p>
+        </w:tc>
+        <w:tc>
+          <w:tcPr>
+            <w:tcW w:w="1272" w:type="dxa"/>
+            <w:tcBorders/>
+            <w:vAlign w:val="center"/>
+          </w:tcPr>
+          <w:p>
+            <w:pPr>
+              <w:pStyle w:val="TableContents"/>
+              <w:shd w:fill="2E3440" w:val="clear"/>
+              <w:bidi w:val="0"/>
+              <w:spacing w:before="120" w:after="120"/>
+              <w:jc w:val="left"/>
+              <w:rPr/>
+            </w:pPr>
+            <w:r>
+              <w:rPr/>
+              <w:t>both layers</w:t>
+            </w:r>
+          </w:p>
+        </w:tc>
+        <w:tc>
+          <w:tcPr>
+            <w:tcW w:w="1495" w:type="dxa"/>
+            <w:tcBorders/>
+            <w:vAlign w:val="center"/>
+          </w:tcPr>
+          <w:p>
+            <w:pPr>
+              <w:pStyle w:val="TableContents"/>
+              <w:shd w:fill="2E3440" w:val="clear"/>
+              <w:bidi w:val="0"/>
+              <w:spacing w:before="120" w:after="120"/>
+              <w:jc w:val="left"/>
+              <w:rPr/>
+            </w:pPr>
+            <w:r>
+              <w:rPr/>
+              <w:t xml:space="preserve">provider name / </w:t>
+            </w:r>
+            <w:r>
+              <w:rPr>
+                <w:rStyle w:val="SourceText"/>
+              </w:rPr>
+              <w:t>none</w:t>
+            </w:r>
+          </w:p>
+        </w:tc>
+        <w:tc>
+          <w:tcPr>
+            <w:tcW w:w="4653" w:type="dxa"/>
+            <w:tcBorders/>
+            <w:vAlign w:val="center"/>
+          </w:tcPr>
+          <w:p>
+            <w:pPr>
+              <w:pStyle w:val="TableContents"/>
+              <w:shd w:fill="2E3440" w:val="clear"/>
+              <w:bidi w:val="0"/>
+              <w:spacing w:before="120" w:after="120"/>
+              <w:jc w:val="left"/>
+              <w:rPr/>
+            </w:pPr>
+            <w:r>
+              <w:rPr>
+                <w:rStyle w:val="SourceText"/>
+              </w:rPr>
+              <w:t>none</w:t>
+            </w:r>
+            <w:r>
+              <w:rPr/>
+              <w:t xml:space="preserve">: the </w:t>
+            </w:r>
+            <w:r>
+              <w:rPr>
+                <w:rStyle w:val="SourceText"/>
+              </w:rPr>
+              <w:t>Notification</w:t>
+            </w:r>
+            <w:r>
+              <w:rPr/>
+              <w:t xml:space="preserve"> hook sends nothing</w:t>
+            </w:r>
+          </w:p>
+        </w:tc>
+      </w:tr>
+      <w:tr>
+        <w:trPr/>
+        <w:tc>
+          <w:tcPr>
+            <w:tcW w:w="3919" w:type="dxa"/>
+            <w:tcBorders/>
+            <w:vAlign w:val="center"/>
+          </w:tcPr>
+          <w:p>
+            <w:pPr>
+              <w:pStyle w:val="TableContents"/>
+              <w:shd w:fill="2E3440" w:val="clear"/>
+              <w:bidi w:val="0"/>
+              <w:spacing w:before="120" w:after="120"/>
+              <w:jc w:val="left"/>
+              <w:rPr/>
+            </w:pPr>
+            <w:r>
+              <w:rPr>
+                <w:rStyle w:val="SourceText"/>
+              </w:rPr>
+              <w:t>change.requireForProduction</w:t>
+            </w:r>
+          </w:p>
+        </w:tc>
+        <w:tc>
+          <w:tcPr>
+            <w:tcW w:w="1272" w:type="dxa"/>
+            <w:tcBorders/>
+            <w:vAlign w:val="center"/>
+          </w:tcPr>
+          <w:p>
+            <w:pPr>
+              <w:pStyle w:val="TableContents"/>
+              <w:shd w:fill="2E3440" w:val="clear"/>
+              <w:bidi w:val="0"/>
+              <w:spacing w:before="120" w:after="120"/>
+              <w:jc w:val="left"/>
+              <w:rPr/>
+            </w:pPr>
+            <w:r>
+              <w:rPr/>
+              <w:t>both layers, ratchets (may only turn ON)</w:t>
+            </w:r>
+          </w:p>
+        </w:tc>
+        <w:tc>
+          <w:tcPr>
+            <w:tcW w:w="1495" w:type="dxa"/>
+            <w:tcBorders/>
+            <w:vAlign w:val="center"/>
+          </w:tcPr>
+          <w:p>
+            <w:pPr>
+              <w:pStyle w:val="TableContents"/>
+              <w:shd w:fill="2E3440" w:val="clear"/>
+              <w:bidi w:val="0"/>
+              <w:spacing w:before="120" w:after="120"/>
+              <w:jc w:val="left"/>
+              <w:rPr/>
+            </w:pPr>
+            <w:r>
+              <w:rPr/>
+              <w:t>bool</w:t>
+            </w:r>
+          </w:p>
+        </w:tc>
+        <w:tc>
+          <w:tcPr>
+            <w:tcW w:w="4653" w:type="dxa"/>
+            <w:tcBorders/>
+            <w:vAlign w:val="center"/>
+          </w:tcPr>
+          <w:p>
+            <w:pPr>
+              <w:pStyle w:val="TableContents"/>
+              <w:shd w:fill="2E3440" w:val="clear"/>
+              <w:bidi w:val="0"/>
+              <w:spacing w:before="120" w:after="120"/>
+              <w:jc w:val="left"/>
+              <w:rPr/>
+            </w:pPr>
+            <w:r>
+              <w:rPr>
+                <w:rStyle w:val="SourceText"/>
+              </w:rPr>
+              <w:t>false</w:t>
+            </w:r>
+            <w:r>
+              <w:rPr/>
+              <w:t>: promoting needs no approved change request</w:t>
+            </w:r>
+          </w:p>
+        </w:tc>
+      </w:tr>
+      <w:tr>
+        <w:trPr/>
+        <w:tc>
+          <w:tcPr>
+            <w:tcW w:w="3919" w:type="dxa"/>
             <w:tcBorders/>
             <w:vAlign w:val="center"/>
           </w:tcPr>
@@ -9586,7 +10528,7 @@
         </w:tc>
         <w:tc>
           <w:tcPr>
-            <w:tcW w:w="1551" w:type="dxa"/>
+            <w:tcW w:w="1272" w:type="dxa"/>
             <w:tcBorders/>
             <w:vAlign w:val="center"/>
           </w:tcPr>
@@ -9607,7 +10549,7 @@
         </w:tc>
         <w:tc>
           <w:tcPr>
-            <w:tcW w:w="1790" w:type="dxa"/>
+            <w:tcW w:w="1495" w:type="dxa"/>
             <w:tcBorders/>
             <w:vAlign w:val="center"/>
           </w:tcPr>
@@ -9638,7 +10580,7 @@
         </w:tc>
         <w:tc>
           <w:tcPr>
-            <w:tcW w:w="3377" w:type="dxa"/>
+            <w:tcW w:w="4653" w:type="dxa"/>
             <w:tcBorders/>
             <w:vAlign w:val="center"/>
           </w:tcPr>
@@ -9659,6 +10601,104 @@
         </w:tc>
       </w:tr>
     </w:tbl>
+    <w:p>
+      <w:pPr>
+        <w:pStyle w:val="BodyText"/>
+        <w:bidi w:val="0"/>
+        <w:jc w:val="left"/>
+        <w:rPr/>
+      </w:pPr>
+      <w:r>
+        <w:rPr>
+          <w:rStyle w:val="Strong"/>
+        </w:rPr>
+        <w:t>A destroy is never applied unattended</w:t>
+      </w:r>
+      <w:r>
+        <w:rPr/>
+        <w:t xml:space="preserve">, at any setting: </w:t>
+      </w:r>
+      <w:r>
+        <w:rPr>
+          <w:rStyle w:val="SourceText"/>
+        </w:rPr>
+        <w:t>destroy</w:t>
+      </w:r>
+      <w:r>
+        <w:rPr/>
+        <w:t xml:space="preserve">, </w:t>
+      </w:r>
+      <w:r>
+        <w:rPr>
+          <w:rStyle w:val="SourceText"/>
+        </w:rPr>
+        <w:t>apply -destroy</w:t>
+      </w:r>
+      <w:r>
+        <w:rPr/>
+        <w:t xml:space="preserve">, </w:t>
+      </w:r>
+      <w:r>
+        <w:rPr>
+          <w:rStyle w:val="SourceText"/>
+        </w:rPr>
+        <w:t>-replace</w:t>
+      </w:r>
+      <w:r>
+        <w:rPr/>
+        <w:t xml:space="preserve">, </w:t>
+      </w:r>
+      <w:r>
+        <w:rPr>
+          <w:rStyle w:val="SourceText"/>
+        </w:rPr>
+        <w:t>workspace delete</w:t>
+      </w:r>
+      <w:r>
+        <w:rPr/>
+        <w:t xml:space="preserve">, a saved plan whose sidecar lists a delete, or an apply with no sidecar at all asks when you are there and is denied unattended — </w:t>
+      </w:r>
+      <w:r>
+        <w:rPr>
+          <w:rStyle w:val="SourceText"/>
+        </w:rPr>
+        <w:t>terraformApply: allow</w:t>
+      </w:r>
+      <w:r>
+        <w:rPr/>
+        <w:t xml:space="preserve"> and </w:t>
+      </w:r>
+      <w:r>
+        <w:rPr>
+          <w:rStyle w:val="SourceText"/>
+        </w:rPr>
+        <w:t>environments.prodUnattended</w:t>
+      </w:r>
+      <w:r>
+        <w:rPr/>
+        <w:t xml:space="preserve"> included. The full decision table is in </w:t>
+      </w:r>
+      <w:r>
+        <w:rPr>
+          <w:rStyle w:val="SourceText"/>
+        </w:rPr>
+        <w:t>plugin/crew/CONFIG.md</w:t>
+      </w:r>
+      <w:r>
+        <w:rPr/>
+        <w:t xml:space="preserve"> (</w:t>
+      </w:r>
+      <w:r>
+        <w:rPr>
+          <w:rStyle w:val="SourceText"/>
+        </w:rPr>
+        <w:t>environments.*</w:t>
+      </w:r>
+      <w:r>
+        <w:rPr/>
+        <w:t>).</w:t>
+      </w:r>
+    </w:p>
     <w:p>
       <w:pPr>
         <w:pStyle w:val="BodyText"/>

</xml_diff>

<commit_message>
L-0604: R5 and the proposals docstring say a shortfall admission is INCOMPLETE only when it matches the wording list
R5, crew_standards.proposals' docstring, the README verdict-table row and the
troubleshooting guide (rebuilt) state the rule the parser applies:
review_verdict._SHORTFALL is a wording net that cannot be complete, so an
admission it misses is recovered as prose beside findings (FINDINGS) and
reported as ignored. Two tests pin the repro. No behaviour change.
</commit_message>
<xml_diff>
--- a/docs/guides/crew/crew-1.0-troubleshooting.docx
+++ b/docs/guides/crew/crew-1.0-troubleshooting.docx
@@ -3420,11 +3420,21 @@
         <w:rPr>
           <w:rStyle w:val="SourceText"/>
         </w:rPr>
+        <w:t>ignored_text</w:t>
+      </w:r>
+      <w:r>
+        <w:rPr/>
+        <w:t xml:space="preserve"> (</w:t>
+      </w:r>
+      <w:r>
+        <w:rPr>
+          <w:rStyle w:val="SourceText"/>
+        </w:rPr>
         <w:t>ignored_lines</w:t>
       </w:r>
       <w:r>
         <w:rPr/>
-        <w:t xml:space="preserve">. A stray line beside </w:t>
+        <w:t xml:space="preserve"> is their count). A stray line beside </w:t>
       </w:r>
       <w:r>
         <w:rPr>
@@ -3464,7 +3474,7 @@
       </w:r>
       <w:r>
         <w:rPr/>
-        <w:t xml:space="preserve"> table row) or a line admitting the review fell short ("skipped", "truncated", "could not review") is still INCOMPLETE </w:t>
+        <w:t xml:space="preserve"> table row) or a line matching the shortfall wording list ("skipped", "truncated", "could not review") is still INCOMPLETE </w:t>
       </w:r>
       <w:r>
         <w:rPr>
@@ -3474,7 +3484,7 @@
       </w:r>
       <w:r>
         <w:rPr/>
-        <w:t xml:space="preserve">. </w:t>
+        <w:t xml:space="preserve">. That list cannot catch every admission: one it misses ("I only inspected one of the nine files") is ignored as prose and the round stays FINDINGS, so read the ignored lines. </w:t>
       </w:r>
       <w:r>
         <w:rPr>

</xml_diff>

<commit_message>
L-0604: after merging main f808e5f0 - troubleshooting DOCX/PDF rebuilt from the merged source, BUDGETS count re-measured (22,058)
</commit_message>
<xml_diff>
--- a/docs/guides/crew/crew-1.0-troubleshooting.docx
+++ b/docs/guides/crew/crew-1.0-troubleshooting.docx
@@ -3534,7 +3534,7 @@
       </w:r>
       <w:r>
         <w:rPr/>
-        <w:t xml:space="preserve"> table row) or a line admitting the review fell short ("skipped", "truncated", "could not review") is still INCOMPLETE </w:t>
+        <w:t xml:space="preserve"> table row) or a line matching the shortfall wording list ("skipped", "truncated", "could not review") is still INCOMPLETE </w:t>
       </w:r>
       <w:r>
         <w:rPr>
@@ -3544,7 +3544,7 @@
       </w:r>
       <w:r>
         <w:rPr/>
-        <w:t xml:space="preserve">. </w:t>
+        <w:t xml:space="preserve">. That list cannot catch every admission: one it misses ("I only inspected one of the nine files") is ignored as prose and the round stays FINDINGS, so read the ignored lines. </w:t>
       </w:r>
       <w:r>
         <w:rPr>

</xml_diff>

<commit_message>
T-0009: rebuild the troubleshooting guide (HTML, DOCX, PDF) after the merge of main f808e5f0 (build.py --guide troubleshooting)
</commit_message>
<xml_diff>
--- a/docs/guides/crew/crew-1.0-troubleshooting.docx
+++ b/docs/guides/crew/crew-1.0-troubleshooting.docx
@@ -545,7 +545,7 @@
     </w:p>
     <w:tbl>
       <w:tblPr>
-        <w:tblW w:w="11731" w:type="dxa"/>
+        <w:tblW w:w="12926" w:type="dxa"/>
         <w:jc w:val="left"/>
         <w:tblInd w:w="28" w:type="dxa"/>
         <w:tblLayout w:type="fixed"/>
@@ -559,8 +559,8 @@
       <w:tblGrid>
         <w:gridCol w:w="2119"/>
         <w:gridCol w:w="2456"/>
-        <w:gridCol w:w="2022"/>
-        <w:gridCol w:w="2986"/>
+        <w:gridCol w:w="2808"/>
+        <w:gridCol w:w="3395"/>
         <w:gridCol w:w="2148"/>
       </w:tblGrid>
       <w:tr>
@@ -613,7 +613,7 @@
         </w:tc>
         <w:tc>
           <w:tcPr>
-            <w:tcW w:w="2022" w:type="dxa"/>
+            <w:tcW w:w="2808" w:type="dxa"/>
             <w:tcBorders/>
             <w:vAlign w:val="center"/>
           </w:tcPr>
@@ -635,7 +635,7 @@
         </w:tc>
         <w:tc>
           <w:tcPr>
-            <w:tcW w:w="2986" w:type="dxa"/>
+            <w:tcW w:w="3395" w:type="dxa"/>
             <w:tcBorders/>
             <w:vAlign w:val="center"/>
           </w:tcPr>
@@ -728,7 +728,7 @@
         </w:tc>
         <w:tc>
           <w:tcPr>
-            <w:tcW w:w="2022" w:type="dxa"/>
+            <w:tcW w:w="2808" w:type="dxa"/>
             <w:tcBorders/>
             <w:vAlign w:val="center"/>
           </w:tcPr>
@@ -769,7 +769,7 @@
         </w:tc>
         <w:tc>
           <w:tcPr>
-            <w:tcW w:w="2986" w:type="dxa"/>
+            <w:tcW w:w="3395" w:type="dxa"/>
             <w:tcBorders/>
             <w:vAlign w:val="center"/>
           </w:tcPr>
@@ -864,7 +864,7 @@
         </w:tc>
         <w:tc>
           <w:tcPr>
-            <w:tcW w:w="2022" w:type="dxa"/>
+            <w:tcW w:w="2808" w:type="dxa"/>
             <w:tcBorders/>
             <w:vAlign w:val="center"/>
           </w:tcPr>
@@ -891,7 +891,7 @@
         </w:tc>
         <w:tc>
           <w:tcPr>
-            <w:tcW w:w="2986" w:type="dxa"/>
+            <w:tcW w:w="3395" w:type="dxa"/>
             <w:tcBorders/>
             <w:vAlign w:val="center"/>
           </w:tcPr>
@@ -1016,7 +1016,7 @@
         </w:tc>
         <w:tc>
           <w:tcPr>
-            <w:tcW w:w="2022" w:type="dxa"/>
+            <w:tcW w:w="2808" w:type="dxa"/>
             <w:tcBorders/>
             <w:vAlign w:val="center"/>
           </w:tcPr>
@@ -1037,7 +1037,7 @@
         </w:tc>
         <w:tc>
           <w:tcPr>
-            <w:tcW w:w="2986" w:type="dxa"/>
+            <w:tcW w:w="3395" w:type="dxa"/>
             <w:tcBorders/>
             <w:vAlign w:val="center"/>
           </w:tcPr>
@@ -1156,7 +1156,7 @@
         </w:tc>
         <w:tc>
           <w:tcPr>
-            <w:tcW w:w="2022" w:type="dxa"/>
+            <w:tcW w:w="2808" w:type="dxa"/>
             <w:tcBorders/>
             <w:vAlign w:val="center"/>
           </w:tcPr>
@@ -1187,7 +1187,7 @@
         </w:tc>
         <w:tc>
           <w:tcPr>
-            <w:tcW w:w="2986" w:type="dxa"/>
+            <w:tcW w:w="3395" w:type="dxa"/>
             <w:tcBorders/>
             <w:vAlign w:val="center"/>
           </w:tcPr>
@@ -1308,7 +1308,7 @@
         </w:tc>
         <w:tc>
           <w:tcPr>
-            <w:tcW w:w="2022" w:type="dxa"/>
+            <w:tcW w:w="2808" w:type="dxa"/>
             <w:tcBorders/>
             <w:vAlign w:val="center"/>
           </w:tcPr>
@@ -1335,7 +1335,7 @@
         </w:tc>
         <w:tc>
           <w:tcPr>
-            <w:tcW w:w="2986" w:type="dxa"/>
+            <w:tcW w:w="3395" w:type="dxa"/>
             <w:tcBorders/>
             <w:vAlign w:val="center"/>
           </w:tcPr>
@@ -1538,7 +1538,7 @@
         </w:tc>
         <w:tc>
           <w:tcPr>
-            <w:tcW w:w="2022" w:type="dxa"/>
+            <w:tcW w:w="2808" w:type="dxa"/>
             <w:tcBorders/>
             <w:vAlign w:val="center"/>
           </w:tcPr>
@@ -1559,7 +1559,7 @@
         </w:tc>
         <w:tc>
           <w:tcPr>
-            <w:tcW w:w="2986" w:type="dxa"/>
+            <w:tcW w:w="3395" w:type="dxa"/>
             <w:tcBorders/>
             <w:vAlign w:val="center"/>
           </w:tcPr>
@@ -1712,7 +1712,7 @@
         </w:tc>
         <w:tc>
           <w:tcPr>
-            <w:tcW w:w="2022" w:type="dxa"/>
+            <w:tcW w:w="2808" w:type="dxa"/>
             <w:tcBorders/>
             <w:vAlign w:val="center"/>
           </w:tcPr>
@@ -1747,13 +1747,33 @@
             </w:r>
             <w:r>
               <w:rPr/>
-              <w:t xml:space="preserve"> commands and wrong-identity commands</w:t>
-            </w:r>
-          </w:p>
-        </w:tc>
-        <w:tc>
-          <w:tcPr>
-            <w:tcW w:w="2986" w:type="dxa"/>
+              <w:t xml:space="preserve"> commands, wrong-identity commands, and dispatches of workflows listed in </w:t>
+            </w:r>
+            <w:r>
+              <w:rPr>
+                <w:rStyle w:val="SourceText"/>
+              </w:rPr>
+              <w:t>environments.workflows</w:t>
+            </w:r>
+            <w:r>
+              <w:rPr/>
+              <w:t xml:space="preserve"> (</w:t>
+            </w:r>
+            <w:r>
+              <w:rPr>
+                <w:rStyle w:val="SourceText"/>
+              </w:rPr>
+              <w:t>guards.deployWorkflow</w:t>
+            </w:r>
+            <w:r>
+              <w:rPr/>
+              <w:t>) — judged only when every word on the line is a plain literal or a single-quoted word; anything else asks, and is refused unattended</w:t>
+            </w:r>
+          </w:p>
+        </w:tc>
+        <w:tc>
+          <w:tcPr>
+            <w:tcW w:w="3395" w:type="dxa"/>
             <w:tcBorders/>
             <w:vAlign w:val="center"/>
           </w:tcPr>
@@ -1863,7 +1883,7 @@
               <w:rPr>
                 <w:rStyle w:val="SourceText"/>
               </w:rPr>
-              <w:t>Write</w:t>
+              <w:t>Bash</w:t>
             </w:r>
             <w:r>
               <w:rPr/>
@@ -1873,46 +1893,6 @@
               <w:rPr>
                 <w:rStyle w:val="SourceText"/>
               </w:rPr>
-              <w:t>Edit</w:t>
-            </w:r>
-            <w:r>
-              <w:rPr/>
-              <w:t>|</w:t>
-            </w:r>
-            <w:r>
-              <w:rPr>
-                <w:rStyle w:val="SourceText"/>
-              </w:rPr>
-              <w:t>MultiEdit</w:t>
-            </w:r>
-            <w:r>
-              <w:rPr/>
-              <w:t>|</w:t>
-            </w:r>
-            <w:r>
-              <w:rPr>
-                <w:rStyle w:val="SourceText"/>
-              </w:rPr>
-              <w:t>NotebookEdit</w:t>
-            </w:r>
-            <w:r>
-              <w:rPr/>
-              <w:t>|</w:t>
-            </w:r>
-            <w:r>
-              <w:rPr>
-                <w:rStyle w:val="SourceText"/>
-              </w:rPr>
-              <w:t>Bash</w:t>
-            </w:r>
-            <w:r>
-              <w:rPr/>
-              <w:t>|</w:t>
-            </w:r>
-            <w:r>
-              <w:rPr>
-                <w:rStyle w:val="SourceText"/>
-              </w:rPr>
               <w:t>PowerShell</w:t>
             </w:r>
             <w:r>
@@ -1940,101 +1920,89 @@
               <w:rPr>
                 <w:rStyle w:val="SourceText"/>
               </w:rPr>
-              <w:t>scope-guard.sh</w:t>
-            </w:r>
-          </w:p>
-        </w:tc>
-        <w:tc>
-          <w:tcPr>
-            <w:tcW w:w="2022" w:type="dxa"/>
-            <w:tcBorders/>
-            <w:vAlign w:val="center"/>
-          </w:tcPr>
-          <w:p>
-            <w:pPr>
-              <w:pStyle w:val="TableContents"/>
-              <w:shd w:fill="2E3440" w:val="clear"/>
-              <w:bidi w:val="0"/>
-              <w:spacing w:before="120" w:after="120"/>
-              <w:jc w:val="left"/>
-              <w:rPr/>
-            </w:pPr>
-            <w:r>
-              <w:rPr/>
-              <w:t>plan-approval + ticket scope guard</w:t>
-            </w:r>
-          </w:p>
-        </w:tc>
-        <w:tc>
-          <w:tcPr>
-            <w:tcW w:w="2986" w:type="dxa"/>
-            <w:tcBorders/>
-            <w:vAlign w:val="center"/>
-          </w:tcPr>
-          <w:p>
-            <w:pPr>
-              <w:pStyle w:val="TableContents"/>
-              <w:shd w:fill="2E3440" w:val="clear"/>
-              <w:bidi w:val="0"/>
-              <w:spacing w:before="120" w:after="120"/>
-              <w:jc w:val="left"/>
-              <w:rPr/>
-            </w:pPr>
-            <w:r>
-              <w:rPr>
-                <w:rStyle w:val="SourceText"/>
-              </w:rPr>
-              <w:t>scope.mode</w:t>
-            </w:r>
-            <w:r>
-              <w:rPr/>
-              <w:t xml:space="preserve"> (</w:t>
-            </w:r>
-            <w:r>
-              <w:rPr>
-                <w:rStyle w:val="SourceText"/>
-              </w:rPr>
-              <w:t>off</w:t>
-            </w:r>
-            <w:r>
-              <w:rPr/>
-              <w:t>/</w:t>
-            </w:r>
-            <w:r>
-              <w:rPr>
-                <w:rStyle w:val="SourceText"/>
-              </w:rPr>
-              <w:t>report</w:t>
-            </w:r>
-            <w:r>
-              <w:rPr/>
-              <w:t>/</w:t>
-            </w:r>
-            <w:r>
-              <w:rPr>
-                <w:rStyle w:val="SourceText"/>
-              </w:rPr>
-              <w:t>block</w:t>
-            </w:r>
-            <w:r>
-              <w:rPr/>
-              <w:t>/</w:t>
-            </w:r>
-            <w:r>
-              <w:rPr>
-                <w:rStyle w:val="SourceText"/>
-              </w:rPr>
-              <w:t>auto</w:t>
-            </w:r>
-            <w:r>
-              <w:rPr/>
-              <w:t xml:space="preserve">), </w:t>
-            </w:r>
-            <w:r>
-              <w:rPr>
-                <w:rStyle w:val="SourceText"/>
-              </w:rPr>
-              <w:t>scope.allowCliApproval</w:t>
+              <w:t>cloud-guard.sh</w:t>
+            </w:r>
+            <w:r>
+              <w:rPr/>
+              <w:t>, environment layer (T-0005)</w:t>
+            </w:r>
+          </w:p>
+        </w:tc>
+        <w:tc>
+          <w:tcPr>
+            <w:tcW w:w="2808" w:type="dxa"/>
+            <w:tcBorders/>
+            <w:vAlign w:val="center"/>
+          </w:tcPr>
+          <w:p>
+            <w:pPr>
+              <w:pStyle w:val="TableContents"/>
+              <w:shd w:fill="2E3440" w:val="clear"/>
+              <w:bidi w:val="0"/>
+              <w:spacing w:before="120" w:after="120"/>
+              <w:jc w:val="left"/>
+              <w:rPr/>
+            </w:pPr>
+            <w:r>
+              <w:rPr/>
+              <w:t>a terraform apply judged by its target environment, and a destroy never applied unattended</w:t>
+            </w:r>
+          </w:p>
+        </w:tc>
+        <w:tc>
+          <w:tcPr>
+            <w:tcW w:w="3395" w:type="dxa"/>
+            <w:tcBorders/>
+            <w:vAlign w:val="center"/>
+          </w:tcPr>
+          <w:p>
+            <w:pPr>
+              <w:pStyle w:val="TableContents"/>
+              <w:shd w:fill="2E3440" w:val="clear"/>
+              <w:bidi w:val="0"/>
+              <w:spacing w:before="120" w:after="120"/>
+              <w:jc w:val="left"/>
+              <w:rPr/>
+            </w:pPr>
+            <w:r>
+              <w:rPr>
+                <w:rStyle w:val="SourceText"/>
+              </w:rPr>
+              <w:t>environments.nonProd</w:t>
+            </w:r>
+            <w:r>
+              <w:rPr/>
+              <w:t xml:space="preserve"> (repo only; globs naming non-production workspaces), </w:t>
+            </w:r>
+            <w:r>
+              <w:rPr>
+                <w:rStyle w:val="SourceText"/>
+              </w:rPr>
+              <w:t>environments.prodUnattended</w:t>
+            </w:r>
+            <w:r>
+              <w:rPr/>
+              <w:t xml:space="preserve"> (both layers; true only when </w:t>
+            </w:r>
+            <w:r>
+              <w:rPr>
+                <w:rStyle w:val="Strong"/>
+              </w:rPr>
+              <w:t>both</w:t>
+            </w:r>
+            <w:r>
+              <w:rPr/>
+              <w:t xml:space="preserve"> say </w:t>
+            </w:r>
+            <w:r>
+              <w:rPr>
+                <w:rStyle w:val="SourceText"/>
+              </w:rPr>
+              <w:t>true</w:t>
+            </w:r>
+            <w:r>
+              <w:rPr/>
+              <w:t>)</w:t>
             </w:r>
           </w:p>
         </w:tc>
@@ -2057,7 +2025,7 @@
               <w:rPr>
                 <w:rStyle w:val="SourceText"/>
               </w:rPr>
-              <w:t>off</w:t>
+              <w:t>[]</w:t>
             </w:r>
             <w:r>
               <w:rPr/>
@@ -2093,7 +2061,71 @@
               <w:rPr>
                 <w:rStyle w:val="SourceText"/>
               </w:rPr>
-              <w:t>PreCompact</w:t>
+              <w:t>PreToolUse</w:t>
+            </w:r>
+            <w:r>
+              <w:rPr/>
+              <w:t xml:space="preserve"> (</w:t>
+            </w:r>
+            <w:r>
+              <w:rPr>
+                <w:rStyle w:val="SourceText"/>
+              </w:rPr>
+              <w:t>Write</w:t>
+            </w:r>
+            <w:r>
+              <w:rPr/>
+              <w:t>|</w:t>
+            </w:r>
+            <w:r>
+              <w:rPr>
+                <w:rStyle w:val="SourceText"/>
+              </w:rPr>
+              <w:t>Edit</w:t>
+            </w:r>
+            <w:r>
+              <w:rPr/>
+              <w:t>|</w:t>
+            </w:r>
+            <w:r>
+              <w:rPr>
+                <w:rStyle w:val="SourceText"/>
+              </w:rPr>
+              <w:t>MultiEdit</w:t>
+            </w:r>
+            <w:r>
+              <w:rPr/>
+              <w:t>|</w:t>
+            </w:r>
+            <w:r>
+              <w:rPr>
+                <w:rStyle w:val="SourceText"/>
+              </w:rPr>
+              <w:t>NotebookEdit</w:t>
+            </w:r>
+            <w:r>
+              <w:rPr/>
+              <w:t>|</w:t>
+            </w:r>
+            <w:r>
+              <w:rPr>
+                <w:rStyle w:val="SourceText"/>
+              </w:rPr>
+              <w:t>Bash</w:t>
+            </w:r>
+            <w:r>
+              <w:rPr/>
+              <w:t>|</w:t>
+            </w:r>
+            <w:r>
+              <w:rPr>
+                <w:rStyle w:val="SourceText"/>
+              </w:rPr>
+              <w:t>PowerShell</w:t>
+            </w:r>
+            <w:r>
+              <w:rPr/>
+              <w:t>)</w:t>
             </w:r>
           </w:p>
         </w:tc>
@@ -2116,51 +2148,124 @@
               <w:rPr>
                 <w:rStyle w:val="SourceText"/>
               </w:rPr>
-              <w:t>handoff-write.sh</w:t>
-            </w:r>
-          </w:p>
-        </w:tc>
-        <w:tc>
-          <w:tcPr>
-            <w:tcW w:w="2022" w:type="dxa"/>
-            <w:tcBorders/>
-            <w:vAlign w:val="center"/>
-          </w:tcPr>
-          <w:p>
-            <w:pPr>
-              <w:pStyle w:val="TableContents"/>
-              <w:shd w:fill="2E3440" w:val="clear"/>
-              <w:bidi w:val="0"/>
-              <w:spacing w:before="120" w:after="120"/>
-              <w:jc w:val="left"/>
-              <w:rPr/>
-            </w:pPr>
-            <w:r>
-              <w:rPr/>
-              <w:t>writes the handoff note before compaction</w:t>
-            </w:r>
-          </w:p>
-        </w:tc>
-        <w:tc>
-          <w:tcPr>
-            <w:tcW w:w="2986" w:type="dxa"/>
-            <w:tcBorders/>
-            <w:vAlign w:val="center"/>
-          </w:tcPr>
-          <w:p>
-            <w:pPr>
-              <w:pStyle w:val="TableContents"/>
-              <w:shd w:fill="2E3440" w:val="clear"/>
-              <w:bidi w:val="0"/>
-              <w:spacing w:before="120" w:after="120"/>
-              <w:jc w:val="left"/>
-              <w:rPr/>
-            </w:pPr>
-            <w:r>
-              <w:rPr>
-                <w:rStyle w:val="SourceText"/>
-              </w:rPr>
-              <w:t>context.autoWrapUp</w:t>
+              <w:t>scope-guard.sh</w:t>
+            </w:r>
+          </w:p>
+        </w:tc>
+        <w:tc>
+          <w:tcPr>
+            <w:tcW w:w="2808" w:type="dxa"/>
+            <w:tcBorders/>
+            <w:vAlign w:val="center"/>
+          </w:tcPr>
+          <w:p>
+            <w:pPr>
+              <w:pStyle w:val="TableContents"/>
+              <w:shd w:fill="2E3440" w:val="clear"/>
+              <w:bidi w:val="0"/>
+              <w:spacing w:before="120" w:after="120"/>
+              <w:jc w:val="left"/>
+              <w:rPr/>
+            </w:pPr>
+            <w:r>
+              <w:rPr/>
+              <w:t>plan-approval + ticket scope guard</w:t>
+            </w:r>
+          </w:p>
+        </w:tc>
+        <w:tc>
+          <w:tcPr>
+            <w:tcW w:w="3395" w:type="dxa"/>
+            <w:tcBorders/>
+            <w:vAlign w:val="center"/>
+          </w:tcPr>
+          <w:p>
+            <w:pPr>
+              <w:pStyle w:val="TableContents"/>
+              <w:shd w:fill="2E3440" w:val="clear"/>
+              <w:bidi w:val="0"/>
+              <w:spacing w:before="120" w:after="120"/>
+              <w:jc w:val="left"/>
+              <w:rPr/>
+            </w:pPr>
+            <w:r>
+              <w:rPr>
+                <w:rStyle w:val="SourceText"/>
+              </w:rPr>
+              <w:t>scope.mode</w:t>
+            </w:r>
+            <w:r>
+              <w:rPr/>
+              <w:t xml:space="preserve"> (</w:t>
+            </w:r>
+            <w:r>
+              <w:rPr>
+                <w:rStyle w:val="SourceText"/>
+              </w:rPr>
+              <w:t>off</w:t>
+            </w:r>
+            <w:r>
+              <w:rPr/>
+              <w:t>/</w:t>
+            </w:r>
+            <w:r>
+              <w:rPr>
+                <w:rStyle w:val="SourceText"/>
+              </w:rPr>
+              <w:t>report</w:t>
+            </w:r>
+            <w:r>
+              <w:rPr/>
+              <w:t>/</w:t>
+            </w:r>
+            <w:r>
+              <w:rPr>
+                <w:rStyle w:val="SourceText"/>
+              </w:rPr>
+              <w:t>block</w:t>
+            </w:r>
+            <w:r>
+              <w:rPr/>
+              <w:t>/</w:t>
+            </w:r>
+            <w:r>
+              <w:rPr>
+                <w:rStyle w:val="SourceText"/>
+              </w:rPr>
+              <w:t>auto</w:t>
+            </w:r>
+            <w:r>
+              <w:rPr/>
+              <w:t xml:space="preserve">), </w:t>
+            </w:r>
+            <w:r>
+              <w:rPr>
+                <w:rStyle w:val="SourceText"/>
+              </w:rPr>
+              <w:t>scope.allowCliApproval</w:t>
+            </w:r>
+          </w:p>
+        </w:tc>
+        <w:tc>
+          <w:tcPr>
+            <w:tcW w:w="2148" w:type="dxa"/>
+            <w:tcBorders/>
+            <w:vAlign w:val="center"/>
+          </w:tcPr>
+          <w:p>
+            <w:pPr>
+              <w:pStyle w:val="TableContents"/>
+              <w:shd w:fill="2E3440" w:val="clear"/>
+              <w:bidi w:val="0"/>
+              <w:spacing w:before="120" w:after="120"/>
+              <w:jc w:val="left"/>
+              <w:rPr/>
+            </w:pPr>
+            <w:r>
+              <w:rPr>
+                <w:rStyle w:val="SourceText"/>
+              </w:rPr>
+              <w:t>off</w:t>
             </w:r>
             <w:r>
               <w:rPr/>
@@ -2170,28 +2275,7 @@
               <w:rPr>
                 <w:rStyle w:val="SourceText"/>
               </w:rPr>
-              <w:t>context.handoffPath</w:t>
-            </w:r>
-          </w:p>
-        </w:tc>
-        <w:tc>
-          <w:tcPr>
-            <w:tcW w:w="2148" w:type="dxa"/>
-            <w:tcBorders/>
-            <w:vAlign w:val="center"/>
-          </w:tcPr>
-          <w:p>
-            <w:pPr>
-              <w:pStyle w:val="TableContents"/>
-              <w:shd w:fill="2E3440" w:val="clear"/>
-              <w:bidi w:val="0"/>
-              <w:spacing w:before="120" w:after="120"/>
-              <w:jc w:val="left"/>
-              <w:rPr/>
-            </w:pPr>
-            <w:r>
-              <w:rPr/>
-              <w:t>on</w:t>
+              <w:t>false</w:t>
             </w:r>
           </w:p>
         </w:tc>
@@ -2217,7 +2301,7 @@
               <w:rPr>
                 <w:rStyle w:val="SourceText"/>
               </w:rPr>
-              <w:t>Notification</w:t>
+              <w:t>PreCompact</w:t>
             </w:r>
           </w:p>
         </w:tc>
@@ -2240,71 +2324,61 @@
               <w:rPr>
                 <w:rStyle w:val="SourceText"/>
               </w:rPr>
-              <w:t>notify.sh</w:t>
-            </w:r>
-          </w:p>
-        </w:tc>
-        <w:tc>
-          <w:tcPr>
-            <w:tcW w:w="2022" w:type="dxa"/>
-            <w:tcBorders/>
-            <w:vAlign w:val="center"/>
-          </w:tcPr>
-          <w:p>
-            <w:pPr>
-              <w:pStyle w:val="TableContents"/>
-              <w:shd w:fill="2E3440" w:val="clear"/>
-              <w:bidi w:val="0"/>
-              <w:spacing w:before="120" w:after="120"/>
-              <w:jc w:val="left"/>
-              <w:rPr/>
-            </w:pPr>
-            <w:r>
-              <w:rPr/>
-              <w:t>pings an external channel</w:t>
-            </w:r>
-          </w:p>
-        </w:tc>
-        <w:tc>
-          <w:tcPr>
-            <w:tcW w:w="2986" w:type="dxa"/>
-            <w:tcBorders/>
-            <w:vAlign w:val="center"/>
-          </w:tcPr>
-          <w:p>
-            <w:pPr>
-              <w:pStyle w:val="TableContents"/>
-              <w:shd w:fill="2E3440" w:val="clear"/>
-              <w:bidi w:val="0"/>
-              <w:spacing w:before="120" w:after="120"/>
-              <w:jc w:val="left"/>
-              <w:rPr/>
-            </w:pPr>
-            <w:r>
-              <w:rPr>
-                <w:rStyle w:val="SourceText"/>
-              </w:rPr>
-              <w:t>notify.provider</w:t>
-            </w:r>
-            <w:r>
-              <w:rPr/>
-              <w:t xml:space="preserve"> (</w:t>
-            </w:r>
-            <w:r>
-              <w:rPr>
-                <w:rStyle w:val="SourceText"/>
-              </w:rPr>
-              <w:t>none</w:t>
-            </w:r>
-            <w:r>
-              <w:rPr/>
-              <w:t xml:space="preserve"> disables it), </w:t>
-            </w:r>
-            <w:r>
-              <w:rPr>
-                <w:rStyle w:val="SourceText"/>
-              </w:rPr>
-              <w:t>notify.events</w:t>
+              <w:t>handoff-write.sh</w:t>
+            </w:r>
+          </w:p>
+        </w:tc>
+        <w:tc>
+          <w:tcPr>
+            <w:tcW w:w="2808" w:type="dxa"/>
+            <w:tcBorders/>
+            <w:vAlign w:val="center"/>
+          </w:tcPr>
+          <w:p>
+            <w:pPr>
+              <w:pStyle w:val="TableContents"/>
+              <w:shd w:fill="2E3440" w:val="clear"/>
+              <w:bidi w:val="0"/>
+              <w:spacing w:before="120" w:after="120"/>
+              <w:jc w:val="left"/>
+              <w:rPr/>
+            </w:pPr>
+            <w:r>
+              <w:rPr/>
+              <w:t>writes the handoff note before compaction</w:t>
+            </w:r>
+          </w:p>
+        </w:tc>
+        <w:tc>
+          <w:tcPr>
+            <w:tcW w:w="3395" w:type="dxa"/>
+            <w:tcBorders/>
+            <w:vAlign w:val="center"/>
+          </w:tcPr>
+          <w:p>
+            <w:pPr>
+              <w:pStyle w:val="TableContents"/>
+              <w:shd w:fill="2E3440" w:val="clear"/>
+              <w:bidi w:val="0"/>
+              <w:spacing w:before="120" w:after="120"/>
+              <w:jc w:val="left"/>
+              <w:rPr/>
+            </w:pPr>
+            <w:r>
+              <w:rPr>
+                <w:rStyle w:val="SourceText"/>
+              </w:rPr>
+              <w:t>context.autoWrapUp</w:t>
+            </w:r>
+            <w:r>
+              <w:rPr/>
+              <w:t xml:space="preserve">, </w:t>
+            </w:r>
+            <w:r>
+              <w:rPr>
+                <w:rStyle w:val="SourceText"/>
+              </w:rPr>
+              <w:t>context.handoffPath</w:t>
             </w:r>
           </w:p>
         </w:tc>
@@ -2324,10 +2398,8 @@
               <w:rPr/>
             </w:pPr>
             <w:r>
-              <w:rPr>
-                <w:rStyle w:val="SourceText"/>
-              </w:rPr>
-              <w:t>none</w:t>
+              <w:rPr/>
+              <w:t>on</w:t>
             </w:r>
           </w:p>
         </w:tc>
@@ -2353,7 +2425,7 @@
               <w:rPr>
                 <w:rStyle w:val="SourceText"/>
               </w:rPr>
-              <w:t>Stop</w:t>
+              <w:t>Notification</w:t>
             </w:r>
           </w:p>
         </w:tc>
@@ -2376,65 +2448,71 @@
               <w:rPr>
                 <w:rStyle w:val="SourceText"/>
               </w:rPr>
-              <w:t>verify-gate.sh</w:t>
-            </w:r>
-          </w:p>
-        </w:tc>
-        <w:tc>
-          <w:tcPr>
-            <w:tcW w:w="2022" w:type="dxa"/>
-            <w:tcBorders/>
-            <w:vAlign w:val="center"/>
-          </w:tcPr>
-          <w:p>
-            <w:pPr>
-              <w:pStyle w:val="TableContents"/>
-              <w:shd w:fill="2E3440" w:val="clear"/>
-              <w:bidi w:val="0"/>
-              <w:spacing w:before="120" w:after="120"/>
-              <w:jc w:val="left"/>
-              <w:rPr/>
-            </w:pPr>
-            <w:r>
-              <w:rPr/>
-              <w:t xml:space="preserve">runs </w:t>
-            </w:r>
-            <w:r>
-              <w:rPr>
-                <w:rStyle w:val="SourceText"/>
-              </w:rPr>
-              <w:t>.crew/verify.json</w:t>
-            </w:r>
-            <w:r>
-              <w:rPr/>
-              <w:t>'s checks</w:t>
-            </w:r>
-          </w:p>
-        </w:tc>
-        <w:tc>
-          <w:tcPr>
-            <w:tcW w:w="2986" w:type="dxa"/>
-            <w:tcBorders/>
-            <w:vAlign w:val="center"/>
-          </w:tcPr>
-          <w:p>
-            <w:pPr>
-              <w:pStyle w:val="TableContents"/>
-              <w:shd w:fill="2E3440" w:val="clear"/>
-              <w:bidi w:val="0"/>
-              <w:spacing w:before="120" w:after="120"/>
-              <w:jc w:val="left"/>
-              <w:rPr/>
-            </w:pPr>
-            <w:r>
-              <w:rPr>
-                <w:rStyle w:val="SourceText"/>
-              </w:rPr>
-              <w:t>verifyGate</w:t>
-            </w:r>
-            <w:r>
-              <w:rPr/>
-              <w:t xml:space="preserve"> (boolean)</w:t>
+              <w:t>notify.sh</w:t>
+            </w:r>
+          </w:p>
+        </w:tc>
+        <w:tc>
+          <w:tcPr>
+            <w:tcW w:w="2808" w:type="dxa"/>
+            <w:tcBorders/>
+            <w:vAlign w:val="center"/>
+          </w:tcPr>
+          <w:p>
+            <w:pPr>
+              <w:pStyle w:val="TableContents"/>
+              <w:shd w:fill="2E3440" w:val="clear"/>
+              <w:bidi w:val="0"/>
+              <w:spacing w:before="120" w:after="120"/>
+              <w:jc w:val="left"/>
+              <w:rPr/>
+            </w:pPr>
+            <w:r>
+              <w:rPr/>
+              <w:t>pings an external channel</w:t>
+            </w:r>
+          </w:p>
+        </w:tc>
+        <w:tc>
+          <w:tcPr>
+            <w:tcW w:w="3395" w:type="dxa"/>
+            <w:tcBorders/>
+            <w:vAlign w:val="center"/>
+          </w:tcPr>
+          <w:p>
+            <w:pPr>
+              <w:pStyle w:val="TableContents"/>
+              <w:shd w:fill="2E3440" w:val="clear"/>
+              <w:bidi w:val="0"/>
+              <w:spacing w:before="120" w:after="120"/>
+              <w:jc w:val="left"/>
+              <w:rPr/>
+            </w:pPr>
+            <w:r>
+              <w:rPr>
+                <w:rStyle w:val="SourceText"/>
+              </w:rPr>
+              <w:t>notify.provider</w:t>
+            </w:r>
+            <w:r>
+              <w:rPr/>
+              <w:t xml:space="preserve"> (</w:t>
+            </w:r>
+            <w:r>
+              <w:rPr>
+                <w:rStyle w:val="SourceText"/>
+              </w:rPr>
+              <w:t>none</w:t>
+            </w:r>
+            <w:r>
+              <w:rPr/>
+              <w:t xml:space="preserve"> disables it), </w:t>
+            </w:r>
+            <w:r>
+              <w:rPr>
+                <w:rStyle w:val="SourceText"/>
+              </w:rPr>
+              <w:t>notify.events</w:t>
             </w:r>
           </w:p>
         </w:tc>
@@ -2457,7 +2535,7 @@
               <w:rPr>
                 <w:rStyle w:val="SourceText"/>
               </w:rPr>
-              <w:t>true</w:t>
+              <w:t>none</w:t>
             </w:r>
           </w:p>
         </w:tc>
@@ -2506,91 +2584,65 @@
               <w:rPr>
                 <w:rStyle w:val="SourceText"/>
               </w:rPr>
-              <w:t>context-watch.sh</w:t>
-            </w:r>
-          </w:p>
-        </w:tc>
-        <w:tc>
-          <w:tcPr>
-            <w:tcW w:w="2022" w:type="dxa"/>
-            <w:tcBorders/>
-            <w:vAlign w:val="center"/>
-          </w:tcPr>
-          <w:p>
-            <w:pPr>
-              <w:pStyle w:val="TableContents"/>
-              <w:shd w:fill="2E3440" w:val="clear"/>
-              <w:bidi w:val="0"/>
-              <w:spacing w:before="120" w:after="120"/>
-              <w:jc w:val="left"/>
-              <w:rPr/>
-            </w:pPr>
-            <w:r>
-              <w:rPr/>
-              <w:t>nags for a handoff near the context budget, drives auto-clear</w:t>
-            </w:r>
-          </w:p>
-        </w:tc>
-        <w:tc>
-          <w:tcPr>
-            <w:tcW w:w="2986" w:type="dxa"/>
-            <w:tcBorders/>
-            <w:vAlign w:val="center"/>
-          </w:tcPr>
-          <w:p>
-            <w:pPr>
-              <w:pStyle w:val="TableContents"/>
-              <w:shd w:fill="2E3440" w:val="clear"/>
-              <w:bidi w:val="0"/>
-              <w:spacing w:before="120" w:after="120"/>
-              <w:jc w:val="left"/>
-              <w:rPr/>
-            </w:pPr>
-            <w:r>
-              <w:rPr>
-                <w:rStyle w:val="SourceText"/>
-              </w:rPr>
-              <w:t>context.enabled</w:t>
-            </w:r>
-            <w:r>
-              <w:rPr/>
-              <w:t xml:space="preserve">, </w:t>
-            </w:r>
-            <w:r>
-              <w:rPr>
-                <w:rStyle w:val="SourceText"/>
-              </w:rPr>
-              <w:t>context.warnAt</w:t>
-            </w:r>
-            <w:r>
-              <w:rPr/>
-              <w:t xml:space="preserve">, </w:t>
-            </w:r>
-            <w:r>
-              <w:rPr>
-                <w:rStyle w:val="SourceText"/>
-              </w:rPr>
-              <w:t>context.budgetTokens</w:t>
-            </w:r>
-            <w:r>
-              <w:rPr/>
-              <w:t xml:space="preserve">, </w:t>
-            </w:r>
-            <w:r>
-              <w:rPr>
-                <w:rStyle w:val="SourceText"/>
-              </w:rPr>
-              <w:t>context.reserveTokens</w:t>
-            </w:r>
-            <w:r>
-              <w:rPr/>
-              <w:t xml:space="preserve">, </w:t>
-            </w:r>
-            <w:r>
-              <w:rPr>
-                <w:rStyle w:val="SourceText"/>
-              </w:rPr>
-              <w:t>context.autoClear.*</w:t>
+              <w:t>verify-gate.sh</w:t>
+            </w:r>
+          </w:p>
+        </w:tc>
+        <w:tc>
+          <w:tcPr>
+            <w:tcW w:w="2808" w:type="dxa"/>
+            <w:tcBorders/>
+            <w:vAlign w:val="center"/>
+          </w:tcPr>
+          <w:p>
+            <w:pPr>
+              <w:pStyle w:val="TableContents"/>
+              <w:shd w:fill="2E3440" w:val="clear"/>
+              <w:bidi w:val="0"/>
+              <w:spacing w:before="120" w:after="120"/>
+              <w:jc w:val="left"/>
+              <w:rPr/>
+            </w:pPr>
+            <w:r>
+              <w:rPr/>
+              <w:t xml:space="preserve">runs </w:t>
+            </w:r>
+            <w:r>
+              <w:rPr>
+                <w:rStyle w:val="SourceText"/>
+              </w:rPr>
+              <w:t>.crew/verify.json</w:t>
+            </w:r>
+            <w:r>
+              <w:rPr/>
+              <w:t>'s checks</w:t>
+            </w:r>
+          </w:p>
+        </w:tc>
+        <w:tc>
+          <w:tcPr>
+            <w:tcW w:w="3395" w:type="dxa"/>
+            <w:tcBorders/>
+            <w:vAlign w:val="center"/>
+          </w:tcPr>
+          <w:p>
+            <w:pPr>
+              <w:pStyle w:val="TableContents"/>
+              <w:shd w:fill="2E3440" w:val="clear"/>
+              <w:bidi w:val="0"/>
+              <w:spacing w:before="120" w:after="120"/>
+              <w:jc w:val="left"/>
+              <w:rPr/>
+            </w:pPr>
+            <w:r>
+              <w:rPr>
+                <w:rStyle w:val="SourceText"/>
+              </w:rPr>
+              <w:t>verifyGate</w:t>
+            </w:r>
+            <w:r>
+              <w:rPr/>
+              <w:t xml:space="preserve"> (boolean)</w:t>
             </w:r>
           </w:p>
         </w:tc>
@@ -2610,14 +2662,10 @@
               <w:rPr/>
             </w:pPr>
             <w:r>
-              <w:rPr/>
-              <w:t xml:space="preserve">on, </w:t>
-            </w:r>
-            <w:r>
-              <w:rPr>
-                <w:rStyle w:val="SourceText"/>
-              </w:rPr>
-              <w:t>warnAt: 0.5</w:t>
+              <w:rPr>
+                <w:rStyle w:val="SourceText"/>
+              </w:rPr>
+              <w:t>true</w:t>
             </w:r>
           </w:p>
         </w:tc>
@@ -2666,13 +2714,173 @@
               <w:rPr>
                 <w:rStyle w:val="SourceText"/>
               </w:rPr>
+              <w:t>context-watch.sh</w:t>
+            </w:r>
+          </w:p>
+        </w:tc>
+        <w:tc>
+          <w:tcPr>
+            <w:tcW w:w="2808" w:type="dxa"/>
+            <w:tcBorders/>
+            <w:vAlign w:val="center"/>
+          </w:tcPr>
+          <w:p>
+            <w:pPr>
+              <w:pStyle w:val="TableContents"/>
+              <w:shd w:fill="2E3440" w:val="clear"/>
+              <w:bidi w:val="0"/>
+              <w:spacing w:before="120" w:after="120"/>
+              <w:jc w:val="left"/>
+              <w:rPr/>
+            </w:pPr>
+            <w:r>
+              <w:rPr/>
+              <w:t>nags for a handoff near the context budget, drives auto-clear</w:t>
+            </w:r>
+          </w:p>
+        </w:tc>
+        <w:tc>
+          <w:tcPr>
+            <w:tcW w:w="3395" w:type="dxa"/>
+            <w:tcBorders/>
+            <w:vAlign w:val="center"/>
+          </w:tcPr>
+          <w:p>
+            <w:pPr>
+              <w:pStyle w:val="TableContents"/>
+              <w:shd w:fill="2E3440" w:val="clear"/>
+              <w:bidi w:val="0"/>
+              <w:spacing w:before="120" w:after="120"/>
+              <w:jc w:val="left"/>
+              <w:rPr/>
+            </w:pPr>
+            <w:r>
+              <w:rPr>
+                <w:rStyle w:val="SourceText"/>
+              </w:rPr>
+              <w:t>context.enabled</w:t>
+            </w:r>
+            <w:r>
+              <w:rPr/>
+              <w:t xml:space="preserve">, </w:t>
+            </w:r>
+            <w:r>
+              <w:rPr>
+                <w:rStyle w:val="SourceText"/>
+              </w:rPr>
+              <w:t>context.warnAt</w:t>
+            </w:r>
+            <w:r>
+              <w:rPr/>
+              <w:t xml:space="preserve">, </w:t>
+            </w:r>
+            <w:r>
+              <w:rPr>
+                <w:rStyle w:val="SourceText"/>
+              </w:rPr>
+              <w:t>context.budgetTokens</w:t>
+            </w:r>
+            <w:r>
+              <w:rPr/>
+              <w:t xml:space="preserve">, </w:t>
+            </w:r>
+            <w:r>
+              <w:rPr>
+                <w:rStyle w:val="SourceText"/>
+              </w:rPr>
+              <w:t>context.reserveTokens</w:t>
+            </w:r>
+            <w:r>
+              <w:rPr/>
+              <w:t xml:space="preserve">, </w:t>
+            </w:r>
+            <w:r>
+              <w:rPr>
+                <w:rStyle w:val="SourceText"/>
+              </w:rPr>
+              <w:t>context.autoClear.*</w:t>
+            </w:r>
+          </w:p>
+        </w:tc>
+        <w:tc>
+          <w:tcPr>
+            <w:tcW w:w="2148" w:type="dxa"/>
+            <w:tcBorders/>
+            <w:vAlign w:val="center"/>
+          </w:tcPr>
+          <w:p>
+            <w:pPr>
+              <w:pStyle w:val="TableContents"/>
+              <w:shd w:fill="2E3440" w:val="clear"/>
+              <w:bidi w:val="0"/>
+              <w:spacing w:before="120" w:after="120"/>
+              <w:jc w:val="left"/>
+              <w:rPr/>
+            </w:pPr>
+            <w:r>
+              <w:rPr/>
+              <w:t xml:space="preserve">on, </w:t>
+            </w:r>
+            <w:r>
+              <w:rPr>
+                <w:rStyle w:val="SourceText"/>
+              </w:rPr>
+              <w:t>warnAt: 0.5</w:t>
+            </w:r>
+          </w:p>
+        </w:tc>
+      </w:tr>
+      <w:tr>
+        <w:trPr/>
+        <w:tc>
+          <w:tcPr>
+            <w:tcW w:w="2119" w:type="dxa"/>
+            <w:tcBorders/>
+            <w:vAlign w:val="center"/>
+          </w:tcPr>
+          <w:p>
+            <w:pPr>
+              <w:pStyle w:val="TableContents"/>
+              <w:shd w:fill="2E3440" w:val="clear"/>
+              <w:bidi w:val="0"/>
+              <w:spacing w:before="120" w:after="120"/>
+              <w:jc w:val="left"/>
+              <w:rPr/>
+            </w:pPr>
+            <w:r>
+              <w:rPr>
+                <w:rStyle w:val="SourceText"/>
+              </w:rPr>
+              <w:t>Stop</w:t>
+            </w:r>
+          </w:p>
+        </w:tc>
+        <w:tc>
+          <w:tcPr>
+            <w:tcW w:w="2456" w:type="dxa"/>
+            <w:tcBorders/>
+            <w:vAlign w:val="center"/>
+          </w:tcPr>
+          <w:p>
+            <w:pPr>
+              <w:pStyle w:val="TableContents"/>
+              <w:shd w:fill="2E3440" w:val="clear"/>
+              <w:bidi w:val="0"/>
+              <w:spacing w:before="120" w:after="120"/>
+              <w:jc w:val="left"/>
+              <w:rPr/>
+            </w:pPr>
+            <w:r>
+              <w:rPr>
+                <w:rStyle w:val="SourceText"/>
+              </w:rPr>
               <w:t>completion-audit.sh</w:t>
             </w:r>
           </w:p>
         </w:tc>
         <w:tc>
           <w:tcPr>
-            <w:tcW w:w="2022" w:type="dxa"/>
+            <w:tcW w:w="2808" w:type="dxa"/>
             <w:tcBorders/>
             <w:vAlign w:val="center"/>
           </w:tcPr>
@@ -2693,7 +2901,7 @@
         </w:tc>
         <w:tc>
           <w:tcPr>
-            <w:tcW w:w="2986" w:type="dxa"/>
+            <w:tcW w:w="3395" w:type="dxa"/>
             <w:tcBorders/>
             <w:vAlign w:val="center"/>
           </w:tcPr>
@@ -6441,7 +6649,394 @@
       </w:r>
       <w:r>
         <w:rPr/>
-        <w:t xml:space="preserve"> mode while testing, or approve the one-shot marker the deny message names.</w:t>
+        <w:t xml:space="preserve"> mode while testing, or approve the one-shot marker the deny message names. A literal </w:t>
+      </w:r>
+      <w:r>
+        <w:rPr>
+          <w:rStyle w:val="SourceText"/>
+        </w:rPr>
+        <w:t>gh workflow run ... --help</w:t>
+      </w:r>
+      <w:r>
+        <w:rPr/>
+        <w:t xml:space="preserve"> (or </w:t>
+      </w:r>
+      <w:r>
+        <w:rPr>
+          <w:rStyle w:val="SourceText"/>
+        </w:rPr>
+        <w:t>-h</w:t>
+      </w:r>
+      <w:r>
+        <w:rPr/>
+        <w:t xml:space="preserve">) is the exception: gh prints help and dispatches nothing, so the line is not judged at all; terraform's </w:t>
+      </w:r>
+      <w:r>
+        <w:rPr>
+          <w:rStyle w:val="SourceText"/>
+        </w:rPr>
+        <w:t>--help</w:t>
+      </w:r>
+      <w:r>
+        <w:rPr/>
+        <w:t xml:space="preserve"> still is.</w:t>
+      </w:r>
+    </w:p>
+    <w:p>
+      <w:pPr>
+        <w:pStyle w:val="BodyText"/>
+        <w:numPr>
+          <w:ilvl w:val="0"/>
+          <w:numId w:val="16"/>
+        </w:numPr>
+        <w:tabs>
+          <w:tab w:val="clear" w:pos="1134"/>
+          <w:tab w:val="left" w:pos="829" w:leader="none"/>
+        </w:tabs>
+        <w:bidi w:val="0"/>
+        <w:ind w:hanging="283" w:left="829"/>
+        <w:jc w:val="left"/>
+        <w:rPr/>
+      </w:pPr>
+      <w:r>
+        <w:rPr>
+          <w:rStyle w:val="Strong"/>
+        </w:rPr>
+        <w:t>A workflow dispatch is refused as "could not tell" although it looks fine.</w:t>
+      </w:r>
+      <w:r>
+        <w:rPr/>
+        <w:t xml:space="preserve"> With </w:t>
+      </w:r>
+      <w:r>
+        <w:rPr>
+          <w:rStyle w:val="SourceText"/>
+        </w:rPr>
+        <w:t>environments.workflows</w:t>
+      </w:r>
+      <w:r>
+        <w:rPr/>
+        <w:t xml:space="preserve"> set, a </w:t>
+      </w:r>
+      <w:r>
+        <w:rPr>
+          <w:rStyle w:val="SourceText"/>
+        </w:rPr>
+        <w:t>gh workflow run</w:t>
+      </w:r>
+      <w:r>
+        <w:rPr/>
+        <w:t xml:space="preserve"> or </w:t>
+      </w:r>
+      <w:r>
+        <w:rPr>
+          <w:rStyle w:val="SourceText"/>
+        </w:rPr>
+        <w:t>gh api .../dispatches</w:t>
+      </w:r>
+      <w:r>
+        <w:rPr/>
+        <w:t xml:space="preserve"> line is judged only when every word on it is a plain literal (letters, digits, </w:t>
+      </w:r>
+      <w:r>
+        <w:rPr>
+          <w:rStyle w:val="SourceText"/>
+        </w:rPr>
+        <w:t>_./:=@%+,-</w:t>
+      </w:r>
+      <w:r>
+        <w:rPr/>
+        <w:t xml:space="preserve">) or one whole single-quoted word, joined only by </w:t>
+      </w:r>
+      <w:r>
+        <w:rPr>
+          <w:rStyle w:val="SourceText"/>
+        </w:rPr>
+        <w:t>;</w:t>
+      </w:r>
+      <w:r>
+        <w:rPr/>
+        <w:t xml:space="preserve">, </w:t>
+      </w:r>
+      <w:r>
+        <w:rPr>
+          <w:rStyle w:val="SourceText"/>
+        </w:rPr>
+        <w:t>&amp;&amp;</w:t>
+      </w:r>
+      <w:r>
+        <w:rPr/>
+        <w:t xml:space="preserve">, </w:t>
+      </w:r>
+      <w:r>
+        <w:rPr>
+          <w:rStyle w:val="SourceText"/>
+        </w:rPr>
+        <w:t>||</w:t>
+      </w:r>
+      <w:r>
+        <w:rPr/>
+        <w:t xml:space="preserve">, </w:t>
+      </w:r>
+      <w:r>
+        <w:rPr>
+          <w:rStyle w:val="SourceText"/>
+        </w:rPr>
+        <w:t>&amp;</w:t>
+      </w:r>
+      <w:r>
+        <w:rPr/>
+        <w:t xml:space="preserve">, newlines, </w:t>
+      </w:r>
+      <w:r>
+        <w:rPr>
+          <w:rStyle w:val="SourceText"/>
+        </w:rPr>
+        <w:t>&gt;</w:t>
+      </w:r>
+      <w:r>
+        <w:rPr/>
+        <w:t>/</w:t>
+      </w:r>
+      <w:r>
+        <w:rPr>
+          <w:rStyle w:val="SourceText"/>
+        </w:rPr>
+        <w:t>&gt;&gt;</w:t>
+      </w:r>
+      <w:r>
+        <w:rPr/>
+        <w:t>/</w:t>
+      </w:r>
+      <w:r>
+        <w:rPr>
+          <w:rStyle w:val="SourceText"/>
+        </w:rPr>
+        <w:t>&amp;&gt;</w:t>
+      </w:r>
+      <w:r>
+        <w:rPr/>
+        <w:t>/</w:t>
+      </w:r>
+      <w:r>
+        <w:rPr>
+          <w:rStyle w:val="SourceText"/>
+        </w:rPr>
+        <w:t>&amp;&gt;&gt;</w:t>
+      </w:r>
+      <w:r>
+        <w:rPr/>
+        <w:t xml:space="preserve"> to a plain word and </w:t>
+      </w:r>
+      <w:r>
+        <w:rPr>
+          <w:rStyle w:val="SourceText"/>
+        </w:rPr>
+        <w:t>2&gt;&amp;1</w:t>
+      </w:r>
+      <w:r>
+        <w:rPr/>
+        <w:t xml:space="preserve">. A pipe, any </w:t>
+      </w:r>
+      <w:r>
+        <w:rPr>
+          <w:rStyle w:val="SourceText"/>
+        </w:rPr>
+        <w:t>&lt;</w:t>
+      </w:r>
+      <w:r>
+        <w:rPr/>
+        <w:t xml:space="preserve">, double quotes, </w:t>
+      </w:r>
+      <w:r>
+        <w:rPr>
+          <w:rStyle w:val="SourceText"/>
+        </w:rPr>
+        <w:t>$</w:t>
+      </w:r>
+      <w:r>
+        <w:rPr/>
+        <w:t xml:space="preserve">, a glob, </w:t>
+      </w:r>
+      <w:r>
+        <w:rPr>
+          <w:rStyle w:val="SourceText"/>
+        </w:rPr>
+        <w:t>bash -c '...'</w:t>
+      </w:r>
+      <w:r>
+        <w:rPr/>
+        <w:t xml:space="preserve">, </w:t>
+      </w:r>
+      <w:r>
+        <w:rPr>
+          <w:rStyle w:val="SourceText"/>
+        </w:rPr>
+        <w:t>xargs</w:t>
+      </w:r>
+      <w:r>
+        <w:rPr/>
+        <w:t>, a command word built at run time (</w:t>
+      </w:r>
+      <w:r>
+        <w:rPr>
+          <w:rStyle w:val="SourceText"/>
+        </w:rPr>
+        <w:t>$X $Y run ...</w:t>
+      </w:r>
+      <w:r>
+        <w:rPr/>
+        <w:t xml:space="preserve">, </w:t>
+      </w:r>
+      <w:r>
+        <w:rPr>
+          <w:rStyle w:val="SourceText"/>
+        </w:rPr>
+        <w:t>Start-Process $x</w:t>
+      </w:r>
+      <w:r>
+        <w:rPr/>
+        <w:t>, an alias to a variable), gh reading stdin or a file (</w:t>
+      </w:r>
+      <w:r>
+        <w:rPr>
+          <w:rStyle w:val="SourceText"/>
+        </w:rPr>
+        <w:t>--json</w:t>
+      </w:r>
+      <w:r>
+        <w:rPr/>
+        <w:t xml:space="preserve">, </w:t>
+      </w:r>
+      <w:r>
+        <w:rPr>
+          <w:rStyle w:val="SourceText"/>
+        </w:rPr>
+        <w:t>--input</w:t>
+      </w:r>
+      <w:r>
+        <w:rPr/>
+        <w:t xml:space="preserve">, </w:t>
+      </w:r>
+      <w:r>
+        <w:rPr>
+          <w:rStyle w:val="SourceText"/>
+        </w:rPr>
+        <w:t>-F k=@f</w:t>
+      </w:r>
+      <w:r>
+        <w:rPr/>
+        <w:t xml:space="preserve">), and a malformed </w:t>
+      </w:r>
+      <w:r>
+        <w:rPr>
+          <w:rStyle w:val="SourceText"/>
+        </w:rPr>
+        <w:t>environments</w:t>
+      </w:r>
+      <w:r>
+        <w:rPr/>
+        <w:t xml:space="preserve"> block in either config layer make the line could-not-tell: it asks when you are there and is denied unattended at every setting. </w:t>
+      </w:r>
+      <w:r>
+        <w:rPr>
+          <w:rStyle w:val="Strong"/>
+        </w:rPr>
+        <w:t>Fix:</w:t>
+      </w:r>
+      <w:r>
+        <w:rPr/>
+        <w:t xml:space="preserve"> write the literal form — </w:t>
+      </w:r>
+      <w:r>
+        <w:rPr>
+          <w:rStyle w:val="SourceText"/>
+        </w:rPr>
+        <w:t>-f environment=staging</w:t>
+      </w:r>
+      <w:r>
+        <w:rPr/>
+        <w:t xml:space="preserve"> instead of a </w:t>
+      </w:r>
+      <w:r>
+        <w:rPr>
+          <w:rStyle w:val="SourceText"/>
+        </w:rPr>
+        <w:t>--json</w:t>
+      </w:r>
+      <w:r>
+        <w:rPr/>
+        <w:t xml:space="preserve"> body, </w:t>
+      </w:r>
+      <w:r>
+        <w:rPr>
+          <w:rStyle w:val="SourceText"/>
+        </w:rPr>
+        <w:t>'Deploy Staging'</w:t>
+      </w:r>
+      <w:r>
+        <w:rPr/>
+        <w:t xml:space="preserve"> instead of </w:t>
+      </w:r>
+      <w:r>
+        <w:rPr>
+          <w:rStyle w:val="SourceText"/>
+        </w:rPr>
+        <w:t>"Deploy Staging"</w:t>
+      </w:r>
+      <w:r>
+        <w:rPr/>
+        <w:t xml:space="preserve">, </w:t>
+      </w:r>
+      <w:r>
+        <w:rPr>
+          <w:rStyle w:val="SourceText"/>
+        </w:rPr>
+        <w:t>&gt; log</w:t>
+      </w:r>
+      <w:r>
+        <w:rPr/>
+        <w:t xml:space="preserve"> instead of </w:t>
+      </w:r>
+      <w:r>
+        <w:rPr>
+          <w:rStyle w:val="SourceText"/>
+        </w:rPr>
+        <w:t>| tee log</w:t>
+      </w:r>
+      <w:r>
+        <w:rPr/>
+        <w:t xml:space="preserve">, the value instead of </w:t>
+      </w:r>
+      <w:r>
+        <w:rPr>
+          <w:rStyle w:val="SourceText"/>
+        </w:rPr>
+        <w:t>$ENV</w:t>
+      </w:r>
+      <w:r>
+        <w:rPr/>
+        <w:t xml:space="preserve"> — or approve the one command with the marker the refusal names (it covers those exact bytes only). Other </w:t>
+      </w:r>
+      <w:r>
+        <w:rPr>
+          <w:rStyle w:val="SourceText"/>
+        </w:rPr>
+        <w:t>gh</w:t>
+      </w:r>
+      <w:r>
+        <w:rPr/>
+        <w:t xml:space="preserve"> commands (</w:t>
+      </w:r>
+      <w:r>
+        <w:rPr>
+          <w:rStyle w:val="SourceText"/>
+        </w:rPr>
+        <w:t>gh pr create --title "..."</w:t>
+      </w:r>
+      <w:r>
+        <w:rPr/>
+        <w:t>) are never gated.</w:t>
       </w:r>
     </w:p>
     <w:p>
@@ -8187,10 +8782,10 @@
         </w:tblCellMar>
       </w:tblPr>
       <w:tblGrid>
-        <w:gridCol w:w="4621"/>
-        <w:gridCol w:w="1551"/>
-        <w:gridCol w:w="1790"/>
-        <w:gridCol w:w="3377"/>
+        <w:gridCol w:w="3919"/>
+        <w:gridCol w:w="1272"/>
+        <w:gridCol w:w="1495"/>
+        <w:gridCol w:w="4653"/>
       </w:tblGrid>
       <w:tr>
         <w:trPr>
@@ -8198,7 +8793,7 @@
         </w:trPr>
         <w:tc>
           <w:tcPr>
-            <w:tcW w:w="4621" w:type="dxa"/>
+            <w:tcW w:w="3919" w:type="dxa"/>
             <w:tcBorders/>
             <w:vAlign w:val="center"/>
           </w:tcPr>
@@ -8220,7 +8815,7 @@
         </w:tc>
         <w:tc>
           <w:tcPr>
-            <w:tcW w:w="1551" w:type="dxa"/>
+            <w:tcW w:w="1272" w:type="dxa"/>
             <w:tcBorders/>
             <w:vAlign w:val="center"/>
           </w:tcPr>
@@ -8242,7 +8837,7 @@
         </w:tc>
         <w:tc>
           <w:tcPr>
-            <w:tcW w:w="1790" w:type="dxa"/>
+            <w:tcW w:w="1495" w:type="dxa"/>
             <w:tcBorders/>
             <w:vAlign w:val="center"/>
           </w:tcPr>
@@ -8264,7 +8859,7 @@
         </w:tc>
         <w:tc>
           <w:tcPr>
-            <w:tcW w:w="3377" w:type="dxa"/>
+            <w:tcW w:w="4653" w:type="dxa"/>
             <w:tcBorders/>
             <w:vAlign w:val="center"/>
           </w:tcPr>
@@ -8289,7 +8884,7 @@
         <w:trPr/>
         <w:tc>
           <w:tcPr>
-            <w:tcW w:w="4621" w:type="dxa"/>
+            <w:tcW w:w="3919" w:type="dxa"/>
             <w:tcBorders/>
             <w:vAlign w:val="center"/>
           </w:tcPr>
@@ -8312,7 +8907,7 @@
         </w:tc>
         <w:tc>
           <w:tcPr>
-            <w:tcW w:w="1551" w:type="dxa"/>
+            <w:tcW w:w="1272" w:type="dxa"/>
             <w:tcBorders/>
             <w:vAlign w:val="center"/>
           </w:tcPr>
@@ -8333,7 +8928,7 @@
         </w:tc>
         <w:tc>
           <w:tcPr>
-            <w:tcW w:w="1790" w:type="dxa"/>
+            <w:tcW w:w="1495" w:type="dxa"/>
             <w:tcBorders/>
             <w:vAlign w:val="center"/>
           </w:tcPr>
@@ -8354,7 +8949,7 @@
         </w:tc>
         <w:tc>
           <w:tcPr>
-            <w:tcW w:w="3377" w:type="dxa"/>
+            <w:tcW w:w="4653" w:type="dxa"/>
             <w:tcBorders/>
             <w:vAlign w:val="center"/>
           </w:tcPr>
@@ -8394,7 +8989,7 @@
         <w:trPr/>
         <w:tc>
           <w:tcPr>
-            <w:tcW w:w="4621" w:type="dxa"/>
+            <w:tcW w:w="3919" w:type="dxa"/>
             <w:tcBorders/>
             <w:vAlign w:val="center"/>
           </w:tcPr>
@@ -8417,7 +9012,7 @@
         </w:tc>
         <w:tc>
           <w:tcPr>
-            <w:tcW w:w="1551" w:type="dxa"/>
+            <w:tcW w:w="1272" w:type="dxa"/>
             <w:tcBorders/>
             <w:vAlign w:val="center"/>
           </w:tcPr>
@@ -8438,7 +9033,7 @@
         </w:tc>
         <w:tc>
           <w:tcPr>
-            <w:tcW w:w="1790" w:type="dxa"/>
+            <w:tcW w:w="1495" w:type="dxa"/>
             <w:tcBorders/>
             <w:vAlign w:val="center"/>
           </w:tcPr>
@@ -8481,7 +9076,7 @@
         </w:tc>
         <w:tc>
           <w:tcPr>
-            <w:tcW w:w="3377" w:type="dxa"/>
+            <w:tcW w:w="4653" w:type="dxa"/>
             <w:tcBorders/>
             <w:vAlign w:val="center"/>
           </w:tcPr>
@@ -8511,7 +9106,7 @@
         <w:trPr/>
         <w:tc>
           <w:tcPr>
-            <w:tcW w:w="4621" w:type="dxa"/>
+            <w:tcW w:w="3919" w:type="dxa"/>
             <w:tcBorders/>
             <w:vAlign w:val="center"/>
           </w:tcPr>
@@ -8534,7 +9129,7 @@
         </w:tc>
         <w:tc>
           <w:tcPr>
-            <w:tcW w:w="1551" w:type="dxa"/>
+            <w:tcW w:w="1272" w:type="dxa"/>
             <w:tcBorders/>
             <w:vAlign w:val="center"/>
           </w:tcPr>
@@ -8555,7 +9150,7 @@
         </w:tc>
         <w:tc>
           <w:tcPr>
-            <w:tcW w:w="1790" w:type="dxa"/>
+            <w:tcW w:w="1495" w:type="dxa"/>
             <w:tcBorders/>
             <w:vAlign w:val="center"/>
           </w:tcPr>
@@ -8598,7 +9193,7 @@
         </w:tc>
         <w:tc>
           <w:tcPr>
-            <w:tcW w:w="3377" w:type="dxa"/>
+            <w:tcW w:w="4653" w:type="dxa"/>
             <w:tcBorders/>
             <w:vAlign w:val="center"/>
           </w:tcPr>
@@ -8628,7 +9223,7 @@
         <w:trPr/>
         <w:tc>
           <w:tcPr>
-            <w:tcW w:w="4621" w:type="dxa"/>
+            <w:tcW w:w="3919" w:type="dxa"/>
             <w:tcBorders/>
             <w:vAlign w:val="center"/>
           </w:tcPr>
@@ -8701,7 +9296,7 @@
         </w:tc>
         <w:tc>
           <w:tcPr>
-            <w:tcW w:w="1551" w:type="dxa"/>
+            <w:tcW w:w="1272" w:type="dxa"/>
             <w:tcBorders/>
             <w:vAlign w:val="center"/>
           </w:tcPr>
@@ -8722,7 +9317,7 @@
         </w:tc>
         <w:tc>
           <w:tcPr>
-            <w:tcW w:w="1790" w:type="dxa"/>
+            <w:tcW w:w="1495" w:type="dxa"/>
             <w:tcBorders/>
             <w:vAlign w:val="center"/>
           </w:tcPr>
@@ -8765,7 +9360,7 @@
         </w:tc>
         <w:tc>
           <w:tcPr>
-            <w:tcW w:w="3377" w:type="dxa"/>
+            <w:tcW w:w="4653" w:type="dxa"/>
             <w:tcBorders/>
             <w:vAlign w:val="center"/>
           </w:tcPr>
@@ -8799,40 +9394,30 @@
         <w:trPr/>
         <w:tc>
           <w:tcPr>
-            <w:tcW w:w="4621" w:type="dxa"/>
-            <w:tcBorders/>
-            <w:vAlign w:val="center"/>
-          </w:tcPr>
-          <w:p>
-            <w:pPr>
-              <w:pStyle w:val="TableContents"/>
-              <w:shd w:fill="2E3440" w:val="clear"/>
-              <w:bidi w:val="0"/>
-              <w:spacing w:before="120" w:after="120"/>
-              <w:jc w:val="left"/>
-              <w:rPr/>
-            </w:pPr>
-            <w:r>
-              <w:rPr>
-                <w:rStyle w:val="SourceText"/>
-              </w:rPr>
-              <w:t>guards.prodDatabase</w:t>
-            </w:r>
-            <w:r>
-              <w:rPr/>
-              <w:t xml:space="preserve">, </w:t>
-            </w:r>
-            <w:r>
-              <w:rPr>
-                <w:rStyle w:val="SourceText"/>
-              </w:rPr>
-              <w:t>guards.prodServer</w:t>
-            </w:r>
-          </w:p>
-        </w:tc>
-        <w:tc>
-          <w:tcPr>
-            <w:tcW w:w="1551" w:type="dxa"/>
+            <w:tcW w:w="3919" w:type="dxa"/>
+            <w:tcBorders/>
+            <w:vAlign w:val="center"/>
+          </w:tcPr>
+          <w:p>
+            <w:pPr>
+              <w:pStyle w:val="TableContents"/>
+              <w:shd w:fill="2E3440" w:val="clear"/>
+              <w:bidi w:val="0"/>
+              <w:spacing w:before="120" w:after="120"/>
+              <w:jc w:val="left"/>
+              <w:rPr/>
+            </w:pPr>
+            <w:r>
+              <w:rPr>
+                <w:rStyle w:val="SourceText"/>
+              </w:rPr>
+              <w:t>guards.deployWorkflow</w:t>
+            </w:r>
+          </w:p>
+        </w:tc>
+        <w:tc>
+          <w:tcPr>
+            <w:tcW w:w="1272" w:type="dxa"/>
             <w:tcBorders/>
             <w:vAlign w:val="center"/>
           </w:tcPr>
@@ -8853,24 +9438,24 @@
         </w:tc>
         <w:tc>
           <w:tcPr>
-            <w:tcW w:w="1790" w:type="dxa"/>
-            <w:tcBorders/>
-            <w:vAlign w:val="center"/>
-          </w:tcPr>
-          <w:p>
-            <w:pPr>
-              <w:pStyle w:val="TableContents"/>
-              <w:shd w:fill="2E3440" w:val="clear"/>
-              <w:bidi w:val="0"/>
-              <w:spacing w:before="120" w:after="120"/>
-              <w:jc w:val="left"/>
-              <w:rPr/>
-            </w:pPr>
-            <w:r>
-              <w:rPr>
-                <w:rStyle w:val="SourceText"/>
-              </w:rPr>
-              <w:t>none</w:t>
+            <w:tcW w:w="1495" w:type="dxa"/>
+            <w:tcBorders/>
+            <w:vAlign w:val="center"/>
+          </w:tcPr>
+          <w:p>
+            <w:pPr>
+              <w:pStyle w:val="TableContents"/>
+              <w:shd w:fill="2E3440" w:val="clear"/>
+              <w:bidi w:val="0"/>
+              <w:spacing w:before="120" w:after="120"/>
+              <w:jc w:val="left"/>
+              <w:rPr/>
+            </w:pPr>
+            <w:r>
+              <w:rPr>
+                <w:rStyle w:val="SourceText"/>
+              </w:rPr>
+              <w:t>block</w:t>
             </w:r>
             <w:r>
               <w:rPr/>
@@ -8880,7 +9465,7 @@
               <w:rPr>
                 <w:rStyle w:val="SourceText"/>
               </w:rPr>
-              <w:t>read</w:t>
+              <w:t>ask</w:t>
             </w:r>
             <w:r>
               <w:rPr/>
@@ -8890,34 +9475,54 @@
               <w:rPr>
                 <w:rStyle w:val="SourceText"/>
               </w:rPr>
-              <w:t>full</w:t>
-            </w:r>
-          </w:p>
-        </w:tc>
-        <w:tc>
-          <w:tcPr>
-            <w:tcW w:w="3377" w:type="dxa"/>
-            <w:tcBorders/>
-            <w:vAlign w:val="center"/>
-          </w:tcPr>
-          <w:p>
-            <w:pPr>
-              <w:pStyle w:val="TableContents"/>
-              <w:shd w:fill="2E3440" w:val="clear"/>
-              <w:bidi w:val="0"/>
-              <w:spacing w:before="120" w:after="120"/>
-              <w:jc w:val="left"/>
-              <w:rPr/>
-            </w:pPr>
-            <w:r>
-              <w:rPr>
-                <w:rStyle w:val="SourceText"/>
-              </w:rPr>
-              <w:t>none</w:t>
-            </w:r>
-            <w:r>
-              <w:rPr/>
-              <w:t xml:space="preserve"> is both the default and the floor</w:t>
+              <w:t>allow</w:t>
+            </w:r>
+          </w:p>
+        </w:tc>
+        <w:tc>
+          <w:tcPr>
+            <w:tcW w:w="4653" w:type="dxa"/>
+            <w:tcBorders/>
+            <w:vAlign w:val="center"/>
+          </w:tcPr>
+          <w:p>
+            <w:pPr>
+              <w:pStyle w:val="TableContents"/>
+              <w:shd w:fill="2E3440" w:val="clear"/>
+              <w:bidi w:val="0"/>
+              <w:spacing w:before="120" w:after="120"/>
+              <w:jc w:val="left"/>
+              <w:rPr/>
+            </w:pPr>
+            <w:r>
+              <w:rPr>
+                <w:rStyle w:val="SourceText"/>
+              </w:rPr>
+              <w:t>block</w:t>
+            </w:r>
+            <w:r>
+              <w:rPr/>
+              <w:t xml:space="preserve"> is default and floor; </w:t>
+            </w:r>
+            <w:r>
+              <w:rPr>
+                <w:rStyle w:val="SourceText"/>
+              </w:rPr>
+              <w:t>allow</w:t>
+            </w:r>
+            <w:r>
+              <w:rPr/>
+              <w:t xml:space="preserve"> covers nonProd only — production without </w:t>
+            </w:r>
+            <w:r>
+              <w:rPr>
+                <w:rStyle w:val="SourceText"/>
+              </w:rPr>
+              <w:t>environments.prodUnattended</w:t>
+            </w:r>
+            <w:r>
+              <w:rPr/>
+              <w:t xml:space="preserve"> in both layers, and an unknown environment, still ask (denied unattended)</w:t>
             </w:r>
           </w:p>
         </w:tc>
@@ -8926,30 +9531,30 @@
         <w:trPr/>
         <w:tc>
           <w:tcPr>
-            <w:tcW w:w="4621" w:type="dxa"/>
-            <w:tcBorders/>
-            <w:vAlign w:val="center"/>
-          </w:tcPr>
-          <w:p>
-            <w:pPr>
-              <w:pStyle w:val="TableContents"/>
-              <w:shd w:fill="2E3440" w:val="clear"/>
-              <w:bidi w:val="0"/>
-              <w:spacing w:before="120" w:after="120"/>
-              <w:jc w:val="left"/>
-              <w:rPr/>
-            </w:pPr>
-            <w:r>
-              <w:rPr>
-                <w:rStyle w:val="SourceText"/>
-              </w:rPr>
-              <w:t>scope.mode</w:t>
-            </w:r>
-          </w:p>
-        </w:tc>
-        <w:tc>
-          <w:tcPr>
-            <w:tcW w:w="1551" w:type="dxa"/>
+            <w:tcW w:w="3919" w:type="dxa"/>
+            <w:tcBorders/>
+            <w:vAlign w:val="center"/>
+          </w:tcPr>
+          <w:p>
+            <w:pPr>
+              <w:pStyle w:val="TableContents"/>
+              <w:shd w:fill="2E3440" w:val="clear"/>
+              <w:bidi w:val="0"/>
+              <w:spacing w:before="120" w:after="120"/>
+              <w:jc w:val="left"/>
+              <w:rPr/>
+            </w:pPr>
+            <w:r>
+              <w:rPr>
+                <w:rStyle w:val="SourceText"/>
+              </w:rPr>
+              <w:t>environments.nonProd</w:t>
+            </w:r>
+          </w:p>
+        </w:tc>
+        <w:tc>
+          <w:tcPr>
+            <w:tcW w:w="1272" w:type="dxa"/>
             <w:tcBorders/>
             <w:vAlign w:val="center"/>
           </w:tcPr>
@@ -8970,81 +9575,49 @@
         </w:tc>
         <w:tc>
           <w:tcPr>
-            <w:tcW w:w="1790" w:type="dxa"/>
-            <w:tcBorders/>
-            <w:vAlign w:val="center"/>
-          </w:tcPr>
-          <w:p>
-            <w:pPr>
-              <w:pStyle w:val="TableContents"/>
-              <w:shd w:fill="2E3440" w:val="clear"/>
-              <w:bidi w:val="0"/>
-              <w:spacing w:before="120" w:after="120"/>
-              <w:jc w:val="left"/>
-              <w:rPr/>
-            </w:pPr>
-            <w:r>
-              <w:rPr>
-                <w:rStyle w:val="SourceText"/>
-              </w:rPr>
-              <w:t>off</w:t>
-            </w:r>
-            <w:r>
-              <w:rPr/>
-              <w:t>/</w:t>
-            </w:r>
-            <w:r>
-              <w:rPr>
-                <w:rStyle w:val="SourceText"/>
-              </w:rPr>
-              <w:t>report</w:t>
-            </w:r>
-            <w:r>
-              <w:rPr/>
-              <w:t>/</w:t>
-            </w:r>
-            <w:r>
-              <w:rPr>
-                <w:rStyle w:val="SourceText"/>
-              </w:rPr>
-              <w:t>block</w:t>
-            </w:r>
-            <w:r>
-              <w:rPr/>
-              <w:t>/</w:t>
-            </w:r>
-            <w:r>
-              <w:rPr>
-                <w:rStyle w:val="SourceText"/>
-              </w:rPr>
-              <w:t>auto</w:t>
-            </w:r>
-          </w:p>
-        </w:tc>
-        <w:tc>
-          <w:tcPr>
-            <w:tcW w:w="3377" w:type="dxa"/>
-            <w:tcBorders/>
-            <w:vAlign w:val="center"/>
-          </w:tcPr>
-          <w:p>
-            <w:pPr>
-              <w:pStyle w:val="TableContents"/>
-              <w:shd w:fill="2E3440" w:val="clear"/>
-              <w:bidi w:val="0"/>
-              <w:spacing w:before="120" w:after="120"/>
-              <w:jc w:val="left"/>
-              <w:rPr/>
-            </w:pPr>
-            <w:r>
-              <w:rPr>
-                <w:rStyle w:val="SourceText"/>
-              </w:rPr>
-              <w:t>off</w:t>
-            </w:r>
-            <w:r>
-              <w:rPr/>
-              <w:t>: neither the edit guard nor the completion audit runs</w:t>
+            <w:tcW w:w="1495" w:type="dxa"/>
+            <w:tcBorders/>
+            <w:vAlign w:val="center"/>
+          </w:tcPr>
+          <w:p>
+            <w:pPr>
+              <w:pStyle w:val="TableContents"/>
+              <w:shd w:fill="2E3440" w:val="clear"/>
+              <w:bidi w:val="0"/>
+              <w:spacing w:before="120" w:after="120"/>
+              <w:jc w:val="left"/>
+              <w:rPr/>
+            </w:pPr>
+            <w:r>
+              <w:rPr/>
+              <w:t>list of globs</w:t>
+            </w:r>
+          </w:p>
+        </w:tc>
+        <w:tc>
+          <w:tcPr>
+            <w:tcW w:w="4653" w:type="dxa"/>
+            <w:tcBorders/>
+            <w:vAlign w:val="center"/>
+          </w:tcPr>
+          <w:p>
+            <w:pPr>
+              <w:pStyle w:val="TableContents"/>
+              <w:shd w:fill="2E3440" w:val="clear"/>
+              <w:bidi w:val="0"/>
+              <w:spacing w:before="120" w:after="120"/>
+              <w:jc w:val="left"/>
+              <w:rPr/>
+            </w:pPr>
+            <w:r>
+              <w:rPr>
+                <w:rStyle w:val="SourceText"/>
+              </w:rPr>
+              <w:t>[]</w:t>
+            </w:r>
+            <w:r>
+              <w:rPr/>
+              <w:t>: nothing is nonProd, so every terraform apply asks (denied unattended)</w:t>
             </w:r>
           </w:p>
         </w:tc>
@@ -9053,51 +9626,61 @@
         <w:trPr/>
         <w:tc>
           <w:tcPr>
-            <w:tcW w:w="4621" w:type="dxa"/>
-            <w:tcBorders/>
-            <w:vAlign w:val="center"/>
-          </w:tcPr>
-          <w:p>
-            <w:pPr>
-              <w:pStyle w:val="TableContents"/>
-              <w:shd w:fill="2E3440" w:val="clear"/>
-              <w:bidi w:val="0"/>
-              <w:spacing w:before="120" w:after="120"/>
-              <w:jc w:val="left"/>
-              <w:rPr/>
-            </w:pPr>
-            <w:r>
-              <w:rPr>
-                <w:rStyle w:val="SourceText"/>
-              </w:rPr>
-              <w:t>scope.allowCliApproval</w:t>
-            </w:r>
-          </w:p>
-        </w:tc>
-        <w:tc>
-          <w:tcPr>
-            <w:tcW w:w="1551" w:type="dxa"/>
-            <w:tcBorders/>
-            <w:vAlign w:val="center"/>
-          </w:tcPr>
-          <w:p>
-            <w:pPr>
-              <w:pStyle w:val="TableContents"/>
-              <w:shd w:fill="2E3440" w:val="clear"/>
-              <w:bidi w:val="0"/>
-              <w:spacing w:before="120" w:after="120"/>
-              <w:jc w:val="left"/>
-              <w:rPr/>
-            </w:pPr>
-            <w:r>
-              <w:rPr/>
-              <w:t>repo only</w:t>
-            </w:r>
-          </w:p>
-        </w:tc>
-        <w:tc>
-          <w:tcPr>
-            <w:tcW w:w="1790" w:type="dxa"/>
+            <w:tcW w:w="3919" w:type="dxa"/>
+            <w:tcBorders/>
+            <w:vAlign w:val="center"/>
+          </w:tcPr>
+          <w:p>
+            <w:pPr>
+              <w:pStyle w:val="TableContents"/>
+              <w:shd w:fill="2E3440" w:val="clear"/>
+              <w:bidi w:val="0"/>
+              <w:spacing w:before="120" w:after="120"/>
+              <w:jc w:val="left"/>
+              <w:rPr/>
+            </w:pPr>
+            <w:r>
+              <w:rPr>
+                <w:rStyle w:val="SourceText"/>
+              </w:rPr>
+              <w:t>environments.prodUnattended</w:t>
+            </w:r>
+          </w:p>
+        </w:tc>
+        <w:tc>
+          <w:tcPr>
+            <w:tcW w:w="1272" w:type="dxa"/>
+            <w:tcBorders/>
+            <w:vAlign w:val="center"/>
+          </w:tcPr>
+          <w:p>
+            <w:pPr>
+              <w:pStyle w:val="TableContents"/>
+              <w:shd w:fill="2E3440" w:val="clear"/>
+              <w:bidi w:val="0"/>
+              <w:spacing w:before="120" w:after="120"/>
+              <w:jc w:val="left"/>
+              <w:rPr/>
+            </w:pPr>
+            <w:r>
+              <w:rPr/>
+              <w:t xml:space="preserve">both layers, ratchets (true only when both say </w:t>
+            </w:r>
+            <w:r>
+              <w:rPr>
+                <w:rStyle w:val="SourceText"/>
+              </w:rPr>
+              <w:t>true</w:t>
+            </w:r>
+            <w:r>
+              <w:rPr/>
+              <w:t>)</w:t>
+            </w:r>
+          </w:p>
+        </w:tc>
+        <w:tc>
+          <w:tcPr>
+            <w:tcW w:w="1495" w:type="dxa"/>
             <w:tcBorders/>
             <w:vAlign w:val="center"/>
           </w:tcPr>
@@ -9118,7 +9701,7 @@
         </w:tc>
         <w:tc>
           <w:tcPr>
-            <w:tcW w:w="3377" w:type="dxa"/>
+            <w:tcW w:w="4653" w:type="dxa"/>
             <w:tcBorders/>
             <w:vAlign w:val="center"/>
           </w:tcPr>
@@ -9139,37 +9722,7 @@
             </w:r>
             <w:r>
               <w:rPr/>
-              <w:t xml:space="preserve">: only a </w:t>
-            </w:r>
-            <w:r>
-              <w:rPr>
-                <w:rStyle w:val="SourceText"/>
-              </w:rPr>
-              <w:t>/crew:approve</w:t>
-            </w:r>
-            <w:r>
-              <w:rPr/>
-              <w:t xml:space="preserve"> typed by the user counts (no </w:t>
-            </w:r>
-            <w:r>
-              <w:rPr>
-                <w:rStyle w:val="SourceText"/>
-              </w:rPr>
-              <w:t>cli</w:t>
-            </w:r>
-            <w:r>
-              <w:rPr/>
-              <w:t xml:space="preserve"> or </w:t>
-            </w:r>
-            <w:r>
-              <w:rPr>
-                <w:rStyle w:val="SourceText"/>
-              </w:rPr>
-              <w:t>autopilot</w:t>
-            </w:r>
-            <w:r>
-              <w:rPr/>
-              <w:t xml:space="preserve"> receipt)</w:t>
+              <w:t xml:space="preserve"> in either layer holds it down: production applies and dispatches ask</w:t>
             </w:r>
           </w:p>
         </w:tc>
@@ -9178,93 +9731,125 @@
         <w:trPr/>
         <w:tc>
           <w:tcPr>
-            <w:tcW w:w="4621" w:type="dxa"/>
-            <w:tcBorders/>
-            <w:vAlign w:val="center"/>
-          </w:tcPr>
-          <w:p>
-            <w:pPr>
-              <w:pStyle w:val="TableContents"/>
-              <w:shd w:fill="2E3440" w:val="clear"/>
-              <w:bidi w:val="0"/>
-              <w:spacing w:before="120" w:after="120"/>
-              <w:jc w:val="left"/>
-              <w:rPr/>
-            </w:pPr>
-            <w:r>
-              <w:rPr>
-                <w:rStyle w:val="SourceText"/>
-              </w:rPr>
-              <w:t>verifyGate</w:t>
-            </w:r>
-          </w:p>
-        </w:tc>
-        <w:tc>
-          <w:tcPr>
-            <w:tcW w:w="1551" w:type="dxa"/>
-            <w:tcBorders/>
-            <w:vAlign w:val="center"/>
-          </w:tcPr>
-          <w:p>
-            <w:pPr>
-              <w:pStyle w:val="TableContents"/>
-              <w:shd w:fill="2E3440" w:val="clear"/>
-              <w:bidi w:val="0"/>
-              <w:spacing w:before="120" w:after="120"/>
-              <w:jc w:val="left"/>
-              <w:rPr/>
-            </w:pPr>
-            <w:r>
-              <w:rPr/>
-              <w:t>repo only</w:t>
-            </w:r>
-          </w:p>
-        </w:tc>
-        <w:tc>
-          <w:tcPr>
-            <w:tcW w:w="1790" w:type="dxa"/>
-            <w:tcBorders/>
-            <w:vAlign w:val="center"/>
-          </w:tcPr>
-          <w:p>
-            <w:pPr>
-              <w:pStyle w:val="TableContents"/>
-              <w:shd w:fill="2E3440" w:val="clear"/>
-              <w:bidi w:val="0"/>
-              <w:spacing w:before="120" w:after="120"/>
-              <w:jc w:val="left"/>
-              <w:rPr/>
-            </w:pPr>
-            <w:r>
-              <w:rPr/>
-              <w:t>bool</w:t>
-            </w:r>
-          </w:p>
-        </w:tc>
-        <w:tc>
-          <w:tcPr>
-            <w:tcW w:w="3377" w:type="dxa"/>
-            <w:tcBorders/>
-            <w:vAlign w:val="center"/>
-          </w:tcPr>
-          <w:p>
-            <w:pPr>
-              <w:pStyle w:val="TableContents"/>
-              <w:shd w:fill="2E3440" w:val="clear"/>
-              <w:bidi w:val="0"/>
-              <w:spacing w:before="120" w:after="120"/>
-              <w:jc w:val="left"/>
-              <w:rPr/>
-            </w:pPr>
-            <w:r>
-              <w:rPr>
-                <w:rStyle w:val="SourceText"/>
-              </w:rPr>
-              <w:t>false</w:t>
-            </w:r>
-            <w:r>
-              <w:rPr/>
-              <w:t>: the Stop verify gate does not run at all</w:t>
+            <w:tcW w:w="3919" w:type="dxa"/>
+            <w:tcBorders/>
+            <w:vAlign w:val="center"/>
+          </w:tcPr>
+          <w:p>
+            <w:pPr>
+              <w:pStyle w:val="TableContents"/>
+              <w:shd w:fill="2E3440" w:val="clear"/>
+              <w:bidi w:val="0"/>
+              <w:spacing w:before="120" w:after="120"/>
+              <w:jc w:val="left"/>
+              <w:rPr/>
+            </w:pPr>
+            <w:r>
+              <w:rPr>
+                <w:rStyle w:val="SourceText"/>
+              </w:rPr>
+              <w:t>guards.prodDatabase</w:t>
+            </w:r>
+            <w:r>
+              <w:rPr/>
+              <w:t xml:space="preserve">, </w:t>
+            </w:r>
+            <w:r>
+              <w:rPr>
+                <w:rStyle w:val="SourceText"/>
+              </w:rPr>
+              <w:t>guards.prodServer</w:t>
+            </w:r>
+          </w:p>
+        </w:tc>
+        <w:tc>
+          <w:tcPr>
+            <w:tcW w:w="1272" w:type="dxa"/>
+            <w:tcBorders/>
+            <w:vAlign w:val="center"/>
+          </w:tcPr>
+          <w:p>
+            <w:pPr>
+              <w:pStyle w:val="TableContents"/>
+              <w:shd w:fill="2E3440" w:val="clear"/>
+              <w:bidi w:val="0"/>
+              <w:spacing w:before="120" w:after="120"/>
+              <w:jc w:val="left"/>
+              <w:rPr/>
+            </w:pPr>
+            <w:r>
+              <w:rPr/>
+              <w:t>both layers, ratchets</w:t>
+            </w:r>
+          </w:p>
+        </w:tc>
+        <w:tc>
+          <w:tcPr>
+            <w:tcW w:w="1495" w:type="dxa"/>
+            <w:tcBorders/>
+            <w:vAlign w:val="center"/>
+          </w:tcPr>
+          <w:p>
+            <w:pPr>
+              <w:pStyle w:val="TableContents"/>
+              <w:shd w:fill="2E3440" w:val="clear"/>
+              <w:bidi w:val="0"/>
+              <w:spacing w:before="120" w:after="120"/>
+              <w:jc w:val="left"/>
+              <w:rPr/>
+            </w:pPr>
+            <w:r>
+              <w:rPr>
+                <w:rStyle w:val="SourceText"/>
+              </w:rPr>
+              <w:t>none</w:t>
+            </w:r>
+            <w:r>
+              <w:rPr/>
+              <w:t>/</w:t>
+            </w:r>
+            <w:r>
+              <w:rPr>
+                <w:rStyle w:val="SourceText"/>
+              </w:rPr>
+              <w:t>read</w:t>
+            </w:r>
+            <w:r>
+              <w:rPr/>
+              <w:t>/</w:t>
+            </w:r>
+            <w:r>
+              <w:rPr>
+                <w:rStyle w:val="SourceText"/>
+              </w:rPr>
+              <w:t>full</w:t>
+            </w:r>
+          </w:p>
+        </w:tc>
+        <w:tc>
+          <w:tcPr>
+            <w:tcW w:w="4653" w:type="dxa"/>
+            <w:tcBorders/>
+            <w:vAlign w:val="center"/>
+          </w:tcPr>
+          <w:p>
+            <w:pPr>
+              <w:pStyle w:val="TableContents"/>
+              <w:shd w:fill="2E3440" w:val="clear"/>
+              <w:bidi w:val="0"/>
+              <w:spacing w:before="120" w:after="120"/>
+              <w:jc w:val="left"/>
+              <w:rPr/>
+            </w:pPr>
+            <w:r>
+              <w:rPr>
+                <w:rStyle w:val="SourceText"/>
+              </w:rPr>
+              <w:t>none</w:t>
+            </w:r>
+            <w:r>
+              <w:rPr/>
+              <w:t xml:space="preserve"> is both the default and the floor</w:t>
             </w:r>
           </w:p>
         </w:tc>
@@ -9273,103 +9858,125 @@
         <w:trPr/>
         <w:tc>
           <w:tcPr>
-            <w:tcW w:w="4621" w:type="dxa"/>
-            <w:tcBorders/>
-            <w:vAlign w:val="center"/>
-          </w:tcPr>
-          <w:p>
-            <w:pPr>
-              <w:pStyle w:val="TableContents"/>
-              <w:shd w:fill="2E3440" w:val="clear"/>
-              <w:bidi w:val="0"/>
-              <w:spacing w:before="120" w:after="120"/>
-              <w:jc w:val="left"/>
-              <w:rPr/>
-            </w:pPr>
-            <w:r>
-              <w:rPr>
-                <w:rStyle w:val="SourceText"/>
-              </w:rPr>
-              <w:t>context.enabled</w:t>
-            </w:r>
-          </w:p>
-        </w:tc>
-        <w:tc>
-          <w:tcPr>
-            <w:tcW w:w="1551" w:type="dxa"/>
-            <w:tcBorders/>
-            <w:vAlign w:val="center"/>
-          </w:tcPr>
-          <w:p>
-            <w:pPr>
-              <w:pStyle w:val="TableContents"/>
-              <w:shd w:fill="2E3440" w:val="clear"/>
-              <w:bidi w:val="0"/>
-              <w:spacing w:before="120" w:after="120"/>
-              <w:jc w:val="left"/>
-              <w:rPr/>
-            </w:pPr>
-            <w:r>
-              <w:rPr/>
-              <w:t>both layers</w:t>
-            </w:r>
-          </w:p>
-        </w:tc>
-        <w:tc>
-          <w:tcPr>
-            <w:tcW w:w="1790" w:type="dxa"/>
-            <w:tcBorders/>
-            <w:vAlign w:val="center"/>
-          </w:tcPr>
-          <w:p>
-            <w:pPr>
-              <w:pStyle w:val="TableContents"/>
-              <w:shd w:fill="2E3440" w:val="clear"/>
-              <w:bidi w:val="0"/>
-              <w:spacing w:before="120" w:after="120"/>
-              <w:jc w:val="left"/>
-              <w:rPr/>
-            </w:pPr>
-            <w:r>
-              <w:rPr/>
-              <w:t>bool</w:t>
-            </w:r>
-          </w:p>
-        </w:tc>
-        <w:tc>
-          <w:tcPr>
-            <w:tcW w:w="3377" w:type="dxa"/>
-            <w:tcBorders/>
-            <w:vAlign w:val="center"/>
-          </w:tcPr>
-          <w:p>
-            <w:pPr>
-              <w:pStyle w:val="TableContents"/>
-              <w:shd w:fill="2E3440" w:val="clear"/>
-              <w:bidi w:val="0"/>
-              <w:spacing w:before="120" w:after="120"/>
-              <w:jc w:val="left"/>
-              <w:rPr/>
-            </w:pPr>
-            <w:r>
-              <w:rPr>
-                <w:rStyle w:val="SourceText"/>
-              </w:rPr>
-              <w:t>false</w:t>
-            </w:r>
-            <w:r>
-              <w:rPr/>
-              <w:t xml:space="preserve">: </w:t>
-            </w:r>
-            <w:r>
-              <w:rPr>
-                <w:rStyle w:val="SourceText"/>
-              </w:rPr>
-              <w:t>context-watch.sh</w:t>
-            </w:r>
-            <w:r>
-              <w:rPr/>
-              <w:t xml:space="preserve"> (the Stop nag) does nothing</w:t>
+            <w:tcW w:w="3919" w:type="dxa"/>
+            <w:tcBorders/>
+            <w:vAlign w:val="center"/>
+          </w:tcPr>
+          <w:p>
+            <w:pPr>
+              <w:pStyle w:val="TableContents"/>
+              <w:shd w:fill="2E3440" w:val="clear"/>
+              <w:bidi w:val="0"/>
+              <w:spacing w:before="120" w:after="120"/>
+              <w:jc w:val="left"/>
+              <w:rPr/>
+            </w:pPr>
+            <w:r>
+              <w:rPr>
+                <w:rStyle w:val="SourceText"/>
+              </w:rPr>
+              <w:t>scope.mode</w:t>
+            </w:r>
+          </w:p>
+        </w:tc>
+        <w:tc>
+          <w:tcPr>
+            <w:tcW w:w="1272" w:type="dxa"/>
+            <w:tcBorders/>
+            <w:vAlign w:val="center"/>
+          </w:tcPr>
+          <w:p>
+            <w:pPr>
+              <w:pStyle w:val="TableContents"/>
+              <w:shd w:fill="2E3440" w:val="clear"/>
+              <w:bidi w:val="0"/>
+              <w:spacing w:before="120" w:after="120"/>
+              <w:jc w:val="left"/>
+              <w:rPr/>
+            </w:pPr>
+            <w:r>
+              <w:rPr/>
+              <w:t>repo only</w:t>
+            </w:r>
+          </w:p>
+        </w:tc>
+        <w:tc>
+          <w:tcPr>
+            <w:tcW w:w="1495" w:type="dxa"/>
+            <w:tcBorders/>
+            <w:vAlign w:val="center"/>
+          </w:tcPr>
+          <w:p>
+            <w:pPr>
+              <w:pStyle w:val="TableContents"/>
+              <w:shd w:fill="2E3440" w:val="clear"/>
+              <w:bidi w:val="0"/>
+              <w:spacing w:before="120" w:after="120"/>
+              <w:jc w:val="left"/>
+              <w:rPr/>
+            </w:pPr>
+            <w:r>
+              <w:rPr>
+                <w:rStyle w:val="SourceText"/>
+              </w:rPr>
+              <w:t>off</w:t>
+            </w:r>
+            <w:r>
+              <w:rPr/>
+              <w:t>/</w:t>
+            </w:r>
+            <w:r>
+              <w:rPr>
+                <w:rStyle w:val="SourceText"/>
+              </w:rPr>
+              <w:t>report</w:t>
+            </w:r>
+            <w:r>
+              <w:rPr/>
+              <w:t>/</w:t>
+            </w:r>
+            <w:r>
+              <w:rPr>
+                <w:rStyle w:val="SourceText"/>
+              </w:rPr>
+              <w:t>block</w:t>
+            </w:r>
+            <w:r>
+              <w:rPr/>
+              <w:t>/</w:t>
+            </w:r>
+            <w:r>
+              <w:rPr>
+                <w:rStyle w:val="SourceText"/>
+              </w:rPr>
+              <w:t>auto</w:t>
+            </w:r>
+          </w:p>
+        </w:tc>
+        <w:tc>
+          <w:tcPr>
+            <w:tcW w:w="4653" w:type="dxa"/>
+            <w:tcBorders/>
+            <w:vAlign w:val="center"/>
+          </w:tcPr>
+          <w:p>
+            <w:pPr>
+              <w:pStyle w:val="TableContents"/>
+              <w:shd w:fill="2E3440" w:val="clear"/>
+              <w:bidi w:val="0"/>
+              <w:spacing w:before="120" w:after="120"/>
+              <w:jc w:val="left"/>
+              <w:rPr/>
+            </w:pPr>
+            <w:r>
+              <w:rPr>
+                <w:rStyle w:val="SourceText"/>
+              </w:rPr>
+              <w:t>off</w:t>
+            </w:r>
+            <w:r>
+              <w:rPr/>
+              <w:t>: neither the edit guard nor the completion audit runs</w:t>
             </w:r>
           </w:p>
         </w:tc>
@@ -9378,61 +9985,51 @@
         <w:trPr/>
         <w:tc>
           <w:tcPr>
-            <w:tcW w:w="4621" w:type="dxa"/>
-            <w:tcBorders/>
-            <w:vAlign w:val="center"/>
-          </w:tcPr>
-          <w:p>
-            <w:pPr>
-              <w:pStyle w:val="TableContents"/>
-              <w:shd w:fill="2E3440" w:val="clear"/>
-              <w:bidi w:val="0"/>
-              <w:spacing w:before="120" w:after="120"/>
-              <w:jc w:val="left"/>
-              <w:rPr/>
-            </w:pPr>
-            <w:r>
-              <w:rPr>
-                <w:rStyle w:val="SourceText"/>
-              </w:rPr>
-              <w:t>context.autoClear.enabled</w:t>
-            </w:r>
-            <w:r>
-              <w:rPr/>
-              <w:t xml:space="preserve">, </w:t>
-            </w:r>
-            <w:r>
-              <w:rPr>
-                <w:rStyle w:val="SourceText"/>
-              </w:rPr>
-              <w:t>autoWrapUp</w:t>
-            </w:r>
-          </w:p>
-        </w:tc>
-        <w:tc>
-          <w:tcPr>
-            <w:tcW w:w="1551" w:type="dxa"/>
-            <w:tcBorders/>
-            <w:vAlign w:val="center"/>
-          </w:tcPr>
-          <w:p>
-            <w:pPr>
-              <w:pStyle w:val="TableContents"/>
-              <w:shd w:fill="2E3440" w:val="clear"/>
-              <w:bidi w:val="0"/>
-              <w:spacing w:before="120" w:after="120"/>
-              <w:jc w:val="left"/>
-              <w:rPr/>
-            </w:pPr>
-            <w:r>
-              <w:rPr/>
-              <w:t>both layers</w:t>
-            </w:r>
-          </w:p>
-        </w:tc>
-        <w:tc>
-          <w:tcPr>
-            <w:tcW w:w="1790" w:type="dxa"/>
+            <w:tcW w:w="3919" w:type="dxa"/>
+            <w:tcBorders/>
+            <w:vAlign w:val="center"/>
+          </w:tcPr>
+          <w:p>
+            <w:pPr>
+              <w:pStyle w:val="TableContents"/>
+              <w:shd w:fill="2E3440" w:val="clear"/>
+              <w:bidi w:val="0"/>
+              <w:spacing w:before="120" w:after="120"/>
+              <w:jc w:val="left"/>
+              <w:rPr/>
+            </w:pPr>
+            <w:r>
+              <w:rPr>
+                <w:rStyle w:val="SourceText"/>
+              </w:rPr>
+              <w:t>scope.allowCliApproval</w:t>
+            </w:r>
+          </w:p>
+        </w:tc>
+        <w:tc>
+          <w:tcPr>
+            <w:tcW w:w="1272" w:type="dxa"/>
+            <w:tcBorders/>
+            <w:vAlign w:val="center"/>
+          </w:tcPr>
+          <w:p>
+            <w:pPr>
+              <w:pStyle w:val="TableContents"/>
+              <w:shd w:fill="2E3440" w:val="clear"/>
+              <w:bidi w:val="0"/>
+              <w:spacing w:before="120" w:after="120"/>
+              <w:jc w:val="left"/>
+              <w:rPr/>
+            </w:pPr>
+            <w:r>
+              <w:rPr/>
+              <w:t>repo only</w:t>
+            </w:r>
+          </w:p>
+        </w:tc>
+        <w:tc>
+          <w:tcPr>
+            <w:tcW w:w="1495" w:type="dxa"/>
             <w:tcBorders/>
             <w:vAlign w:val="center"/>
           </w:tcPr>
@@ -9453,22 +10050,58 @@
         </w:tc>
         <w:tc>
           <w:tcPr>
-            <w:tcW w:w="3377" w:type="dxa"/>
-            <w:tcBorders/>
-            <w:vAlign w:val="center"/>
-          </w:tcPr>
-          <w:p>
-            <w:pPr>
-              <w:pStyle w:val="TableContents"/>
-              <w:shd w:fill="2E3440" w:val="clear"/>
-              <w:bidi w:val="0"/>
-              <w:spacing w:before="120" w:after="120"/>
-              <w:jc w:val="left"/>
-              <w:rPr/>
-            </w:pPr>
-            <w:r>
-              <w:rPr/>
-              <w:t>each independently disables one leg of the wrap-up/clear loop</w:t>
+            <w:tcW w:w="4653" w:type="dxa"/>
+            <w:tcBorders/>
+            <w:vAlign w:val="center"/>
+          </w:tcPr>
+          <w:p>
+            <w:pPr>
+              <w:pStyle w:val="TableContents"/>
+              <w:shd w:fill="2E3440" w:val="clear"/>
+              <w:bidi w:val="0"/>
+              <w:spacing w:before="120" w:after="120"/>
+              <w:jc w:val="left"/>
+              <w:rPr/>
+            </w:pPr>
+            <w:r>
+              <w:rPr>
+                <w:rStyle w:val="SourceText"/>
+              </w:rPr>
+              <w:t>false</w:t>
+            </w:r>
+            <w:r>
+              <w:rPr/>
+              <w:t xml:space="preserve">: only a </w:t>
+            </w:r>
+            <w:r>
+              <w:rPr>
+                <w:rStyle w:val="SourceText"/>
+              </w:rPr>
+              <w:t>/crew:approve</w:t>
+            </w:r>
+            <w:r>
+              <w:rPr/>
+              <w:t xml:space="preserve"> typed by the user counts (no </w:t>
+            </w:r>
+            <w:r>
+              <w:rPr>
+                <w:rStyle w:val="SourceText"/>
+              </w:rPr>
+              <w:t>cli</w:t>
+            </w:r>
+            <w:r>
+              <w:rPr/>
+              <w:t xml:space="preserve"> or </w:t>
+            </w:r>
+            <w:r>
+              <w:rPr>
+                <w:rStyle w:val="SourceText"/>
+              </w:rPr>
+              <w:t>autopilot</w:t>
+            </w:r>
+            <w:r>
+              <w:rPr/>
+              <w:t xml:space="preserve"> receipt)</w:t>
             </w:r>
           </w:p>
         </w:tc>
@@ -9477,109 +10110,93 @@
         <w:trPr/>
         <w:tc>
           <w:tcPr>
-            <w:tcW w:w="4621" w:type="dxa"/>
-            <w:tcBorders/>
-            <w:vAlign w:val="center"/>
-          </w:tcPr>
-          <w:p>
-            <w:pPr>
-              <w:pStyle w:val="TableContents"/>
-              <w:shd w:fill="2E3440" w:val="clear"/>
-              <w:bidi w:val="0"/>
-              <w:spacing w:before="120" w:after="120"/>
-              <w:jc w:val="left"/>
-              <w:rPr/>
-            </w:pPr>
-            <w:r>
-              <w:rPr>
-                <w:rStyle w:val="SourceText"/>
-              </w:rPr>
-              <w:t>notify.provider</w:t>
-            </w:r>
-          </w:p>
-        </w:tc>
-        <w:tc>
-          <w:tcPr>
-            <w:tcW w:w="1551" w:type="dxa"/>
-            <w:tcBorders/>
-            <w:vAlign w:val="center"/>
-          </w:tcPr>
-          <w:p>
-            <w:pPr>
-              <w:pStyle w:val="TableContents"/>
-              <w:shd w:fill="2E3440" w:val="clear"/>
-              <w:bidi w:val="0"/>
-              <w:spacing w:before="120" w:after="120"/>
-              <w:jc w:val="left"/>
-              <w:rPr/>
-            </w:pPr>
-            <w:r>
-              <w:rPr/>
-              <w:t>both layers</w:t>
-            </w:r>
-          </w:p>
-        </w:tc>
-        <w:tc>
-          <w:tcPr>
-            <w:tcW w:w="1790" w:type="dxa"/>
-            <w:tcBorders/>
-            <w:vAlign w:val="center"/>
-          </w:tcPr>
-          <w:p>
-            <w:pPr>
-              <w:pStyle w:val="TableContents"/>
-              <w:shd w:fill="2E3440" w:val="clear"/>
-              <w:bidi w:val="0"/>
-              <w:spacing w:before="120" w:after="120"/>
-              <w:jc w:val="left"/>
-              <w:rPr/>
-            </w:pPr>
-            <w:r>
-              <w:rPr/>
-              <w:t xml:space="preserve">provider name / </w:t>
-            </w:r>
-            <w:r>
-              <w:rPr>
-                <w:rStyle w:val="SourceText"/>
-              </w:rPr>
-              <w:t>none</w:t>
-            </w:r>
-          </w:p>
-        </w:tc>
-        <w:tc>
-          <w:tcPr>
-            <w:tcW w:w="3377" w:type="dxa"/>
-            <w:tcBorders/>
-            <w:vAlign w:val="center"/>
-          </w:tcPr>
-          <w:p>
-            <w:pPr>
-              <w:pStyle w:val="TableContents"/>
-              <w:shd w:fill="2E3440" w:val="clear"/>
-              <w:bidi w:val="0"/>
-              <w:spacing w:before="120" w:after="120"/>
-              <w:jc w:val="left"/>
-              <w:rPr/>
-            </w:pPr>
-            <w:r>
-              <w:rPr>
-                <w:rStyle w:val="SourceText"/>
-              </w:rPr>
-              <w:t>none</w:t>
-            </w:r>
-            <w:r>
-              <w:rPr/>
-              <w:t xml:space="preserve">: the </w:t>
-            </w:r>
-            <w:r>
-              <w:rPr>
-                <w:rStyle w:val="SourceText"/>
-              </w:rPr>
-              <w:t>Notification</w:t>
-            </w:r>
-            <w:r>
-              <w:rPr/>
-              <w:t xml:space="preserve"> hook sends nothing</w:t>
+            <w:tcW w:w="3919" w:type="dxa"/>
+            <w:tcBorders/>
+            <w:vAlign w:val="center"/>
+          </w:tcPr>
+          <w:p>
+            <w:pPr>
+              <w:pStyle w:val="TableContents"/>
+              <w:shd w:fill="2E3440" w:val="clear"/>
+              <w:bidi w:val="0"/>
+              <w:spacing w:before="120" w:after="120"/>
+              <w:jc w:val="left"/>
+              <w:rPr/>
+            </w:pPr>
+            <w:r>
+              <w:rPr>
+                <w:rStyle w:val="SourceText"/>
+              </w:rPr>
+              <w:t>verifyGate</w:t>
+            </w:r>
+          </w:p>
+        </w:tc>
+        <w:tc>
+          <w:tcPr>
+            <w:tcW w:w="1272" w:type="dxa"/>
+            <w:tcBorders/>
+            <w:vAlign w:val="center"/>
+          </w:tcPr>
+          <w:p>
+            <w:pPr>
+              <w:pStyle w:val="TableContents"/>
+              <w:shd w:fill="2E3440" w:val="clear"/>
+              <w:bidi w:val="0"/>
+              <w:spacing w:before="120" w:after="120"/>
+              <w:jc w:val="left"/>
+              <w:rPr/>
+            </w:pPr>
+            <w:r>
+              <w:rPr/>
+              <w:t>repo only</w:t>
+            </w:r>
+          </w:p>
+        </w:tc>
+        <w:tc>
+          <w:tcPr>
+            <w:tcW w:w="1495" w:type="dxa"/>
+            <w:tcBorders/>
+            <w:vAlign w:val="center"/>
+          </w:tcPr>
+          <w:p>
+            <w:pPr>
+              <w:pStyle w:val="TableContents"/>
+              <w:shd w:fill="2E3440" w:val="clear"/>
+              <w:bidi w:val="0"/>
+              <w:spacing w:before="120" w:after="120"/>
+              <w:jc w:val="left"/>
+              <w:rPr/>
+            </w:pPr>
+            <w:r>
+              <w:rPr/>
+              <w:t>bool</w:t>
+            </w:r>
+          </w:p>
+        </w:tc>
+        <w:tc>
+          <w:tcPr>
+            <w:tcW w:w="4653" w:type="dxa"/>
+            <w:tcBorders/>
+            <w:vAlign w:val="center"/>
+          </w:tcPr>
+          <w:p>
+            <w:pPr>
+              <w:pStyle w:val="TableContents"/>
+              <w:shd w:fill="2E3440" w:val="clear"/>
+              <w:bidi w:val="0"/>
+              <w:spacing w:before="120" w:after="120"/>
+              <w:jc w:val="left"/>
+              <w:rPr/>
+            </w:pPr>
+            <w:r>
+              <w:rPr>
+                <w:rStyle w:val="SourceText"/>
+              </w:rPr>
+              <w:t>false</w:t>
+            </w:r>
+            <w:r>
+              <w:rPr/>
+              <w:t>: the Stop verify gate does not run at all</w:t>
             </w:r>
           </w:p>
         </w:tc>
@@ -9588,51 +10205,51 @@
         <w:trPr/>
         <w:tc>
           <w:tcPr>
-            <w:tcW w:w="4621" w:type="dxa"/>
-            <w:tcBorders/>
-            <w:vAlign w:val="center"/>
-          </w:tcPr>
-          <w:p>
-            <w:pPr>
-              <w:pStyle w:val="TableContents"/>
-              <w:shd w:fill="2E3440" w:val="clear"/>
-              <w:bidi w:val="0"/>
-              <w:spacing w:before="120" w:after="120"/>
-              <w:jc w:val="left"/>
-              <w:rPr/>
-            </w:pPr>
-            <w:r>
-              <w:rPr>
-                <w:rStyle w:val="SourceText"/>
-              </w:rPr>
-              <w:t>change.requireForProduction</w:t>
-            </w:r>
-          </w:p>
-        </w:tc>
-        <w:tc>
-          <w:tcPr>
-            <w:tcW w:w="1551" w:type="dxa"/>
-            <w:tcBorders/>
-            <w:vAlign w:val="center"/>
-          </w:tcPr>
-          <w:p>
-            <w:pPr>
-              <w:pStyle w:val="TableContents"/>
-              <w:shd w:fill="2E3440" w:val="clear"/>
-              <w:bidi w:val="0"/>
-              <w:spacing w:before="120" w:after="120"/>
-              <w:jc w:val="left"/>
-              <w:rPr/>
-            </w:pPr>
-            <w:r>
-              <w:rPr/>
-              <w:t>both layers, ratchets (may only turn ON)</w:t>
-            </w:r>
-          </w:p>
-        </w:tc>
-        <w:tc>
-          <w:tcPr>
-            <w:tcW w:w="1790" w:type="dxa"/>
+            <w:tcW w:w="3919" w:type="dxa"/>
+            <w:tcBorders/>
+            <w:vAlign w:val="center"/>
+          </w:tcPr>
+          <w:p>
+            <w:pPr>
+              <w:pStyle w:val="TableContents"/>
+              <w:shd w:fill="2E3440" w:val="clear"/>
+              <w:bidi w:val="0"/>
+              <w:spacing w:before="120" w:after="120"/>
+              <w:jc w:val="left"/>
+              <w:rPr/>
+            </w:pPr>
+            <w:r>
+              <w:rPr>
+                <w:rStyle w:val="SourceText"/>
+              </w:rPr>
+              <w:t>context.enabled</w:t>
+            </w:r>
+          </w:p>
+        </w:tc>
+        <w:tc>
+          <w:tcPr>
+            <w:tcW w:w="1272" w:type="dxa"/>
+            <w:tcBorders/>
+            <w:vAlign w:val="center"/>
+          </w:tcPr>
+          <w:p>
+            <w:pPr>
+              <w:pStyle w:val="TableContents"/>
+              <w:shd w:fill="2E3440" w:val="clear"/>
+              <w:bidi w:val="0"/>
+              <w:spacing w:before="120" w:after="120"/>
+              <w:jc w:val="left"/>
+              <w:rPr/>
+            </w:pPr>
+            <w:r>
+              <w:rPr/>
+              <w:t>both layers</w:t>
+            </w:r>
+          </w:p>
+        </w:tc>
+        <w:tc>
+          <w:tcPr>
+            <w:tcW w:w="1495" w:type="dxa"/>
             <w:tcBorders/>
             <w:vAlign w:val="center"/>
           </w:tcPr>
@@ -9653,7 +10270,7 @@
         </w:tc>
         <w:tc>
           <w:tcPr>
-            <w:tcW w:w="3377" w:type="dxa"/>
+            <w:tcW w:w="4653" w:type="dxa"/>
             <w:tcBorders/>
             <w:vAlign w:val="center"/>
           </w:tcPr>
@@ -9674,7 +10291,17 @@
             </w:r>
             <w:r>
               <w:rPr/>
-              <w:t>: promoting needs no approved change request</w:t>
+              <w:t xml:space="preserve">: </w:t>
+            </w:r>
+            <w:r>
+              <w:rPr>
+                <w:rStyle w:val="SourceText"/>
+              </w:rPr>
+              <w:t>context-watch.sh</w:t>
+            </w:r>
+            <w:r>
+              <w:rPr/>
+              <w:t xml:space="preserve"> (the Stop nag) does nothing</w:t>
             </w:r>
           </w:p>
         </w:tc>
@@ -9683,7 +10310,312 @@
         <w:trPr/>
         <w:tc>
           <w:tcPr>
-            <w:tcW w:w="4621" w:type="dxa"/>
+            <w:tcW w:w="3919" w:type="dxa"/>
+            <w:tcBorders/>
+            <w:vAlign w:val="center"/>
+          </w:tcPr>
+          <w:p>
+            <w:pPr>
+              <w:pStyle w:val="TableContents"/>
+              <w:shd w:fill="2E3440" w:val="clear"/>
+              <w:bidi w:val="0"/>
+              <w:spacing w:before="120" w:after="120"/>
+              <w:jc w:val="left"/>
+              <w:rPr/>
+            </w:pPr>
+            <w:r>
+              <w:rPr>
+                <w:rStyle w:val="SourceText"/>
+              </w:rPr>
+              <w:t>context.autoClear.enabled</w:t>
+            </w:r>
+            <w:r>
+              <w:rPr/>
+              <w:t xml:space="preserve">, </w:t>
+            </w:r>
+            <w:r>
+              <w:rPr>
+                <w:rStyle w:val="SourceText"/>
+              </w:rPr>
+              <w:t>autoWrapUp</w:t>
+            </w:r>
+          </w:p>
+        </w:tc>
+        <w:tc>
+          <w:tcPr>
+            <w:tcW w:w="1272" w:type="dxa"/>
+            <w:tcBorders/>
+            <w:vAlign w:val="center"/>
+          </w:tcPr>
+          <w:p>
+            <w:pPr>
+              <w:pStyle w:val="TableContents"/>
+              <w:shd w:fill="2E3440" w:val="clear"/>
+              <w:bidi w:val="0"/>
+              <w:spacing w:before="120" w:after="120"/>
+              <w:jc w:val="left"/>
+              <w:rPr/>
+            </w:pPr>
+            <w:r>
+              <w:rPr/>
+              <w:t>both layers</w:t>
+            </w:r>
+          </w:p>
+        </w:tc>
+        <w:tc>
+          <w:tcPr>
+            <w:tcW w:w="1495" w:type="dxa"/>
+            <w:tcBorders/>
+            <w:vAlign w:val="center"/>
+          </w:tcPr>
+          <w:p>
+            <w:pPr>
+              <w:pStyle w:val="TableContents"/>
+              <w:shd w:fill="2E3440" w:val="clear"/>
+              <w:bidi w:val="0"/>
+              <w:spacing w:before="120" w:after="120"/>
+              <w:jc w:val="left"/>
+              <w:rPr/>
+            </w:pPr>
+            <w:r>
+              <w:rPr/>
+              <w:t>bool</w:t>
+            </w:r>
+          </w:p>
+        </w:tc>
+        <w:tc>
+          <w:tcPr>
+            <w:tcW w:w="4653" w:type="dxa"/>
+            <w:tcBorders/>
+            <w:vAlign w:val="center"/>
+          </w:tcPr>
+          <w:p>
+            <w:pPr>
+              <w:pStyle w:val="TableContents"/>
+              <w:shd w:fill="2E3440" w:val="clear"/>
+              <w:bidi w:val="0"/>
+              <w:spacing w:before="120" w:after="120"/>
+              <w:jc w:val="left"/>
+              <w:rPr/>
+            </w:pPr>
+            <w:r>
+              <w:rPr/>
+              <w:t>each independently disables one leg of the wrap-up/clear loop</w:t>
+            </w:r>
+          </w:p>
+        </w:tc>
+      </w:tr>
+      <w:tr>
+        <w:trPr/>
+        <w:tc>
+          <w:tcPr>
+            <w:tcW w:w="3919" w:type="dxa"/>
+            <w:tcBorders/>
+            <w:vAlign w:val="center"/>
+          </w:tcPr>
+          <w:p>
+            <w:pPr>
+              <w:pStyle w:val="TableContents"/>
+              <w:shd w:fill="2E3440" w:val="clear"/>
+              <w:bidi w:val="0"/>
+              <w:spacing w:before="120" w:after="120"/>
+              <w:jc w:val="left"/>
+              <w:rPr/>
+            </w:pPr>
+            <w:r>
+              <w:rPr>
+                <w:rStyle w:val="SourceText"/>
+              </w:rPr>
+              <w:t>notify.provider</w:t>
+            </w:r>
+          </w:p>
+        </w:tc>
+        <w:tc>
+          <w:tcPr>
+            <w:tcW w:w="1272" w:type="dxa"/>
+            <w:tcBorders/>
+            <w:vAlign w:val="center"/>
+          </w:tcPr>
+          <w:p>
+            <w:pPr>
+              <w:pStyle w:val="TableContents"/>
+              <w:shd w:fill="2E3440" w:val="clear"/>
+              <w:bidi w:val="0"/>
+              <w:spacing w:before="120" w:after="120"/>
+              <w:jc w:val="left"/>
+              <w:rPr/>
+            </w:pPr>
+            <w:r>
+              <w:rPr/>
+              <w:t>both layers</w:t>
+            </w:r>
+          </w:p>
+        </w:tc>
+        <w:tc>
+          <w:tcPr>
+            <w:tcW w:w="1495" w:type="dxa"/>
+            <w:tcBorders/>
+            <w:vAlign w:val="center"/>
+          </w:tcPr>
+          <w:p>
+            <w:pPr>
+              <w:pStyle w:val="TableContents"/>
+              <w:shd w:fill="2E3440" w:val="clear"/>
+              <w:bidi w:val="0"/>
+              <w:spacing w:before="120" w:after="120"/>
+              <w:jc w:val="left"/>
+              <w:rPr/>
+            </w:pPr>
+            <w:r>
+              <w:rPr/>
+              <w:t xml:space="preserve">provider name / </w:t>
+            </w:r>
+            <w:r>
+              <w:rPr>
+                <w:rStyle w:val="SourceText"/>
+              </w:rPr>
+              <w:t>none</w:t>
+            </w:r>
+          </w:p>
+        </w:tc>
+        <w:tc>
+          <w:tcPr>
+            <w:tcW w:w="4653" w:type="dxa"/>
+            <w:tcBorders/>
+            <w:vAlign w:val="center"/>
+          </w:tcPr>
+          <w:p>
+            <w:pPr>
+              <w:pStyle w:val="TableContents"/>
+              <w:shd w:fill="2E3440" w:val="clear"/>
+              <w:bidi w:val="0"/>
+              <w:spacing w:before="120" w:after="120"/>
+              <w:jc w:val="left"/>
+              <w:rPr/>
+            </w:pPr>
+            <w:r>
+              <w:rPr>
+                <w:rStyle w:val="SourceText"/>
+              </w:rPr>
+              <w:t>none</w:t>
+            </w:r>
+            <w:r>
+              <w:rPr/>
+              <w:t xml:space="preserve">: the </w:t>
+            </w:r>
+            <w:r>
+              <w:rPr>
+                <w:rStyle w:val="SourceText"/>
+              </w:rPr>
+              <w:t>Notification</w:t>
+            </w:r>
+            <w:r>
+              <w:rPr/>
+              <w:t xml:space="preserve"> hook sends nothing</w:t>
+            </w:r>
+          </w:p>
+        </w:tc>
+      </w:tr>
+      <w:tr>
+        <w:trPr/>
+        <w:tc>
+          <w:tcPr>
+            <w:tcW w:w="3919" w:type="dxa"/>
+            <w:tcBorders/>
+            <w:vAlign w:val="center"/>
+          </w:tcPr>
+          <w:p>
+            <w:pPr>
+              <w:pStyle w:val="TableContents"/>
+              <w:shd w:fill="2E3440" w:val="clear"/>
+              <w:bidi w:val="0"/>
+              <w:spacing w:before="120" w:after="120"/>
+              <w:jc w:val="left"/>
+              <w:rPr/>
+            </w:pPr>
+            <w:r>
+              <w:rPr>
+                <w:rStyle w:val="SourceText"/>
+              </w:rPr>
+              <w:t>change.requireForProduction</w:t>
+            </w:r>
+          </w:p>
+        </w:tc>
+        <w:tc>
+          <w:tcPr>
+            <w:tcW w:w="1272" w:type="dxa"/>
+            <w:tcBorders/>
+            <w:vAlign w:val="center"/>
+          </w:tcPr>
+          <w:p>
+            <w:pPr>
+              <w:pStyle w:val="TableContents"/>
+              <w:shd w:fill="2E3440" w:val="clear"/>
+              <w:bidi w:val="0"/>
+              <w:spacing w:before="120" w:after="120"/>
+              <w:jc w:val="left"/>
+              <w:rPr/>
+            </w:pPr>
+            <w:r>
+              <w:rPr/>
+              <w:t>both layers, ratchets (may only turn ON)</w:t>
+            </w:r>
+          </w:p>
+        </w:tc>
+        <w:tc>
+          <w:tcPr>
+            <w:tcW w:w="1495" w:type="dxa"/>
+            <w:tcBorders/>
+            <w:vAlign w:val="center"/>
+          </w:tcPr>
+          <w:p>
+            <w:pPr>
+              <w:pStyle w:val="TableContents"/>
+              <w:shd w:fill="2E3440" w:val="clear"/>
+              <w:bidi w:val="0"/>
+              <w:spacing w:before="120" w:after="120"/>
+              <w:jc w:val="left"/>
+              <w:rPr/>
+            </w:pPr>
+            <w:r>
+              <w:rPr/>
+              <w:t>bool</w:t>
+            </w:r>
+          </w:p>
+        </w:tc>
+        <w:tc>
+          <w:tcPr>
+            <w:tcW w:w="4653" w:type="dxa"/>
+            <w:tcBorders/>
+            <w:vAlign w:val="center"/>
+          </w:tcPr>
+          <w:p>
+            <w:pPr>
+              <w:pStyle w:val="TableContents"/>
+              <w:shd w:fill="2E3440" w:val="clear"/>
+              <w:bidi w:val="0"/>
+              <w:spacing w:before="120" w:after="120"/>
+              <w:jc w:val="left"/>
+              <w:rPr/>
+            </w:pPr>
+            <w:r>
+              <w:rPr>
+                <w:rStyle w:val="SourceText"/>
+              </w:rPr>
+              <w:t>false</w:t>
+            </w:r>
+            <w:r>
+              <w:rPr/>
+              <w:t>: promoting needs no approved change request</w:t>
+            </w:r>
+          </w:p>
+        </w:tc>
+      </w:tr>
+      <w:tr>
+        <w:trPr/>
+        <w:tc>
+          <w:tcPr>
+            <w:tcW w:w="3919" w:type="dxa"/>
             <w:tcBorders/>
             <w:vAlign w:val="center"/>
           </w:tcPr>
@@ -9706,7 +10638,7 @@
         </w:tc>
         <w:tc>
           <w:tcPr>
-            <w:tcW w:w="1551" w:type="dxa"/>
+            <w:tcW w:w="1272" w:type="dxa"/>
             <w:tcBorders/>
             <w:vAlign w:val="center"/>
           </w:tcPr>
@@ -9727,7 +10659,7 @@
         </w:tc>
         <w:tc>
           <w:tcPr>
-            <w:tcW w:w="1790" w:type="dxa"/>
+            <w:tcW w:w="1495" w:type="dxa"/>
             <w:tcBorders/>
             <w:vAlign w:val="center"/>
           </w:tcPr>
@@ -9758,7 +10690,7 @@
         </w:tc>
         <w:tc>
           <w:tcPr>
-            <w:tcW w:w="3377" w:type="dxa"/>
+            <w:tcW w:w="4653" w:type="dxa"/>
             <w:tcBorders/>
             <w:vAlign w:val="center"/>
           </w:tcPr>
@@ -9779,6 +10711,104 @@
         </w:tc>
       </w:tr>
     </w:tbl>
+    <w:p>
+      <w:pPr>
+        <w:pStyle w:val="BodyText"/>
+        <w:bidi w:val="0"/>
+        <w:jc w:val="left"/>
+        <w:rPr/>
+      </w:pPr>
+      <w:r>
+        <w:rPr>
+          <w:rStyle w:val="Strong"/>
+        </w:rPr>
+        <w:t>A destroy is never applied unattended</w:t>
+      </w:r>
+      <w:r>
+        <w:rPr/>
+        <w:t xml:space="preserve">, at any setting: </w:t>
+      </w:r>
+      <w:r>
+        <w:rPr>
+          <w:rStyle w:val="SourceText"/>
+        </w:rPr>
+        <w:t>destroy</w:t>
+      </w:r>
+      <w:r>
+        <w:rPr/>
+        <w:t xml:space="preserve">, </w:t>
+      </w:r>
+      <w:r>
+        <w:rPr>
+          <w:rStyle w:val="SourceText"/>
+        </w:rPr>
+        <w:t>apply -destroy</w:t>
+      </w:r>
+      <w:r>
+        <w:rPr/>
+        <w:t xml:space="preserve">, </w:t>
+      </w:r>
+      <w:r>
+        <w:rPr>
+          <w:rStyle w:val="SourceText"/>
+        </w:rPr>
+        <w:t>-replace</w:t>
+      </w:r>
+      <w:r>
+        <w:rPr/>
+        <w:t xml:space="preserve">, </w:t>
+      </w:r>
+      <w:r>
+        <w:rPr>
+          <w:rStyle w:val="SourceText"/>
+        </w:rPr>
+        <w:t>workspace delete</w:t>
+      </w:r>
+      <w:r>
+        <w:rPr/>
+        <w:t xml:space="preserve">, a saved plan whose sidecar lists a delete, or an apply with no sidecar at all asks when you are there and is denied unattended — </w:t>
+      </w:r>
+      <w:r>
+        <w:rPr>
+          <w:rStyle w:val="SourceText"/>
+        </w:rPr>
+        <w:t>terraformApply: allow</w:t>
+      </w:r>
+      <w:r>
+        <w:rPr/>
+        <w:t xml:space="preserve"> and </w:t>
+      </w:r>
+      <w:r>
+        <w:rPr>
+          <w:rStyle w:val="SourceText"/>
+        </w:rPr>
+        <w:t>environments.prodUnattended</w:t>
+      </w:r>
+      <w:r>
+        <w:rPr/>
+        <w:t xml:space="preserve"> included. The full decision table is in </w:t>
+      </w:r>
+      <w:r>
+        <w:rPr>
+          <w:rStyle w:val="SourceText"/>
+        </w:rPr>
+        <w:t>plugin/crew/CONFIG.md</w:t>
+      </w:r>
+      <w:r>
+        <w:rPr/>
+        <w:t xml:space="preserve"> (</w:t>
+      </w:r>
+      <w:r>
+        <w:rPr>
+          <w:rStyle w:val="SourceText"/>
+        </w:rPr>
+        <w:t>environments.*</w:t>
+      </w:r>
+      <w:r>
+        <w:rPr/>
+        <w:t>).</w:t>
+      </w:r>
+    </w:p>
     <w:p>
       <w:pPr>
         <w:pStyle w:val="BodyText"/>

</xml_diff>

<commit_message>
T-0044: seal the launcher against repo settings, cwd drift, writes and foreign credentials
The session and the probe start as `<claude> --settings <sealed> --setting-sources user`
from --root with the same executable; a new settings check refuses repo files with a
sandbox key or Read allow and user files that widen the sandbox; stores are write- and
Edit-denied with the sealed dir and user settings; gcloud/kube/gh/docker stores and their
env variables are sealed; the probe is bounded, indexed and end-marked; stale sealed
dirs are swept once their process exits.

Claude-Session: https://claude.ai/code/session_01YVvVmFJquzLKR26dG6oSQS
</commit_message>
<xml_diff>
--- a/docs/guides/crew/crew-1.0-troubleshooting.docx
+++ b/docs/guides/crew/crew-1.0-troubleshooting.docx
@@ -7227,7 +7227,17 @@
         <w:rPr>
           <w:rStyle w:val="SourceText"/>
         </w:rPr>
-        <w:t>sandbox: the session can read a store: OPEN &lt;path&gt;</w:t>
+        <w:t>settings: &lt;file&gt; sets sandbox</w:t>
+      </w:r>
+      <w:r>
+        <w:rPr/>
+        <w:t xml:space="preserve"> or </w:t>
+      </w:r>
+      <w:r>
+        <w:rPr>
+          <w:rStyle w:val="SourceText"/>
+        </w:rPr>
+        <w:t>allows Read(...)</w:t>
       </w:r>
       <w:r>
         <w:rPr>
@@ -7237,7 +7247,37 @@
       </w:r>
       <w:r>
         <w:rPr/>
-        <w:t xml:space="preserve"> The sealed settings did not hold for that path (a repo or user setting may be widening it). Nothing launches; find the setting. </w:t>
+        <w:t xml:space="preserve"> The repo's </w:t>
+      </w:r>
+      <w:r>
+        <w:rPr>
+          <w:rStyle w:val="SourceText"/>
+        </w:rPr>
+        <w:t>.claude/settings.json</w:t>
+      </w:r>
+      <w:r>
+        <w:rPr/>
+        <w:t xml:space="preserve"> or </w:t>
+      </w:r>
+      <w:r>
+        <w:rPr>
+          <w:rStyle w:val="SourceText"/>
+        </w:rPr>
+        <w:t>.claude/settings.local.json</w:t>
+      </w:r>
+      <w:r>
+        <w:rPr/>
+        <w:t xml:space="preserve"> tries to shape the sandbox or widen reads. The sealed session never loads those files, but the launcher refuses rather than trust that. </w:t>
+      </w:r>
+      <w:r>
+        <w:rPr>
+          <w:rStyle w:val="Strong"/>
+        </w:rPr>
+        <w:t>Fix:</w:t>
+      </w:r>
+      <w:r>
+        <w:rPr/>
+        <w:t xml:space="preserve"> remove the key from the repo's file, or run that work attended. </w:t>
       </w:r>
     </w:p>
     <w:p>
@@ -7261,41 +7301,67 @@
         <w:rPr>
           <w:rStyle w:val="SourceText"/>
         </w:rPr>
-        <w:t>sandbox: store not reported</w:t>
+        <w:t>settings: ... sandbox.excludedCommands</w:t>
+      </w:r>
+      <w:r>
+        <w:rPr/>
+        <w:t xml:space="preserve">, </w:t>
+      </w:r>
+      <w:r>
+        <w:rPr>
+          <w:rStyle w:val="SourceText"/>
+        </w:rPr>
+        <w:t>allowRead entry ... could re-open a credential store</w:t>
+      </w:r>
+      <w:r>
+        <w:rPr/>
+        <w:t xml:space="preserve"> or </w:t>
+      </w:r>
+      <w:r>
+        <w:rPr>
+          <w:rStyle w:val="SourceText"/>
+        </w:rPr>
+        <w:t>sandbox.filesystem.disabled</w:t>
       </w:r>
       <w:r>
         <w:rPr>
           <w:rStyle w:val="Strong"/>
         </w:rPr>
-        <w:t xml:space="preserve">, </w:t>
-      </w:r>
-      <w:r>
-        <w:rPr>
-          <w:rStyle w:val="SourceText"/>
-        </w:rPr>
-        <w:t>could not tell</w:t>
+        <w:t>.</w:t>
+      </w:r>
+      <w:r>
+        <w:rPr/>
+        <w:t xml:space="preserve"> Your </w:t>
+      </w:r>
+      <w:r>
+        <w:rPr>
+          <w:rStyle w:val="SourceText"/>
+        </w:rPr>
+        <w:t>~/.claude/settings.json</w:t>
+      </w:r>
+      <w:r>
+        <w:rPr/>
+        <w:t xml:space="preserve"> loads in the sealed session and would let a command run unsandboxed or re-open a store. </w:t>
       </w:r>
       <w:r>
         <w:rPr>
           <w:rStyle w:val="Strong"/>
         </w:rPr>
-        <w:t xml:space="preserve">, or </w:t>
-      </w:r>
-      <w:r>
-        <w:rPr>
-          <w:rStyle w:val="SourceText"/>
-        </w:rPr>
-        <w:t>probe made no tool call</w:t>
-      </w:r>
-      <w:r>
-        <w:rPr>
-          <w:rStyle w:val="Strong"/>
-        </w:rPr>
-        <w:t>.</w:t>
-      </w:r>
-      <w:r>
-        <w:rPr/>
-        <w:t xml:space="preserve"> The probe did not measure every store; retry, and treat a repeat as a host problem, not a pass. </w:t>
+        <w:t>Fix:</w:t>
+      </w:r>
+      <w:r>
+        <w:rPr/>
+        <w:t xml:space="preserve"> move the entry out of your user settings (or narrow the </w:t>
+      </w:r>
+      <w:r>
+        <w:rPr>
+          <w:rStyle w:val="SourceText"/>
+        </w:rPr>
+        <w:t>allowRead</w:t>
+      </w:r>
+      <w:r>
+        <w:rPr/>
+        <w:t xml:space="preserve"> away from the stores), then retry. </w:t>
       </w:r>
     </w:p>
     <w:p>
@@ -7310,6 +7376,7 @@
           <w:tab w:val="left" w:pos="829" w:leader="none"/>
         </w:tabs>
         <w:bidi w:val="0"/>
+        <w:spacing w:before="120" w:after="0"/>
         <w:ind w:hanging="283" w:left="829"/>
         <w:jc w:val="left"/>
         <w:rPr/>
@@ -7318,6 +7385,109 @@
         <w:rPr>
           <w:rStyle w:val="SourceText"/>
         </w:rPr>
+        <w:t>sandbox: the session can read a store: OPEN &lt;path&gt;</w:t>
+      </w:r>
+      <w:r>
+        <w:rPr>
+          <w:rStyle w:val="Strong"/>
+        </w:rPr>
+        <w:t>.</w:t>
+      </w:r>
+      <w:r>
+        <w:rPr/>
+        <w:t xml:space="preserve"> The sealed settings did not hold for that path (a managed or user setting may be widening it). Nothing launches; find the setting. </w:t>
+      </w:r>
+    </w:p>
+    <w:p>
+      <w:pPr>
+        <w:pStyle w:val="BodyText"/>
+        <w:numPr>
+          <w:ilvl w:val="0"/>
+          <w:numId w:val="17"/>
+        </w:numPr>
+        <w:tabs>
+          <w:tab w:val="clear" w:pos="1134"/>
+          <w:tab w:val="left" w:pos="829" w:leader="none"/>
+        </w:tabs>
+        <w:bidi w:val="0"/>
+        <w:spacing w:before="120" w:after="0"/>
+        <w:ind w:hanging="283" w:left="829"/>
+        <w:jc w:val="left"/>
+        <w:rPr/>
+      </w:pPr>
+      <w:r>
+        <w:rPr>
+          <w:rStyle w:val="SourceText"/>
+        </w:rPr>
+        <w:t>sandbox: store not reported</w:t>
+      </w:r>
+      <w:r>
+        <w:rPr>
+          <w:rStyle w:val="Strong"/>
+        </w:rPr>
+        <w:t xml:space="preserve">, </w:t>
+      </w:r>
+      <w:r>
+        <w:rPr>
+          <w:rStyle w:val="SourceText"/>
+        </w:rPr>
+        <w:t>could not tell</w:t>
+      </w:r>
+      <w:r>
+        <w:rPr>
+          <w:rStyle w:val="Strong"/>
+        </w:rPr>
+        <w:t xml:space="preserve">, </w:t>
+      </w:r>
+      <w:r>
+        <w:rPr>
+          <w:rStyle w:val="SourceText"/>
+        </w:rPr>
+        <w:t>no end marker</w:t>
+      </w:r>
+      <w:r>
+        <w:rPr>
+          <w:rStyle w:val="Strong"/>
+        </w:rPr>
+        <w:t xml:space="preserve">, or </w:t>
+      </w:r>
+      <w:r>
+        <w:rPr>
+          <w:rStyle w:val="SourceText"/>
+        </w:rPr>
+        <w:t>probe made no tool call</w:t>
+      </w:r>
+      <w:r>
+        <w:rPr>
+          <w:rStyle w:val="Strong"/>
+        </w:rPr>
+        <w:t>.</w:t>
+      </w:r>
+      <w:r>
+        <w:rPr/>
+        <w:t xml:space="preserve"> The probe did not measure every store, or its output was cut short; retry, and treat a repeat as a host problem, not a pass. </w:t>
+      </w:r>
+    </w:p>
+    <w:p>
+      <w:pPr>
+        <w:pStyle w:val="BodyText"/>
+        <w:numPr>
+          <w:ilvl w:val="0"/>
+          <w:numId w:val="17"/>
+        </w:numPr>
+        <w:tabs>
+          <w:tab w:val="clear" w:pos="1134"/>
+          <w:tab w:val="left" w:pos="829" w:leader="none"/>
+        </w:tabs>
+        <w:bidi w:val="0"/>
+        <w:ind w:hanging="283" w:left="829"/>
+        <w:jc w:val="left"/>
+        <w:rPr/>
+      </w:pPr>
+      <w:r>
+        <w:rPr>
+          <w:rStyle w:val="SourceText"/>
+        </w:rPr>
         <w:t>refuse command: ...</w:t>
       </w:r>
       <w:r>
@@ -7348,13 +7518,33 @@
       </w:r>
       <w:r>
         <w:rPr/>
-        <w:t xml:space="preserve"> only, and supplies </w:t>
+        <w:t xml:space="preserve"> only (an executable file or a name on </w:t>
+      </w:r>
+      <w:r>
+        <w:rPr>
+          <w:rStyle w:val="SourceText"/>
+        </w:rPr>
+        <w:t>PATH</w:t>
+      </w:r>
+      <w:r>
+        <w:rPr/>
+        <w:t xml:space="preserve">), and supplies </w:t>
       </w:r>
       <w:r>
         <w:rPr>
           <w:rStyle w:val="SourceText"/>
         </w:rPr>
         <w:t>--settings</w:t>
+      </w:r>
+      <w:r>
+        <w:rPr/>
+        <w:t xml:space="preserve"> and </w:t>
+      </w:r>
+      <w:r>
+        <w:rPr>
+          <w:rStyle w:val="SourceText"/>
+        </w:rPr>
+        <w:t>--setting-sources</w:t>
       </w:r>
       <w:r>
         <w:rPr/>

</xml_diff>

<commit_message>
T-0065: docs, verify rules and code map for the four TSS hygiene fixes
status.md gains the agents row, verify.md step 8 runs verify_agents.py
--check, the verification skill names the checker; model.md, the providers
skill and providers.sh name provider_probe.py instead of a hand-typed codex
exec; onboard.md and upgrade.md describe the UPGRADE.md history. README,
the working-with-codex and troubleshooting guides (rebuilt with build.py),
three .crew/verify.json rules, the crew code map (anchor not moved, see its
note) and the generated rules.

Claude-Session: https://claude.ai/code/session_01YVvVmFJquzLKR26dG6oSQS
</commit_message>
<xml_diff>
--- a/docs/guides/crew/crew-1.0-troubleshooting.docx
+++ b/docs/guides/crew/crew-1.0-troubleshooting.docx
@@ -8325,8 +8325,522 @@
         <w:jc w:val="left"/>
         <w:rPr/>
       </w:pPr>
-      <w:bookmarkStart w:id="11" w:name="turning-things-off"/>
+      <w:bookmarkStart w:id="11" w:name="an-agent-named-in-verifyjson-is-not-inst"/>
       <w:bookmarkEnd w:id="11"/>
+      <w:r>
+        <w:rPr/>
+        <w:t>An Agent Named in verify.json Is Not Installed</w:t>
+      </w:r>
+    </w:p>
+    <w:p>
+      <w:pPr>
+        <w:pStyle w:val="BodyText"/>
+        <w:bidi w:val="0"/>
+        <w:jc w:val="left"/>
+        <w:rPr/>
+      </w:pPr>
+      <w:r>
+        <w:rPr>
+          <w:rStyle w:val="SourceText"/>
+        </w:rPr>
+        <w:t>.crew/verify.json</w:t>
+      </w:r>
+      <w:r>
+        <w:rPr/>
+        <w:t xml:space="preserve"> travels with the repo; the agents its rules name do not. A rule asking for an agent this machine lacks reviews less, and nothing in the output says so.</w:t>
+      </w:r>
+    </w:p>
+    <w:p>
+      <w:pPr>
+        <w:pStyle w:val="BodyText"/>
+        <w:numPr>
+          <w:ilvl w:val="0"/>
+          <w:numId w:val="20"/>
+        </w:numPr>
+        <w:tabs>
+          <w:tab w:val="clear" w:pos="1134"/>
+          <w:tab w:val="left" w:pos="829" w:leader="none"/>
+        </w:tabs>
+        <w:bidi w:val="0"/>
+        <w:ind w:hanging="283" w:left="829"/>
+        <w:jc w:val="left"/>
+        <w:rPr/>
+      </w:pPr>
+      <w:r>
+        <w:rPr>
+          <w:rStyle w:val="Strong"/>
+        </w:rPr>
+        <w:t>Symptom:</w:t>
+      </w:r>
+      <w:r>
+        <w:rPr/>
+        <w:t xml:space="preserve"> </w:t>
+      </w:r>
+      <w:r>
+        <w:rPr>
+          <w:rStyle w:val="SourceText"/>
+        </w:rPr>
+        <w:t>/crew:status</w:t>
+      </w:r>
+      <w:r>
+        <w:rPr/>
+        <w:t xml:space="preserve"> prints </w:t>
+      </w:r>
+      <w:r>
+        <w:rPr>
+          <w:rStyle w:val="SourceText"/>
+        </w:rPr>
+        <w:t>agents MISSING &lt;name&gt; (verify.json rule: &lt;paths&gt;)</w:t>
+      </w:r>
+      <w:r>
+        <w:rPr/>
+        <w:t xml:space="preserve">, or </w:t>
+      </w:r>
+      <w:r>
+        <w:rPr>
+          <w:rStyle w:val="SourceText"/>
+        </w:rPr>
+        <w:t>/crew:review</w:t>
+      </w:r>
+      <w:r>
+        <w:rPr/>
+        <w:t xml:space="preserve"> reports a requested agent as a gap. </w:t>
+      </w:r>
+      <w:r>
+        <w:rPr>
+          <w:rStyle w:val="Strong"/>
+        </w:rPr>
+        <w:t>Check:</w:t>
+      </w:r>
+      <w:r>
+        <w:rPr/>
+        <w:t xml:space="preserve"> </w:t>
+      </w:r>
+    </w:p>
+    <w:p>
+      <w:pPr>
+        <w:pStyle w:val="PreformattedText"/>
+        <w:bidi w:val="0"/>
+        <w:jc w:val="left"/>
+        <w:rPr/>
+      </w:pPr>
+      <w:r>
+        <w:rPr>
+          <w:rStyle w:val="SourceText"/>
+        </w:rPr>
+        <w:t>python3 "&lt;crew&gt;/hooks/scripts/verify_agents.py" --root . --check</w:t>
+      </w:r>
+    </w:p>
+    <w:p>
+      <w:pPr>
+        <w:pStyle w:val="BodyText"/>
+        <w:bidi w:val="0"/>
+        <w:jc w:val="left"/>
+        <w:rPr/>
+      </w:pPr>
+      <w:r>
+        <w:rPr/>
+        <w:t>Exit 1 lists each missing name with its rule's paths. Exit 2 (</w:t>
+      </w:r>
+      <w:r>
+        <w:rPr>
+          <w:rStyle w:val="SourceText"/>
+        </w:rPr>
+        <w:t>unknown</w:t>
+      </w:r>
+      <w:r>
+        <w:rPr/>
+        <w:t xml:space="preserve">) means a plugin registry, a settings file or </w:t>
+      </w:r>
+      <w:r>
+        <w:rPr>
+          <w:rStyle w:val="SourceText"/>
+        </w:rPr>
+        <w:t>verify.json</w:t>
+      </w:r>
+      <w:r>
+        <w:rPr/>
+        <w:t xml:space="preserve"> itself would not parse, so it could not tell; it never reads that as installed. Managed-policy agents and </w:t>
+      </w:r>
+      <w:r>
+        <w:rPr>
+          <w:rStyle w:val="SourceText"/>
+        </w:rPr>
+        <w:t>--agents</w:t>
+      </w:r>
+      <w:r>
+        <w:rPr/>
+        <w:t xml:space="preserve"> agents are not checked. </w:t>
+      </w:r>
+      <w:r>
+        <w:rPr>
+          <w:rStyle w:val="Strong"/>
+        </w:rPr>
+        <w:t>Fix:</w:t>
+      </w:r>
+      <w:r>
+        <w:rPr/>
+        <w:t xml:space="preserve"> install the plugin or agent, enable the plugin (</w:t>
+      </w:r>
+      <w:r>
+        <w:rPr>
+          <w:rStyle w:val="SourceText"/>
+        </w:rPr>
+        <w:t>enabledPlugins</w:t>
+      </w:r>
+      <w:r>
+        <w:rPr/>
+        <w:t xml:space="preserve">; a narrower settings scope's </w:t>
+      </w:r>
+      <w:r>
+        <w:rPr>
+          <w:rStyle w:val="SourceText"/>
+        </w:rPr>
+        <w:t>false</w:t>
+      </w:r>
+      <w:r>
+        <w:rPr/>
+        <w:t xml:space="preserve"> wins), or change the rule to an agent this machine has.</w:t>
+      </w:r>
+    </w:p>
+    <w:p>
+      <w:pPr>
+        <w:pStyle w:val="Heading2"/>
+        <w:bidi w:val="0"/>
+        <w:ind w:hanging="0" w:left="0" w:right="0"/>
+        <w:jc w:val="left"/>
+        <w:rPr/>
+      </w:pPr>
+      <w:bookmarkStart w:id="12" w:name="the-temp-directory-fills-with-crew-files"/>
+      <w:bookmarkEnd w:id="12"/>
+      <w:r>
+        <w:rPr/>
+        <w:t>The Temp Directory Fills with Crew Files</w:t>
+      </w:r>
+    </w:p>
+    <w:p>
+      <w:pPr>
+        <w:pStyle w:val="BodyText"/>
+        <w:bidi w:val="0"/>
+        <w:jc w:val="left"/>
+        <w:rPr/>
+      </w:pPr>
+      <w:r>
+        <w:rPr/>
+        <w:t xml:space="preserve">Earlier crew releases' test suites and auto-clear sender could leave files in the system temp directory: </w:t>
+      </w:r>
+      <w:r>
+        <w:rPr>
+          <w:rStyle w:val="SourceText"/>
+        </w:rPr>
+        <w:t>crew-completion-audit.*</w:t>
+      </w:r>
+      <w:r>
+        <w:rPr/>
+        <w:t xml:space="preserve"> markers, </w:t>
+      </w:r>
+      <w:r>
+        <w:rPr>
+          <w:rStyle w:val="SourceText"/>
+        </w:rPr>
+        <w:t>tmp.*</w:t>
+      </w:r>
+      <w:r>
+        <w:rPr/>
+        <w:t xml:space="preserve"> auto-clear sender scripts (</w:t>
+      </w:r>
+      <w:r>
+        <w:rPr>
+          <w:rStyle w:val="SourceText"/>
+        </w:rPr>
+        <w:t>tmux send-keys ...</w:t>
+      </w:r>
+      <w:r>
+        <w:rPr/>
+        <w:t xml:space="preserve"> / </w:t>
+      </w:r>
+      <w:r>
+        <w:rPr>
+          <w:rStyle w:val="SourceText"/>
+        </w:rPr>
+        <w:t>xdotool ...</w:t>
+      </w:r>
+      <w:r>
+        <w:rPr/>
+        <w:t xml:space="preserve"> followed by </w:t>
+      </w:r>
+      <w:r>
+        <w:rPr>
+          <w:rStyle w:val="SourceText"/>
+        </w:rPr>
+        <w:t>rm -f -- &lt;itself&gt;</w:t>
+      </w:r>
+      <w:r>
+        <w:rPr/>
+        <w:t xml:space="preserve">) and </w:t>
+      </w:r>
+      <w:r>
+        <w:rPr>
+          <w:rStyle w:val="SourceText"/>
+        </w:rPr>
+        <w:t>tmp.*</w:t>
+      </w:r>
+      <w:r>
+        <w:rPr/>
+        <w:t xml:space="preserve"> fixture directories from </w:t>
+      </w:r>
+      <w:r>
+        <w:rPr>
+          <w:rStyle w:val="SourceText"/>
+        </w:rPr>
+        <w:t>hooks/scripts/_test/run-tests.sh</w:t>
+      </w:r>
+      <w:r>
+        <w:rPr/>
+        <w:t xml:space="preserve">. Enough of them exhaust the inodes, and the guard and the Stop verify-gate then fail closed. Now every crew test runs with its own </w:t>
+      </w:r>
+      <w:r>
+        <w:rPr>
+          <w:rStyle w:val="SourceText"/>
+        </w:rPr>
+        <w:t>TMPDIR</w:t>
+      </w:r>
+      <w:r>
+        <w:rPr/>
+        <w:t xml:space="preserve">, the sender deletes itself before it sleeps, and </w:t>
+      </w:r>
+      <w:r>
+        <w:rPr>
+          <w:rStyle w:val="SourceText"/>
+        </w:rPr>
+        <w:t>run-tests.sh</w:t>
+      </w:r>
+      <w:r>
+        <w:rPr/>
+        <w:t xml:space="preserve"> removes every fixture it makes.</w:t>
+      </w:r>
+    </w:p>
+    <w:p>
+      <w:pPr>
+        <w:pStyle w:val="BodyText"/>
+        <w:numPr>
+          <w:ilvl w:val="0"/>
+          <w:numId w:val="21"/>
+        </w:numPr>
+        <w:tabs>
+          <w:tab w:val="clear" w:pos="1134"/>
+          <w:tab w:val="left" w:pos="829" w:leader="none"/>
+        </w:tabs>
+        <w:bidi w:val="0"/>
+        <w:ind w:hanging="283" w:left="829"/>
+        <w:jc w:val="left"/>
+        <w:rPr/>
+      </w:pPr>
+      <w:r>
+        <w:rPr>
+          <w:rStyle w:val="Strong"/>
+        </w:rPr>
+        <w:t>Symptom:</w:t>
+      </w:r>
+      <w:r>
+        <w:rPr/>
+        <w:t xml:space="preserve"> </w:t>
+      </w:r>
+      <w:r>
+        <w:rPr>
+          <w:rStyle w:val="SourceText"/>
+        </w:rPr>
+        <w:t>df -i /tmp</w:t>
+      </w:r>
+      <w:r>
+        <w:rPr/>
+        <w:t xml:space="preserve"> near 100%, or hooks failing on </w:t>
+      </w:r>
+      <w:r>
+        <w:rPr>
+          <w:rStyle w:val="SourceText"/>
+        </w:rPr>
+        <w:t>mktemp</w:t>
+      </w:r>
+      <w:r>
+        <w:rPr/>
+        <w:t xml:space="preserve">. </w:t>
+      </w:r>
+      <w:r>
+        <w:rPr>
+          <w:rStyle w:val="Strong"/>
+        </w:rPr>
+        <w:t>Check</w:t>
+      </w:r>
+      <w:r>
+        <w:rPr/>
+        <w:t xml:space="preserve"> (read-only): </w:t>
+      </w:r>
+    </w:p>
+    <w:p>
+      <w:pPr>
+        <w:pStyle w:val="PreformattedText"/>
+        <w:bidi w:val="0"/>
+        <w:jc w:val="left"/>
+        <w:rPr/>
+      </w:pPr>
+      <w:r>
+        <w:rPr>
+          <w:rStyle w:val="SourceText"/>
+        </w:rPr>
+        <w:t>cd "${TMPDIR:-/tmp}"</w:t>
+      </w:r>
+    </w:p>
+    <w:p>
+      <w:pPr>
+        <w:pStyle w:val="PreformattedText"/>
+        <w:bidi w:val="0"/>
+        <w:jc w:val="left"/>
+        <w:rPr/>
+      </w:pPr>
+      <w:r>
+        <w:rPr>
+          <w:rStyle w:val="SourceText"/>
+        </w:rPr>
+        <w:t>ls -d crew-completion-audit.* 2&gt;/dev/null | wc -l</w:t>
+      </w:r>
+    </w:p>
+    <w:p>
+      <w:pPr>
+        <w:pStyle w:val="PreformattedText"/>
+        <w:bidi w:val="0"/>
+        <w:jc w:val="left"/>
+        <w:rPr/>
+      </w:pPr>
+      <w:r>
+        <w:rPr>
+          <w:rStyle w:val="SourceText"/>
+        </w:rPr>
+        <w:t>grep -l -e '^tmux send-keys -t' -e '^xdotool ' tmp.* 2&gt;/dev/null | wc -l</w:t>
+      </w:r>
+    </w:p>
+    <w:p>
+      <w:pPr>
+        <w:pStyle w:val="BodyText"/>
+        <w:bidi w:val="0"/>
+        <w:jc w:val="left"/>
+        <w:rPr/>
+      </w:pPr>
+      <w:r>
+        <w:rPr>
+          <w:rStyle w:val="Strong"/>
+        </w:rPr>
+        <w:t>Fix (an owner action; crew itself never runs it):</w:t>
+      </w:r>
+      <w:r>
+        <w:rPr/>
+        <w:t xml:space="preserve"> with no crew session or test run active, remove what the check counted:</w:t>
+      </w:r>
+    </w:p>
+    <w:p>
+      <w:pPr>
+        <w:pStyle w:val="PreformattedText"/>
+        <w:bidi w:val="0"/>
+        <w:jc w:val="left"/>
+        <w:rPr/>
+      </w:pPr>
+      <w:r>
+        <w:rPr>
+          <w:rStyle w:val="SourceText"/>
+        </w:rPr>
+        <w:t>cd "${TMPDIR:-/tmp}"</w:t>
+      </w:r>
+    </w:p>
+    <w:p>
+      <w:pPr>
+        <w:pStyle w:val="PreformattedText"/>
+        <w:bidi w:val="0"/>
+        <w:jc w:val="left"/>
+        <w:rPr/>
+      </w:pPr>
+      <w:r>
+        <w:rPr>
+          <w:rStyle w:val="SourceText"/>
+        </w:rPr>
+        <w:t>find . -maxdepth 1 -name 'crew-completion-audit.*' -mmin +60 -delete</w:t>
+      </w:r>
+    </w:p>
+    <w:p>
+      <w:pPr>
+        <w:pStyle w:val="PreformattedText"/>
+        <w:bidi w:val="0"/>
+        <w:jc w:val="left"/>
+        <w:rPr/>
+      </w:pPr>
+      <w:r>
+        <w:rPr>
+          <w:rStyle w:val="SourceText"/>
+        </w:rPr>
+        <w:t>grep -l -e '^tmux send-keys -t' -e '^xdotool ' tmp.* 2&gt;/dev/null | xargs -r rm -f --</w:t>
+      </w:r>
+    </w:p>
+    <w:p>
+      <w:pPr>
+        <w:pStyle w:val="BodyText"/>
+        <w:bidi w:val="0"/>
+        <w:jc w:val="left"/>
+        <w:rPr/>
+      </w:pPr>
+      <w:r>
+        <w:rPr/>
+        <w:t xml:space="preserve">Old </w:t>
+      </w:r>
+      <w:r>
+        <w:rPr>
+          <w:rStyle w:val="SourceText"/>
+        </w:rPr>
+        <w:t>run-tests.sh</w:t>
+      </w:r>
+      <w:r>
+        <w:rPr/>
+        <w:t xml:space="preserve"> fixture directories are ordinary </w:t>
+      </w:r>
+      <w:r>
+        <w:rPr>
+          <w:rStyle w:val="SourceText"/>
+        </w:rPr>
+        <w:t>tmp.*</w:t>
+      </w:r>
+      <w:r>
+        <w:rPr/>
+        <w:t xml:space="preserve"> directories (a </w:t>
+      </w:r>
+      <w:r>
+        <w:rPr>
+          <w:rStyle w:val="SourceText"/>
+        </w:rPr>
+        <w:t>.crew/</w:t>
+      </w:r>
+      <w:r>
+        <w:rPr/>
+        <w:t xml:space="preserve"> and a </w:t>
+      </w:r>
+      <w:r>
+        <w:rPr>
+          <w:rStyle w:val="SourceText"/>
+        </w:rPr>
+        <w:t>.git/</w:t>
+      </w:r>
+      <w:r>
+        <w:rPr/>
+        <w:t xml:space="preserve"> inside); read each before removing it.</w:t>
+      </w:r>
+    </w:p>
+    <w:p>
+      <w:pPr>
+        <w:pStyle w:val="Heading2"/>
+        <w:bidi w:val="0"/>
+        <w:ind w:hanging="0" w:left="0" w:right="0"/>
+        <w:jc w:val="left"/>
+        <w:rPr/>
+      </w:pPr>
+      <w:bookmarkStart w:id="13" w:name="turning-things-off"/>
+      <w:bookmarkEnd w:id="13"/>
       <w:r>
         <w:rPr/>
         <w:t>Turning Things Off</w:t>
@@ -10096,8 +10610,8 @@
         <w:jc w:val="left"/>
         <w:rPr/>
       </w:pPr>
-      <w:bookmarkStart w:id="12" w:name="web-testing"/>
-      <w:bookmarkEnd w:id="12"/>
+      <w:bookmarkStart w:id="14" w:name="web-testing"/>
+      <w:bookmarkEnd w:id="14"/>
       <w:r>
         <w:rPr/>
         <w:t>Web Testing</w:t>
@@ -10136,7 +10650,7 @@
         <w:pStyle w:val="BodyText"/>
         <w:numPr>
           <w:ilvl w:val="0"/>
-          <w:numId w:val="20"/>
+          <w:numId w:val="22"/>
         </w:numPr>
         <w:tabs>
           <w:tab w:val="clear" w:pos="1134"/>
@@ -10210,7 +10724,7 @@
         <w:pStyle w:val="BodyText"/>
         <w:numPr>
           <w:ilvl w:val="0"/>
-          <w:numId w:val="20"/>
+          <w:numId w:val="22"/>
         </w:numPr>
         <w:tabs>
           <w:tab w:val="clear" w:pos="1134"/>
@@ -10261,609 +10775,6 @@
       <w:r>
         <w:rPr/>
         <w:t xml:space="preserve">) skips the OS packages Chromium needs and produces a browser that launches, then crashes on first navigation. </w:t>
-      </w:r>
-    </w:p>
-    <w:p>
-      <w:pPr>
-        <w:pStyle w:val="BodyText"/>
-        <w:numPr>
-          <w:ilvl w:val="0"/>
-          <w:numId w:val="20"/>
-        </w:numPr>
-        <w:tabs>
-          <w:tab w:val="clear" w:pos="1134"/>
-          <w:tab w:val="left" w:pos="829" w:leader="none"/>
-        </w:tabs>
-        <w:bidi w:val="0"/>
-        <w:spacing w:before="120" w:after="0"/>
-        <w:ind w:hanging="283" w:left="829"/>
-        <w:jc w:val="left"/>
-        <w:rPr/>
-      </w:pPr>
-      <w:r>
-        <w:rPr>
-          <w:rStyle w:val="Strong"/>
-        </w:rPr>
-        <w:t>Docker absent -&gt; visual UNVERIFIED, not a fail.</w:t>
-      </w:r>
-      <w:r>
-        <w:rPr/>
-        <w:t xml:space="preserve"> </w:t>
-      </w:r>
-      <w:r>
-        <w:rPr>
-          <w:rStyle w:val="SourceText"/>
-        </w:rPr>
-        <w:t>toHaveScreenshot</w:t>
-      </w:r>
-      <w:r>
-        <w:rPr/>
-        <w:t xml:space="preserve"> baselines are only meaningful when generated inside </w:t>
-      </w:r>
-      <w:r>
-        <w:rPr>
-          <w:rStyle w:val="SourceText"/>
-        </w:rPr>
-        <w:t>mcr.microsoft.com/playwright:v1.63.0-noble</w:t>
-      </w:r>
-      <w:r>
-        <w:rPr/>
-        <w:t xml:space="preserve"> — the installer warns rather than blocking when Docker is missing, and the visual </w:t>
-      </w:r>
-      <w:r>
-        <w:rPr>
-          <w:rStyle w:val="SourceText"/>
-        </w:rPr>
-        <w:t>verify.json</w:t>
-      </w:r>
-      <w:r>
-        <w:rPr/>
-        <w:t xml:space="preserve"> rule is written to skip (report UNVERIFIED) outside that image rather than compare against a baseline that can never match. </w:t>
-      </w:r>
-    </w:p>
-    <w:p>
-      <w:pPr>
-        <w:pStyle w:val="BodyText"/>
-        <w:numPr>
-          <w:ilvl w:val="0"/>
-          <w:numId w:val="20"/>
-        </w:numPr>
-        <w:tabs>
-          <w:tab w:val="clear" w:pos="1134"/>
-          <w:tab w:val="left" w:pos="829" w:leader="none"/>
-        </w:tabs>
-        <w:bidi w:val="0"/>
-        <w:ind w:hanging="283" w:left="829"/>
-        <w:jc w:val="left"/>
-        <w:rPr/>
-      </w:pPr>
-      <w:r>
-        <w:rPr>
-          <w:rStyle w:val="Strong"/>
-        </w:rPr>
-        <w:t>MCP server won't connect on Windows.</w:t>
-      </w:r>
-      <w:r>
-        <w:rPr/>
-        <w:t xml:space="preserve"> Both </w:t>
-      </w:r>
-      <w:r>
-        <w:rPr>
-          <w:rStyle w:val="SourceText"/>
-        </w:rPr>
-        <w:t>@playwright/mcp</w:t>
-      </w:r>
-      <w:r>
-        <w:rPr/>
-        <w:t xml:space="preserve"> and </w:t>
-      </w:r>
-      <w:r>
-        <w:rPr>
-          <w:rStyle w:val="SourceText"/>
-        </w:rPr>
-        <w:t>chrome-devtools-mcp</w:t>
-      </w:r>
-      <w:r>
-        <w:rPr/>
-        <w:t xml:space="preserve"> are launched with </w:t>
-      </w:r>
-      <w:r>
-        <w:rPr>
-          <w:rStyle w:val="SourceText"/>
-        </w:rPr>
-        <w:t>npx</w:t>
-      </w:r>
-      <w:r>
-        <w:rPr/>
-        <w:t xml:space="preserve">, which the MCP host cannot invoke directly on Windows — wrap the entry as </w:t>
-      </w:r>
-      <w:r>
-        <w:rPr>
-          <w:rStyle w:val="SourceText"/>
-        </w:rPr>
-        <w:t>"command": "cmd", "args": ["/c", "npx", ...]</w:t>
-      </w:r>
-      <w:r>
-        <w:rPr/>
-        <w:t xml:space="preserve"> in </w:t>
-      </w:r>
-      <w:r>
-        <w:rPr>
-          <w:rStyle w:val="SourceText"/>
-        </w:rPr>
-        <w:t>.mcp.json</w:t>
-      </w:r>
-      <w:r>
-        <w:rPr/>
-        <w:t xml:space="preserve"> (documented in chrome-devtools-mcp's own troubleshooting for the "Connection closed" failure); the </w:t>
-      </w:r>
-      <w:r>
-        <w:rPr>
-          <w:rStyle w:val="SourceText"/>
-        </w:rPr>
-        <w:t>stack-web</w:t>
-      </w:r>
-      <w:r>
-        <w:rPr/>
-        <w:t xml:space="preserve"> skill's </w:t>
-      </w:r>
-      <w:r>
-        <w:rPr>
-          <w:rStyle w:val="SourceText"/>
-        </w:rPr>
-        <w:t>.mcp.json</w:t>
-      </w:r>
-      <w:r>
-        <w:rPr/>
-        <w:t xml:space="preserve"> example already shows this. </w:t>
-      </w:r>
-    </w:p>
-    <w:p>
-      <w:pPr>
-        <w:pStyle w:val="Heading2"/>
-        <w:bidi w:val="0"/>
-        <w:ind w:hanging="0" w:left="0" w:right="0"/>
-        <w:jc w:val="left"/>
-        <w:rPr/>
-      </w:pPr>
-      <w:bookmarkStart w:id="13" w:name="windows-notes"/>
-      <w:bookmarkEnd w:id="13"/>
-      <w:r>
-        <w:rPr/>
-        <w:t>Windows Notes</w:t>
-      </w:r>
-    </w:p>
-    <w:p>
-      <w:pPr>
-        <w:pStyle w:val="BodyText"/>
-        <w:numPr>
-          <w:ilvl w:val="0"/>
-          <w:numId w:val="21"/>
-        </w:numPr>
-        <w:tabs>
-          <w:tab w:val="clear" w:pos="1134"/>
-          <w:tab w:val="left" w:pos="829" w:leader="none"/>
-        </w:tabs>
-        <w:bidi w:val="0"/>
-        <w:spacing w:before="120" w:after="0"/>
-        <w:ind w:hanging="283" w:left="829"/>
-        <w:jc w:val="left"/>
-        <w:rPr/>
-      </w:pPr>
-      <w:r>
-        <w:rPr>
-          <w:rStyle w:val="SourceText"/>
-        </w:rPr>
-        <w:t>pwsh</w:t>
-      </w:r>
-      <w:r>
-        <w:rPr>
-          <w:rStyle w:val="Strong"/>
-        </w:rPr>
-        <w:t xml:space="preserve"> is not on Git Bash's </w:t>
-      </w:r>
-      <w:r>
-        <w:rPr>
-          <w:rStyle w:val="SourceText"/>
-        </w:rPr>
-        <w:t>PATH</w:t>
-      </w:r>
-      <w:r>
-        <w:rPr>
-          <w:rStyle w:val="Strong"/>
-        </w:rPr>
-        <w:t>.</w:t>
-      </w:r>
-      <w:r>
-        <w:rPr/>
-        <w:t xml:space="preserve"> Every script that shells out to PowerShell names it by an absolute path or resolves it explicitly; a bare </w:t>
-      </w:r>
-      <w:r>
-        <w:rPr>
-          <w:rStyle w:val="SourceText"/>
-        </w:rPr>
-        <w:t>pwsh</w:t>
-      </w:r>
-      <w:r>
-        <w:rPr/>
-        <w:t xml:space="preserve"> in a hand-typed command fails as "command not found", which is easy to misread as PowerShell itself being broken. </w:t>
-      </w:r>
-    </w:p>
-    <w:p>
-      <w:pPr>
-        <w:pStyle w:val="BodyText"/>
-        <w:numPr>
-          <w:ilvl w:val="0"/>
-          <w:numId w:val="21"/>
-        </w:numPr>
-        <w:tabs>
-          <w:tab w:val="clear" w:pos="1134"/>
-          <w:tab w:val="left" w:pos="829" w:leader="none"/>
-        </w:tabs>
-        <w:bidi w:val="0"/>
-        <w:spacing w:before="120" w:after="0"/>
-        <w:ind w:hanging="283" w:left="829"/>
-        <w:jc w:val="left"/>
-        <w:rPr/>
-      </w:pPr>
-      <w:r>
-        <w:rPr>
-          <w:rStyle w:val="Strong"/>
-        </w:rPr>
-        <w:t xml:space="preserve">Git Bash ships without </w:t>
-      </w:r>
-      <w:r>
-        <w:rPr>
-          <w:rStyle w:val="SourceText"/>
-        </w:rPr>
-        <w:t>python3</w:t>
-      </w:r>
-      <w:r>
-        <w:rPr>
-          <w:rStyle w:val="Strong"/>
-        </w:rPr>
-        <w:t>.</w:t>
-      </w:r>
-      <w:r>
-        <w:rPr/>
-        <w:t xml:space="preserve"> Every hook wrapper here resolves </w:t>
-      </w:r>
-      <w:r>
-        <w:rPr>
-          <w:rStyle w:val="SourceText"/>
-        </w:rPr>
-        <w:t>python3</w:t>
-      </w:r>
-      <w:r>
-        <w:rPr/>
-        <w:t xml:space="preserve">, then </w:t>
-      </w:r>
-      <w:r>
-        <w:rPr>
-          <w:rStyle w:val="SourceText"/>
-        </w:rPr>
-        <w:t>python</w:t>
-      </w:r>
-      <w:r>
-        <w:rPr/>
-        <w:t xml:space="preserve">, then </w:t>
-      </w:r>
-      <w:r>
-        <w:rPr>
-          <w:rStyle w:val="SourceText"/>
-        </w:rPr>
-        <w:t>py</w:t>
-      </w:r>
-      <w:r>
-        <w:rPr/>
-        <w:t xml:space="preserve">, and fails loudly on stderr rather than silently standing down when none resolves (see "no-python fail-closed", above). If a hook you expect to run says nothing at all, check for a usable Python on </w:t>
-      </w:r>
-      <w:r>
-        <w:rPr>
-          <w:rStyle w:val="SourceText"/>
-        </w:rPr>
-        <w:t>PATH</w:t>
-      </w:r>
-      <w:r>
-        <w:rPr/>
-        <w:t xml:space="preserve"> first. </w:t>
-      </w:r>
-    </w:p>
-    <w:p>
-      <w:pPr>
-        <w:pStyle w:val="BodyText"/>
-        <w:numPr>
-          <w:ilvl w:val="0"/>
-          <w:numId w:val="21"/>
-        </w:numPr>
-        <w:tabs>
-          <w:tab w:val="clear" w:pos="1134"/>
-          <w:tab w:val="left" w:pos="829" w:leader="none"/>
-        </w:tabs>
-        <w:bidi w:val="0"/>
-        <w:spacing w:before="120" w:after="0"/>
-        <w:ind w:hanging="283" w:left="829"/>
-        <w:jc w:val="left"/>
-        <w:rPr/>
-      </w:pPr>
-      <w:r>
-        <w:rPr>
-          <w:rStyle w:val="Strong"/>
-        </w:rPr>
-        <w:t>Both flavours are always registered.</w:t>
-      </w:r>
-      <w:r>
-        <w:rPr/>
-        <w:t xml:space="preserve"> </w:t>
-      </w:r>
-      <w:r>
-        <w:rPr>
-          <w:rStyle w:val="SourceText"/>
-        </w:rPr>
-        <w:t>hooks.json</w:t>
-      </w:r>
-      <w:r>
-        <w:rPr/>
-        <w:t xml:space="preserve"> pairs every bash command with a </w:t>
-      </w:r>
-      <w:r>
-        <w:rPr>
-          <w:rStyle w:val="SourceText"/>
-        </w:rPr>
-        <w:t>shell: "powershell"</w:t>
-      </w:r>
-      <w:r>
-        <w:rPr/>
-        <w:t xml:space="preserve"> sibling on the same event, so a machine with both </w:t>
-      </w:r>
-      <w:r>
-        <w:rPr>
-          <w:rStyle w:val="SourceText"/>
-        </w:rPr>
-        <w:t>bash</w:t>
-      </w:r>
-      <w:r>
-        <w:rPr/>
-        <w:t xml:space="preserve"> and </w:t>
-      </w:r>
-      <w:r>
-        <w:rPr>
-          <w:rStyle w:val="SourceText"/>
-        </w:rPr>
-        <w:t>pwsh</w:t>
-      </w:r>
-      <w:r>
-        <w:rPr/>
-        <w:t xml:space="preserve"> present runs both. This is not double-firing to fix — it is how the same hook reaches both shells; each PowerShell twin stands itself down on the wrong platform (</w:t>
-      </w:r>
-      <w:r>
-        <w:rPr>
-          <w:rStyle w:val="SourceText"/>
-        </w:rPr>
-        <w:t>$env:OS -ne 'Windows_NT'</w:t>
-      </w:r>
-      <w:r>
-        <w:rPr/>
-        <w:t xml:space="preserve">) rather than the bash twin doing that job. </w:t>
-      </w:r>
-    </w:p>
-    <w:p>
-      <w:pPr>
-        <w:pStyle w:val="BodyText"/>
-        <w:numPr>
-          <w:ilvl w:val="0"/>
-          <w:numId w:val="21"/>
-        </w:numPr>
-        <w:tabs>
-          <w:tab w:val="clear" w:pos="1134"/>
-          <w:tab w:val="left" w:pos="829" w:leader="none"/>
-        </w:tabs>
-        <w:bidi w:val="0"/>
-        <w:ind w:hanging="283" w:left="829"/>
-        <w:jc w:val="left"/>
-        <w:rPr/>
-      </w:pPr>
-      <w:r>
-        <w:rPr>
-          <w:rStyle w:val="Strong"/>
-        </w:rPr>
-        <w:t>Tests and checks are slow on Windows.</w:t>
-      </w:r>
-      <w:r>
-        <w:rPr/>
-        <w:t xml:space="preserve"> Read </w:t>
-      </w:r>
-      <w:r>
-        <w:rPr>
-          <w:rStyle w:val="SourceText"/>
-        </w:rPr>
-        <w:t>/crew:status</w:t>
-      </w:r>
-      <w:r>
-        <w:rPr/>
-        <w:t xml:space="preserve">'s </w:t>
-      </w:r>
-      <w:r>
-        <w:rPr>
-          <w:rStyle w:val="SourceText"/>
-        </w:rPr>
-        <w:t>shell</w:t>
-      </w:r>
-      <w:r>
-        <w:rPr/>
-        <w:t xml:space="preserve"> line first. It names the shell route crew's jobs take (</w:t>
-      </w:r>
-      <w:r>
-        <w:rPr>
-          <w:rStyle w:val="SourceText"/>
-        </w:rPr>
-        <w:t>shellRoute.mode</w:t>
-      </w:r>
-      <w:r>
-        <w:rPr/>
-        <w:t xml:space="preserve">: </w:t>
-      </w:r>
-      <w:r>
-        <w:rPr>
-          <w:rStyle w:val="SourceText"/>
-        </w:rPr>
-        <w:t>auto</w:t>
-      </w:r>
-      <w:r>
-        <w:rPr/>
-        <w:t xml:space="preserve">, </w:t>
-      </w:r>
-      <w:r>
-        <w:rPr>
-          <w:rStyle w:val="SourceText"/>
-        </w:rPr>
-        <w:t>wsl</w:t>
-      </w:r>
-      <w:r>
-        <w:rPr/>
-        <w:t xml:space="preserve">, </w:t>
-      </w:r>
-      <w:r>
-        <w:rPr>
-          <w:rStyle w:val="SourceText"/>
-        </w:rPr>
-        <w:t>powershell</w:t>
-      </w:r>
-      <w:r>
-        <w:rPr/>
-        <w:t xml:space="preserve">, </w:t>
-      </w:r>
-      <w:r>
-        <w:rPr>
-          <w:rStyle w:val="SourceText"/>
-        </w:rPr>
-        <w:t>gitbash</w:t>
-      </w:r>
-      <w:r>
-        <w:rPr/>
-        <w:t xml:space="preserve">) and why. </w:t>
-      </w:r>
-      <w:r>
-        <w:rPr>
-          <w:rStyle w:val="SourceText"/>
-        </w:rPr>
-        <w:t>WSL never probed</w:t>
-      </w:r>
-      <w:r>
-        <w:rPr/>
-        <w:t xml:space="preserve"> means nobody ran </w:t>
-      </w:r>
-      <w:r>
-        <w:rPr>
-          <w:rStyle w:val="SourceText"/>
-        </w:rPr>
-        <w:t>crew_shell.py probe --write</w:t>
-      </w:r>
-      <w:r>
-        <w:rPr/>
-        <w:t xml:space="preserve">; </w:t>
-      </w:r>
-      <w:r>
-        <w:rPr>
-          <w:rStyle w:val="SourceText"/>
-        </w:rPr>
-        <w:t>not-installed</w:t>
-      </w:r>
-      <w:r>
-        <w:rPr/>
-        <w:t xml:space="preserve"> comes with the </w:t>
-      </w:r>
-      <w:r>
-        <w:rPr>
-          <w:rStyle w:val="SourceText"/>
-        </w:rPr>
-        <w:t>wsl --install -d Ubuntu</w:t>
-      </w:r>
-      <w:r>
-        <w:rPr/>
-        <w:t xml:space="preserve"> recommendation, which crew prints and never runs. A repo on a Windows drive goes to WSL under </w:t>
-      </w:r>
-      <w:r>
-        <w:rPr>
-          <w:rStyle w:val="SourceText"/>
-        </w:rPr>
-        <w:t>auto</w:t>
-      </w:r>
-      <w:r>
-        <w:rPr/>
-        <w:t xml:space="preserve"> only after </w:t>
-      </w:r>
-      <w:r>
-        <w:rPr>
-          <w:rStyle w:val="SourceText"/>
-        </w:rPr>
-        <w:t>crew_shell.py measure --write</w:t>
-      </w:r>
-      <w:r>
-        <w:rPr/>
-        <w:t xml:space="preserve"> has shown WSL faster there. See "Choosing the shell route on Windows" in </w:t>
-      </w:r>
-      <w:r>
-        <w:rPr>
-          <w:rStyle w:val="SourceText"/>
-        </w:rPr>
-        <w:t>plugin/crew/skills/crew-setup/platform.md</w:t>
-      </w:r>
-      <w:r>
-        <w:rPr/>
-        <w:t xml:space="preserve">. </w:t>
-      </w:r>
-    </w:p>
-    <w:p>
-      <w:pPr>
-        <w:pStyle w:val="Heading2"/>
-        <w:bidi w:val="0"/>
-        <w:ind w:hanging="0" w:left="0" w:right="0"/>
-        <w:jc w:val="left"/>
-        <w:rPr/>
-      </w:pPr>
-      <w:bookmarkStart w:id="14" w:name="auto-wrap-up-auto-clear-and-auto-resume"/>
-      <w:bookmarkEnd w:id="14"/>
-      <w:r>
-        <w:rPr/>
-        <w:t>Auto Wrap-Up, Auto-Clear and Auto-Resume</w:t>
-      </w:r>
-    </w:p>
-    <w:p>
-      <w:pPr>
-        <w:pStyle w:val="BodyText"/>
-        <w:bidi w:val="0"/>
-        <w:jc w:val="left"/>
-        <w:rPr/>
-      </w:pPr>
-      <w:r>
-        <w:rPr/>
-        <w:t>This section is folded into the troubleshooting guide (</w:t>
-      </w:r>
-      <w:r>
-        <w:rPr>
-          <w:rStyle w:val="SourceText"/>
-        </w:rPr>
-        <w:t>troubleshooting.md</w:t>
-      </w:r>
-      <w:r>
-        <w:rPr/>
-        <w:t>), linked from it as "Auto wrap-up, clear and resume". It covers the cycle that lets a long session finish itself cleanly, clear, and pick up where it stopped.</w:t>
-      </w:r>
-    </w:p>
-    <w:p>
-      <w:pPr>
-        <w:pStyle w:val="Heading3"/>
-        <w:bidi w:val="0"/>
-        <w:ind w:hanging="0" w:left="0" w:right="0"/>
-        <w:jc w:val="left"/>
-        <w:rPr/>
-      </w:pPr>
-      <w:bookmarkStart w:id="15" w:name="what-the-cycle-does"/>
-      <w:bookmarkEnd w:id="15"/>
-      <w:r>
-        <w:rPr/>
-        <w:t>What the Cycle Does</w:t>
       </w:r>
     </w:p>
     <w:p>
@@ -10887,31 +10798,41 @@
         <w:rPr>
           <w:rStyle w:val="Strong"/>
         </w:rPr>
-        <w:t>Wrap-up.</w:t>
-      </w:r>
-      <w:r>
-        <w:rPr/>
-        <w:t xml:space="preserve"> When the context window crosses its threshold, the </w:t>
-      </w:r>
-      <w:r>
-        <w:rPr>
-          <w:rStyle w:val="SourceText"/>
-        </w:rPr>
-        <w:t>Stop</w:t>
-      </w:r>
-      <w:r>
-        <w:rPr/>
-        <w:t xml:space="preserve"> hook blocks once. It asks the session to finish or park the change in flight, write </w:t>
-      </w:r>
-      <w:r>
-        <w:rPr>
-          <w:rStyle w:val="SourceText"/>
-        </w:rPr>
-        <w:t>.work/HANDOFF.md</w:t>
-      </w:r>
-      <w:r>
-        <w:rPr/>
-        <w:t xml:space="preserve">, and update the ticket. This happens once for each threshold crossing in each session. It never happens on the forced continuation that follows a block. </w:t>
+        <w:t>Docker absent -&gt; visual UNVERIFIED, not a fail.</w:t>
+      </w:r>
+      <w:r>
+        <w:rPr/>
+        <w:t xml:space="preserve"> </w:t>
+      </w:r>
+      <w:r>
+        <w:rPr>
+          <w:rStyle w:val="SourceText"/>
+        </w:rPr>
+        <w:t>toHaveScreenshot</w:t>
+      </w:r>
+      <w:r>
+        <w:rPr/>
+        <w:t xml:space="preserve"> baselines are only meaningful when generated inside </w:t>
+      </w:r>
+      <w:r>
+        <w:rPr>
+          <w:rStyle w:val="SourceText"/>
+        </w:rPr>
+        <w:t>mcr.microsoft.com/playwright:v1.63.0-noble</w:t>
+      </w:r>
+      <w:r>
+        <w:rPr/>
+        <w:t xml:space="preserve"> — the installer warns rather than blocking when Docker is missing, and the visual </w:t>
+      </w:r>
+      <w:r>
+        <w:rPr>
+          <w:rStyle w:val="SourceText"/>
+        </w:rPr>
+        <w:t>verify.json</w:t>
+      </w:r>
+      <w:r>
+        <w:rPr/>
+        <w:t xml:space="preserve"> rule is written to skip (report UNVERIFIED) outside that image rather than compare against a baseline that can never match. </w:t>
       </w:r>
     </w:p>
     <w:p>
@@ -10934,57 +10855,373 @@
         <w:rPr>
           <w:rStyle w:val="Strong"/>
         </w:rPr>
-        <w:t>Clear, or notify.</w:t>
-      </w:r>
-      <w:r>
-        <w:rPr/>
-        <w:t xml:space="preserve"> After the handoff is written, auto-clear acts on it. What it does depends on </w:t>
-      </w:r>
-      <w:r>
-        <w:rPr>
-          <w:rStyle w:val="SourceText"/>
-        </w:rPr>
-        <w:t>method</w:t>
-      </w:r>
-      <w:r>
-        <w:rPr/>
-        <w:t xml:space="preserve"> (below): </w:t>
-      </w:r>
-      <w:r>
-        <w:rPr>
-          <w:rStyle w:val="SourceText"/>
-        </w:rPr>
-        <w:t>notify</w:t>
-      </w:r>
-      <w:r>
-        <w:rPr/>
-        <w:t xml:space="preserve"> (the default on native Windows) prints a message telling you the handoff is written and it is safe to run </w:t>
-      </w:r>
-      <w:r>
-        <w:rPr>
-          <w:rStyle w:val="SourceText"/>
-        </w:rPr>
-        <w:t>/clear</w:t>
-      </w:r>
-      <w:r>
-        <w:rPr/>
-        <w:t xml:space="preserve"> (or </w:t>
-      </w:r>
-      <w:r>
-        <w:rPr>
-          <w:rStyle w:val="SourceText"/>
-        </w:rPr>
-        <w:t>/compact</w:t>
-      </w:r>
-      <w:r>
-        <w:rPr/>
-        <w:t xml:space="preserve">) yourself — it types nothing. </w:t>
-      </w:r>
-      <w:r>
-        <w:rPr>
-          <w:rStyle w:val="SourceText"/>
-        </w:rPr>
-        <w:t>tmux</w:t>
+        <w:t>MCP server won't connect on Windows.</w:t>
+      </w:r>
+      <w:r>
+        <w:rPr/>
+        <w:t xml:space="preserve"> Both </w:t>
+      </w:r>
+      <w:r>
+        <w:rPr>
+          <w:rStyle w:val="SourceText"/>
+        </w:rPr>
+        <w:t>@playwright/mcp</w:t>
+      </w:r>
+      <w:r>
+        <w:rPr/>
+        <w:t xml:space="preserve"> and </w:t>
+      </w:r>
+      <w:r>
+        <w:rPr>
+          <w:rStyle w:val="SourceText"/>
+        </w:rPr>
+        <w:t>chrome-devtools-mcp</w:t>
+      </w:r>
+      <w:r>
+        <w:rPr/>
+        <w:t xml:space="preserve"> are launched with </w:t>
+      </w:r>
+      <w:r>
+        <w:rPr>
+          <w:rStyle w:val="SourceText"/>
+        </w:rPr>
+        <w:t>npx</w:t>
+      </w:r>
+      <w:r>
+        <w:rPr/>
+        <w:t xml:space="preserve">, which the MCP host cannot invoke directly on Windows — wrap the entry as </w:t>
+      </w:r>
+      <w:r>
+        <w:rPr>
+          <w:rStyle w:val="SourceText"/>
+        </w:rPr>
+        <w:t>"command": "cmd", "args": ["/c", "npx", ...]</w:t>
+      </w:r>
+      <w:r>
+        <w:rPr/>
+        <w:t xml:space="preserve"> in </w:t>
+      </w:r>
+      <w:r>
+        <w:rPr>
+          <w:rStyle w:val="SourceText"/>
+        </w:rPr>
+        <w:t>.mcp.json</w:t>
+      </w:r>
+      <w:r>
+        <w:rPr/>
+        <w:t xml:space="preserve"> (documented in chrome-devtools-mcp's own troubleshooting for the "Connection closed" failure); the </w:t>
+      </w:r>
+      <w:r>
+        <w:rPr>
+          <w:rStyle w:val="SourceText"/>
+        </w:rPr>
+        <w:t>stack-web</w:t>
+      </w:r>
+      <w:r>
+        <w:rPr/>
+        <w:t xml:space="preserve"> skill's </w:t>
+      </w:r>
+      <w:r>
+        <w:rPr>
+          <w:rStyle w:val="SourceText"/>
+        </w:rPr>
+        <w:t>.mcp.json</w:t>
+      </w:r>
+      <w:r>
+        <w:rPr/>
+        <w:t xml:space="preserve"> example already shows this. </w:t>
+      </w:r>
+    </w:p>
+    <w:p>
+      <w:pPr>
+        <w:pStyle w:val="Heading2"/>
+        <w:bidi w:val="0"/>
+        <w:ind w:hanging="0" w:left="0" w:right="0"/>
+        <w:jc w:val="left"/>
+        <w:rPr/>
+      </w:pPr>
+      <w:bookmarkStart w:id="15" w:name="windows-notes"/>
+      <w:bookmarkEnd w:id="15"/>
+      <w:r>
+        <w:rPr/>
+        <w:t>Windows Notes</w:t>
+      </w:r>
+    </w:p>
+    <w:p>
+      <w:pPr>
+        <w:pStyle w:val="BodyText"/>
+        <w:numPr>
+          <w:ilvl w:val="0"/>
+          <w:numId w:val="23"/>
+        </w:numPr>
+        <w:tabs>
+          <w:tab w:val="clear" w:pos="1134"/>
+          <w:tab w:val="left" w:pos="829" w:leader="none"/>
+        </w:tabs>
+        <w:bidi w:val="0"/>
+        <w:spacing w:before="120" w:after="0"/>
+        <w:ind w:hanging="283" w:left="829"/>
+        <w:jc w:val="left"/>
+        <w:rPr/>
+      </w:pPr>
+      <w:r>
+        <w:rPr>
+          <w:rStyle w:val="SourceText"/>
+        </w:rPr>
+        <w:t>pwsh</w:t>
+      </w:r>
+      <w:r>
+        <w:rPr>
+          <w:rStyle w:val="Strong"/>
+        </w:rPr>
+        <w:t xml:space="preserve"> is not on Git Bash's </w:t>
+      </w:r>
+      <w:r>
+        <w:rPr>
+          <w:rStyle w:val="SourceText"/>
+        </w:rPr>
+        <w:t>PATH</w:t>
+      </w:r>
+      <w:r>
+        <w:rPr>
+          <w:rStyle w:val="Strong"/>
+        </w:rPr>
+        <w:t>.</w:t>
+      </w:r>
+      <w:r>
+        <w:rPr/>
+        <w:t xml:space="preserve"> Every script that shells out to PowerShell names it by an absolute path or resolves it explicitly; a bare </w:t>
+      </w:r>
+      <w:r>
+        <w:rPr>
+          <w:rStyle w:val="SourceText"/>
+        </w:rPr>
+        <w:t>pwsh</w:t>
+      </w:r>
+      <w:r>
+        <w:rPr/>
+        <w:t xml:space="preserve"> in a hand-typed command fails as "command not found", which is easy to misread as PowerShell itself being broken. </w:t>
+      </w:r>
+    </w:p>
+    <w:p>
+      <w:pPr>
+        <w:pStyle w:val="BodyText"/>
+        <w:numPr>
+          <w:ilvl w:val="0"/>
+          <w:numId w:val="23"/>
+        </w:numPr>
+        <w:tabs>
+          <w:tab w:val="clear" w:pos="1134"/>
+          <w:tab w:val="left" w:pos="829" w:leader="none"/>
+        </w:tabs>
+        <w:bidi w:val="0"/>
+        <w:spacing w:before="120" w:after="0"/>
+        <w:ind w:hanging="283" w:left="829"/>
+        <w:jc w:val="left"/>
+        <w:rPr/>
+      </w:pPr>
+      <w:r>
+        <w:rPr>
+          <w:rStyle w:val="Strong"/>
+        </w:rPr>
+        <w:t xml:space="preserve">Git Bash ships without </w:t>
+      </w:r>
+      <w:r>
+        <w:rPr>
+          <w:rStyle w:val="SourceText"/>
+        </w:rPr>
+        <w:t>python3</w:t>
+      </w:r>
+      <w:r>
+        <w:rPr>
+          <w:rStyle w:val="Strong"/>
+        </w:rPr>
+        <w:t>.</w:t>
+      </w:r>
+      <w:r>
+        <w:rPr/>
+        <w:t xml:space="preserve"> Every hook wrapper here resolves </w:t>
+      </w:r>
+      <w:r>
+        <w:rPr>
+          <w:rStyle w:val="SourceText"/>
+        </w:rPr>
+        <w:t>python3</w:t>
+      </w:r>
+      <w:r>
+        <w:rPr/>
+        <w:t xml:space="preserve">, then </w:t>
+      </w:r>
+      <w:r>
+        <w:rPr>
+          <w:rStyle w:val="SourceText"/>
+        </w:rPr>
+        <w:t>python</w:t>
+      </w:r>
+      <w:r>
+        <w:rPr/>
+        <w:t xml:space="preserve">, then </w:t>
+      </w:r>
+      <w:r>
+        <w:rPr>
+          <w:rStyle w:val="SourceText"/>
+        </w:rPr>
+        <w:t>py</w:t>
+      </w:r>
+      <w:r>
+        <w:rPr/>
+        <w:t xml:space="preserve">, and fails loudly on stderr rather than silently standing down when none resolves (see "no-python fail-closed", above). If a hook you expect to run says nothing at all, check for a usable Python on </w:t>
+      </w:r>
+      <w:r>
+        <w:rPr>
+          <w:rStyle w:val="SourceText"/>
+        </w:rPr>
+        <w:t>PATH</w:t>
+      </w:r>
+      <w:r>
+        <w:rPr/>
+        <w:t xml:space="preserve"> first. </w:t>
+      </w:r>
+    </w:p>
+    <w:p>
+      <w:pPr>
+        <w:pStyle w:val="BodyText"/>
+        <w:numPr>
+          <w:ilvl w:val="0"/>
+          <w:numId w:val="23"/>
+        </w:numPr>
+        <w:tabs>
+          <w:tab w:val="clear" w:pos="1134"/>
+          <w:tab w:val="left" w:pos="829" w:leader="none"/>
+        </w:tabs>
+        <w:bidi w:val="0"/>
+        <w:spacing w:before="120" w:after="0"/>
+        <w:ind w:hanging="283" w:left="829"/>
+        <w:jc w:val="left"/>
+        <w:rPr/>
+      </w:pPr>
+      <w:r>
+        <w:rPr>
+          <w:rStyle w:val="Strong"/>
+        </w:rPr>
+        <w:t>Both flavours are always registered.</w:t>
+      </w:r>
+      <w:r>
+        <w:rPr/>
+        <w:t xml:space="preserve"> </w:t>
+      </w:r>
+      <w:r>
+        <w:rPr>
+          <w:rStyle w:val="SourceText"/>
+        </w:rPr>
+        <w:t>hooks.json</w:t>
+      </w:r>
+      <w:r>
+        <w:rPr/>
+        <w:t xml:space="preserve"> pairs every bash command with a </w:t>
+      </w:r>
+      <w:r>
+        <w:rPr>
+          <w:rStyle w:val="SourceText"/>
+        </w:rPr>
+        <w:t>shell: "powershell"</w:t>
+      </w:r>
+      <w:r>
+        <w:rPr/>
+        <w:t xml:space="preserve"> sibling on the same event, so a machine with both </w:t>
+      </w:r>
+      <w:r>
+        <w:rPr>
+          <w:rStyle w:val="SourceText"/>
+        </w:rPr>
+        <w:t>bash</w:t>
+      </w:r>
+      <w:r>
+        <w:rPr/>
+        <w:t xml:space="preserve"> and </w:t>
+      </w:r>
+      <w:r>
+        <w:rPr>
+          <w:rStyle w:val="SourceText"/>
+        </w:rPr>
+        <w:t>pwsh</w:t>
+      </w:r>
+      <w:r>
+        <w:rPr/>
+        <w:t xml:space="preserve"> present runs both. This is not double-firing to fix — it is how the same hook reaches both shells; each PowerShell twin stands itself down on the wrong platform (</w:t>
+      </w:r>
+      <w:r>
+        <w:rPr>
+          <w:rStyle w:val="SourceText"/>
+        </w:rPr>
+        <w:t>$env:OS -ne 'Windows_NT'</w:t>
+      </w:r>
+      <w:r>
+        <w:rPr/>
+        <w:t xml:space="preserve">) rather than the bash twin doing that job. </w:t>
+      </w:r>
+    </w:p>
+    <w:p>
+      <w:pPr>
+        <w:pStyle w:val="BodyText"/>
+        <w:numPr>
+          <w:ilvl w:val="0"/>
+          <w:numId w:val="23"/>
+        </w:numPr>
+        <w:tabs>
+          <w:tab w:val="clear" w:pos="1134"/>
+          <w:tab w:val="left" w:pos="829" w:leader="none"/>
+        </w:tabs>
+        <w:bidi w:val="0"/>
+        <w:ind w:hanging="283" w:left="829"/>
+        <w:jc w:val="left"/>
+        <w:rPr/>
+      </w:pPr>
+      <w:r>
+        <w:rPr>
+          <w:rStyle w:val="Strong"/>
+        </w:rPr>
+        <w:t>Tests and checks are slow on Windows.</w:t>
+      </w:r>
+      <w:r>
+        <w:rPr/>
+        <w:t xml:space="preserve"> Read </w:t>
+      </w:r>
+      <w:r>
+        <w:rPr>
+          <w:rStyle w:val="SourceText"/>
+        </w:rPr>
+        <w:t>/crew:status</w:t>
+      </w:r>
+      <w:r>
+        <w:rPr/>
+        <w:t xml:space="preserve">'s </w:t>
+      </w:r>
+      <w:r>
+        <w:rPr>
+          <w:rStyle w:val="SourceText"/>
+        </w:rPr>
+        <w:t>shell</w:t>
+      </w:r>
+      <w:r>
+        <w:rPr/>
+        <w:t xml:space="preserve"> line first. It names the shell route crew's jobs take (</w:t>
+      </w:r>
+      <w:r>
+        <w:rPr>
+          <w:rStyle w:val="SourceText"/>
+        </w:rPr>
+        <w:t>shellRoute.mode</w:t>
+      </w:r>
+      <w:r>
+        <w:rPr/>
+        <w:t xml:space="preserve">: </w:t>
+      </w:r>
+      <w:r>
+        <w:rPr>
+          <w:rStyle w:val="SourceText"/>
+        </w:rPr>
+        <w:t>auto</w:t>
       </w:r>
       <w:r>
         <w:rPr/>
@@ -10994,61 +11231,116 @@
         <w:rPr>
           <w:rStyle w:val="SourceText"/>
         </w:rPr>
-        <w:t>xdotool</w:t>
-      </w:r>
-      <w:r>
-        <w:rPr/>
-        <w:t xml:space="preserve"> and </w:t>
-      </w:r>
-      <w:r>
-        <w:rPr>
-          <w:rStyle w:val="SourceText"/>
-        </w:rPr>
-        <w:t>sendkeys</w:t>
-      </w:r>
-      <w:r>
-        <w:rPr/>
-        <w:t xml:space="preserve"> actually type the configured command into the terminal that runs this session. Whichever method is in force, it acts only when all four of these hold: - this machine opted in; - the handoff was written by this session after the wrap-up request, is longer than a stub, and is not the automatic PreCompact skeleton; - the context reading that caused the wrap-up was a real measurement (see "When it will not clear"); - for a method that types (</w:t>
-      </w:r>
-      <w:r>
-        <w:rPr>
-          <w:rStyle w:val="SourceText"/>
-        </w:rPr>
-        <w:t>tmux</w:t>
-      </w:r>
-      <w:r>
-        <w:rPr/>
-        <w:t>/</w:t>
-      </w:r>
-      <w:r>
-        <w:rPr>
-          <w:rStyle w:val="SourceText"/>
-        </w:rPr>
-        <w:t>xdotool</w:t>
-      </w:r>
-      <w:r>
-        <w:rPr/>
-        <w:t>/</w:t>
-      </w:r>
-      <w:r>
-        <w:rPr>
-          <w:rStyle w:val="SourceText"/>
-        </w:rPr>
-        <w:t>sendkeys</w:t>
-      </w:r>
-      <w:r>
-        <w:rPr/>
-        <w:t xml:space="preserve">), the target window can be identified exactly — </w:t>
-      </w:r>
-      <w:r>
-        <w:rPr>
-          <w:rStyle w:val="SourceText"/>
-        </w:rPr>
-        <w:t>notify</w:t>
-      </w:r>
-      <w:r>
-        <w:rPr/>
-        <w:t xml:space="preserve"> needs none of this, since it identifies no window. </w:t>
+        <w:t>wsl</w:t>
+      </w:r>
+      <w:r>
+        <w:rPr/>
+        <w:t xml:space="preserve">, </w:t>
+      </w:r>
+      <w:r>
+        <w:rPr>
+          <w:rStyle w:val="SourceText"/>
+        </w:rPr>
+        <w:t>powershell</w:t>
+      </w:r>
+      <w:r>
+        <w:rPr/>
+        <w:t xml:space="preserve">, </w:t>
+      </w:r>
+      <w:r>
+        <w:rPr>
+          <w:rStyle w:val="SourceText"/>
+        </w:rPr>
+        <w:t>gitbash</w:t>
+      </w:r>
+      <w:r>
+        <w:rPr/>
+        <w:t xml:space="preserve">) and why. </w:t>
+      </w:r>
+      <w:r>
+        <w:rPr>
+          <w:rStyle w:val="SourceText"/>
+        </w:rPr>
+        <w:t>WSL never probed</w:t>
+      </w:r>
+      <w:r>
+        <w:rPr/>
+        <w:t xml:space="preserve"> means nobody ran </w:t>
+      </w:r>
+      <w:r>
+        <w:rPr>
+          <w:rStyle w:val="SourceText"/>
+        </w:rPr>
+        <w:t>crew_shell.py probe --write</w:t>
+      </w:r>
+      <w:r>
+        <w:rPr/>
+        <w:t xml:space="preserve">; </w:t>
+      </w:r>
+      <w:r>
+        <w:rPr>
+          <w:rStyle w:val="SourceText"/>
+        </w:rPr>
+        <w:t>not-installed</w:t>
+      </w:r>
+      <w:r>
+        <w:rPr/>
+        <w:t xml:space="preserve"> comes with the </w:t>
+      </w:r>
+      <w:r>
+        <w:rPr>
+          <w:rStyle w:val="SourceText"/>
+        </w:rPr>
+        <w:t>wsl --install -d Ubuntu</w:t>
+      </w:r>
+      <w:r>
+        <w:rPr/>
+        <w:t xml:space="preserve"> recommendation, which crew prints and never runs. A repo on a Windows drive goes to WSL under </w:t>
+      </w:r>
+      <w:r>
+        <w:rPr>
+          <w:rStyle w:val="SourceText"/>
+        </w:rPr>
+        <w:t>auto</w:t>
+      </w:r>
+      <w:r>
+        <w:rPr/>
+        <w:t xml:space="preserve"> only after </w:t>
+      </w:r>
+      <w:r>
+        <w:rPr>
+          <w:rStyle w:val="SourceText"/>
+        </w:rPr>
+        <w:t>crew_shell.py measure --write</w:t>
+      </w:r>
+      <w:r>
+        <w:rPr/>
+        <w:t xml:space="preserve"> has shown WSL faster there. See "Choosing the shell route on Windows" in </w:t>
+      </w:r>
+      <w:r>
+        <w:rPr>
+          <w:rStyle w:val="SourceText"/>
+        </w:rPr>
+        <w:t>plugin/crew/skills/crew-setup/platform.md</w:t>
+      </w:r>
+      <w:r>
+        <w:rPr/>
+        <w:t xml:space="preserve">. </w:t>
+      </w:r>
+    </w:p>
+    <w:p>
+      <w:pPr>
+        <w:pStyle w:val="Heading2"/>
+        <w:bidi w:val="0"/>
+        <w:ind w:hanging="0" w:left="0" w:right="0"/>
+        <w:jc w:val="left"/>
+        <w:rPr/>
+      </w:pPr>
+      <w:bookmarkStart w:id="16" w:name="auto-wrap-up-auto-clear-and-auto-resume"/>
+      <w:bookmarkEnd w:id="16"/>
+      <w:r>
+        <w:rPr/>
+        <w:t>Auto Wrap-Up, Auto-Clear and Auto-Resume</w:t>
       </w:r>
     </w:p>
     <w:p>
@@ -11059,268 +11351,18 @@
         <w:rPr/>
       </w:pPr>
       <w:r>
-        <w:rPr>
-          <w:rStyle w:val="Strong"/>
-        </w:rPr>
-        <w:t>Crew neither causes nor tunes Claude Code's own auto-compact.</w:t>
-      </w:r>
-      <w:r>
-        <w:rPr/>
-        <w:t xml:space="preserve"> That is a separate, built-in behaviour that fires whenever Claude Code itself decides to; this cycle only reacts to a handoff once one exists, and nothing here makes auto-compact happen sooner, later, or at all. 3. </w:t>
-      </w:r>
-      <w:r>
-        <w:rPr>
-          <w:rStyle w:val="Strong"/>
-        </w:rPr>
-        <w:t>Resume.</w:t>
-      </w:r>
-      <w:r>
-        <w:rPr/>
-        <w:t xml:space="preserve"> The new session starts with the handoff and its next action already in context, within the 3,000-character resume budget. Nothing starts working unprompted: crew does not use </w:t>
-      </w:r>
-      <w:r>
-        <w:rPr>
-          <w:rStyle w:val="SourceText"/>
-        </w:rPr>
-        <w:t>initialUserMessage</w:t>
-      </w:r>
-      <w:r>
-        <w:rPr/>
-        <w:t xml:space="preserve">, so you press Enter to continue. Claude Code 2.1.282 drops it in an interactive session anyway (spike, 2026-09-25): it is honoured by </w:t>
-      </w:r>
-      <w:r>
-        <w:rPr>
-          <w:rStyle w:val="SourceText"/>
-        </w:rPr>
-        <w:t>claude -p</w:t>
-      </w:r>
-      <w:r>
-        <w:rPr/>
-        <w:t xml:space="preserve"> only.</w:t>
-      </w:r>
-    </w:p>
-    <w:p>
-      <w:pPr>
-        <w:pStyle w:val="BodyText"/>
-        <w:bidi w:val="0"/>
-        <w:jc w:val="left"/>
-        <w:rPr/>
-      </w:pPr>
-      <w:r>
-        <w:rPr/>
-        <w:t xml:space="preserve">With </w:t>
-      </w:r>
-      <w:r>
-        <w:rPr>
-          <w:rStyle w:val="SourceText"/>
-        </w:rPr>
-        <w:t>resume.auto: true</w:t>
-      </w:r>
-      <w:r>
-        <w:rPr/>
-        <w:t xml:space="preserve"> in the machine-global config, the handoff after </w:t>
-      </w:r>
-      <w:r>
-        <w:rPr>
-          <w:rStyle w:val="SourceText"/>
-        </w:rPr>
-        <w:t>/clear</w:t>
-      </w:r>
-      <w:r>
-        <w:rPr/>
-        <w:t xml:space="preserve"> or a manual </w:t>
-      </w:r>
-      <w:r>
-        <w:rPr>
-          <w:rStyle w:val="SourceText"/>
-        </w:rPr>
-        <w:t>/compact</w:t>
-      </w:r>
-      <w:r>
-        <w:rPr/>
-        <w:t xml:space="preserve"> also names the exact next command, read from the note's </w:t>
-      </w:r>
-      <w:r>
-        <w:rPr>
-          <w:rStyle w:val="SourceText"/>
-        </w:rPr>
-        <w:t>resume:</w:t>
-      </w:r>
-      <w:r>
-        <w:rPr/>
-        <w:t xml:space="preserve"> line (</w:t>
-      </w:r>
-      <w:r>
-        <w:rPr>
-          <w:rStyle w:val="SourceText"/>
-        </w:rPr>
-        <w:t>resume: /crew:done T-0001</w:t>
-      </w:r>
-      <w:r>
-        <w:rPr/>
-        <w:t xml:space="preserve">): </w:t>
-      </w:r>
-      <w:r>
-        <w:rPr>
-          <w:rStyle w:val="SourceText"/>
-        </w:rPr>
-        <w:t>Auto-resume: ready to run /crew:done T-0001.</w:t>
-      </w:r>
-      <w:r>
-        <w:rPr/>
-        <w:t xml:space="preserve"> — or </w:t>
-      </w:r>
-      <w:r>
-        <w:rPr>
-          <w:rStyle w:val="SourceText"/>
-        </w:rPr>
-        <w:t>Auto-resume did not start: &lt;reason&gt;.</w:t>
-      </w:r>
-      <w:r>
-        <w:rPr/>
-        <w:t xml:space="preserve"> when a check refuses it. It still does not start on its own: you press Enter or type it, until T-0013 types it where the terminal can be identified. The refusal reasons are: compact was not a manual /compact; no handoff note, or it was archived as stale, or is stale and could not be archived; the handoff is the automatic PreCompact skeleton; no resume line, </w:t>
-      </w:r>
-      <w:r>
-        <w:rPr>
-          <w:rStyle w:val="SourceText"/>
-        </w:rPr>
-        <w:t>resume: none</w:t>
-      </w:r>
-      <w:r>
-        <w:rPr/>
-        <w:t xml:space="preserve">, or a line the grammar refuses (a second line, trailing text, an unknown command, or an excluded one such as </w:t>
-      </w:r>
-      <w:r>
-        <w:rPr>
-          <w:rStyle w:val="SourceText"/>
-        </w:rPr>
-        <w:t>/crew:approve</w:t>
-      </w:r>
-      <w:r>
-        <w:rPr/>
-        <w:t xml:space="preserve">); the note's </w:t>
-      </w:r>
-      <w:r>
-        <w:rPr>
-          <w:rStyle w:val="SourceText"/>
-        </w:rPr>
-        <w:t>branch:</w:t>
-      </w:r>
-      <w:r>
-        <w:rPr/>
-        <w:t xml:space="preserve"> or </w:t>
-      </w:r>
-      <w:r>
-        <w:rPr>
-          <w:rStyle w:val="SourceText"/>
-        </w:rPr>
-        <w:t>head:</w:t>
-      </w:r>
-      <w:r>
-        <w:rPr/>
-        <w:t xml:space="preserve"> does not match the checkout; the ticket directory or goal file is missing; the command is not installed; </w:t>
-      </w:r>
-      <w:r>
-        <w:rPr>
-          <w:rStyle w:val="SourceText"/>
-        </w:rPr>
-        <w:t>handoff-author.json</w:t>
-      </w:r>
-      <w:r>
-        <w:rPr/>
-        <w:t xml:space="preserve"> could not be read; no record of which session wrote this handoff; the handoff changed since its author session wrote it; the handoff was written by another session; this session's process could not be identified (always on a host without </w:t>
-      </w:r>
-      <w:r>
-        <w:rPr>
-          <w:rStyle w:val="SourceText"/>
-        </w:rPr>
-        <w:t>/proc</w:t>
-      </w:r>
-      <w:r>
-        <w:rPr/>
-        <w:t>, such as native Windows or macOS); the record of past auto-resumes (</w:t>
-      </w:r>
-      <w:r>
-        <w:rPr>
-          <w:rStyle w:val="SourceText"/>
-        </w:rPr>
-        <w:t>resume-state.json</w:t>
-      </w:r>
-      <w:r>
-        <w:rPr/>
-        <w:t xml:space="preserve">) could not be read, or its directory cannot be searched; this handoff was already resumed; the progress fingerprint could not be computed; the same command with no progress since the last auto-resume; </w:t>
-      </w:r>
-      <w:r>
-        <w:rPr>
-          <w:rStyle w:val="SourceText"/>
-        </w:rPr>
-        <w:t>internal error</w:t>
-      </w:r>
-      <w:r>
-        <w:rPr/>
-        <w:t xml:space="preserve"> (the decision itself failed, and the handoff is still injected). Never on a plain </w:t>
-      </w:r>
-      <w:r>
-        <w:rPr>
-          <w:rStyle w:val="SourceText"/>
-        </w:rPr>
-        <w:t>startup</w:t>
-      </w:r>
-      <w:r>
-        <w:rPr/>
-        <w:t>.</w:t>
-      </w:r>
-    </w:p>
-    <w:p>
-      <w:pPr>
-        <w:pStyle w:val="BodyText"/>
-        <w:bidi w:val="0"/>
-        <w:jc w:val="left"/>
-        <w:rPr/>
-      </w:pPr>
-      <w:r>
-        <w:rPr/>
-        <w:t xml:space="preserve">A note resumes only in the session that wrote it. Write it with the Write tool (as </w:t>
-      </w:r>
-      <w:r>
-        <w:rPr>
-          <w:rStyle w:val="SourceText"/>
-        </w:rPr>
-        <w:t>/crew:handoff</w:t>
-      </w:r>
-      <w:r>
-        <w:rPr/>
-        <w:t xml:space="preserve"> does): the context hook then records which session and which Claude Code process wrote it. After </w:t>
-      </w:r>
-      <w:r>
-        <w:rPr>
-          <w:rStyle w:val="SourceText"/>
-        </w:rPr>
-        <w:t>/compact</w:t>
-      </w:r>
-      <w:r>
-        <w:rPr/>
-        <w:t xml:space="preserve"> the session must match; after </w:t>
-      </w:r>
-      <w:r>
-        <w:rPr>
-          <w:rStyle w:val="SourceText"/>
-        </w:rPr>
-        <w:t>/clear</w:t>
-      </w:r>
-      <w:r>
-        <w:rPr/>
-        <w:t xml:space="preserve"> the process must, so a </w:t>
-      </w:r>
-      <w:r>
-        <w:rPr>
-          <w:rStyle w:val="SourceText"/>
-        </w:rPr>
-        <w:t>/clear</w:t>
-      </w:r>
-      <w:r>
-        <w:rPr/>
-        <w:t xml:space="preserve"> in another terminal on the same worktree waits. A note written by Bash or by hand waits.</w:t>
+        <w:rPr/>
+        <w:t>This section is folded into the troubleshooting guide (</w:t>
+      </w:r>
+      <w:r>
+        <w:rPr>
+          <w:rStyle w:val="SourceText"/>
+        </w:rPr>
+        <w:t>troubleshooting.md</w:t>
+      </w:r>
+      <w:r>
+        <w:rPr/>
+        <w:t>), linked from it as "Auto wrap-up, clear and resume". It covers the cycle that lets a long session finish itself cleanly, clear, and pick up where it stopped.</w:t>
       </w:r>
     </w:p>
     <w:p>
@@ -11331,8 +11373,480 @@
         <w:jc w:val="left"/>
         <w:rPr/>
       </w:pPr>
-      <w:bookmarkStart w:id="16" w:name="turning-it-on-and-off"/>
-      <w:bookmarkEnd w:id="16"/>
+      <w:bookmarkStart w:id="17" w:name="what-the-cycle-does"/>
+      <w:bookmarkEnd w:id="17"/>
+      <w:r>
+        <w:rPr/>
+        <w:t>What the Cycle Does</w:t>
+      </w:r>
+    </w:p>
+    <w:p>
+      <w:pPr>
+        <w:pStyle w:val="BodyText"/>
+        <w:numPr>
+          <w:ilvl w:val="0"/>
+          <w:numId w:val="24"/>
+        </w:numPr>
+        <w:tabs>
+          <w:tab w:val="clear" w:pos="1134"/>
+          <w:tab w:val="left" w:pos="829" w:leader="none"/>
+        </w:tabs>
+        <w:bidi w:val="0"/>
+        <w:spacing w:before="120" w:after="0"/>
+        <w:ind w:hanging="283" w:left="829"/>
+        <w:jc w:val="left"/>
+        <w:rPr/>
+      </w:pPr>
+      <w:r>
+        <w:rPr>
+          <w:rStyle w:val="Strong"/>
+        </w:rPr>
+        <w:t>Wrap-up.</w:t>
+      </w:r>
+      <w:r>
+        <w:rPr/>
+        <w:t xml:space="preserve"> When the context window crosses its threshold, the </w:t>
+      </w:r>
+      <w:r>
+        <w:rPr>
+          <w:rStyle w:val="SourceText"/>
+        </w:rPr>
+        <w:t>Stop</w:t>
+      </w:r>
+      <w:r>
+        <w:rPr/>
+        <w:t xml:space="preserve"> hook blocks once. It asks the session to finish or park the change in flight, write </w:t>
+      </w:r>
+      <w:r>
+        <w:rPr>
+          <w:rStyle w:val="SourceText"/>
+        </w:rPr>
+        <w:t>.work/HANDOFF.md</w:t>
+      </w:r>
+      <w:r>
+        <w:rPr/>
+        <w:t xml:space="preserve">, and update the ticket. This happens once for each threshold crossing in each session. It never happens on the forced continuation that follows a block. </w:t>
+      </w:r>
+    </w:p>
+    <w:p>
+      <w:pPr>
+        <w:pStyle w:val="BodyText"/>
+        <w:numPr>
+          <w:ilvl w:val="0"/>
+          <w:numId w:val="24"/>
+        </w:numPr>
+        <w:tabs>
+          <w:tab w:val="clear" w:pos="1134"/>
+          <w:tab w:val="left" w:pos="829" w:leader="none"/>
+        </w:tabs>
+        <w:bidi w:val="0"/>
+        <w:ind w:hanging="283" w:left="829"/>
+        <w:jc w:val="left"/>
+        <w:rPr/>
+      </w:pPr>
+      <w:r>
+        <w:rPr>
+          <w:rStyle w:val="Strong"/>
+        </w:rPr>
+        <w:t>Clear, or notify.</w:t>
+      </w:r>
+      <w:r>
+        <w:rPr/>
+        <w:t xml:space="preserve"> After the handoff is written, auto-clear acts on it. What it does depends on </w:t>
+      </w:r>
+      <w:r>
+        <w:rPr>
+          <w:rStyle w:val="SourceText"/>
+        </w:rPr>
+        <w:t>method</w:t>
+      </w:r>
+      <w:r>
+        <w:rPr/>
+        <w:t xml:space="preserve"> (below): </w:t>
+      </w:r>
+      <w:r>
+        <w:rPr>
+          <w:rStyle w:val="SourceText"/>
+        </w:rPr>
+        <w:t>notify</w:t>
+      </w:r>
+      <w:r>
+        <w:rPr/>
+        <w:t xml:space="preserve"> (the default on native Windows) prints a message telling you the handoff is written and it is safe to run </w:t>
+      </w:r>
+      <w:r>
+        <w:rPr>
+          <w:rStyle w:val="SourceText"/>
+        </w:rPr>
+        <w:t>/clear</w:t>
+      </w:r>
+      <w:r>
+        <w:rPr/>
+        <w:t xml:space="preserve"> (or </w:t>
+      </w:r>
+      <w:r>
+        <w:rPr>
+          <w:rStyle w:val="SourceText"/>
+        </w:rPr>
+        <w:t>/compact</w:t>
+      </w:r>
+      <w:r>
+        <w:rPr/>
+        <w:t xml:space="preserve">) yourself — it types nothing. </w:t>
+      </w:r>
+      <w:r>
+        <w:rPr>
+          <w:rStyle w:val="SourceText"/>
+        </w:rPr>
+        <w:t>tmux</w:t>
+      </w:r>
+      <w:r>
+        <w:rPr/>
+        <w:t xml:space="preserve">, </w:t>
+      </w:r>
+      <w:r>
+        <w:rPr>
+          <w:rStyle w:val="SourceText"/>
+        </w:rPr>
+        <w:t>xdotool</w:t>
+      </w:r>
+      <w:r>
+        <w:rPr/>
+        <w:t xml:space="preserve"> and </w:t>
+      </w:r>
+      <w:r>
+        <w:rPr>
+          <w:rStyle w:val="SourceText"/>
+        </w:rPr>
+        <w:t>sendkeys</w:t>
+      </w:r>
+      <w:r>
+        <w:rPr/>
+        <w:t xml:space="preserve"> actually type the configured command into the terminal that runs this session. Whichever method is in force, it acts only when all four of these hold: - this machine opted in; - the handoff was written by this session after the wrap-up request, is longer than a stub, and is not the automatic PreCompact skeleton; - the context reading that caused the wrap-up was a real measurement (see "When it will not clear"); - for a method that types (</w:t>
+      </w:r>
+      <w:r>
+        <w:rPr>
+          <w:rStyle w:val="SourceText"/>
+        </w:rPr>
+        <w:t>tmux</w:t>
+      </w:r>
+      <w:r>
+        <w:rPr/>
+        <w:t>/</w:t>
+      </w:r>
+      <w:r>
+        <w:rPr>
+          <w:rStyle w:val="SourceText"/>
+        </w:rPr>
+        <w:t>xdotool</w:t>
+      </w:r>
+      <w:r>
+        <w:rPr/>
+        <w:t>/</w:t>
+      </w:r>
+      <w:r>
+        <w:rPr>
+          <w:rStyle w:val="SourceText"/>
+        </w:rPr>
+        <w:t>sendkeys</w:t>
+      </w:r>
+      <w:r>
+        <w:rPr/>
+        <w:t xml:space="preserve">), the target window can be identified exactly — </w:t>
+      </w:r>
+      <w:r>
+        <w:rPr>
+          <w:rStyle w:val="SourceText"/>
+        </w:rPr>
+        <w:t>notify</w:t>
+      </w:r>
+      <w:r>
+        <w:rPr/>
+        <w:t xml:space="preserve"> needs none of this, since it identifies no window. </w:t>
+      </w:r>
+    </w:p>
+    <w:p>
+      <w:pPr>
+        <w:pStyle w:val="BodyText"/>
+        <w:bidi w:val="0"/>
+        <w:jc w:val="left"/>
+        <w:rPr/>
+      </w:pPr>
+      <w:r>
+        <w:rPr>
+          <w:rStyle w:val="Strong"/>
+        </w:rPr>
+        <w:t>Crew neither causes nor tunes Claude Code's own auto-compact.</w:t>
+      </w:r>
+      <w:r>
+        <w:rPr/>
+        <w:t xml:space="preserve"> That is a separate, built-in behaviour that fires whenever Claude Code itself decides to; this cycle only reacts to a handoff once one exists, and nothing here makes auto-compact happen sooner, later, or at all. 3. </w:t>
+      </w:r>
+      <w:r>
+        <w:rPr>
+          <w:rStyle w:val="Strong"/>
+        </w:rPr>
+        <w:t>Resume.</w:t>
+      </w:r>
+      <w:r>
+        <w:rPr/>
+        <w:t xml:space="preserve"> The new session starts with the handoff and its next action already in context, within the 3,000-character resume budget. Nothing starts working unprompted: crew does not use </w:t>
+      </w:r>
+      <w:r>
+        <w:rPr>
+          <w:rStyle w:val="SourceText"/>
+        </w:rPr>
+        <w:t>initialUserMessage</w:t>
+      </w:r>
+      <w:r>
+        <w:rPr/>
+        <w:t xml:space="preserve">, so you press Enter to continue. Claude Code 2.1.282 drops it in an interactive session anyway (spike, 2026-09-25): it is honoured by </w:t>
+      </w:r>
+      <w:r>
+        <w:rPr>
+          <w:rStyle w:val="SourceText"/>
+        </w:rPr>
+        <w:t>claude -p</w:t>
+      </w:r>
+      <w:r>
+        <w:rPr/>
+        <w:t xml:space="preserve"> only.</w:t>
+      </w:r>
+    </w:p>
+    <w:p>
+      <w:pPr>
+        <w:pStyle w:val="BodyText"/>
+        <w:bidi w:val="0"/>
+        <w:jc w:val="left"/>
+        <w:rPr/>
+      </w:pPr>
+      <w:r>
+        <w:rPr/>
+        <w:t xml:space="preserve">With </w:t>
+      </w:r>
+      <w:r>
+        <w:rPr>
+          <w:rStyle w:val="SourceText"/>
+        </w:rPr>
+        <w:t>resume.auto: true</w:t>
+      </w:r>
+      <w:r>
+        <w:rPr/>
+        <w:t xml:space="preserve"> in the machine-global config, the handoff after </w:t>
+      </w:r>
+      <w:r>
+        <w:rPr>
+          <w:rStyle w:val="SourceText"/>
+        </w:rPr>
+        <w:t>/clear</w:t>
+      </w:r>
+      <w:r>
+        <w:rPr/>
+        <w:t xml:space="preserve"> or a manual </w:t>
+      </w:r>
+      <w:r>
+        <w:rPr>
+          <w:rStyle w:val="SourceText"/>
+        </w:rPr>
+        <w:t>/compact</w:t>
+      </w:r>
+      <w:r>
+        <w:rPr/>
+        <w:t xml:space="preserve"> also names the exact next command, read from the note's </w:t>
+      </w:r>
+      <w:r>
+        <w:rPr>
+          <w:rStyle w:val="SourceText"/>
+        </w:rPr>
+        <w:t>resume:</w:t>
+      </w:r>
+      <w:r>
+        <w:rPr/>
+        <w:t xml:space="preserve"> line (</w:t>
+      </w:r>
+      <w:r>
+        <w:rPr>
+          <w:rStyle w:val="SourceText"/>
+        </w:rPr>
+        <w:t>resume: /crew:done T-0001</w:t>
+      </w:r>
+      <w:r>
+        <w:rPr/>
+        <w:t xml:space="preserve">): </w:t>
+      </w:r>
+      <w:r>
+        <w:rPr>
+          <w:rStyle w:val="SourceText"/>
+        </w:rPr>
+        <w:t>Auto-resume: ready to run /crew:done T-0001.</w:t>
+      </w:r>
+      <w:r>
+        <w:rPr/>
+        <w:t xml:space="preserve"> — or </w:t>
+      </w:r>
+      <w:r>
+        <w:rPr>
+          <w:rStyle w:val="SourceText"/>
+        </w:rPr>
+        <w:t>Auto-resume did not start: &lt;reason&gt;.</w:t>
+      </w:r>
+      <w:r>
+        <w:rPr/>
+        <w:t xml:space="preserve"> when a check refuses it. It still does not start on its own: you press Enter or type it, until T-0013 types it where the terminal can be identified. The refusal reasons are: compact was not a manual /compact; no handoff note, or it was archived as stale, or is stale and could not be archived; the handoff is the automatic PreCompact skeleton; no resume line, </w:t>
+      </w:r>
+      <w:r>
+        <w:rPr>
+          <w:rStyle w:val="SourceText"/>
+        </w:rPr>
+        <w:t>resume: none</w:t>
+      </w:r>
+      <w:r>
+        <w:rPr/>
+        <w:t xml:space="preserve">, or a line the grammar refuses (a second line, trailing text, an unknown command, or an excluded one such as </w:t>
+      </w:r>
+      <w:r>
+        <w:rPr>
+          <w:rStyle w:val="SourceText"/>
+        </w:rPr>
+        <w:t>/crew:approve</w:t>
+      </w:r>
+      <w:r>
+        <w:rPr/>
+        <w:t xml:space="preserve">); the note's </w:t>
+      </w:r>
+      <w:r>
+        <w:rPr>
+          <w:rStyle w:val="SourceText"/>
+        </w:rPr>
+        <w:t>branch:</w:t>
+      </w:r>
+      <w:r>
+        <w:rPr/>
+        <w:t xml:space="preserve"> or </w:t>
+      </w:r>
+      <w:r>
+        <w:rPr>
+          <w:rStyle w:val="SourceText"/>
+        </w:rPr>
+        <w:t>head:</w:t>
+      </w:r>
+      <w:r>
+        <w:rPr/>
+        <w:t xml:space="preserve"> does not match the checkout; the ticket directory or goal file is missing; the command is not installed; </w:t>
+      </w:r>
+      <w:r>
+        <w:rPr>
+          <w:rStyle w:val="SourceText"/>
+        </w:rPr>
+        <w:t>handoff-author.json</w:t>
+      </w:r>
+      <w:r>
+        <w:rPr/>
+        <w:t xml:space="preserve"> could not be read; no record of which session wrote this handoff; the handoff changed since its author session wrote it; the handoff was written by another session; this session's process could not be identified (always on a host without </w:t>
+      </w:r>
+      <w:r>
+        <w:rPr>
+          <w:rStyle w:val="SourceText"/>
+        </w:rPr>
+        <w:t>/proc</w:t>
+      </w:r>
+      <w:r>
+        <w:rPr/>
+        <w:t>, such as native Windows or macOS); the record of past auto-resumes (</w:t>
+      </w:r>
+      <w:r>
+        <w:rPr>
+          <w:rStyle w:val="SourceText"/>
+        </w:rPr>
+        <w:t>resume-state.json</w:t>
+      </w:r>
+      <w:r>
+        <w:rPr/>
+        <w:t xml:space="preserve">) could not be read, or its directory cannot be searched; this handoff was already resumed; the progress fingerprint could not be computed; the same command with no progress since the last auto-resume; </w:t>
+      </w:r>
+      <w:r>
+        <w:rPr>
+          <w:rStyle w:val="SourceText"/>
+        </w:rPr>
+        <w:t>internal error</w:t>
+      </w:r>
+      <w:r>
+        <w:rPr/>
+        <w:t xml:space="preserve"> (the decision itself failed, and the handoff is still injected). Never on a plain </w:t>
+      </w:r>
+      <w:r>
+        <w:rPr>
+          <w:rStyle w:val="SourceText"/>
+        </w:rPr>
+        <w:t>startup</w:t>
+      </w:r>
+      <w:r>
+        <w:rPr/>
+        <w:t>.</w:t>
+      </w:r>
+    </w:p>
+    <w:p>
+      <w:pPr>
+        <w:pStyle w:val="BodyText"/>
+        <w:bidi w:val="0"/>
+        <w:jc w:val="left"/>
+        <w:rPr/>
+      </w:pPr>
+      <w:r>
+        <w:rPr/>
+        <w:t xml:space="preserve">A note resumes only in the session that wrote it. Write it with the Write tool (as </w:t>
+      </w:r>
+      <w:r>
+        <w:rPr>
+          <w:rStyle w:val="SourceText"/>
+        </w:rPr>
+        <w:t>/crew:handoff</w:t>
+      </w:r>
+      <w:r>
+        <w:rPr/>
+        <w:t xml:space="preserve"> does): the context hook then records which session and which Claude Code process wrote it. After </w:t>
+      </w:r>
+      <w:r>
+        <w:rPr>
+          <w:rStyle w:val="SourceText"/>
+        </w:rPr>
+        <w:t>/compact</w:t>
+      </w:r>
+      <w:r>
+        <w:rPr/>
+        <w:t xml:space="preserve"> the session must match; after </w:t>
+      </w:r>
+      <w:r>
+        <w:rPr>
+          <w:rStyle w:val="SourceText"/>
+        </w:rPr>
+        <w:t>/clear</w:t>
+      </w:r>
+      <w:r>
+        <w:rPr/>
+        <w:t xml:space="preserve"> the process must, so a </w:t>
+      </w:r>
+      <w:r>
+        <w:rPr>
+          <w:rStyle w:val="SourceText"/>
+        </w:rPr>
+        <w:t>/clear</w:t>
+      </w:r>
+      <w:r>
+        <w:rPr/>
+        <w:t xml:space="preserve"> in another terminal on the same worktree waits. A note written by Bash or by hand waits.</w:t>
+      </w:r>
+    </w:p>
+    <w:p>
+      <w:pPr>
+        <w:pStyle w:val="Heading3"/>
+        <w:bidi w:val="0"/>
+        <w:ind w:hanging="0" w:left="0" w:right="0"/>
+        <w:jc w:val="left"/>
+        <w:rPr/>
+      </w:pPr>
+      <w:bookmarkStart w:id="18" w:name="turning-it-on-and-off"/>
+      <w:bookmarkEnd w:id="18"/>
       <w:r>
         <w:rPr/>
         <w:t>Turning It on and Off</w:t>
@@ -12760,8 +13274,8 @@
         <w:jc w:val="left"/>
         <w:rPr/>
       </w:pPr>
-      <w:bookmarkStart w:id="17" w:name="arming-one-scratch-repo-while-other-sess"/>
-      <w:bookmarkEnd w:id="17"/>
+      <w:bookmarkStart w:id="19" w:name="arming-one-scratch-repo-while-other-sess"/>
+      <w:bookmarkEnd w:id="19"/>
       <w:r>
         <w:rPr/>
         <w:t>Arming one scratch repo while other sessions are live</w:t>
@@ -13046,7 +13560,7 @@
         <w:pStyle w:val="BodyText"/>
         <w:numPr>
           <w:ilvl w:val="0"/>
-          <w:numId w:val="23"/>
+          <w:numId w:val="25"/>
         </w:numPr>
         <w:tabs>
           <w:tab w:val="clear" w:pos="1134"/>
@@ -13088,7 +13602,7 @@
         <w:pStyle w:val="BodyText"/>
         <w:numPr>
           <w:ilvl w:val="0"/>
-          <w:numId w:val="23"/>
+          <w:numId w:val="25"/>
         </w:numPr>
         <w:tabs>
           <w:tab w:val="clear" w:pos="1134"/>
@@ -13110,7 +13624,7 @@
         <w:pStyle w:val="BodyText"/>
         <w:numPr>
           <w:ilvl w:val="0"/>
-          <w:numId w:val="23"/>
+          <w:numId w:val="25"/>
         </w:numPr>
         <w:tabs>
           <w:tab w:val="clear" w:pos="1134"/>
@@ -13162,7 +13676,7 @@
         <w:pStyle w:val="BodyText"/>
         <w:numPr>
           <w:ilvl w:val="0"/>
-          <w:numId w:val="23"/>
+          <w:numId w:val="25"/>
         </w:numPr>
         <w:tabs>
           <w:tab w:val="clear" w:pos="1134"/>
@@ -13184,7 +13698,7 @@
         <w:pStyle w:val="BodyText"/>
         <w:numPr>
           <w:ilvl w:val="0"/>
-          <w:numId w:val="23"/>
+          <w:numId w:val="25"/>
         </w:numPr>
         <w:tabs>
           <w:tab w:val="clear" w:pos="1134"/>
@@ -13236,7 +13750,7 @@
         <w:pStyle w:val="BodyText"/>
         <w:numPr>
           <w:ilvl w:val="0"/>
-          <w:numId w:val="23"/>
+          <w:numId w:val="25"/>
         </w:numPr>
         <w:tabs>
           <w:tab w:val="clear" w:pos="1134"/>
@@ -13492,8 +14006,8 @@
         <w:jc w:val="left"/>
         <w:rPr/>
       </w:pPr>
-      <w:bookmarkStart w:id="18" w:name="which-method-and-what-it-does"/>
-      <w:bookmarkEnd w:id="18"/>
+      <w:bookmarkStart w:id="20" w:name="which-method-and-what-it-does"/>
+      <w:bookmarkEnd w:id="20"/>
       <w:r>
         <w:rPr/>
         <w:t>Which Method, and What It Does</w:t>
@@ -14075,8 +14589,8 @@
         <w:jc w:val="left"/>
         <w:rPr/>
       </w:pPr>
-      <w:bookmarkStart w:id="19" w:name="when-it-will-not-clear-or-notify"/>
-      <w:bookmarkEnd w:id="19"/>
+      <w:bookmarkStart w:id="21" w:name="when-it-will-not-clear-or-notify"/>
+      <w:bookmarkEnd w:id="21"/>
       <w:r>
         <w:rPr/>
         <w:t>When It Will Not Clear (or Notify)</w:t>
@@ -14944,8 +15458,8 @@
         <w:jc w:val="left"/>
         <w:rPr/>
       </w:pPr>
-      <w:bookmarkStart w:id="20" w:name="which-window-gets-the-keystroke"/>
-      <w:bookmarkEnd w:id="20"/>
+      <w:bookmarkStart w:id="22" w:name="which-window-gets-the-keystroke"/>
+      <w:bookmarkEnd w:id="22"/>
       <w:r>
         <w:rPr/>
         <w:t>Which Window Gets the Keystroke</w:t>
@@ -15008,7 +15522,7 @@
         <w:pStyle w:val="BodyText"/>
         <w:numPr>
           <w:ilvl w:val="0"/>
-          <w:numId w:val="24"/>
+          <w:numId w:val="26"/>
         </w:numPr>
         <w:tabs>
           <w:tab w:val="clear" w:pos="1134"/>
@@ -15046,7 +15560,7 @@
         <w:pStyle w:val="BodyText"/>
         <w:numPr>
           <w:ilvl w:val="0"/>
-          <w:numId w:val="24"/>
+          <w:numId w:val="26"/>
         </w:numPr>
         <w:tabs>
           <w:tab w:val="clear" w:pos="1134"/>
@@ -15106,7 +15620,7 @@
         <w:pStyle w:val="BodyText"/>
         <w:numPr>
           <w:ilvl w:val="0"/>
-          <w:numId w:val="24"/>
+          <w:numId w:val="26"/>
         </w:numPr>
         <w:tabs>
           <w:tab w:val="clear" w:pos="1134"/>
@@ -18058,8 +18572,8 @@
   <w:abstractNum w:abstractNumId="22">
     <w:lvl w:ilvl="0">
       <w:start w:val="1"/>
-      <w:numFmt w:val="decimal"/>
-      <w:lvlText w:val="%1."/>
+      <w:numFmt w:val="bullet"/>
+      <w:lvlText w:val=""/>
       <w:lvlJc w:val="left"/>
       <w:pPr>
         <w:tabs>
@@ -18067,12 +18581,14 @@
         </w:tabs>
         <w:ind w:left="709" w:hanging="283"/>
       </w:pPr>
-      <w:rPr/>
+      <w:rPr>
+        <w:rFonts w:ascii="Symbol" w:hAnsi="Symbol" w:cs="Symbol" w:hint="default"/>
+      </w:rPr>
     </w:lvl>
     <w:lvl w:ilvl="1">
       <w:start w:val="1"/>
-      <w:numFmt w:val="decimal"/>
-      <w:lvlText w:val="%2."/>
+      <w:numFmt w:val="bullet"/>
+      <w:lvlText w:val=""/>
       <w:lvlJc w:val="left"/>
       <w:pPr>
         <w:tabs>
@@ -18080,12 +18596,14 @@
         </w:tabs>
         <w:ind w:left="1418" w:hanging="283"/>
       </w:pPr>
-      <w:rPr/>
+      <w:rPr>
+        <w:rFonts w:ascii="Symbol" w:hAnsi="Symbol" w:cs="Symbol" w:hint="default"/>
+      </w:rPr>
     </w:lvl>
     <w:lvl w:ilvl="2">
       <w:start w:val="1"/>
-      <w:numFmt w:val="decimal"/>
-      <w:lvlText w:val="%3."/>
+      <w:numFmt w:val="bullet"/>
+      <w:lvlText w:val=""/>
       <w:lvlJc w:val="left"/>
       <w:pPr>
         <w:tabs>
@@ -18093,12 +18611,14 @@
         </w:tabs>
         <w:ind w:left="2127" w:hanging="283"/>
       </w:pPr>
-      <w:rPr/>
+      <w:rPr>
+        <w:rFonts w:ascii="Symbol" w:hAnsi="Symbol" w:cs="Symbol" w:hint="default"/>
+      </w:rPr>
     </w:lvl>
     <w:lvl w:ilvl="3">
       <w:start w:val="1"/>
-      <w:numFmt w:val="decimal"/>
-      <w:lvlText w:val="%4."/>
+      <w:numFmt w:val="bullet"/>
+      <w:lvlText w:val=""/>
       <w:lvlJc w:val="left"/>
       <w:pPr>
         <w:tabs>
@@ -18106,12 +18626,14 @@
         </w:tabs>
         <w:ind w:left="2836" w:hanging="283"/>
       </w:pPr>
-      <w:rPr/>
+      <w:rPr>
+        <w:rFonts w:ascii="Symbol" w:hAnsi="Symbol" w:cs="Symbol" w:hint="default"/>
+      </w:rPr>
     </w:lvl>
     <w:lvl w:ilvl="4">
       <w:start w:val="1"/>
-      <w:numFmt w:val="decimal"/>
-      <w:lvlText w:val="%5."/>
+      <w:numFmt w:val="bullet"/>
+      <w:lvlText w:val=""/>
       <w:lvlJc w:val="left"/>
       <w:pPr>
         <w:tabs>
@@ -18119,12 +18641,14 @@
         </w:tabs>
         <w:ind w:left="3545" w:hanging="283"/>
       </w:pPr>
-      <w:rPr/>
+      <w:rPr>
+        <w:rFonts w:ascii="Symbol" w:hAnsi="Symbol" w:cs="Symbol" w:hint="default"/>
+      </w:rPr>
     </w:lvl>
     <w:lvl w:ilvl="5">
       <w:start w:val="1"/>
-      <w:numFmt w:val="decimal"/>
-      <w:lvlText w:val="%6."/>
+      <w:numFmt w:val="bullet"/>
+      <w:lvlText w:val=""/>
       <w:lvlJc w:val="left"/>
       <w:pPr>
         <w:tabs>
@@ -18132,12 +18656,14 @@
         </w:tabs>
         <w:ind w:left="4254" w:hanging="283"/>
       </w:pPr>
-      <w:rPr/>
+      <w:rPr>
+        <w:rFonts w:ascii="Symbol" w:hAnsi="Symbol" w:cs="Symbol" w:hint="default"/>
+      </w:rPr>
     </w:lvl>
     <w:lvl w:ilvl="6">
       <w:start w:val="1"/>
-      <w:numFmt w:val="decimal"/>
-      <w:lvlText w:val="%7."/>
+      <w:numFmt w:val="bullet"/>
+      <w:lvlText w:val=""/>
       <w:lvlJc w:val="left"/>
       <w:pPr>
         <w:tabs>
@@ -18145,12 +18671,14 @@
         </w:tabs>
         <w:ind w:left="4963" w:hanging="283"/>
       </w:pPr>
-      <w:rPr/>
+      <w:rPr>
+        <w:rFonts w:ascii="Symbol" w:hAnsi="Symbol" w:cs="Symbol" w:hint="default"/>
+      </w:rPr>
     </w:lvl>
     <w:lvl w:ilvl="7">
       <w:start w:val="1"/>
-      <w:numFmt w:val="decimal"/>
-      <w:lvlText w:val="%8."/>
+      <w:numFmt w:val="bullet"/>
+      <w:lvlText w:val=""/>
       <w:lvlJc w:val="left"/>
       <w:pPr>
         <w:tabs>
@@ -18158,12 +18686,14 @@
         </w:tabs>
         <w:ind w:left="5672" w:hanging="283"/>
       </w:pPr>
-      <w:rPr/>
+      <w:rPr>
+        <w:rFonts w:ascii="Symbol" w:hAnsi="Symbol" w:cs="Symbol" w:hint="default"/>
+      </w:rPr>
     </w:lvl>
     <w:lvl w:ilvl="8">
       <w:start w:val="1"/>
-      <w:numFmt w:val="decimal"/>
-      <w:lvlText w:val="%9."/>
+      <w:numFmt w:val="bullet"/>
+      <w:lvlText w:val=""/>
       <w:lvlJc w:val="left"/>
       <w:pPr>
         <w:tabs>
@@ -18171,7 +18701,9 @@
         </w:tabs>
         <w:ind w:left="6381" w:hanging="283"/>
       </w:pPr>
-      <w:rPr/>
+      <w:rPr>
+        <w:rFonts w:ascii="Symbol" w:hAnsi="Symbol" w:cs="Symbol" w:hint="default"/>
+      </w:rPr>
     </w:lvl>
   </w:abstractNum>
   <w:abstractNum w:abstractNumId="23">
@@ -18314,8 +18846,8 @@
   <w:abstractNum w:abstractNumId="24">
     <w:lvl w:ilvl="0">
       <w:start w:val="1"/>
-      <w:numFmt w:val="bullet"/>
-      <w:lvlText w:val=""/>
+      <w:numFmt w:val="decimal"/>
+      <w:lvlText w:val="%1."/>
       <w:lvlJc w:val="left"/>
       <w:pPr>
         <w:tabs>
@@ -18323,14 +18855,12 @@
         </w:tabs>
         <w:ind w:left="709" w:hanging="283"/>
       </w:pPr>
-      <w:rPr>
-        <w:rFonts w:ascii="Symbol" w:hAnsi="Symbol" w:cs="Symbol" w:hint="default"/>
-      </w:rPr>
+      <w:rPr/>
     </w:lvl>
     <w:lvl w:ilvl="1">
       <w:start w:val="1"/>
-      <w:numFmt w:val="bullet"/>
-      <w:lvlText w:val=""/>
+      <w:numFmt w:val="decimal"/>
+      <w:lvlText w:val="%2."/>
       <w:lvlJc w:val="left"/>
       <w:pPr>
         <w:tabs>
@@ -18338,14 +18868,12 @@
         </w:tabs>
         <w:ind w:left="1418" w:hanging="283"/>
       </w:pPr>
-      <w:rPr>
-        <w:rFonts w:ascii="Symbol" w:hAnsi="Symbol" w:cs="Symbol" w:hint="default"/>
-      </w:rPr>
+      <w:rPr/>
     </w:lvl>
     <w:lvl w:ilvl="2">
       <w:start w:val="1"/>
-      <w:numFmt w:val="bullet"/>
-      <w:lvlText w:val=""/>
+      <w:numFmt w:val="decimal"/>
+      <w:lvlText w:val="%3."/>
       <w:lvlJc w:val="left"/>
       <w:pPr>
         <w:tabs>
@@ -18353,14 +18881,12 @@
         </w:tabs>
         <w:ind w:left="2127" w:hanging="283"/>
       </w:pPr>
-      <w:rPr>
-        <w:rFonts w:ascii="Symbol" w:hAnsi="Symbol" w:cs="Symbol" w:hint="default"/>
-      </w:rPr>
+      <w:rPr/>
     </w:lvl>
     <w:lvl w:ilvl="3">
       <w:start w:val="1"/>
-      <w:numFmt w:val="bullet"/>
-      <w:lvlText w:val=""/>
+      <w:numFmt w:val="decimal"/>
+      <w:lvlText w:val="%4."/>
       <w:lvlJc w:val="left"/>
       <w:pPr>
         <w:tabs>
@@ -18368,14 +18894,12 @@
         </w:tabs>
         <w:ind w:left="2836" w:hanging="283"/>
       </w:pPr>
-      <w:rPr>
-        <w:rFonts w:ascii="Symbol" w:hAnsi="Symbol" w:cs="Symbol" w:hint="default"/>
-      </w:rPr>
+      <w:rPr/>
     </w:lvl>
     <w:lvl w:ilvl="4">
       <w:start w:val="1"/>
-      <w:numFmt w:val="bullet"/>
-      <w:lvlText w:val=""/>
+      <w:numFmt w:val="decimal"/>
+      <w:lvlText w:val="%5."/>
       <w:lvlJc w:val="left"/>
       <w:pPr>
         <w:tabs>
@@ -18383,14 +18907,12 @@
         </w:tabs>
         <w:ind w:left="3545" w:hanging="283"/>
       </w:pPr>
-      <w:rPr>
-        <w:rFonts w:ascii="Symbol" w:hAnsi="Symbol" w:cs="Symbol" w:hint="default"/>
-      </w:rPr>
+      <w:rPr/>
     </w:lvl>
     <w:lvl w:ilvl="5">
       <w:start w:val="1"/>
-      <w:numFmt w:val="bullet"/>
-      <w:lvlText w:val=""/>
+      <w:numFmt w:val="decimal"/>
+      <w:lvlText w:val="%6."/>
       <w:lvlJc w:val="left"/>
       <w:pPr>
         <w:tabs>
@@ -18398,14 +18920,12 @@
         </w:tabs>
         <w:ind w:left="4254" w:hanging="283"/>
       </w:pPr>
-      <w:rPr>
-        <w:rFonts w:ascii="Symbol" w:hAnsi="Symbol" w:cs="Symbol" w:hint="default"/>
-      </w:rPr>
+      <w:rPr/>
     </w:lvl>
     <w:lvl w:ilvl="6">
       <w:start w:val="1"/>
-      <w:numFmt w:val="bullet"/>
-      <w:lvlText w:val=""/>
+      <w:numFmt w:val="decimal"/>
+      <w:lvlText w:val="%7."/>
       <w:lvlJc w:val="left"/>
       <w:pPr>
         <w:tabs>
@@ -18413,14 +18933,12 @@
         </w:tabs>
         <w:ind w:left="4963" w:hanging="283"/>
       </w:pPr>
-      <w:rPr>
-        <w:rFonts w:ascii="Symbol" w:hAnsi="Symbol" w:cs="Symbol" w:hint="default"/>
-      </w:rPr>
+      <w:rPr/>
     </w:lvl>
     <w:lvl w:ilvl="7">
       <w:start w:val="1"/>
-      <w:numFmt w:val="bullet"/>
-      <w:lvlText w:val=""/>
+      <w:numFmt w:val="decimal"/>
+      <w:lvlText w:val="%8."/>
       <w:lvlJc w:val="left"/>
       <w:pPr>
         <w:tabs>
@@ -18428,14 +18946,12 @@
         </w:tabs>
         <w:ind w:left="5672" w:hanging="283"/>
       </w:pPr>
-      <w:rPr>
-        <w:rFonts w:ascii="Symbol" w:hAnsi="Symbol" w:cs="Symbol" w:hint="default"/>
-      </w:rPr>
+      <w:rPr/>
     </w:lvl>
     <w:lvl w:ilvl="8">
       <w:start w:val="1"/>
-      <w:numFmt w:val="bullet"/>
-      <w:lvlText w:val=""/>
+      <w:numFmt w:val="decimal"/>
+      <w:lvlText w:val="%9."/>
       <w:lvlJc w:val="left"/>
       <w:pPr>
         <w:tabs>
@@ -18443,12 +18959,284 @@
         </w:tabs>
         <w:ind w:left="6381" w:hanging="283"/>
       </w:pPr>
-      <w:rPr>
-        <w:rFonts w:ascii="Symbol" w:hAnsi="Symbol" w:cs="Symbol" w:hint="default"/>
-      </w:rPr>
+      <w:rPr/>
     </w:lvl>
   </w:abstractNum>
   <w:abstractNum w:abstractNumId="25">
+    <w:lvl w:ilvl="0">
+      <w:start w:val="1"/>
+      <w:numFmt w:val="bullet"/>
+      <w:lvlText w:val=""/>
+      <w:lvlJc w:val="left"/>
+      <w:pPr>
+        <w:tabs>
+          <w:tab w:val="num" w:pos="709"/>
+        </w:tabs>
+        <w:ind w:left="709" w:hanging="283"/>
+      </w:pPr>
+      <w:rPr>
+        <w:rFonts w:ascii="Symbol" w:hAnsi="Symbol" w:cs="Symbol" w:hint="default"/>
+      </w:rPr>
+    </w:lvl>
+    <w:lvl w:ilvl="1">
+      <w:start w:val="1"/>
+      <w:numFmt w:val="bullet"/>
+      <w:lvlText w:val=""/>
+      <w:lvlJc w:val="left"/>
+      <w:pPr>
+        <w:tabs>
+          <w:tab w:val="num" w:pos="1418"/>
+        </w:tabs>
+        <w:ind w:left="1418" w:hanging="283"/>
+      </w:pPr>
+      <w:rPr>
+        <w:rFonts w:ascii="Symbol" w:hAnsi="Symbol" w:cs="Symbol" w:hint="default"/>
+      </w:rPr>
+    </w:lvl>
+    <w:lvl w:ilvl="2">
+      <w:start w:val="1"/>
+      <w:numFmt w:val="bullet"/>
+      <w:lvlText w:val=""/>
+      <w:lvlJc w:val="left"/>
+      <w:pPr>
+        <w:tabs>
+          <w:tab w:val="num" w:pos="2127"/>
+        </w:tabs>
+        <w:ind w:left="2127" w:hanging="283"/>
+      </w:pPr>
+      <w:rPr>
+        <w:rFonts w:ascii="Symbol" w:hAnsi="Symbol" w:cs="Symbol" w:hint="default"/>
+      </w:rPr>
+    </w:lvl>
+    <w:lvl w:ilvl="3">
+      <w:start w:val="1"/>
+      <w:numFmt w:val="bullet"/>
+      <w:lvlText w:val=""/>
+      <w:lvlJc w:val="left"/>
+      <w:pPr>
+        <w:tabs>
+          <w:tab w:val="num" w:pos="2836"/>
+        </w:tabs>
+        <w:ind w:left="2836" w:hanging="283"/>
+      </w:pPr>
+      <w:rPr>
+        <w:rFonts w:ascii="Symbol" w:hAnsi="Symbol" w:cs="Symbol" w:hint="default"/>
+      </w:rPr>
+    </w:lvl>
+    <w:lvl w:ilvl="4">
+      <w:start w:val="1"/>
+      <w:numFmt w:val="bullet"/>
+      <w:lvlText w:val=""/>
+      <w:lvlJc w:val="left"/>
+      <w:pPr>
+        <w:tabs>
+          <w:tab w:val="num" w:pos="3545"/>
+        </w:tabs>
+        <w:ind w:left="3545" w:hanging="283"/>
+      </w:pPr>
+      <w:rPr>
+        <w:rFonts w:ascii="Symbol" w:hAnsi="Symbol" w:cs="Symbol" w:hint="default"/>
+      </w:rPr>
+    </w:lvl>
+    <w:lvl w:ilvl="5">
+      <w:start w:val="1"/>
+      <w:numFmt w:val="bullet"/>
+      <w:lvlText w:val=""/>
+      <w:lvlJc w:val="left"/>
+      <w:pPr>
+        <w:tabs>
+          <w:tab w:val="num" w:pos="4254"/>
+        </w:tabs>
+        <w:ind w:left="4254" w:hanging="283"/>
+      </w:pPr>
+      <w:rPr>
+        <w:rFonts w:ascii="Symbol" w:hAnsi="Symbol" w:cs="Symbol" w:hint="default"/>
+      </w:rPr>
+    </w:lvl>
+    <w:lvl w:ilvl="6">
+      <w:start w:val="1"/>
+      <w:numFmt w:val="bullet"/>
+      <w:lvlText w:val=""/>
+      <w:lvlJc w:val="left"/>
+      <w:pPr>
+        <w:tabs>
+          <w:tab w:val="num" w:pos="4963"/>
+        </w:tabs>
+        <w:ind w:left="4963" w:hanging="283"/>
+      </w:pPr>
+      <w:rPr>
+        <w:rFonts w:ascii="Symbol" w:hAnsi="Symbol" w:cs="Symbol" w:hint="default"/>
+      </w:rPr>
+    </w:lvl>
+    <w:lvl w:ilvl="7">
+      <w:start w:val="1"/>
+      <w:numFmt w:val="bullet"/>
+      <w:lvlText w:val=""/>
+      <w:lvlJc w:val="left"/>
+      <w:pPr>
+        <w:tabs>
+          <w:tab w:val="num" w:pos="5672"/>
+        </w:tabs>
+        <w:ind w:left="5672" w:hanging="283"/>
+      </w:pPr>
+      <w:rPr>
+        <w:rFonts w:ascii="Symbol" w:hAnsi="Symbol" w:cs="Symbol" w:hint="default"/>
+      </w:rPr>
+    </w:lvl>
+    <w:lvl w:ilvl="8">
+      <w:start w:val="1"/>
+      <w:numFmt w:val="bullet"/>
+      <w:lvlText w:val=""/>
+      <w:lvlJc w:val="left"/>
+      <w:pPr>
+        <w:tabs>
+          <w:tab w:val="num" w:pos="6381"/>
+        </w:tabs>
+        <w:ind w:left="6381" w:hanging="283"/>
+      </w:pPr>
+      <w:rPr>
+        <w:rFonts w:ascii="Symbol" w:hAnsi="Symbol" w:cs="Symbol" w:hint="default"/>
+      </w:rPr>
+    </w:lvl>
+  </w:abstractNum>
+  <w:abstractNum w:abstractNumId="26">
+    <w:lvl w:ilvl="0">
+      <w:start w:val="1"/>
+      <w:numFmt w:val="bullet"/>
+      <w:lvlText w:val=""/>
+      <w:lvlJc w:val="left"/>
+      <w:pPr>
+        <w:tabs>
+          <w:tab w:val="num" w:pos="709"/>
+        </w:tabs>
+        <w:ind w:left="709" w:hanging="283"/>
+      </w:pPr>
+      <w:rPr>
+        <w:rFonts w:ascii="Symbol" w:hAnsi="Symbol" w:cs="Symbol" w:hint="default"/>
+      </w:rPr>
+    </w:lvl>
+    <w:lvl w:ilvl="1">
+      <w:start w:val="1"/>
+      <w:numFmt w:val="bullet"/>
+      <w:lvlText w:val=""/>
+      <w:lvlJc w:val="left"/>
+      <w:pPr>
+        <w:tabs>
+          <w:tab w:val="num" w:pos="1418"/>
+        </w:tabs>
+        <w:ind w:left="1418" w:hanging="283"/>
+      </w:pPr>
+      <w:rPr>
+        <w:rFonts w:ascii="Symbol" w:hAnsi="Symbol" w:cs="Symbol" w:hint="default"/>
+      </w:rPr>
+    </w:lvl>
+    <w:lvl w:ilvl="2">
+      <w:start w:val="1"/>
+      <w:numFmt w:val="bullet"/>
+      <w:lvlText w:val=""/>
+      <w:lvlJc w:val="left"/>
+      <w:pPr>
+        <w:tabs>
+          <w:tab w:val="num" w:pos="2127"/>
+        </w:tabs>
+        <w:ind w:left="2127" w:hanging="283"/>
+      </w:pPr>
+      <w:rPr>
+        <w:rFonts w:ascii="Symbol" w:hAnsi="Symbol" w:cs="Symbol" w:hint="default"/>
+      </w:rPr>
+    </w:lvl>
+    <w:lvl w:ilvl="3">
+      <w:start w:val="1"/>
+      <w:numFmt w:val="bullet"/>
+      <w:lvlText w:val=""/>
+      <w:lvlJc w:val="left"/>
+      <w:pPr>
+        <w:tabs>
+          <w:tab w:val="num" w:pos="2836"/>
+        </w:tabs>
+        <w:ind w:left="2836" w:hanging="283"/>
+      </w:pPr>
+      <w:rPr>
+        <w:rFonts w:ascii="Symbol" w:hAnsi="Symbol" w:cs="Symbol" w:hint="default"/>
+      </w:rPr>
+    </w:lvl>
+    <w:lvl w:ilvl="4">
+      <w:start w:val="1"/>
+      <w:numFmt w:val="bullet"/>
+      <w:lvlText w:val=""/>
+      <w:lvlJc w:val="left"/>
+      <w:pPr>
+        <w:tabs>
+          <w:tab w:val="num" w:pos="3545"/>
+        </w:tabs>
+        <w:ind w:left="3545" w:hanging="283"/>
+      </w:pPr>
+      <w:rPr>
+        <w:rFonts w:ascii="Symbol" w:hAnsi="Symbol" w:cs="Symbol" w:hint="default"/>
+      </w:rPr>
+    </w:lvl>
+    <w:lvl w:ilvl="5">
+      <w:start w:val="1"/>
+      <w:numFmt w:val="bullet"/>
+      <w:lvlText w:val=""/>
+      <w:lvlJc w:val="left"/>
+      <w:pPr>
+        <w:tabs>
+          <w:tab w:val="num" w:pos="4254"/>
+        </w:tabs>
+        <w:ind w:left="4254" w:hanging="283"/>
+      </w:pPr>
+      <w:rPr>
+        <w:rFonts w:ascii="Symbol" w:hAnsi="Symbol" w:cs="Symbol" w:hint="default"/>
+      </w:rPr>
+    </w:lvl>
+    <w:lvl w:ilvl="6">
+      <w:start w:val="1"/>
+      <w:numFmt w:val="bullet"/>
+      <w:lvlText w:val=""/>
+      <w:lvlJc w:val="left"/>
+      <w:pPr>
+        <w:tabs>
+          <w:tab w:val="num" w:pos="4963"/>
+        </w:tabs>
+        <w:ind w:left="4963" w:hanging="283"/>
+      </w:pPr>
+      <w:rPr>
+        <w:rFonts w:ascii="Symbol" w:hAnsi="Symbol" w:cs="Symbol" w:hint="default"/>
+      </w:rPr>
+    </w:lvl>
+    <w:lvl w:ilvl="7">
+      <w:start w:val="1"/>
+      <w:numFmt w:val="bullet"/>
+      <w:lvlText w:val=""/>
+      <w:lvlJc w:val="left"/>
+      <w:pPr>
+        <w:tabs>
+          <w:tab w:val="num" w:pos="5672"/>
+        </w:tabs>
+        <w:ind w:left="5672" w:hanging="283"/>
+      </w:pPr>
+      <w:rPr>
+        <w:rFonts w:ascii="Symbol" w:hAnsi="Symbol" w:cs="Symbol" w:hint="default"/>
+      </w:rPr>
+    </w:lvl>
+    <w:lvl w:ilvl="8">
+      <w:start w:val="1"/>
+      <w:numFmt w:val="bullet"/>
+      <w:lvlText w:val=""/>
+      <w:lvlJc w:val="left"/>
+      <w:pPr>
+        <w:tabs>
+          <w:tab w:val="num" w:pos="6381"/>
+        </w:tabs>
+        <w:ind w:left="6381" w:hanging="283"/>
+      </w:pPr>
+      <w:rPr>
+        <w:rFonts w:ascii="Symbol" w:hAnsi="Symbol" w:cs="Symbol" w:hint="default"/>
+      </w:rPr>
+    </w:lvl>
+  </w:abstractNum>
+  <w:abstractNum w:abstractNumId="27">
     <w:lvl w:ilvl="0">
       <w:start w:val="1"/>
       <w:numFmt w:val="none"/>
@@ -18644,6 +19432,12 @@
   </w:num>
   <w:num w:numId="25">
     <w:abstractNumId w:val="25"/>
+  </w:num>
+  <w:num w:numId="26">
+    <w:abstractNumId w:val="26"/>
+  </w:num>
+  <w:num w:numId="27">
+    <w:abstractNumId w:val="27"/>
   </w:num>
 </w:numbering>
 </file>

</xml_diff>

<commit_message>
T-0065: per-test TMPDIR beside tmp_path, not inside it; keep rule-36 anchor unique; guide names no missing script
A tmp subdirectory inside tmp_path failed twelve tests that assert exactly
what their tmp_path holds (the reason the XDG cache is made beside it too).
The verify_agents rule's run line ended with the sabotage anchor
' plugin/crew/tests/test_status.py -q"]', which must occur once.
test_troubleshooting_guide requires every script the guide names to exist
under hooks/scripts.

Claude-Session: https://claude.ai/code/session_01YVvVmFJquzLKR26dG6oSQS
</commit_message>
<xml_diff>
--- a/docs/guides/crew/crew-1.0-troubleshooting.docx
+++ b/docs/guides/crew/crew-1.0-troubleshooting.docx
@@ -8587,17 +8587,7 @@
       </w:r>
       <w:r>
         <w:rPr/>
-        <w:t xml:space="preserve"> fixture directories from </w:t>
-      </w:r>
-      <w:r>
-        <w:rPr>
-          <w:rStyle w:val="SourceText"/>
-        </w:rPr>
-        <w:t>hooks/scripts/_test/run-tests.sh</w:t>
-      </w:r>
-      <w:r>
-        <w:rPr/>
-        <w:t xml:space="preserve">. Enough of them exhaust the inodes, and the guard and the Stop verify-gate then fail closed. Now every crew test runs with its own </w:t>
+        <w:t xml:space="preserve"> fixture directories from crew's shell regression suite. Enough of them exhaust the inodes, and the guard and the Stop verify-gate then fail closed. Now every crew test runs with its own </w:t>
       </w:r>
       <w:r>
         <w:rPr>
@@ -8607,17 +8597,7 @@
       </w:r>
       <w:r>
         <w:rPr/>
-        <w:t xml:space="preserve">, the sender deletes itself before it sleeps, and </w:t>
-      </w:r>
-      <w:r>
-        <w:rPr>
-          <w:rStyle w:val="SourceText"/>
-        </w:rPr>
-        <w:t>run-tests.sh</w:t>
-      </w:r>
-      <w:r>
-        <w:rPr/>
-        <w:t xml:space="preserve"> removes every fixture it makes.</w:t>
+        <w:t>, the sender deletes itself before it sleeps, and the shell suite removes every fixture it makes.</w:t>
       </w:r>
     </w:p>
     <w:p>
@@ -8788,17 +8768,7 @@
       </w:pPr>
       <w:r>
         <w:rPr/>
-        <w:t xml:space="preserve">Old </w:t>
-      </w:r>
-      <w:r>
-        <w:rPr>
-          <w:rStyle w:val="SourceText"/>
-        </w:rPr>
-        <w:t>run-tests.sh</w:t>
-      </w:r>
-      <w:r>
-        <w:rPr/>
-        <w:t xml:space="preserve"> fixture directories are ordinary </w:t>
+        <w:t xml:space="preserve">Old shell-suite fixture directories are ordinary </w:t>
       </w:r>
       <w:r>
         <w:rPr>

</xml_diff>

<commit_message>
T-0063: name 1.0.334 as the arrival version in the codemap, crew README and troubleshooting guide; codemap version note lists 1.0.323/1.0.329 as earlier allocations; troubleshooting guide rebuilt (also picks up main's auto-cycle.md)
Claude-Session: https://claude.ai/code/session_01YVvVmFJquzLKR26dG6oSQS
</commit_message>
<xml_diff>
--- a/docs/guides/crew/crew-1.0-troubleshooting.docx
+++ b/docs/guides/crew/crew-1.0-troubleshooting.docx
@@ -5817,7 +5817,7 @@
       </w:r>
       <w:r>
         <w:rPr/>
-        <w:t xml:space="preserve"> row in the checkout it runs in, and — since crew 1.0.329 — in the main checkout (the first record of </w:t>
+        <w:t xml:space="preserve"> row in the checkout it runs in, and — since crew 1.0.334 — in the main checkout (the first record of </w:t>
       </w:r>
       <w:r>
         <w:rPr>
@@ -11545,7 +11545,7 @@
       </w:r>
       <w:r>
         <w:rPr/>
-        <w:t xml:space="preserve"> when a check refuses it. It still does not start on its own: you press Enter or type it, until T-0013 types it where the terminal can be identified. The refusal reasons are: compact was not a manual /compact; no handoff note, or it was archived as stale, or is stale and could not be archived; the handoff is the automatic PreCompact skeleton; no resume line, </w:t>
+        <w:t xml:space="preserve"> when a check refuses it. It does not start from the hook: you press Enter or type it, or crew types it where the terminal can be identified (below). The refusal reasons are: compact was not a manual /compact; no handoff note, or it was archived as stale, or is stale and could not be archived; the handoff is the automatic PreCompact skeleton; no resume line, </w:t>
       </w:r>
       <w:r>
         <w:rPr>
@@ -11636,6 +11636,164 @@
       <w:r>
         <w:rPr/>
         <w:t>.</w:t>
+      </w:r>
+    </w:p>
+    <w:p>
+      <w:pPr>
+        <w:pStyle w:val="BodyText"/>
+        <w:bidi w:val="0"/>
+        <w:jc w:val="left"/>
+        <w:rPr/>
+      </w:pPr>
+      <w:r>
+        <w:rPr>
+          <w:rStyle w:val="Strong"/>
+        </w:rPr>
+        <w:t>Crew types it where it can (T-0013).</w:t>
+      </w:r>
+      <w:r>
+        <w:rPr/>
+        <w:t xml:space="preserve"> The context hook runs its own flavour's </w:t>
+      </w:r>
+      <w:r>
+        <w:rPr>
+          <w:rStyle w:val="SourceText"/>
+        </w:rPr>
+        <w:t>auto-clear</w:t>
+      </w:r>
+      <w:r>
+        <w:rPr/>
+        <w:t xml:space="preserve"> sender in resume mode. Consent is </w:t>
+      </w:r>
+      <w:r>
+        <w:rPr>
+          <w:rStyle w:val="SourceText"/>
+        </w:rPr>
+        <w:t>resume.auto</w:t>
+      </w:r>
+      <w:r>
+        <w:rPr/>
+        <w:t xml:space="preserve">; </w:t>
+      </w:r>
+      <w:r>
+        <w:rPr>
+          <w:rStyle w:val="SourceText"/>
+        </w:rPr>
+        <w:t>context.autoClear</w:t>
+      </w:r>
+      <w:r>
+        <w:rPr/>
+        <w:t xml:space="preserve"> only describes the terminal. In tmux it waits </w:t>
+      </w:r>
+      <w:r>
+        <w:rPr>
+          <w:rStyle w:val="SourceText"/>
+        </w:rPr>
+        <w:t>resume.typeDelaySeconds</w:t>
+      </w:r>
+      <w:r>
+        <w:rPr/>
+        <w:t xml:space="preserve"> (default 2), polls the pane for an idle, empty input line for up to </w:t>
+      </w:r>
+      <w:r>
+        <w:rPr>
+          <w:rStyle w:val="SourceText"/>
+        </w:rPr>
+        <w:t>resume.readyTimeoutSeconds</w:t>
+      </w:r>
+      <w:r>
+        <w:rPr/>
+        <w:t xml:space="preserve"> (default 15), then sends the command and, half a second later, Enter. On native Windows it types only under an explicit </w:t>
+      </w:r>
+      <w:r>
+        <w:rPr>
+          <w:rStyle w:val="SourceText"/>
+        </w:rPr>
+        <w:t>method: sendkeys</w:t>
+      </w:r>
+      <w:r>
+        <w:rPr/>
+        <w:t xml:space="preserve">, after the delay, with the focus and tab rechecks; </w:t>
+      </w:r>
+      <w:r>
+        <w:rPr>
+          <w:rStyle w:val="SourceText"/>
+        </w:rPr>
+        <w:t>auto</w:t>
+      </w:r>
+      <w:r>
+        <w:rPr/>
+        <w:t xml:space="preserve"> there types nothing. It types once per handoff (a marker under </w:t>
+      </w:r>
+      <w:r>
+        <w:rPr>
+          <w:rStyle w:val="SourceText"/>
+        </w:rPr>
+        <w:t>&lt;git-common-dir&gt;/crew/</w:t>
+      </w:r>
+      <w:r>
+        <w:rPr/>
+        <w:t xml:space="preserve">) and records the run first, so a run that could not be recorded is never typed. The context then says </w:t>
+      </w:r>
+      <w:r>
+        <w:rPr>
+          <w:rStyle w:val="SourceText"/>
+        </w:rPr>
+        <w:t>Auto-resume: typing /crew:done T-0001 into this session in 2s (method tmux)</w:t>
+      </w:r>
+      <w:r>
+        <w:rPr/>
+        <w:t xml:space="preserve">, or keeps the line above and adds </w:t>
+      </w:r>
+      <w:r>
+        <w:rPr>
+          <w:rStyle w:val="SourceText"/>
+        </w:rPr>
+        <w:t>Auto-resume was not typed: &lt;reason&gt;.</w:t>
+      </w:r>
+      <w:r>
+        <w:rPr/>
+        <w:t xml:space="preserve"> Every refusal is in </w:t>
+      </w:r>
+      <w:r>
+        <w:rPr>
+          <w:rStyle w:val="SourceText"/>
+        </w:rPr>
+        <w:t>.crew/.autoclear.log</w:t>
+      </w:r>
+      <w:r>
+        <w:rPr/>
+        <w:t xml:space="preserve">: decide did not say run; no usable method, </w:t>
+      </w:r>
+      <w:r>
+        <w:rPr>
+          <w:rStyle w:val="SourceText"/>
+        </w:rPr>
+        <w:t>$TMUX</w:t>
+      </w:r>
+      <w:r>
+        <w:rPr/>
+        <w:t xml:space="preserve"> unset or a pane that is not this session's; </w:t>
+      </w:r>
+      <w:r>
+        <w:rPr>
+          <w:rStyle w:val="SourceText"/>
+        </w:rPr>
+        <w:t>wtype</w:t>
+      </w:r>
+      <w:r>
+        <w:rPr/>
+        <w:t xml:space="preserve"> or </w:t>
+      </w:r>
+      <w:r>
+        <w:rPr>
+          <w:rStyle w:val="SourceText"/>
+        </w:rPr>
+        <w:t>xdotool</w:t>
+      </w:r>
+      <w:r>
+        <w:rPr/>
+        <w:t>; already typed; the run could not be recorded; the input line is not empty; not ready in time; on Windows, focus lost or a tab not provable. The 2 s default comes from a measurement (input ready by 0.134 s after SessionStart on Claude Code 2.1.282); a delay is still a guess, and Windows has no probe.</w:t>
       </w:r>
     </w:p>
     <w:p>

</xml_diff>

<commit_message>
L-0522: troubleshooting guide's catch-up fixes state the landing order (merge review FIX); test holds both guides to it
Claude-Session: https://claude.ai/code/session_016wQA2o38aSB65bpjaGpMVJ
</commit_message>
<xml_diff>
--- a/docs/guides/crew/crew-1.0-troubleshooting.docx
+++ b/docs/guides/crew/crew-1.0-troubleshooting.docx
@@ -4156,7 +4156,17 @@
       </w:r>
       <w:r>
         <w:rPr/>
-        <w:t xml:space="preserve"> and review the merged head. </w:t>
+        <w:t xml:space="preserve"> (resolve any conflict), bump the version one past the base's, refresh the artifacts, commit, gate the merged head, review it again if </w:t>
+      </w:r>
+      <w:r>
+        <w:rPr>
+          <w:rStyle w:val="SourceText"/>
+        </w:rPr>
+        <w:t>review_ledger.py --check-receipt</w:t>
+      </w:r>
+      <w:r>
+        <w:rPr/>
+        <w:t xml:space="preserve"> reads stale, then acquire again. </w:t>
       </w:r>
       <w:r>
         <w:rPr>
@@ -4348,7 +4358,7 @@
       </w:r>
       <w:r>
         <w:rPr/>
-        <w:t xml:space="preserve"> and commit; a version file is never replayed and comes back conflicted), gate the merged head again (</w:t>
+        <w:t xml:space="preserve"> and commit; a version file is never replayed and comes back conflicted), then bump the version one past the base's, refresh the artifacts, commit, gate the merged head, review it again (</w:t>
       </w:r>
       <w:r>
         <w:rPr>
@@ -4358,7 +4368,17 @@
       </w:r>
       <w:r>
         <w:rPr/>
-        <w:t xml:space="preserve">), then </w:t>
+        <w:t xml:space="preserve">) if </w:t>
+      </w:r>
+      <w:r>
+        <w:rPr>
+          <w:rStyle w:val="SourceText"/>
+        </w:rPr>
+        <w:t>review_ledger.py --check-receipt</w:t>
+      </w:r>
+      <w:r>
+        <w:rPr/>
+        <w:t xml:space="preserve"> reads stale, then </w:t>
       </w:r>
       <w:r>
         <w:rPr>
@@ -4368,7 +4388,7 @@
       </w:r>
       <w:r>
         <w:rPr/>
-        <w:t xml:space="preserve"> again. </w:t>
+        <w:t xml:space="preserve"> again, so the tree the gate passed is the tree that lands. </w:t>
       </w:r>
       <w:r>
         <w:rPr>

</xml_diff>

<commit_message>
T-0016 after the merge of main: troubleshooting guide rebuilt (auto-cycle.md is in it; LibreOffice, not Word), code map citations re-taken, rules regenerated, BUDGETS re-measured (22,827 lines across 140 files)
Claude-Session: https://claude.ai/code/session_016wQA2o38aSB65bpjaGpMVJ
</commit_message>
<xml_diff>
--- a/docs/guides/crew/crew-1.0-troubleshooting.docx
+++ b/docs/guides/crew/crew-1.0-troubleshooting.docx
@@ -11138,7 +11138,17 @@
       </w:r>
       <w:r>
         <w:rPr/>
-        <w:t xml:space="preserve"> actually type the configured command into the terminal that runs this session. Whichever method is in force, it acts only when all four of these hold: - this machine opted in; - the handoff was written by this session after the wrap-up request, is longer than a stub, and is not the automatic PreCompact skeleton; - the context reading that caused the wrap-up was a real measurement (see "When it will not clear"); - for a method that types (</w:t>
+        <w:t xml:space="preserve"> actually type the configured command into the terminal that runs this session. Whichever method is in force, it acts only when all five of these hold: - this machine opted in; - the handoff was written by this session after the wrap-up request, is longer than a stub, and is not the automatic PreCompact skeleton; - the context reading that caused the wrap-up was a real measurement (see "When it will not clear"); - this session is bound to its own Claude Code process, and that process has a terminal of its own (see "Which window gets the keystroke") — a headless session, such as a </w:t>
+      </w:r>
+      <w:r>
+        <w:rPr>
+          <w:rStyle w:val="SourceText"/>
+        </w:rPr>
+        <w:t>claude -p</w:t>
+      </w:r>
+      <w:r>
+        <w:rPr/>
+        <w:t xml:space="preserve"> child, gets one message instead, naming its handoff and saying the process that started it must start a new one; - for a method that types (</w:t>
       </w:r>
       <w:r>
         <w:rPr>
@@ -11168,7 +11178,7 @@
       </w:r>
       <w:r>
         <w:rPr/>
-        <w:t xml:space="preserve">), the target window can be identified exactly — </w:t>
+        <w:t xml:space="preserve">), the target window can be identified exactly, from that process — </w:t>
       </w:r>
       <w:r>
         <w:rPr>
@@ -13802,8 +13812,8 @@
       </w:tblPr>
       <w:tblGrid>
         <w:gridCol w:w="1186"/>
-        <w:gridCol w:w="8225"/>
-        <w:gridCol w:w="2399"/>
+        <w:gridCol w:w="8255"/>
+        <w:gridCol w:w="2369"/>
       </w:tblGrid>
       <w:tr>
         <w:trPr>
@@ -13833,7 +13843,7 @@
         </w:tc>
         <w:tc>
           <w:tcPr>
-            <w:tcW w:w="8225" w:type="dxa"/>
+            <w:tcW w:w="8255" w:type="dxa"/>
             <w:tcBorders/>
             <w:vAlign w:val="center"/>
           </w:tcPr>
@@ -13855,7 +13865,7 @@
         </w:tc>
         <w:tc>
           <w:tcPr>
-            <w:tcW w:w="2399" w:type="dxa"/>
+            <w:tcW w:w="2369" w:type="dxa"/>
             <w:tcBorders/>
             <w:vAlign w:val="center"/>
           </w:tcPr>
@@ -13913,7 +13923,7 @@
         </w:tc>
         <w:tc>
           <w:tcPr>
-            <w:tcW w:w="8225" w:type="dxa"/>
+            <w:tcW w:w="8255" w:type="dxa"/>
             <w:tcBorders/>
             <w:vAlign w:val="center"/>
           </w:tcPr>
@@ -13938,13 +13948,13 @@
             </w:r>
             <w:r>
               <w:rPr/>
-              <w:t xml:space="preserve"> that is an ancestor of the hook. No focus involved — the most reliable method.</w:t>
-            </w:r>
-          </w:p>
-        </w:tc>
-        <w:tc>
-          <w:tcPr>
-            <w:tcW w:w="2399" w:type="dxa"/>
+              <w:t xml:space="preserve"> whose process is this session's own process or an ancestor of it. No focus involved — the most reliable method.</w:t>
+            </w:r>
+          </w:p>
+        </w:tc>
+        <w:tc>
+          <w:tcPr>
+            <w:tcW w:w="2369" w:type="dxa"/>
             <w:tcBorders/>
             <w:vAlign w:val="center"/>
           </w:tcPr>
@@ -14011,22 +14021,22 @@
         </w:tc>
         <w:tc>
           <w:tcPr>
-            <w:tcW w:w="8225" w:type="dxa"/>
-            <w:tcBorders/>
-            <w:vAlign w:val="center"/>
-          </w:tcPr>
-          <w:p>
-            <w:pPr>
-              <w:pStyle w:val="TableContents"/>
-              <w:shd w:fill="2E3440" w:val="clear"/>
-              <w:bidi w:val="0"/>
-              <w:spacing w:before="120" w:after="120"/>
-              <w:jc w:val="left"/>
-              <w:rPr/>
-            </w:pPr>
-            <w:r>
-              <w:rPr/>
-              <w:t xml:space="preserve">Types into the one X11 window owned by the nearest ancestor process (or matching </w:t>
+            <w:tcW w:w="8255" w:type="dxa"/>
+            <w:tcBorders/>
+            <w:vAlign w:val="center"/>
+          </w:tcPr>
+          <w:p>
+            <w:pPr>
+              <w:pStyle w:val="TableContents"/>
+              <w:shd w:fill="2E3440" w:val="clear"/>
+              <w:bidi w:val="0"/>
+              <w:spacing w:before="120" w:after="120"/>
+              <w:jc w:val="left"/>
+              <w:rPr/>
+            </w:pPr>
+            <w:r>
+              <w:rPr/>
+              <w:t xml:space="preserve">Types into the one X11 window owned by the nearest ancestor of this session's own process, when that window hosts no other terminal (or matching </w:t>
             </w:r>
             <w:r>
               <w:rPr>
@@ -14042,7 +14052,7 @@
         </w:tc>
         <w:tc>
           <w:tcPr>
-            <w:tcW w:w="2399" w:type="dxa"/>
+            <w:tcW w:w="2369" w:type="dxa"/>
             <w:tcBorders/>
             <w:vAlign w:val="center"/>
           </w:tcPr>
@@ -14109,7 +14119,7 @@
         </w:tc>
         <w:tc>
           <w:tcPr>
-            <w:tcW w:w="8225" w:type="dxa"/>
+            <w:tcW w:w="8255" w:type="dxa"/>
             <w:tcBorders/>
             <w:vAlign w:val="center"/>
           </w:tcPr>
@@ -14130,7 +14140,7 @@
         </w:tc>
         <w:tc>
           <w:tcPr>
-            <w:tcW w:w="2399" w:type="dxa"/>
+            <w:tcW w:w="2369" w:type="dxa"/>
             <w:tcBorders/>
             <w:vAlign w:val="center"/>
           </w:tcPr>
@@ -14183,7 +14193,7 @@
         </w:tc>
         <w:tc>
           <w:tcPr>
-            <w:tcW w:w="8225" w:type="dxa"/>
+            <w:tcW w:w="8255" w:type="dxa"/>
             <w:tcBorders/>
             <w:vAlign w:val="center"/>
           </w:tcPr>
@@ -14204,7 +14214,7 @@
             </w:r>
             <w:r>
               <w:rPr/>
-              <w:t xml:space="preserve"> against the one window owned by an ancestor process (or matching </w:t>
+              <w:t xml:space="preserve"> against the one window owned by an ancestor of this session's own process (or matching </w:t>
             </w:r>
             <w:r>
               <w:rPr>
@@ -14266,7 +14276,7 @@
         </w:tc>
         <w:tc>
           <w:tcPr>
-            <w:tcW w:w="2399" w:type="dxa"/>
+            <w:tcW w:w="2369" w:type="dxa"/>
             <w:tcBorders/>
             <w:vAlign w:val="center"/>
           </w:tcPr>
@@ -14313,7 +14323,7 @@
         </w:tc>
         <w:tc>
           <w:tcPr>
-            <w:tcW w:w="8225" w:type="dxa"/>
+            <w:tcW w:w="8255" w:type="dxa"/>
             <w:tcBorders/>
             <w:vAlign w:val="center"/>
           </w:tcPr>
@@ -14334,7 +14344,7 @@
         </w:tc>
         <w:tc>
           <w:tcPr>
-            <w:tcW w:w="2399" w:type="dxa"/>
+            <w:tcW w:w="2369" w:type="dxa"/>
             <w:tcBorders/>
             <w:vAlign w:val="center"/>
           </w:tcPr>
@@ -14426,8 +14436,8 @@
         </w:tblCellMar>
       </w:tblPr>
       <w:tblGrid>
-        <w:gridCol w:w="5490"/>
-        <w:gridCol w:w="6320"/>
+        <w:gridCol w:w="5238"/>
+        <w:gridCol w:w="6572"/>
       </w:tblGrid>
       <w:tr>
         <w:trPr>
@@ -14435,7 +14445,7 @@
         </w:trPr>
         <w:tc>
           <w:tcPr>
-            <w:tcW w:w="5490" w:type="dxa"/>
+            <w:tcW w:w="5238" w:type="dxa"/>
             <w:tcBorders/>
             <w:vAlign w:val="center"/>
           </w:tcPr>
@@ -14457,7 +14467,7 @@
         </w:tc>
         <w:tc>
           <w:tcPr>
-            <w:tcW w:w="6320" w:type="dxa"/>
+            <w:tcW w:w="6572" w:type="dxa"/>
             <w:tcBorders/>
             <w:vAlign w:val="center"/>
           </w:tcPr>
@@ -14482,7 +14492,7 @@
         <w:trPr/>
         <w:tc>
           <w:tcPr>
-            <w:tcW w:w="5490" w:type="dxa"/>
+            <w:tcW w:w="5238" w:type="dxa"/>
             <w:tcBorders/>
             <w:vAlign w:val="center"/>
           </w:tcPr>
@@ -14505,7 +14515,7 @@
         </w:tc>
         <w:tc>
           <w:tcPr>
-            <w:tcW w:w="6320" w:type="dxa"/>
+            <w:tcW w:w="6572" w:type="dxa"/>
             <w:tcBorders/>
             <w:vAlign w:val="center"/>
           </w:tcPr>
@@ -14529,7 +14539,7 @@
         <w:trPr/>
         <w:tc>
           <w:tcPr>
-            <w:tcW w:w="5490" w:type="dxa"/>
+            <w:tcW w:w="5238" w:type="dxa"/>
             <w:tcBorders/>
             <w:vAlign w:val="center"/>
           </w:tcPr>
@@ -14552,7 +14562,7 @@
         </w:tc>
         <w:tc>
           <w:tcPr>
-            <w:tcW w:w="6320" w:type="dxa"/>
+            <w:tcW w:w="6572" w:type="dxa"/>
             <w:tcBorders/>
             <w:vAlign w:val="center"/>
           </w:tcPr>
@@ -14586,7 +14596,7 @@
         <w:trPr/>
         <w:tc>
           <w:tcPr>
-            <w:tcW w:w="5490" w:type="dxa"/>
+            <w:tcW w:w="5238" w:type="dxa"/>
             <w:tcBorders/>
             <w:vAlign w:val="center"/>
           </w:tcPr>
@@ -14609,7 +14619,7 @@
         </w:tc>
         <w:tc>
           <w:tcPr>
-            <w:tcW w:w="6320" w:type="dxa"/>
+            <w:tcW w:w="6572" w:type="dxa"/>
             <w:tcBorders/>
             <w:vAlign w:val="center"/>
           </w:tcPr>
@@ -14633,7 +14643,7 @@
         <w:trPr/>
         <w:tc>
           <w:tcPr>
-            <w:tcW w:w="5490" w:type="dxa"/>
+            <w:tcW w:w="5238" w:type="dxa"/>
             <w:tcBorders/>
             <w:vAlign w:val="center"/>
           </w:tcPr>
@@ -14656,7 +14666,7 @@
         </w:tc>
         <w:tc>
           <w:tcPr>
-            <w:tcW w:w="6320" w:type="dxa"/>
+            <w:tcW w:w="6572" w:type="dxa"/>
             <w:tcBorders/>
             <w:vAlign w:val="center"/>
           </w:tcPr>
@@ -14680,7 +14690,7 @@
         <w:trPr/>
         <w:tc>
           <w:tcPr>
-            <w:tcW w:w="5490" w:type="dxa"/>
+            <w:tcW w:w="5238" w:type="dxa"/>
             <w:tcBorders/>
             <w:vAlign w:val="center"/>
           </w:tcPr>
@@ -14703,7 +14713,7 @@
         </w:tc>
         <w:tc>
           <w:tcPr>
-            <w:tcW w:w="6320" w:type="dxa"/>
+            <w:tcW w:w="6572" w:type="dxa"/>
             <w:tcBorders/>
             <w:vAlign w:val="center"/>
           </w:tcPr>
@@ -14727,7 +14737,7 @@
         <w:trPr/>
         <w:tc>
           <w:tcPr>
-            <w:tcW w:w="5490" w:type="dxa"/>
+            <w:tcW w:w="5238" w:type="dxa"/>
             <w:tcBorders/>
             <w:vAlign w:val="center"/>
           </w:tcPr>
@@ -14750,7 +14760,7 @@
         </w:tc>
         <w:tc>
           <w:tcPr>
-            <w:tcW w:w="6320" w:type="dxa"/>
+            <w:tcW w:w="6572" w:type="dxa"/>
             <w:tcBorders/>
             <w:vAlign w:val="center"/>
           </w:tcPr>
@@ -14774,7 +14784,7 @@
         <w:trPr/>
         <w:tc>
           <w:tcPr>
-            <w:tcW w:w="5490" w:type="dxa"/>
+            <w:tcW w:w="5238" w:type="dxa"/>
             <w:tcBorders/>
             <w:vAlign w:val="center"/>
           </w:tcPr>
@@ -14807,7 +14817,7 @@
         </w:tc>
         <w:tc>
           <w:tcPr>
-            <w:tcW w:w="6320" w:type="dxa"/>
+            <w:tcW w:w="6572" w:type="dxa"/>
             <w:tcBorders/>
             <w:vAlign w:val="center"/>
           </w:tcPr>
@@ -14851,7 +14861,7 @@
         <w:trPr/>
         <w:tc>
           <w:tcPr>
-            <w:tcW w:w="5490" w:type="dxa"/>
+            <w:tcW w:w="5238" w:type="dxa"/>
             <w:tcBorders/>
             <w:vAlign w:val="center"/>
           </w:tcPr>
@@ -14870,11 +14880,21 @@
               </w:rPr>
               <w:t>no window belongs to any ancestor of this hook</w:t>
             </w:r>
-          </w:p>
-        </w:tc>
-        <w:tc>
-          <w:tcPr>
-            <w:tcW w:w="6320" w:type="dxa"/>
+            <w:r>
+              <w:rPr/>
+              <w:t xml:space="preserve"> / </w:t>
+            </w:r>
+            <w:r>
+              <w:rPr>
+                <w:rStyle w:val="SourceText"/>
+              </w:rPr>
+              <w:t>... of this session's process</w:t>
+            </w:r>
+          </w:p>
+        </w:tc>
+        <w:tc>
+          <w:tcPr>
+            <w:tcW w:w="6572" w:type="dxa"/>
             <w:tcBorders/>
             <w:vAlign w:val="center"/>
           </w:tcPr>
@@ -14928,51 +14948,75 @@
         <w:trPr/>
         <w:tc>
           <w:tcPr>
-            <w:tcW w:w="5490" w:type="dxa"/>
-            <w:tcBorders/>
-            <w:vAlign w:val="center"/>
-          </w:tcPr>
-          <w:p>
-            <w:pPr>
-              <w:pStyle w:val="TableContents"/>
-              <w:shd w:fill="2E3440" w:val="clear"/>
-              <w:bidi w:val="0"/>
-              <w:spacing w:before="120" w:after="120"/>
-              <w:jc w:val="left"/>
-              <w:rPr/>
-            </w:pPr>
-            <w:r>
-              <w:rPr>
-                <w:rStyle w:val="SourceText"/>
-              </w:rPr>
-              <w:t>tmux pane %N could not be confirmed</w:t>
-            </w:r>
-          </w:p>
-        </w:tc>
-        <w:tc>
-          <w:tcPr>
-            <w:tcW w:w="6320" w:type="dxa"/>
-            <w:tcBorders/>
-            <w:vAlign w:val="center"/>
-          </w:tcPr>
-          <w:p>
-            <w:pPr>
-              <w:pStyle w:val="TableContents"/>
-              <w:shd w:fill="2E3440" w:val="clear"/>
-              <w:bidi w:val="0"/>
-              <w:spacing w:before="120" w:after="120"/>
-              <w:jc w:val="left"/>
-              <w:rPr/>
-            </w:pPr>
-            <w:r>
-              <w:rPr>
-                <w:rStyle w:val="SourceText"/>
-              </w:rPr>
-              <w:t>$TMUX_PANE</w:t>
-            </w:r>
-            <w:r>
-              <w:rPr/>
-              <w:t xml:space="preserve"> is not the pane that runs this session</w:t>
+            <w:tcW w:w="5238" w:type="dxa"/>
+            <w:tcBorders/>
+            <w:vAlign w:val="center"/>
+          </w:tcPr>
+          <w:p>
+            <w:pPr>
+              <w:pStyle w:val="TableContents"/>
+              <w:shd w:fill="2E3440" w:val="clear"/>
+              <w:bidi w:val="0"/>
+              <w:spacing w:before="120" w:after="120"/>
+              <w:jc w:val="left"/>
+              <w:rPr/>
+            </w:pPr>
+            <w:r>
+              <w:rPr>
+                <w:rStyle w:val="SourceText"/>
+              </w:rPr>
+              <w:t>sent - method notify-headless: crew: this session has no terminal of its own (...)</w:t>
+            </w:r>
+          </w:p>
+        </w:tc>
+        <w:tc>
+          <w:tcPr>
+            <w:tcW w:w="6572" w:type="dxa"/>
+            <w:tcBorders/>
+            <w:vAlign w:val="center"/>
+          </w:tcPr>
+          <w:p>
+            <w:pPr>
+              <w:pStyle w:val="TableContents"/>
+              <w:shd w:fill="2E3440" w:val="clear"/>
+              <w:bidi w:val="0"/>
+              <w:spacing w:before="120" w:after="120"/>
+              <w:jc w:val="left"/>
+              <w:rPr/>
+            </w:pPr>
+            <w:r>
+              <w:rPr/>
+              <w:t>a headless session (</w:t>
+            </w:r>
+            <w:r>
+              <w:rPr>
+                <w:rStyle w:val="SourceText"/>
+              </w:rPr>
+              <w:t>claude -p</w:t>
+            </w:r>
+            <w:r>
+              <w:rPr/>
+              <w:t xml:space="preserve">: entrypoint </w:t>
+            </w:r>
+            <w:r>
+              <w:rPr>
+                <w:rStyle w:val="SourceText"/>
+              </w:rPr>
+              <w:t>sdk-cli</w:t>
+            </w:r>
+            <w:r>
+              <w:rPr/>
+              <w:t xml:space="preserve">, or no controlling terminal): nothing was typed, and the message names the handoff and its </w:t>
+            </w:r>
+            <w:r>
+              <w:rPr>
+                <w:rStyle w:val="SourceText"/>
+              </w:rPr>
+              <w:t>resume:</w:t>
+            </w:r>
+            <w:r>
+              <w:rPr/>
+              <w:t xml:space="preserve"> line. The process that started the session restarts it</w:t>
             </w:r>
           </w:p>
         </w:tc>
@@ -14981,55 +15025,61 @@
         <w:trPr/>
         <w:tc>
           <w:tcPr>
-            <w:tcW w:w="5490" w:type="dxa"/>
-            <w:tcBorders/>
-            <w:vAlign w:val="center"/>
-          </w:tcPr>
-          <w:p>
-            <w:pPr>
-              <w:pStyle w:val="TableContents"/>
-              <w:shd w:fill="2E3440" w:val="clear"/>
-              <w:bidi w:val="0"/>
-              <w:spacing w:before="120" w:after="120"/>
-              <w:jc w:val="left"/>
-              <w:rPr/>
-            </w:pPr>
-            <w:r>
-              <w:rPr>
-                <w:rStyle w:val="SourceText"/>
-              </w:rPr>
-              <w:t>method wtype ... is refused</w:t>
-            </w:r>
-          </w:p>
-        </w:tc>
-        <w:tc>
-          <w:tcPr>
-            <w:tcW w:w="6320" w:type="dxa"/>
-            <w:tcBorders/>
-            <w:vAlign w:val="center"/>
-          </w:tcPr>
-          <w:p>
-            <w:pPr>
-              <w:pStyle w:val="TableContents"/>
-              <w:shd w:fill="2E3440" w:val="clear"/>
-              <w:bidi w:val="0"/>
-              <w:spacing w:before="120" w:after="120"/>
-              <w:jc w:val="left"/>
-              <w:rPr/>
-            </w:pPr>
-            <w:r>
-              <w:rPr/>
-              <w:t xml:space="preserve">Wayland's </w:t>
-            </w:r>
-            <w:r>
-              <w:rPr>
-                <w:rStyle w:val="SourceText"/>
-              </w:rPr>
-              <w:t>wtype</w:t>
-            </w:r>
-            <w:r>
-              <w:rPr/>
-              <w:t xml:space="preserve"> cannot target a window. Use tmux instead.</w:t>
+            <w:tcW w:w="5238" w:type="dxa"/>
+            <w:tcBorders/>
+            <w:vAlign w:val="center"/>
+          </w:tcPr>
+          <w:p>
+            <w:pPr>
+              <w:pStyle w:val="TableContents"/>
+              <w:shd w:fill="2E3440" w:val="clear"/>
+              <w:bidi w:val="0"/>
+              <w:spacing w:before="120" w:after="120"/>
+              <w:jc w:val="left"/>
+              <w:rPr/>
+            </w:pPr>
+            <w:r>
+              <w:rPr>
+                <w:rStyle w:val="SourceText"/>
+              </w:rPr>
+              <w:t>could not identify this session's process (...)</w:t>
+            </w:r>
+          </w:p>
+        </w:tc>
+        <w:tc>
+          <w:tcPr>
+            <w:tcW w:w="6572" w:type="dxa"/>
+            <w:tcBorders/>
+            <w:vAlign w:val="center"/>
+          </w:tcPr>
+          <w:p>
+            <w:pPr>
+              <w:pStyle w:val="TableContents"/>
+              <w:shd w:fill="2E3440" w:val="clear"/>
+              <w:bidi w:val="0"/>
+              <w:spacing w:before="120" w:after="120"/>
+              <w:jc w:val="left"/>
+              <w:rPr/>
+            </w:pPr>
+            <w:r>
+              <w:rPr/>
+              <w:t xml:space="preserve">no Claude Code session record names a process above the hook with this session's id and start time (or the record is unreadable, or names another session). Nothing is typed; </w:t>
+            </w:r>
+            <w:r>
+              <w:rPr>
+                <w:rStyle w:val="SourceText"/>
+              </w:rPr>
+              <w:t>auto</w:t>
+            </w:r>
+            <w:r>
+              <w:rPr/>
+              <w:t xml:space="preserve"> falls back to </w:t>
+            </w:r>
+            <w:r>
+              <w:rPr>
+                <w:rStyle w:val="SourceText"/>
+              </w:rPr>
+              <w:t>notify</w:t>
             </w:r>
           </w:p>
         </w:tc>
@@ -15038,45 +15088,65 @@
         <w:trPr/>
         <w:tc>
           <w:tcPr>
-            <w:tcW w:w="5490" w:type="dxa"/>
-            <w:tcBorders/>
-            <w:vAlign w:val="center"/>
-          </w:tcPr>
-          <w:p>
-            <w:pPr>
-              <w:pStyle w:val="TableContents"/>
-              <w:shd w:fill="2E3440" w:val="clear"/>
-              <w:bidi w:val="0"/>
-              <w:spacing w:before="120" w:after="120"/>
-              <w:jc w:val="left"/>
-              <w:rPr/>
-            </w:pPr>
-            <w:r>
-              <w:rPr>
-                <w:rStyle w:val="SourceText"/>
-              </w:rPr>
-              <w:t>sent - method notify</w:t>
-            </w:r>
-          </w:p>
-        </w:tc>
-        <w:tc>
-          <w:tcPr>
-            <w:tcW w:w="6320" w:type="dxa"/>
-            <w:tcBorders/>
-            <w:vAlign w:val="center"/>
-          </w:tcPr>
-          <w:p>
-            <w:pPr>
-              <w:pStyle w:val="TableContents"/>
-              <w:shd w:fill="2E3440" w:val="clear"/>
-              <w:bidi w:val="0"/>
-              <w:spacing w:before="120" w:after="120"/>
-              <w:jc w:val="left"/>
-              <w:rPr/>
-            </w:pPr>
-            <w:r>
-              <w:rPr/>
-              <w:t xml:space="preserve">the message was printed — this is the normal, successful outcome for </w:t>
+            <w:tcW w:w="5238" w:type="dxa"/>
+            <w:tcBorders/>
+            <w:vAlign w:val="center"/>
+          </w:tcPr>
+          <w:p>
+            <w:pPr>
+              <w:pStyle w:val="TableContents"/>
+              <w:shd w:fill="2E3440" w:val="clear"/>
+              <w:bidi w:val="0"/>
+              <w:spacing w:before="120" w:after="120"/>
+              <w:jc w:val="left"/>
+              <w:rPr/>
+            </w:pPr>
+            <w:r>
+              <w:rPr>
+                <w:rStyle w:val="SourceText"/>
+              </w:rPr>
+              <w:t>could not tell whether this session has a terminal of its own (entrypoint '...' ...)</w:t>
+            </w:r>
+          </w:p>
+        </w:tc>
+        <w:tc>
+          <w:tcPr>
+            <w:tcW w:w="6572" w:type="dxa"/>
+            <w:tcBorders/>
+            <w:vAlign w:val="center"/>
+          </w:tcPr>
+          <w:p>
+            <w:pPr>
+              <w:pStyle w:val="TableContents"/>
+              <w:shd w:fill="2E3440" w:val="clear"/>
+              <w:bidi w:val="0"/>
+              <w:spacing w:before="120" w:after="120"/>
+              <w:jc w:val="left"/>
+              <w:rPr/>
+            </w:pPr>
+            <w:r>
+              <w:rPr/>
+              <w:t xml:space="preserve">the session record's entrypoint is not one measured to have a terminal (only </w:t>
+            </w:r>
+            <w:r>
+              <w:rPr>
+                <w:rStyle w:val="SourceText"/>
+              </w:rPr>
+              <w:t>cli</w:t>
+            </w:r>
+            <w:r>
+              <w:rPr/>
+              <w:t xml:space="preserve"> is). Nothing is typed; </w:t>
+            </w:r>
+            <w:r>
+              <w:rPr>
+                <w:rStyle w:val="SourceText"/>
+              </w:rPr>
+              <w:t>auto</w:t>
+            </w:r>
+            <w:r>
+              <w:rPr/>
+              <w:t xml:space="preserve"> falls back to </w:t>
             </w:r>
             <w:r>
               <w:rPr>
@@ -15091,65 +15161,45 @@
         <w:trPr/>
         <w:tc>
           <w:tcPr>
-            <w:tcW w:w="5490" w:type="dxa"/>
-            <w:tcBorders/>
-            <w:vAlign w:val="center"/>
-          </w:tcPr>
-          <w:p>
-            <w:pPr>
-              <w:pStyle w:val="TableContents"/>
-              <w:shd w:fill="2E3440" w:val="clear"/>
-              <w:bidi w:val="0"/>
-              <w:spacing w:before="120" w:after="120"/>
-              <w:jc w:val="left"/>
-              <w:rPr/>
-            </w:pPr>
-            <w:r>
-              <w:rPr>
-                <w:rStyle w:val="SourceText"/>
-              </w:rPr>
-              <w:t>declined sendkeys - cannot verify the active tab ...</w:t>
-            </w:r>
-          </w:p>
-        </w:tc>
-        <w:tc>
-          <w:tcPr>
-            <w:tcW w:w="6320" w:type="dxa"/>
-            <w:tcBorders/>
-            <w:vAlign w:val="center"/>
-          </w:tcPr>
-          <w:p>
-            <w:pPr>
-              <w:pStyle w:val="TableContents"/>
-              <w:shd w:fill="2E3440" w:val="clear"/>
-              <w:bidi w:val="0"/>
-              <w:spacing w:before="120" w:after="120"/>
-              <w:jc w:val="left"/>
-              <w:rPr/>
-            </w:pPr>
-            <w:r>
-              <w:rPr/>
-              <w:t xml:space="preserve">the target window is owned by Windows Terminal; </w:t>
-            </w:r>
-            <w:r>
-              <w:rPr>
-                <w:rStyle w:val="SourceText"/>
-              </w:rPr>
-              <w:t>sendkeys</w:t>
-            </w:r>
-            <w:r>
-              <w:rPr/>
-              <w:t xml:space="preserve"> fell back to </w:t>
-            </w:r>
-            <w:r>
-              <w:rPr>
-                <w:rStyle w:val="SourceText"/>
-              </w:rPr>
-              <w:t>notify</w:t>
-            </w:r>
-            <w:r>
-              <w:rPr/>
-              <w:t xml:space="preserve"> instead of guessing which tab is active</w:t>
+            <w:tcW w:w="5238" w:type="dxa"/>
+            <w:tcBorders/>
+            <w:vAlign w:val="center"/>
+          </w:tcPr>
+          <w:p>
+            <w:pPr>
+              <w:pStyle w:val="TableContents"/>
+              <w:shd w:fill="2E3440" w:val="clear"/>
+              <w:bidi w:val="0"/>
+              <w:spacing w:before="120" w:after="120"/>
+              <w:jc w:val="left"/>
+              <w:rPr/>
+            </w:pPr>
+            <w:r>
+              <w:rPr>
+                <w:rStyle w:val="SourceText"/>
+              </w:rPr>
+              <w:t>passes through another Claude Code session (pid N)</w:t>
+            </w:r>
+          </w:p>
+        </w:tc>
+        <w:tc>
+          <w:tcPr>
+            <w:tcW w:w="6572" w:type="dxa"/>
+            <w:tcBorders/>
+            <w:vAlign w:val="center"/>
+          </w:tcPr>
+          <w:p>
+            <w:pPr>
+              <w:pStyle w:val="TableContents"/>
+              <w:shd w:fill="2E3440" w:val="clear"/>
+              <w:bidi w:val="0"/>
+              <w:spacing w:before="120" w:after="120"/>
+              <w:jc w:val="left"/>
+              <w:rPr/>
+            </w:pPr>
+            <w:r>
+              <w:rPr/>
+              <w:t>this session is a child of another session, and the pane or window above it is the parent's</w:t>
             </w:r>
           </w:p>
         </w:tc>
@@ -15158,7 +15208,428 @@
         <w:trPr/>
         <w:tc>
           <w:tcPr>
-            <w:tcW w:w="5490" w:type="dxa"/>
+            <w:tcW w:w="5238" w:type="dxa"/>
+            <w:tcBorders/>
+            <w:vAlign w:val="center"/>
+          </w:tcPr>
+          <w:p>
+            <w:pPr>
+              <w:pStyle w:val="TableContents"/>
+              <w:shd w:fill="2E3440" w:val="clear"/>
+              <w:bidi w:val="0"/>
+              <w:spacing w:before="120" w:after="120"/>
+              <w:jc w:val="left"/>
+              <w:rPr/>
+            </w:pPr>
+            <w:r>
+              <w:rPr>
+                <w:rStyle w:val="SourceText"/>
+              </w:rPr>
+              <w:t>the window's owner (pid N) also hosts another terminal</w:t>
+            </w:r>
+            <w:r>
+              <w:rPr/>
+              <w:t xml:space="preserve"> / </w:t>
+            </w:r>
+            <w:r>
+              <w:rPr>
+                <w:rStyle w:val="SourceText"/>
+              </w:rPr>
+              <w:t>another Claude Code session</w:t>
+            </w:r>
+          </w:p>
+        </w:tc>
+        <w:tc>
+          <w:tcPr>
+            <w:tcW w:w="6572" w:type="dxa"/>
+            <w:tcBorders/>
+            <w:vAlign w:val="center"/>
+          </w:tcPr>
+          <w:p>
+            <w:pPr>
+              <w:pStyle w:val="TableContents"/>
+              <w:shd w:fill="2E3440" w:val="clear"/>
+              <w:bidi w:val="0"/>
+              <w:spacing w:before="120" w:after="120"/>
+              <w:jc w:val="left"/>
+              <w:rPr/>
+            </w:pPr>
+            <w:r>
+              <w:rPr/>
+              <w:t>the terminal that owns the window also runs another tab or session, so the window is not provably this one's</w:t>
+            </w:r>
+          </w:p>
+        </w:tc>
+      </w:tr>
+      <w:tr>
+        <w:trPr/>
+        <w:tc>
+          <w:tcPr>
+            <w:tcW w:w="5238" w:type="dxa"/>
+            <w:tcBorders/>
+            <w:vAlign w:val="center"/>
+          </w:tcPr>
+          <w:p>
+            <w:pPr>
+              <w:pStyle w:val="TableContents"/>
+              <w:shd w:fill="2E3440" w:val="clear"/>
+              <w:bidi w:val="0"/>
+              <w:spacing w:before="120" w:after="120"/>
+              <w:jc w:val="left"/>
+              <w:rPr/>
+            </w:pPr>
+            <w:r>
+              <w:rPr>
+                <w:rStyle w:val="SourceText"/>
+              </w:rPr>
+              <w:t>could not be listed</w:t>
+            </w:r>
+            <w:r>
+              <w:rPr/>
+              <w:t xml:space="preserve"> / </w:t>
+            </w:r>
+            <w:r>
+              <w:rPr>
+                <w:rStyle w:val="SourceText"/>
+              </w:rPr>
+              <w:t>the parent of pid N could not be read</w:t>
+            </w:r>
+            <w:r>
+              <w:rPr/>
+              <w:t xml:space="preserve"> / </w:t>
+            </w:r>
+            <w:r>
+              <w:rPr>
+                <w:rStyle w:val="SourceText"/>
+              </w:rPr>
+              <w:t>deeper than 16 processes</w:t>
+            </w:r>
+          </w:p>
+        </w:tc>
+        <w:tc>
+          <w:tcPr>
+            <w:tcW w:w="6572" w:type="dxa"/>
+            <w:tcBorders/>
+            <w:vAlign w:val="center"/>
+          </w:tcPr>
+          <w:p>
+            <w:pPr>
+              <w:pStyle w:val="TableContents"/>
+              <w:shd w:fill="2E3440" w:val="clear"/>
+              <w:bidi w:val="0"/>
+              <w:spacing w:before="120" w:after="120"/>
+              <w:jc w:val="left"/>
+              <w:rPr/>
+            </w:pPr>
+            <w:r>
+              <w:rPr/>
+              <w:t>the process tree could not be read far enough to prove anything</w:t>
+            </w:r>
+          </w:p>
+        </w:tc>
+      </w:tr>
+      <w:tr>
+        <w:trPr/>
+        <w:tc>
+          <w:tcPr>
+            <w:tcW w:w="5238" w:type="dxa"/>
+            <w:tcBorders/>
+            <w:vAlign w:val="center"/>
+          </w:tcPr>
+          <w:p>
+            <w:pPr>
+              <w:pStyle w:val="TableContents"/>
+              <w:shd w:fill="2E3440" w:val="clear"/>
+              <w:bidi w:val="0"/>
+              <w:spacing w:before="120" w:after="120"/>
+              <w:jc w:val="left"/>
+              <w:rPr/>
+            </w:pPr>
+            <w:r>
+              <w:rPr>
+                <w:rStyle w:val="SourceText"/>
+              </w:rPr>
+              <w:t>found by its title alone, and another Claude Code session is live</w:t>
+            </w:r>
+            <w:r>
+              <w:rPr/>
+              <w:t xml:space="preserve"> / </w:t>
+            </w:r>
+            <w:r>
+              <w:rPr>
+                <w:rStyle w:val="SourceText"/>
+              </w:rPr>
+              <w:t>has no owning process</w:t>
+            </w:r>
+          </w:p>
+        </w:tc>
+        <w:tc>
+          <w:tcPr>
+            <w:tcW w:w="6572" w:type="dxa"/>
+            <w:tcBorders/>
+            <w:vAlign w:val="center"/>
+          </w:tcPr>
+          <w:p>
+            <w:pPr>
+              <w:pStyle w:val="TableContents"/>
+              <w:shd w:fill="2E3440" w:val="clear"/>
+              <w:bidi w:val="0"/>
+              <w:spacing w:before="120" w:after="120"/>
+              <w:jc w:val="left"/>
+              <w:rPr/>
+            </w:pPr>
+            <w:r>
+              <w:rPr/>
+              <w:t xml:space="preserve">a </w:t>
+            </w:r>
+            <w:r>
+              <w:rPr>
+                <w:rStyle w:val="SourceText"/>
+              </w:rPr>
+              <w:t>windowTitle</w:t>
+            </w:r>
+            <w:r>
+              <w:rPr/>
+              <w:t xml:space="preserve"> match (or a window with no process) cannot tell two sessions apart</w:t>
+            </w:r>
+          </w:p>
+        </w:tc>
+      </w:tr>
+      <w:tr>
+        <w:trPr/>
+        <w:tc>
+          <w:tcPr>
+            <w:tcW w:w="5238" w:type="dxa"/>
+            <w:tcBorders/>
+            <w:vAlign w:val="center"/>
+          </w:tcPr>
+          <w:p>
+            <w:pPr>
+              <w:pStyle w:val="TableContents"/>
+              <w:shd w:fill="2E3440" w:val="clear"/>
+              <w:bidi w:val="0"/>
+              <w:spacing w:before="120" w:after="120"/>
+              <w:jc w:val="left"/>
+              <w:rPr/>
+            </w:pPr>
+            <w:r>
+              <w:rPr>
+                <w:rStyle w:val="SourceText"/>
+              </w:rPr>
+              <w:t>tmux pane %N could not be confirmed</w:t>
+            </w:r>
+          </w:p>
+        </w:tc>
+        <w:tc>
+          <w:tcPr>
+            <w:tcW w:w="6572" w:type="dxa"/>
+            <w:tcBorders/>
+            <w:vAlign w:val="center"/>
+          </w:tcPr>
+          <w:p>
+            <w:pPr>
+              <w:pStyle w:val="TableContents"/>
+              <w:shd w:fill="2E3440" w:val="clear"/>
+              <w:bidi w:val="0"/>
+              <w:spacing w:before="120" w:after="120"/>
+              <w:jc w:val="left"/>
+              <w:rPr/>
+            </w:pPr>
+            <w:r>
+              <w:rPr>
+                <w:rStyle w:val="SourceText"/>
+              </w:rPr>
+              <w:t>$TMUX_PANE</w:t>
+            </w:r>
+            <w:r>
+              <w:rPr/>
+              <w:t xml:space="preserve"> is not the pane that runs this session</w:t>
+            </w:r>
+          </w:p>
+        </w:tc>
+      </w:tr>
+      <w:tr>
+        <w:trPr/>
+        <w:tc>
+          <w:tcPr>
+            <w:tcW w:w="5238" w:type="dxa"/>
+            <w:tcBorders/>
+            <w:vAlign w:val="center"/>
+          </w:tcPr>
+          <w:p>
+            <w:pPr>
+              <w:pStyle w:val="TableContents"/>
+              <w:shd w:fill="2E3440" w:val="clear"/>
+              <w:bidi w:val="0"/>
+              <w:spacing w:before="120" w:after="120"/>
+              <w:jc w:val="left"/>
+              <w:rPr/>
+            </w:pPr>
+            <w:r>
+              <w:rPr>
+                <w:rStyle w:val="SourceText"/>
+              </w:rPr>
+              <w:t>method wtype ... is refused</w:t>
+            </w:r>
+          </w:p>
+        </w:tc>
+        <w:tc>
+          <w:tcPr>
+            <w:tcW w:w="6572" w:type="dxa"/>
+            <w:tcBorders/>
+            <w:vAlign w:val="center"/>
+          </w:tcPr>
+          <w:p>
+            <w:pPr>
+              <w:pStyle w:val="TableContents"/>
+              <w:shd w:fill="2E3440" w:val="clear"/>
+              <w:bidi w:val="0"/>
+              <w:spacing w:before="120" w:after="120"/>
+              <w:jc w:val="left"/>
+              <w:rPr/>
+            </w:pPr>
+            <w:r>
+              <w:rPr/>
+              <w:t xml:space="preserve">Wayland's </w:t>
+            </w:r>
+            <w:r>
+              <w:rPr>
+                <w:rStyle w:val="SourceText"/>
+              </w:rPr>
+              <w:t>wtype</w:t>
+            </w:r>
+            <w:r>
+              <w:rPr/>
+              <w:t xml:space="preserve"> cannot target a window. Use tmux instead.</w:t>
+            </w:r>
+          </w:p>
+        </w:tc>
+      </w:tr>
+      <w:tr>
+        <w:trPr/>
+        <w:tc>
+          <w:tcPr>
+            <w:tcW w:w="5238" w:type="dxa"/>
+            <w:tcBorders/>
+            <w:vAlign w:val="center"/>
+          </w:tcPr>
+          <w:p>
+            <w:pPr>
+              <w:pStyle w:val="TableContents"/>
+              <w:shd w:fill="2E3440" w:val="clear"/>
+              <w:bidi w:val="0"/>
+              <w:spacing w:before="120" w:after="120"/>
+              <w:jc w:val="left"/>
+              <w:rPr/>
+            </w:pPr>
+            <w:r>
+              <w:rPr>
+                <w:rStyle w:val="SourceText"/>
+              </w:rPr>
+              <w:t>sent - method notify</w:t>
+            </w:r>
+          </w:p>
+        </w:tc>
+        <w:tc>
+          <w:tcPr>
+            <w:tcW w:w="6572" w:type="dxa"/>
+            <w:tcBorders/>
+            <w:vAlign w:val="center"/>
+          </w:tcPr>
+          <w:p>
+            <w:pPr>
+              <w:pStyle w:val="TableContents"/>
+              <w:shd w:fill="2E3440" w:val="clear"/>
+              <w:bidi w:val="0"/>
+              <w:spacing w:before="120" w:after="120"/>
+              <w:jc w:val="left"/>
+              <w:rPr/>
+            </w:pPr>
+            <w:r>
+              <w:rPr/>
+              <w:t xml:space="preserve">the message was printed — this is the normal, successful outcome for </w:t>
+            </w:r>
+            <w:r>
+              <w:rPr>
+                <w:rStyle w:val="SourceText"/>
+              </w:rPr>
+              <w:t>notify</w:t>
+            </w:r>
+          </w:p>
+        </w:tc>
+      </w:tr>
+      <w:tr>
+        <w:trPr/>
+        <w:tc>
+          <w:tcPr>
+            <w:tcW w:w="5238" w:type="dxa"/>
+            <w:tcBorders/>
+            <w:vAlign w:val="center"/>
+          </w:tcPr>
+          <w:p>
+            <w:pPr>
+              <w:pStyle w:val="TableContents"/>
+              <w:shd w:fill="2E3440" w:val="clear"/>
+              <w:bidi w:val="0"/>
+              <w:spacing w:before="120" w:after="120"/>
+              <w:jc w:val="left"/>
+              <w:rPr/>
+            </w:pPr>
+            <w:r>
+              <w:rPr>
+                <w:rStyle w:val="SourceText"/>
+              </w:rPr>
+              <w:t>declined sendkeys - cannot verify the active tab ...</w:t>
+            </w:r>
+          </w:p>
+        </w:tc>
+        <w:tc>
+          <w:tcPr>
+            <w:tcW w:w="6572" w:type="dxa"/>
+            <w:tcBorders/>
+            <w:vAlign w:val="center"/>
+          </w:tcPr>
+          <w:p>
+            <w:pPr>
+              <w:pStyle w:val="TableContents"/>
+              <w:shd w:fill="2E3440" w:val="clear"/>
+              <w:bidi w:val="0"/>
+              <w:spacing w:before="120" w:after="120"/>
+              <w:jc w:val="left"/>
+              <w:rPr/>
+            </w:pPr>
+            <w:r>
+              <w:rPr/>
+              <w:t xml:space="preserve">the target window is owned by Windows Terminal; </w:t>
+            </w:r>
+            <w:r>
+              <w:rPr>
+                <w:rStyle w:val="SourceText"/>
+              </w:rPr>
+              <w:t>sendkeys</w:t>
+            </w:r>
+            <w:r>
+              <w:rPr/>
+              <w:t xml:space="preserve"> fell back to </w:t>
+            </w:r>
+            <w:r>
+              <w:rPr>
+                <w:rStyle w:val="SourceText"/>
+              </w:rPr>
+              <w:t>notify</w:t>
+            </w:r>
+            <w:r>
+              <w:rPr/>
+              <w:t xml:space="preserve"> instead of guessing which tab is active</w:t>
+            </w:r>
+          </w:p>
+        </w:tc>
+      </w:tr>
+      <w:tr>
+        <w:trPr/>
+        <w:tc>
+          <w:tcPr>
+            <w:tcW w:w="5238" w:type="dxa"/>
             <w:tcBorders/>
             <w:vAlign w:val="center"/>
           </w:tcPr>
@@ -15181,7 +15652,7 @@
         </w:tc>
         <w:tc>
           <w:tcPr>
-            <w:tcW w:w="6320" w:type="dxa"/>
+            <w:tcW w:w="6572" w:type="dxa"/>
             <w:tcBorders/>
             <w:vAlign w:val="center"/>
           </w:tcPr>
@@ -15289,6 +15760,68 @@
       <w:r>
         <w:rPr/>
         <w:t xml:space="preserve"> identifies no window and needs none of this.</w:t>
+      </w:r>
+    </w:p>
+    <w:p>
+      <w:pPr>
+        <w:pStyle w:val="BodyText"/>
+        <w:bidi w:val="0"/>
+        <w:jc w:val="left"/>
+        <w:rPr/>
+      </w:pPr>
+      <w:r>
+        <w:rPr/>
+        <w:t>First, the session is bound to its own process: the nearest ancestor of the hook named by a Claude Code session record (</w:t>
+      </w:r>
+      <w:r>
+        <w:rPr>
+          <w:rStyle w:val="SourceText"/>
+        </w:rPr>
+        <w:t>${CLAUDE_CONFIG_DIR:-~/.claude}/sessions/&lt;pid&gt;.json</w:t>
+      </w:r>
+      <w:r>
+        <w:rPr/>
+        <w:t xml:space="preserve">) carrying this session's id and that process's start time. Only a session whose record says kind </w:t>
+      </w:r>
+      <w:r>
+        <w:rPr>
+          <w:rStyle w:val="SourceText"/>
+        </w:rPr>
+        <w:t>interactive</w:t>
+      </w:r>
+      <w:r>
+        <w:rPr/>
+        <w:t xml:space="preserve"> and entrypoint </w:t>
+      </w:r>
+      <w:r>
+        <w:rPr>
+          <w:rStyle w:val="SourceText"/>
+        </w:rPr>
+        <w:t>cli</w:t>
+      </w:r>
+      <w:r>
+        <w:rPr/>
+        <w:t xml:space="preserve">, with a controlling terminal (native Windows has none to read), is typed into. Every rule below walks up from that process, not from the hook, and refuses when the walk passes through another Claude Code session — a child started from a session's Bash tool inherits </w:t>
+      </w:r>
+      <w:r>
+        <w:rPr>
+          <w:rStyle w:val="SourceText"/>
+        </w:rPr>
+        <w:t>$TMUX</w:t>
+      </w:r>
+      <w:r>
+        <w:rPr/>
+        <w:t xml:space="preserve">, and without this its parent's pane is the one that got </w:t>
+      </w:r>
+      <w:r>
+        <w:rPr>
+          <w:rStyle w:val="SourceText"/>
+        </w:rPr>
+        <w:t>/clear</w:t>
+      </w:r>
+      <w:r>
+        <w:rPr/>
+        <w:t>. CONFIG.md §14 has the full rules and their limits (Windows' entrypoint is unmeasured; macOS cannot check the start time).</w:t>
       </w:r>
     </w:p>
     <w:p>
@@ -15326,7 +15859,7 @@
       </w:r>
       <w:r>
         <w:rPr/>
-        <w:t xml:space="preserve">, and only when that pane's process is an ancestor of the hook. No title is needed. This is the most reliable method. </w:t>
+        <w:t xml:space="preserve">, and only when that pane's process is this session's own process or an ancestor of it. No title is needed. This is the most reliable method. </w:t>
       </w:r>
     </w:p>
     <w:p>
@@ -15366,7 +15899,7 @@
       </w:r>
       <w:r>
         <w:rPr/>
-        <w:t xml:space="preserve"> the one visible window owned by the nearest ancestor process of the hook. If that process owns more than one window, </w:t>
+        <w:t xml:space="preserve"> the one visible window owned by the nearest ancestor of the session's process, and only when no other terminal (another tab's tty, another session) runs under that window's owner. If that process owns more than one window, </w:t>
       </w:r>
       <w:r>
         <w:rPr>
@@ -15386,7 +15919,7 @@
       </w:r>
       <w:r>
         <w:rPr/>
-        <w:t xml:space="preserve">. The keystroke goes to that window id after it is activated and confirmed active. </w:t>
+        <w:t xml:space="preserve">, and no other session may be live, since a title cannot tell two apart. The keystroke goes to that window id after it is activated and confirmed active. </w:t>
       </w:r>
     </w:p>
     <w:p>

</xml_diff>

<commit_message>
T-0096: docs, verify rule, code map, diagrams; ticket folder removed (ships as code and CHANGELOG)
README, CONFIG.md and the troubleshooting guide (html/docx/pdf rebuilt) name the
shell resolvers, the readers routed, the readers still own-file and the
verify-gate.ps1 stand-down divergence until L-0681. One verify.json rule, appended,
priced from a measured run. docs/diagrams/index.html and README.md regenerated by
diagram_doc.py after a full render.

Claude-Session: https://claude.ai/code/session_016wQA2o38aSB65bpjaGpMVJ
</commit_message>
<xml_diff>
--- a/docs/guides/crew/crew-1.0-troubleshooting.docx
+++ b/docs/guides/crew/crew-1.0-troubleshooting.docx
@@ -4655,13 +4655,13 @@
       </w:r>
       <w:r>
         <w:rPr/>
-        <w:t xml:space="preserve"> means git could not name the main checkout; then no default is written either. The shell and PowerShell readers (</w:t>
-      </w:r>
-      <w:r>
-        <w:rPr>
-          <w:rStyle w:val="SourceText"/>
-        </w:rPr>
-        <w:t>verify-gate.sh</w:t>
+        <w:t xml:space="preserve"> means git could not name the main checkout; then no default is written either. Of the shell and PowerShell readers (T-0096), the incident stand-down read (</w:t>
+      </w:r>
+      <w:r>
+        <w:rPr>
+          <w:rStyle w:val="SourceText"/>
+        </w:rPr>
+        <w:t>_common.sh</w:t>
       </w:r>
       <w:r>
         <w:rPr/>
@@ -4671,17 +4671,37 @@
         <w:rPr>
           <w:rStyle w:val="SourceText"/>
         </w:rPr>
-        <w:t>_common.sh</w:t>
-      </w:r>
-      <w:r>
-        <w:rPr/>
-        <w:t xml:space="preserve">, </w:t>
-      </w:r>
-      <w:r>
-        <w:rPr>
-          <w:rStyle w:val="SourceText"/>
-        </w:rPr>
-        <w:t>notify.sh</w:t>
+        <w:t>promote-gate.ps1</w:t>
+      </w:r>
+      <w:r>
+        <w:rPr/>
+        <w:t xml:space="preserve">), both cloud-guard no-python fallbacks and </w:t>
+      </w:r>
+      <w:r>
+        <w:rPr>
+          <w:rStyle w:val="SourceText"/>
+        </w:rPr>
+        <w:t>auto-clear.ps1</w:t>
+      </w:r>
+      <w:r>
+        <w:rPr/>
+        <w:t xml:space="preserve"> inherit too; in the cloud guard's fallback </w:t>
+      </w:r>
+      <w:r>
+        <w:rPr>
+          <w:rStyle w:val="SourceText"/>
+        </w:rPr>
+        <w:t>unknown</w:t>
+      </w:r>
+      <w:r>
+        <w:rPr/>
+        <w:t xml:space="preserve"> counts as armed. The session hooks (</w:t>
+      </w:r>
+      <w:r>
+        <w:rPr>
+          <w:rStyle w:val="SourceText"/>
+        </w:rPr>
+        <w:t>notify</w:t>
       </w:r>
       <w:r>
         <w:rPr/>
@@ -4691,41 +4711,41 @@
         <w:rPr>
           <w:rStyle w:val="SourceText"/>
         </w:rPr>
-        <w:t>promote-gate.ps1</w:t>
-      </w:r>
-      <w:r>
-        <w:rPr/>
-        <w:t xml:space="preserve">, </w:t>
-      </w:r>
-      <w:r>
-        <w:rPr>
-          <w:rStyle w:val="SourceText"/>
-        </w:rPr>
-        <w:t>scope-guard.ps1</w:t>
-      </w:r>
-      <w:r>
-        <w:rPr/>
-        <w:t xml:space="preserve">, </w:t>
-      </w:r>
-      <w:r>
-        <w:rPr>
-          <w:rStyle w:val="SourceText"/>
-        </w:rPr>
-        <w:t>cloud-guard.ps1</w:t>
-      </w:r>
-      <w:r>
-        <w:rPr/>
-        <w:t xml:space="preserve">, </w:t>
-      </w:r>
-      <w:r>
-        <w:rPr>
-          <w:rStyle w:val="SourceText"/>
-        </w:rPr>
-        <w:t>auto-clear.ps1</w:t>
-      </w:r>
-      <w:r>
-        <w:rPr/>
-        <w:t xml:space="preserve">) do not inherit yet. </w:t>
+        <w:t>context-watch</w:t>
+      </w:r>
+      <w:r>
+        <w:rPr/>
+        <w:t xml:space="preserve">), the verify gate, the scope and completion wrappers and </w:t>
+      </w:r>
+      <w:r>
+        <w:rPr>
+          <w:rStyle w:val="SourceText"/>
+        </w:rPr>
+        <w:t>review_gate.py</w:t>
+      </w:r>
+      <w:r>
+        <w:rPr/>
+        <w:t xml:space="preserve"> do not inherit yet, so </w:t>
+      </w:r>
+      <w:r>
+        <w:rPr>
+          <w:rStyle w:val="SourceText"/>
+        </w:rPr>
+        <w:t>verify-gate.ps1</w:t>
+      </w:r>
+      <w:r>
+        <w:rPr/>
+        <w:t xml:space="preserve"> still reads the lane's own </w:t>
+      </w:r>
+      <w:r>
+        <w:rPr>
+          <w:rStyle w:val="SourceText"/>
+        </w:rPr>
+        <w:t>emergency.standDown</w:t>
+      </w:r>
+      <w:r>
+        <w:rPr/>
+        <w:t xml:space="preserve"> while the bash gate reads the inherited one. </w:t>
       </w:r>
     </w:p>
     <w:p>

</xml_diff>

<commit_message>
L-0680: docs, verify rule, code map, diagrams, guide, graph; ticket folder removed (ships as code and CHANGELOG)
README, CONFIG.md and the troubleshooting guide drop the session hooks from the
not-yet-covered list (L-0681 has not landed, so the list keeps the harness
readers); README states that a lane notifies with the main checkout's settings
and that a relative handoff path stays in the lane. T-0096's verify rule gains
the eight scripts, re-priced 36s.

Claude-Session: https://claude.ai/code/session_016wQA2o38aSB65bpjaGpMVJ
</commit_message>
<xml_diff>
--- a/docs/guides/crew/crew-1.0-troubleshooting.docx
+++ b/docs/guides/crew/crew-1.0-troubleshooting.docx
@@ -4715,7 +4715,7 @@
       </w:r>
       <w:r>
         <w:rPr/>
-        <w:t xml:space="preserve"> counts as armed. The session hooks (</w:t>
+        <w:t xml:space="preserve"> counts as armed. So do the session hooks (</w:t>
       </w:r>
       <w:r>
         <w:rPr>
@@ -4735,7 +4735,7 @@
       </w:r>
       <w:r>
         <w:rPr/>
-        <w:t xml:space="preserve">), the verify gate, the scope and completion wrappers and </w:t>
+        <w:t xml:space="preserve">; crew 1.0.404, L-0680): a lane notifies with the main checkout's settings, and a relative handoff path still names a file in the lane. The verify gate, the scope and completion wrappers and </w:t>
       </w:r>
       <w:r>
         <w:rPr>

</xml_diff>

<commit_message>
L-0673: CI receipt lists could-not-tell as UNKNOWN; verify.md states the completion-record rule
ci_receipt.parse_log reads T-0082's COULD NOT TELL line as UNKNOWN and lists
a command named failed with no elapsed line (a gate killed mid-rule) as
UNKNOWN with seconds null. The receipt records log_complete; with a non-zero
gate exit the job summary says the list is partial. Acceptance unchanged.

verify.md gains "A rule passes only on a completion record", inside its
226-line allowance: the section is offset by rewrapping four existing
sections to 100 columns, no wording changed.

Claude-Session: https://claude.ai/code/session_016wQA2o38aSB65bpjaGpMVJ
</commit_message>
<xml_diff>
--- a/docs/guides/crew/crew-1.0-troubleshooting.docx
+++ b/docs/guides/crew/crew-1.0-troubleshooting.docx
@@ -6394,6 +6394,68 @@
       <w:r>
         <w:rPr/>
         <w:t xml:space="preserve"> for such a rule; the record sync leaves that rule's entry as it was and the tree-pass cache never stores it. The gate still waits as long as a rule runs - a hung rule is not ended by the gate.</w:t>
+      </w:r>
+    </w:p>
+    <w:p>
+      <w:pPr>
+        <w:pStyle w:val="BodyText"/>
+        <w:bidi w:val="0"/>
+        <w:jc w:val="left"/>
+        <w:rPr/>
+      </w:pPr>
+      <w:r>
+        <w:rPr/>
+        <w:t>The CI receipt (</w:t>
+      </w:r>
+      <w:r>
+        <w:rPr>
+          <w:rStyle w:val="SourceText"/>
+        </w:rPr>
+        <w:t>ci_receipt.py</w:t>
+      </w:r>
+      <w:r>
+        <w:rPr/>
+        <w:t xml:space="preserve">, L-0673) lists such a command as </w:t>
+      </w:r>
+      <w:r>
+        <w:rPr>
+          <w:rStyle w:val="SourceText"/>
+        </w:rPr>
+        <w:t>UNKNOWN</w:t>
+      </w:r>
+      <w:r>
+        <w:rPr/>
+        <w:t xml:space="preserve">, never </w:t>
+      </w:r>
+      <w:r>
+        <w:rPr>
+          <w:rStyle w:val="SourceText"/>
+        </w:rPr>
+        <w:t>PASS</w:t>
+      </w:r>
+      <w:r>
+        <w:rPr/>
+        <w:t xml:space="preserve">, and so a command the gate named failed but never finished (a gate killed mid-rule). A log that ends before the </w:t>
+      </w:r>
+      <w:r>
+        <w:rPr>
+          <w:rStyle w:val="SourceText"/>
+        </w:rPr>
+        <w:t>verify-gate: &lt;N&gt;s total across</w:t>
+      </w:r>
+      <w:r>
+        <w:rPr/>
+        <w:t xml:space="preserve"> line records </w:t>
+      </w:r>
+      <w:r>
+        <w:rPr>
+          <w:rStyle w:val="SourceText"/>
+        </w:rPr>
+        <w:t>log_complete: false</w:t>
+      </w:r>
+      <w:r>
+        <w:rPr/>
+        <w:t>; when the gate also exited non-zero, the job summary says the list is partial. The list is informative only: what the receipt accepts did not change.</w:t>
       </w:r>
     </w:p>
     <w:p>

</xml_diff>

<commit_message>
L-0673: review fixes - log_complete needs the total line after the last rule; flake-free real-gate test
FIX 1: a failing rule's echoed output can carry a nested gate's total line,
so log_complete is true only when the total line follows the last per-rule
line. Test from the reviewer's real-gate repro, sabotage-tested.
FIX 2: the real-gate test pins seconds' type, not its value.
NITs: verify.md lines 1-114 unchanged (verify-gate.ps1:19-20 cites :72 and
:114), the offset comes from later sections only; the reasons list names
the unwritable capture, the ps1-only reasons and the bash-only signal case;
SKIP without an elapsed line is UNKNOWN in the wording; the CHANGELOG no
longer claims "never PASS".

Claude-Session: https://claude.ai/code/session_016wQA2o38aSB65bpjaGpMVJ
</commit_message>
<xml_diff>
--- a/docs/guides/crew/crew-1.0-troubleshooting.docx
+++ b/docs/guides/crew/crew-1.0-troubleshooting.docx
@@ -6425,17 +6425,7 @@
       </w:r>
       <w:r>
         <w:rPr/>
-        <w:t xml:space="preserve">, never </w:t>
-      </w:r>
-      <w:r>
-        <w:rPr>
-          <w:rStyle w:val="SourceText"/>
-        </w:rPr>
-        <w:t>PASS</w:t>
-      </w:r>
-      <w:r>
-        <w:rPr/>
-        <w:t xml:space="preserve">, and so a command the gate named failed but never finished (a gate killed mid-rule). A log that ends before the </w:t>
+        <w:t xml:space="preserve">, and so a command the gate named failed, skipped or could-not-tell but never finished (a gate killed mid-rule). A log whose </w:t>
       </w:r>
       <w:r>
         <w:rPr>
@@ -6445,7 +6435,7 @@
       </w:r>
       <w:r>
         <w:rPr/>
-        <w:t xml:space="preserve"> line records </w:t>
+        <w:t xml:space="preserve"> line does not come after its last per-rule line records </w:t>
       </w:r>
       <w:r>
         <w:rPr>

</xml_diff>

<commit_message>
batch 8: regenerate rules, diagrams page, troubleshooting guide; re-measure BUDGETS
crew_instructions.py rules, render.sh + diagram_doc.py --write (index.html),
crew_diagrams.py embed (already current), config_reference.py --write (no
change), build.py --guide troubleshooting (its docx/pdf were taken from one
side at the T-0051 merge; the HTML auto-merged), build.py --check clean.
plugin/crew Markdown re-measured: 24,572 lines across 141 files.

Claude-Session: https://claude.ai/code/session_016wQA2o38aSB65bpjaGpMVJ
</commit_message>
<xml_diff>
--- a/docs/guides/crew/crew-1.0-troubleshooting.docx
+++ b/docs/guides/crew/crew-1.0-troubleshooting.docx
@@ -545,7 +545,7 @@
     </w:p>
     <w:tbl>
       <w:tblPr>
-        <w:tblW w:w="11810" w:type="dxa"/>
+        <w:tblW w:w="11825" w:type="dxa"/>
         <w:jc w:val="left"/>
         <w:tblInd w:w="0" w:type="dxa"/>
         <w:tblLayout w:type="fixed"/>
@@ -559,7 +559,7 @@
       <w:tblGrid>
         <w:gridCol w:w="2116"/>
         <w:gridCol w:w="2446"/>
-        <w:gridCol w:w="2131"/>
+        <w:gridCol w:w="2146"/>
         <w:gridCol w:w="2986"/>
         <w:gridCol w:w="2131"/>
       </w:tblGrid>
@@ -613,7 +613,7 @@
         </w:tc>
         <w:tc>
           <w:tcPr>
-            <w:tcW w:w="2131" w:type="dxa"/>
+            <w:tcW w:w="2146" w:type="dxa"/>
             <w:tcBorders/>
             <w:vAlign w:val="center"/>
           </w:tcPr>
@@ -728,7 +728,7 @@
         </w:tc>
         <w:tc>
           <w:tcPr>
-            <w:tcW w:w="2131" w:type="dxa"/>
+            <w:tcW w:w="2146" w:type="dxa"/>
             <w:tcBorders/>
             <w:vAlign w:val="center"/>
           </w:tcPr>
@@ -864,7 +864,7 @@
         </w:tc>
         <w:tc>
           <w:tcPr>
-            <w:tcW w:w="2131" w:type="dxa"/>
+            <w:tcW w:w="2146" w:type="dxa"/>
             <w:tcBorders/>
             <w:vAlign w:val="center"/>
           </w:tcPr>
@@ -1016,7 +1016,7 @@
         </w:tc>
         <w:tc>
           <w:tcPr>
-            <w:tcW w:w="2131" w:type="dxa"/>
+            <w:tcW w:w="2146" w:type="dxa"/>
             <w:tcBorders/>
             <w:vAlign w:val="center"/>
           </w:tcPr>
@@ -1156,7 +1156,7 @@
         </w:tc>
         <w:tc>
           <w:tcPr>
-            <w:tcW w:w="2131" w:type="dxa"/>
+            <w:tcW w:w="2146" w:type="dxa"/>
             <w:tcBorders/>
             <w:vAlign w:val="center"/>
           </w:tcPr>
@@ -1308,7 +1308,7 @@
         </w:tc>
         <w:tc>
           <w:tcPr>
-            <w:tcW w:w="2131" w:type="dxa"/>
+            <w:tcW w:w="2146" w:type="dxa"/>
             <w:tcBorders/>
             <w:vAlign w:val="center"/>
           </w:tcPr>
@@ -1538,7 +1538,7 @@
         </w:tc>
         <w:tc>
           <w:tcPr>
-            <w:tcW w:w="2131" w:type="dxa"/>
+            <w:tcW w:w="2146" w:type="dxa"/>
             <w:tcBorders/>
             <w:vAlign w:val="center"/>
           </w:tcPr>
@@ -1712,7 +1712,7 @@
         </w:tc>
         <w:tc>
           <w:tcPr>
-            <w:tcW w:w="2131" w:type="dxa"/>
+            <w:tcW w:w="2146" w:type="dxa"/>
             <w:tcBorders/>
             <w:vAlign w:val="center"/>
           </w:tcPr>
@@ -1946,7 +1946,7 @@
         </w:tc>
         <w:tc>
           <w:tcPr>
-            <w:tcW w:w="2131" w:type="dxa"/>
+            <w:tcW w:w="2146" w:type="dxa"/>
             <w:tcBorders/>
             <w:vAlign w:val="center"/>
           </w:tcPr>
@@ -2122,7 +2122,7 @@
         </w:tc>
         <w:tc>
           <w:tcPr>
-            <w:tcW w:w="2131" w:type="dxa"/>
+            <w:tcW w:w="2146" w:type="dxa"/>
             <w:tcBorders/>
             <w:vAlign w:val="center"/>
           </w:tcPr>
@@ -2242,6 +2242,124 @@
               </w:rPr>
               <w:t>notify.sh</w:t>
             </w:r>
+            <w:r>
+              <w:rPr/>
+              <w:t xml:space="preserve"> (</w:t>
+            </w:r>
+            <w:r>
+              <w:rPr>
+                <w:rStyle w:val="SourceText"/>
+              </w:rPr>
+              <w:t>crew_notify.py hook</w:t>
+            </w:r>
+            <w:r>
+              <w:rPr/>
+              <w:t>)</w:t>
+            </w:r>
+          </w:p>
+        </w:tc>
+        <w:tc>
+          <w:tcPr>
+            <w:tcW w:w="2146" w:type="dxa"/>
+            <w:tcBorders/>
+            <w:vAlign w:val="center"/>
+          </w:tcPr>
+          <w:p>
+            <w:pPr>
+              <w:pStyle w:val="TableContents"/>
+              <w:shd w:fill="2E3440" w:val="clear"/>
+              <w:bidi w:val="0"/>
+              <w:spacing w:before="120" w:after="120"/>
+              <w:jc w:val="left"/>
+              <w:rPr/>
+            </w:pPr>
+            <w:r>
+              <w:rPr/>
+              <w:t xml:space="preserve">a </w:t>
+            </w:r>
+            <w:r>
+              <w:rPr>
+                <w:rStyle w:val="SourceText"/>
+              </w:rPr>
+              <w:t>Question</w:t>
+            </w:r>
+            <w:r>
+              <w:rPr/>
+              <w:t xml:space="preserve"> / </w:t>
+            </w:r>
+            <w:r>
+              <w:rPr>
+                <w:rStyle w:val="SourceText"/>
+              </w:rPr>
+              <w:t>Needs permission</w:t>
+            </w:r>
+            <w:r>
+              <w:rPr/>
+              <w:t xml:space="preserve"> ping when Claude stopped on a permission prompt, an AskUserQuestion or an elicitation; never </w:t>
+            </w:r>
+            <w:r>
+              <w:rPr>
+                <w:rStyle w:val="SourceText"/>
+              </w:rPr>
+              <w:t>idle_prompt</w:t>
+            </w:r>
+            <w:r>
+              <w:rPr/>
+              <w:t>; once per waiting episode</w:t>
+            </w:r>
+          </w:p>
+        </w:tc>
+        <w:tc>
+          <w:tcPr>
+            <w:tcW w:w="2986" w:type="dxa"/>
+            <w:tcBorders/>
+            <w:vAlign w:val="center"/>
+          </w:tcPr>
+          <w:p>
+            <w:pPr>
+              <w:pStyle w:val="TableContents"/>
+              <w:shd w:fill="2E3440" w:val="clear"/>
+              <w:bidi w:val="0"/>
+              <w:spacing w:before="120" w:after="120"/>
+              <w:jc w:val="left"/>
+              <w:rPr/>
+            </w:pPr>
+            <w:r>
+              <w:rPr>
+                <w:rStyle w:val="SourceText"/>
+              </w:rPr>
+              <w:t>notify.provider</w:t>
+            </w:r>
+            <w:r>
+              <w:rPr/>
+              <w:t xml:space="preserve"> (</w:t>
+            </w:r>
+            <w:r>
+              <w:rPr>
+                <w:rStyle w:val="SourceText"/>
+              </w:rPr>
+              <w:t>none</w:t>
+            </w:r>
+            <w:r>
+              <w:rPr/>
+              <w:t xml:space="preserve"> or null disables it), </w:t>
+            </w:r>
+            <w:r>
+              <w:rPr>
+                <w:rStyle w:val="SourceText"/>
+              </w:rPr>
+              <w:t>notify.events</w:t>
+            </w:r>
+            <w:r>
+              <w:rPr/>
+              <w:t xml:space="preserve">, </w:t>
+            </w:r>
+            <w:r>
+              <w:rPr>
+                <w:rStyle w:val="SourceText"/>
+              </w:rPr>
+              <w:t>notify.questionTypes</w:t>
+            </w:r>
           </w:p>
         </w:tc>
         <w:tc>
@@ -2261,73 +2379,7 @@
             </w:pPr>
             <w:r>
               <w:rPr/>
-              <w:t>pings an external channel</w:t>
-            </w:r>
-          </w:p>
-        </w:tc>
-        <w:tc>
-          <w:tcPr>
-            <w:tcW w:w="2986" w:type="dxa"/>
-            <w:tcBorders/>
-            <w:vAlign w:val="center"/>
-          </w:tcPr>
-          <w:p>
-            <w:pPr>
-              <w:pStyle w:val="TableContents"/>
-              <w:shd w:fill="2E3440" w:val="clear"/>
-              <w:bidi w:val="0"/>
-              <w:spacing w:before="120" w:after="120"/>
-              <w:jc w:val="left"/>
-              <w:rPr/>
-            </w:pPr>
-            <w:r>
-              <w:rPr>
-                <w:rStyle w:val="SourceText"/>
-              </w:rPr>
-              <w:t>notify.provider</w:t>
-            </w:r>
-            <w:r>
-              <w:rPr/>
-              <w:t xml:space="preserve"> (</w:t>
-            </w:r>
-            <w:r>
-              <w:rPr>
-                <w:rStyle w:val="SourceText"/>
-              </w:rPr>
-              <w:t>none</w:t>
-            </w:r>
-            <w:r>
-              <w:rPr/>
-              <w:t xml:space="preserve"> disables it), </w:t>
-            </w:r>
-            <w:r>
-              <w:rPr>
-                <w:rStyle w:val="SourceText"/>
-              </w:rPr>
-              <w:t>notify.events</w:t>
-            </w:r>
-          </w:p>
-        </w:tc>
-        <w:tc>
-          <w:tcPr>
-            <w:tcW w:w="2131" w:type="dxa"/>
-            <w:tcBorders/>
-            <w:vAlign w:val="center"/>
-          </w:tcPr>
-          <w:p>
-            <w:pPr>
-              <w:pStyle w:val="TableContents"/>
-              <w:shd w:fill="2E3440" w:val="clear"/>
-              <w:bidi w:val="0"/>
-              <w:spacing w:before="120" w:after="120"/>
-              <w:jc w:val="left"/>
-              <w:rPr/>
-            </w:pPr>
-            <w:r>
-              <w:rPr>
-                <w:rStyle w:val="SourceText"/>
-              </w:rPr>
-              <w:t>none</w:t>
+              <w:t>off</w:t>
             </w:r>
           </w:p>
         </w:tc>
@@ -2382,7 +2434,7 @@
         </w:tc>
         <w:tc>
           <w:tcPr>
-            <w:tcW w:w="2131" w:type="dxa"/>
+            <w:tcW w:w="2146" w:type="dxa"/>
             <w:tcBorders/>
             <w:vAlign w:val="center"/>
           </w:tcPr>
@@ -2512,7 +2564,7 @@
         </w:tc>
         <w:tc>
           <w:tcPr>
-            <w:tcW w:w="2131" w:type="dxa"/>
+            <w:tcW w:w="2146" w:type="dxa"/>
             <w:tcBorders/>
             <w:vAlign w:val="center"/>
           </w:tcPr>
@@ -2672,7 +2724,7 @@
         </w:tc>
         <w:tc>
           <w:tcPr>
-            <w:tcW w:w="2131" w:type="dxa"/>
+            <w:tcW w:w="2146" w:type="dxa"/>
             <w:tcBorders/>
             <w:vAlign w:val="center"/>
           </w:tcPr>
@@ -9505,7 +9557,7 @@
     </w:p>
     <w:tbl>
       <w:tblPr>
-        <w:tblW w:w="11810" w:type="dxa"/>
+        <w:tblW w:w="11825" w:type="dxa"/>
         <w:jc w:val="left"/>
         <w:tblInd w:w="0" w:type="dxa"/>
         <w:tblLayout w:type="fixed"/>
@@ -9517,10 +9569,10 @@
         </w:tblCellMar>
       </w:tblPr>
       <w:tblGrid>
-        <w:gridCol w:w="4730"/>
-        <w:gridCol w:w="1699"/>
-        <w:gridCol w:w="1841"/>
-        <w:gridCol w:w="3540"/>
+        <w:gridCol w:w="4369"/>
+        <w:gridCol w:w="1689"/>
+        <w:gridCol w:w="1687"/>
+        <w:gridCol w:w="4080"/>
       </w:tblGrid>
       <w:tr>
         <w:trPr>
@@ -9528,7 +9580,7 @@
         </w:trPr>
         <w:tc>
           <w:tcPr>
-            <w:tcW w:w="4730" w:type="dxa"/>
+            <w:tcW w:w="4369" w:type="dxa"/>
             <w:tcBorders/>
             <w:vAlign w:val="center"/>
           </w:tcPr>
@@ -9550,7 +9602,7 @@
         </w:tc>
         <w:tc>
           <w:tcPr>
-            <w:tcW w:w="1699" w:type="dxa"/>
+            <w:tcW w:w="1689" w:type="dxa"/>
             <w:tcBorders/>
             <w:vAlign w:val="center"/>
           </w:tcPr>
@@ -9572,7 +9624,7 @@
         </w:tc>
         <w:tc>
           <w:tcPr>
-            <w:tcW w:w="1841" w:type="dxa"/>
+            <w:tcW w:w="1687" w:type="dxa"/>
             <w:tcBorders/>
             <w:vAlign w:val="center"/>
           </w:tcPr>
@@ -9594,7 +9646,7 @@
         </w:tc>
         <w:tc>
           <w:tcPr>
-            <w:tcW w:w="3540" w:type="dxa"/>
+            <w:tcW w:w="4080" w:type="dxa"/>
             <w:tcBorders/>
             <w:vAlign w:val="center"/>
           </w:tcPr>
@@ -9619,7 +9671,7 @@
         <w:trPr/>
         <w:tc>
           <w:tcPr>
-            <w:tcW w:w="4730" w:type="dxa"/>
+            <w:tcW w:w="4369" w:type="dxa"/>
             <w:tcBorders/>
             <w:vAlign w:val="center"/>
           </w:tcPr>
@@ -9642,7 +9694,7 @@
         </w:tc>
         <w:tc>
           <w:tcPr>
-            <w:tcW w:w="1699" w:type="dxa"/>
+            <w:tcW w:w="1689" w:type="dxa"/>
             <w:tcBorders/>
             <w:vAlign w:val="center"/>
           </w:tcPr>
@@ -9663,7 +9715,7 @@
         </w:tc>
         <w:tc>
           <w:tcPr>
-            <w:tcW w:w="1841" w:type="dxa"/>
+            <w:tcW w:w="1687" w:type="dxa"/>
             <w:tcBorders/>
             <w:vAlign w:val="center"/>
           </w:tcPr>
@@ -9684,7 +9736,7 @@
         </w:tc>
         <w:tc>
           <w:tcPr>
-            <w:tcW w:w="3540" w:type="dxa"/>
+            <w:tcW w:w="4080" w:type="dxa"/>
             <w:tcBorders/>
             <w:vAlign w:val="center"/>
           </w:tcPr>
@@ -9724,7 +9776,7 @@
         <w:trPr/>
         <w:tc>
           <w:tcPr>
-            <w:tcW w:w="4730" w:type="dxa"/>
+            <w:tcW w:w="4369" w:type="dxa"/>
             <w:tcBorders/>
             <w:vAlign w:val="center"/>
           </w:tcPr>
@@ -9747,7 +9799,7 @@
         </w:tc>
         <w:tc>
           <w:tcPr>
-            <w:tcW w:w="1699" w:type="dxa"/>
+            <w:tcW w:w="1689" w:type="dxa"/>
             <w:tcBorders/>
             <w:vAlign w:val="center"/>
           </w:tcPr>
@@ -9768,7 +9820,7 @@
         </w:tc>
         <w:tc>
           <w:tcPr>
-            <w:tcW w:w="1841" w:type="dxa"/>
+            <w:tcW w:w="1687" w:type="dxa"/>
             <w:tcBorders/>
             <w:vAlign w:val="center"/>
           </w:tcPr>
@@ -9811,7 +9863,7 @@
         </w:tc>
         <w:tc>
           <w:tcPr>
-            <w:tcW w:w="3540" w:type="dxa"/>
+            <w:tcW w:w="4080" w:type="dxa"/>
             <w:tcBorders/>
             <w:vAlign w:val="center"/>
           </w:tcPr>
@@ -9841,7 +9893,7 @@
         <w:trPr/>
         <w:tc>
           <w:tcPr>
-            <w:tcW w:w="4730" w:type="dxa"/>
+            <w:tcW w:w="4369" w:type="dxa"/>
             <w:tcBorders/>
             <w:vAlign w:val="center"/>
           </w:tcPr>
@@ -9864,7 +9916,7 @@
         </w:tc>
         <w:tc>
           <w:tcPr>
-            <w:tcW w:w="1699" w:type="dxa"/>
+            <w:tcW w:w="1689" w:type="dxa"/>
             <w:tcBorders/>
             <w:vAlign w:val="center"/>
           </w:tcPr>
@@ -9885,7 +9937,7 @@
         </w:tc>
         <w:tc>
           <w:tcPr>
-            <w:tcW w:w="1841" w:type="dxa"/>
+            <w:tcW w:w="1687" w:type="dxa"/>
             <w:tcBorders/>
             <w:vAlign w:val="center"/>
           </w:tcPr>
@@ -9928,7 +9980,7 @@
         </w:tc>
         <w:tc>
           <w:tcPr>
-            <w:tcW w:w="3540" w:type="dxa"/>
+            <w:tcW w:w="4080" w:type="dxa"/>
             <w:tcBorders/>
             <w:vAlign w:val="center"/>
           </w:tcPr>
@@ -9958,7 +10010,7 @@
         <w:trPr/>
         <w:tc>
           <w:tcPr>
-            <w:tcW w:w="4730" w:type="dxa"/>
+            <w:tcW w:w="4369" w:type="dxa"/>
             <w:tcBorders/>
             <w:vAlign w:val="center"/>
           </w:tcPr>
@@ -10031,7 +10083,7 @@
         </w:tc>
         <w:tc>
           <w:tcPr>
-            <w:tcW w:w="1699" w:type="dxa"/>
+            <w:tcW w:w="1689" w:type="dxa"/>
             <w:tcBorders/>
             <w:vAlign w:val="center"/>
           </w:tcPr>
@@ -10052,7 +10104,7 @@
         </w:tc>
         <w:tc>
           <w:tcPr>
-            <w:tcW w:w="1841" w:type="dxa"/>
+            <w:tcW w:w="1687" w:type="dxa"/>
             <w:tcBorders/>
             <w:vAlign w:val="center"/>
           </w:tcPr>
@@ -10095,7 +10147,7 @@
         </w:tc>
         <w:tc>
           <w:tcPr>
-            <w:tcW w:w="3540" w:type="dxa"/>
+            <w:tcW w:w="4080" w:type="dxa"/>
             <w:tcBorders/>
             <w:vAlign w:val="center"/>
           </w:tcPr>
@@ -10129,7 +10181,7 @@
         <w:trPr/>
         <w:tc>
           <w:tcPr>
-            <w:tcW w:w="4730" w:type="dxa"/>
+            <w:tcW w:w="4369" w:type="dxa"/>
             <w:tcBorders/>
             <w:vAlign w:val="center"/>
           </w:tcPr>
@@ -10162,7 +10214,7 @@
         </w:tc>
         <w:tc>
           <w:tcPr>
-            <w:tcW w:w="1699" w:type="dxa"/>
+            <w:tcW w:w="1689" w:type="dxa"/>
             <w:tcBorders/>
             <w:vAlign w:val="center"/>
           </w:tcPr>
@@ -10183,7 +10235,7 @@
         </w:tc>
         <w:tc>
           <w:tcPr>
-            <w:tcW w:w="1841" w:type="dxa"/>
+            <w:tcW w:w="1687" w:type="dxa"/>
             <w:tcBorders/>
             <w:vAlign w:val="center"/>
           </w:tcPr>
@@ -10226,7 +10278,7 @@
         </w:tc>
         <w:tc>
           <w:tcPr>
-            <w:tcW w:w="3540" w:type="dxa"/>
+            <w:tcW w:w="4080" w:type="dxa"/>
             <w:tcBorders/>
             <w:vAlign w:val="center"/>
           </w:tcPr>
@@ -10256,7 +10308,7 @@
         <w:trPr/>
         <w:tc>
           <w:tcPr>
-            <w:tcW w:w="4730" w:type="dxa"/>
+            <w:tcW w:w="4369" w:type="dxa"/>
             <w:tcBorders/>
             <w:vAlign w:val="center"/>
           </w:tcPr>
@@ -10279,7 +10331,7 @@
         </w:tc>
         <w:tc>
           <w:tcPr>
-            <w:tcW w:w="1699" w:type="dxa"/>
+            <w:tcW w:w="1689" w:type="dxa"/>
             <w:tcBorders/>
             <w:vAlign w:val="center"/>
           </w:tcPr>
@@ -10300,7 +10352,7 @@
         </w:tc>
         <w:tc>
           <w:tcPr>
-            <w:tcW w:w="1841" w:type="dxa"/>
+            <w:tcW w:w="1687" w:type="dxa"/>
             <w:tcBorders/>
             <w:vAlign w:val="center"/>
           </w:tcPr>
@@ -10353,7 +10405,7 @@
         </w:tc>
         <w:tc>
           <w:tcPr>
-            <w:tcW w:w="3540" w:type="dxa"/>
+            <w:tcW w:w="4080" w:type="dxa"/>
             <w:tcBorders/>
             <w:vAlign w:val="center"/>
           </w:tcPr>
@@ -10383,7 +10435,7 @@
         <w:trPr/>
         <w:tc>
           <w:tcPr>
-            <w:tcW w:w="4730" w:type="dxa"/>
+            <w:tcW w:w="4369" w:type="dxa"/>
             <w:tcBorders/>
             <w:vAlign w:val="center"/>
           </w:tcPr>
@@ -10406,7 +10458,7 @@
         </w:tc>
         <w:tc>
           <w:tcPr>
-            <w:tcW w:w="1699" w:type="dxa"/>
+            <w:tcW w:w="1689" w:type="dxa"/>
             <w:tcBorders/>
             <w:vAlign w:val="center"/>
           </w:tcPr>
@@ -10427,7 +10479,7 @@
         </w:tc>
         <w:tc>
           <w:tcPr>
-            <w:tcW w:w="1841" w:type="dxa"/>
+            <w:tcW w:w="1687" w:type="dxa"/>
             <w:tcBorders/>
             <w:vAlign w:val="center"/>
           </w:tcPr>
@@ -10448,7 +10500,7 @@
         </w:tc>
         <w:tc>
           <w:tcPr>
-            <w:tcW w:w="3540" w:type="dxa"/>
+            <w:tcW w:w="4080" w:type="dxa"/>
             <w:tcBorders/>
             <w:vAlign w:val="center"/>
           </w:tcPr>
@@ -10508,7 +10560,7 @@
         <w:trPr/>
         <w:tc>
           <w:tcPr>
-            <w:tcW w:w="4730" w:type="dxa"/>
+            <w:tcW w:w="4369" w:type="dxa"/>
             <w:tcBorders/>
             <w:vAlign w:val="center"/>
           </w:tcPr>
@@ -10531,7 +10583,7 @@
         </w:tc>
         <w:tc>
           <w:tcPr>
-            <w:tcW w:w="1699" w:type="dxa"/>
+            <w:tcW w:w="1689" w:type="dxa"/>
             <w:tcBorders/>
             <w:vAlign w:val="center"/>
           </w:tcPr>
@@ -10552,7 +10604,7 @@
         </w:tc>
         <w:tc>
           <w:tcPr>
-            <w:tcW w:w="1841" w:type="dxa"/>
+            <w:tcW w:w="1687" w:type="dxa"/>
             <w:tcBorders/>
             <w:vAlign w:val="center"/>
           </w:tcPr>
@@ -10573,7 +10625,7 @@
         </w:tc>
         <w:tc>
           <w:tcPr>
-            <w:tcW w:w="3540" w:type="dxa"/>
+            <w:tcW w:w="4080" w:type="dxa"/>
             <w:tcBorders/>
             <w:vAlign w:val="center"/>
           </w:tcPr>
@@ -10603,7 +10655,7 @@
         <w:trPr/>
         <w:tc>
           <w:tcPr>
-            <w:tcW w:w="4730" w:type="dxa"/>
+            <w:tcW w:w="4369" w:type="dxa"/>
             <w:tcBorders/>
             <w:vAlign w:val="center"/>
           </w:tcPr>
@@ -10626,7 +10678,7 @@
         </w:tc>
         <w:tc>
           <w:tcPr>
-            <w:tcW w:w="1699" w:type="dxa"/>
+            <w:tcW w:w="1689" w:type="dxa"/>
             <w:tcBorders/>
             <w:vAlign w:val="center"/>
           </w:tcPr>
@@ -10647,7 +10699,7 @@
         </w:tc>
         <w:tc>
           <w:tcPr>
-            <w:tcW w:w="1841" w:type="dxa"/>
+            <w:tcW w:w="1687" w:type="dxa"/>
             <w:tcBorders/>
             <w:vAlign w:val="center"/>
           </w:tcPr>
@@ -10668,7 +10720,7 @@
         </w:tc>
         <w:tc>
           <w:tcPr>
-            <w:tcW w:w="3540" w:type="dxa"/>
+            <w:tcW w:w="4080" w:type="dxa"/>
             <w:tcBorders/>
             <w:vAlign w:val="center"/>
           </w:tcPr>
@@ -10708,7 +10760,7 @@
         <w:trPr/>
         <w:tc>
           <w:tcPr>
-            <w:tcW w:w="4730" w:type="dxa"/>
+            <w:tcW w:w="4369" w:type="dxa"/>
             <w:tcBorders/>
             <w:vAlign w:val="center"/>
           </w:tcPr>
@@ -10741,7 +10793,7 @@
         </w:tc>
         <w:tc>
           <w:tcPr>
-            <w:tcW w:w="1699" w:type="dxa"/>
+            <w:tcW w:w="1689" w:type="dxa"/>
             <w:tcBorders/>
             <w:vAlign w:val="center"/>
           </w:tcPr>
@@ -10762,7 +10814,7 @@
         </w:tc>
         <w:tc>
           <w:tcPr>
-            <w:tcW w:w="1841" w:type="dxa"/>
+            <w:tcW w:w="1687" w:type="dxa"/>
             <w:tcBorders/>
             <w:vAlign w:val="center"/>
           </w:tcPr>
@@ -10783,7 +10835,7 @@
         </w:tc>
         <w:tc>
           <w:tcPr>
-            <w:tcW w:w="3540" w:type="dxa"/>
+            <w:tcW w:w="4080" w:type="dxa"/>
             <w:tcBorders/>
             <w:vAlign w:val="center"/>
           </w:tcPr>
@@ -10807,7 +10859,7 @@
         <w:trPr/>
         <w:tc>
           <w:tcPr>
-            <w:tcW w:w="4730" w:type="dxa"/>
+            <w:tcW w:w="4369" w:type="dxa"/>
             <w:tcBorders/>
             <w:vAlign w:val="center"/>
           </w:tcPr>
@@ -10830,43 +10882,59 @@
         </w:tc>
         <w:tc>
           <w:tcPr>
-            <w:tcW w:w="1699" w:type="dxa"/>
-            <w:tcBorders/>
-            <w:vAlign w:val="center"/>
-          </w:tcPr>
-          <w:p>
-            <w:pPr>
-              <w:pStyle w:val="TableContents"/>
-              <w:shd w:fill="2E3440" w:val="clear"/>
-              <w:bidi w:val="0"/>
-              <w:spacing w:before="120" w:after="120"/>
-              <w:jc w:val="left"/>
-              <w:rPr/>
-            </w:pPr>
-            <w:r>
-              <w:rPr/>
-              <w:t>both layers</w:t>
-            </w:r>
-          </w:p>
-        </w:tc>
-        <w:tc>
-          <w:tcPr>
-            <w:tcW w:w="1841" w:type="dxa"/>
-            <w:tcBorders/>
-            <w:vAlign w:val="center"/>
-          </w:tcPr>
-          <w:p>
-            <w:pPr>
-              <w:pStyle w:val="TableContents"/>
-              <w:shd w:fill="2E3440" w:val="clear"/>
-              <w:bidi w:val="0"/>
-              <w:spacing w:before="120" w:after="120"/>
-              <w:jc w:val="left"/>
-              <w:rPr/>
-            </w:pPr>
-            <w:r>
-              <w:rPr/>
-              <w:t xml:space="preserve">provider name / </w:t>
+            <w:tcW w:w="1689" w:type="dxa"/>
+            <w:tcBorders/>
+            <w:vAlign w:val="center"/>
+          </w:tcPr>
+          <w:p>
+            <w:pPr>
+              <w:pStyle w:val="TableContents"/>
+              <w:shd w:fill="2E3440" w:val="clear"/>
+              <w:bidi w:val="0"/>
+              <w:spacing w:before="120" w:after="120"/>
+              <w:jc w:val="left"/>
+              <w:rPr/>
+            </w:pPr>
+            <w:r>
+              <w:rPr/>
+              <w:t>both layers (a repo null inherits the global one)</w:t>
+            </w:r>
+          </w:p>
+        </w:tc>
+        <w:tc>
+          <w:tcPr>
+            <w:tcW w:w="1687" w:type="dxa"/>
+            <w:tcBorders/>
+            <w:vAlign w:val="center"/>
+          </w:tcPr>
+          <w:p>
+            <w:pPr>
+              <w:pStyle w:val="TableContents"/>
+              <w:shd w:fill="2E3440" w:val="clear"/>
+              <w:bidi w:val="0"/>
+              <w:spacing w:before="120" w:after="120"/>
+              <w:jc w:val="left"/>
+              <w:rPr/>
+            </w:pPr>
+            <w:r>
+              <w:rPr>
+                <w:rStyle w:val="SourceText"/>
+              </w:rPr>
+              <w:t>telegram</w:t>
+            </w:r>
+            <w:r>
+              <w:rPr/>
+              <w:t>/</w:t>
+            </w:r>
+            <w:r>
+              <w:rPr>
+                <w:rStyle w:val="SourceText"/>
+              </w:rPr>
+              <w:t>teams</w:t>
+            </w:r>
+            <w:r>
+              <w:rPr/>
+              <w:t>/</w:t>
             </w:r>
             <w:r>
               <w:rPr>
@@ -10878,19 +10946,23 @@
         </w:tc>
         <w:tc>
           <w:tcPr>
-            <w:tcW w:w="3540" w:type="dxa"/>
-            <w:tcBorders/>
-            <w:vAlign w:val="center"/>
-          </w:tcPr>
-          <w:p>
-            <w:pPr>
-              <w:pStyle w:val="TableContents"/>
-              <w:shd w:fill="2E3440" w:val="clear"/>
-              <w:bidi w:val="0"/>
-              <w:spacing w:before="120" w:after="120"/>
-              <w:jc w:val="left"/>
-              <w:rPr/>
-            </w:pPr>
+            <w:tcW w:w="4080" w:type="dxa"/>
+            <w:tcBorders/>
+            <w:vAlign w:val="center"/>
+          </w:tcPr>
+          <w:p>
+            <w:pPr>
+              <w:pStyle w:val="TableContents"/>
+              <w:shd w:fill="2E3440" w:val="clear"/>
+              <w:bidi w:val="0"/>
+              <w:spacing w:before="120" w:after="120"/>
+              <w:jc w:val="left"/>
+              <w:rPr/>
+            </w:pPr>
+            <w:r>
+              <w:rPr/>
+              <w:t xml:space="preserve">a repo </w:t>
+            </w:r>
             <w:r>
               <w:rPr>
                 <w:rStyle w:val="SourceText"/>
@@ -10899,17 +10971,37 @@
             </w:r>
             <w:r>
               <w:rPr/>
-              <w:t xml:space="preserve">: the </w:t>
-            </w:r>
-            <w:r>
-              <w:rPr>
-                <w:rStyle w:val="SourceText"/>
-              </w:rPr>
-              <w:t>Notification</w:t>
-            </w:r>
-            <w:r>
-              <w:rPr/>
-              <w:t xml:space="preserve"> hook sends nothing</w:t>
+              <w:t xml:space="preserve"> opts out even when the global file names a provider: no </w:t>
+            </w:r>
+            <w:r>
+              <w:rPr>
+                <w:rStyle w:val="SourceText"/>
+              </w:rPr>
+              <w:t>question</w:t>
+            </w:r>
+            <w:r>
+              <w:rPr/>
+              <w:t xml:space="preserve"> ping, no </w:t>
+            </w:r>
+            <w:r>
+              <w:rPr>
+                <w:rStyle w:val="SourceText"/>
+              </w:rPr>
+              <w:t>deploy</w:t>
+            </w:r>
+            <w:r>
+              <w:rPr/>
+              <w:t xml:space="preserve"> result (</w:t>
+            </w:r>
+            <w:r>
+              <w:rPr>
+                <w:rStyle w:val="SourceText"/>
+              </w:rPr>
+              <w:t>crew_notify.py config --root .</w:t>
+            </w:r>
+            <w:r>
+              <w:rPr/>
+              <w:t xml:space="preserve"> says so)</w:t>
             </w:r>
           </w:p>
         </w:tc>
@@ -10918,7 +11010,7 @@
         <w:trPr/>
         <w:tc>
           <w:tcPr>
-            <w:tcW w:w="4730" w:type="dxa"/>
+            <w:tcW w:w="4369" w:type="dxa"/>
             <w:tcBorders/>
             <w:vAlign w:val="center"/>
           </w:tcPr>
@@ -10941,7 +11033,7 @@
         </w:tc>
         <w:tc>
           <w:tcPr>
-            <w:tcW w:w="1699" w:type="dxa"/>
+            <w:tcW w:w="1689" w:type="dxa"/>
             <w:tcBorders/>
             <w:vAlign w:val="center"/>
           </w:tcPr>
@@ -10962,7 +11054,7 @@
         </w:tc>
         <w:tc>
           <w:tcPr>
-            <w:tcW w:w="1841" w:type="dxa"/>
+            <w:tcW w:w="1687" w:type="dxa"/>
             <w:tcBorders/>
             <w:vAlign w:val="center"/>
           </w:tcPr>
@@ -10983,7 +11075,7 @@
         </w:tc>
         <w:tc>
           <w:tcPr>
-            <w:tcW w:w="3540" w:type="dxa"/>
+            <w:tcW w:w="4080" w:type="dxa"/>
             <w:tcBorders/>
             <w:vAlign w:val="center"/>
           </w:tcPr>
@@ -11013,7 +11105,7 @@
         <w:trPr/>
         <w:tc>
           <w:tcPr>
-            <w:tcW w:w="4730" w:type="dxa"/>
+            <w:tcW w:w="4369" w:type="dxa"/>
             <w:tcBorders/>
             <w:vAlign w:val="center"/>
           </w:tcPr>
@@ -11036,7 +11128,7 @@
         </w:tc>
         <w:tc>
           <w:tcPr>
-            <w:tcW w:w="1699" w:type="dxa"/>
+            <w:tcW w:w="1689" w:type="dxa"/>
             <w:tcBorders/>
             <w:vAlign w:val="center"/>
           </w:tcPr>
@@ -11057,7 +11149,7 @@
         </w:tc>
         <w:tc>
           <w:tcPr>
-            <w:tcW w:w="1841" w:type="dxa"/>
+            <w:tcW w:w="1687" w:type="dxa"/>
             <w:tcBorders/>
             <w:vAlign w:val="center"/>
           </w:tcPr>
@@ -11088,7 +11180,7 @@
         </w:tc>
         <w:tc>
           <w:tcPr>
-            <w:tcW w:w="3540" w:type="dxa"/>
+            <w:tcW w:w="4080" w:type="dxa"/>
             <w:tcBorders/>
             <w:vAlign w:val="center"/>
           </w:tcPr>
@@ -12689,7 +12781,7 @@
     </w:p>
     <w:tbl>
       <w:tblPr>
-        <w:tblW w:w="11810" w:type="dxa"/>
+        <w:tblW w:w="11825" w:type="dxa"/>
         <w:jc w:val="left"/>
         <w:tblInd w:w="0" w:type="dxa"/>
         <w:tblLayout w:type="fixed"/>
@@ -12701,10 +12793,10 @@
         </w:tblCellMar>
       </w:tblPr>
       <w:tblGrid>
-        <w:gridCol w:w="2419"/>
+        <w:gridCol w:w="2423"/>
         <w:gridCol w:w="4096"/>
-        <w:gridCol w:w="1750"/>
-        <w:gridCol w:w="3545"/>
+        <w:gridCol w:w="1753"/>
+        <w:gridCol w:w="3553"/>
       </w:tblGrid>
       <w:tr>
         <w:trPr>
@@ -12712,7 +12804,7 @@
         </w:trPr>
         <w:tc>
           <w:tcPr>
-            <w:tcW w:w="2419" w:type="dxa"/>
+            <w:tcW w:w="2423" w:type="dxa"/>
             <w:tcBorders/>
             <w:vAlign w:val="center"/>
           </w:tcPr>
@@ -12756,7 +12848,7 @@
         </w:tc>
         <w:tc>
           <w:tcPr>
-            <w:tcW w:w="1750" w:type="dxa"/>
+            <w:tcW w:w="1753" w:type="dxa"/>
             <w:tcBorders/>
             <w:vAlign w:val="center"/>
           </w:tcPr>
@@ -12778,7 +12870,7 @@
         </w:tc>
         <w:tc>
           <w:tcPr>
-            <w:tcW w:w="3545" w:type="dxa"/>
+            <w:tcW w:w="3553" w:type="dxa"/>
             <w:tcBorders/>
             <w:vAlign w:val="center"/>
           </w:tcPr>
@@ -12803,7 +12895,7 @@
         <w:trPr/>
         <w:tc>
           <w:tcPr>
-            <w:tcW w:w="2419" w:type="dxa"/>
+            <w:tcW w:w="2423" w:type="dxa"/>
             <w:tcBorders/>
             <w:vAlign w:val="center"/>
           </w:tcPr>
@@ -12863,7 +12955,7 @@
         </w:tc>
         <w:tc>
           <w:tcPr>
-            <w:tcW w:w="1750" w:type="dxa"/>
+            <w:tcW w:w="1753" w:type="dxa"/>
             <w:tcBorders/>
             <w:vAlign w:val="center"/>
           </w:tcPr>
@@ -12886,7 +12978,7 @@
         </w:tc>
         <w:tc>
           <w:tcPr>
-            <w:tcW w:w="3545" w:type="dxa"/>
+            <w:tcW w:w="3553" w:type="dxa"/>
             <w:tcBorders/>
             <w:vAlign w:val="center"/>
           </w:tcPr>
@@ -12910,7 +13002,7 @@
         <w:trPr/>
         <w:tc>
           <w:tcPr>
-            <w:tcW w:w="2419" w:type="dxa"/>
+            <w:tcW w:w="2423" w:type="dxa"/>
             <w:tcBorders/>
             <w:vAlign w:val="center"/>
           </w:tcPr>
@@ -12954,7 +13046,7 @@
         </w:tc>
         <w:tc>
           <w:tcPr>
-            <w:tcW w:w="1750" w:type="dxa"/>
+            <w:tcW w:w="1753" w:type="dxa"/>
             <w:tcBorders/>
             <w:vAlign w:val="center"/>
           </w:tcPr>
@@ -13027,7 +13119,7 @@
         </w:tc>
         <w:tc>
           <w:tcPr>
-            <w:tcW w:w="3545" w:type="dxa"/>
+            <w:tcW w:w="3553" w:type="dxa"/>
             <w:tcBorders/>
             <w:vAlign w:val="center"/>
           </w:tcPr>
@@ -13051,7 +13143,7 @@
         <w:trPr/>
         <w:tc>
           <w:tcPr>
-            <w:tcW w:w="2419" w:type="dxa"/>
+            <w:tcW w:w="2423" w:type="dxa"/>
             <w:tcBorders/>
             <w:vAlign w:val="center"/>
           </w:tcPr>
@@ -13095,7 +13187,7 @@
         </w:tc>
         <w:tc>
           <w:tcPr>
-            <w:tcW w:w="1750" w:type="dxa"/>
+            <w:tcW w:w="1753" w:type="dxa"/>
             <w:tcBorders/>
             <w:vAlign w:val="center"/>
           </w:tcPr>
@@ -13116,7 +13208,7 @@
         </w:tc>
         <w:tc>
           <w:tcPr>
-            <w:tcW w:w="3545" w:type="dxa"/>
+            <w:tcW w:w="3553" w:type="dxa"/>
             <w:tcBorders/>
             <w:vAlign w:val="center"/>
           </w:tcPr>
@@ -13140,7 +13232,7 @@
         <w:trPr/>
         <w:tc>
           <w:tcPr>
-            <w:tcW w:w="2419" w:type="dxa"/>
+            <w:tcW w:w="2423" w:type="dxa"/>
             <w:tcBorders/>
             <w:vAlign w:val="center"/>
           </w:tcPr>
@@ -13184,7 +13276,7 @@
         </w:tc>
         <w:tc>
           <w:tcPr>
-            <w:tcW w:w="1750" w:type="dxa"/>
+            <w:tcW w:w="1753" w:type="dxa"/>
             <w:tcBorders/>
             <w:vAlign w:val="center"/>
           </w:tcPr>
@@ -13207,7 +13299,7 @@
         </w:tc>
         <w:tc>
           <w:tcPr>
-            <w:tcW w:w="3545" w:type="dxa"/>
+            <w:tcW w:w="3553" w:type="dxa"/>
             <w:tcBorders/>
             <w:vAlign w:val="center"/>
           </w:tcPr>
@@ -13231,7 +13323,7 @@
         <w:trPr/>
         <w:tc>
           <w:tcPr>
-            <w:tcW w:w="2419" w:type="dxa"/>
+            <w:tcW w:w="2423" w:type="dxa"/>
             <w:tcBorders/>
             <w:vAlign w:val="center"/>
           </w:tcPr>
@@ -13275,7 +13367,7 @@
         </w:tc>
         <w:tc>
           <w:tcPr>
-            <w:tcW w:w="1750" w:type="dxa"/>
+            <w:tcW w:w="1753" w:type="dxa"/>
             <w:tcBorders/>
             <w:vAlign w:val="center"/>
           </w:tcPr>
@@ -13298,7 +13390,7 @@
         </w:tc>
         <w:tc>
           <w:tcPr>
-            <w:tcW w:w="3545" w:type="dxa"/>
+            <w:tcW w:w="3553" w:type="dxa"/>
             <w:tcBorders/>
             <w:vAlign w:val="center"/>
           </w:tcPr>
@@ -13322,7 +13414,7 @@
         <w:trPr/>
         <w:tc>
           <w:tcPr>
-            <w:tcW w:w="2419" w:type="dxa"/>
+            <w:tcW w:w="2423" w:type="dxa"/>
             <w:tcBorders/>
             <w:vAlign w:val="center"/>
           </w:tcPr>
@@ -13372,7 +13464,7 @@
         </w:tc>
         <w:tc>
           <w:tcPr>
-            <w:tcW w:w="1750" w:type="dxa"/>
+            <w:tcW w:w="1753" w:type="dxa"/>
             <w:tcBorders/>
             <w:vAlign w:val="center"/>
           </w:tcPr>
@@ -13395,7 +13487,7 @@
         </w:tc>
         <w:tc>
           <w:tcPr>
-            <w:tcW w:w="3545" w:type="dxa"/>
+            <w:tcW w:w="3553" w:type="dxa"/>
             <w:tcBorders/>
             <w:vAlign w:val="center"/>
           </w:tcPr>
@@ -13429,7 +13521,7 @@
         <w:trPr/>
         <w:tc>
           <w:tcPr>
-            <w:tcW w:w="2419" w:type="dxa"/>
+            <w:tcW w:w="2423" w:type="dxa"/>
             <w:tcBorders/>
             <w:vAlign w:val="center"/>
           </w:tcPr>
@@ -13475,7 +13567,7 @@
         </w:tc>
         <w:tc>
           <w:tcPr>
-            <w:tcW w:w="1750" w:type="dxa"/>
+            <w:tcW w:w="1753" w:type="dxa"/>
             <w:tcBorders/>
             <w:vAlign w:val="center"/>
           </w:tcPr>
@@ -13498,7 +13590,7 @@
         </w:tc>
         <w:tc>
           <w:tcPr>
-            <w:tcW w:w="3545" w:type="dxa"/>
+            <w:tcW w:w="3553" w:type="dxa"/>
             <w:tcBorders/>
             <w:vAlign w:val="center"/>
           </w:tcPr>
@@ -13552,7 +13644,7 @@
         <w:trPr/>
         <w:tc>
           <w:tcPr>
-            <w:tcW w:w="2419" w:type="dxa"/>
+            <w:tcW w:w="2423" w:type="dxa"/>
             <w:tcBorders/>
             <w:vAlign w:val="center"/>
           </w:tcPr>
@@ -13612,7 +13704,7 @@
         </w:tc>
         <w:tc>
           <w:tcPr>
-            <w:tcW w:w="1750" w:type="dxa"/>
+            <w:tcW w:w="1753" w:type="dxa"/>
             <w:tcBorders/>
             <w:vAlign w:val="center"/>
           </w:tcPr>
@@ -13635,7 +13727,7 @@
         </w:tc>
         <w:tc>
           <w:tcPr>
-            <w:tcW w:w="3545" w:type="dxa"/>
+            <w:tcW w:w="3553" w:type="dxa"/>
             <w:tcBorders/>
             <w:vAlign w:val="center"/>
           </w:tcPr>
@@ -13669,7 +13761,7 @@
         <w:trPr/>
         <w:tc>
           <w:tcPr>
-            <w:tcW w:w="2419" w:type="dxa"/>
+            <w:tcW w:w="2423" w:type="dxa"/>
             <w:tcBorders/>
             <w:vAlign w:val="center"/>
           </w:tcPr>
@@ -13715,7 +13807,7 @@
         </w:tc>
         <w:tc>
           <w:tcPr>
-            <w:tcW w:w="1750" w:type="dxa"/>
+            <w:tcW w:w="1753" w:type="dxa"/>
             <w:tcBorders/>
             <w:vAlign w:val="center"/>
           </w:tcPr>
@@ -13738,7 +13830,7 @@
         </w:tc>
         <w:tc>
           <w:tcPr>
-            <w:tcW w:w="3545" w:type="dxa"/>
+            <w:tcW w:w="3553" w:type="dxa"/>
             <w:tcBorders/>
             <w:vAlign w:val="center"/>
           </w:tcPr>
@@ -13792,7 +13884,7 @@
         <w:trPr/>
         <w:tc>
           <w:tcPr>
-            <w:tcW w:w="2419" w:type="dxa"/>
+            <w:tcW w:w="2423" w:type="dxa"/>
             <w:tcBorders/>
             <w:vAlign w:val="center"/>
           </w:tcPr>
@@ -13838,7 +13930,7 @@
         </w:tc>
         <w:tc>
           <w:tcPr>
-            <w:tcW w:w="1750" w:type="dxa"/>
+            <w:tcW w:w="1753" w:type="dxa"/>
             <w:tcBorders/>
             <w:vAlign w:val="center"/>
           </w:tcPr>
@@ -13861,7 +13953,7 @@
         </w:tc>
         <w:tc>
           <w:tcPr>
-            <w:tcW w:w="3545" w:type="dxa"/>
+            <w:tcW w:w="3553" w:type="dxa"/>
             <w:tcBorders/>
             <w:vAlign w:val="center"/>
           </w:tcPr>
@@ -13895,7 +13987,7 @@
         <w:trPr/>
         <w:tc>
           <w:tcPr>
-            <w:tcW w:w="2419" w:type="dxa"/>
+            <w:tcW w:w="2423" w:type="dxa"/>
             <w:tcBorders/>
             <w:vAlign w:val="center"/>
           </w:tcPr>
@@ -13941,7 +14033,7 @@
         </w:tc>
         <w:tc>
           <w:tcPr>
-            <w:tcW w:w="1750" w:type="dxa"/>
+            <w:tcW w:w="1753" w:type="dxa"/>
             <w:tcBorders/>
             <w:vAlign w:val="center"/>
           </w:tcPr>
@@ -13964,7 +14056,7 @@
         </w:tc>
         <w:tc>
           <w:tcPr>
-            <w:tcW w:w="3545" w:type="dxa"/>
+            <w:tcW w:w="3553" w:type="dxa"/>
             <w:tcBorders/>
             <w:vAlign w:val="center"/>
           </w:tcPr>
@@ -13988,7 +14080,7 @@
         <w:trPr/>
         <w:tc>
           <w:tcPr>
-            <w:tcW w:w="2419" w:type="dxa"/>
+            <w:tcW w:w="2423" w:type="dxa"/>
             <w:tcBorders/>
             <w:vAlign w:val="center"/>
           </w:tcPr>
@@ -14034,7 +14126,7 @@
         </w:tc>
         <w:tc>
           <w:tcPr>
-            <w:tcW w:w="1750" w:type="dxa"/>
+            <w:tcW w:w="1753" w:type="dxa"/>
             <w:tcBorders/>
             <w:vAlign w:val="center"/>
           </w:tcPr>
@@ -14057,7 +14149,7 @@
         </w:tc>
         <w:tc>
           <w:tcPr>
-            <w:tcW w:w="3545" w:type="dxa"/>
+            <w:tcW w:w="3553" w:type="dxa"/>
             <w:tcBorders/>
             <w:vAlign w:val="center"/>
           </w:tcPr>
@@ -15229,7 +15321,7 @@
     </w:p>
     <w:tbl>
       <w:tblPr>
-        <w:tblW w:w="11810" w:type="dxa"/>
+        <w:tblW w:w="11825" w:type="dxa"/>
         <w:jc w:val="left"/>
         <w:tblInd w:w="0" w:type="dxa"/>
         <w:tblLayout w:type="fixed"/>
@@ -15242,8 +15334,8 @@
       </w:tblPr>
       <w:tblGrid>
         <w:gridCol w:w="1186"/>
-        <w:gridCol w:w="8255"/>
-        <w:gridCol w:w="2369"/>
+        <w:gridCol w:w="8267"/>
+        <w:gridCol w:w="2372"/>
       </w:tblGrid>
       <w:tr>
         <w:trPr>
@@ -15273,7 +15365,7 @@
         </w:tc>
         <w:tc>
           <w:tcPr>
-            <w:tcW w:w="8255" w:type="dxa"/>
+            <w:tcW w:w="8267" w:type="dxa"/>
             <w:tcBorders/>
             <w:vAlign w:val="center"/>
           </w:tcPr>
@@ -15295,7 +15387,7 @@
         </w:tc>
         <w:tc>
           <w:tcPr>
-            <w:tcW w:w="2369" w:type="dxa"/>
+            <w:tcW w:w="2372" w:type="dxa"/>
             <w:tcBorders/>
             <w:vAlign w:val="center"/>
           </w:tcPr>
@@ -15353,7 +15445,7 @@
         </w:tc>
         <w:tc>
           <w:tcPr>
-            <w:tcW w:w="8255" w:type="dxa"/>
+            <w:tcW w:w="8267" w:type="dxa"/>
             <w:tcBorders/>
             <w:vAlign w:val="center"/>
           </w:tcPr>
@@ -15384,7 +15476,7 @@
         </w:tc>
         <w:tc>
           <w:tcPr>
-            <w:tcW w:w="2369" w:type="dxa"/>
+            <w:tcW w:w="2372" w:type="dxa"/>
             <w:tcBorders/>
             <w:vAlign w:val="center"/>
           </w:tcPr>
@@ -15451,7 +15543,7 @@
         </w:tc>
         <w:tc>
           <w:tcPr>
-            <w:tcW w:w="8255" w:type="dxa"/>
+            <w:tcW w:w="8267" w:type="dxa"/>
             <w:tcBorders/>
             <w:vAlign w:val="center"/>
           </w:tcPr>
@@ -15482,7 +15574,7 @@
         </w:tc>
         <w:tc>
           <w:tcPr>
-            <w:tcW w:w="2369" w:type="dxa"/>
+            <w:tcW w:w="2372" w:type="dxa"/>
             <w:tcBorders/>
             <w:vAlign w:val="center"/>
           </w:tcPr>
@@ -15549,7 +15641,7 @@
         </w:tc>
         <w:tc>
           <w:tcPr>
-            <w:tcW w:w="8255" w:type="dxa"/>
+            <w:tcW w:w="8267" w:type="dxa"/>
             <w:tcBorders/>
             <w:vAlign w:val="center"/>
           </w:tcPr>
@@ -15570,7 +15662,7 @@
         </w:tc>
         <w:tc>
           <w:tcPr>
-            <w:tcW w:w="2369" w:type="dxa"/>
+            <w:tcW w:w="2372" w:type="dxa"/>
             <w:tcBorders/>
             <w:vAlign w:val="center"/>
           </w:tcPr>
@@ -15623,7 +15715,7 @@
         </w:tc>
         <w:tc>
           <w:tcPr>
-            <w:tcW w:w="8255" w:type="dxa"/>
+            <w:tcW w:w="8267" w:type="dxa"/>
             <w:tcBorders/>
             <w:vAlign w:val="center"/>
           </w:tcPr>
@@ -15706,7 +15798,7 @@
         </w:tc>
         <w:tc>
           <w:tcPr>
-            <w:tcW w:w="2369" w:type="dxa"/>
+            <w:tcW w:w="2372" w:type="dxa"/>
             <w:tcBorders/>
             <w:vAlign w:val="center"/>
           </w:tcPr>
@@ -15753,7 +15845,7 @@
         </w:tc>
         <w:tc>
           <w:tcPr>
-            <w:tcW w:w="8255" w:type="dxa"/>
+            <w:tcW w:w="8267" w:type="dxa"/>
             <w:tcBorders/>
             <w:vAlign w:val="center"/>
           </w:tcPr>
@@ -15774,7 +15866,7 @@
         </w:tc>
         <w:tc>
           <w:tcPr>
-            <w:tcW w:w="2369" w:type="dxa"/>
+            <w:tcW w:w="2372" w:type="dxa"/>
             <w:tcBorders/>
             <w:vAlign w:val="center"/>
           </w:tcPr>
@@ -15854,7 +15946,7 @@
     </w:p>
     <w:tbl>
       <w:tblPr>
-        <w:tblW w:w="11810" w:type="dxa"/>
+        <w:tblW w:w="11825" w:type="dxa"/>
         <w:jc w:val="left"/>
         <w:tblInd w:w="0" w:type="dxa"/>
         <w:tblLayout w:type="fixed"/>
@@ -15866,8 +15958,8 @@
         </w:tblCellMar>
       </w:tblPr>
       <w:tblGrid>
-        <w:gridCol w:w="5238"/>
-        <w:gridCol w:w="6572"/>
+        <w:gridCol w:w="5241"/>
+        <w:gridCol w:w="6584"/>
       </w:tblGrid>
       <w:tr>
         <w:trPr>
@@ -15875,7 +15967,7 @@
         </w:trPr>
         <w:tc>
           <w:tcPr>
-            <w:tcW w:w="5238" w:type="dxa"/>
+            <w:tcW w:w="5241" w:type="dxa"/>
             <w:tcBorders/>
             <w:vAlign w:val="center"/>
           </w:tcPr>
@@ -15897,7 +15989,7 @@
         </w:tc>
         <w:tc>
           <w:tcPr>
-            <w:tcW w:w="6572" w:type="dxa"/>
+            <w:tcW w:w="6584" w:type="dxa"/>
             <w:tcBorders/>
             <w:vAlign w:val="center"/>
           </w:tcPr>
@@ -15922,7 +16014,7 @@
         <w:trPr/>
         <w:tc>
           <w:tcPr>
-            <w:tcW w:w="5238" w:type="dxa"/>
+            <w:tcW w:w="5241" w:type="dxa"/>
             <w:tcBorders/>
             <w:vAlign w:val="center"/>
           </w:tcPr>
@@ -15945,7 +16037,7 @@
         </w:tc>
         <w:tc>
           <w:tcPr>
-            <w:tcW w:w="6572" w:type="dxa"/>
+            <w:tcW w:w="6584" w:type="dxa"/>
             <w:tcBorders/>
             <w:vAlign w:val="center"/>
           </w:tcPr>
@@ -15969,7 +16061,7 @@
         <w:trPr/>
         <w:tc>
           <w:tcPr>
-            <w:tcW w:w="5238" w:type="dxa"/>
+            <w:tcW w:w="5241" w:type="dxa"/>
             <w:tcBorders/>
             <w:vAlign w:val="center"/>
           </w:tcPr>
@@ -15992,7 +16084,7 @@
         </w:tc>
         <w:tc>
           <w:tcPr>
-            <w:tcW w:w="6572" w:type="dxa"/>
+            <w:tcW w:w="6584" w:type="dxa"/>
             <w:tcBorders/>
             <w:vAlign w:val="center"/>
           </w:tcPr>
@@ -16026,7 +16118,7 @@
         <w:trPr/>
         <w:tc>
           <w:tcPr>
-            <w:tcW w:w="5238" w:type="dxa"/>
+            <w:tcW w:w="5241" w:type="dxa"/>
             <w:tcBorders/>
             <w:vAlign w:val="center"/>
           </w:tcPr>
@@ -16049,7 +16141,7 @@
         </w:tc>
         <w:tc>
           <w:tcPr>
-            <w:tcW w:w="6572" w:type="dxa"/>
+            <w:tcW w:w="6584" w:type="dxa"/>
             <w:tcBorders/>
             <w:vAlign w:val="center"/>
           </w:tcPr>
@@ -16073,7 +16165,7 @@
         <w:trPr/>
         <w:tc>
           <w:tcPr>
-            <w:tcW w:w="5238" w:type="dxa"/>
+            <w:tcW w:w="5241" w:type="dxa"/>
             <w:tcBorders/>
             <w:vAlign w:val="center"/>
           </w:tcPr>
@@ -16096,7 +16188,7 @@
         </w:tc>
         <w:tc>
           <w:tcPr>
-            <w:tcW w:w="6572" w:type="dxa"/>
+            <w:tcW w:w="6584" w:type="dxa"/>
             <w:tcBorders/>
             <w:vAlign w:val="center"/>
           </w:tcPr>
@@ -16120,7 +16212,7 @@
         <w:trPr/>
         <w:tc>
           <w:tcPr>
-            <w:tcW w:w="5238" w:type="dxa"/>
+            <w:tcW w:w="5241" w:type="dxa"/>
             <w:tcBorders/>
             <w:vAlign w:val="center"/>
           </w:tcPr>
@@ -16143,7 +16235,7 @@
         </w:tc>
         <w:tc>
           <w:tcPr>
-            <w:tcW w:w="6572" w:type="dxa"/>
+            <w:tcW w:w="6584" w:type="dxa"/>
             <w:tcBorders/>
             <w:vAlign w:val="center"/>
           </w:tcPr>
@@ -16167,7 +16259,7 @@
         <w:trPr/>
         <w:tc>
           <w:tcPr>
-            <w:tcW w:w="5238" w:type="dxa"/>
+            <w:tcW w:w="5241" w:type="dxa"/>
             <w:tcBorders/>
             <w:vAlign w:val="center"/>
           </w:tcPr>
@@ -16190,7 +16282,7 @@
         </w:tc>
         <w:tc>
           <w:tcPr>
-            <w:tcW w:w="6572" w:type="dxa"/>
+            <w:tcW w:w="6584" w:type="dxa"/>
             <w:tcBorders/>
             <w:vAlign w:val="center"/>
           </w:tcPr>
@@ -16214,7 +16306,7 @@
         <w:trPr/>
         <w:tc>
           <w:tcPr>
-            <w:tcW w:w="5238" w:type="dxa"/>
+            <w:tcW w:w="5241" w:type="dxa"/>
             <w:tcBorders/>
             <w:vAlign w:val="center"/>
           </w:tcPr>
@@ -16247,7 +16339,7 @@
         </w:tc>
         <w:tc>
           <w:tcPr>
-            <w:tcW w:w="6572" w:type="dxa"/>
+            <w:tcW w:w="6584" w:type="dxa"/>
             <w:tcBorders/>
             <w:vAlign w:val="center"/>
           </w:tcPr>
@@ -16291,7 +16383,7 @@
         <w:trPr/>
         <w:tc>
           <w:tcPr>
-            <w:tcW w:w="5238" w:type="dxa"/>
+            <w:tcW w:w="5241" w:type="dxa"/>
             <w:tcBorders/>
             <w:vAlign w:val="center"/>
           </w:tcPr>
@@ -16324,7 +16416,7 @@
         </w:tc>
         <w:tc>
           <w:tcPr>
-            <w:tcW w:w="6572" w:type="dxa"/>
+            <w:tcW w:w="6584" w:type="dxa"/>
             <w:tcBorders/>
             <w:vAlign w:val="center"/>
           </w:tcPr>
@@ -16378,7 +16470,7 @@
         <w:trPr/>
         <w:tc>
           <w:tcPr>
-            <w:tcW w:w="5238" w:type="dxa"/>
+            <w:tcW w:w="5241" w:type="dxa"/>
             <w:tcBorders/>
             <w:vAlign w:val="center"/>
           </w:tcPr>
@@ -16401,7 +16493,7 @@
         </w:tc>
         <w:tc>
           <w:tcPr>
-            <w:tcW w:w="6572" w:type="dxa"/>
+            <w:tcW w:w="6584" w:type="dxa"/>
             <w:tcBorders/>
             <w:vAlign w:val="center"/>
           </w:tcPr>
@@ -16455,7 +16547,7 @@
         <w:trPr/>
         <w:tc>
           <w:tcPr>
-            <w:tcW w:w="5238" w:type="dxa"/>
+            <w:tcW w:w="5241" w:type="dxa"/>
             <w:tcBorders/>
             <w:vAlign w:val="center"/>
           </w:tcPr>
@@ -16478,7 +16570,7 @@
         </w:tc>
         <w:tc>
           <w:tcPr>
-            <w:tcW w:w="6572" w:type="dxa"/>
+            <w:tcW w:w="6584" w:type="dxa"/>
             <w:tcBorders/>
             <w:vAlign w:val="center"/>
           </w:tcPr>
@@ -16518,7 +16610,7 @@
         <w:trPr/>
         <w:tc>
           <w:tcPr>
-            <w:tcW w:w="5238" w:type="dxa"/>
+            <w:tcW w:w="5241" w:type="dxa"/>
             <w:tcBorders/>
             <w:vAlign w:val="center"/>
           </w:tcPr>
@@ -16541,7 +16633,7 @@
         </w:tc>
         <w:tc>
           <w:tcPr>
-            <w:tcW w:w="6572" w:type="dxa"/>
+            <w:tcW w:w="6584" w:type="dxa"/>
             <w:tcBorders/>
             <w:vAlign w:val="center"/>
           </w:tcPr>
@@ -16591,7 +16683,7 @@
         <w:trPr/>
         <w:tc>
           <w:tcPr>
-            <w:tcW w:w="5238" w:type="dxa"/>
+            <w:tcW w:w="5241" w:type="dxa"/>
             <w:tcBorders/>
             <w:vAlign w:val="center"/>
           </w:tcPr>
@@ -16614,7 +16706,7 @@
         </w:tc>
         <w:tc>
           <w:tcPr>
-            <w:tcW w:w="6572" w:type="dxa"/>
+            <w:tcW w:w="6584" w:type="dxa"/>
             <w:tcBorders/>
             <w:vAlign w:val="center"/>
           </w:tcPr>
@@ -16638,7 +16730,7 @@
         <w:trPr/>
         <w:tc>
           <w:tcPr>
-            <w:tcW w:w="5238" w:type="dxa"/>
+            <w:tcW w:w="5241" w:type="dxa"/>
             <w:tcBorders/>
             <w:vAlign w:val="center"/>
           </w:tcPr>
@@ -16671,7 +16763,7 @@
         </w:tc>
         <w:tc>
           <w:tcPr>
-            <w:tcW w:w="6572" w:type="dxa"/>
+            <w:tcW w:w="6584" w:type="dxa"/>
             <w:tcBorders/>
             <w:vAlign w:val="center"/>
           </w:tcPr>
@@ -16695,7 +16787,7 @@
         <w:trPr/>
         <w:tc>
           <w:tcPr>
-            <w:tcW w:w="5238" w:type="dxa"/>
+            <w:tcW w:w="5241" w:type="dxa"/>
             <w:tcBorders/>
             <w:vAlign w:val="center"/>
           </w:tcPr>
@@ -16738,7 +16830,7 @@
         </w:tc>
         <w:tc>
           <w:tcPr>
-            <w:tcW w:w="6572" w:type="dxa"/>
+            <w:tcW w:w="6584" w:type="dxa"/>
             <w:tcBorders/>
             <w:vAlign w:val="center"/>
           </w:tcPr>
@@ -16762,7 +16854,7 @@
         <w:trPr/>
         <w:tc>
           <w:tcPr>
-            <w:tcW w:w="5238" w:type="dxa"/>
+            <w:tcW w:w="5241" w:type="dxa"/>
             <w:tcBorders/>
             <w:vAlign w:val="center"/>
           </w:tcPr>
@@ -16795,7 +16887,7 @@
         </w:tc>
         <w:tc>
           <w:tcPr>
-            <w:tcW w:w="6572" w:type="dxa"/>
+            <w:tcW w:w="6584" w:type="dxa"/>
             <w:tcBorders/>
             <w:vAlign w:val="center"/>
           </w:tcPr>
@@ -16829,7 +16921,7 @@
         <w:trPr/>
         <w:tc>
           <w:tcPr>
-            <w:tcW w:w="5238" w:type="dxa"/>
+            <w:tcW w:w="5241" w:type="dxa"/>
             <w:tcBorders/>
             <w:vAlign w:val="center"/>
           </w:tcPr>
@@ -16852,7 +16944,7 @@
         </w:tc>
         <w:tc>
           <w:tcPr>
-            <w:tcW w:w="6572" w:type="dxa"/>
+            <w:tcW w:w="6584" w:type="dxa"/>
             <w:tcBorders/>
             <w:vAlign w:val="center"/>
           </w:tcPr>
@@ -16882,7 +16974,7 @@
         <w:trPr/>
         <w:tc>
           <w:tcPr>
-            <w:tcW w:w="5238" w:type="dxa"/>
+            <w:tcW w:w="5241" w:type="dxa"/>
             <w:tcBorders/>
             <w:vAlign w:val="center"/>
           </w:tcPr>
@@ -16905,7 +16997,7 @@
         </w:tc>
         <w:tc>
           <w:tcPr>
-            <w:tcW w:w="6572" w:type="dxa"/>
+            <w:tcW w:w="6584" w:type="dxa"/>
             <w:tcBorders/>
             <w:vAlign w:val="center"/>
           </w:tcPr>
@@ -16939,7 +17031,7 @@
         <w:trPr/>
         <w:tc>
           <w:tcPr>
-            <w:tcW w:w="5238" w:type="dxa"/>
+            <w:tcW w:w="5241" w:type="dxa"/>
             <w:tcBorders/>
             <w:vAlign w:val="center"/>
           </w:tcPr>
@@ -16962,7 +17054,7 @@
         </w:tc>
         <w:tc>
           <w:tcPr>
-            <w:tcW w:w="6572" w:type="dxa"/>
+            <w:tcW w:w="6584" w:type="dxa"/>
             <w:tcBorders/>
             <w:vAlign w:val="center"/>
           </w:tcPr>
@@ -16992,7 +17084,7 @@
         <w:trPr/>
         <w:tc>
           <w:tcPr>
-            <w:tcW w:w="5238" w:type="dxa"/>
+            <w:tcW w:w="5241" w:type="dxa"/>
             <w:tcBorders/>
             <w:vAlign w:val="center"/>
           </w:tcPr>
@@ -17015,7 +17107,7 @@
         </w:tc>
         <w:tc>
           <w:tcPr>
-            <w:tcW w:w="6572" w:type="dxa"/>
+            <w:tcW w:w="6584" w:type="dxa"/>
             <w:tcBorders/>
             <w:vAlign w:val="center"/>
           </w:tcPr>
@@ -17059,7 +17151,7 @@
         <w:trPr/>
         <w:tc>
           <w:tcPr>
-            <w:tcW w:w="5238" w:type="dxa"/>
+            <w:tcW w:w="5241" w:type="dxa"/>
             <w:tcBorders/>
             <w:vAlign w:val="center"/>
           </w:tcPr>
@@ -17082,7 +17174,7 @@
         </w:tc>
         <w:tc>
           <w:tcPr>
-            <w:tcW w:w="6572" w:type="dxa"/>
+            <w:tcW w:w="6584" w:type="dxa"/>
             <w:tcBorders/>
             <w:vAlign w:val="center"/>
           </w:tcPr>

</xml_diff>